<commit_message>
Update CV docx and regenerate site-data (autopush 2026-05-28 02:53)
</commit_message>
<xml_diff>
--- a/CV_202605_MOON.docx
+++ b/CV_202605_MOON.docx
@@ -1163,7 +1163,23 @@
           <w:bCs/>
           <w:iCs/>
         </w:rPr>
-        <w:t>, Fall 2024)</w:t>
+        <w:t xml:space="preserve">, </w:t>
+      </w:r>
+      <w:proofErr w:type="gramStart"/>
+      <w:r>
+        <w:rPr>
+          <w:bCs/>
+          <w:iCs/>
+        </w:rPr>
+        <w:t>Fall</w:t>
+      </w:r>
+      <w:proofErr w:type="gramEnd"/>
+      <w:r>
+        <w:rPr>
+          <w:bCs/>
+          <w:iCs/>
+        </w:rPr>
+        <w:t xml:space="preserve"> 2024)</w:t>
       </w:r>
       <w:r>
         <w:rPr>
@@ -1631,7 +1647,23 @@
           <w:bCs/>
           <w:iCs/>
         </w:rPr>
-        <w:t>, Fall 2024)</w:t>
+        <w:t xml:space="preserve">, </w:t>
+      </w:r>
+      <w:proofErr w:type="gramStart"/>
+      <w:r>
+        <w:rPr>
+          <w:bCs/>
+          <w:iCs/>
+        </w:rPr>
+        <w:t>Fall</w:t>
+      </w:r>
+      <w:proofErr w:type="gramEnd"/>
+      <w:r>
+        <w:rPr>
+          <w:bCs/>
+          <w:iCs/>
+        </w:rPr>
+        <w:t xml:space="preserve"> 2024)</w:t>
       </w:r>
       <w:r>
         <w:rPr>
@@ -2280,7 +2312,15 @@
         <w:ind w:firstLine="720"/>
       </w:pPr>
       <w:r>
-        <w:t>Doctoral Dissertation Committee, Kimberly Galho (ELPTS, College of Education)</w:t>
+        <w:t xml:space="preserve">Doctoral Dissertation Committee, Kimberly </w:t>
+      </w:r>
+      <w:proofErr w:type="spellStart"/>
+      <w:r>
+        <w:t>Galho</w:t>
+      </w:r>
+      <w:proofErr w:type="spellEnd"/>
+      <w:r>
+        <w:t xml:space="preserve"> (ELPTS, College of Education)</w:t>
       </w:r>
     </w:p>
     <w:p>
@@ -2821,13 +2861,21 @@
         <w:t xml:space="preserve">, </w:t>
       </w:r>
       <w:r>
-        <w:t xml:space="preserve">Doctoral Student, Raissa Marchiori </w:t>
+        <w:t xml:space="preserve">Doctoral Student, Raissa </w:t>
+      </w:r>
+      <w:proofErr w:type="gramStart"/>
+      <w:r>
+        <w:t xml:space="preserve">Marchiori </w:t>
       </w:r>
       <w:r>
         <w:t xml:space="preserve"> </w:t>
       </w:r>
       <w:r>
-        <w:t>(Civil Engineering)</w:t>
+        <w:t>(</w:t>
+      </w:r>
+      <w:proofErr w:type="gramEnd"/>
+      <w:r>
+        <w:t>Civil Engineering)</w:t>
       </w:r>
     </w:p>
     <w:p>
@@ -2995,6 +3043,7 @@
           <w:lang w:eastAsia="ko-KR"/>
         </w:rPr>
       </w:pPr>
+      <w:proofErr w:type="gramStart"/>
       <w:r>
         <w:rPr>
           <w:rFonts w:hint="eastAsia"/>
@@ -3013,7 +3062,18 @@
           <w:u w:val="single"/>
           <w:lang w:eastAsia="ko-KR"/>
         </w:rPr>
-        <w:t xml:space="preserve">  (Total, </w:t>
+        <w:t xml:space="preserve">  (</w:t>
+      </w:r>
+      <w:proofErr w:type="gramEnd"/>
+      <w:r>
+        <w:rPr>
+          <w:rFonts w:hint="eastAsia"/>
+          <w:b/>
+          <w:bCs/>
+          <w:u w:val="single"/>
+          <w:lang w:eastAsia="ko-KR"/>
+        </w:rPr>
+        <w:t xml:space="preserve">Total, </w:t>
       </w:r>
       <w:r>
         <w:rPr>
@@ -3479,7 +3539,23 @@
           <w:rFonts w:hint="eastAsia"/>
           <w:lang w:eastAsia="ko-KR"/>
         </w:rPr>
-        <w:t xml:space="preserve">COE RisingTide Grant, The University of Alabama, </w:t>
+        <w:t xml:space="preserve">COE </w:t>
+      </w:r>
+      <w:proofErr w:type="spellStart"/>
+      <w:r>
+        <w:rPr>
+          <w:rFonts w:hint="eastAsia"/>
+          <w:lang w:eastAsia="ko-KR"/>
+        </w:rPr>
+        <w:t>RisingTide</w:t>
+      </w:r>
+      <w:proofErr w:type="spellEnd"/>
+      <w:r>
+        <w:rPr>
+          <w:rFonts w:hint="eastAsia"/>
+          <w:lang w:eastAsia="ko-KR"/>
+        </w:rPr>
+        <w:t xml:space="preserve"> Grant, The University of Alabama, </w:t>
       </w:r>
       <w:r>
         <w:rPr>
@@ -3580,11 +3656,33 @@
       <w:r>
         <w:t xml:space="preserve">). </w:t>
       </w:r>
-      <w:r>
-        <w:rPr>
-          <w:lang w:eastAsia="ko-KR"/>
-        </w:rPr>
-        <w:t>TeachPlay: AI-Enhanced Educational Gamelet Design</w:t>
+      <w:proofErr w:type="spellStart"/>
+      <w:r>
+        <w:rPr>
+          <w:lang w:eastAsia="ko-KR"/>
+        </w:rPr>
+        <w:t>TeachPlay</w:t>
+      </w:r>
+      <w:proofErr w:type="spellEnd"/>
+      <w:r>
+        <w:rPr>
+          <w:lang w:eastAsia="ko-KR"/>
+        </w:rPr>
+        <w:t xml:space="preserve">: AI-Enhanced Educational </w:t>
+      </w:r>
+      <w:proofErr w:type="spellStart"/>
+      <w:r>
+        <w:rPr>
+          <w:lang w:eastAsia="ko-KR"/>
+        </w:rPr>
+        <w:t>Gamelet</w:t>
+      </w:r>
+      <w:proofErr w:type="spellEnd"/>
+      <w:r>
+        <w:rPr>
+          <w:lang w:eastAsia="ko-KR"/>
+        </w:rPr>
+        <w:t xml:space="preserve"> Design</w:t>
       </w:r>
       <w:r>
         <w:rPr>
@@ -3700,11 +3798,19 @@
       <w:r>
         <w:t xml:space="preserve">). </w:t>
       </w:r>
-      <w:r>
-        <w:rPr>
-          <w:lang w:eastAsia="ko-KR"/>
-        </w:rPr>
-        <w:t>RemixEd: Designing AI- and XR-Enhanced Instructional Modules for Inclusive, Doctoral-Level Online Learning</w:t>
+      <w:proofErr w:type="spellStart"/>
+      <w:r>
+        <w:rPr>
+          <w:lang w:eastAsia="ko-KR"/>
+        </w:rPr>
+        <w:t>RemixEd</w:t>
+      </w:r>
+      <w:proofErr w:type="spellEnd"/>
+      <w:r>
+        <w:rPr>
+          <w:lang w:eastAsia="ko-KR"/>
+        </w:rPr>
+        <w:t>: Designing AI- and XR-Enhanced Instructional Modules for Inclusive, Doctoral-Level Online Learning</w:t>
       </w:r>
       <w:r>
         <w:rPr>
@@ -4142,7 +4248,39 @@
           <w:rFonts w:hint="eastAsia"/>
           <w:lang w:eastAsia="ko-KR"/>
         </w:rPr>
-        <w:t>Fellowship amount (summer stipend)</w:t>
+        <w:t xml:space="preserve">Fellowship </w:t>
+      </w:r>
+      <w:proofErr w:type="gramStart"/>
+      <w:r>
+        <w:rPr>
+          <w:rFonts w:hint="eastAsia"/>
+          <w:lang w:eastAsia="ko-KR"/>
+        </w:rPr>
+        <w:t>amount</w:t>
+      </w:r>
+      <w:proofErr w:type="gramEnd"/>
+      <w:r>
+        <w:rPr>
+          <w:rFonts w:hint="eastAsia"/>
+          <w:lang w:eastAsia="ko-KR"/>
+        </w:rPr>
+        <w:t xml:space="preserve"> (summer </w:t>
+      </w:r>
+      <w:proofErr w:type="gramStart"/>
+      <w:r>
+        <w:rPr>
+          <w:rFonts w:hint="eastAsia"/>
+          <w:lang w:eastAsia="ko-KR"/>
+        </w:rPr>
+        <w:t>stipend</w:t>
+      </w:r>
+      <w:proofErr w:type="gramEnd"/>
+      <w:r>
+        <w:rPr>
+          <w:rFonts w:hint="eastAsia"/>
+          <w:lang w:eastAsia="ko-KR"/>
+        </w:rPr>
+        <w:t>)</w:t>
       </w:r>
       <w:r>
         <w:t xml:space="preserve"> $</w:t>
@@ -5601,11 +5739,47 @@
         </w:rPr>
         <w:t xml:space="preserve">). </w:t>
       </w:r>
-      <w:r>
-        <w:rPr>
-          <w:lang w:eastAsia="ko-KR"/>
-        </w:rPr>
-        <w:t>SaTS 2.0: EDU: Metaverse or Metaworst: Metaverse Security Education by Using Heutagogical and Challenge-based Pedagogy</w:t>
+      <w:proofErr w:type="spellStart"/>
+      <w:r>
+        <w:rPr>
+          <w:lang w:eastAsia="ko-KR"/>
+        </w:rPr>
+        <w:t>SaTS</w:t>
+      </w:r>
+      <w:proofErr w:type="spellEnd"/>
+      <w:r>
+        <w:rPr>
+          <w:lang w:eastAsia="ko-KR"/>
+        </w:rPr>
+        <w:t xml:space="preserve"> 2.0: EDU: Metaverse or </w:t>
+      </w:r>
+      <w:proofErr w:type="spellStart"/>
+      <w:r>
+        <w:rPr>
+          <w:lang w:eastAsia="ko-KR"/>
+        </w:rPr>
+        <w:t>Metaworst</w:t>
+      </w:r>
+      <w:proofErr w:type="spellEnd"/>
+      <w:r>
+        <w:rPr>
+          <w:lang w:eastAsia="ko-KR"/>
+        </w:rPr>
+        <w:t xml:space="preserve">: Metaverse Security Education by Using </w:t>
+      </w:r>
+      <w:proofErr w:type="spellStart"/>
+      <w:r>
+        <w:rPr>
+          <w:lang w:eastAsia="ko-KR"/>
+        </w:rPr>
+        <w:t>Heutagogical</w:t>
+      </w:r>
+      <w:proofErr w:type="spellEnd"/>
+      <w:r>
+        <w:rPr>
+          <w:lang w:eastAsia="ko-KR"/>
+        </w:rPr>
+        <w:t xml:space="preserve"> and Challenge-based Pedagogy</w:t>
       </w:r>
       <w:r>
         <w:rPr>
@@ -5907,11 +6081,19 @@
         </w:rPr>
         <w:t xml:space="preserve">9). </w:t>
       </w:r>
-      <w:r>
-        <w:rPr>
-          <w:lang w:eastAsia="ko-KR"/>
-        </w:rPr>
-        <w:t>CyberSecure Minds: Generative AI-enhanced Microlearning Games to Teach Math and Science through Real-World Cybersecurity Scenarios for Marginalized Youth</w:t>
+      <w:proofErr w:type="spellStart"/>
+      <w:r>
+        <w:rPr>
+          <w:lang w:eastAsia="ko-KR"/>
+        </w:rPr>
+        <w:t>CyberSecure</w:t>
+      </w:r>
+      <w:proofErr w:type="spellEnd"/>
+      <w:r>
+        <w:rPr>
+          <w:lang w:eastAsia="ko-KR"/>
+        </w:rPr>
+        <w:t xml:space="preserve"> Minds: Generative AI-enhanced Microlearning Games to Teach Math and Science through Real-World Cybersecurity Scenarios for Marginalized Youth</w:t>
       </w:r>
       <w:r>
         <w:rPr>
@@ -7556,12 +7738,21 @@
         </w:rPr>
         <w:t xml:space="preserve"> 2027). </w:t>
       </w:r>
-      <w:r>
-        <w:rPr>
-          <w:rFonts w:hint="eastAsia"/>
-          <w:lang w:eastAsia="ko-KR"/>
-        </w:rPr>
-        <w:t xml:space="preserve">QuestFlex: </w:t>
+      <w:proofErr w:type="spellStart"/>
+      <w:r>
+        <w:rPr>
+          <w:rFonts w:hint="eastAsia"/>
+          <w:lang w:eastAsia="ko-KR"/>
+        </w:rPr>
+        <w:t>QuestFlex</w:t>
+      </w:r>
+      <w:proofErr w:type="spellEnd"/>
+      <w:r>
+        <w:rPr>
+          <w:rFonts w:hint="eastAsia"/>
+          <w:lang w:eastAsia="ko-KR"/>
+        </w:rPr>
+        <w:t xml:space="preserve">: </w:t>
       </w:r>
       <w:r>
         <w:rPr>
@@ -7816,7 +8007,27 @@
           <w:szCs w:val="22"/>
           <w:u w:val="single"/>
         </w:rPr>
-        <w:t>Note 2. * indicates the work with a mentoring student</w:t>
+        <w:t xml:space="preserve">Note 2. * </w:t>
+      </w:r>
+      <w:proofErr w:type="gramStart"/>
+      <w:r>
+        <w:rPr>
+          <w:bCs/>
+          <w:sz w:val="22"/>
+          <w:szCs w:val="22"/>
+          <w:u w:val="single"/>
+        </w:rPr>
+        <w:t>indicates</w:t>
+      </w:r>
+      <w:proofErr w:type="gramEnd"/>
+      <w:r>
+        <w:rPr>
+          <w:bCs/>
+          <w:sz w:val="22"/>
+          <w:szCs w:val="22"/>
+          <w:u w:val="single"/>
+        </w:rPr>
+        <w:t xml:space="preserve"> the work with a mentoring student</w:t>
       </w:r>
     </w:p>
     <w:p>
@@ -7854,7 +8065,27 @@
           <w:szCs w:val="22"/>
           <w:u w:val="single"/>
         </w:rPr>
-        <w:t>‡ indicates the corresponding authorship.</w:t>
+        <w:t xml:space="preserve">‡ </w:t>
+      </w:r>
+      <w:proofErr w:type="gramStart"/>
+      <w:r>
+        <w:rPr>
+          <w:bCs/>
+          <w:sz w:val="22"/>
+          <w:szCs w:val="22"/>
+          <w:u w:val="single"/>
+        </w:rPr>
+        <w:t>indicates</w:t>
+      </w:r>
+      <w:proofErr w:type="gramEnd"/>
+      <w:r>
+        <w:rPr>
+          <w:bCs/>
+          <w:sz w:val="22"/>
+          <w:szCs w:val="22"/>
+          <w:u w:val="single"/>
+        </w:rPr>
+        <w:t xml:space="preserve"> the corresponding authorship.</w:t>
       </w:r>
       <w:r>
         <w:rPr>
@@ -7948,22 +8179,20 @@
         </w:rPr>
         <w:t>[</w:t>
       </w:r>
-      <w:r>
-        <w:rPr>
-          <w:rFonts w:hint="eastAsia"/>
-          <w:lang w:eastAsia="ko-KR"/>
-        </w:rPr>
-        <w:t>57</w:t>
-      </w:r>
-      <w:r>
-        <w:rPr>
-          <w:rFonts w:hint="eastAsia"/>
-          <w:lang w:eastAsia="ko-KR"/>
-        </w:rPr>
-        <w:t xml:space="preserve">] </w:t>
-      </w:r>
-      <w:r>
-        <w:t xml:space="preserve">‡ </w:t>
+      <w:proofErr w:type="gramStart"/>
+      <w:r>
+        <w:rPr>
+          <w:rFonts w:hint="eastAsia"/>
+          <w:lang w:eastAsia="ko-KR"/>
+        </w:rPr>
+        <w:t xml:space="preserve">57] </w:t>
+      </w:r>
+      <w:r>
+        <w:t>‡</w:t>
+      </w:r>
+      <w:proofErr w:type="gramEnd"/>
+      <w:r>
+        <w:t xml:space="preserve"> </w:t>
       </w:r>
       <w:r>
         <w:rPr>
@@ -7979,14 +8208,7 @@
           <w:rFonts w:hint="eastAsia"/>
           <w:lang w:eastAsia="ko-KR"/>
         </w:rPr>
-        <w:t>. (</w:t>
-      </w:r>
-      <w:r>
-        <w:rPr>
-          <w:rFonts w:hint="eastAsia"/>
-          <w:lang w:eastAsia="ko-KR"/>
-        </w:rPr>
-        <w:t>Minor revision</w:t>
+        <w:t>. (Minor revision</w:t>
       </w:r>
       <w:r>
         <w:rPr>
@@ -9584,7 +9806,11 @@
         <w:ind w:left="720" w:hanging="720"/>
       </w:pPr>
       <w:r>
-        <w:t>[5</w:t>
+        <w:t>[</w:t>
+      </w:r>
+      <w:proofErr w:type="gramStart"/>
+      <w:r>
+        <w:t>5</w:t>
       </w:r>
       <w:r>
         <w:rPr>
@@ -9593,7 +9819,11 @@
         <w:t>1</w:t>
       </w:r>
       <w:r>
-        <w:t>] ‡ * </w:t>
+        <w:t>] ‡</w:t>
+      </w:r>
+      <w:proofErr w:type="gramEnd"/>
+      <w:r>
+        <w:t xml:space="preserve"> * </w:t>
       </w:r>
       <w:r>
         <w:rPr>
@@ -9609,7 +9839,15 @@
         <w:t>6</w:t>
       </w:r>
       <w:r>
-        <w:t>). Decoding immersive learning states: A reproducible microgenetic pipeline for behavioral data in virtual reality safety training. </w:t>
+        <w:t xml:space="preserve">). Decoding immersive learning states: A reproducible </w:t>
+      </w:r>
+      <w:proofErr w:type="spellStart"/>
+      <w:r>
+        <w:t>microgenetic</w:t>
+      </w:r>
+      <w:proofErr w:type="spellEnd"/>
+      <w:r>
+        <w:t xml:space="preserve"> pipeline for behavioral data in virtual reality safety training. </w:t>
       </w:r>
       <w:r>
         <w:rPr>
@@ -9629,6 +9867,7 @@
           <w:t>https://doi.org/10.1007/s41237-025-00286-1</w:t>
         </w:r>
       </w:hyperlink>
+      <w:proofErr w:type="gramStart"/>
       <w:r>
         <w:t xml:space="preserve"> </w:t>
       </w:r>
@@ -9657,7 +9896,17 @@
           <w:i/>
           <w:iCs/>
         </w:rPr>
-        <w:t>[SCOPUS-indexed]</w:t>
+        <w:t>[</w:t>
+      </w:r>
+      <w:proofErr w:type="gramEnd"/>
+      <w:r>
+        <w:rPr>
+          <w:b/>
+          <w:bCs/>
+          <w:i/>
+          <w:iCs/>
+        </w:rPr>
+        <w:t>SCOPUS-indexed]</w:t>
       </w:r>
     </w:p>
     <w:p>
@@ -10618,6 +10867,7 @@
         </w:rPr>
         <w:t xml:space="preserve">., Awoyemi, I., Ghooreian, A., &amp; </w:t>
       </w:r>
+      <w:proofErr w:type="spellStart"/>
       <w:r>
         <w:rPr>
           <w:bCs/>
@@ -10625,6 +10875,7 @@
         </w:rPr>
         <w:t>Ramenzapour</w:t>
       </w:r>
+      <w:proofErr w:type="spellEnd"/>
       <w:r>
         <w:rPr>
           <w:rFonts w:hint="eastAsia"/>
@@ -10952,6 +11203,7 @@
         </w:rPr>
         <w:t>46</w:t>
       </w:r>
+      <w:proofErr w:type="gramStart"/>
       <w:r>
         <w:rPr>
           <w:rFonts w:hint="eastAsia"/>
@@ -10968,6 +11220,7 @@
         </w:rPr>
         <w:t>‡</w:t>
       </w:r>
+      <w:proofErr w:type="gramEnd"/>
       <w:r>
         <w:rPr>
           <w:rFonts w:hint="eastAsia"/>
@@ -11368,7 +11621,16 @@
           <w:bCs/>
           <w:lang w:eastAsia="ko-KR"/>
         </w:rPr>
-        <w:t>[4</w:t>
+        <w:t>[</w:t>
+      </w:r>
+      <w:proofErr w:type="gramStart"/>
+      <w:r>
+        <w:rPr>
+          <w:rFonts w:hint="eastAsia"/>
+          <w:bCs/>
+          <w:lang w:eastAsia="ko-KR"/>
+        </w:rPr>
+        <w:t>4</w:t>
       </w:r>
       <w:r>
         <w:rPr>
@@ -11394,6 +11656,7 @@
         </w:rPr>
         <w:t>‡</w:t>
       </w:r>
+      <w:proofErr w:type="gramEnd"/>
       <w:r>
         <w:rPr>
           <w:rFonts w:hint="eastAsia"/>
@@ -11855,7 +12118,21 @@
         <w:rPr>
           <w:lang w:eastAsia="ko-KR"/>
         </w:rPr>
-        <w:t xml:space="preserve">How Non-CS preservice teachers conceptualize and engage with computational thinking through 3D game design: Insights from an </w:t>
+        <w:t xml:space="preserve">How </w:t>
+      </w:r>
+      <w:proofErr w:type="gramStart"/>
+      <w:r>
+        <w:rPr>
+          <w:lang w:eastAsia="ko-KR"/>
+        </w:rPr>
+        <w:t>Non-CS</w:t>
+      </w:r>
+      <w:proofErr w:type="gramEnd"/>
+      <w:r>
+        <w:rPr>
+          <w:lang w:eastAsia="ko-KR"/>
+        </w:rPr>
+        <w:t xml:space="preserve"> preservice teachers conceptualize and engage with computational thinking through 3D game design: Insights from an </w:t>
       </w:r>
       <w:r>
         <w:rPr>
@@ -12016,6 +12293,7 @@
         </w:rPr>
         <w:t>[</w:t>
       </w:r>
+      <w:proofErr w:type="gramStart"/>
       <w:r>
         <w:rPr>
           <w:rFonts w:hint="eastAsia"/>
@@ -12038,6 +12316,7 @@
         </w:rPr>
         <w:t>‡</w:t>
       </w:r>
+      <w:proofErr w:type="gramEnd"/>
       <w:r>
         <w:rPr>
           <w:rFonts w:hint="eastAsia"/>
@@ -13132,6 +13411,7 @@
       <w:r>
         <w:t>[</w:t>
       </w:r>
+      <w:proofErr w:type="gramStart"/>
       <w:r>
         <w:rPr>
           <w:rFonts w:hint="eastAsia"/>
@@ -13157,6 +13437,7 @@
         </w:rPr>
         <w:t>‡</w:t>
       </w:r>
+      <w:proofErr w:type="gramEnd"/>
       <w:r>
         <w:rPr>
           <w:rFonts w:hint="eastAsia"/>
@@ -13438,6 +13719,7 @@
           <w:t>https://doi.org/10.1186/s40561-024-00335-4</w:t>
         </w:r>
       </w:hyperlink>
+      <w:proofErr w:type="gramStart"/>
       <w:r>
         <w:rPr>
           <w:rFonts w:hint="eastAsia"/>
@@ -13454,7 +13736,18 @@
           <w:iCs/>
           <w:lang w:eastAsia="ko-KR"/>
         </w:rPr>
-        <w:t xml:space="preserve">[ESCI-indexed; IF = </w:t>
+        <w:t>[</w:t>
+      </w:r>
+      <w:proofErr w:type="gramEnd"/>
+      <w:r>
+        <w:rPr>
+          <w:b/>
+          <w:bCs/>
+          <w:i/>
+          <w:iCs/>
+          <w:lang w:eastAsia="ko-KR"/>
+        </w:rPr>
+        <w:t xml:space="preserve">ESCI-indexed; IF = </w:t>
       </w:r>
       <w:r>
         <w:rPr>
@@ -13667,7 +13960,15 @@
           <w:rFonts w:hint="eastAsia"/>
           <w:lang w:eastAsia="ko-KR"/>
         </w:rPr>
-        <w:t>[3</w:t>
+        <w:t>[</w:t>
+      </w:r>
+      <w:proofErr w:type="gramStart"/>
+      <w:r>
+        <w:rPr>
+          <w:rFonts w:hint="eastAsia"/>
+          <w:lang w:eastAsia="ko-KR"/>
+        </w:rPr>
+        <w:t>3</w:t>
       </w:r>
       <w:r>
         <w:rPr>
@@ -13691,6 +13992,7 @@
         </w:rPr>
         <w:t>‡</w:t>
       </w:r>
+      <w:proofErr w:type="gramEnd"/>
       <w:r>
         <w:rPr>
           <w:rFonts w:hint="eastAsia"/>
@@ -13872,7 +14174,15 @@
           <w:rFonts w:hint="eastAsia"/>
           <w:lang w:eastAsia="ko-KR"/>
         </w:rPr>
-        <w:t>[3</w:t>
+        <w:t>[</w:t>
+      </w:r>
+      <w:proofErr w:type="gramStart"/>
+      <w:r>
+        <w:rPr>
+          <w:rFonts w:hint="eastAsia"/>
+          <w:lang w:eastAsia="ko-KR"/>
+        </w:rPr>
+        <w:t>3</w:t>
       </w:r>
       <w:r>
         <w:rPr>
@@ -13896,6 +14206,7 @@
         </w:rPr>
         <w:t>‡</w:t>
       </w:r>
+      <w:proofErr w:type="gramEnd"/>
       <w:r>
         <w:rPr>
           <w:rFonts w:hint="eastAsia"/>
@@ -14086,7 +14397,15 @@
           <w:rFonts w:hint="eastAsia"/>
           <w:lang w:eastAsia="ko-KR"/>
         </w:rPr>
-        <w:t>[3</w:t>
+        <w:t>[</w:t>
+      </w:r>
+      <w:proofErr w:type="gramStart"/>
+      <w:r>
+        <w:rPr>
+          <w:rFonts w:hint="eastAsia"/>
+          <w:lang w:eastAsia="ko-KR"/>
+        </w:rPr>
+        <w:t>3</w:t>
       </w:r>
       <w:r>
         <w:rPr>
@@ -14110,6 +14429,7 @@
         </w:rPr>
         <w:t>‡</w:t>
       </w:r>
+      <w:proofErr w:type="gramEnd"/>
       <w:r>
         <w:rPr>
           <w:rFonts w:hint="eastAsia"/>
@@ -14564,6 +14884,7 @@
         </w:rPr>
         <w:t>[</w:t>
       </w:r>
+      <w:proofErr w:type="gramStart"/>
       <w:r>
         <w:rPr>
           <w:bCs/>
@@ -14592,6 +14913,7 @@
         </w:rPr>
         <w:t>‡</w:t>
       </w:r>
+      <w:proofErr w:type="gramEnd"/>
       <w:r>
         <w:rPr>
           <w:rFonts w:hint="eastAsia"/>
@@ -15034,7 +15356,21 @@
         <w:rPr>
           <w:bCs/>
         </w:rPr>
-        <w:t xml:space="preserve">nvironment:  A </w:t>
+        <w:t>nvironment</w:t>
+      </w:r>
+      <w:proofErr w:type="gramStart"/>
+      <w:r>
+        <w:rPr>
+          <w:bCs/>
+        </w:rPr>
+        <w:t>:  A</w:t>
+      </w:r>
+      <w:proofErr w:type="gramEnd"/>
+      <w:r>
+        <w:rPr>
+          <w:bCs/>
+        </w:rPr>
+        <w:t xml:space="preserve"> </w:t>
       </w:r>
       <w:r>
         <w:rPr>
@@ -15173,8 +15509,23 @@
         <w:rPr>
           <w:bCs/>
         </w:rPr>
-        <w:t xml:space="preserve">). Utilizing generative artificial intelligence for instructional design: Exploring strengths, weakness, opportunities, and threats. </w:t>
-      </w:r>
+        <w:t xml:space="preserve">). Utilizing generative artificial intelligence for instructional design: Exploring strengths, </w:t>
+      </w:r>
+      <w:proofErr w:type="gramStart"/>
+      <w:r>
+        <w:rPr>
+          <w:bCs/>
+        </w:rPr>
+        <w:t>weakness</w:t>
+      </w:r>
+      <w:proofErr w:type="gramEnd"/>
+      <w:r>
+        <w:rPr>
+          <w:bCs/>
+        </w:rPr>
+        <w:t xml:space="preserve">, opportunities, and threats. </w:t>
+      </w:r>
+      <w:proofErr w:type="spellStart"/>
       <w:r>
         <w:rPr>
           <w:bCs/>
@@ -15183,6 +15534,7 @@
         </w:rPr>
         <w:t>TechTrends</w:t>
       </w:r>
+      <w:proofErr w:type="spellEnd"/>
       <w:r>
         <w:rPr>
           <w:rFonts w:hint="eastAsia"/>
@@ -15345,6 +15697,7 @@
       <w:r>
         <w:t>[</w:t>
       </w:r>
+      <w:proofErr w:type="gramStart"/>
       <w:r>
         <w:t>29</w:t>
       </w:r>
@@ -15359,6 +15712,7 @@
         </w:rPr>
         <w:t>‡</w:t>
       </w:r>
+      <w:proofErr w:type="gramEnd"/>
       <w:r>
         <w:rPr>
           <w:rFonts w:hint="eastAsia"/>
@@ -15380,7 +15734,15 @@
         <w:t>Moon, J.</w:t>
       </w:r>
       <w:r>
-        <w:t xml:space="preserve">, Yeo, S., Si, Q., &amp; Ljeluola, </w:t>
+        <w:t xml:space="preserve">, Yeo, S., Si, Q., &amp; </w:t>
+      </w:r>
+      <w:proofErr w:type="spellStart"/>
+      <w:r>
+        <w:t>Ljeluola</w:t>
+      </w:r>
+      <w:proofErr w:type="spellEnd"/>
+      <w:r>
+        <w:t xml:space="preserve">, </w:t>
       </w:r>
       <w:r>
         <w:t xml:space="preserve">A. </w:t>
@@ -15440,6 +15802,7 @@
           <w:t>https://doi.org/10.1080/0020739X.2024.2337934</w:t>
         </w:r>
       </w:hyperlink>
+      <w:proofErr w:type="gramStart"/>
       <w:r>
         <w:t xml:space="preserve">   </w:t>
       </w:r>
@@ -15450,7 +15813,17 @@
           <w:i/>
           <w:iCs/>
         </w:rPr>
-        <w:t>[ESCI-indexed, IF = 0.</w:t>
+        <w:t>[</w:t>
+      </w:r>
+      <w:proofErr w:type="gramEnd"/>
+      <w:r>
+        <w:rPr>
+          <w:b/>
+          <w:bCs/>
+          <w:i/>
+          <w:iCs/>
+        </w:rPr>
+        <w:t>ESCI-indexed, IF = 0.</w:t>
       </w:r>
       <w:r>
         <w:rPr>
@@ -15522,7 +15895,11 @@
         </w:rPr>
       </w:pPr>
       <w:r>
-        <w:t>[2</w:t>
+        <w:t>[</w:t>
+      </w:r>
+      <w:proofErr w:type="gramStart"/>
+      <w:r>
+        <w:t>2</w:t>
       </w:r>
       <w:r>
         <w:t>8</w:t>
@@ -15538,6 +15915,7 @@
         </w:rPr>
         <w:t>‡</w:t>
       </w:r>
+      <w:proofErr w:type="gramEnd"/>
       <w:r>
         <w:rPr>
           <w:rFonts w:hint="eastAsia"/>
@@ -15574,7 +15952,15 @@
         <w:t>2024</w:t>
       </w:r>
       <w:r>
-        <w:t xml:space="preserve">). Applying multimodal data fusion to track autistic adolescents’ representational flexibility development during virtual reality-based training . </w:t>
+        <w:t xml:space="preserve">). Applying multimodal data fusion to track autistic adolescents’ representational flexibility development during virtual reality-based </w:t>
+      </w:r>
+      <w:proofErr w:type="gramStart"/>
+      <w:r>
+        <w:t>training .</w:t>
+      </w:r>
+      <w:proofErr w:type="gramEnd"/>
+      <w:r>
+        <w:t xml:space="preserve"> </w:t>
       </w:r>
       <w:r>
         <w:rPr>
@@ -15650,7 +16036,15 @@
         <w:t>Moon, J</w:t>
       </w:r>
       <w:r>
-        <w:t>., &amp; Drachsler, H. (</w:t>
+        <w:t xml:space="preserve">., &amp; </w:t>
+      </w:r>
+      <w:proofErr w:type="spellStart"/>
+      <w:r>
+        <w:t>Drachsler</w:t>
+      </w:r>
+      <w:proofErr w:type="spellEnd"/>
+      <w:r>
+        <w:t>, H. (</w:t>
       </w:r>
       <w:r>
         <w:t>2024</w:t>
@@ -15973,6 +16367,7 @@
           <w:t>https://doi.org/10.1007/s10648-024-09855-4</w:t>
         </w:r>
       </w:hyperlink>
+      <w:proofErr w:type="gramStart"/>
       <w:r>
         <w:t xml:space="preserve">  </w:t>
       </w:r>
@@ -15990,7 +16385,17 @@
           <w:i/>
           <w:iCs/>
         </w:rPr>
-        <w:t xml:space="preserve">[SSCI-indexed, IF = </w:t>
+        <w:t>[</w:t>
+      </w:r>
+      <w:proofErr w:type="gramEnd"/>
+      <w:r>
+        <w:rPr>
+          <w:b/>
+          <w:bCs/>
+          <w:i/>
+          <w:iCs/>
+        </w:rPr>
+        <w:t xml:space="preserve">SSCI-indexed, IF = </w:t>
       </w:r>
       <w:r>
         <w:rPr>
@@ -16128,7 +16533,11 @@
         </w:rPr>
       </w:pPr>
       <w:r>
-        <w:t>[2</w:t>
+        <w:t>[</w:t>
+      </w:r>
+      <w:proofErr w:type="gramStart"/>
+      <w:r>
+        <w:t>2</w:t>
       </w:r>
       <w:r>
         <w:t>4</w:t>
@@ -16144,6 +16553,7 @@
         </w:rPr>
         <w:t>‡</w:t>
       </w:r>
+      <w:proofErr w:type="gramEnd"/>
       <w:r>
         <w:rPr>
           <w:rFonts w:hint="eastAsia"/>
@@ -16764,19 +17174,29 @@
           <w:i/>
           <w:iCs/>
         </w:rPr>
-        <w:t xml:space="preserve"> = </w:t>
-      </w:r>
-      <w:r>
-        <w:rPr>
-          <w:rFonts w:hint="eastAsia"/>
-          <w:b/>
-          <w:bCs/>
-          <w:i/>
-          <w:iCs/>
-          <w:lang w:eastAsia="ko-KR"/>
-        </w:rPr>
         <w:t xml:space="preserve"> </w:t>
       </w:r>
+      <w:proofErr w:type="gramStart"/>
+      <w:r>
+        <w:rPr>
+          <w:b/>
+          <w:bCs/>
+          <w:i/>
+          <w:iCs/>
+        </w:rPr>
+        <w:t xml:space="preserve">= </w:t>
+      </w:r>
+      <w:r>
+        <w:rPr>
+          <w:rFonts w:hint="eastAsia"/>
+          <w:b/>
+          <w:bCs/>
+          <w:i/>
+          <w:iCs/>
+          <w:lang w:eastAsia="ko-KR"/>
+        </w:rPr>
+        <w:t xml:space="preserve"> </w:t>
+      </w:r>
       <w:r>
         <w:rPr>
           <w:rFonts w:hint="eastAsia"/>
@@ -16826,7 +17246,14 @@
         <w:rPr>
           <w:rFonts w:ascii="Tahoma" w:hAnsi="Tahoma" w:cs="Tahoma"/>
         </w:rPr>
-        <w:t>﻿﻿</w:t>
+        <w:t>﻿</w:t>
+      </w:r>
+      <w:proofErr w:type="gramEnd"/>
+      <w:r>
+        <w:rPr>
+          <w:rFonts w:ascii="Tahoma" w:hAnsi="Tahoma" w:cs="Tahoma"/>
+        </w:rPr>
+        <w:t>﻿</w:t>
       </w:r>
     </w:p>
     <w:p>
@@ -16839,6 +17266,7 @@
       <w:r>
         <w:t>0</w:t>
       </w:r>
+      <w:proofErr w:type="gramStart"/>
       <w:r>
         <w:t xml:space="preserve">]  </w:t>
       </w:r>
@@ -16850,6 +17278,7 @@
         </w:rPr>
         <w:t>‡</w:t>
       </w:r>
+      <w:proofErr w:type="gramEnd"/>
       <w:r>
         <w:rPr>
           <w:rFonts w:hint="eastAsia"/>
@@ -17208,7 +17637,11 @@
         </w:rPr>
       </w:pPr>
       <w:r>
-        <w:t>[1</w:t>
+        <w:t>[</w:t>
+      </w:r>
+      <w:proofErr w:type="gramStart"/>
+      <w:r>
+        <w:t>1</w:t>
       </w:r>
       <w:r>
         <w:t>8</w:t>
@@ -17224,6 +17657,7 @@
         </w:rPr>
         <w:t>‡</w:t>
       </w:r>
+      <w:proofErr w:type="gramEnd"/>
       <w:r>
         <w:rPr>
           <w:rFonts w:hint="eastAsia"/>
@@ -17880,7 +18314,11 @@
         <w:ind w:left="720" w:hanging="720"/>
       </w:pPr>
       <w:r>
-        <w:t xml:space="preserve">[15] </w:t>
+        <w:t>[</w:t>
+      </w:r>
+      <w:proofErr w:type="gramStart"/>
+      <w:r>
+        <w:t xml:space="preserve">15] </w:t>
       </w:r>
       <w:r>
         <w:rPr>
@@ -17890,6 +18328,7 @@
         </w:rPr>
         <w:t>‡</w:t>
       </w:r>
+      <w:proofErr w:type="gramEnd"/>
       <w:r>
         <w:rPr>
           <w:rFonts w:hint="eastAsia"/>
@@ -18105,6 +18544,7 @@
       <w:r>
         <w:t xml:space="preserve"> </w:t>
       </w:r>
+      <w:proofErr w:type="spellStart"/>
       <w:r>
         <w:rPr>
           <w:i/>
@@ -18112,6 +18552,7 @@
         </w:rPr>
         <w:t>TechTrends</w:t>
       </w:r>
+      <w:proofErr w:type="spellEnd"/>
       <w:r>
         <w:rPr>
           <w:i/>
@@ -18398,7 +18839,17 @@
           <w:i/>
           <w:iCs/>
         </w:rPr>
-        <w:t xml:space="preserve"> = </w:t>
+        <w:t xml:space="preserve"> </w:t>
+      </w:r>
+      <w:proofErr w:type="gramStart"/>
+      <w:r>
+        <w:rPr>
+          <w:b/>
+          <w:bCs/>
+          <w:i/>
+          <w:iCs/>
+        </w:rPr>
+        <w:t xml:space="preserve">= </w:t>
       </w:r>
       <w:r>
         <w:rPr>
@@ -18422,6 +18873,7 @@
         </w:rPr>
         <w:t>3</w:t>
       </w:r>
+      <w:proofErr w:type="gramEnd"/>
       <w:r>
         <w:rPr>
           <w:b/>
@@ -18450,7 +18902,11 @@
         </w:rPr>
       </w:pPr>
       <w:r>
-        <w:t xml:space="preserve">[12] </w:t>
+        <w:t>[</w:t>
+      </w:r>
+      <w:proofErr w:type="gramStart"/>
+      <w:r>
+        <w:t xml:space="preserve">12] </w:t>
       </w:r>
       <w:r>
         <w:rPr>
@@ -18460,6 +18916,7 @@
         </w:rPr>
         <w:t>‡</w:t>
       </w:r>
+      <w:proofErr w:type="gramEnd"/>
       <w:r>
         <w:rPr>
           <w:rFonts w:hint="eastAsia"/>
@@ -18526,6 +18983,7 @@
           <w:t>https://doi.org/10.1007/s10798-021-09672-8</w:t>
         </w:r>
       </w:hyperlink>
+      <w:proofErr w:type="gramStart"/>
       <w:r>
         <w:t xml:space="preserve"> </w:t>
       </w:r>
@@ -18541,7 +18999,16 @@
           <w:i/>
           <w:iCs/>
         </w:rPr>
-        <w:t>[SCIE- and SSCI-indexed</w:t>
+        <w:t>[</w:t>
+      </w:r>
+      <w:proofErr w:type="gramEnd"/>
+      <w:r>
+        <w:rPr>
+          <w:b/>
+          <w:i/>
+          <w:iCs/>
+        </w:rPr>
+        <w:t>SCIE- and SSCI-indexed</w:t>
       </w:r>
       <w:r>
         <w:rPr>
@@ -18601,7 +19068,17 @@
           <w:i/>
           <w:iCs/>
         </w:rPr>
-        <w:t xml:space="preserve"> = </w:t>
+        <w:t xml:space="preserve"> </w:t>
+      </w:r>
+      <w:proofErr w:type="gramStart"/>
+      <w:r>
+        <w:rPr>
+          <w:b/>
+          <w:bCs/>
+          <w:i/>
+          <w:iCs/>
+        </w:rPr>
+        <w:t xml:space="preserve">= </w:t>
       </w:r>
       <w:r>
         <w:rPr>
@@ -18625,6 +19102,7 @@
         </w:rPr>
         <w:t>8</w:t>
       </w:r>
+      <w:proofErr w:type="gramEnd"/>
       <w:r>
         <w:rPr>
           <w:b/>
@@ -18655,7 +19133,11 @@
         </w:rPr>
       </w:pPr>
       <w:r>
-        <w:t xml:space="preserve">[11] </w:t>
+        <w:t>[</w:t>
+      </w:r>
+      <w:proofErr w:type="gramStart"/>
+      <w:r>
+        <w:t xml:space="preserve">11] </w:t>
       </w:r>
       <w:r>
         <w:rPr>
@@ -18665,6 +19147,7 @@
         </w:rPr>
         <w:t>‡</w:t>
       </w:r>
+      <w:proofErr w:type="gramEnd"/>
       <w:r>
         <w:rPr>
           <w:rFonts w:hint="eastAsia"/>
@@ -18722,6 +19205,7 @@
           <w:t>https://doi.org/10.19173/irrodl.v22i1.5110</w:t>
         </w:r>
       </w:hyperlink>
+      <w:proofErr w:type="gramStart"/>
       <w:r>
         <w:t xml:space="preserve"> </w:t>
       </w:r>
@@ -18733,7 +19217,15 @@
           <w:b/>
           <w:i/>
         </w:rPr>
-        <w:t>[SSCI-indexed</w:t>
+        <w:t>[</w:t>
+      </w:r>
+      <w:proofErr w:type="gramEnd"/>
+      <w:r>
+        <w:rPr>
+          <w:b/>
+          <w:i/>
+        </w:rPr>
+        <w:t>SSCI-indexed</w:t>
       </w:r>
       <w:r>
         <w:rPr>
@@ -19042,7 +19534,17 @@
           <w:i/>
           <w:iCs/>
         </w:rPr>
-        <w:t xml:space="preserve"> = </w:t>
+        <w:t xml:space="preserve"> </w:t>
+      </w:r>
+      <w:proofErr w:type="gramStart"/>
+      <w:r>
+        <w:rPr>
+          <w:b/>
+          <w:bCs/>
+          <w:i/>
+          <w:iCs/>
+        </w:rPr>
+        <w:t xml:space="preserve">= </w:t>
       </w:r>
       <w:r>
         <w:rPr>
@@ -19066,6 +19568,7 @@
         </w:rPr>
         <w:t>2</w:t>
       </w:r>
+      <w:proofErr w:type="gramEnd"/>
       <w:r>
         <w:rPr>
           <w:b/>
@@ -19095,7 +19598,11 @@
         </w:rPr>
       </w:pPr>
       <w:r>
-        <w:t xml:space="preserve">[9] </w:t>
+        <w:t>[</w:t>
+      </w:r>
+      <w:proofErr w:type="gramStart"/>
+      <w:r>
+        <w:t xml:space="preserve">9] </w:t>
       </w:r>
       <w:r>
         <w:rPr>
@@ -19105,6 +19612,7 @@
         </w:rPr>
         <w:t>‡</w:t>
       </w:r>
+      <w:proofErr w:type="gramEnd"/>
       <w:r>
         <w:rPr>
           <w:rFonts w:hint="eastAsia"/>
@@ -19252,7 +19760,17 @@
           <w:i/>
           <w:iCs/>
         </w:rPr>
-        <w:t xml:space="preserve"> = </w:t>
+        <w:t xml:space="preserve"> </w:t>
+      </w:r>
+      <w:proofErr w:type="gramStart"/>
+      <w:r>
+        <w:rPr>
+          <w:b/>
+          <w:bCs/>
+          <w:i/>
+          <w:iCs/>
+        </w:rPr>
+        <w:t xml:space="preserve">= </w:t>
       </w:r>
       <w:r>
         <w:rPr>
@@ -19265,6 +19783,7 @@
         </w:rPr>
         <w:t xml:space="preserve"> 8.1</w:t>
       </w:r>
+      <w:proofErr w:type="gramEnd"/>
       <w:r>
         <w:rPr>
           <w:b/>
@@ -19534,7 +20053,11 @@
         </w:rPr>
       </w:pPr>
       <w:r>
-        <w:t xml:space="preserve">[7] </w:t>
+        <w:t>[</w:t>
+      </w:r>
+      <w:proofErr w:type="gramStart"/>
+      <w:r>
+        <w:t xml:space="preserve">7] </w:t>
       </w:r>
       <w:r>
         <w:rPr>
@@ -19544,6 +20067,7 @@
         </w:rPr>
         <w:t>‡</w:t>
       </w:r>
+      <w:proofErr w:type="gramEnd"/>
       <w:r>
         <w:rPr>
           <w:rFonts w:hint="eastAsia"/>
@@ -19745,7 +20269,11 @@
         </w:rPr>
       </w:pPr>
       <w:r>
-        <w:t xml:space="preserve">[6] </w:t>
+        <w:t>[</w:t>
+      </w:r>
+      <w:proofErr w:type="gramStart"/>
+      <w:r>
+        <w:t xml:space="preserve">6] </w:t>
       </w:r>
       <w:r>
         <w:rPr>
@@ -19755,6 +20283,7 @@
         </w:rPr>
         <w:t>‡</w:t>
       </w:r>
+      <w:proofErr w:type="gramEnd"/>
       <w:r>
         <w:rPr>
           <w:rFonts w:hint="eastAsia"/>
@@ -20082,7 +20611,11 @@
         </w:rPr>
       </w:pPr>
       <w:r>
-        <w:t xml:space="preserve">[4] </w:t>
+        <w:t>[</w:t>
+      </w:r>
+      <w:proofErr w:type="gramStart"/>
+      <w:r>
+        <w:t xml:space="preserve">4] </w:t>
       </w:r>
       <w:r>
         <w:rPr>
@@ -20092,6 +20625,7 @@
         </w:rPr>
         <w:t>‡</w:t>
       </w:r>
+      <w:proofErr w:type="gramEnd"/>
       <w:r>
         <w:rPr>
           <w:rFonts w:hint="eastAsia"/>
@@ -20239,19 +20773,29 @@
           <w:i/>
           <w:iCs/>
         </w:rPr>
-        <w:t xml:space="preserve"> = </w:t>
-      </w:r>
-      <w:r>
-        <w:rPr>
-          <w:rFonts w:hint="eastAsia"/>
-          <w:b/>
-          <w:bCs/>
-          <w:i/>
-          <w:iCs/>
-          <w:lang w:eastAsia="ko-KR"/>
-        </w:rPr>
         <w:t xml:space="preserve"> </w:t>
       </w:r>
+      <w:proofErr w:type="gramStart"/>
+      <w:r>
+        <w:rPr>
+          <w:b/>
+          <w:bCs/>
+          <w:i/>
+          <w:iCs/>
+        </w:rPr>
+        <w:t xml:space="preserve">= </w:t>
+      </w:r>
+      <w:r>
+        <w:rPr>
+          <w:rFonts w:hint="eastAsia"/>
+          <w:b/>
+          <w:bCs/>
+          <w:i/>
+          <w:iCs/>
+          <w:lang w:eastAsia="ko-KR"/>
+        </w:rPr>
+        <w:t xml:space="preserve"> </w:t>
+      </w:r>
       <w:r>
         <w:rPr>
           <w:rFonts w:hint="eastAsia"/>
@@ -20274,6 +20818,7 @@
         </w:rPr>
         <w:t>.0</w:t>
       </w:r>
+      <w:proofErr w:type="gramEnd"/>
       <w:r>
         <w:rPr>
           <w:b/>
@@ -20301,7 +20846,11 @@
         </w:rPr>
       </w:pPr>
       <w:r>
-        <w:t xml:space="preserve">[3] </w:t>
+        <w:t>[</w:t>
+      </w:r>
+      <w:proofErr w:type="gramStart"/>
+      <w:r>
+        <w:t xml:space="preserve">3] </w:t>
       </w:r>
       <w:r>
         <w:rPr>
@@ -20311,6 +20860,7 @@
         </w:rPr>
         <w:t>‡</w:t>
       </w:r>
+      <w:proofErr w:type="gramEnd"/>
       <w:r>
         <w:rPr>
           <w:rFonts w:hint="eastAsia"/>
@@ -20600,19 +21150,29 @@
           <w:i/>
           <w:iCs/>
         </w:rPr>
-        <w:t xml:space="preserve"> = </w:t>
-      </w:r>
-      <w:r>
-        <w:rPr>
-          <w:rFonts w:hint="eastAsia"/>
-          <w:b/>
-          <w:bCs/>
-          <w:i/>
-          <w:iCs/>
-          <w:lang w:eastAsia="ko-KR"/>
-        </w:rPr>
         <w:t xml:space="preserve"> </w:t>
       </w:r>
+      <w:proofErr w:type="gramStart"/>
+      <w:r>
+        <w:rPr>
+          <w:b/>
+          <w:bCs/>
+          <w:i/>
+          <w:iCs/>
+        </w:rPr>
+        <w:t xml:space="preserve">= </w:t>
+      </w:r>
+      <w:r>
+        <w:rPr>
+          <w:rFonts w:hint="eastAsia"/>
+          <w:b/>
+          <w:bCs/>
+          <w:i/>
+          <w:iCs/>
+          <w:lang w:eastAsia="ko-KR"/>
+        </w:rPr>
+        <w:t xml:space="preserve"> </w:t>
+      </w:r>
       <w:r>
         <w:rPr>
           <w:rFonts w:hint="eastAsia"/>
@@ -20646,6 +21206,7 @@
         </w:rPr>
         <w:t>1</w:t>
       </w:r>
+      <w:proofErr w:type="gramEnd"/>
       <w:r>
         <w:rPr>
           <w:b/>
@@ -20673,7 +21234,11 @@
         </w:rPr>
       </w:pPr>
       <w:r>
-        <w:t xml:space="preserve">[1] </w:t>
+        <w:t>[</w:t>
+      </w:r>
+      <w:proofErr w:type="gramStart"/>
+      <w:r>
+        <w:t xml:space="preserve">1] </w:t>
       </w:r>
       <w:r>
         <w:rPr>
@@ -20683,6 +21248,7 @@
         </w:rPr>
         <w:t>‡</w:t>
       </w:r>
+      <w:proofErr w:type="gramEnd"/>
       <w:r>
         <w:rPr>
           <w:rFonts w:hint="eastAsia"/>
@@ -20900,7 +21466,21 @@
         <w:rPr>
           <w:color w:val="212121"/>
         </w:rPr>
-        <w:t xml:space="preserve">. (2020). Exploring synchronous online course cases on secondary schools via </w:t>
+        <w:t xml:space="preserve">. (2020). Exploring synchronous online course cases </w:t>
+      </w:r>
+      <w:proofErr w:type="gramStart"/>
+      <w:r>
+        <w:rPr>
+          <w:color w:val="212121"/>
+        </w:rPr>
+        <w:t>on</w:t>
+      </w:r>
+      <w:proofErr w:type="gramEnd"/>
+      <w:r>
+        <w:rPr>
+          <w:color w:val="212121"/>
+        </w:rPr>
+        <w:t xml:space="preserve"> secondary schools via </w:t>
       </w:r>
       <w:r>
         <w:t>semantic</w:t>
@@ -21139,10 +21719,34 @@
         <w:t xml:space="preserve">Instructional Technology and Learning Sciences: Korean Open Access Guide. </w:t>
       </w:r>
       <w:r>
-        <w:t>Korean Edutech/LearningSciences Researcher Network (KELS).</w:t>
-      </w:r>
-      <w:r>
-        <w:t xml:space="preserve"> EdtechBooks. </w:t>
+        <w:t xml:space="preserve">Korean </w:t>
+      </w:r>
+      <w:proofErr w:type="spellStart"/>
+      <w:r>
+        <w:t>Edutech</w:t>
+      </w:r>
+      <w:proofErr w:type="spellEnd"/>
+      <w:r>
+        <w:t>/</w:t>
+      </w:r>
+      <w:proofErr w:type="spellStart"/>
+      <w:r>
+        <w:t>LearningSciences</w:t>
+      </w:r>
+      <w:proofErr w:type="spellEnd"/>
+      <w:r>
+        <w:t xml:space="preserve"> Researcher Network (KELS).</w:t>
+      </w:r>
+      <w:r>
+        <w:t xml:space="preserve"> </w:t>
+      </w:r>
+      <w:proofErr w:type="spellStart"/>
+      <w:r>
+        <w:t>EdtechBooks</w:t>
+      </w:r>
+      <w:proofErr w:type="spellEnd"/>
+      <w:r>
+        <w:t xml:space="preserve">. </w:t>
       </w:r>
       <w:hyperlink r:id="rId71" w:history="1">
         <w:r>
@@ -21427,6 +22031,7 @@
         </w:rPr>
         <w:t xml:space="preserve">] </w:t>
       </w:r>
+      <w:proofErr w:type="gramStart"/>
       <w:r>
         <w:t xml:space="preserve">‡ </w:t>
       </w:r>
@@ -21435,7 +22040,15 @@
           <w:b/>
           <w:lang w:eastAsia="ko-KR"/>
         </w:rPr>
-        <w:t xml:space="preserve"> Moon, J</w:t>
+        <w:t xml:space="preserve"> Moon</w:t>
+      </w:r>
+      <w:proofErr w:type="gramEnd"/>
+      <w:r>
+        <w:rPr>
+          <w:b/>
+          <w:lang w:eastAsia="ko-KR"/>
+        </w:rPr>
+        <w:t>, J</w:t>
       </w:r>
       <w:r>
         <w:rPr>
@@ -21457,7 +22070,23 @@
           <w:bCs/>
           <w:lang w:eastAsia="ko-KR"/>
         </w:rPr>
-        <w:t xml:space="preserve">reasoning: AI-mediated dilemma spaces and exploratory learning. In A. Darejeh &amp; S. Sepasgozar (Eds.), </w:t>
+        <w:t xml:space="preserve">reasoning: AI-mediated dilemma spaces and exploratory learning. In A. Darejeh &amp; S. </w:t>
+      </w:r>
+      <w:proofErr w:type="spellStart"/>
+      <w:r>
+        <w:rPr>
+          <w:bCs/>
+          <w:lang w:eastAsia="ko-KR"/>
+        </w:rPr>
+        <w:t>Sepasgozar</w:t>
+      </w:r>
+      <w:proofErr w:type="spellEnd"/>
+      <w:r>
+        <w:rPr>
+          <w:bCs/>
+          <w:lang w:eastAsia="ko-KR"/>
+        </w:rPr>
+        <w:t xml:space="preserve"> (Eds.), </w:t>
       </w:r>
       <w:r>
         <w:rPr>
@@ -21496,6 +22125,7 @@
         </w:rPr>
         <w:t>7</w:t>
       </w:r>
+      <w:proofErr w:type="gramStart"/>
       <w:r>
         <w:rPr>
           <w:rFonts w:hint="eastAsia"/>
@@ -21519,6 +22149,7 @@
         </w:rPr>
         <w:t>‡</w:t>
       </w:r>
+      <w:proofErr w:type="gramEnd"/>
       <w:r>
         <w:rPr>
           <w:rFonts w:hint="eastAsia"/>
@@ -21836,7 +22467,15 @@
         <w:t>Moon, J</w:t>
       </w:r>
       <w:r>
-        <w:t xml:space="preserve">., and West, L. (2021). Designing Dynamic Learning Supports for Game and Simulation-Based Learning in STEM Education, Aprea C. and Ifenthaler, D.(eds.) in </w:t>
+        <w:t xml:space="preserve">., and West, L. (2021). Designing Dynamic Learning Supports for Game and Simulation-Based Learning in STEM Education, Aprea C. and </w:t>
+      </w:r>
+      <w:proofErr w:type="spellStart"/>
+      <w:r>
+        <w:t>Ifenthaler</w:t>
+      </w:r>
+      <w:proofErr w:type="spellEnd"/>
+      <w:r>
+        <w:t xml:space="preserve">, D.(eds.) in </w:t>
       </w:r>
       <w:r>
         <w:rPr>
@@ -22138,7 +22777,27 @@
           <w:szCs w:val="22"/>
           <w:u w:val="single"/>
         </w:rPr>
-        <w:t>Note. * indicates the work with a mentoring student</w:t>
+        <w:t xml:space="preserve">Note. * </w:t>
+      </w:r>
+      <w:proofErr w:type="gramStart"/>
+      <w:r>
+        <w:rPr>
+          <w:bCs/>
+          <w:sz w:val="22"/>
+          <w:szCs w:val="22"/>
+          <w:u w:val="single"/>
+        </w:rPr>
+        <w:t>indicates</w:t>
+      </w:r>
+      <w:proofErr w:type="gramEnd"/>
+      <w:r>
+        <w:rPr>
+          <w:bCs/>
+          <w:sz w:val="22"/>
+          <w:szCs w:val="22"/>
+          <w:u w:val="single"/>
+        </w:rPr>
+        <w:t xml:space="preserve"> the work with a mentoring student</w:t>
       </w:r>
     </w:p>
     <w:p>
@@ -22157,6 +22816,7 @@
         </w:rPr>
         <w:t xml:space="preserve">[21] </w:t>
       </w:r>
+      <w:proofErr w:type="gramStart"/>
       <w:r>
         <w:rPr>
           <w:bCs/>
@@ -22180,7 +22840,15 @@
           <w:bCs/>
           <w:lang w:eastAsia="ko-KR"/>
         </w:rPr>
-        <w:t xml:space="preserve">Liu, Z., </w:t>
+        <w:t>Liu</w:t>
+      </w:r>
+      <w:proofErr w:type="gramEnd"/>
+      <w:r>
+        <w:rPr>
+          <w:bCs/>
+          <w:lang w:eastAsia="ko-KR"/>
+        </w:rPr>
+        <w:t xml:space="preserve">, Z., </w:t>
       </w:r>
       <w:r>
         <w:rPr>
@@ -23077,7 +23745,21 @@
         <w:rPr>
           <w:color w:val="212121"/>
         </w:rPr>
-        <w:t>., Ke, F., &amp; Dahlstrom-Hakki, I. (2021). Methodological considerations for understanding students’ problem solving processes and affective trajectories during game-based learning: A data fusion approach</w:t>
+        <w:t xml:space="preserve">., Ke, F., &amp; Dahlstrom-Hakki, I. (2021). Methodological considerations for understanding students’ </w:t>
+      </w:r>
+      <w:proofErr w:type="gramStart"/>
+      <w:r>
+        <w:rPr>
+          <w:color w:val="212121"/>
+        </w:rPr>
+        <w:t>problem solving</w:t>
+      </w:r>
+      <w:proofErr w:type="gramEnd"/>
+      <w:r>
+        <w:rPr>
+          <w:color w:val="212121"/>
+        </w:rPr>
+        <w:t xml:space="preserve"> processes and affective trajectories during game-based learning: A data fusion approach</w:t>
       </w:r>
       <w:r>
         <w:rPr>
@@ -23211,7 +23893,15 @@
         <w:t>Moon, J.</w:t>
       </w:r>
       <w:r>
-        <w:t xml:space="preserve"> &amp; Ke, F. (2020). Exploring learning supports in virtual reality-based flexibility training for adolescents with autism. In Melissa Gresalfi, &amp; Ilana Seidel Horn (Eds.), </w:t>
+        <w:t xml:space="preserve"> &amp; Ke, F. (2020). Exploring learning </w:t>
+      </w:r>
+      <w:proofErr w:type="gramStart"/>
+      <w:r>
+        <w:t>supports in</w:t>
+      </w:r>
+      <w:proofErr w:type="gramEnd"/>
+      <w:r>
+        <w:t xml:space="preserve"> virtual reality-based flexibility training for adolescents with autism. In Melissa Gresalfi, &amp; Ilana Seidel Horn (Eds.), </w:t>
       </w:r>
       <w:r>
         <w:rPr>
@@ -23842,7 +24532,27 @@
           <w:szCs w:val="22"/>
           <w:u w:val="single"/>
         </w:rPr>
-        <w:t>Note. * indicates the work with a mentoring student</w:t>
+        <w:t xml:space="preserve">Note. * </w:t>
+      </w:r>
+      <w:proofErr w:type="gramStart"/>
+      <w:r>
+        <w:rPr>
+          <w:bCs/>
+          <w:sz w:val="22"/>
+          <w:szCs w:val="22"/>
+          <w:u w:val="single"/>
+        </w:rPr>
+        <w:t>indicates</w:t>
+      </w:r>
+      <w:proofErr w:type="gramEnd"/>
+      <w:r>
+        <w:rPr>
+          <w:bCs/>
+          <w:sz w:val="22"/>
+          <w:szCs w:val="22"/>
+          <w:u w:val="single"/>
+        </w:rPr>
+        <w:t xml:space="preserve"> the work with a mentoring student</w:t>
       </w:r>
     </w:p>
     <w:p>
@@ -23943,10 +24653,23 @@
           <w:bCs/>
           <w:lang w:eastAsia="ko-KR"/>
         </w:rPr>
-        <w:t xml:space="preserve">[69] </w:t>
-      </w:r>
-      <w:r>
-        <w:t xml:space="preserve">‡ </w:t>
+        <w:t>[</w:t>
+      </w:r>
+      <w:proofErr w:type="gramStart"/>
+      <w:r>
+        <w:rPr>
+          <w:rFonts w:hint="eastAsia"/>
+          <w:bCs/>
+          <w:lang w:eastAsia="ko-KR"/>
+        </w:rPr>
+        <w:t xml:space="preserve">69] </w:t>
+      </w:r>
+      <w:r>
+        <w:t>‡</w:t>
+      </w:r>
+      <w:proofErr w:type="gramEnd"/>
+      <w:r>
+        <w:t xml:space="preserve"> </w:t>
       </w:r>
       <w:r>
         <w:rPr>
@@ -23983,14 +24706,25 @@
         </w:rPr>
         <w:t xml:space="preserve">). </w:t>
       </w:r>
-      <w:r>
-        <w:rPr>
-          <w:bCs/>
-          <w:i/>
-          <w:iCs/>
-          <w:lang w:eastAsia="ko-KR"/>
-        </w:rPr>
-        <w:t>FieldExplorer: A network-based visualization platform for supporting novice researchers’ academic decision-making</w:t>
+      <w:proofErr w:type="spellStart"/>
+      <w:r>
+        <w:rPr>
+          <w:bCs/>
+          <w:i/>
+          <w:iCs/>
+          <w:lang w:eastAsia="ko-KR"/>
+        </w:rPr>
+        <w:t>FieldExplorer</w:t>
+      </w:r>
+      <w:proofErr w:type="spellEnd"/>
+      <w:r>
+        <w:rPr>
+          <w:bCs/>
+          <w:i/>
+          <w:iCs/>
+          <w:lang w:eastAsia="ko-KR"/>
+        </w:rPr>
+        <w:t>: A network-based visualization platform for supporting novice researchers’ academic decision-making</w:t>
       </w:r>
       <w:r>
         <w:rPr>
@@ -24038,10 +24772,23 @@
           <w:bCs/>
           <w:lang w:eastAsia="ko-KR"/>
         </w:rPr>
-        <w:t xml:space="preserve">[68] </w:t>
-      </w:r>
-      <w:r>
-        <w:t xml:space="preserve">‡ </w:t>
+        <w:t>[</w:t>
+      </w:r>
+      <w:proofErr w:type="gramStart"/>
+      <w:r>
+        <w:rPr>
+          <w:rFonts w:hint="eastAsia"/>
+          <w:bCs/>
+          <w:lang w:eastAsia="ko-KR"/>
+        </w:rPr>
+        <w:t xml:space="preserve">68] </w:t>
+      </w:r>
+      <w:r>
+        <w:t>‡</w:t>
+      </w:r>
+      <w:proofErr w:type="gramEnd"/>
+      <w:r>
+        <w:t xml:space="preserve"> </w:t>
       </w:r>
       <w:r>
         <w:rPr>
@@ -24078,14 +24825,25 @@
         </w:rPr>
         <w:t xml:space="preserve">). </w:t>
       </w:r>
-      <w:r>
-        <w:rPr>
-          <w:bCs/>
-          <w:i/>
-          <w:iCs/>
-          <w:lang w:eastAsia="ko-KR"/>
-        </w:rPr>
-        <w:t>SpeakWise: Capturing real-time reasoning evidence traces through AI-mediated oral assessment</w:t>
+      <w:proofErr w:type="spellStart"/>
+      <w:r>
+        <w:rPr>
+          <w:bCs/>
+          <w:i/>
+          <w:iCs/>
+          <w:lang w:eastAsia="ko-KR"/>
+        </w:rPr>
+        <w:t>SpeakWise</w:t>
+      </w:r>
+      <w:proofErr w:type="spellEnd"/>
+      <w:r>
+        <w:rPr>
+          <w:bCs/>
+          <w:i/>
+          <w:iCs/>
+          <w:lang w:eastAsia="ko-KR"/>
+        </w:rPr>
+        <w:t>: Capturing real-time reasoning evidence traces through AI-mediated oral assessment</w:t>
       </w:r>
       <w:r>
         <w:rPr>
@@ -24175,14 +24933,25 @@
         </w:rPr>
         <w:t xml:space="preserve">). </w:t>
       </w:r>
-      <w:r>
-        <w:rPr>
-          <w:i/>
-          <w:iCs/>
-          <w:color w:val="222222"/>
-          <w:lang w:eastAsia="ko-KR"/>
-        </w:rPr>
-        <w:t>ReviewLens: An AI-</w:t>
+      <w:proofErr w:type="spellStart"/>
+      <w:r>
+        <w:rPr>
+          <w:i/>
+          <w:iCs/>
+          <w:color w:val="222222"/>
+          <w:lang w:eastAsia="ko-KR"/>
+        </w:rPr>
+        <w:t>ReviewLens</w:t>
+      </w:r>
+      <w:proofErr w:type="spellEnd"/>
+      <w:r>
+        <w:rPr>
+          <w:i/>
+          <w:iCs/>
+          <w:color w:val="222222"/>
+          <w:lang w:eastAsia="ko-KR"/>
+        </w:rPr>
+        <w:t>: An AI-</w:t>
       </w:r>
       <w:r>
         <w:rPr>
@@ -24342,7 +25111,43 @@
           <w:color w:val="222222"/>
           <w:lang w:eastAsia="ko-KR"/>
         </w:rPr>
-        <w:t xml:space="preserve">. iLEAD Stream, iLRN 2026, </w:t>
+        <w:t xml:space="preserve">. </w:t>
+      </w:r>
+      <w:proofErr w:type="spellStart"/>
+      <w:r>
+        <w:rPr>
+          <w:rFonts w:hint="eastAsia"/>
+          <w:color w:val="222222"/>
+          <w:lang w:eastAsia="ko-KR"/>
+        </w:rPr>
+        <w:t>iLEAD</w:t>
+      </w:r>
+      <w:proofErr w:type="spellEnd"/>
+      <w:r>
+        <w:rPr>
+          <w:rFonts w:hint="eastAsia"/>
+          <w:color w:val="222222"/>
+          <w:lang w:eastAsia="ko-KR"/>
+        </w:rPr>
+        <w:t xml:space="preserve"> Stream, </w:t>
+      </w:r>
+      <w:proofErr w:type="spellStart"/>
+      <w:r>
+        <w:rPr>
+          <w:rFonts w:hint="eastAsia"/>
+          <w:color w:val="222222"/>
+          <w:lang w:eastAsia="ko-KR"/>
+        </w:rPr>
+        <w:t>iLRN</w:t>
+      </w:r>
+      <w:proofErr w:type="spellEnd"/>
+      <w:r>
+        <w:rPr>
+          <w:rFonts w:hint="eastAsia"/>
+          <w:color w:val="222222"/>
+          <w:lang w:eastAsia="ko-KR"/>
+        </w:rPr>
+        <w:t xml:space="preserve"> 2026, </w:t>
       </w:r>
       <w:r>
         <w:rPr>
@@ -24395,14 +25200,25 @@
         </w:rPr>
         <w:t xml:space="preserve">., Kim, T., Amayou, J. (2026, June). </w:t>
       </w:r>
-      <w:r>
-        <w:rPr>
-          <w:i/>
-          <w:iCs/>
-          <w:color w:val="222222"/>
-          <w:lang w:eastAsia="ko-KR"/>
-        </w:rPr>
-        <w:t xml:space="preserve">DataSandbox: Designing </w:t>
+      <w:proofErr w:type="spellStart"/>
+      <w:r>
+        <w:rPr>
+          <w:i/>
+          <w:iCs/>
+          <w:color w:val="222222"/>
+          <w:lang w:eastAsia="ko-KR"/>
+        </w:rPr>
+        <w:t>DataSandbox</w:t>
+      </w:r>
+      <w:proofErr w:type="spellEnd"/>
+      <w:r>
+        <w:rPr>
+          <w:i/>
+          <w:iCs/>
+          <w:color w:val="222222"/>
+          <w:lang w:eastAsia="ko-KR"/>
+        </w:rPr>
+        <w:t xml:space="preserve">: Designing </w:t>
       </w:r>
       <w:r>
         <w:rPr>
@@ -24524,7 +25340,43 @@
           <w:color w:val="222222"/>
           <w:lang w:eastAsia="ko-KR"/>
         </w:rPr>
-        <w:t xml:space="preserve">. iLEAD Stream, iLRN 2026, </w:t>
+        <w:t xml:space="preserve">. </w:t>
+      </w:r>
+      <w:proofErr w:type="spellStart"/>
+      <w:r>
+        <w:rPr>
+          <w:rFonts w:hint="eastAsia"/>
+          <w:color w:val="222222"/>
+          <w:lang w:eastAsia="ko-KR"/>
+        </w:rPr>
+        <w:t>iLEAD</w:t>
+      </w:r>
+      <w:proofErr w:type="spellEnd"/>
+      <w:r>
+        <w:rPr>
+          <w:rFonts w:hint="eastAsia"/>
+          <w:color w:val="222222"/>
+          <w:lang w:eastAsia="ko-KR"/>
+        </w:rPr>
+        <w:t xml:space="preserve"> Stream, </w:t>
+      </w:r>
+      <w:proofErr w:type="spellStart"/>
+      <w:r>
+        <w:rPr>
+          <w:rFonts w:hint="eastAsia"/>
+          <w:color w:val="222222"/>
+          <w:lang w:eastAsia="ko-KR"/>
+        </w:rPr>
+        <w:t>iLRN</w:t>
+      </w:r>
+      <w:proofErr w:type="spellEnd"/>
+      <w:r>
+        <w:rPr>
+          <w:rFonts w:hint="eastAsia"/>
+          <w:color w:val="222222"/>
+          <w:lang w:eastAsia="ko-KR"/>
+        </w:rPr>
+        <w:t xml:space="preserve"> 2026, </w:t>
       </w:r>
       <w:r>
         <w:rPr>
@@ -25768,6 +26620,7 @@
         </w:rPr>
         <w:t xml:space="preserve">raining: A </w:t>
       </w:r>
+      <w:proofErr w:type="spellStart"/>
       <w:r>
         <w:rPr>
           <w:rFonts w:hint="eastAsia"/>
@@ -25785,7 +26638,17 @@
           <w:color w:val="222222"/>
           <w:lang w:eastAsia="ko-KR"/>
         </w:rPr>
-        <w:t xml:space="preserve">icrogenetic and </w:t>
+        <w:t>icrogenetic</w:t>
+      </w:r>
+      <w:proofErr w:type="spellEnd"/>
+      <w:r>
+        <w:rPr>
+          <w:i/>
+          <w:iCs/>
+          <w:color w:val="222222"/>
+          <w:lang w:eastAsia="ko-KR"/>
+        </w:rPr>
+        <w:t xml:space="preserve"> and </w:t>
       </w:r>
       <w:r>
         <w:rPr>
@@ -26097,7 +26960,25 @@
           <w:color w:val="222222"/>
           <w:lang w:eastAsia="ko-KR"/>
         </w:rPr>
-        <w:t xml:space="preserve">., Lim, J., Lee, Y., Byun, G., Jeong, Y., &amp; Lee, U. (2026, April). </w:t>
+        <w:t xml:space="preserve">., Lim, J., Lee, Y., Byun, G., </w:t>
+      </w:r>
+      <w:proofErr w:type="gramStart"/>
+      <w:r>
+        <w:rPr>
+          <w:rFonts w:hint="eastAsia"/>
+          <w:color w:val="222222"/>
+          <w:lang w:eastAsia="ko-KR"/>
+        </w:rPr>
+        <w:t>Jeong, Y.</w:t>
+      </w:r>
+      <w:proofErr w:type="gramEnd"/>
+      <w:r>
+        <w:rPr>
+          <w:rFonts w:hint="eastAsia"/>
+          <w:color w:val="222222"/>
+          <w:lang w:eastAsia="ko-KR"/>
+        </w:rPr>
+        <w:t xml:space="preserve">, &amp; Lee, U. (2026, April). </w:t>
       </w:r>
       <w:r>
         <w:rPr>
@@ -26301,16 +27182,53 @@
           <w:color w:val="222222"/>
           <w:lang w:eastAsia="ko-KR"/>
         </w:rPr>
-        <w:t>, Lim, J., Lee, Y., Byun, G., Jeong, Y., &amp; Lee, U. (2026, April).</w:t>
-      </w:r>
-      <w:r>
-        <w:rPr>
-          <w:i/>
-          <w:iCs/>
-          <w:color w:val="222222"/>
-          <w:lang w:eastAsia="ko-KR"/>
-        </w:rPr>
-        <w:t xml:space="preserve">Generative AI </w:t>
+        <w:t>, Lim, J., Lee, Y., Byun, G., Jeong, Y</w:t>
+      </w:r>
+      <w:proofErr w:type="gramStart"/>
+      <w:r>
+        <w:rPr>
+          <w:rFonts w:hint="eastAsia"/>
+          <w:color w:val="222222"/>
+          <w:lang w:eastAsia="ko-KR"/>
+        </w:rPr>
+        <w:t>., &amp;</w:t>
+      </w:r>
+      <w:proofErr w:type="gramEnd"/>
+      <w:r>
+        <w:rPr>
+          <w:rFonts w:hint="eastAsia"/>
+          <w:color w:val="222222"/>
+          <w:lang w:eastAsia="ko-KR"/>
+        </w:rPr>
+        <w:t xml:space="preserve"> Lee, U. (2026, April</w:t>
+      </w:r>
+      <w:proofErr w:type="gramStart"/>
+      <w:r>
+        <w:rPr>
+          <w:rFonts w:hint="eastAsia"/>
+          <w:color w:val="222222"/>
+          <w:lang w:eastAsia="ko-KR"/>
+        </w:rPr>
+        <w:t>).</w:t>
+      </w:r>
+      <w:r>
+        <w:rPr>
+          <w:i/>
+          <w:iCs/>
+          <w:color w:val="222222"/>
+          <w:lang w:eastAsia="ko-KR"/>
+        </w:rPr>
+        <w:t>Generative</w:t>
+      </w:r>
+      <w:proofErr w:type="gramEnd"/>
+      <w:r>
+        <w:rPr>
+          <w:i/>
+          <w:iCs/>
+          <w:color w:val="222222"/>
+          <w:lang w:eastAsia="ko-KR"/>
+        </w:rPr>
+        <w:t xml:space="preserve"> AI </w:t>
       </w:r>
       <w:r>
         <w:rPr>
@@ -26350,6 +27268,7 @@
         </w:rPr>
         <w:t xml:space="preserve">ersona </w:t>
       </w:r>
+      <w:proofErr w:type="gramStart"/>
       <w:r>
         <w:rPr>
           <w:rFonts w:hint="eastAsia"/>
@@ -26367,7 +27286,17 @@
           <w:color w:val="222222"/>
           <w:lang w:eastAsia="ko-KR"/>
         </w:rPr>
-        <w:t xml:space="preserve">ffects on </w:t>
+        <w:t>ffects on</w:t>
+      </w:r>
+      <w:proofErr w:type="gramEnd"/>
+      <w:r>
+        <w:rPr>
+          <w:i/>
+          <w:iCs/>
+          <w:color w:val="222222"/>
+          <w:lang w:eastAsia="ko-KR"/>
+        </w:rPr>
+        <w:t xml:space="preserve"> </w:t>
       </w:r>
       <w:r>
         <w:rPr>
@@ -27029,6 +27958,7 @@
           <w:lang w:eastAsia="ko-KR"/>
         </w:rPr>
       </w:pPr>
+      <w:proofErr w:type="gramStart"/>
       <w:r>
         <w:rPr>
           <w:rFonts w:hint="eastAsia"/>
@@ -27043,7 +27973,16 @@
           <w:color w:val="222222"/>
           <w:lang w:eastAsia="ko-KR"/>
         </w:rPr>
-        <w:t xml:space="preserve">Kim, C., Lim, J., and </w:t>
+        <w:t>Kim</w:t>
+      </w:r>
+      <w:proofErr w:type="gramEnd"/>
+      <w:r>
+        <w:rPr>
+          <w:rFonts w:hint="eastAsia"/>
+          <w:color w:val="222222"/>
+          <w:lang w:eastAsia="ko-KR"/>
+        </w:rPr>
+        <w:t xml:space="preserve">, C., Lim, J., and </w:t>
       </w:r>
       <w:r>
         <w:rPr>
@@ -27307,6 +28246,7 @@
         </w:rPr>
         <w:t xml:space="preserve"> October). </w:t>
       </w:r>
+      <w:proofErr w:type="gramStart"/>
       <w:r>
         <w:rPr>
           <w:i/>
@@ -27333,7 +28273,17 @@
           <w:color w:val="222222"/>
           <w:lang w:eastAsia="ko-KR"/>
         </w:rPr>
-        <w:t xml:space="preserve">hen </w:t>
+        <w:t>hen</w:t>
+      </w:r>
+      <w:proofErr w:type="gramEnd"/>
+      <w:r>
+        <w:rPr>
+          <w:i/>
+          <w:iCs/>
+          <w:color w:val="222222"/>
+          <w:lang w:eastAsia="ko-KR"/>
+        </w:rPr>
+        <w:t xml:space="preserve"> </w:t>
       </w:r>
       <w:r>
         <w:rPr>
@@ -27893,6 +28843,7 @@
         </w:rPr>
         <w:t xml:space="preserve">uthentic </w:t>
       </w:r>
+      <w:proofErr w:type="gramStart"/>
       <w:r>
         <w:rPr>
           <w:rFonts w:hint="eastAsia"/>
@@ -27906,7 +28857,15 @@
           <w:color w:val="222222"/>
           <w:lang w:eastAsia="ko-KR"/>
         </w:rPr>
-        <w:t xml:space="preserve">earning : A </w:t>
+        <w:t>earning :</w:t>
+      </w:r>
+      <w:proofErr w:type="gramEnd"/>
+      <w:r>
+        <w:rPr>
+          <w:color w:val="222222"/>
+          <w:lang w:eastAsia="ko-KR"/>
+        </w:rPr>
+        <w:t xml:space="preserve"> A </w:t>
       </w:r>
       <w:r>
         <w:rPr>
@@ -28648,7 +29607,25 @@
           <w:color w:val="222222"/>
           <w:lang w:eastAsia="ko-KR"/>
         </w:rPr>
-        <w:t xml:space="preserve">] Kim, C.,, Lim, J., Kang, M., &amp; </w:t>
+        <w:t xml:space="preserve">] Kim, </w:t>
+      </w:r>
+      <w:proofErr w:type="gramStart"/>
+      <w:r>
+        <w:rPr>
+          <w:rFonts w:hint="eastAsia"/>
+          <w:color w:val="222222"/>
+          <w:lang w:eastAsia="ko-KR"/>
+        </w:rPr>
+        <w:t>C.,,</w:t>
+      </w:r>
+      <w:proofErr w:type="gramEnd"/>
+      <w:r>
+        <w:rPr>
+          <w:rFonts w:hint="eastAsia"/>
+          <w:color w:val="222222"/>
+          <w:lang w:eastAsia="ko-KR"/>
+        </w:rPr>
+        <w:t xml:space="preserve"> Lim, J., Kang, M., &amp; </w:t>
       </w:r>
       <w:r>
         <w:rPr>
@@ -28886,7 +29863,23 @@
           <w:rFonts w:hint="eastAsia"/>
           <w:lang w:eastAsia="ko-KR"/>
         </w:rPr>
-        <w:t xml:space="preserve">Awoyemi, I., Unggi, L., &amp; </w:t>
+        <w:t xml:space="preserve">Awoyemi, I., </w:t>
+      </w:r>
+      <w:proofErr w:type="spellStart"/>
+      <w:r>
+        <w:rPr>
+          <w:rFonts w:hint="eastAsia"/>
+          <w:lang w:eastAsia="ko-KR"/>
+        </w:rPr>
+        <w:t>Unggi</w:t>
+      </w:r>
+      <w:proofErr w:type="spellEnd"/>
+      <w:r>
+        <w:rPr>
+          <w:rFonts w:hint="eastAsia"/>
+          <w:lang w:eastAsia="ko-KR"/>
+        </w:rPr>
+        <w:t xml:space="preserve">, L., &amp; </w:t>
       </w:r>
       <w:r>
         <w:rPr>
@@ -29720,7 +30713,21 @@
         <w:rPr>
           <w:color w:val="222222"/>
         </w:rPr>
-        <w:t>. iLRN 2024 Practitioner Stream</w:t>
+        <w:t xml:space="preserve">. </w:t>
+      </w:r>
+      <w:proofErr w:type="spellStart"/>
+      <w:r>
+        <w:rPr>
+          <w:color w:val="222222"/>
+        </w:rPr>
+        <w:t>iLRN</w:t>
+      </w:r>
+      <w:proofErr w:type="spellEnd"/>
+      <w:r>
+        <w:rPr>
+          <w:color w:val="222222"/>
+        </w:rPr>
+        <w:t xml:space="preserve"> 2024 Practitioner Stream</w:t>
       </w:r>
     </w:p>
     <w:p>
@@ -29804,7 +30811,21 @@
         <w:rPr>
           <w:color w:val="222222"/>
         </w:rPr>
-        <w:t>. iLRN 2024 Practitioner Stream</w:t>
+        <w:t xml:space="preserve">. </w:t>
+      </w:r>
+      <w:proofErr w:type="spellStart"/>
+      <w:r>
+        <w:rPr>
+          <w:color w:val="222222"/>
+        </w:rPr>
+        <w:t>iLRN</w:t>
+      </w:r>
+      <w:proofErr w:type="spellEnd"/>
+      <w:r>
+        <w:rPr>
+          <w:color w:val="222222"/>
+        </w:rPr>
+        <w:t xml:space="preserve"> 2024 Practitioner Stream</w:t>
       </w:r>
     </w:p>
     <w:p>
@@ -29982,7 +31003,15 @@
         <w:t xml:space="preserve"> November). </w:t>
       </w:r>
       <w:r>
-        <w:t>Exploring the evolution: Topic modeling in digital textbook research trends. 2023 Conference of Joint Societies for Mathematics Education: KSESM, KSME, Korea University, South Korea.</w:t>
+        <w:t xml:space="preserve">Exploring </w:t>
+      </w:r>
+      <w:proofErr w:type="gramStart"/>
+      <w:r>
+        <w:t>the evolution</w:t>
+      </w:r>
+      <w:proofErr w:type="gramEnd"/>
+      <w:r>
+        <w:t>: Topic modeling in digital textbook research trends. 2023 Conference of Joint Societies for Mathematics Education: KSESM, KSME, Korea University, South Korea.</w:t>
       </w:r>
     </w:p>
     <w:p>
@@ -30230,8 +31259,13 @@
       <w:r>
         <w:t xml:space="preserve">Poster Presentation. </w:t>
       </w:r>
-      <w:r>
-        <w:t>iLRN 2023 Practitioner Stream. Virtual</w:t>
+      <w:proofErr w:type="spellStart"/>
+      <w:r>
+        <w:t>iLRN</w:t>
+      </w:r>
+      <w:proofErr w:type="spellEnd"/>
+      <w:r>
+        <w:t xml:space="preserve"> 2023 Practitioner Stream. Virtual</w:t>
       </w:r>
       <w:r>
         <w:t>.</w:t>
@@ -30306,8 +31340,13 @@
       <w:r>
         <w:t xml:space="preserve">Poster Presentation. </w:t>
       </w:r>
-      <w:r>
-        <w:t>iLRN 2023 Practitioner Stream. Virtual</w:t>
+      <w:proofErr w:type="spellStart"/>
+      <w:r>
+        <w:t>iLRN</w:t>
+      </w:r>
+      <w:proofErr w:type="spellEnd"/>
+      <w:r>
+        <w:t xml:space="preserve"> 2023 Practitioner Stream. Virtual</w:t>
       </w:r>
       <w:r>
         <w:t>.</w:t>
@@ -30375,8 +31414,13 @@
       <w:r>
         <w:t xml:space="preserve">Poster Presentation. </w:t>
       </w:r>
-      <w:r>
-        <w:t>iLRN 2023 Practitioner Stream. Virtual</w:t>
+      <w:proofErr w:type="spellStart"/>
+      <w:r>
+        <w:t>iLRN</w:t>
+      </w:r>
+      <w:proofErr w:type="spellEnd"/>
+      <w:r>
+        <w:t xml:space="preserve"> 2023 Practitioner Stream. Virtual</w:t>
       </w:r>
       <w:r>
         <w:t>.</w:t>
@@ -30412,7 +31456,23 @@
           <w:i/>
           <w:iCs/>
         </w:rPr>
-        <w:t>Crafting an approach to cultivate engineering competencies for undergraduate students in construction engineering with Minecraft</w:t>
+        <w:t xml:space="preserve">Crafting an approach to </w:t>
+      </w:r>
+      <w:proofErr w:type="gramStart"/>
+      <w:r>
+        <w:rPr>
+          <w:i/>
+          <w:iCs/>
+        </w:rPr>
+        <w:t>cultivate</w:t>
+      </w:r>
+      <w:proofErr w:type="gramEnd"/>
+      <w:r>
+        <w:rPr>
+          <w:i/>
+          <w:iCs/>
+        </w:rPr>
+        <w:t xml:space="preserve"> engineering competencies for undergraduate students in construction engineering with Minecraft</w:t>
       </w:r>
       <w:r>
         <w:t>. ASEE 2023. Baltimore, MD, United States.</w:t>
@@ -30610,12 +31670,21 @@
         </w:rPr>
         <w:t xml:space="preserve">* </w:t>
       </w:r>
-      <w:r>
-        <w:rPr>
-          <w:bCs/>
-          <w:color w:val="000000"/>
-        </w:rPr>
-        <w:t xml:space="preserve">Ljeluola, S. &amp; </w:t>
+      <w:proofErr w:type="spellStart"/>
+      <w:r>
+        <w:rPr>
+          <w:bCs/>
+          <w:color w:val="000000"/>
+        </w:rPr>
+        <w:t>Ljeluola</w:t>
+      </w:r>
+      <w:proofErr w:type="spellEnd"/>
+      <w:r>
+        <w:rPr>
+          <w:bCs/>
+          <w:color w:val="000000"/>
+        </w:rPr>
+        <w:t xml:space="preserve">, S. &amp; </w:t>
       </w:r>
       <w:r>
         <w:rPr>
@@ -31494,7 +32563,21 @@
         <w:rPr>
           <w:bCs/>
         </w:rPr>
-        <w:t>., &amp; Sokolikj, Z. (2022, May) Developing an evidence-centered model for computational thinking in virtual worlds with children with autism. Poster Presentation, iLRN 2022, Vienne, Austria.</w:t>
+        <w:t xml:space="preserve">., &amp; Sokolikj, Z. (2022, May) Developing an evidence-centered model for computational thinking in virtual worlds with children with autism. Poster Presentation, </w:t>
+      </w:r>
+      <w:proofErr w:type="spellStart"/>
+      <w:r>
+        <w:rPr>
+          <w:bCs/>
+        </w:rPr>
+        <w:t>iLRN</w:t>
+      </w:r>
+      <w:proofErr w:type="spellEnd"/>
+      <w:r>
+        <w:rPr>
+          <w:bCs/>
+        </w:rPr>
+        <w:t xml:space="preserve"> 2022, Vienne, Austria.</w:t>
       </w:r>
     </w:p>
     <w:p>
@@ -33695,7 +34778,15 @@
         <w:t>Moon, J.</w:t>
       </w:r>
       <w:r>
-        <w:t xml:space="preserve">, Dai, Z., Pan, Y., Shute, V., Clark, K., &amp; Erlebacher, G. (2017, April). </w:t>
+        <w:t xml:space="preserve">, Dai, Z., Pan, Y., Shute, V., Clark, K., &amp; </w:t>
+      </w:r>
+      <w:proofErr w:type="spellStart"/>
+      <w:r>
+        <w:t>Erlebacher</w:t>
+      </w:r>
+      <w:proofErr w:type="spellEnd"/>
+      <w:r>
+        <w:t xml:space="preserve">, G. (2017, April). </w:t>
       </w:r>
       <w:r>
         <w:rPr>
@@ -34110,7 +35201,7 @@
           <w:szCs w:val="28"/>
           <w:lang w:eastAsia="ko-KR"/>
         </w:rPr>
-        <w:t>3</w:t>
+        <w:t>2</w:t>
       </w:r>
       <w:r>
         <w:rPr>
@@ -34157,37 +35248,77 @@
           <w:szCs w:val="22"/>
           <w:u w:val="single"/>
         </w:rPr>
-        <w:t>. * indicates the work with a mentoring student</w:t>
-      </w:r>
-    </w:p>
-    <w:p>
-      <w:pPr>
+        <w:t xml:space="preserve">. * </w:t>
+      </w:r>
+      <w:proofErr w:type="gramStart"/>
+      <w:r>
         <w:rPr>
           <w:bCs/>
           <w:sz w:val="22"/>
           <w:szCs w:val="22"/>
           <w:u w:val="single"/>
         </w:rPr>
-      </w:pPr>
-      <w:r>
-        <w:rPr>
-          <w:rFonts w:hint="eastAsia"/>
+        <w:t>indicates</w:t>
+      </w:r>
+      <w:proofErr w:type="gramEnd"/>
+      <w:r>
+        <w:rPr>
           <w:bCs/>
           <w:sz w:val="22"/>
           <w:szCs w:val="22"/>
           <w:u w:val="single"/>
-          <w:lang w:eastAsia="ko-KR"/>
-        </w:rPr>
-        <w:t xml:space="preserve">Note 2. </w:t>
-      </w:r>
-      <w:r>
+        </w:rPr>
+        <w:t xml:space="preserve"> the work with a mentoring student</w:t>
+      </w:r>
+    </w:p>
+    <w:p>
+      <w:pPr>
         <w:rPr>
           <w:bCs/>
           <w:sz w:val="22"/>
           <w:szCs w:val="22"/>
           <w:u w:val="single"/>
         </w:rPr>
-        <w:t>‡ indicates the corresponding authorship.</w:t>
+      </w:pPr>
+      <w:r>
+        <w:rPr>
+          <w:rFonts w:hint="eastAsia"/>
+          <w:bCs/>
+          <w:sz w:val="22"/>
+          <w:szCs w:val="22"/>
+          <w:u w:val="single"/>
+          <w:lang w:eastAsia="ko-KR"/>
+        </w:rPr>
+        <w:t xml:space="preserve">Note 2. </w:t>
+      </w:r>
+      <w:r>
+        <w:rPr>
+          <w:bCs/>
+          <w:sz w:val="22"/>
+          <w:szCs w:val="22"/>
+          <w:u w:val="single"/>
+        </w:rPr>
+        <w:t xml:space="preserve">‡ </w:t>
+      </w:r>
+      <w:proofErr w:type="gramStart"/>
+      <w:r>
+        <w:rPr>
+          <w:bCs/>
+          <w:sz w:val="22"/>
+          <w:szCs w:val="22"/>
+          <w:u w:val="single"/>
+        </w:rPr>
+        <w:t>indicates</w:t>
+      </w:r>
+      <w:proofErr w:type="gramEnd"/>
+      <w:r>
+        <w:rPr>
+          <w:bCs/>
+          <w:sz w:val="22"/>
+          <w:szCs w:val="22"/>
+          <w:u w:val="single"/>
+        </w:rPr>
+        <w:t xml:space="preserve"> the corresponding authorship.</w:t>
       </w:r>
     </w:p>
     <w:p>
@@ -34238,7 +35369,7 @@
           <w:bCs/>
           <w:lang w:eastAsia="ko-KR"/>
         </w:rPr>
-        <w:t>3</w:t>
+        <w:t>2</w:t>
       </w:r>
       <w:r>
         <w:rPr>
@@ -34293,7 +35424,7 @@
           <w:u w:val="single"/>
           <w:lang w:eastAsia="ko-KR"/>
         </w:rPr>
-        <w:t>1</w:t>
+        <w:t>0</w:t>
       </w:r>
       <w:r>
         <w:rPr>
@@ -34318,7 +35449,21 @@
           <w:rFonts w:hint="eastAsia"/>
           <w:lang w:eastAsia="ko-KR"/>
         </w:rPr>
-        <w:t xml:space="preserve">[31] </w:t>
+        <w:t>[3</w:t>
+      </w:r>
+      <w:r>
+        <w:rPr>
+          <w:rFonts w:hint="eastAsia"/>
+          <w:lang w:eastAsia="ko-KR"/>
+        </w:rPr>
+        <w:t>0</w:t>
+      </w:r>
+      <w:r>
+        <w:rPr>
+          <w:rFonts w:hint="eastAsia"/>
+          <w:lang w:eastAsia="ko-KR"/>
+        </w:rPr>
+        <w:t xml:space="preserve">] </w:t>
       </w:r>
       <w:r>
         <w:t>*</w:t>
@@ -34455,6 +35600,7 @@
         </w:rPr>
         <w:t xml:space="preserve">. </w:t>
       </w:r>
+      <w:proofErr w:type="spellStart"/>
       <w:r>
         <w:rPr>
           <w:rFonts w:hint="eastAsia"/>
@@ -34464,6 +35610,7 @@
         </w:rPr>
         <w:t>TechTrends</w:t>
       </w:r>
+      <w:proofErr w:type="spellEnd"/>
       <w:r>
         <w:rPr>
           <w:rFonts w:hint="eastAsia"/>
@@ -34486,7 +35633,21 @@
           <w:rFonts w:hint="eastAsia"/>
           <w:lang w:eastAsia="ko-KR"/>
         </w:rPr>
-        <w:t xml:space="preserve">[30] Amari, A. Y. </w:t>
+        <w:t>[</w:t>
+      </w:r>
+      <w:r>
+        <w:rPr>
+          <w:rFonts w:hint="eastAsia"/>
+          <w:lang w:eastAsia="ko-KR"/>
+        </w:rPr>
+        <w:t>29</w:t>
+      </w:r>
+      <w:r>
+        <w:rPr>
+          <w:rFonts w:hint="eastAsia"/>
+          <w:lang w:eastAsia="ko-KR"/>
+        </w:rPr>
+        <w:t xml:space="preserve">] Amari, A. Y. </w:t>
       </w:r>
       <w:r>
         <w:rPr>
@@ -34547,7 +35708,21 @@
         <w:rPr>
           <w:lang w:eastAsia="ko-KR"/>
         </w:rPr>
-        <w:t xml:space="preserve">earning (AutoML) to </w:t>
+        <w:t>earning (</w:t>
+      </w:r>
+      <w:proofErr w:type="spellStart"/>
+      <w:r>
+        <w:rPr>
+          <w:lang w:eastAsia="ko-KR"/>
+        </w:rPr>
+        <w:t>AutoML</w:t>
+      </w:r>
+      <w:proofErr w:type="spellEnd"/>
+      <w:r>
+        <w:rPr>
+          <w:lang w:eastAsia="ko-KR"/>
+        </w:rPr>
+        <w:t xml:space="preserve">) to </w:t>
       </w:r>
       <w:r>
         <w:rPr>
@@ -34709,10 +35884,36 @@
           <w:rFonts w:hint="eastAsia"/>
           <w:lang w:eastAsia="ko-KR"/>
         </w:rPr>
-        <w:t xml:space="preserve">[29] </w:t>
-      </w:r>
-      <w:r>
-        <w:t xml:space="preserve">‡ </w:t>
+        <w:t>[</w:t>
+      </w:r>
+      <w:proofErr w:type="gramStart"/>
+      <w:r>
+        <w:rPr>
+          <w:rFonts w:hint="eastAsia"/>
+          <w:lang w:eastAsia="ko-KR"/>
+        </w:rPr>
+        <w:t>2</w:t>
+      </w:r>
+      <w:r>
+        <w:rPr>
+          <w:rFonts w:hint="eastAsia"/>
+          <w:lang w:eastAsia="ko-KR"/>
+        </w:rPr>
+        <w:t>8</w:t>
+      </w:r>
+      <w:r>
+        <w:rPr>
+          <w:rFonts w:hint="eastAsia"/>
+          <w:lang w:eastAsia="ko-KR"/>
+        </w:rPr>
+        <w:t xml:space="preserve">] </w:t>
+      </w:r>
+      <w:r>
+        <w:t>‡</w:t>
+      </w:r>
+      <w:proofErr w:type="gramEnd"/>
+      <w:r>
+        <w:t xml:space="preserve"> </w:t>
       </w:r>
       <w:r>
         <w:rPr>
@@ -34953,7 +36154,21 @@
           <w:rFonts w:hint="eastAsia"/>
           <w:lang w:eastAsia="ko-KR"/>
         </w:rPr>
-        <w:t xml:space="preserve">[28] * Awoyemi, I., </w:t>
+        <w:t>[2</w:t>
+      </w:r>
+      <w:r>
+        <w:rPr>
+          <w:rFonts w:hint="eastAsia"/>
+          <w:lang w:eastAsia="ko-KR"/>
+        </w:rPr>
+        <w:t>7</w:t>
+      </w:r>
+      <w:r>
+        <w:rPr>
+          <w:rFonts w:hint="eastAsia"/>
+          <w:lang w:eastAsia="ko-KR"/>
+        </w:rPr>
+        <w:t xml:space="preserve">] * Awoyemi, I., </w:t>
       </w:r>
       <w:r>
         <w:rPr>
@@ -35143,7 +36358,7 @@
           <w:rFonts w:hint="eastAsia"/>
           <w:lang w:eastAsia="ko-KR"/>
         </w:rPr>
-        <w:t>7</w:t>
+        <w:t>6</w:t>
       </w:r>
       <w:r>
         <w:rPr>
@@ -35355,11 +36570,34 @@
           <w:rFonts w:hint="eastAsia"/>
           <w:lang w:eastAsia="ko-KR"/>
         </w:rPr>
-        <w:t xml:space="preserve">[26] </w:t>
+        <w:t>[</w:t>
+      </w:r>
+      <w:proofErr w:type="gramStart"/>
+      <w:r>
+        <w:rPr>
+          <w:rFonts w:hint="eastAsia"/>
+          <w:lang w:eastAsia="ko-KR"/>
+        </w:rPr>
+        <w:t>2</w:t>
+      </w:r>
+      <w:r>
+        <w:rPr>
+          <w:rFonts w:hint="eastAsia"/>
+          <w:lang w:eastAsia="ko-KR"/>
+        </w:rPr>
+        <w:t>5</w:t>
+      </w:r>
+      <w:r>
+        <w:rPr>
+          <w:rFonts w:hint="eastAsia"/>
+          <w:lang w:eastAsia="ko-KR"/>
+        </w:rPr>
+        <w:t xml:space="preserve">] </w:t>
       </w:r>
       <w:r>
         <w:t>‡</w:t>
       </w:r>
+      <w:proofErr w:type="gramEnd"/>
       <w:r>
         <w:rPr>
           <w:rFonts w:hint="eastAsia"/>
@@ -35383,11 +36621,19 @@
         </w:rPr>
         <w:t xml:space="preserve"> (In preparation). </w:t>
       </w:r>
-      <w:r>
-        <w:rPr>
-          <w:lang w:eastAsia="ko-KR"/>
-        </w:rPr>
-        <w:t xml:space="preserve">Operationalising CEFR in L2 English </w:t>
+      <w:proofErr w:type="spellStart"/>
+      <w:r>
+        <w:rPr>
+          <w:lang w:eastAsia="ko-KR"/>
+        </w:rPr>
+        <w:t>Operationalising</w:t>
+      </w:r>
+      <w:proofErr w:type="spellEnd"/>
+      <w:r>
+        <w:rPr>
+          <w:lang w:eastAsia="ko-KR"/>
+        </w:rPr>
+        <w:t xml:space="preserve"> CEFR in L2 English </w:t>
       </w:r>
       <w:r>
         <w:rPr>
@@ -35579,7 +36825,7 @@
           <w:rFonts w:hint="eastAsia"/>
           <w:lang w:eastAsia="ko-KR"/>
         </w:rPr>
-        <w:t>5</w:t>
+        <w:t>4</w:t>
       </w:r>
       <w:r>
         <w:rPr>
@@ -35748,7 +36994,7 @@
           <w:rFonts w:hint="eastAsia"/>
           <w:lang w:eastAsia="ko-KR"/>
         </w:rPr>
-        <w:t>4</w:t>
+        <w:t>3</w:t>
       </w:r>
       <w:r>
         <w:rPr>
@@ -35830,8 +37076,9 @@
           <w:rFonts w:hint="eastAsia"/>
           <w:lang w:eastAsia="ko-KR"/>
         </w:rPr>
-        <w:t>3</w:t>
-      </w:r>
+        <w:t>2</w:t>
+      </w:r>
+      <w:proofErr w:type="gramStart"/>
       <w:r>
         <w:rPr>
           <w:rFonts w:hint="eastAsia"/>
@@ -35854,7 +37101,11 @@
         <w:t>*</w:t>
       </w:r>
       <w:r>
-        <w:t xml:space="preserve">‡ </w:t>
+        <w:t>‡</w:t>
+      </w:r>
+      <w:proofErr w:type="gramEnd"/>
+      <w:r>
+        <w:t xml:space="preserve"> </w:t>
       </w:r>
       <w:r>
         <w:rPr>
@@ -36076,7 +37327,7 @@
           <w:rFonts w:hint="eastAsia"/>
           <w:lang w:eastAsia="ko-KR"/>
         </w:rPr>
-        <w:t>2</w:t>
+        <w:t>1</w:t>
       </w:r>
       <w:r>
         <w:rPr>
@@ -36144,7 +37395,7 @@
           <w:rFonts w:hint="eastAsia"/>
           <w:lang w:eastAsia="ko-KR"/>
         </w:rPr>
-        <w:t>1</w:t>
+        <w:t>0</w:t>
       </w:r>
       <w:r>
         <w:rPr>
@@ -36325,14 +37576,15 @@
           <w:rFonts w:hint="eastAsia"/>
           <w:lang w:eastAsia="ko-KR"/>
         </w:rPr>
-        <w:t>[2</w:t>
-      </w:r>
-      <w:r>
-        <w:rPr>
-          <w:rFonts w:hint="eastAsia"/>
-          <w:lang w:eastAsia="ko-KR"/>
-        </w:rPr>
-        <w:t>0</w:t>
+        <w:t>[</w:t>
+      </w:r>
+      <w:proofErr w:type="gramStart"/>
+      <w:r>
+        <w:rPr>
+          <w:rFonts w:hint="eastAsia"/>
+          <w:lang w:eastAsia="ko-KR"/>
+        </w:rPr>
+        <w:t>19</w:t>
       </w:r>
       <w:r>
         <w:rPr>
@@ -36342,7 +37594,11 @@
         <w:t xml:space="preserve">] </w:t>
       </w:r>
       <w:r>
-        <w:t xml:space="preserve">‡ </w:t>
+        <w:t>‡</w:t>
+      </w:r>
+      <w:proofErr w:type="gramEnd"/>
+      <w:r>
+        <w:t xml:space="preserve"> </w:t>
       </w:r>
       <w:r>
         <w:rPr>
@@ -36358,7 +37614,23 @@
           <w:rFonts w:hint="eastAsia"/>
           <w:lang w:eastAsia="ko-KR"/>
         </w:rPr>
-        <w:t xml:space="preserve">., Hong, S., Chae, J., Cho, H., &amp; Lee, Y. J. (Submitted). </w:t>
+        <w:t xml:space="preserve">., Hong, S., Chae, J., Cho, H., &amp; Lee, </w:t>
+      </w:r>
+      <w:proofErr w:type="gramStart"/>
+      <w:r>
+        <w:rPr>
+          <w:rFonts w:hint="eastAsia"/>
+          <w:lang w:eastAsia="ko-KR"/>
+        </w:rPr>
+        <w:t>Y. J</w:t>
+      </w:r>
+      <w:proofErr w:type="gramEnd"/>
+      <w:r>
+        <w:rPr>
+          <w:rFonts w:hint="eastAsia"/>
+          <w:lang w:eastAsia="ko-KR"/>
+        </w:rPr>
+        <w:t xml:space="preserve">. (Submitted). </w:t>
       </w:r>
       <w:r>
         <w:rPr>
@@ -36544,7 +37816,14 @@
           <w:rFonts w:hint="eastAsia"/>
           <w:lang w:eastAsia="ko-KR"/>
         </w:rPr>
-        <w:t>19</w:t>
+        <w:t>1</w:t>
+      </w:r>
+      <w:r>
+        <w:rPr>
+          <w:rFonts w:hint="eastAsia"/>
+          <w:lang w:eastAsia="ko-KR"/>
+        </w:rPr>
+        <w:t>8</w:t>
       </w:r>
       <w:r>
         <w:rPr>
@@ -36749,7 +38028,14 @@
           <w:rFonts w:hint="eastAsia"/>
           <w:lang w:eastAsia="ko-KR"/>
         </w:rPr>
-        <w:t>18</w:t>
+        <w:t>1</w:t>
+      </w:r>
+      <w:r>
+        <w:rPr>
+          <w:rFonts w:hint="eastAsia"/>
+          <w:lang w:eastAsia="ko-KR"/>
+        </w:rPr>
+        <w:t>7</w:t>
       </w:r>
       <w:r>
         <w:rPr>
@@ -37030,7 +38316,7 @@
           <w:rFonts w:hint="eastAsia"/>
           <w:lang w:eastAsia="ko-KR"/>
         </w:rPr>
-        <w:t>7</w:t>
+        <w:t>6</w:t>
       </w:r>
       <w:r>
         <w:rPr>
@@ -37299,6 +38585,7 @@
         </w:rPr>
         <w:t>[</w:t>
       </w:r>
+      <w:proofErr w:type="gramStart"/>
       <w:r>
         <w:rPr>
           <w:rFonts w:hint="eastAsia"/>
@@ -37311,7 +38598,7 @@
           <w:rFonts w:hint="eastAsia"/>
           <w:lang w:eastAsia="ko-KR"/>
         </w:rPr>
-        <w:t>6</w:t>
+        <w:t>5</w:t>
       </w:r>
       <w:r>
         <w:rPr>
@@ -37321,7 +38608,11 @@
         <w:t xml:space="preserve">] </w:t>
       </w:r>
       <w:r>
-        <w:t xml:space="preserve">‡ </w:t>
+        <w:t>‡</w:t>
+      </w:r>
+      <w:proofErr w:type="gramEnd"/>
+      <w:r>
+        <w:t xml:space="preserve"> </w:t>
       </w:r>
       <w:r>
         <w:rPr>
@@ -37598,14 +38889,22 @@
           <w:rFonts w:hint="eastAsia"/>
           <w:lang w:eastAsia="ko-KR"/>
         </w:rPr>
-        <w:t>[1</w:t>
-      </w:r>
-      <w:r>
-        <w:rPr>
-          <w:rFonts w:hint="eastAsia"/>
-          <w:lang w:eastAsia="ko-KR"/>
-        </w:rPr>
-        <w:t>5</w:t>
+        <w:t>[</w:t>
+      </w:r>
+      <w:proofErr w:type="gramStart"/>
+      <w:r>
+        <w:rPr>
+          <w:rFonts w:hint="eastAsia"/>
+          <w:lang w:eastAsia="ko-KR"/>
+        </w:rPr>
+        <w:t>1</w:t>
+      </w:r>
+      <w:r>
+        <w:rPr>
+          <w:rFonts w:hint="eastAsia"/>
+          <w:lang w:eastAsia="ko-KR"/>
+        </w:rPr>
+        <w:t>4</w:t>
       </w:r>
       <w:r>
         <w:rPr>
@@ -37615,7 +38914,11 @@
         <w:t xml:space="preserve">] </w:t>
       </w:r>
       <w:r>
-        <w:t xml:space="preserve">‡ </w:t>
+        <w:t>‡</w:t>
+      </w:r>
+      <w:proofErr w:type="gramEnd"/>
+      <w:r>
+        <w:t xml:space="preserve"> </w:t>
       </w:r>
       <w:r>
         <w:rPr>
@@ -37870,7 +39173,7 @@
           <w:rFonts w:hint="eastAsia"/>
           <w:lang w:eastAsia="ko-KR"/>
         </w:rPr>
-        <w:t>4</w:t>
+        <w:t>3</w:t>
       </w:r>
       <w:r>
         <w:rPr>
@@ -38076,7 +39379,7 @@
           <w:rFonts w:hint="eastAsia"/>
           <w:lang w:eastAsia="ko-KR"/>
         </w:rPr>
-        <w:t>3</w:t>
+        <w:t>2</w:t>
       </w:r>
       <w:r>
         <w:rPr>
@@ -38382,7 +39685,7 @@
           <w:rFonts w:hint="eastAsia"/>
           <w:lang w:eastAsia="ko-KR"/>
         </w:rPr>
-        <w:t>2</w:t>
+        <w:t>1</w:t>
       </w:r>
       <w:r>
         <w:rPr>
@@ -38592,7 +39895,7 @@
           <w:rFonts w:hint="eastAsia"/>
           <w:lang w:eastAsia="ko-KR"/>
         </w:rPr>
-        <w:t>1</w:t>
+        <w:t>0</w:t>
       </w:r>
       <w:r>
         <w:rPr>
@@ -38942,14 +40245,14 @@
           <w:rFonts w:hint="eastAsia"/>
           <w:lang w:eastAsia="ko-KR"/>
         </w:rPr>
-        <w:t>[1</w:t>
-      </w:r>
-      <w:r>
-        <w:rPr>
-          <w:rFonts w:hint="eastAsia"/>
-          <w:lang w:eastAsia="ko-KR"/>
-        </w:rPr>
-        <w:t>0</w:t>
+        <w:t>[</w:t>
+      </w:r>
+      <w:r>
+        <w:rPr>
+          <w:rFonts w:hint="eastAsia"/>
+          <w:lang w:eastAsia="ko-KR"/>
+        </w:rPr>
+        <w:t>9</w:t>
       </w:r>
       <w:r>
         <w:rPr>
@@ -39233,7 +40536,7 @@
           <w:rFonts w:hint="eastAsia"/>
           <w:lang w:eastAsia="ko-KR"/>
         </w:rPr>
-        <w:t>9</w:t>
+        <w:t>8</w:t>
       </w:r>
       <w:r>
         <w:rPr>
@@ -39452,6 +40755,7 @@
         </w:rPr>
         <w:t xml:space="preserve">. </w:t>
       </w:r>
+      <w:proofErr w:type="spellStart"/>
       <w:r>
         <w:rPr>
           <w:rFonts w:hint="eastAsia"/>
@@ -39479,6 +40783,7 @@
         </w:rPr>
         <w:t>rends</w:t>
       </w:r>
+      <w:proofErr w:type="spellEnd"/>
       <w:r>
         <w:rPr>
           <w:rFonts w:hint="eastAsia"/>
@@ -39633,6 +40938,7 @@
       <w:r>
         <w:t>[</w:t>
       </w:r>
+      <w:proofErr w:type="gramStart"/>
       <w:r>
         <w:rPr>
           <w:rFonts w:hint="eastAsia"/>
@@ -39649,6 +40955,7 @@
         </w:rPr>
         <w:t>‡</w:t>
       </w:r>
+      <w:proofErr w:type="gramEnd"/>
       <w:r>
         <w:rPr>
           <w:rFonts w:hint="eastAsia"/>
@@ -40727,6 +42034,7 @@
         </w:rPr>
         <w:t>[</w:t>
       </w:r>
+      <w:proofErr w:type="gramStart"/>
       <w:r>
         <w:rPr>
           <w:rFonts w:hint="eastAsia"/>
@@ -40742,7 +42050,11 @@
         <w:t xml:space="preserve">] </w:t>
       </w:r>
       <w:r>
-        <w:t xml:space="preserve">‡ </w:t>
+        <w:t>‡</w:t>
+      </w:r>
+      <w:proofErr w:type="gramEnd"/>
+      <w:r>
+        <w:t xml:space="preserve"> </w:t>
       </w:r>
       <w:r>
         <w:rPr>
@@ -41527,7 +42839,23 @@
           <w:bCs/>
           <w:lang w:eastAsia="ko-KR"/>
         </w:rPr>
-        <w:t>., Aldemir, T., Kourkoulou, T., Lee, H., Song, D., Abu, S., Emerson, W., &amp; Wang, S. (</w:t>
+        <w:t xml:space="preserve">., Aldemir, T., </w:t>
+      </w:r>
+      <w:proofErr w:type="spellStart"/>
+      <w:r>
+        <w:rPr>
+          <w:bCs/>
+          <w:lang w:eastAsia="ko-KR"/>
+        </w:rPr>
+        <w:t>Kourkoulou</w:t>
+      </w:r>
+      <w:proofErr w:type="spellEnd"/>
+      <w:r>
+        <w:rPr>
+          <w:bCs/>
+          <w:lang w:eastAsia="ko-KR"/>
+        </w:rPr>
+        <w:t>, T., Lee, H., Song, D., Abu, S., Emerson, W., &amp; Wang, S. (</w:t>
       </w:r>
       <w:r>
         <w:rPr>
@@ -41605,7 +42933,23 @@
           <w:bCs/>
           <w:lang w:eastAsia="ko-KR"/>
         </w:rPr>
-        <w:t>., Kourkoulou, T., Aldemir, T., Abu, S., Lee, H., &amp; Song, D. (</w:t>
+        <w:t xml:space="preserve">., </w:t>
+      </w:r>
+      <w:proofErr w:type="spellStart"/>
+      <w:r>
+        <w:rPr>
+          <w:bCs/>
+          <w:lang w:eastAsia="ko-KR"/>
+        </w:rPr>
+        <w:t>Kourkoulou</w:t>
+      </w:r>
+      <w:proofErr w:type="spellEnd"/>
+      <w:r>
+        <w:rPr>
+          <w:bCs/>
+          <w:lang w:eastAsia="ko-KR"/>
+        </w:rPr>
+        <w:t>, T., Aldemir, T., Abu, S., Lee, H., &amp; Song, D. (</w:t>
       </w:r>
       <w:r>
         <w:rPr>
@@ -41787,6 +43131,7 @@
         </w:rPr>
         <w:t>[</w:t>
       </w:r>
+      <w:proofErr w:type="gramStart"/>
       <w:r>
         <w:rPr>
           <w:rFonts w:hint="eastAsia"/>
@@ -41802,7 +43147,11 @@
         <w:t xml:space="preserve">] </w:t>
       </w:r>
       <w:r>
-        <w:t xml:space="preserve">‡ </w:t>
+        <w:t>‡</w:t>
+      </w:r>
+      <w:proofErr w:type="gramEnd"/>
+      <w:r>
+        <w:t xml:space="preserve"> </w:t>
       </w:r>
       <w:r>
         <w:rPr>
@@ -42527,7 +43876,27 @@
           <w:iCs/>
           <w:lang w:eastAsia="ko-KR"/>
         </w:rPr>
-        <w:t>Enhancing the resolution of instructional design evaluation: Reliability and validity analysis of a multi-agent system applying Gagné’s nine events of instruction</w:t>
+        <w:t xml:space="preserve">Enhancing the resolution of instructional design evaluation: Reliability and validity analysis of a multi-agent system applying </w:t>
+      </w:r>
+      <w:proofErr w:type="spellStart"/>
+      <w:r>
+        <w:rPr>
+          <w:bCs/>
+          <w:i/>
+          <w:iCs/>
+          <w:lang w:eastAsia="ko-KR"/>
+        </w:rPr>
+        <w:t>Gagné’s</w:t>
+      </w:r>
+      <w:proofErr w:type="spellEnd"/>
+      <w:r>
+        <w:rPr>
+          <w:bCs/>
+          <w:i/>
+          <w:iCs/>
+          <w:lang w:eastAsia="ko-KR"/>
+        </w:rPr>
+        <w:t xml:space="preserve"> nine events of instruction</w:t>
       </w:r>
       <w:r>
         <w:rPr>
@@ -42705,10 +44074,23 @@
           <w:bCs/>
           <w:lang w:eastAsia="ko-KR"/>
         </w:rPr>
-        <w:t xml:space="preserve">[1] </w:t>
-      </w:r>
-      <w:r>
-        <w:t xml:space="preserve">‡ </w:t>
+        <w:t>[</w:t>
+      </w:r>
+      <w:proofErr w:type="gramStart"/>
+      <w:r>
+        <w:rPr>
+          <w:rFonts w:hint="eastAsia"/>
+          <w:bCs/>
+          <w:lang w:eastAsia="ko-KR"/>
+        </w:rPr>
+        <w:t xml:space="preserve">1] </w:t>
+      </w:r>
+      <w:r>
+        <w:t>‡</w:t>
+      </w:r>
+      <w:proofErr w:type="gramEnd"/>
+      <w:r>
+        <w:t xml:space="preserve"> </w:t>
       </w:r>
       <w:r>
         <w:rPr>
@@ -43325,7 +44707,15 @@
       </w:r>
       <w:r>
         <w:br/>
-        <w:t>International Learning Research Network (iLRN) Conference 2022</w:t>
+        <w:t>International Learning Research Network (</w:t>
+      </w:r>
+      <w:proofErr w:type="spellStart"/>
+      <w:r>
+        <w:t>iLRN</w:t>
+      </w:r>
+      <w:proofErr w:type="spellEnd"/>
+      <w:r>
+        <w:t>) Conference 2022</w:t>
       </w:r>
       <w:r>
         <w:rPr>
@@ -43497,14 +44887,30 @@
           <w:rFonts w:hint="eastAsia"/>
           <w:lang w:eastAsia="ko-KR"/>
         </w:rPr>
-        <w:t>Affiliated Faculty, Modu</w:t>
-      </w:r>
-      <w:r>
-        <w:rPr>
-          <w:rFonts w:hint="eastAsia"/>
-          <w:lang w:eastAsia="ko-KR"/>
-        </w:rPr>
-        <w:t xml:space="preserve">Labs </w:t>
+        <w:t xml:space="preserve">Affiliated Faculty, </w:t>
+      </w:r>
+      <w:proofErr w:type="spellStart"/>
+      <w:r>
+        <w:rPr>
+          <w:rFonts w:hint="eastAsia"/>
+          <w:lang w:eastAsia="ko-KR"/>
+        </w:rPr>
+        <w:t>Modu</w:t>
+      </w:r>
+      <w:r>
+        <w:rPr>
+          <w:rFonts w:hint="eastAsia"/>
+          <w:lang w:eastAsia="ko-KR"/>
+        </w:rPr>
+        <w:t>Labs</w:t>
+      </w:r>
+      <w:proofErr w:type="spellEnd"/>
+      <w:r>
+        <w:rPr>
+          <w:rFonts w:hint="eastAsia"/>
+          <w:lang w:eastAsia="ko-KR"/>
+        </w:rPr>
+        <w:t xml:space="preserve"> </w:t>
       </w:r>
       <w:r>
         <w:rPr>
@@ -43610,7 +45016,15 @@
         <w:ind w:left="1440" w:hanging="720"/>
       </w:pPr>
       <w:r>
-        <w:t>Co-Chair, Immersive Learning Research Network (iLRN) (Appointed</w:t>
+        <w:t>Co-Chair, Immersive Learning Research Network (</w:t>
+      </w:r>
+      <w:proofErr w:type="spellStart"/>
+      <w:r>
+        <w:t>iLRN</w:t>
+      </w:r>
+      <w:proofErr w:type="spellEnd"/>
+      <w:r>
+        <w:t>) (Appointed</w:t>
       </w:r>
       <w:r>
         <w:t>, 2021-present</w:t>
@@ -43702,13 +45116,23 @@
         </w:rPr>
         <w:t xml:space="preserve">Associate Editor – </w:t>
       </w:r>
-      <w:r>
-        <w:rPr>
-          <w:i/>
-          <w:iCs/>
-          <w:color w:val="000000"/>
-        </w:rPr>
-        <w:t>Behaviour &amp; Information Technology</w:t>
+      <w:proofErr w:type="spellStart"/>
+      <w:r>
+        <w:rPr>
+          <w:i/>
+          <w:iCs/>
+          <w:color w:val="000000"/>
+        </w:rPr>
+        <w:t>Behaviour</w:t>
+      </w:r>
+      <w:proofErr w:type="spellEnd"/>
+      <w:r>
+        <w:rPr>
+          <w:i/>
+          <w:iCs/>
+          <w:color w:val="000000"/>
+        </w:rPr>
+        <w:t xml:space="preserve"> &amp; Information Technology</w:t>
       </w:r>
       <w:r>
         <w:rPr>
@@ -43768,7 +45192,29 @@
           <w:color w:val="000000"/>
           <w:lang w:eastAsia="ko-KR"/>
         </w:rPr>
-        <w:t>International Journal of Computer-Supported Collaborative Learning  (SSCI, Q1) (2026-present)</w:t>
+        <w:t xml:space="preserve">International Journal of Computer-Supported Collaborative </w:t>
+      </w:r>
+      <w:proofErr w:type="gramStart"/>
+      <w:r>
+        <w:rPr>
+          <w:rFonts w:hint="eastAsia"/>
+          <w:i/>
+          <w:iCs/>
+          <w:color w:val="000000"/>
+          <w:lang w:eastAsia="ko-KR"/>
+        </w:rPr>
+        <w:t>Learning  (</w:t>
+      </w:r>
+      <w:proofErr w:type="gramEnd"/>
+      <w:r>
+        <w:rPr>
+          <w:rFonts w:hint="eastAsia"/>
+          <w:i/>
+          <w:iCs/>
+          <w:color w:val="000000"/>
+          <w:lang w:eastAsia="ko-KR"/>
+        </w:rPr>
+        <w:t>SSCI, Q1) (2026-present)</w:t>
       </w:r>
     </w:p>
     <w:p>
@@ -44054,7 +45500,14 @@
         <w:rPr>
           <w:color w:val="000000"/>
         </w:rPr>
-        <w:t>Korean Journal</w:t>
+        <w:t xml:space="preserve">Korean </w:t>
+      </w:r>
+      <w:proofErr w:type="gramStart"/>
+      <w:r>
+        <w:rPr>
+          <w:color w:val="000000"/>
+        </w:rPr>
+        <w:t>Journal</w:t>
       </w:r>
       <w:r>
         <w:rPr>
@@ -44072,7 +45525,18 @@
           <w:color w:val="000000"/>
           <w:lang w:eastAsia="ko-KR"/>
         </w:rPr>
-        <w:t>(2024)</w:t>
+        <w:t>(</w:t>
+      </w:r>
+      <w:proofErr w:type="gramEnd"/>
+      <w:r>
+        <w:rPr>
+          <w:rFonts w:hint="eastAsia"/>
+          <w:i/>
+          <w:iCs/>
+          <w:color w:val="000000"/>
+          <w:lang w:eastAsia="ko-KR"/>
+        </w:rPr>
+        <w:t>2024)</w:t>
       </w:r>
     </w:p>
     <w:p>
@@ -44159,7 +45623,25 @@
           <w:iCs/>
           <w:color w:val="000000"/>
         </w:rPr>
-        <w:t>, Korean Open Access Guide in Edutech/Learning Sciences Research</w:t>
+        <w:t xml:space="preserve">, Korean Open Access Guide in </w:t>
+      </w:r>
+      <w:proofErr w:type="spellStart"/>
+      <w:r>
+        <w:rPr>
+          <w:i/>
+          <w:iCs/>
+          <w:color w:val="000000"/>
+        </w:rPr>
+        <w:t>Edutech</w:t>
+      </w:r>
+      <w:proofErr w:type="spellEnd"/>
+      <w:r>
+        <w:rPr>
+          <w:i/>
+          <w:iCs/>
+          <w:color w:val="000000"/>
+        </w:rPr>
+        <w:t>/Learning Sciences Research</w:t>
       </w:r>
     </w:p>
     <w:p>
@@ -44433,7 +45915,29 @@
           <w:color w:val="000000"/>
           <w:lang w:eastAsia="ko-KR"/>
         </w:rPr>
-        <w:t>Engineering Applications of Artificial Intelligence</w:t>
+        <w:t xml:space="preserve">Engineering Applications </w:t>
+      </w:r>
+      <w:proofErr w:type="gramStart"/>
+      <w:r>
+        <w:rPr>
+          <w:rFonts w:hint="eastAsia"/>
+          <w:i/>
+          <w:iCs/>
+          <w:color w:val="000000"/>
+          <w:lang w:eastAsia="ko-KR"/>
+        </w:rPr>
+        <w:t>of</w:t>
+      </w:r>
+      <w:proofErr w:type="gramEnd"/>
+      <w:r>
+        <w:rPr>
+          <w:rFonts w:hint="eastAsia"/>
+          <w:i/>
+          <w:iCs/>
+          <w:color w:val="000000"/>
+          <w:lang w:eastAsia="ko-KR"/>
+        </w:rPr>
+        <w:t xml:space="preserve"> Artificial Intelligence</w:t>
       </w:r>
     </w:p>
     <w:p>
@@ -44469,15 +45973,27 @@
         </w:rPr>
         <w:br/>
       </w:r>
-      <w:r>
-        <w:rPr>
-          <w:rFonts w:hint="eastAsia"/>
-          <w:i/>
-          <w:iCs/>
-          <w:color w:val="000000"/>
-          <w:lang w:eastAsia="ko-KR"/>
-        </w:rPr>
-        <w:t>Behaviour and Information Technology</w:t>
+      <w:proofErr w:type="spellStart"/>
+      <w:r>
+        <w:rPr>
+          <w:rFonts w:hint="eastAsia"/>
+          <w:i/>
+          <w:iCs/>
+          <w:color w:val="000000"/>
+          <w:lang w:eastAsia="ko-KR"/>
+        </w:rPr>
+        <w:t>Behaviour</w:t>
+      </w:r>
+      <w:proofErr w:type="spellEnd"/>
+      <w:r>
+        <w:rPr>
+          <w:rFonts w:hint="eastAsia"/>
+          <w:i/>
+          <w:iCs/>
+          <w:color w:val="000000"/>
+          <w:lang w:eastAsia="ko-KR"/>
+        </w:rPr>
+        <w:t xml:space="preserve"> and Information Technology</w:t>
       </w:r>
     </w:p>
     <w:p>
@@ -44813,6 +46329,7 @@
           <w:color w:val="000000"/>
         </w:rPr>
       </w:pPr>
+      <w:proofErr w:type="spellStart"/>
       <w:r>
         <w:rPr>
           <w:i/>
@@ -44820,6 +46337,7 @@
         </w:rPr>
         <w:t>TechTrends</w:t>
       </w:r>
+      <w:proofErr w:type="spellEnd"/>
     </w:p>
     <w:p>
       <w:pPr>
@@ -44995,12 +46513,21 @@
         </w:rPr>
         <w:br/>
       </w:r>
-      <w:r>
-        <w:rPr>
-          <w:i/>
-          <w:color w:val="000000"/>
-        </w:rPr>
-        <w:t>International Journal of Human-Computer Interaction</w:t>
+      <w:proofErr w:type="spellStart"/>
+      <w:r>
+        <w:rPr>
+          <w:i/>
+          <w:color w:val="000000"/>
+        </w:rPr>
+        <w:t>International</w:t>
+      </w:r>
+      <w:proofErr w:type="spellEnd"/>
+      <w:r>
+        <w:rPr>
+          <w:i/>
+          <w:color w:val="000000"/>
+        </w:rPr>
+        <w:t xml:space="preserve"> Journal of Human-Computer Interaction</w:t>
       </w:r>
       <w:r>
         <w:rPr>
@@ -45408,6 +46935,7 @@
         <w:lastRenderedPageBreak/>
         <w:t xml:space="preserve">Outstanding </w:t>
       </w:r>
+      <w:proofErr w:type="spellStart"/>
       <w:r>
         <w:rPr>
           <w:rFonts w:hint="eastAsia"/>
@@ -45415,6 +46943,7 @@
         </w:rPr>
         <w:t>iLEAD</w:t>
       </w:r>
+      <w:proofErr w:type="spellEnd"/>
       <w:r>
         <w:t xml:space="preserve"> Paper Award (202</w:t>
       </w:r>
@@ -45426,7 +46955,15 @@
         <w:t>4</w:t>
       </w:r>
       <w:r>
-        <w:t>). Immersive Learning Research Network Conference (iLRN) 202</w:t>
+        <w:t>). Immersive Learning Research Network Conference (</w:t>
+      </w:r>
+      <w:proofErr w:type="spellStart"/>
+      <w:r>
+        <w:t>iLRN</w:t>
+      </w:r>
+      <w:proofErr w:type="spellEnd"/>
+      <w:r>
+        <w:t>) 202</w:t>
       </w:r>
       <w:r>
         <w:rPr>
@@ -45451,7 +46988,15 @@
         <w:ind w:left="720" w:hanging="720"/>
       </w:pPr>
       <w:r>
-        <w:t>Outstanding Practitioner Paper Award (2023). Immersive Learning Research Network Conference (iLRN) 2023</w:t>
+        <w:t>Outstanding Practitioner Paper Award (2023). Immersive Learning Research Network Conference (</w:t>
+      </w:r>
+      <w:proofErr w:type="spellStart"/>
+      <w:r>
+        <w:t>iLRN</w:t>
+      </w:r>
+      <w:proofErr w:type="spellEnd"/>
+      <w:r>
+        <w:t>) 2023</w:t>
       </w:r>
     </w:p>
     <w:p>
@@ -47721,6 +49266,14 @@
 </file>
 
 <file path=customXml/item1.xml><?xml version="1.0" encoding="utf-8"?>
+<p:properties xmlns:p="http://schemas.microsoft.com/office/2006/metadata/properties" xmlns:xsi="http://www.w3.org/2001/XMLSchema-instance" xmlns:pc="http://schemas.microsoft.com/office/infopath/2007/PartnerControls">
+  <documentManagement>
+    <_activity xmlns="6a4161d7-0e07-4bb5-8cdd-a87a7602a445" xsi:nil="true"/>
+  </documentManagement>
+</p:properties>
+</file>
+
+<file path=customXml/item2.xml><?xml version="1.0" encoding="utf-8"?>
 <?mso-contentType ?>
 <FormTemplates xmlns="http://schemas.microsoft.com/sharepoint/v3/contenttype/forms">
   <Display>DocumentLibraryForm</Display>
@@ -47729,19 +49282,7 @@
 </FormTemplates>
 </file>
 
-<file path=customXml/item2.xml><?xml version="1.0" encoding="utf-8"?>
-<b:Sources xmlns:b="http://schemas.openxmlformats.org/officeDocument/2006/bibliography" xmlns="http://schemas.openxmlformats.org/officeDocument/2006/bibliography" SelectedStyle="\APASixthEditionOfficeOnline.xsl" StyleName="APA" Version="6"/>
-</file>
-
 <file path=customXml/item3.xml><?xml version="1.0" encoding="utf-8"?>
-<p:properties xmlns:p="http://schemas.microsoft.com/office/2006/metadata/properties" xmlns:xsi="http://www.w3.org/2001/XMLSchema-instance" xmlns:pc="http://schemas.microsoft.com/office/infopath/2007/PartnerControls">
-  <documentManagement>
-    <_activity xmlns="6a4161d7-0e07-4bb5-8cdd-a87a7602a445" xsi:nil="true"/>
-  </documentManagement>
-</p:properties>
-</file>
-
-<file path=customXml/item4.xml><?xml version="1.0" encoding="utf-8"?>
 <ct:contentTypeSchema xmlns:ct="http://schemas.microsoft.com/office/2006/metadata/contentType" xmlns:ma="http://schemas.microsoft.com/office/2006/metadata/properties/metaAttributes" ct:_="" ma:_="" ma:contentTypeName="Document" ma:contentTypeID="0x010100FA54A6C77D34E44FB33E0184D6F9C744" ma:contentTypeVersion="18" ma:contentTypeDescription="Create a new document." ma:contentTypeScope="" ma:versionID="9c28832654d292338743ef1185d20088">
   <xsd:schema xmlns:xsd="http://www.w3.org/2001/XMLSchema" xmlns:xs="http://www.w3.org/2001/XMLSchema" xmlns:p="http://schemas.microsoft.com/office/2006/metadata/properties" xmlns:ns3="6a4161d7-0e07-4bb5-8cdd-a87a7602a445" xmlns:ns4="30453fea-43c5-4a0b-a417-834186a09351" targetNamespace="http://schemas.microsoft.com/office/2006/metadata/properties" ma:root="true" ma:fieldsID="aadbfd92c1be4506f2c2f9fc093c4d0b" ns3:_="" ns4:_="">
     <xsd:import namespace="6a4161d7-0e07-4bb5-8cdd-a87a7602a445"/>
@@ -47994,23 +49535,11 @@
 </ct:contentTypeSchema>
 </file>
 
-<file path=customXml/itemProps1.xml><?xml version="1.0" encoding="utf-8"?>
-<ds:datastoreItem xmlns:ds="http://schemas.openxmlformats.org/officeDocument/2006/customXml" ds:itemID="{F79F8074-1665-45F2-8B05-A95EA1C1A155}">
-  <ds:schemaRefs>
-    <ds:schemaRef ds:uri="http://schemas.microsoft.com/sharepoint/v3/contenttype/forms"/>
-  </ds:schemaRefs>
-</ds:datastoreItem>
+<file path=customXml/item4.xml><?xml version="1.0" encoding="utf-8"?>
+<b:Sources xmlns:b="http://schemas.openxmlformats.org/officeDocument/2006/bibliography" xmlns="http://schemas.openxmlformats.org/officeDocument/2006/bibliography" SelectedStyle="\APASixthEditionOfficeOnline.xsl" StyleName="APA" Version="6"/>
 </file>
 
-<file path=customXml/itemProps2.xml><?xml version="1.0" encoding="utf-8"?>
-<ds:datastoreItem xmlns:ds="http://schemas.openxmlformats.org/officeDocument/2006/customXml" ds:itemID="{E286DD98-9466-43F6-BF97-336366EE54DF}">
-  <ds:schemaRefs>
-    <ds:schemaRef ds:uri="http://schemas.openxmlformats.org/officeDocument/2006/bibliography"/>
-  </ds:schemaRefs>
-</ds:datastoreItem>
-</file>
-
-<file path=customXml/itemProps3.xml><?xml version="1.0" encoding="utf-8"?>
+<file path=customXml/itemProps1.xml><?xml version="1.0" encoding="utf-8"?>
 <ds:datastoreItem xmlns:ds="http://schemas.openxmlformats.org/officeDocument/2006/customXml" ds:itemID="{7C24488D-A36D-4C56-91ED-753F5C27550A}">
   <ds:schemaRefs>
     <ds:schemaRef ds:uri="http://schemas.microsoft.com/office/2006/metadata/properties"/>
@@ -48020,7 +49549,15 @@
 </ds:datastoreItem>
 </file>
 
-<file path=customXml/itemProps4.xml><?xml version="1.0" encoding="utf-8"?>
+<file path=customXml/itemProps2.xml><?xml version="1.0" encoding="utf-8"?>
+<ds:datastoreItem xmlns:ds="http://schemas.openxmlformats.org/officeDocument/2006/customXml" ds:itemID="{F79F8074-1665-45F2-8B05-A95EA1C1A155}">
+  <ds:schemaRefs>
+    <ds:schemaRef ds:uri="http://schemas.microsoft.com/sharepoint/v3/contenttype/forms"/>
+  </ds:schemaRefs>
+</ds:datastoreItem>
+</file>
+
+<file path=customXml/itemProps3.xml><?xml version="1.0" encoding="utf-8"?>
 <ds:datastoreItem xmlns:ds="http://schemas.openxmlformats.org/officeDocument/2006/customXml" ds:itemID="{44F19B31-977D-45A4-A748-143054BB9DA7}">
   <ds:schemaRefs>
     <ds:schemaRef ds:uri="http://schemas.microsoft.com/office/2006/metadata/contentType"/>
@@ -48037,4 +49574,12 @@
     <ds:schemaRef ds:uri="http://schemas.microsoft.com/internal/obd"/>
   </ds:schemaRefs>
 </ds:datastoreItem>
+</file>
+
+<file path=customXml/itemProps4.xml><?xml version="1.0" encoding="utf-8"?>
+<ds:datastoreItem xmlns:ds="http://schemas.openxmlformats.org/officeDocument/2006/customXml" ds:itemID="{E286DD98-9466-43F6-BF97-336366EE54DF}">
+  <ds:schemaRefs>
+    <ds:schemaRef ds:uri="http://schemas.openxmlformats.org/officeDocument/2006/bibliography"/>
+  </ds:schemaRefs>
+</ds:datastoreItem>
 </file>
</xml_diff>

<commit_message>
Update CV docx and regenerate site-data (autopush 2026-05-30 09:00)
</commit_message>
<xml_diff>
--- a/CV_202605_MOON.docx
+++ b/CV_202605_MOON.docx
@@ -7992,7 +7992,14 @@
           <w:rFonts w:hint="eastAsia"/>
           <w:lang w:eastAsia="ko-KR"/>
         </w:rPr>
-        <w:t>Cultural history activity theory</w:t>
+        <w:t>c</w:t>
+      </w:r>
+      <w:r>
+        <w:rPr>
+          <w:rFonts w:hint="eastAsia"/>
+          <w:lang w:eastAsia="ko-KR"/>
+        </w:rPr>
+        <w:t>ultural history activity theory</w:t>
       </w:r>
       <w:r>
         <w:rPr>
@@ -8158,6 +8165,92 @@
           <w:lang w:eastAsia="ko-KR"/>
         </w:rPr>
         <w:t>Interactive Learning Environments.</w:t>
+      </w:r>
+      <w:r>
+        <w:rPr>
+          <w:rFonts w:hint="eastAsia"/>
+          <w:i/>
+          <w:iCs/>
+          <w:lang w:eastAsia="ko-KR"/>
+        </w:rPr>
+        <w:t xml:space="preserve"> </w:t>
+      </w:r>
+      <w:r>
+        <w:rPr>
+          <w:b/>
+          <w:i/>
+        </w:rPr>
+        <w:t>[SSCI-indexed</w:t>
+      </w:r>
+      <w:r>
+        <w:rPr>
+          <w:b/>
+          <w:bCs/>
+          <w:i/>
+          <w:iCs/>
+        </w:rPr>
+        <w:t xml:space="preserve">, IF = </w:t>
+      </w:r>
+      <w:r>
+        <w:rPr>
+          <w:rFonts w:hint="eastAsia"/>
+          <w:b/>
+          <w:bCs/>
+          <w:i/>
+          <w:iCs/>
+          <w:lang w:eastAsia="ko-KR"/>
+        </w:rPr>
+        <w:t xml:space="preserve">5.3, </w:t>
+      </w:r>
+      <w:r>
+        <w:rPr>
+          <w:b/>
+          <w:bCs/>
+          <w:i/>
+          <w:iCs/>
+        </w:rPr>
+        <w:t>IF</w:t>
+      </w:r>
+      <w:r>
+        <w:rPr>
+          <w:rFonts w:hint="eastAsia"/>
+          <w:b/>
+          <w:bCs/>
+          <w:i/>
+          <w:iCs/>
+          <w:lang w:eastAsia="ko-KR"/>
+        </w:rPr>
+        <w:t>5</w:t>
+      </w:r>
+      <w:r>
+        <w:rPr>
+          <w:b/>
+          <w:bCs/>
+          <w:i/>
+          <w:iCs/>
+        </w:rPr>
+        <w:t xml:space="preserve"> = </w:t>
+      </w:r>
+      <w:r>
+        <w:rPr>
+          <w:rFonts w:hint="eastAsia"/>
+          <w:b/>
+          <w:bCs/>
+          <w:i/>
+          <w:iCs/>
+          <w:lang w:eastAsia="ko-KR"/>
+        </w:rPr>
+        <w:t>6.2</w:t>
+      </w:r>
+      <w:r>
+        <w:rPr>
+          <w:b/>
+          <w:i/>
+          <w:color w:val="212121"/>
+          <w:sz w:val="28"/>
+          <w:szCs w:val="28"/>
+        </w:rPr>
+        <w:t>]</w:t>
       </w:r>
     </w:p>
     <w:p>
@@ -9118,21 +9211,7 @@
           <w:rFonts w:hint="eastAsia"/>
           <w:lang w:eastAsia="ko-KR"/>
         </w:rPr>
-        <w:t>. (</w:t>
-      </w:r>
-      <w:r>
-        <w:rPr>
-          <w:rFonts w:hint="eastAsia"/>
-          <w:lang w:eastAsia="ko-KR"/>
-        </w:rPr>
-        <w:t>Accepted</w:t>
-      </w:r>
-      <w:r>
-        <w:rPr>
-          <w:rFonts w:hint="eastAsia"/>
-          <w:lang w:eastAsia="ko-KR"/>
-        </w:rPr>
-        <w:t xml:space="preserve">, 2026). </w:t>
+        <w:t xml:space="preserve">. (2026). </w:t>
       </w:r>
       <w:r>
         <w:rPr>
@@ -9259,8 +9338,22 @@
       <w:r>
         <w:rPr>
           <w:rFonts w:hint="eastAsia"/>
-          <w:i/>
-          <w:iCs/>
+          <w:lang w:eastAsia="ko-KR"/>
+        </w:rPr>
+        <w:t xml:space="preserve"> </w:t>
+      </w:r>
+      <w:hyperlink r:id="rId15" w:history="1">
+        <w:r>
+          <w:rPr>
+            <w:rStyle w:val="Hyperlink"/>
+            <w:lang w:eastAsia="ko-KR"/>
+          </w:rPr>
+          <w:t>https://doi.org/10.1080/10494820.2026.2679063</w:t>
+        </w:r>
+      </w:hyperlink>
+      <w:r>
+        <w:rPr>
+          <w:rFonts w:hint="eastAsia"/>
           <w:lang w:eastAsia="ko-KR"/>
         </w:rPr>
         <w:t xml:space="preserve"> </w:t>
@@ -9545,7 +9638,7 @@
         </w:rPr>
         <w:t xml:space="preserve"> </w:t>
       </w:r>
-      <w:hyperlink r:id="rId15" w:history="1">
+      <w:hyperlink r:id="rId16" w:history="1">
         <w:r>
           <w:rPr>
             <w:rStyle w:val="Hyperlink"/>
@@ -9613,7 +9706,7 @@
       <w:r>
         <w:t>. </w:t>
       </w:r>
-      <w:hyperlink r:id="rId16" w:history="1">
+      <w:hyperlink r:id="rId17" w:history="1">
         <w:r>
           <w:rPr>
             <w:rStyle w:val="Hyperlink"/>
@@ -9797,7 +9890,7 @@
         </w:rPr>
         <w:t xml:space="preserve">. </w:t>
       </w:r>
-      <w:hyperlink r:id="rId17" w:tgtFrame="_blank" w:history="1">
+      <w:hyperlink r:id="rId18" w:tgtFrame="_blank" w:history="1">
         <w:r>
           <w:rPr>
             <w:rStyle w:val="Hyperlink"/>
@@ -10112,7 +10205,7 @@
         </w:rPr>
         <w:t xml:space="preserve"> </w:t>
       </w:r>
-      <w:hyperlink r:id="rId18" w:history="1">
+      <w:hyperlink r:id="rId19" w:history="1">
         <w:r>
           <w:rPr>
             <w:rStyle w:val="Hyperlink"/>
@@ -10448,7 +10541,7 @@
         </w:rPr>
         <w:t xml:space="preserve"> </w:t>
       </w:r>
-      <w:hyperlink r:id="rId19" w:history="1">
+      <w:hyperlink r:id="rId20" w:history="1">
         <w:r>
           <w:rPr>
             <w:rStyle w:val="Hyperlink"/>
@@ -10814,7 +10907,7 @@
         </w:rPr>
         <w:t xml:space="preserve"> </w:t>
       </w:r>
-      <w:hyperlink r:id="rId20" w:history="1">
+      <w:hyperlink r:id="rId21" w:history="1">
         <w:r>
           <w:rPr>
             <w:rStyle w:val="Hyperlink"/>
@@ -11225,7 +11318,7 @@
         </w:rPr>
         <w:t xml:space="preserve"> </w:t>
       </w:r>
-      <w:hyperlink r:id="rId21" w:history="1">
+      <w:hyperlink r:id="rId22" w:history="1">
         <w:r>
           <w:rPr>
             <w:rStyle w:val="Hyperlink"/>
@@ -11628,7 +11721,7 @@
         </w:rPr>
         <w:t xml:space="preserve"> </w:t>
       </w:r>
-      <w:hyperlink r:id="rId22" w:history="1">
+      <w:hyperlink r:id="rId23" w:history="1">
         <w:r>
           <w:rPr>
             <w:rStyle w:val="Hyperlink"/>
@@ -11917,7 +12010,7 @@
         </w:rPr>
         <w:t xml:space="preserve"> </w:t>
       </w:r>
-      <w:hyperlink r:id="rId23" w:history="1">
+      <w:hyperlink r:id="rId24" w:history="1">
         <w:r>
           <w:rPr>
             <w:rStyle w:val="Hyperlink"/>
@@ -12280,7 +12373,7 @@
         </w:rPr>
         <w:t xml:space="preserve">Computers &amp; Education </w:t>
       </w:r>
-      <w:hyperlink r:id="rId24" w:history="1">
+      <w:hyperlink r:id="rId25" w:history="1">
         <w:r>
           <w:rPr>
             <w:rStyle w:val="Hyperlink"/>
@@ -12561,7 +12654,7 @@
         </w:rPr>
         <w:t xml:space="preserve">(1), 192-215. </w:t>
       </w:r>
-      <w:hyperlink r:id="rId25" w:history="1">
+      <w:hyperlink r:id="rId26" w:history="1">
         <w:r>
           <w:rPr>
             <w:rStyle w:val="Hyperlink"/>
@@ -12942,7 +13035,7 @@
         </w:rPr>
         <w:t xml:space="preserve"> </w:t>
       </w:r>
-      <w:hyperlink r:id="rId26" w:tgtFrame="_blank" w:tooltip="Persistent link using digital object identifier" w:history="1">
+      <w:hyperlink r:id="rId27" w:tgtFrame="_blank" w:tooltip="Persistent link using digital object identifier" w:history="1">
         <w:r>
           <w:rPr>
             <w:rStyle w:val="Hyperlink"/>
@@ -13206,7 +13299,7 @@
         </w:rPr>
         <w:t xml:space="preserve"> </w:t>
       </w:r>
-      <w:hyperlink r:id="rId27" w:history="1">
+      <w:hyperlink r:id="rId28" w:history="1">
         <w:r>
           <w:rPr>
             <w:rStyle w:val="Hyperlink"/>
@@ -13420,7 +13513,7 @@
         </w:rPr>
         <w:t xml:space="preserve">Smart Learning Environments </w:t>
       </w:r>
-      <w:hyperlink r:id="rId28" w:history="1">
+      <w:hyperlink r:id="rId29" w:history="1">
         <w:r>
           <w:rPr>
             <w:rStyle w:val="Hyperlink"/>
@@ -13541,7 +13634,7 @@
         </w:rPr>
         <w:t xml:space="preserve"> </w:t>
       </w:r>
-      <w:hyperlink r:id="rId29" w:history="1">
+      <w:hyperlink r:id="rId30" w:history="1">
         <w:r>
           <w:rPr>
             <w:rStyle w:val="Hyperlink"/>
@@ -13753,7 +13846,7 @@
         </w:rPr>
         <w:t xml:space="preserve"> </w:t>
       </w:r>
-      <w:hyperlink r:id="rId30" w:history="1">
+      <w:hyperlink r:id="rId31" w:history="1">
         <w:r>
           <w:rPr>
             <w:rStyle w:val="Hyperlink"/>
@@ -13941,7 +14034,7 @@
         </w:rPr>
         <w:t xml:space="preserve"> </w:t>
       </w:r>
-      <w:hyperlink r:id="rId31" w:history="1">
+      <w:hyperlink r:id="rId32" w:history="1">
         <w:r>
           <w:rPr>
             <w:rStyle w:val="Hyperlink"/>
@@ -14160,7 +14253,7 @@
         </w:rPr>
         <w:t xml:space="preserve"> </w:t>
       </w:r>
-      <w:hyperlink r:id="rId32" w:history="1">
+      <w:hyperlink r:id="rId33" w:history="1">
         <w:r>
           <w:rPr>
             <w:rStyle w:val="Hyperlink"/>
@@ -14454,7 +14547,7 @@
         </w:rPr>
         <w:t xml:space="preserve"> </w:t>
       </w:r>
-      <w:hyperlink r:id="rId33" w:history="1">
+      <w:hyperlink r:id="rId34" w:history="1">
         <w:r>
           <w:rPr>
             <w:rStyle w:val="Hyperlink"/>
@@ -14664,7 +14757,7 @@
         </w:rPr>
         <w:t xml:space="preserve"> </w:t>
       </w:r>
-      <w:hyperlink r:id="rId34" w:history="1">
+      <w:hyperlink r:id="rId35" w:history="1">
         <w:r>
           <w:rPr>
             <w:rStyle w:val="Hyperlink"/>
@@ -14826,7 +14919,7 @@
       <w:r>
         <w:t xml:space="preserve"> </w:t>
       </w:r>
-      <w:hyperlink r:id="rId35" w:history="1">
+      <w:hyperlink r:id="rId36" w:history="1">
         <w:r>
           <w:rPr>
             <w:rStyle w:val="Hyperlink"/>
@@ -15096,7 +15189,7 @@
         </w:rPr>
         <w:t xml:space="preserve"> </w:t>
       </w:r>
-      <w:hyperlink r:id="rId36" w:history="1">
+      <w:hyperlink r:id="rId37" w:history="1">
         <w:r>
           <w:rPr>
             <w:rStyle w:val="Hyperlink"/>
@@ -15191,7 +15284,7 @@
         </w:rPr>
         <w:t xml:space="preserve"> </w:t>
       </w:r>
-      <w:hyperlink r:id="rId37" w:history="1">
+      <w:hyperlink r:id="rId38" w:history="1">
         <w:r>
           <w:rPr>
             <w:rStyle w:val="Hyperlink"/>
@@ -15424,7 +15517,7 @@
       <w:r>
         <w:t xml:space="preserve"> </w:t>
       </w:r>
-      <w:hyperlink r:id="rId38" w:history="1">
+      <w:hyperlink r:id="rId39" w:history="1">
         <w:r>
           <w:rPr>
             <w:rStyle w:val="Hyperlink"/>
@@ -15599,7 +15692,7 @@
         </w:rPr>
         <w:t xml:space="preserve"> </w:t>
       </w:r>
-      <w:hyperlink r:id="rId39" w:history="1">
+      <w:hyperlink r:id="rId40" w:history="1">
         <w:r>
           <w:rPr>
             <w:rStyle w:val="Hyperlink"/>
@@ -15677,7 +15770,7 @@
       <w:r>
         <w:t xml:space="preserve"> </w:t>
       </w:r>
-      <w:hyperlink r:id="rId40" w:history="1">
+      <w:hyperlink r:id="rId41" w:history="1">
         <w:r>
           <w:rPr>
             <w:rStyle w:val="Hyperlink"/>
@@ -15857,7 +15950,7 @@
         </w:rPr>
         <w:t xml:space="preserve"> </w:t>
       </w:r>
-      <w:hyperlink r:id="rId41" w:history="1">
+      <w:hyperlink r:id="rId42" w:history="1">
         <w:r>
           <w:rPr>
             <w:rStyle w:val="Hyperlink"/>
@@ -15957,7 +16050,7 @@
       <w:r>
         <w:t xml:space="preserve"> </w:t>
       </w:r>
-      <w:hyperlink r:id="rId42" w:history="1">
+      <w:hyperlink r:id="rId43" w:history="1">
         <w:r>
           <w:rPr>
             <w:rStyle w:val="Hyperlink"/>
@@ -16182,7 +16275,7 @@
       <w:r>
         <w:t xml:space="preserve"> </w:t>
       </w:r>
-      <w:hyperlink r:id="rId43" w:history="1">
+      <w:hyperlink r:id="rId44" w:history="1">
         <w:r>
           <w:rPr>
             <w:rStyle w:val="Hyperlink"/>
@@ -16351,7 +16444,7 @@
       <w:r>
         <w:t xml:space="preserve"> </w:t>
       </w:r>
-      <w:hyperlink r:id="rId44" w:history="1">
+      <w:hyperlink r:id="rId45" w:history="1">
         <w:r>
           <w:rPr>
             <w:rStyle w:val="Hyperlink"/>
@@ -16537,7 +16630,7 @@
       <w:r>
         <w:t xml:space="preserve"> </w:t>
       </w:r>
-      <w:hyperlink r:id="rId45" w:history="1">
+      <w:hyperlink r:id="rId46" w:history="1">
         <w:r>
           <w:rPr>
             <w:rStyle w:val="Hyperlink"/>
@@ -16660,7 +16753,7 @@
       <w:r>
         <w:t xml:space="preserve">, 3101-3113. </w:t>
       </w:r>
-      <w:hyperlink r:id="rId46" w:history="1">
+      <w:hyperlink r:id="rId47" w:history="1">
         <w:r>
           <w:rPr>
             <w:rStyle w:val="Hyperlink"/>
@@ -16875,7 +16968,7 @@
       <w:r>
         <w:t xml:space="preserve"> </w:t>
       </w:r>
-      <w:hyperlink r:id="rId47" w:history="1">
+      <w:hyperlink r:id="rId48" w:history="1">
         <w:r>
           <w:rPr>
             <w:rStyle w:val="Hyperlink"/>
@@ -17018,7 +17111,7 @@
       <w:r>
         <w:t xml:space="preserve"> </w:t>
       </w:r>
-      <w:hyperlink r:id="rId48" w:history="1">
+      <w:hyperlink r:id="rId49" w:history="1">
         <w:r>
           <w:rPr>
             <w:rStyle w:val="Hyperlink"/>
@@ -17251,7 +17344,7 @@
         </w:rPr>
         <w:t xml:space="preserve"> </w:t>
       </w:r>
-      <w:hyperlink r:id="rId49" w:history="1">
+      <w:hyperlink r:id="rId50" w:history="1">
         <w:r>
           <w:rPr>
             <w:rStyle w:val="Hyperlink"/>
@@ -17474,7 +17567,7 @@
         </w:rPr>
         <w:t xml:space="preserve">. </w:t>
       </w:r>
-      <w:hyperlink r:id="rId50" w:history="1">
+      <w:hyperlink r:id="rId51" w:history="1">
         <w:r>
           <w:rPr>
             <w:rStyle w:val="Hyperlink"/>
@@ -17709,7 +17802,7 @@
       <w:r>
         <w:t xml:space="preserve">(3), 11-31. </w:t>
       </w:r>
-      <w:hyperlink r:id="rId51" w:history="1">
+      <w:hyperlink r:id="rId52" w:history="1">
         <w:r>
           <w:rPr>
             <w:rStyle w:val="Hyperlink"/>
@@ -17946,7 +18039,7 @@
       <w:r>
         <w:t xml:space="preserve">. </w:t>
       </w:r>
-      <w:hyperlink r:id="rId52" w:history="1">
+      <w:hyperlink r:id="rId53" w:history="1">
         <w:r>
           <w:rPr>
             <w:rStyle w:val="Hyperlink"/>
@@ -18128,7 +18221,7 @@
         </w:rPr>
         <w:t xml:space="preserve"> </w:t>
       </w:r>
-      <w:hyperlink r:id="rId53" w:history="1">
+      <w:hyperlink r:id="rId54" w:history="1">
         <w:r>
           <w:rPr>
             <w:rStyle w:val="Hyperlink"/>
@@ -18293,7 +18386,7 @@
       <w:r>
         <w:t xml:space="preserve">(1), 49-62. </w:t>
       </w:r>
-      <w:hyperlink r:id="rId54" w:history="1">
+      <w:hyperlink r:id="rId55" w:history="1">
         <w:r>
           <w:rPr>
             <w:rStyle w:val="Hyperlink"/>
@@ -18510,7 +18603,7 @@
         </w:rPr>
         <w:t xml:space="preserve">, 1777–1798. </w:t>
       </w:r>
-      <w:hyperlink r:id="rId55" w:history="1">
+      <w:hyperlink r:id="rId56" w:history="1">
         <w:r>
           <w:rPr>
             <w:rStyle w:val="Hyperlink"/>
@@ -18706,7 +18799,7 @@
       <w:r>
         <w:t xml:space="preserve"> </w:t>
       </w:r>
-      <w:hyperlink r:id="rId56" w:history="1">
+      <w:hyperlink r:id="rId57" w:history="1">
         <w:r>
           <w:rPr>
             <w:rStyle w:val="Hyperlink"/>
@@ -18940,7 +19033,7 @@
         </w:rPr>
         <w:t xml:space="preserve">. </w:t>
       </w:r>
-      <w:hyperlink r:id="rId57" w:history="1">
+      <w:hyperlink r:id="rId58" w:history="1">
         <w:r>
           <w:rPr>
             <w:rStyle w:val="Hyperlink"/>
@@ -19146,7 +19239,7 @@
       <w:r>
         <w:t xml:space="preserve">(5), 1766-1784. </w:t>
       </w:r>
-      <w:hyperlink r:id="rId58" w:history="1">
+      <w:hyperlink r:id="rId59" w:history="1">
         <w:r>
           <w:rPr>
             <w:rStyle w:val="Hyperlink"/>
@@ -19365,7 +19458,7 @@
         </w:rPr>
         <w:t xml:space="preserve">, 1931-1959. </w:t>
       </w:r>
-      <w:hyperlink r:id="rId59" w:history="1">
+      <w:hyperlink r:id="rId60" w:history="1">
         <w:r>
           <w:rPr>
             <w:rStyle w:val="Hyperlink"/>
@@ -19586,7 +19679,7 @@
         </w:rPr>
         <w:t>,</w:t>
       </w:r>
-      <w:hyperlink r:id="rId60">
+      <w:hyperlink r:id="rId61">
         <w:r>
           <w:rPr>
             <w:color w:val="212121"/>
@@ -19608,7 +19701,7 @@
         </w:rPr>
         <w:t xml:space="preserve">, 39–63. </w:t>
       </w:r>
-      <w:hyperlink r:id="rId61" w:history="1">
+      <w:hyperlink r:id="rId62" w:history="1">
         <w:r>
           <w:rPr>
             <w:rStyle w:val="Hyperlink"/>
@@ -19808,7 +19901,7 @@
       <w:r>
         <w:t xml:space="preserve">(3), 310-335. </w:t>
       </w:r>
-      <w:hyperlink r:id="rId62" w:history="1">
+      <w:hyperlink r:id="rId63" w:history="1">
         <w:r>
           <w:rPr>
             <w:rStyle w:val="Hyperlink"/>
@@ -20012,7 +20105,7 @@
       <w:r>
         <w:t xml:space="preserve"> </w:t>
       </w:r>
-      <w:hyperlink r:id="rId63" w:history="1">
+      <w:hyperlink r:id="rId64" w:history="1">
         <w:r>
           <w:rPr>
             <w:rStyle w:val="Hyperlink"/>
@@ -20144,7 +20237,7 @@
       <w:r>
         <w:t xml:space="preserve">(4), 863-885. </w:t>
       </w:r>
-      <w:hyperlink r:id="rId64" w:history="1">
+      <w:hyperlink r:id="rId65" w:history="1">
         <w:r>
           <w:rPr>
             <w:rStyle w:val="Hyperlink"/>
@@ -20356,7 +20449,7 @@
       <w:r>
         <w:t xml:space="preserve"> </w:t>
       </w:r>
-      <w:hyperlink r:id="rId65" w:history="1">
+      <w:hyperlink r:id="rId66" w:history="1">
         <w:r>
           <w:rPr>
             <w:rStyle w:val="Hyperlink"/>
@@ -20484,7 +20577,7 @@
       <w:r>
         <w:t>(4), 728-741. </w:t>
       </w:r>
-      <w:hyperlink r:id="rId66" w:history="1">
+      <w:hyperlink r:id="rId67" w:history="1">
         <w:r>
           <w:rPr>
             <w:rStyle w:val="Hyperlink"/>
@@ -20713,7 +20806,7 @@
       <w:r>
         <w:t>(3), 53-62. </w:t>
       </w:r>
-      <w:hyperlink r:id="rId67" w:history="1">
+      <w:hyperlink r:id="rId68" w:history="1">
         <w:r>
           <w:rPr>
             <w:rStyle w:val="Hyperlink"/>
@@ -20929,7 +21022,7 @@
         </w:rPr>
         <w:t xml:space="preserve">(3), 637-681. </w:t>
       </w:r>
-      <w:hyperlink r:id="rId68" w:history="1">
+      <w:hyperlink r:id="rId69" w:history="1">
         <w:r>
           <w:rPr>
             <w:rStyle w:val="Hyperlink"/>
@@ -20975,7 +21068,7 @@
       <w:r>
         <w:t xml:space="preserve">(3), 293-313. </w:t>
       </w:r>
-      <w:hyperlink r:id="rId69" w:history="1">
+      <w:hyperlink r:id="rId70" w:history="1">
         <w:r>
           <w:rPr>
             <w:rStyle w:val="Hyperlink"/>
@@ -21024,7 +21117,7 @@
       <w:r>
         <w:t xml:space="preserve">(10), 594-603. </w:t>
       </w:r>
-      <w:hyperlink r:id="rId70" w:history="1">
+      <w:hyperlink r:id="rId71" w:history="1">
         <w:r>
           <w:rPr>
             <w:rStyle w:val="Hyperlink"/>
@@ -21136,7 +21229,7 @@
       <w:r>
         <w:t xml:space="preserve"> EdtechBooks. </w:t>
       </w:r>
-      <w:hyperlink r:id="rId71" w:history="1">
+      <w:hyperlink r:id="rId72" w:history="1">
         <w:r>
           <w:rPr>
             <w:rStyle w:val="Hyperlink"/>
@@ -21840,7 +21933,7 @@
       <w:r>
         <w:t xml:space="preserve">. Advances in Game-Based Learning, Springer, Cham. </w:t>
       </w:r>
-      <w:hyperlink r:id="rId72" w:history="1">
+      <w:hyperlink r:id="rId73" w:history="1">
         <w:r>
           <w:rPr>
             <w:rStyle w:val="Hyperlink"/>
@@ -21905,7 +21998,7 @@
       <w:r>
         <w:t xml:space="preserve">, Lecture Note Series in Educational Technology. Springer, Singapore. </w:t>
       </w:r>
-      <w:hyperlink r:id="rId73">
+      <w:hyperlink r:id="rId74">
         <w:r>
           <w:rPr>
             <w:color w:val="1155CC"/>
@@ -21973,7 +22066,7 @@
       <w:r>
         <w:t xml:space="preserve">, Springer, Singapore. </w:t>
       </w:r>
-      <w:hyperlink r:id="rId74">
+      <w:hyperlink r:id="rId75">
         <w:r>
           <w:rPr>
             <w:color w:val="0563C1"/>
@@ -22039,7 +22132,7 @@
         <w:lastRenderedPageBreak/>
         <w:t xml:space="preserve">Intelligence, Springer, Singapore. </w:t>
       </w:r>
-      <w:hyperlink r:id="rId75">
+      <w:hyperlink r:id="rId76">
         <w:r>
           <w:rPr>
             <w:color w:val="0563C1"/>
@@ -22219,7 +22312,7 @@
         </w:rPr>
         <w:t xml:space="preserve">. Advance online publication. </w:t>
       </w:r>
-      <w:hyperlink r:id="rId76" w:history="1">
+      <w:hyperlink r:id="rId77" w:history="1">
         <w:r>
           <w:rPr>
             <w:rStyle w:val="Hyperlink"/>
@@ -22297,7 +22390,7 @@
         </w:rPr>
         <w:t xml:space="preserve">Generative AI-Enhanced Chatbot Design for Constructionist Gaming. In: Plass, J.L., Ochoa, X. (eds) Serious Games. JCSG 2024. Lecture Notes in Computer Science, vol 15259. Springer, Cham. </w:t>
       </w:r>
-      <w:hyperlink r:id="rId77" w:history="1">
+      <w:hyperlink r:id="rId78" w:history="1">
         <w:r>
           <w:rPr>
             <w:rStyle w:val="Hyperlink"/>
@@ -22413,7 +22506,7 @@
         </w:rPr>
         <w:t xml:space="preserve">(1), 16–19. </w:t>
       </w:r>
-      <w:hyperlink r:id="rId78" w:history="1">
+      <w:hyperlink r:id="rId79" w:history="1">
         <w:r>
           <w:rPr>
             <w:rStyle w:val="Hyperlink"/>
@@ -22500,7 +22593,7 @@
         </w:rPr>
         <w:t xml:space="preserve">(1), 32–35. </w:t>
       </w:r>
-      <w:hyperlink r:id="rId79" w:history="1">
+      <w:hyperlink r:id="rId80" w:history="1">
         <w:r>
           <w:rPr>
             <w:rStyle w:val="Hyperlink"/>
@@ -22585,7 +22678,7 @@
         </w:rPr>
         <w:t xml:space="preserve">(1), 109–111. Retrieved from </w:t>
       </w:r>
-      <w:hyperlink r:id="rId80" w:history="1">
+      <w:hyperlink r:id="rId81" w:history="1">
         <w:r>
           <w:rPr>
             <w:rStyle w:val="Hyperlink"/>
@@ -22677,7 +22770,7 @@
         </w:rPr>
         <w:t xml:space="preserve">(1), 112–113. Retrieved from </w:t>
       </w:r>
-      <w:hyperlink r:id="rId81" w:history="1">
+      <w:hyperlink r:id="rId82" w:history="1">
         <w:r>
           <w:rPr>
             <w:rStyle w:val="Hyperlink"/>
@@ -22763,7 +22856,7 @@
         </w:rPr>
         <w:t xml:space="preserve">(1), 21–25. Retrieved from </w:t>
       </w:r>
-      <w:hyperlink r:id="rId82" w:history="1">
+      <w:hyperlink r:id="rId83" w:history="1">
         <w:r>
           <w:rPr>
             <w:rStyle w:val="Hyperlink"/>
@@ -22835,7 +22928,7 @@
         </w:rPr>
         <w:t xml:space="preserve">, Fujisawa, Japan. </w:t>
       </w:r>
-      <w:hyperlink r:id="rId83" w:history="1">
+      <w:hyperlink r:id="rId84" w:history="1">
         <w:r>
           <w:rPr>
             <w:rStyle w:val="Hyperlink"/>
@@ -22881,7 +22974,7 @@
         </w:rPr>
         <w:t xml:space="preserve"> (pp. 889-892). International Society of the Learning Sciences. </w:t>
       </w:r>
-      <w:hyperlink r:id="rId84" w:history="1">
+      <w:hyperlink r:id="rId85" w:history="1">
         <w:r>
           <w:rPr>
             <w:rStyle w:val="Hyperlink"/>
@@ -22947,7 +23040,7 @@
         </w:rPr>
         <w:t xml:space="preserve"> </w:t>
       </w:r>
-      <w:hyperlink r:id="rId85" w:history="1">
+      <w:hyperlink r:id="rId86" w:history="1">
         <w:r>
           <w:rPr>
             <w:rStyle w:val="Hyperlink"/>
@@ -23012,7 +23105,7 @@
         </w:rPr>
         <w:t xml:space="preserve"> </w:t>
       </w:r>
-      <w:hyperlink r:id="rId86" w:history="1">
+      <w:hyperlink r:id="rId87" w:history="1">
         <w:r>
           <w:rPr>
             <w:rStyle w:val="Hyperlink"/>
@@ -23083,7 +23176,7 @@
         </w:rPr>
         <w:t xml:space="preserve">In: Fang X. (eds) HCI in Games: Serious and Immersive Games. HCI 2021. Lecture Notes in Computer Science, vol 12790. Springer, Cham. </w:t>
       </w:r>
-      <w:hyperlink r:id="rId87" w:history="1">
+      <w:hyperlink r:id="rId88" w:history="1">
         <w:r>
           <w:rPr>
             <w:rStyle w:val="Hyperlink"/>
@@ -23134,7 +23227,7 @@
         </w:rPr>
         <w:t xml:space="preserve"> </w:t>
       </w:r>
-      <w:hyperlink r:id="rId88" w:history="1">
+      <w:hyperlink r:id="rId89" w:history="1">
         <w:r>
           <w:rPr>
             <w:rStyle w:val="Hyperlink"/>
@@ -23177,7 +23270,7 @@
       <w:r>
         <w:t xml:space="preserve"> </w:t>
       </w:r>
-      <w:hyperlink r:id="rId89" w:history="1">
+      <w:hyperlink r:id="rId90" w:history="1">
         <w:r>
           <w:rPr>
             <w:rStyle w:val="Hyperlink"/>
@@ -23217,7 +23310,7 @@
       <w:r>
         <w:t xml:space="preserve"> </w:t>
       </w:r>
-      <w:hyperlink r:id="rId90" w:history="1">
+      <w:hyperlink r:id="rId91" w:history="1">
         <w:r>
           <w:rPr>
             <w:rStyle w:val="Hyperlink"/>
@@ -23287,7 +23380,7 @@
       <w:r>
         <w:t xml:space="preserve"> </w:t>
       </w:r>
-      <w:hyperlink r:id="rId91" w:history="1">
+      <w:hyperlink r:id="rId92" w:history="1">
         <w:r>
           <w:rPr>
             <w:rStyle w:val="Hyperlink"/>
@@ -23729,7 +23822,7 @@
         </w:rPr>
         <w:t> (pp. 1305-1309). Chesapeake, VA: Association for the Advancement of Computing in Education (AACE). Retrieved from </w:t>
       </w:r>
-      <w:hyperlink r:id="rId92">
+      <w:hyperlink r:id="rId93">
         <w:r>
           <w:rPr>
             <w:color w:val="0563C1"/>
@@ -45770,8 +45863,8 @@
       </w:pPr>
     </w:p>
     <w:sectPr>
-      <w:headerReference w:type="default" r:id="rId93"/>
-      <w:footerReference w:type="default" r:id="rId94"/>
+      <w:headerReference w:type="default" r:id="rId94"/>
+      <w:footerReference w:type="default" r:id="rId95"/>
       <w:pgSz w:w="12240" w:h="15840"/>
       <w:pgMar w:top="1701" w:right="1440" w:bottom="1440" w:left="1440" w:header="0" w:footer="720" w:gutter="0"/>
       <w:pgNumType w:start="1"/>
@@ -47292,7 +47385,6 @@
   <w:style w:type="character" w:default="1" w:styleId="DefaultParagraphFont">
     <w:name w:val="Default Paragraph Font"/>
     <w:uiPriority w:val="1"/>
-    <w:semiHidden/>
     <w:unhideWhenUsed/>
   </w:style>
   <w:style w:type="table" w:default="1" w:styleId="TableNormal">
@@ -47797,6 +47889,27 @@
 </file>
 
 <file path=customXml/item1.xml><?xml version="1.0" encoding="utf-8"?>
+<?mso-contentType ?>
+<FormTemplates xmlns="http://schemas.microsoft.com/sharepoint/v3/contenttype/forms">
+  <Display>DocumentLibraryForm</Display>
+  <Edit>DocumentLibraryForm</Edit>
+  <New>DocumentLibraryForm</New>
+</FormTemplates>
+</file>
+
+<file path=customXml/item2.xml><?xml version="1.0" encoding="utf-8"?>
+<b:Sources xmlns:b="http://schemas.openxmlformats.org/officeDocument/2006/bibliography" xmlns="http://schemas.openxmlformats.org/officeDocument/2006/bibliography" SelectedStyle="\APASixthEditionOfficeOnline.xsl" StyleName="APA" Version="6"/>
+</file>
+
+<file path=customXml/item3.xml><?xml version="1.0" encoding="utf-8"?>
+<p:properties xmlns:p="http://schemas.microsoft.com/office/2006/metadata/properties" xmlns:xsi="http://www.w3.org/2001/XMLSchema-instance" xmlns:pc="http://schemas.microsoft.com/office/infopath/2007/PartnerControls">
+  <documentManagement>
+    <_activity xmlns="6a4161d7-0e07-4bb5-8cdd-a87a7602a445" xsi:nil="true"/>
+  </documentManagement>
+</p:properties>
+</file>
+
+<file path=customXml/item4.xml><?xml version="1.0" encoding="utf-8"?>
 <ct:contentTypeSchema xmlns:ct="http://schemas.microsoft.com/office/2006/metadata/contentType" xmlns:ma="http://schemas.microsoft.com/office/2006/metadata/properties/metaAttributes" ct:_="" ma:_="" ma:contentTypeName="Document" ma:contentTypeID="0x010100FA54A6C77D34E44FB33E0184D6F9C744" ma:contentTypeVersion="18" ma:contentTypeDescription="Create a new document." ma:contentTypeScope="" ma:versionID="9c28832654d292338743ef1185d20088">
   <xsd:schema xmlns:xsd="http://www.w3.org/2001/XMLSchema" xmlns:xs="http://www.w3.org/2001/XMLSchema" xmlns:p="http://schemas.microsoft.com/office/2006/metadata/properties" xmlns:ns3="6a4161d7-0e07-4bb5-8cdd-a87a7602a445" xmlns:ns4="30453fea-43c5-4a0b-a417-834186a09351" targetNamespace="http://schemas.microsoft.com/office/2006/metadata/properties" ma:root="true" ma:fieldsID="aadbfd92c1be4506f2c2f9fc093c4d0b" ns3:_="" ns4:_="">
     <xsd:import namespace="6a4161d7-0e07-4bb5-8cdd-a87a7602a445"/>
@@ -48049,28 +48162,33 @@
 </ct:contentTypeSchema>
 </file>
 
-<file path=customXml/item2.xml><?xml version="1.0" encoding="utf-8"?>
-<p:properties xmlns:p="http://schemas.microsoft.com/office/2006/metadata/properties" xmlns:xsi="http://www.w3.org/2001/XMLSchema-instance" xmlns:pc="http://schemas.microsoft.com/office/infopath/2007/PartnerControls">
-  <documentManagement>
-    <_activity xmlns="6a4161d7-0e07-4bb5-8cdd-a87a7602a445" xsi:nil="true"/>
-  </documentManagement>
-</p:properties>
+<file path=customXml/itemProps1.xml><?xml version="1.0" encoding="utf-8"?>
+<ds:datastoreItem xmlns:ds="http://schemas.openxmlformats.org/officeDocument/2006/customXml" ds:itemID="{F79F8074-1665-45F2-8B05-A95EA1C1A155}">
+  <ds:schemaRefs>
+    <ds:schemaRef ds:uri="http://schemas.microsoft.com/sharepoint/v3/contenttype/forms"/>
+  </ds:schemaRefs>
+</ds:datastoreItem>
 </file>
 
-<file path=customXml/item3.xml><?xml version="1.0" encoding="utf-8"?>
-<b:Sources xmlns:b="http://schemas.openxmlformats.org/officeDocument/2006/bibliography" xmlns="http://schemas.openxmlformats.org/officeDocument/2006/bibliography" SelectedStyle="\APASixthEditionOfficeOnline.xsl" StyleName="APA" Version="6"/>
+<file path=customXml/itemProps2.xml><?xml version="1.0" encoding="utf-8"?>
+<ds:datastoreItem xmlns:ds="http://schemas.openxmlformats.org/officeDocument/2006/customXml" ds:itemID="{E286DD98-9466-43F6-BF97-336366EE54DF}">
+  <ds:schemaRefs>
+    <ds:schemaRef ds:uri="http://schemas.openxmlformats.org/officeDocument/2006/bibliography"/>
+  </ds:schemaRefs>
+</ds:datastoreItem>
 </file>
 
-<file path=customXml/item4.xml><?xml version="1.0" encoding="utf-8"?>
-<?mso-contentType ?>
-<FormTemplates xmlns="http://schemas.microsoft.com/sharepoint/v3/contenttype/forms">
-  <Display>DocumentLibraryForm</Display>
-  <Edit>DocumentLibraryForm</Edit>
-  <New>DocumentLibraryForm</New>
-</FormTemplates>
+<file path=customXml/itemProps3.xml><?xml version="1.0" encoding="utf-8"?>
+<ds:datastoreItem xmlns:ds="http://schemas.openxmlformats.org/officeDocument/2006/customXml" ds:itemID="{7C24488D-A36D-4C56-91ED-753F5C27550A}">
+  <ds:schemaRefs>
+    <ds:schemaRef ds:uri="http://schemas.microsoft.com/office/2006/metadata/properties"/>
+    <ds:schemaRef ds:uri="http://schemas.microsoft.com/office/infopath/2007/PartnerControls"/>
+    <ds:schemaRef ds:uri="6a4161d7-0e07-4bb5-8cdd-a87a7602a445"/>
+  </ds:schemaRefs>
+</ds:datastoreItem>
 </file>
 
-<file path=customXml/itemProps1.xml><?xml version="1.0" encoding="utf-8"?>
+<file path=customXml/itemProps4.xml><?xml version="1.0" encoding="utf-8"?>
 <ds:datastoreItem xmlns:ds="http://schemas.openxmlformats.org/officeDocument/2006/customXml" ds:itemID="{44F19B31-977D-45A4-A748-143054BB9DA7}">
   <ds:schemaRefs>
     <ds:schemaRef ds:uri="http://schemas.microsoft.com/office/2006/metadata/contentType"/>
@@ -48087,30 +48205,4 @@
     <ds:schemaRef ds:uri="http://schemas.microsoft.com/internal/obd"/>
   </ds:schemaRefs>
 </ds:datastoreItem>
-</file>
-
-<file path=customXml/itemProps2.xml><?xml version="1.0" encoding="utf-8"?>
-<ds:datastoreItem xmlns:ds="http://schemas.openxmlformats.org/officeDocument/2006/customXml" ds:itemID="{7C24488D-A36D-4C56-91ED-753F5C27550A}">
-  <ds:schemaRefs>
-    <ds:schemaRef ds:uri="http://schemas.microsoft.com/office/2006/metadata/properties"/>
-    <ds:schemaRef ds:uri="http://schemas.microsoft.com/office/infopath/2007/PartnerControls"/>
-    <ds:schemaRef ds:uri="6a4161d7-0e07-4bb5-8cdd-a87a7602a445"/>
-  </ds:schemaRefs>
-</ds:datastoreItem>
-</file>
-
-<file path=customXml/itemProps3.xml><?xml version="1.0" encoding="utf-8"?>
-<ds:datastoreItem xmlns:ds="http://schemas.openxmlformats.org/officeDocument/2006/customXml" ds:itemID="{E286DD98-9466-43F6-BF97-336366EE54DF}">
-  <ds:schemaRefs>
-    <ds:schemaRef ds:uri="http://schemas.openxmlformats.org/officeDocument/2006/bibliography"/>
-  </ds:schemaRefs>
-</ds:datastoreItem>
-</file>
-
-<file path=customXml/itemProps4.xml><?xml version="1.0" encoding="utf-8"?>
-<ds:datastoreItem xmlns:ds="http://schemas.openxmlformats.org/officeDocument/2006/customXml" ds:itemID="{F79F8074-1665-45F2-8B05-A95EA1C1A155}">
-  <ds:schemaRefs>
-    <ds:schemaRef ds:uri="http://schemas.microsoft.com/sharepoint/v3/contenttype/forms"/>
-  </ds:schemaRefs>
-</ds:datastoreItem>
 </file>
</xml_diff>

<commit_message>
Update CV docx and regenerate site-data (autopush 2026-06-01 09:00)
</commit_message>
<xml_diff>
--- a/CV_202605_MOON.docx
+++ b/CV_202605_MOON.docx
@@ -1163,7 +1163,23 @@
           <w:bCs/>
           <w:iCs/>
         </w:rPr>
-        <w:t>, Fall 2024)</w:t>
+        <w:t xml:space="preserve">, </w:t>
+      </w:r>
+      <w:proofErr w:type="gramStart"/>
+      <w:r>
+        <w:rPr>
+          <w:bCs/>
+          <w:iCs/>
+        </w:rPr>
+        <w:t>Fall</w:t>
+      </w:r>
+      <w:proofErr w:type="gramEnd"/>
+      <w:r>
+        <w:rPr>
+          <w:bCs/>
+          <w:iCs/>
+        </w:rPr>
+        <w:t xml:space="preserve"> 2024)</w:t>
       </w:r>
       <w:r>
         <w:rPr>
@@ -1631,7 +1647,23 @@
           <w:bCs/>
           <w:iCs/>
         </w:rPr>
-        <w:t>, Fall 2024)</w:t>
+        <w:t xml:space="preserve">, </w:t>
+      </w:r>
+      <w:proofErr w:type="gramStart"/>
+      <w:r>
+        <w:rPr>
+          <w:bCs/>
+          <w:iCs/>
+        </w:rPr>
+        <w:t>Fall</w:t>
+      </w:r>
+      <w:proofErr w:type="gramEnd"/>
+      <w:r>
+        <w:rPr>
+          <w:bCs/>
+          <w:iCs/>
+        </w:rPr>
+        <w:t xml:space="preserve"> 2024)</w:t>
       </w:r>
       <w:r>
         <w:rPr>
@@ -2280,7 +2312,15 @@
         <w:ind w:firstLine="720"/>
       </w:pPr>
       <w:r>
-        <w:t>Doctoral Dissertation Committee, Kimberly Galho (ELPTS, College of Education)</w:t>
+        <w:t xml:space="preserve">Doctoral Dissertation Committee, Kimberly </w:t>
+      </w:r>
+      <w:proofErr w:type="spellStart"/>
+      <w:r>
+        <w:t>Galho</w:t>
+      </w:r>
+      <w:proofErr w:type="spellEnd"/>
+      <w:r>
+        <w:t xml:space="preserve"> (ELPTS, College of Education)</w:t>
       </w:r>
     </w:p>
     <w:p>
@@ -2821,13 +2861,21 @@
         <w:t xml:space="preserve">, </w:t>
       </w:r>
       <w:r>
-        <w:t xml:space="preserve">Doctoral Student, Raissa Marchiori </w:t>
+        <w:t xml:space="preserve">Doctoral Student, Raissa </w:t>
+      </w:r>
+      <w:proofErr w:type="gramStart"/>
+      <w:r>
+        <w:t xml:space="preserve">Marchiori </w:t>
       </w:r>
       <w:r>
         <w:t xml:space="preserve"> </w:t>
       </w:r>
       <w:r>
-        <w:t>(Civil Engineering)</w:t>
+        <w:t>(</w:t>
+      </w:r>
+      <w:proofErr w:type="gramEnd"/>
+      <w:r>
+        <w:t>Civil Engineering)</w:t>
       </w:r>
     </w:p>
     <w:p>
@@ -2995,6 +3043,7 @@
           <w:lang w:eastAsia="ko-KR"/>
         </w:rPr>
       </w:pPr>
+      <w:proofErr w:type="gramStart"/>
       <w:r>
         <w:rPr>
           <w:rFonts w:hint="eastAsia"/>
@@ -3013,7 +3062,18 @@
           <w:u w:val="single"/>
           <w:lang w:eastAsia="ko-KR"/>
         </w:rPr>
-        <w:t xml:space="preserve">  (Total, </w:t>
+        <w:t xml:space="preserve">  (</w:t>
+      </w:r>
+      <w:proofErr w:type="gramEnd"/>
+      <w:r>
+        <w:rPr>
+          <w:rFonts w:hint="eastAsia"/>
+          <w:b/>
+          <w:bCs/>
+          <w:u w:val="single"/>
+          <w:lang w:eastAsia="ko-KR"/>
+        </w:rPr>
+        <w:t xml:space="preserve">Total, </w:t>
       </w:r>
       <w:r>
         <w:rPr>
@@ -3479,7 +3539,23 @@
           <w:rFonts w:hint="eastAsia"/>
           <w:lang w:eastAsia="ko-KR"/>
         </w:rPr>
-        <w:t xml:space="preserve">COE RisingTide Grant, The University of Alabama, </w:t>
+        <w:t xml:space="preserve">COE </w:t>
+      </w:r>
+      <w:proofErr w:type="spellStart"/>
+      <w:r>
+        <w:rPr>
+          <w:rFonts w:hint="eastAsia"/>
+          <w:lang w:eastAsia="ko-KR"/>
+        </w:rPr>
+        <w:t>RisingTide</w:t>
+      </w:r>
+      <w:proofErr w:type="spellEnd"/>
+      <w:r>
+        <w:rPr>
+          <w:rFonts w:hint="eastAsia"/>
+          <w:lang w:eastAsia="ko-KR"/>
+        </w:rPr>
+        <w:t xml:space="preserve"> Grant, The University of Alabama, </w:t>
       </w:r>
       <w:r>
         <w:rPr>
@@ -3580,11 +3656,33 @@
       <w:r>
         <w:t xml:space="preserve">). </w:t>
       </w:r>
-      <w:r>
-        <w:rPr>
-          <w:lang w:eastAsia="ko-KR"/>
-        </w:rPr>
-        <w:t>TeachPlay: AI-Enhanced Educational Gamelet Design</w:t>
+      <w:proofErr w:type="spellStart"/>
+      <w:r>
+        <w:rPr>
+          <w:lang w:eastAsia="ko-KR"/>
+        </w:rPr>
+        <w:t>TeachPlay</w:t>
+      </w:r>
+      <w:proofErr w:type="spellEnd"/>
+      <w:r>
+        <w:rPr>
+          <w:lang w:eastAsia="ko-KR"/>
+        </w:rPr>
+        <w:t xml:space="preserve">: AI-Enhanced Educational </w:t>
+      </w:r>
+      <w:proofErr w:type="spellStart"/>
+      <w:r>
+        <w:rPr>
+          <w:lang w:eastAsia="ko-KR"/>
+        </w:rPr>
+        <w:t>Gamelet</w:t>
+      </w:r>
+      <w:proofErr w:type="spellEnd"/>
+      <w:r>
+        <w:rPr>
+          <w:lang w:eastAsia="ko-KR"/>
+        </w:rPr>
+        <w:t xml:space="preserve"> Design</w:t>
       </w:r>
       <w:r>
         <w:rPr>
@@ -3700,11 +3798,19 @@
       <w:r>
         <w:t xml:space="preserve">). </w:t>
       </w:r>
-      <w:r>
-        <w:rPr>
-          <w:lang w:eastAsia="ko-KR"/>
-        </w:rPr>
-        <w:t>RemixEd: Designing AI- and XR-Enhanced Instructional Modules for Inclusive, Doctoral-Level Online Learning</w:t>
+      <w:proofErr w:type="spellStart"/>
+      <w:r>
+        <w:rPr>
+          <w:lang w:eastAsia="ko-KR"/>
+        </w:rPr>
+        <w:t>RemixEd</w:t>
+      </w:r>
+      <w:proofErr w:type="spellEnd"/>
+      <w:r>
+        <w:rPr>
+          <w:lang w:eastAsia="ko-KR"/>
+        </w:rPr>
+        <w:t>: Designing AI- and XR-Enhanced Instructional Modules for Inclusive, Doctoral-Level Online Learning</w:t>
       </w:r>
       <w:r>
         <w:rPr>
@@ -4142,7 +4248,39 @@
           <w:rFonts w:hint="eastAsia"/>
           <w:lang w:eastAsia="ko-KR"/>
         </w:rPr>
-        <w:t>Fellowship amount (summer stipend)</w:t>
+        <w:t xml:space="preserve">Fellowship </w:t>
+      </w:r>
+      <w:proofErr w:type="gramStart"/>
+      <w:r>
+        <w:rPr>
+          <w:rFonts w:hint="eastAsia"/>
+          <w:lang w:eastAsia="ko-KR"/>
+        </w:rPr>
+        <w:t>amount</w:t>
+      </w:r>
+      <w:proofErr w:type="gramEnd"/>
+      <w:r>
+        <w:rPr>
+          <w:rFonts w:hint="eastAsia"/>
+          <w:lang w:eastAsia="ko-KR"/>
+        </w:rPr>
+        <w:t xml:space="preserve"> (summer </w:t>
+      </w:r>
+      <w:proofErr w:type="gramStart"/>
+      <w:r>
+        <w:rPr>
+          <w:rFonts w:hint="eastAsia"/>
+          <w:lang w:eastAsia="ko-KR"/>
+        </w:rPr>
+        <w:t>stipend</w:t>
+      </w:r>
+      <w:proofErr w:type="gramEnd"/>
+      <w:r>
+        <w:rPr>
+          <w:rFonts w:hint="eastAsia"/>
+          <w:lang w:eastAsia="ko-KR"/>
+        </w:rPr>
+        <w:t>)</w:t>
       </w:r>
       <w:r>
         <w:t xml:space="preserve"> $</w:t>
@@ -5601,11 +5739,47 @@
         </w:rPr>
         <w:t xml:space="preserve">). </w:t>
       </w:r>
-      <w:r>
-        <w:rPr>
-          <w:lang w:eastAsia="ko-KR"/>
-        </w:rPr>
-        <w:t>SaTS 2.0: EDU: Metaverse or Metaworst: Metaverse Security Education by Using Heutagogical and Challenge-based Pedagogy</w:t>
+      <w:proofErr w:type="spellStart"/>
+      <w:r>
+        <w:rPr>
+          <w:lang w:eastAsia="ko-KR"/>
+        </w:rPr>
+        <w:t>SaTS</w:t>
+      </w:r>
+      <w:proofErr w:type="spellEnd"/>
+      <w:r>
+        <w:rPr>
+          <w:lang w:eastAsia="ko-KR"/>
+        </w:rPr>
+        <w:t xml:space="preserve"> 2.0: EDU: Metaverse or </w:t>
+      </w:r>
+      <w:proofErr w:type="spellStart"/>
+      <w:r>
+        <w:rPr>
+          <w:lang w:eastAsia="ko-KR"/>
+        </w:rPr>
+        <w:t>Metaworst</w:t>
+      </w:r>
+      <w:proofErr w:type="spellEnd"/>
+      <w:r>
+        <w:rPr>
+          <w:lang w:eastAsia="ko-KR"/>
+        </w:rPr>
+        <w:t xml:space="preserve">: Metaverse Security Education by Using </w:t>
+      </w:r>
+      <w:proofErr w:type="spellStart"/>
+      <w:r>
+        <w:rPr>
+          <w:lang w:eastAsia="ko-KR"/>
+        </w:rPr>
+        <w:t>Heutagogical</w:t>
+      </w:r>
+      <w:proofErr w:type="spellEnd"/>
+      <w:r>
+        <w:rPr>
+          <w:lang w:eastAsia="ko-KR"/>
+        </w:rPr>
+        <w:t xml:space="preserve"> and Challenge-based Pedagogy</w:t>
       </w:r>
       <w:r>
         <w:rPr>
@@ -5907,11 +6081,19 @@
         </w:rPr>
         <w:t xml:space="preserve">9). </w:t>
       </w:r>
-      <w:r>
-        <w:rPr>
-          <w:lang w:eastAsia="ko-KR"/>
-        </w:rPr>
-        <w:t>CyberSecure Minds: Generative AI-enhanced Microlearning Games to Teach Math and Science through Real-World Cybersecurity Scenarios for Marginalized Youth</w:t>
+      <w:proofErr w:type="spellStart"/>
+      <w:r>
+        <w:rPr>
+          <w:lang w:eastAsia="ko-KR"/>
+        </w:rPr>
+        <w:t>CyberSecure</w:t>
+      </w:r>
+      <w:proofErr w:type="spellEnd"/>
+      <w:r>
+        <w:rPr>
+          <w:lang w:eastAsia="ko-KR"/>
+        </w:rPr>
+        <w:t xml:space="preserve"> Minds: Generative AI-enhanced Microlearning Games to Teach Math and Science through Real-World Cybersecurity Scenarios for Marginalized Youth</w:t>
       </w:r>
       <w:r>
         <w:rPr>
@@ -7556,12 +7738,21 @@
         </w:rPr>
         <w:t xml:space="preserve"> 2027). </w:t>
       </w:r>
-      <w:r>
-        <w:rPr>
-          <w:rFonts w:hint="eastAsia"/>
-          <w:lang w:eastAsia="ko-KR"/>
-        </w:rPr>
-        <w:t xml:space="preserve">QuestFlex: </w:t>
+      <w:proofErr w:type="spellStart"/>
+      <w:r>
+        <w:rPr>
+          <w:rFonts w:hint="eastAsia"/>
+          <w:lang w:eastAsia="ko-KR"/>
+        </w:rPr>
+        <w:t>QuestFlex</w:t>
+      </w:r>
+      <w:proofErr w:type="spellEnd"/>
+      <w:r>
+        <w:rPr>
+          <w:rFonts w:hint="eastAsia"/>
+          <w:lang w:eastAsia="ko-KR"/>
+        </w:rPr>
+        <w:t xml:space="preserve">: </w:t>
       </w:r>
       <w:r>
         <w:rPr>
@@ -7816,7 +8007,27 @@
           <w:szCs w:val="22"/>
           <w:u w:val="single"/>
         </w:rPr>
-        <w:t>Note 2. * indicates the work with a mentoring student</w:t>
+        <w:t xml:space="preserve">Note 2. * </w:t>
+      </w:r>
+      <w:proofErr w:type="gramStart"/>
+      <w:r>
+        <w:rPr>
+          <w:bCs/>
+          <w:sz w:val="22"/>
+          <w:szCs w:val="22"/>
+          <w:u w:val="single"/>
+        </w:rPr>
+        <w:t>indicates</w:t>
+      </w:r>
+      <w:proofErr w:type="gramEnd"/>
+      <w:r>
+        <w:rPr>
+          <w:bCs/>
+          <w:sz w:val="22"/>
+          <w:szCs w:val="22"/>
+          <w:u w:val="single"/>
+        </w:rPr>
+        <w:t xml:space="preserve"> the work with a mentoring student</w:t>
       </w:r>
     </w:p>
     <w:p>
@@ -7854,7 +8065,27 @@
           <w:szCs w:val="22"/>
           <w:u w:val="single"/>
         </w:rPr>
-        <w:t>‡ indicates the corresponding authorship.</w:t>
+        <w:t xml:space="preserve">‡ </w:t>
+      </w:r>
+      <w:proofErr w:type="gramStart"/>
+      <w:r>
+        <w:rPr>
+          <w:bCs/>
+          <w:sz w:val="22"/>
+          <w:szCs w:val="22"/>
+          <w:u w:val="single"/>
+        </w:rPr>
+        <w:t>indicates</w:t>
+      </w:r>
+      <w:proofErr w:type="gramEnd"/>
+      <w:r>
+        <w:rPr>
+          <w:bCs/>
+          <w:sz w:val="22"/>
+          <w:szCs w:val="22"/>
+          <w:u w:val="single"/>
+        </w:rPr>
+        <w:t xml:space="preserve"> the corresponding authorship.</w:t>
       </w:r>
       <w:r>
         <w:rPr>
@@ -7946,10 +8177,22 @@
           <w:rFonts w:hint="eastAsia"/>
           <w:lang w:eastAsia="ko-KR"/>
         </w:rPr>
-        <w:t xml:space="preserve">[57] </w:t>
-      </w:r>
-      <w:r>
-        <w:t xml:space="preserve">‡ </w:t>
+        <w:t>[</w:t>
+      </w:r>
+      <w:proofErr w:type="gramStart"/>
+      <w:r>
+        <w:rPr>
+          <w:rFonts w:hint="eastAsia"/>
+          <w:lang w:eastAsia="ko-KR"/>
+        </w:rPr>
+        <w:t xml:space="preserve">57] </w:t>
+      </w:r>
+      <w:r>
+        <w:t>‡</w:t>
+      </w:r>
+      <w:proofErr w:type="gramEnd"/>
+      <w:r>
+        <w:t xml:space="preserve"> </w:t>
       </w:r>
       <w:r>
         <w:rPr>
@@ -9669,7 +9912,11 @@
         <w:ind w:left="720" w:hanging="720"/>
       </w:pPr>
       <w:r>
-        <w:t>[5</w:t>
+        <w:t>[</w:t>
+      </w:r>
+      <w:proofErr w:type="gramStart"/>
+      <w:r>
+        <w:t>5</w:t>
       </w:r>
       <w:r>
         <w:rPr>
@@ -9678,7 +9925,11 @@
         <w:t>1</w:t>
       </w:r>
       <w:r>
-        <w:t>] ‡ * </w:t>
+        <w:t>] ‡</w:t>
+      </w:r>
+      <w:proofErr w:type="gramEnd"/>
+      <w:r>
+        <w:t xml:space="preserve"> * </w:t>
       </w:r>
       <w:r>
         <w:rPr>
@@ -9694,7 +9945,15 @@
         <w:t>6</w:t>
       </w:r>
       <w:r>
-        <w:t>). Decoding immersive learning states: A reproducible microgenetic pipeline for behavioral data in virtual reality safety training. </w:t>
+        <w:t xml:space="preserve">). Decoding immersive learning states: A reproducible </w:t>
+      </w:r>
+      <w:proofErr w:type="spellStart"/>
+      <w:r>
+        <w:t>microgenetic</w:t>
+      </w:r>
+      <w:proofErr w:type="spellEnd"/>
+      <w:r>
+        <w:t xml:space="preserve"> pipeline for behavioral data in virtual reality safety training. </w:t>
       </w:r>
       <w:r>
         <w:rPr>
@@ -9714,6 +9973,7 @@
           <w:t>https://doi.org/10.1007/s41237-025-00286-1</w:t>
         </w:r>
       </w:hyperlink>
+      <w:proofErr w:type="gramStart"/>
       <w:r>
         <w:t xml:space="preserve"> </w:t>
       </w:r>
@@ -9742,7 +10002,17 @@
           <w:i/>
           <w:iCs/>
         </w:rPr>
-        <w:t>[SCOPUS-indexed]</w:t>
+        <w:t>[</w:t>
+      </w:r>
+      <w:proofErr w:type="gramEnd"/>
+      <w:r>
+        <w:rPr>
+          <w:b/>
+          <w:bCs/>
+          <w:i/>
+          <w:iCs/>
+        </w:rPr>
+        <w:t>SCOPUS-indexed]</w:t>
       </w:r>
     </w:p>
     <w:p>
@@ -10703,6 +10973,7 @@
         </w:rPr>
         <w:t xml:space="preserve">., Awoyemi, I., Ghooreian, A., &amp; </w:t>
       </w:r>
+      <w:proofErr w:type="spellStart"/>
       <w:r>
         <w:rPr>
           <w:bCs/>
@@ -10710,6 +10981,7 @@
         </w:rPr>
         <w:t>Ramenzapour</w:t>
       </w:r>
+      <w:proofErr w:type="spellEnd"/>
       <w:r>
         <w:rPr>
           <w:rFonts w:hint="eastAsia"/>
@@ -11037,6 +11309,7 @@
         </w:rPr>
         <w:t>46</w:t>
       </w:r>
+      <w:proofErr w:type="gramStart"/>
       <w:r>
         <w:rPr>
           <w:rFonts w:hint="eastAsia"/>
@@ -11053,6 +11326,7 @@
         </w:rPr>
         <w:t>‡</w:t>
       </w:r>
+      <w:proofErr w:type="gramEnd"/>
       <w:r>
         <w:rPr>
           <w:rFonts w:hint="eastAsia"/>
@@ -11453,7 +11727,16 @@
           <w:bCs/>
           <w:lang w:eastAsia="ko-KR"/>
         </w:rPr>
-        <w:t>[4</w:t>
+        <w:t>[</w:t>
+      </w:r>
+      <w:proofErr w:type="gramStart"/>
+      <w:r>
+        <w:rPr>
+          <w:rFonts w:hint="eastAsia"/>
+          <w:bCs/>
+          <w:lang w:eastAsia="ko-KR"/>
+        </w:rPr>
+        <w:t>4</w:t>
       </w:r>
       <w:r>
         <w:rPr>
@@ -11479,6 +11762,7 @@
         </w:rPr>
         <w:t>‡</w:t>
       </w:r>
+      <w:proofErr w:type="gramEnd"/>
       <w:r>
         <w:rPr>
           <w:rFonts w:hint="eastAsia"/>
@@ -11940,7 +12224,21 @@
         <w:rPr>
           <w:lang w:eastAsia="ko-KR"/>
         </w:rPr>
-        <w:t xml:space="preserve">How Non-CS preservice teachers conceptualize and engage with computational thinking through 3D game design: Insights from an </w:t>
+        <w:t xml:space="preserve">How </w:t>
+      </w:r>
+      <w:proofErr w:type="gramStart"/>
+      <w:r>
+        <w:rPr>
+          <w:lang w:eastAsia="ko-KR"/>
+        </w:rPr>
+        <w:t>Non-CS</w:t>
+      </w:r>
+      <w:proofErr w:type="gramEnd"/>
+      <w:r>
+        <w:rPr>
+          <w:lang w:eastAsia="ko-KR"/>
+        </w:rPr>
+        <w:t xml:space="preserve"> preservice teachers conceptualize and engage with computational thinking through 3D game design: Insights from an </w:t>
       </w:r>
       <w:r>
         <w:rPr>
@@ -12101,6 +12399,7 @@
         </w:rPr>
         <w:t>[</w:t>
       </w:r>
+      <w:proofErr w:type="gramStart"/>
       <w:r>
         <w:rPr>
           <w:rFonts w:hint="eastAsia"/>
@@ -12123,6 +12422,7 @@
         </w:rPr>
         <w:t>‡</w:t>
       </w:r>
+      <w:proofErr w:type="gramEnd"/>
       <w:r>
         <w:rPr>
           <w:rFonts w:hint="eastAsia"/>
@@ -13217,6 +13517,7 @@
       <w:r>
         <w:t>[</w:t>
       </w:r>
+      <w:proofErr w:type="gramStart"/>
       <w:r>
         <w:rPr>
           <w:rFonts w:hint="eastAsia"/>
@@ -13242,6 +13543,7 @@
         </w:rPr>
         <w:t>‡</w:t>
       </w:r>
+      <w:proofErr w:type="gramEnd"/>
       <w:r>
         <w:rPr>
           <w:rFonts w:hint="eastAsia"/>
@@ -13523,6 +13825,7 @@
           <w:t>https://doi.org/10.1186/s40561-024-00335-4</w:t>
         </w:r>
       </w:hyperlink>
+      <w:proofErr w:type="gramStart"/>
       <w:r>
         <w:rPr>
           <w:rFonts w:hint="eastAsia"/>
@@ -13539,7 +13842,18 @@
           <w:iCs/>
           <w:lang w:eastAsia="ko-KR"/>
         </w:rPr>
-        <w:t xml:space="preserve">[ESCI-indexed; IF = </w:t>
+        <w:t>[</w:t>
+      </w:r>
+      <w:proofErr w:type="gramEnd"/>
+      <w:r>
+        <w:rPr>
+          <w:b/>
+          <w:bCs/>
+          <w:i/>
+          <w:iCs/>
+          <w:lang w:eastAsia="ko-KR"/>
+        </w:rPr>
+        <w:t xml:space="preserve">ESCI-indexed; IF = </w:t>
       </w:r>
       <w:r>
         <w:rPr>
@@ -13752,7 +14066,15 @@
           <w:rFonts w:hint="eastAsia"/>
           <w:lang w:eastAsia="ko-KR"/>
         </w:rPr>
-        <w:t>[3</w:t>
+        <w:t>[</w:t>
+      </w:r>
+      <w:proofErr w:type="gramStart"/>
+      <w:r>
+        <w:rPr>
+          <w:rFonts w:hint="eastAsia"/>
+          <w:lang w:eastAsia="ko-KR"/>
+        </w:rPr>
+        <w:t>3</w:t>
       </w:r>
       <w:r>
         <w:rPr>
@@ -13776,6 +14098,7 @@
         </w:rPr>
         <w:t>‡</w:t>
       </w:r>
+      <w:proofErr w:type="gramEnd"/>
       <w:r>
         <w:rPr>
           <w:rFonts w:hint="eastAsia"/>
@@ -13957,7 +14280,15 @@
           <w:rFonts w:hint="eastAsia"/>
           <w:lang w:eastAsia="ko-KR"/>
         </w:rPr>
-        <w:t>[3</w:t>
+        <w:t>[</w:t>
+      </w:r>
+      <w:proofErr w:type="gramStart"/>
+      <w:r>
+        <w:rPr>
+          <w:rFonts w:hint="eastAsia"/>
+          <w:lang w:eastAsia="ko-KR"/>
+        </w:rPr>
+        <w:t>3</w:t>
       </w:r>
       <w:r>
         <w:rPr>
@@ -13981,6 +14312,7 @@
         </w:rPr>
         <w:t>‡</w:t>
       </w:r>
+      <w:proofErr w:type="gramEnd"/>
       <w:r>
         <w:rPr>
           <w:rFonts w:hint="eastAsia"/>
@@ -14171,7 +14503,15 @@
           <w:rFonts w:hint="eastAsia"/>
           <w:lang w:eastAsia="ko-KR"/>
         </w:rPr>
-        <w:t>[3</w:t>
+        <w:t>[</w:t>
+      </w:r>
+      <w:proofErr w:type="gramStart"/>
+      <w:r>
+        <w:rPr>
+          <w:rFonts w:hint="eastAsia"/>
+          <w:lang w:eastAsia="ko-KR"/>
+        </w:rPr>
+        <w:t>3</w:t>
       </w:r>
       <w:r>
         <w:rPr>
@@ -14195,6 +14535,7 @@
         </w:rPr>
         <w:t>‡</w:t>
       </w:r>
+      <w:proofErr w:type="gramEnd"/>
       <w:r>
         <w:rPr>
           <w:rFonts w:hint="eastAsia"/>
@@ -14649,6 +14990,7 @@
         </w:rPr>
         <w:t>[</w:t>
       </w:r>
+      <w:proofErr w:type="gramStart"/>
       <w:r>
         <w:rPr>
           <w:bCs/>
@@ -14677,6 +15019,7 @@
         </w:rPr>
         <w:t>‡</w:t>
       </w:r>
+      <w:proofErr w:type="gramEnd"/>
       <w:r>
         <w:rPr>
           <w:rFonts w:hint="eastAsia"/>
@@ -15119,7 +15462,21 @@
         <w:rPr>
           <w:bCs/>
         </w:rPr>
-        <w:t xml:space="preserve">nvironment:  A </w:t>
+        <w:t>nvironment</w:t>
+      </w:r>
+      <w:proofErr w:type="gramStart"/>
+      <w:r>
+        <w:rPr>
+          <w:bCs/>
+        </w:rPr>
+        <w:t>:  A</w:t>
+      </w:r>
+      <w:proofErr w:type="gramEnd"/>
+      <w:r>
+        <w:rPr>
+          <w:bCs/>
+        </w:rPr>
+        <w:t xml:space="preserve"> </w:t>
       </w:r>
       <w:r>
         <w:rPr>
@@ -15258,8 +15615,23 @@
         <w:rPr>
           <w:bCs/>
         </w:rPr>
-        <w:t xml:space="preserve">). Utilizing generative artificial intelligence for instructional design: Exploring strengths, weakness, opportunities, and threats. </w:t>
-      </w:r>
+        <w:t xml:space="preserve">). Utilizing generative artificial intelligence for instructional design: Exploring strengths, </w:t>
+      </w:r>
+      <w:proofErr w:type="gramStart"/>
+      <w:r>
+        <w:rPr>
+          <w:bCs/>
+        </w:rPr>
+        <w:t>weakness</w:t>
+      </w:r>
+      <w:proofErr w:type="gramEnd"/>
+      <w:r>
+        <w:rPr>
+          <w:bCs/>
+        </w:rPr>
+        <w:t xml:space="preserve">, opportunities, and threats. </w:t>
+      </w:r>
+      <w:proofErr w:type="spellStart"/>
       <w:r>
         <w:rPr>
           <w:bCs/>
@@ -15268,6 +15640,7 @@
         </w:rPr>
         <w:t>TechTrends</w:t>
       </w:r>
+      <w:proofErr w:type="spellEnd"/>
       <w:r>
         <w:rPr>
           <w:rFonts w:hint="eastAsia"/>
@@ -15430,6 +15803,7 @@
       <w:r>
         <w:t>[</w:t>
       </w:r>
+      <w:proofErr w:type="gramStart"/>
       <w:r>
         <w:t>29</w:t>
       </w:r>
@@ -15444,6 +15818,7 @@
         </w:rPr>
         <w:t>‡</w:t>
       </w:r>
+      <w:proofErr w:type="gramEnd"/>
       <w:r>
         <w:rPr>
           <w:rFonts w:hint="eastAsia"/>
@@ -15465,7 +15840,15 @@
         <w:t>Moon, J.</w:t>
       </w:r>
       <w:r>
-        <w:t xml:space="preserve">, Yeo, S., Si, Q., &amp; Ljeluola, </w:t>
+        <w:t xml:space="preserve">, Yeo, S., Si, Q., &amp; </w:t>
+      </w:r>
+      <w:proofErr w:type="spellStart"/>
+      <w:r>
+        <w:t>Ljeluola</w:t>
+      </w:r>
+      <w:proofErr w:type="spellEnd"/>
+      <w:r>
+        <w:t xml:space="preserve">, </w:t>
       </w:r>
       <w:r>
         <w:t xml:space="preserve">A. </w:t>
@@ -15525,6 +15908,7 @@
           <w:t>https://doi.org/10.1080/0020739X.2024.2337934</w:t>
         </w:r>
       </w:hyperlink>
+      <w:proofErr w:type="gramStart"/>
       <w:r>
         <w:t xml:space="preserve">   </w:t>
       </w:r>
@@ -15535,7 +15919,17 @@
           <w:i/>
           <w:iCs/>
         </w:rPr>
-        <w:t>[ESCI-indexed, IF = 0.</w:t>
+        <w:t>[</w:t>
+      </w:r>
+      <w:proofErr w:type="gramEnd"/>
+      <w:r>
+        <w:rPr>
+          <w:b/>
+          <w:bCs/>
+          <w:i/>
+          <w:iCs/>
+        </w:rPr>
+        <w:t>ESCI-indexed, IF = 0.</w:t>
       </w:r>
       <w:r>
         <w:rPr>
@@ -15607,7 +16001,11 @@
         </w:rPr>
       </w:pPr>
       <w:r>
-        <w:t>[2</w:t>
+        <w:t>[</w:t>
+      </w:r>
+      <w:proofErr w:type="gramStart"/>
+      <w:r>
+        <w:t>2</w:t>
       </w:r>
       <w:r>
         <w:t>8</w:t>
@@ -15623,6 +16021,7 @@
         </w:rPr>
         <w:t>‡</w:t>
       </w:r>
+      <w:proofErr w:type="gramEnd"/>
       <w:r>
         <w:rPr>
           <w:rFonts w:hint="eastAsia"/>
@@ -15659,7 +16058,15 @@
         <w:t>2024</w:t>
       </w:r>
       <w:r>
-        <w:t xml:space="preserve">). Applying multimodal data fusion to track autistic adolescents’ representational flexibility development during virtual reality-based training . </w:t>
+        <w:t xml:space="preserve">). Applying multimodal data fusion to track autistic adolescents’ representational flexibility development during virtual reality-based </w:t>
+      </w:r>
+      <w:proofErr w:type="gramStart"/>
+      <w:r>
+        <w:t>training .</w:t>
+      </w:r>
+      <w:proofErr w:type="gramEnd"/>
+      <w:r>
+        <w:t xml:space="preserve"> </w:t>
       </w:r>
       <w:r>
         <w:rPr>
@@ -15735,7 +16142,15 @@
         <w:t>Moon, J</w:t>
       </w:r>
       <w:r>
-        <w:t>., &amp; Drachsler, H. (</w:t>
+        <w:t xml:space="preserve">., &amp; </w:t>
+      </w:r>
+      <w:proofErr w:type="spellStart"/>
+      <w:r>
+        <w:t>Drachsler</w:t>
+      </w:r>
+      <w:proofErr w:type="spellEnd"/>
+      <w:r>
+        <w:t>, H. (</w:t>
       </w:r>
       <w:r>
         <w:t>2024</w:t>
@@ -16058,6 +16473,7 @@
           <w:t>https://doi.org/10.1007/s10648-024-09855-4</w:t>
         </w:r>
       </w:hyperlink>
+      <w:proofErr w:type="gramStart"/>
       <w:r>
         <w:t xml:space="preserve">  </w:t>
       </w:r>
@@ -16075,7 +16491,17 @@
           <w:i/>
           <w:iCs/>
         </w:rPr>
-        <w:t xml:space="preserve">[SSCI-indexed, IF = </w:t>
+        <w:t>[</w:t>
+      </w:r>
+      <w:proofErr w:type="gramEnd"/>
+      <w:r>
+        <w:rPr>
+          <w:b/>
+          <w:bCs/>
+          <w:i/>
+          <w:iCs/>
+        </w:rPr>
+        <w:t xml:space="preserve">SSCI-indexed, IF = </w:t>
       </w:r>
       <w:r>
         <w:rPr>
@@ -16213,7 +16639,11 @@
         </w:rPr>
       </w:pPr>
       <w:r>
-        <w:t>[2</w:t>
+        <w:t>[</w:t>
+      </w:r>
+      <w:proofErr w:type="gramStart"/>
+      <w:r>
+        <w:t>2</w:t>
       </w:r>
       <w:r>
         <w:t>4</w:t>
@@ -16229,6 +16659,7 @@
         </w:rPr>
         <w:t>‡</w:t>
       </w:r>
+      <w:proofErr w:type="gramEnd"/>
       <w:r>
         <w:rPr>
           <w:rFonts w:hint="eastAsia"/>
@@ -16849,19 +17280,29 @@
           <w:i/>
           <w:iCs/>
         </w:rPr>
-        <w:t xml:space="preserve"> = </w:t>
-      </w:r>
-      <w:r>
-        <w:rPr>
-          <w:rFonts w:hint="eastAsia"/>
-          <w:b/>
-          <w:bCs/>
-          <w:i/>
-          <w:iCs/>
-          <w:lang w:eastAsia="ko-KR"/>
-        </w:rPr>
         <w:t xml:space="preserve"> </w:t>
       </w:r>
+      <w:proofErr w:type="gramStart"/>
+      <w:r>
+        <w:rPr>
+          <w:b/>
+          <w:bCs/>
+          <w:i/>
+          <w:iCs/>
+        </w:rPr>
+        <w:t xml:space="preserve">= </w:t>
+      </w:r>
+      <w:r>
+        <w:rPr>
+          <w:rFonts w:hint="eastAsia"/>
+          <w:b/>
+          <w:bCs/>
+          <w:i/>
+          <w:iCs/>
+          <w:lang w:eastAsia="ko-KR"/>
+        </w:rPr>
+        <w:t xml:space="preserve"> </w:t>
+      </w:r>
       <w:r>
         <w:rPr>
           <w:rFonts w:hint="eastAsia"/>
@@ -16911,7 +17352,14 @@
         <w:rPr>
           <w:rFonts w:ascii="Tahoma" w:hAnsi="Tahoma" w:cs="Tahoma"/>
         </w:rPr>
-        <w:t>﻿﻿</w:t>
+        <w:t>﻿</w:t>
+      </w:r>
+      <w:proofErr w:type="gramEnd"/>
+      <w:r>
+        <w:rPr>
+          <w:rFonts w:ascii="Tahoma" w:hAnsi="Tahoma" w:cs="Tahoma"/>
+        </w:rPr>
+        <w:t>﻿</w:t>
       </w:r>
     </w:p>
     <w:p>
@@ -16924,6 +17372,7 @@
       <w:r>
         <w:t>0</w:t>
       </w:r>
+      <w:proofErr w:type="gramStart"/>
       <w:r>
         <w:t xml:space="preserve">]  </w:t>
       </w:r>
@@ -16935,6 +17384,7 @@
         </w:rPr>
         <w:t>‡</w:t>
       </w:r>
+      <w:proofErr w:type="gramEnd"/>
       <w:r>
         <w:rPr>
           <w:rFonts w:hint="eastAsia"/>
@@ -17293,7 +17743,11 @@
         </w:rPr>
       </w:pPr>
       <w:r>
-        <w:t>[1</w:t>
+        <w:t>[</w:t>
+      </w:r>
+      <w:proofErr w:type="gramStart"/>
+      <w:r>
+        <w:t>1</w:t>
       </w:r>
       <w:r>
         <w:t>8</w:t>
@@ -17309,6 +17763,7 @@
         </w:rPr>
         <w:t>‡</w:t>
       </w:r>
+      <w:proofErr w:type="gramEnd"/>
       <w:r>
         <w:rPr>
           <w:rFonts w:hint="eastAsia"/>
@@ -17965,7 +18420,11 @@
         <w:ind w:left="720" w:hanging="720"/>
       </w:pPr>
       <w:r>
-        <w:t xml:space="preserve">[15] </w:t>
+        <w:t>[</w:t>
+      </w:r>
+      <w:proofErr w:type="gramStart"/>
+      <w:r>
+        <w:t xml:space="preserve">15] </w:t>
       </w:r>
       <w:r>
         <w:rPr>
@@ -17975,6 +18434,7 @@
         </w:rPr>
         <w:t>‡</w:t>
       </w:r>
+      <w:proofErr w:type="gramEnd"/>
       <w:r>
         <w:rPr>
           <w:rFonts w:hint="eastAsia"/>
@@ -18190,6 +18650,7 @@
       <w:r>
         <w:t xml:space="preserve"> </w:t>
       </w:r>
+      <w:proofErr w:type="spellStart"/>
       <w:r>
         <w:rPr>
           <w:i/>
@@ -18197,6 +18658,7 @@
         </w:rPr>
         <w:t>TechTrends</w:t>
       </w:r>
+      <w:proofErr w:type="spellEnd"/>
       <w:r>
         <w:rPr>
           <w:i/>
@@ -18483,7 +18945,17 @@
           <w:i/>
           <w:iCs/>
         </w:rPr>
-        <w:t xml:space="preserve"> = </w:t>
+        <w:t xml:space="preserve"> </w:t>
+      </w:r>
+      <w:proofErr w:type="gramStart"/>
+      <w:r>
+        <w:rPr>
+          <w:b/>
+          <w:bCs/>
+          <w:i/>
+          <w:iCs/>
+        </w:rPr>
+        <w:t xml:space="preserve">= </w:t>
       </w:r>
       <w:r>
         <w:rPr>
@@ -18507,6 +18979,7 @@
         </w:rPr>
         <w:t>3</w:t>
       </w:r>
+      <w:proofErr w:type="gramEnd"/>
       <w:r>
         <w:rPr>
           <w:b/>
@@ -18535,7 +19008,11 @@
         </w:rPr>
       </w:pPr>
       <w:r>
-        <w:t xml:space="preserve">[12] </w:t>
+        <w:t>[</w:t>
+      </w:r>
+      <w:proofErr w:type="gramStart"/>
+      <w:r>
+        <w:t xml:space="preserve">12] </w:t>
       </w:r>
       <w:r>
         <w:rPr>
@@ -18545,6 +19022,7 @@
         </w:rPr>
         <w:t>‡</w:t>
       </w:r>
+      <w:proofErr w:type="gramEnd"/>
       <w:r>
         <w:rPr>
           <w:rFonts w:hint="eastAsia"/>
@@ -18611,6 +19089,7 @@
           <w:t>https://doi.org/10.1007/s10798-021-09672-8</w:t>
         </w:r>
       </w:hyperlink>
+      <w:proofErr w:type="gramStart"/>
       <w:r>
         <w:t xml:space="preserve"> </w:t>
       </w:r>
@@ -18626,7 +19105,16 @@
           <w:i/>
           <w:iCs/>
         </w:rPr>
-        <w:t>[SCIE- and SSCI-indexed</w:t>
+        <w:t>[</w:t>
+      </w:r>
+      <w:proofErr w:type="gramEnd"/>
+      <w:r>
+        <w:rPr>
+          <w:b/>
+          <w:i/>
+          <w:iCs/>
+        </w:rPr>
+        <w:t>SCIE- and SSCI-indexed</w:t>
       </w:r>
       <w:r>
         <w:rPr>
@@ -18686,7 +19174,17 @@
           <w:i/>
           <w:iCs/>
         </w:rPr>
-        <w:t xml:space="preserve"> = </w:t>
+        <w:t xml:space="preserve"> </w:t>
+      </w:r>
+      <w:proofErr w:type="gramStart"/>
+      <w:r>
+        <w:rPr>
+          <w:b/>
+          <w:bCs/>
+          <w:i/>
+          <w:iCs/>
+        </w:rPr>
+        <w:t xml:space="preserve">= </w:t>
       </w:r>
       <w:r>
         <w:rPr>
@@ -18710,6 +19208,7 @@
         </w:rPr>
         <w:t>8</w:t>
       </w:r>
+      <w:proofErr w:type="gramEnd"/>
       <w:r>
         <w:rPr>
           <w:b/>
@@ -18740,7 +19239,11 @@
         </w:rPr>
       </w:pPr>
       <w:r>
-        <w:t xml:space="preserve">[11] </w:t>
+        <w:t>[</w:t>
+      </w:r>
+      <w:proofErr w:type="gramStart"/>
+      <w:r>
+        <w:t xml:space="preserve">11] </w:t>
       </w:r>
       <w:r>
         <w:rPr>
@@ -18750,6 +19253,7 @@
         </w:rPr>
         <w:t>‡</w:t>
       </w:r>
+      <w:proofErr w:type="gramEnd"/>
       <w:r>
         <w:rPr>
           <w:rFonts w:hint="eastAsia"/>
@@ -18807,6 +19311,7 @@
           <w:t>https://doi.org/10.19173/irrodl.v22i1.5110</w:t>
         </w:r>
       </w:hyperlink>
+      <w:proofErr w:type="gramStart"/>
       <w:r>
         <w:t xml:space="preserve"> </w:t>
       </w:r>
@@ -18818,7 +19323,15 @@
           <w:b/>
           <w:i/>
         </w:rPr>
-        <w:t>[SSCI-indexed</w:t>
+        <w:t>[</w:t>
+      </w:r>
+      <w:proofErr w:type="gramEnd"/>
+      <w:r>
+        <w:rPr>
+          <w:b/>
+          <w:i/>
+        </w:rPr>
+        <w:t>SSCI-indexed</w:t>
       </w:r>
       <w:r>
         <w:rPr>
@@ -19127,7 +19640,17 @@
           <w:i/>
           <w:iCs/>
         </w:rPr>
-        <w:t xml:space="preserve"> = </w:t>
+        <w:t xml:space="preserve"> </w:t>
+      </w:r>
+      <w:proofErr w:type="gramStart"/>
+      <w:r>
+        <w:rPr>
+          <w:b/>
+          <w:bCs/>
+          <w:i/>
+          <w:iCs/>
+        </w:rPr>
+        <w:t xml:space="preserve">= </w:t>
       </w:r>
       <w:r>
         <w:rPr>
@@ -19151,6 +19674,7 @@
         </w:rPr>
         <w:t>2</w:t>
       </w:r>
+      <w:proofErr w:type="gramEnd"/>
       <w:r>
         <w:rPr>
           <w:b/>
@@ -19180,7 +19704,11 @@
         </w:rPr>
       </w:pPr>
       <w:r>
-        <w:t xml:space="preserve">[9] </w:t>
+        <w:t>[</w:t>
+      </w:r>
+      <w:proofErr w:type="gramStart"/>
+      <w:r>
+        <w:t xml:space="preserve">9] </w:t>
       </w:r>
       <w:r>
         <w:rPr>
@@ -19190,6 +19718,7 @@
         </w:rPr>
         <w:t>‡</w:t>
       </w:r>
+      <w:proofErr w:type="gramEnd"/>
       <w:r>
         <w:rPr>
           <w:rFonts w:hint="eastAsia"/>
@@ -19337,7 +19866,17 @@
           <w:i/>
           <w:iCs/>
         </w:rPr>
-        <w:t xml:space="preserve"> = </w:t>
+        <w:t xml:space="preserve"> </w:t>
+      </w:r>
+      <w:proofErr w:type="gramStart"/>
+      <w:r>
+        <w:rPr>
+          <w:b/>
+          <w:bCs/>
+          <w:i/>
+          <w:iCs/>
+        </w:rPr>
+        <w:t xml:space="preserve">= </w:t>
       </w:r>
       <w:r>
         <w:rPr>
@@ -19350,6 +19889,7 @@
         </w:rPr>
         <w:t xml:space="preserve"> 8.1</w:t>
       </w:r>
+      <w:proofErr w:type="gramEnd"/>
       <w:r>
         <w:rPr>
           <w:b/>
@@ -19619,7 +20159,11 @@
         </w:rPr>
       </w:pPr>
       <w:r>
-        <w:t xml:space="preserve">[7] </w:t>
+        <w:t>[</w:t>
+      </w:r>
+      <w:proofErr w:type="gramStart"/>
+      <w:r>
+        <w:t xml:space="preserve">7] </w:t>
       </w:r>
       <w:r>
         <w:rPr>
@@ -19629,6 +20173,7 @@
         </w:rPr>
         <w:t>‡</w:t>
       </w:r>
+      <w:proofErr w:type="gramEnd"/>
       <w:r>
         <w:rPr>
           <w:rFonts w:hint="eastAsia"/>
@@ -19830,7 +20375,11 @@
         </w:rPr>
       </w:pPr>
       <w:r>
-        <w:t xml:space="preserve">[6] </w:t>
+        <w:t>[</w:t>
+      </w:r>
+      <w:proofErr w:type="gramStart"/>
+      <w:r>
+        <w:t xml:space="preserve">6] </w:t>
       </w:r>
       <w:r>
         <w:rPr>
@@ -19840,6 +20389,7 @@
         </w:rPr>
         <w:t>‡</w:t>
       </w:r>
+      <w:proofErr w:type="gramEnd"/>
       <w:r>
         <w:rPr>
           <w:rFonts w:hint="eastAsia"/>
@@ -20167,7 +20717,11 @@
         </w:rPr>
       </w:pPr>
       <w:r>
-        <w:t xml:space="preserve">[4] </w:t>
+        <w:t>[</w:t>
+      </w:r>
+      <w:proofErr w:type="gramStart"/>
+      <w:r>
+        <w:t xml:space="preserve">4] </w:t>
       </w:r>
       <w:r>
         <w:rPr>
@@ -20177,6 +20731,7 @@
         </w:rPr>
         <w:t>‡</w:t>
       </w:r>
+      <w:proofErr w:type="gramEnd"/>
       <w:r>
         <w:rPr>
           <w:rFonts w:hint="eastAsia"/>
@@ -20324,19 +20879,29 @@
           <w:i/>
           <w:iCs/>
         </w:rPr>
-        <w:t xml:space="preserve"> = </w:t>
-      </w:r>
-      <w:r>
-        <w:rPr>
-          <w:rFonts w:hint="eastAsia"/>
-          <w:b/>
-          <w:bCs/>
-          <w:i/>
-          <w:iCs/>
-          <w:lang w:eastAsia="ko-KR"/>
-        </w:rPr>
         <w:t xml:space="preserve"> </w:t>
       </w:r>
+      <w:proofErr w:type="gramStart"/>
+      <w:r>
+        <w:rPr>
+          <w:b/>
+          <w:bCs/>
+          <w:i/>
+          <w:iCs/>
+        </w:rPr>
+        <w:t xml:space="preserve">= </w:t>
+      </w:r>
+      <w:r>
+        <w:rPr>
+          <w:rFonts w:hint="eastAsia"/>
+          <w:b/>
+          <w:bCs/>
+          <w:i/>
+          <w:iCs/>
+          <w:lang w:eastAsia="ko-KR"/>
+        </w:rPr>
+        <w:t xml:space="preserve"> </w:t>
+      </w:r>
       <w:r>
         <w:rPr>
           <w:rFonts w:hint="eastAsia"/>
@@ -20359,6 +20924,7 @@
         </w:rPr>
         <w:t>.0</w:t>
       </w:r>
+      <w:proofErr w:type="gramEnd"/>
       <w:r>
         <w:rPr>
           <w:b/>
@@ -20386,7 +20952,11 @@
         </w:rPr>
       </w:pPr>
       <w:r>
-        <w:t xml:space="preserve">[3] </w:t>
+        <w:t>[</w:t>
+      </w:r>
+      <w:proofErr w:type="gramStart"/>
+      <w:r>
+        <w:t xml:space="preserve">3] </w:t>
       </w:r>
       <w:r>
         <w:rPr>
@@ -20396,6 +20966,7 @@
         </w:rPr>
         <w:t>‡</w:t>
       </w:r>
+      <w:proofErr w:type="gramEnd"/>
       <w:r>
         <w:rPr>
           <w:rFonts w:hint="eastAsia"/>
@@ -20685,19 +21256,29 @@
           <w:i/>
           <w:iCs/>
         </w:rPr>
-        <w:t xml:space="preserve"> = </w:t>
-      </w:r>
-      <w:r>
-        <w:rPr>
-          <w:rFonts w:hint="eastAsia"/>
-          <w:b/>
-          <w:bCs/>
-          <w:i/>
-          <w:iCs/>
-          <w:lang w:eastAsia="ko-KR"/>
-        </w:rPr>
         <w:t xml:space="preserve"> </w:t>
       </w:r>
+      <w:proofErr w:type="gramStart"/>
+      <w:r>
+        <w:rPr>
+          <w:b/>
+          <w:bCs/>
+          <w:i/>
+          <w:iCs/>
+        </w:rPr>
+        <w:t xml:space="preserve">= </w:t>
+      </w:r>
+      <w:r>
+        <w:rPr>
+          <w:rFonts w:hint="eastAsia"/>
+          <w:b/>
+          <w:bCs/>
+          <w:i/>
+          <w:iCs/>
+          <w:lang w:eastAsia="ko-KR"/>
+        </w:rPr>
+        <w:t xml:space="preserve"> </w:t>
+      </w:r>
       <w:r>
         <w:rPr>
           <w:rFonts w:hint="eastAsia"/>
@@ -20731,6 +21312,7 @@
         </w:rPr>
         <w:t>1</w:t>
       </w:r>
+      <w:proofErr w:type="gramEnd"/>
       <w:r>
         <w:rPr>
           <w:b/>
@@ -20758,7 +21340,11 @@
         </w:rPr>
       </w:pPr>
       <w:r>
-        <w:t xml:space="preserve">[1] </w:t>
+        <w:t>[</w:t>
+      </w:r>
+      <w:proofErr w:type="gramStart"/>
+      <w:r>
+        <w:t xml:space="preserve">1] </w:t>
       </w:r>
       <w:r>
         <w:rPr>
@@ -20768,6 +21354,7 @@
         </w:rPr>
         <w:t>‡</w:t>
       </w:r>
+      <w:proofErr w:type="gramEnd"/>
       <w:r>
         <w:rPr>
           <w:rFonts w:hint="eastAsia"/>
@@ -20985,7 +21572,21 @@
         <w:rPr>
           <w:color w:val="212121"/>
         </w:rPr>
-        <w:t xml:space="preserve">. (2020). Exploring synchronous online course cases on secondary schools via </w:t>
+        <w:t xml:space="preserve">. (2020). Exploring synchronous online course cases </w:t>
+      </w:r>
+      <w:proofErr w:type="gramStart"/>
+      <w:r>
+        <w:rPr>
+          <w:color w:val="212121"/>
+        </w:rPr>
+        <w:t>on</w:t>
+      </w:r>
+      <w:proofErr w:type="gramEnd"/>
+      <w:r>
+        <w:rPr>
+          <w:color w:val="212121"/>
+        </w:rPr>
+        <w:t xml:space="preserve"> secondary schools via </w:t>
       </w:r>
       <w:r>
         <w:t>semantic</w:t>
@@ -21224,10 +21825,34 @@
         <w:t xml:space="preserve">Instructional Technology and Learning Sciences: Korean Open Access Guide. </w:t>
       </w:r>
       <w:r>
-        <w:t>Korean Edutech/LearningSciences Researcher Network (KELS).</w:t>
-      </w:r>
-      <w:r>
-        <w:t xml:space="preserve"> EdtechBooks. </w:t>
+        <w:t xml:space="preserve">Korean </w:t>
+      </w:r>
+      <w:proofErr w:type="spellStart"/>
+      <w:r>
+        <w:t>Edutech</w:t>
+      </w:r>
+      <w:proofErr w:type="spellEnd"/>
+      <w:r>
+        <w:t>/</w:t>
+      </w:r>
+      <w:proofErr w:type="spellStart"/>
+      <w:r>
+        <w:t>LearningSciences</w:t>
+      </w:r>
+      <w:proofErr w:type="spellEnd"/>
+      <w:r>
+        <w:t xml:space="preserve"> Researcher Network (KELS).</w:t>
+      </w:r>
+      <w:r>
+        <w:t xml:space="preserve"> </w:t>
+      </w:r>
+      <w:proofErr w:type="spellStart"/>
+      <w:r>
+        <w:t>EdtechBooks</w:t>
+      </w:r>
+      <w:proofErr w:type="spellEnd"/>
+      <w:r>
+        <w:t xml:space="preserve">. </w:t>
       </w:r>
       <w:hyperlink r:id="rId72" w:history="1">
         <w:r>
@@ -21512,6 +22137,7 @@
         </w:rPr>
         <w:t xml:space="preserve">] </w:t>
       </w:r>
+      <w:proofErr w:type="gramStart"/>
       <w:r>
         <w:t xml:space="preserve">‡ </w:t>
       </w:r>
@@ -21520,7 +22146,15 @@
           <w:b/>
           <w:lang w:eastAsia="ko-KR"/>
         </w:rPr>
-        <w:t xml:space="preserve"> Moon, J</w:t>
+        <w:t xml:space="preserve"> Moon</w:t>
+      </w:r>
+      <w:proofErr w:type="gramEnd"/>
+      <w:r>
+        <w:rPr>
+          <w:b/>
+          <w:lang w:eastAsia="ko-KR"/>
+        </w:rPr>
+        <w:t>, J</w:t>
       </w:r>
       <w:r>
         <w:rPr>
@@ -21542,7 +22176,23 @@
           <w:bCs/>
           <w:lang w:eastAsia="ko-KR"/>
         </w:rPr>
-        <w:t xml:space="preserve">reasoning: AI-mediated dilemma spaces and exploratory learning. In A. Darejeh &amp; S. Sepasgozar (Eds.), </w:t>
+        <w:t xml:space="preserve">reasoning: AI-mediated dilemma spaces and exploratory learning. In A. Darejeh &amp; S. </w:t>
+      </w:r>
+      <w:proofErr w:type="spellStart"/>
+      <w:r>
+        <w:rPr>
+          <w:bCs/>
+          <w:lang w:eastAsia="ko-KR"/>
+        </w:rPr>
+        <w:t>Sepasgozar</w:t>
+      </w:r>
+      <w:proofErr w:type="spellEnd"/>
+      <w:r>
+        <w:rPr>
+          <w:bCs/>
+          <w:lang w:eastAsia="ko-KR"/>
+        </w:rPr>
+        <w:t xml:space="preserve"> (Eds.), </w:t>
       </w:r>
       <w:r>
         <w:rPr>
@@ -21581,6 +22231,7 @@
         </w:rPr>
         <w:t>7</w:t>
       </w:r>
+      <w:proofErr w:type="gramStart"/>
       <w:r>
         <w:rPr>
           <w:rFonts w:hint="eastAsia"/>
@@ -21604,6 +22255,7 @@
         </w:rPr>
         <w:t>‡</w:t>
       </w:r>
+      <w:proofErr w:type="gramEnd"/>
       <w:r>
         <w:rPr>
           <w:rFonts w:hint="eastAsia"/>
@@ -21921,7 +22573,15 @@
         <w:t>Moon, J</w:t>
       </w:r>
       <w:r>
-        <w:t xml:space="preserve">., and West, L. (2021). Designing Dynamic Learning Supports for Game and Simulation-Based Learning in STEM Education, Aprea C. and Ifenthaler, D.(eds.) in </w:t>
+        <w:t xml:space="preserve">., and West, L. (2021). Designing Dynamic Learning Supports for Game and Simulation-Based Learning in STEM Education, Aprea C. and </w:t>
+      </w:r>
+      <w:proofErr w:type="spellStart"/>
+      <w:r>
+        <w:t>Ifenthaler</w:t>
+      </w:r>
+      <w:proofErr w:type="spellEnd"/>
+      <w:r>
+        <w:t xml:space="preserve">, D.(eds.) in </w:t>
       </w:r>
       <w:r>
         <w:rPr>
@@ -22223,7 +22883,27 @@
           <w:szCs w:val="22"/>
           <w:u w:val="single"/>
         </w:rPr>
-        <w:t>Note. * indicates the work with a mentoring student</w:t>
+        <w:t xml:space="preserve">Note. * </w:t>
+      </w:r>
+      <w:proofErr w:type="gramStart"/>
+      <w:r>
+        <w:rPr>
+          <w:bCs/>
+          <w:sz w:val="22"/>
+          <w:szCs w:val="22"/>
+          <w:u w:val="single"/>
+        </w:rPr>
+        <w:t>indicates</w:t>
+      </w:r>
+      <w:proofErr w:type="gramEnd"/>
+      <w:r>
+        <w:rPr>
+          <w:bCs/>
+          <w:sz w:val="22"/>
+          <w:szCs w:val="22"/>
+          <w:u w:val="single"/>
+        </w:rPr>
+        <w:t xml:space="preserve"> the work with a mentoring student</w:t>
       </w:r>
     </w:p>
     <w:p>
@@ -22242,6 +22922,7 @@
         </w:rPr>
         <w:t xml:space="preserve">[21] </w:t>
       </w:r>
+      <w:proofErr w:type="gramStart"/>
       <w:r>
         <w:rPr>
           <w:bCs/>
@@ -22265,7 +22946,15 @@
           <w:bCs/>
           <w:lang w:eastAsia="ko-KR"/>
         </w:rPr>
-        <w:t xml:space="preserve">Liu, Z., </w:t>
+        <w:t>Liu</w:t>
+      </w:r>
+      <w:proofErr w:type="gramEnd"/>
+      <w:r>
+        <w:rPr>
+          <w:bCs/>
+          <w:lang w:eastAsia="ko-KR"/>
+        </w:rPr>
+        <w:t xml:space="preserve">, Z., </w:t>
       </w:r>
       <w:r>
         <w:rPr>
@@ -23162,7 +23851,21 @@
         <w:rPr>
           <w:color w:val="212121"/>
         </w:rPr>
-        <w:t>., Ke, F., &amp; Dahlstrom-Hakki, I. (2021). Methodological considerations for understanding students’ problem solving processes and affective trajectories during game-based learning: A data fusion approach</w:t>
+        <w:t xml:space="preserve">., Ke, F., &amp; Dahlstrom-Hakki, I. (2021). Methodological considerations for understanding students’ </w:t>
+      </w:r>
+      <w:proofErr w:type="gramStart"/>
+      <w:r>
+        <w:rPr>
+          <w:color w:val="212121"/>
+        </w:rPr>
+        <w:t>problem solving</w:t>
+      </w:r>
+      <w:proofErr w:type="gramEnd"/>
+      <w:r>
+        <w:rPr>
+          <w:color w:val="212121"/>
+        </w:rPr>
+        <w:t xml:space="preserve"> processes and affective trajectories during game-based learning: A data fusion approach</w:t>
       </w:r>
       <w:r>
         <w:rPr>
@@ -23296,7 +23999,15 @@
         <w:t>Moon, J.</w:t>
       </w:r>
       <w:r>
-        <w:t xml:space="preserve"> &amp; Ke, F. (2020). Exploring learning supports in virtual reality-based flexibility training for adolescents with autism. In Melissa Gresalfi, &amp; Ilana Seidel Horn (Eds.), </w:t>
+        <w:t xml:space="preserve"> &amp; Ke, F. (2020). Exploring learning </w:t>
+      </w:r>
+      <w:proofErr w:type="gramStart"/>
+      <w:r>
+        <w:t>supports in</w:t>
+      </w:r>
+      <w:proofErr w:type="gramEnd"/>
+      <w:r>
+        <w:t xml:space="preserve"> virtual reality-based flexibility training for adolescents with autism. In Melissa Gresalfi, &amp; Ilana Seidel Horn (Eds.), </w:t>
       </w:r>
       <w:r>
         <w:rPr>
@@ -23927,7 +24638,27 @@
           <w:szCs w:val="22"/>
           <w:u w:val="single"/>
         </w:rPr>
-        <w:t>Note. * indicates the work with a mentoring student</w:t>
+        <w:t xml:space="preserve">Note. * </w:t>
+      </w:r>
+      <w:proofErr w:type="gramStart"/>
+      <w:r>
+        <w:rPr>
+          <w:bCs/>
+          <w:sz w:val="22"/>
+          <w:szCs w:val="22"/>
+          <w:u w:val="single"/>
+        </w:rPr>
+        <w:t>indicates</w:t>
+      </w:r>
+      <w:proofErr w:type="gramEnd"/>
+      <w:r>
+        <w:rPr>
+          <w:bCs/>
+          <w:sz w:val="22"/>
+          <w:szCs w:val="22"/>
+          <w:u w:val="single"/>
+        </w:rPr>
+        <w:t xml:space="preserve"> the work with a mentoring student</w:t>
       </w:r>
     </w:p>
     <w:p>
@@ -24028,10 +24759,23 @@
           <w:bCs/>
           <w:lang w:eastAsia="ko-KR"/>
         </w:rPr>
-        <w:t xml:space="preserve">[69] </w:t>
-      </w:r>
-      <w:r>
-        <w:t xml:space="preserve">‡ </w:t>
+        <w:t>[</w:t>
+      </w:r>
+      <w:proofErr w:type="gramStart"/>
+      <w:r>
+        <w:rPr>
+          <w:rFonts w:hint="eastAsia"/>
+          <w:bCs/>
+          <w:lang w:eastAsia="ko-KR"/>
+        </w:rPr>
+        <w:t xml:space="preserve">69] </w:t>
+      </w:r>
+      <w:r>
+        <w:t>‡</w:t>
+      </w:r>
+      <w:proofErr w:type="gramEnd"/>
+      <w:r>
+        <w:t xml:space="preserve"> </w:t>
       </w:r>
       <w:r>
         <w:rPr>
@@ -24068,14 +24812,25 @@
         </w:rPr>
         <w:t xml:space="preserve">). </w:t>
       </w:r>
-      <w:r>
-        <w:rPr>
-          <w:bCs/>
-          <w:i/>
-          <w:iCs/>
-          <w:lang w:eastAsia="ko-KR"/>
-        </w:rPr>
-        <w:t>FieldExplorer: A network-based visualization platform for supporting novice researchers’ academic decision-making</w:t>
+      <w:proofErr w:type="spellStart"/>
+      <w:r>
+        <w:rPr>
+          <w:bCs/>
+          <w:i/>
+          <w:iCs/>
+          <w:lang w:eastAsia="ko-KR"/>
+        </w:rPr>
+        <w:t>FieldExplorer</w:t>
+      </w:r>
+      <w:proofErr w:type="spellEnd"/>
+      <w:r>
+        <w:rPr>
+          <w:bCs/>
+          <w:i/>
+          <w:iCs/>
+          <w:lang w:eastAsia="ko-KR"/>
+        </w:rPr>
+        <w:t>: A network-based visualization platform for supporting novice researchers’ academic decision-making</w:t>
       </w:r>
       <w:r>
         <w:rPr>
@@ -24123,10 +24878,23 @@
           <w:bCs/>
           <w:lang w:eastAsia="ko-KR"/>
         </w:rPr>
-        <w:t xml:space="preserve">[68] </w:t>
-      </w:r>
-      <w:r>
-        <w:t xml:space="preserve">‡ </w:t>
+        <w:t>[</w:t>
+      </w:r>
+      <w:proofErr w:type="gramStart"/>
+      <w:r>
+        <w:rPr>
+          <w:rFonts w:hint="eastAsia"/>
+          <w:bCs/>
+          <w:lang w:eastAsia="ko-KR"/>
+        </w:rPr>
+        <w:t xml:space="preserve">68] </w:t>
+      </w:r>
+      <w:r>
+        <w:t>‡</w:t>
+      </w:r>
+      <w:proofErr w:type="gramEnd"/>
+      <w:r>
+        <w:t xml:space="preserve"> </w:t>
       </w:r>
       <w:r>
         <w:rPr>
@@ -24163,14 +24931,25 @@
         </w:rPr>
         <w:t xml:space="preserve">). </w:t>
       </w:r>
-      <w:r>
-        <w:rPr>
-          <w:bCs/>
-          <w:i/>
-          <w:iCs/>
-          <w:lang w:eastAsia="ko-KR"/>
-        </w:rPr>
-        <w:t>SpeakWise: Capturing real-time reasoning evidence traces through AI-mediated oral assessment</w:t>
+      <w:proofErr w:type="spellStart"/>
+      <w:r>
+        <w:rPr>
+          <w:bCs/>
+          <w:i/>
+          <w:iCs/>
+          <w:lang w:eastAsia="ko-KR"/>
+        </w:rPr>
+        <w:t>SpeakWise</w:t>
+      </w:r>
+      <w:proofErr w:type="spellEnd"/>
+      <w:r>
+        <w:rPr>
+          <w:bCs/>
+          <w:i/>
+          <w:iCs/>
+          <w:lang w:eastAsia="ko-KR"/>
+        </w:rPr>
+        <w:t>: Capturing real-time reasoning evidence traces through AI-mediated oral assessment</w:t>
       </w:r>
       <w:r>
         <w:rPr>
@@ -24260,14 +25039,25 @@
         </w:rPr>
         <w:t xml:space="preserve">). </w:t>
       </w:r>
-      <w:r>
-        <w:rPr>
-          <w:i/>
-          <w:iCs/>
-          <w:color w:val="222222"/>
-          <w:lang w:eastAsia="ko-KR"/>
-        </w:rPr>
-        <w:t>ReviewLens: An AI-</w:t>
+      <w:proofErr w:type="spellStart"/>
+      <w:r>
+        <w:rPr>
+          <w:i/>
+          <w:iCs/>
+          <w:color w:val="222222"/>
+          <w:lang w:eastAsia="ko-KR"/>
+        </w:rPr>
+        <w:t>ReviewLens</w:t>
+      </w:r>
+      <w:proofErr w:type="spellEnd"/>
+      <w:r>
+        <w:rPr>
+          <w:i/>
+          <w:iCs/>
+          <w:color w:val="222222"/>
+          <w:lang w:eastAsia="ko-KR"/>
+        </w:rPr>
+        <w:t>: An AI-</w:t>
       </w:r>
       <w:r>
         <w:rPr>
@@ -24427,7 +25217,43 @@
           <w:color w:val="222222"/>
           <w:lang w:eastAsia="ko-KR"/>
         </w:rPr>
-        <w:t xml:space="preserve">. iLEAD Stream, iLRN 2026, </w:t>
+        <w:t xml:space="preserve">. </w:t>
+      </w:r>
+      <w:proofErr w:type="spellStart"/>
+      <w:r>
+        <w:rPr>
+          <w:rFonts w:hint="eastAsia"/>
+          <w:color w:val="222222"/>
+          <w:lang w:eastAsia="ko-KR"/>
+        </w:rPr>
+        <w:t>iLEAD</w:t>
+      </w:r>
+      <w:proofErr w:type="spellEnd"/>
+      <w:r>
+        <w:rPr>
+          <w:rFonts w:hint="eastAsia"/>
+          <w:color w:val="222222"/>
+          <w:lang w:eastAsia="ko-KR"/>
+        </w:rPr>
+        <w:t xml:space="preserve"> Stream, </w:t>
+      </w:r>
+      <w:proofErr w:type="spellStart"/>
+      <w:r>
+        <w:rPr>
+          <w:rFonts w:hint="eastAsia"/>
+          <w:color w:val="222222"/>
+          <w:lang w:eastAsia="ko-KR"/>
+        </w:rPr>
+        <w:t>iLRN</w:t>
+      </w:r>
+      <w:proofErr w:type="spellEnd"/>
+      <w:r>
+        <w:rPr>
+          <w:rFonts w:hint="eastAsia"/>
+          <w:color w:val="222222"/>
+          <w:lang w:eastAsia="ko-KR"/>
+        </w:rPr>
+        <w:t xml:space="preserve"> 2026, </w:t>
       </w:r>
       <w:r>
         <w:rPr>
@@ -24480,14 +25306,25 @@
         </w:rPr>
         <w:t xml:space="preserve">., Kim, T., Amayou, J. (2026, June). </w:t>
       </w:r>
-      <w:r>
-        <w:rPr>
-          <w:i/>
-          <w:iCs/>
-          <w:color w:val="222222"/>
-          <w:lang w:eastAsia="ko-KR"/>
-        </w:rPr>
-        <w:t xml:space="preserve">DataSandbox: Designing </w:t>
+      <w:proofErr w:type="spellStart"/>
+      <w:r>
+        <w:rPr>
+          <w:i/>
+          <w:iCs/>
+          <w:color w:val="222222"/>
+          <w:lang w:eastAsia="ko-KR"/>
+        </w:rPr>
+        <w:t>DataSandbox</w:t>
+      </w:r>
+      <w:proofErr w:type="spellEnd"/>
+      <w:r>
+        <w:rPr>
+          <w:i/>
+          <w:iCs/>
+          <w:color w:val="222222"/>
+          <w:lang w:eastAsia="ko-KR"/>
+        </w:rPr>
+        <w:t xml:space="preserve">: Designing </w:t>
       </w:r>
       <w:r>
         <w:rPr>
@@ -24609,7 +25446,43 @@
           <w:color w:val="222222"/>
           <w:lang w:eastAsia="ko-KR"/>
         </w:rPr>
-        <w:t xml:space="preserve">. iLEAD Stream, iLRN 2026, </w:t>
+        <w:t xml:space="preserve">. </w:t>
+      </w:r>
+      <w:proofErr w:type="spellStart"/>
+      <w:r>
+        <w:rPr>
+          <w:rFonts w:hint="eastAsia"/>
+          <w:color w:val="222222"/>
+          <w:lang w:eastAsia="ko-KR"/>
+        </w:rPr>
+        <w:t>iLEAD</w:t>
+      </w:r>
+      <w:proofErr w:type="spellEnd"/>
+      <w:r>
+        <w:rPr>
+          <w:rFonts w:hint="eastAsia"/>
+          <w:color w:val="222222"/>
+          <w:lang w:eastAsia="ko-KR"/>
+        </w:rPr>
+        <w:t xml:space="preserve"> Stream, </w:t>
+      </w:r>
+      <w:proofErr w:type="spellStart"/>
+      <w:r>
+        <w:rPr>
+          <w:rFonts w:hint="eastAsia"/>
+          <w:color w:val="222222"/>
+          <w:lang w:eastAsia="ko-KR"/>
+        </w:rPr>
+        <w:t>iLRN</w:t>
+      </w:r>
+      <w:proofErr w:type="spellEnd"/>
+      <w:r>
+        <w:rPr>
+          <w:rFonts w:hint="eastAsia"/>
+          <w:color w:val="222222"/>
+          <w:lang w:eastAsia="ko-KR"/>
+        </w:rPr>
+        <w:t xml:space="preserve"> 2026, </w:t>
       </w:r>
       <w:r>
         <w:rPr>
@@ -25853,6 +26726,7 @@
         </w:rPr>
         <w:t xml:space="preserve">raining: A </w:t>
       </w:r>
+      <w:proofErr w:type="spellStart"/>
       <w:r>
         <w:rPr>
           <w:rFonts w:hint="eastAsia"/>
@@ -25870,7 +26744,17 @@
           <w:color w:val="222222"/>
           <w:lang w:eastAsia="ko-KR"/>
         </w:rPr>
-        <w:t xml:space="preserve">icrogenetic and </w:t>
+        <w:t>icrogenetic</w:t>
+      </w:r>
+      <w:proofErr w:type="spellEnd"/>
+      <w:r>
+        <w:rPr>
+          <w:i/>
+          <w:iCs/>
+          <w:color w:val="222222"/>
+          <w:lang w:eastAsia="ko-KR"/>
+        </w:rPr>
+        <w:t xml:space="preserve"> and </w:t>
       </w:r>
       <w:r>
         <w:rPr>
@@ -26182,7 +27066,25 @@
           <w:color w:val="222222"/>
           <w:lang w:eastAsia="ko-KR"/>
         </w:rPr>
-        <w:t xml:space="preserve">., Lim, J., Lee, Y., Byun, G., Jeong, Y., &amp; Lee, U. (2026, April). </w:t>
+        <w:t xml:space="preserve">., Lim, J., Lee, Y., Byun, G., </w:t>
+      </w:r>
+      <w:proofErr w:type="gramStart"/>
+      <w:r>
+        <w:rPr>
+          <w:rFonts w:hint="eastAsia"/>
+          <w:color w:val="222222"/>
+          <w:lang w:eastAsia="ko-KR"/>
+        </w:rPr>
+        <w:t>Jeong, Y.</w:t>
+      </w:r>
+      <w:proofErr w:type="gramEnd"/>
+      <w:r>
+        <w:rPr>
+          <w:rFonts w:hint="eastAsia"/>
+          <w:color w:val="222222"/>
+          <w:lang w:eastAsia="ko-KR"/>
+        </w:rPr>
+        <w:t xml:space="preserve">, &amp; Lee, U. (2026, April). </w:t>
       </w:r>
       <w:r>
         <w:rPr>
@@ -26386,16 +27288,53 @@
           <w:color w:val="222222"/>
           <w:lang w:eastAsia="ko-KR"/>
         </w:rPr>
-        <w:t>, Lim, J., Lee, Y., Byun, G., Jeong, Y., &amp; Lee, U. (2026, April).</w:t>
-      </w:r>
-      <w:r>
-        <w:rPr>
-          <w:i/>
-          <w:iCs/>
-          <w:color w:val="222222"/>
-          <w:lang w:eastAsia="ko-KR"/>
-        </w:rPr>
-        <w:t xml:space="preserve">Generative AI </w:t>
+        <w:t>, Lim, J., Lee, Y., Byun, G., Jeong, Y</w:t>
+      </w:r>
+      <w:proofErr w:type="gramStart"/>
+      <w:r>
+        <w:rPr>
+          <w:rFonts w:hint="eastAsia"/>
+          <w:color w:val="222222"/>
+          <w:lang w:eastAsia="ko-KR"/>
+        </w:rPr>
+        <w:t>., &amp;</w:t>
+      </w:r>
+      <w:proofErr w:type="gramEnd"/>
+      <w:r>
+        <w:rPr>
+          <w:rFonts w:hint="eastAsia"/>
+          <w:color w:val="222222"/>
+          <w:lang w:eastAsia="ko-KR"/>
+        </w:rPr>
+        <w:t xml:space="preserve"> Lee, U. (2026, April</w:t>
+      </w:r>
+      <w:proofErr w:type="gramStart"/>
+      <w:r>
+        <w:rPr>
+          <w:rFonts w:hint="eastAsia"/>
+          <w:color w:val="222222"/>
+          <w:lang w:eastAsia="ko-KR"/>
+        </w:rPr>
+        <w:t>).</w:t>
+      </w:r>
+      <w:r>
+        <w:rPr>
+          <w:i/>
+          <w:iCs/>
+          <w:color w:val="222222"/>
+          <w:lang w:eastAsia="ko-KR"/>
+        </w:rPr>
+        <w:t>Generative</w:t>
+      </w:r>
+      <w:proofErr w:type="gramEnd"/>
+      <w:r>
+        <w:rPr>
+          <w:i/>
+          <w:iCs/>
+          <w:color w:val="222222"/>
+          <w:lang w:eastAsia="ko-KR"/>
+        </w:rPr>
+        <w:t xml:space="preserve"> AI </w:t>
       </w:r>
       <w:r>
         <w:rPr>
@@ -26435,6 +27374,7 @@
         </w:rPr>
         <w:t xml:space="preserve">ersona </w:t>
       </w:r>
+      <w:proofErr w:type="gramStart"/>
       <w:r>
         <w:rPr>
           <w:rFonts w:hint="eastAsia"/>
@@ -26452,7 +27392,17 @@
           <w:color w:val="222222"/>
           <w:lang w:eastAsia="ko-KR"/>
         </w:rPr>
-        <w:t xml:space="preserve">ffects on </w:t>
+        <w:t>ffects on</w:t>
+      </w:r>
+      <w:proofErr w:type="gramEnd"/>
+      <w:r>
+        <w:rPr>
+          <w:i/>
+          <w:iCs/>
+          <w:color w:val="222222"/>
+          <w:lang w:eastAsia="ko-KR"/>
+        </w:rPr>
+        <w:t xml:space="preserve"> </w:t>
       </w:r>
       <w:r>
         <w:rPr>
@@ -27114,6 +28064,7 @@
           <w:lang w:eastAsia="ko-KR"/>
         </w:rPr>
       </w:pPr>
+      <w:proofErr w:type="gramStart"/>
       <w:r>
         <w:rPr>
           <w:rFonts w:hint="eastAsia"/>
@@ -27128,7 +28079,16 @@
           <w:color w:val="222222"/>
           <w:lang w:eastAsia="ko-KR"/>
         </w:rPr>
-        <w:t xml:space="preserve">Kim, C., Lim, J., and </w:t>
+        <w:t>Kim</w:t>
+      </w:r>
+      <w:proofErr w:type="gramEnd"/>
+      <w:r>
+        <w:rPr>
+          <w:rFonts w:hint="eastAsia"/>
+          <w:color w:val="222222"/>
+          <w:lang w:eastAsia="ko-KR"/>
+        </w:rPr>
+        <w:t xml:space="preserve">, C., Lim, J., and </w:t>
       </w:r>
       <w:r>
         <w:rPr>
@@ -27392,6 +28352,7 @@
         </w:rPr>
         <w:t xml:space="preserve"> October). </w:t>
       </w:r>
+      <w:proofErr w:type="gramStart"/>
       <w:r>
         <w:rPr>
           <w:i/>
@@ -27418,7 +28379,17 @@
           <w:color w:val="222222"/>
           <w:lang w:eastAsia="ko-KR"/>
         </w:rPr>
-        <w:t xml:space="preserve">hen </w:t>
+        <w:t>hen</w:t>
+      </w:r>
+      <w:proofErr w:type="gramEnd"/>
+      <w:r>
+        <w:rPr>
+          <w:i/>
+          <w:iCs/>
+          <w:color w:val="222222"/>
+          <w:lang w:eastAsia="ko-KR"/>
+        </w:rPr>
+        <w:t xml:space="preserve"> </w:t>
       </w:r>
       <w:r>
         <w:rPr>
@@ -27978,6 +28949,7 @@
         </w:rPr>
         <w:t xml:space="preserve">uthentic </w:t>
       </w:r>
+      <w:proofErr w:type="gramStart"/>
       <w:r>
         <w:rPr>
           <w:rFonts w:hint="eastAsia"/>
@@ -27991,7 +28963,15 @@
           <w:color w:val="222222"/>
           <w:lang w:eastAsia="ko-KR"/>
         </w:rPr>
-        <w:t xml:space="preserve">earning : A </w:t>
+        <w:t>earning :</w:t>
+      </w:r>
+      <w:proofErr w:type="gramEnd"/>
+      <w:r>
+        <w:rPr>
+          <w:color w:val="222222"/>
+          <w:lang w:eastAsia="ko-KR"/>
+        </w:rPr>
+        <w:t xml:space="preserve"> A </w:t>
       </w:r>
       <w:r>
         <w:rPr>
@@ -28733,7 +29713,25 @@
           <w:color w:val="222222"/>
           <w:lang w:eastAsia="ko-KR"/>
         </w:rPr>
-        <w:t xml:space="preserve">] Kim, C.,, Lim, J., Kang, M., &amp; </w:t>
+        <w:t xml:space="preserve">] Kim, </w:t>
+      </w:r>
+      <w:proofErr w:type="gramStart"/>
+      <w:r>
+        <w:rPr>
+          <w:rFonts w:hint="eastAsia"/>
+          <w:color w:val="222222"/>
+          <w:lang w:eastAsia="ko-KR"/>
+        </w:rPr>
+        <w:t>C.,,</w:t>
+      </w:r>
+      <w:proofErr w:type="gramEnd"/>
+      <w:r>
+        <w:rPr>
+          <w:rFonts w:hint="eastAsia"/>
+          <w:color w:val="222222"/>
+          <w:lang w:eastAsia="ko-KR"/>
+        </w:rPr>
+        <w:t xml:space="preserve"> Lim, J., Kang, M., &amp; </w:t>
       </w:r>
       <w:r>
         <w:rPr>
@@ -28971,7 +29969,23 @@
           <w:rFonts w:hint="eastAsia"/>
           <w:lang w:eastAsia="ko-KR"/>
         </w:rPr>
-        <w:t xml:space="preserve">Awoyemi, I., Unggi, L., &amp; </w:t>
+        <w:t xml:space="preserve">Awoyemi, I., </w:t>
+      </w:r>
+      <w:proofErr w:type="spellStart"/>
+      <w:r>
+        <w:rPr>
+          <w:rFonts w:hint="eastAsia"/>
+          <w:lang w:eastAsia="ko-KR"/>
+        </w:rPr>
+        <w:t>Unggi</w:t>
+      </w:r>
+      <w:proofErr w:type="spellEnd"/>
+      <w:r>
+        <w:rPr>
+          <w:rFonts w:hint="eastAsia"/>
+          <w:lang w:eastAsia="ko-KR"/>
+        </w:rPr>
+        <w:t xml:space="preserve">, L., &amp; </w:t>
       </w:r>
       <w:r>
         <w:rPr>
@@ -29805,7 +30819,21 @@
         <w:rPr>
           <w:color w:val="222222"/>
         </w:rPr>
-        <w:t>. iLRN 2024 Practitioner Stream</w:t>
+        <w:t xml:space="preserve">. </w:t>
+      </w:r>
+      <w:proofErr w:type="spellStart"/>
+      <w:r>
+        <w:rPr>
+          <w:color w:val="222222"/>
+        </w:rPr>
+        <w:t>iLRN</w:t>
+      </w:r>
+      <w:proofErr w:type="spellEnd"/>
+      <w:r>
+        <w:rPr>
+          <w:color w:val="222222"/>
+        </w:rPr>
+        <w:t xml:space="preserve"> 2024 Practitioner Stream</w:t>
       </w:r>
     </w:p>
     <w:p>
@@ -29889,7 +30917,21 @@
         <w:rPr>
           <w:color w:val="222222"/>
         </w:rPr>
-        <w:t>. iLRN 2024 Practitioner Stream</w:t>
+        <w:t xml:space="preserve">. </w:t>
+      </w:r>
+      <w:proofErr w:type="spellStart"/>
+      <w:r>
+        <w:rPr>
+          <w:color w:val="222222"/>
+        </w:rPr>
+        <w:t>iLRN</w:t>
+      </w:r>
+      <w:proofErr w:type="spellEnd"/>
+      <w:r>
+        <w:rPr>
+          <w:color w:val="222222"/>
+        </w:rPr>
+        <w:t xml:space="preserve"> 2024 Practitioner Stream</w:t>
       </w:r>
     </w:p>
     <w:p>
@@ -30067,7 +31109,15 @@
         <w:t xml:space="preserve"> November). </w:t>
       </w:r>
       <w:r>
-        <w:t>Exploring the evolution: Topic modeling in digital textbook research trends. 2023 Conference of Joint Societies for Mathematics Education: KSESM, KSME, Korea University, South Korea.</w:t>
+        <w:t xml:space="preserve">Exploring </w:t>
+      </w:r>
+      <w:proofErr w:type="gramStart"/>
+      <w:r>
+        <w:t>the evolution</w:t>
+      </w:r>
+      <w:proofErr w:type="gramEnd"/>
+      <w:r>
+        <w:t>: Topic modeling in digital textbook research trends. 2023 Conference of Joint Societies for Mathematics Education: KSESM, KSME, Korea University, South Korea.</w:t>
       </w:r>
     </w:p>
     <w:p>
@@ -30315,8 +31365,13 @@
       <w:r>
         <w:t xml:space="preserve">Poster Presentation. </w:t>
       </w:r>
-      <w:r>
-        <w:t>iLRN 2023 Practitioner Stream. Virtual</w:t>
+      <w:proofErr w:type="spellStart"/>
+      <w:r>
+        <w:t>iLRN</w:t>
+      </w:r>
+      <w:proofErr w:type="spellEnd"/>
+      <w:r>
+        <w:t xml:space="preserve"> 2023 Practitioner Stream. Virtual</w:t>
       </w:r>
       <w:r>
         <w:t>.</w:t>
@@ -30391,8 +31446,13 @@
       <w:r>
         <w:t xml:space="preserve">Poster Presentation. </w:t>
       </w:r>
-      <w:r>
-        <w:t>iLRN 2023 Practitioner Stream. Virtual</w:t>
+      <w:proofErr w:type="spellStart"/>
+      <w:r>
+        <w:t>iLRN</w:t>
+      </w:r>
+      <w:proofErr w:type="spellEnd"/>
+      <w:r>
+        <w:t xml:space="preserve"> 2023 Practitioner Stream. Virtual</w:t>
       </w:r>
       <w:r>
         <w:t>.</w:t>
@@ -30460,8 +31520,13 @@
       <w:r>
         <w:t xml:space="preserve">Poster Presentation. </w:t>
       </w:r>
-      <w:r>
-        <w:t>iLRN 2023 Practitioner Stream. Virtual</w:t>
+      <w:proofErr w:type="spellStart"/>
+      <w:r>
+        <w:t>iLRN</w:t>
+      </w:r>
+      <w:proofErr w:type="spellEnd"/>
+      <w:r>
+        <w:t xml:space="preserve"> 2023 Practitioner Stream. Virtual</w:t>
       </w:r>
       <w:r>
         <w:t>.</w:t>
@@ -30497,7 +31562,23 @@
           <w:i/>
           <w:iCs/>
         </w:rPr>
-        <w:t>Crafting an approach to cultivate engineering competencies for undergraduate students in construction engineering with Minecraft</w:t>
+        <w:t xml:space="preserve">Crafting an approach to </w:t>
+      </w:r>
+      <w:proofErr w:type="gramStart"/>
+      <w:r>
+        <w:rPr>
+          <w:i/>
+          <w:iCs/>
+        </w:rPr>
+        <w:t>cultivate</w:t>
+      </w:r>
+      <w:proofErr w:type="gramEnd"/>
+      <w:r>
+        <w:rPr>
+          <w:i/>
+          <w:iCs/>
+        </w:rPr>
+        <w:t xml:space="preserve"> engineering competencies for undergraduate students in construction engineering with Minecraft</w:t>
       </w:r>
       <w:r>
         <w:t>. ASEE 2023. Baltimore, MD, United States.</w:t>
@@ -30695,12 +31776,21 @@
         </w:rPr>
         <w:t xml:space="preserve">* </w:t>
       </w:r>
-      <w:r>
-        <w:rPr>
-          <w:bCs/>
-          <w:color w:val="000000"/>
-        </w:rPr>
-        <w:t xml:space="preserve">Ljeluola, S. &amp; </w:t>
+      <w:proofErr w:type="spellStart"/>
+      <w:r>
+        <w:rPr>
+          <w:bCs/>
+          <w:color w:val="000000"/>
+        </w:rPr>
+        <w:t>Ljeluola</w:t>
+      </w:r>
+      <w:proofErr w:type="spellEnd"/>
+      <w:r>
+        <w:rPr>
+          <w:bCs/>
+          <w:color w:val="000000"/>
+        </w:rPr>
+        <w:t xml:space="preserve">, S. &amp; </w:t>
       </w:r>
       <w:r>
         <w:rPr>
@@ -31579,7 +32669,21 @@
         <w:rPr>
           <w:bCs/>
         </w:rPr>
-        <w:t>., &amp; Sokolikj, Z. (2022, May) Developing an evidence-centered model for computational thinking in virtual worlds with children with autism. Poster Presentation, iLRN 2022, Vienne, Austria.</w:t>
+        <w:t xml:space="preserve">., &amp; Sokolikj, Z. (2022, May) Developing an evidence-centered model for computational thinking in virtual worlds with children with autism. Poster Presentation, </w:t>
+      </w:r>
+      <w:proofErr w:type="spellStart"/>
+      <w:r>
+        <w:rPr>
+          <w:bCs/>
+        </w:rPr>
+        <w:t>iLRN</w:t>
+      </w:r>
+      <w:proofErr w:type="spellEnd"/>
+      <w:r>
+        <w:rPr>
+          <w:bCs/>
+        </w:rPr>
+        <w:t xml:space="preserve"> 2022, Vienne, Austria.</w:t>
       </w:r>
     </w:p>
     <w:p>
@@ -33780,7 +34884,15 @@
         <w:t>Moon, J.</w:t>
       </w:r>
       <w:r>
-        <w:t xml:space="preserve">, Dai, Z., Pan, Y., Shute, V., Clark, K., &amp; Erlebacher, G. (2017, April). </w:t>
+        <w:t xml:space="preserve">, Dai, Z., Pan, Y., Shute, V., Clark, K., &amp; </w:t>
+      </w:r>
+      <w:proofErr w:type="spellStart"/>
+      <w:r>
+        <w:t>Erlebacher</w:t>
+      </w:r>
+      <w:proofErr w:type="spellEnd"/>
+      <w:r>
+        <w:t xml:space="preserve">, G. (2017, April). </w:t>
       </w:r>
       <w:r>
         <w:rPr>
@@ -34242,37 +35354,77 @@
           <w:szCs w:val="22"/>
           <w:u w:val="single"/>
         </w:rPr>
-        <w:t>. * indicates the work with a mentoring student</w:t>
-      </w:r>
-    </w:p>
-    <w:p>
-      <w:pPr>
+        <w:t xml:space="preserve">. * </w:t>
+      </w:r>
+      <w:proofErr w:type="gramStart"/>
+      <w:r>
         <w:rPr>
           <w:bCs/>
           <w:sz w:val="22"/>
           <w:szCs w:val="22"/>
           <w:u w:val="single"/>
         </w:rPr>
-      </w:pPr>
-      <w:r>
-        <w:rPr>
-          <w:rFonts w:hint="eastAsia"/>
+        <w:t>indicates</w:t>
+      </w:r>
+      <w:proofErr w:type="gramEnd"/>
+      <w:r>
+        <w:rPr>
           <w:bCs/>
           <w:sz w:val="22"/>
           <w:szCs w:val="22"/>
           <w:u w:val="single"/>
-          <w:lang w:eastAsia="ko-KR"/>
-        </w:rPr>
-        <w:t xml:space="preserve">Note 2. </w:t>
-      </w:r>
-      <w:r>
+        </w:rPr>
+        <w:t xml:space="preserve"> the work with a mentoring student</w:t>
+      </w:r>
+    </w:p>
+    <w:p>
+      <w:pPr>
         <w:rPr>
           <w:bCs/>
           <w:sz w:val="22"/>
           <w:szCs w:val="22"/>
           <w:u w:val="single"/>
         </w:rPr>
-        <w:t>‡ indicates the corresponding authorship.</w:t>
+      </w:pPr>
+      <w:r>
+        <w:rPr>
+          <w:rFonts w:hint="eastAsia"/>
+          <w:bCs/>
+          <w:sz w:val="22"/>
+          <w:szCs w:val="22"/>
+          <w:u w:val="single"/>
+          <w:lang w:eastAsia="ko-KR"/>
+        </w:rPr>
+        <w:t xml:space="preserve">Note 2. </w:t>
+      </w:r>
+      <w:r>
+        <w:rPr>
+          <w:bCs/>
+          <w:sz w:val="22"/>
+          <w:szCs w:val="22"/>
+          <w:u w:val="single"/>
+        </w:rPr>
+        <w:t xml:space="preserve">‡ </w:t>
+      </w:r>
+      <w:proofErr w:type="gramStart"/>
+      <w:r>
+        <w:rPr>
+          <w:bCs/>
+          <w:sz w:val="22"/>
+          <w:szCs w:val="22"/>
+          <w:u w:val="single"/>
+        </w:rPr>
+        <w:t>indicates</w:t>
+      </w:r>
+      <w:proofErr w:type="gramEnd"/>
+      <w:r>
+        <w:rPr>
+          <w:bCs/>
+          <w:sz w:val="22"/>
+          <w:szCs w:val="22"/>
+          <w:u w:val="single"/>
+        </w:rPr>
+        <w:t xml:space="preserve"> the corresponding authorship.</w:t>
       </w:r>
     </w:p>
     <w:p>
@@ -34554,6 +35706,7 @@
         </w:rPr>
         <w:t xml:space="preserve">. </w:t>
       </w:r>
+      <w:proofErr w:type="spellStart"/>
       <w:r>
         <w:rPr>
           <w:rFonts w:hint="eastAsia"/>
@@ -34563,6 +35716,7 @@
         </w:rPr>
         <w:t>TechTrends</w:t>
       </w:r>
+      <w:proofErr w:type="spellEnd"/>
       <w:r>
         <w:rPr>
           <w:rFonts w:hint="eastAsia"/>
@@ -34660,7 +35814,21 @@
         <w:rPr>
           <w:lang w:eastAsia="ko-KR"/>
         </w:rPr>
-        <w:t xml:space="preserve">earning (AutoML) to </w:t>
+        <w:t>earning (</w:t>
+      </w:r>
+      <w:proofErr w:type="spellStart"/>
+      <w:r>
+        <w:rPr>
+          <w:lang w:eastAsia="ko-KR"/>
+        </w:rPr>
+        <w:t>AutoML</w:t>
+      </w:r>
+      <w:proofErr w:type="spellEnd"/>
+      <w:r>
+        <w:rPr>
+          <w:lang w:eastAsia="ko-KR"/>
+        </w:rPr>
+        <w:t xml:space="preserve">) to </w:t>
       </w:r>
       <w:r>
         <w:rPr>
@@ -34822,7 +35990,15 @@
           <w:rFonts w:hint="eastAsia"/>
           <w:lang w:eastAsia="ko-KR"/>
         </w:rPr>
-        <w:t>[2</w:t>
+        <w:t>[</w:t>
+      </w:r>
+      <w:proofErr w:type="gramStart"/>
+      <w:r>
+        <w:rPr>
+          <w:rFonts w:hint="eastAsia"/>
+          <w:lang w:eastAsia="ko-KR"/>
+        </w:rPr>
+        <w:t>2</w:t>
       </w:r>
       <w:r>
         <w:rPr>
@@ -34839,7 +36015,11 @@
         <w:t xml:space="preserve">] </w:t>
       </w:r>
       <w:r>
-        <w:t xml:space="preserve">‡ </w:t>
+        <w:t>‡</w:t>
+      </w:r>
+      <w:proofErr w:type="gramEnd"/>
+      <w:r>
+        <w:t xml:space="preserve"> </w:t>
       </w:r>
       <w:r>
         <w:rPr>
@@ -35496,7 +36676,15 @@
           <w:rFonts w:hint="eastAsia"/>
           <w:lang w:eastAsia="ko-KR"/>
         </w:rPr>
-        <w:t>[2</w:t>
+        <w:t>[</w:t>
+      </w:r>
+      <w:proofErr w:type="gramStart"/>
+      <w:r>
+        <w:rPr>
+          <w:rFonts w:hint="eastAsia"/>
+          <w:lang w:eastAsia="ko-KR"/>
+        </w:rPr>
+        <w:t>2</w:t>
       </w:r>
       <w:r>
         <w:rPr>
@@ -35515,6 +36703,7 @@
       <w:r>
         <w:t>‡</w:t>
       </w:r>
+      <w:proofErr w:type="gramEnd"/>
       <w:r>
         <w:rPr>
           <w:rFonts w:hint="eastAsia"/>
@@ -35538,11 +36727,19 @@
         </w:rPr>
         <w:t xml:space="preserve"> (In preparation). </w:t>
       </w:r>
-      <w:r>
-        <w:rPr>
-          <w:lang w:eastAsia="ko-KR"/>
-        </w:rPr>
-        <w:t xml:space="preserve">Operationalising CEFR in L2 English </w:t>
+      <w:proofErr w:type="spellStart"/>
+      <w:r>
+        <w:rPr>
+          <w:lang w:eastAsia="ko-KR"/>
+        </w:rPr>
+        <w:t>Operationalising</w:t>
+      </w:r>
+      <w:proofErr w:type="spellEnd"/>
+      <w:r>
+        <w:rPr>
+          <w:lang w:eastAsia="ko-KR"/>
+        </w:rPr>
+        <w:t xml:space="preserve"> CEFR in L2 English </w:t>
       </w:r>
       <w:r>
         <w:rPr>
@@ -35987,6 +37184,7 @@
         </w:rPr>
         <w:t>2</w:t>
       </w:r>
+      <w:proofErr w:type="gramStart"/>
       <w:r>
         <w:rPr>
           <w:rFonts w:hint="eastAsia"/>
@@ -36009,7 +37207,11 @@
         <w:t>*</w:t>
       </w:r>
       <w:r>
-        <w:t xml:space="preserve">‡ </w:t>
+        <w:t>‡</w:t>
+      </w:r>
+      <w:proofErr w:type="gramEnd"/>
+      <w:r>
+        <w:t xml:space="preserve"> </w:t>
       </w:r>
       <w:r>
         <w:rPr>
@@ -36482,6 +37684,7 @@
         </w:rPr>
         <w:t>[</w:t>
       </w:r>
+      <w:proofErr w:type="gramStart"/>
       <w:r>
         <w:rPr>
           <w:rFonts w:hint="eastAsia"/>
@@ -36497,7 +37700,11 @@
         <w:t xml:space="preserve">] </w:t>
       </w:r>
       <w:r>
-        <w:t xml:space="preserve">‡ </w:t>
+        <w:t>‡</w:t>
+      </w:r>
+      <w:proofErr w:type="gramEnd"/>
+      <w:r>
+        <w:t xml:space="preserve"> </w:t>
       </w:r>
       <w:r>
         <w:rPr>
@@ -36513,7 +37720,23 @@
           <w:rFonts w:hint="eastAsia"/>
           <w:lang w:eastAsia="ko-KR"/>
         </w:rPr>
-        <w:t xml:space="preserve">., Hong, S., Chae, J., Cho, H., &amp; Lee, Y. J. (Submitted). </w:t>
+        <w:t xml:space="preserve">., Hong, S., Chae, J., Cho, H., &amp; Lee, </w:t>
+      </w:r>
+      <w:proofErr w:type="gramStart"/>
+      <w:r>
+        <w:rPr>
+          <w:rFonts w:hint="eastAsia"/>
+          <w:lang w:eastAsia="ko-KR"/>
+        </w:rPr>
+        <w:t>Y. J</w:t>
+      </w:r>
+      <w:proofErr w:type="gramEnd"/>
+      <w:r>
+        <w:rPr>
+          <w:rFonts w:hint="eastAsia"/>
+          <w:lang w:eastAsia="ko-KR"/>
+        </w:rPr>
+        <w:t xml:space="preserve">. (Submitted). </w:t>
       </w:r>
       <w:r>
         <w:rPr>
@@ -37468,6 +38691,7 @@
         </w:rPr>
         <w:t>[</w:t>
       </w:r>
+      <w:proofErr w:type="gramStart"/>
       <w:r>
         <w:rPr>
           <w:rFonts w:hint="eastAsia"/>
@@ -37490,7 +38714,11 @@
         <w:t xml:space="preserve">] </w:t>
       </w:r>
       <w:r>
-        <w:t xml:space="preserve">‡ </w:t>
+        <w:t>‡</w:t>
+      </w:r>
+      <w:proofErr w:type="gramEnd"/>
+      <w:r>
+        <w:t xml:space="preserve"> </w:t>
       </w:r>
       <w:r>
         <w:rPr>
@@ -37767,7 +38995,15 @@
           <w:rFonts w:hint="eastAsia"/>
           <w:lang w:eastAsia="ko-KR"/>
         </w:rPr>
-        <w:t>[1</w:t>
+        <w:t>[</w:t>
+      </w:r>
+      <w:proofErr w:type="gramStart"/>
+      <w:r>
+        <w:rPr>
+          <w:rFonts w:hint="eastAsia"/>
+          <w:lang w:eastAsia="ko-KR"/>
+        </w:rPr>
+        <w:t>1</w:t>
       </w:r>
       <w:r>
         <w:rPr>
@@ -37784,7 +39020,11 @@
         <w:t xml:space="preserve">] </w:t>
       </w:r>
       <w:r>
-        <w:t xml:space="preserve">‡ </w:t>
+        <w:t>‡</w:t>
+      </w:r>
+      <w:proofErr w:type="gramEnd"/>
+      <w:r>
+        <w:t xml:space="preserve"> </w:t>
       </w:r>
       <w:r>
         <w:rPr>
@@ -37800,14 +39040,28 @@
           <w:rFonts w:hint="eastAsia"/>
           <w:lang w:eastAsia="ko-KR"/>
         </w:rPr>
-        <w:t xml:space="preserve">., &amp; </w:t>
-      </w:r>
-      <w:r>
-        <w:rPr>
-          <w:rFonts w:hint="eastAsia"/>
-          <w:lang w:eastAsia="ko-KR"/>
-        </w:rPr>
-        <w:t>Aldemir, T. (</w:t>
+        <w:t xml:space="preserve">., </w:t>
+      </w:r>
+      <w:r>
+        <w:rPr>
+          <w:rFonts w:hint="eastAsia"/>
+          <w:lang w:eastAsia="ko-KR"/>
+        </w:rPr>
+        <w:t>Aldemir, T.</w:t>
+      </w:r>
+      <w:r>
+        <w:rPr>
+          <w:rFonts w:hint="eastAsia"/>
+          <w:lang w:eastAsia="ko-KR"/>
+        </w:rPr>
+        <w:t>, &amp; Byun, G.</w:t>
+      </w:r>
+      <w:r>
+        <w:rPr>
+          <w:rFonts w:hint="eastAsia"/>
+          <w:lang w:eastAsia="ko-KR"/>
+        </w:rPr>
+        <w:t xml:space="preserve"> (</w:t>
       </w:r>
       <w:r>
         <w:rPr>
@@ -39621,6 +40875,7 @@
         </w:rPr>
         <w:t xml:space="preserve">. </w:t>
       </w:r>
+      <w:proofErr w:type="spellStart"/>
       <w:r>
         <w:rPr>
           <w:rFonts w:hint="eastAsia"/>
@@ -39648,6 +40903,7 @@
         </w:rPr>
         <w:t>rends</w:t>
       </w:r>
+      <w:proofErr w:type="spellEnd"/>
       <w:r>
         <w:rPr>
           <w:rFonts w:hint="eastAsia"/>
@@ -39802,6 +41058,7 @@
       <w:r>
         <w:t>[</w:t>
       </w:r>
+      <w:proofErr w:type="gramStart"/>
       <w:r>
         <w:rPr>
           <w:rFonts w:hint="eastAsia"/>
@@ -39818,6 +41075,7 @@
         </w:rPr>
         <w:t>‡</w:t>
       </w:r>
+      <w:proofErr w:type="gramEnd"/>
       <w:r>
         <w:rPr>
           <w:rFonts w:hint="eastAsia"/>
@@ -40896,6 +42154,7 @@
         </w:rPr>
         <w:t>[</w:t>
       </w:r>
+      <w:proofErr w:type="gramStart"/>
       <w:r>
         <w:rPr>
           <w:rFonts w:hint="eastAsia"/>
@@ -40911,7 +42170,11 @@
         <w:t xml:space="preserve">] </w:t>
       </w:r>
       <w:r>
-        <w:t xml:space="preserve">‡ </w:t>
+        <w:t>‡</w:t>
+      </w:r>
+      <w:proofErr w:type="gramEnd"/>
+      <w:r>
+        <w:t xml:space="preserve"> </w:t>
       </w:r>
       <w:r>
         <w:rPr>
@@ -41696,7 +42959,23 @@
           <w:bCs/>
           <w:lang w:eastAsia="ko-KR"/>
         </w:rPr>
-        <w:t>., Aldemir, T., Kourkoulou, T., Lee, H., Song, D., Abu, S., Emerson, W., &amp; Wang, S. (</w:t>
+        <w:t xml:space="preserve">., Aldemir, T., </w:t>
+      </w:r>
+      <w:proofErr w:type="spellStart"/>
+      <w:r>
+        <w:rPr>
+          <w:bCs/>
+          <w:lang w:eastAsia="ko-KR"/>
+        </w:rPr>
+        <w:t>Kourkoulou</w:t>
+      </w:r>
+      <w:proofErr w:type="spellEnd"/>
+      <w:r>
+        <w:rPr>
+          <w:bCs/>
+          <w:lang w:eastAsia="ko-KR"/>
+        </w:rPr>
+        <w:t>, T., Lee, H., Song, D., Abu, S., Emerson, W., &amp; Wang, S. (</w:t>
       </w:r>
       <w:r>
         <w:rPr>
@@ -41774,7 +43053,23 @@
           <w:bCs/>
           <w:lang w:eastAsia="ko-KR"/>
         </w:rPr>
-        <w:t>., Kourkoulou, T., Aldemir, T., Abu, S., Lee, H., &amp; Song, D. (</w:t>
+        <w:t xml:space="preserve">., </w:t>
+      </w:r>
+      <w:proofErr w:type="spellStart"/>
+      <w:r>
+        <w:rPr>
+          <w:bCs/>
+          <w:lang w:eastAsia="ko-KR"/>
+        </w:rPr>
+        <w:t>Kourkoulou</w:t>
+      </w:r>
+      <w:proofErr w:type="spellEnd"/>
+      <w:r>
+        <w:rPr>
+          <w:bCs/>
+          <w:lang w:eastAsia="ko-KR"/>
+        </w:rPr>
+        <w:t>, T., Aldemir, T., Abu, S., Lee, H., &amp; Song, D. (</w:t>
       </w:r>
       <w:r>
         <w:rPr>
@@ -41956,6 +43251,7 @@
         </w:rPr>
         <w:t>[</w:t>
       </w:r>
+      <w:proofErr w:type="gramStart"/>
       <w:r>
         <w:rPr>
           <w:rFonts w:hint="eastAsia"/>
@@ -41971,7 +43267,11 @@
         <w:t xml:space="preserve">] </w:t>
       </w:r>
       <w:r>
-        <w:t xml:space="preserve">‡ </w:t>
+        <w:t>‡</w:t>
+      </w:r>
+      <w:proofErr w:type="gramEnd"/>
+      <w:r>
+        <w:t xml:space="preserve"> </w:t>
       </w:r>
       <w:r>
         <w:rPr>
@@ -42696,7 +43996,27 @@
           <w:iCs/>
           <w:lang w:eastAsia="ko-KR"/>
         </w:rPr>
-        <w:t>Enhancing the resolution of instructional design evaluation: Reliability and validity analysis of a multi-agent system applying Gagné’s nine events of instruction</w:t>
+        <w:t xml:space="preserve">Enhancing the resolution of instructional design evaluation: Reliability and validity analysis of a multi-agent system applying </w:t>
+      </w:r>
+      <w:proofErr w:type="spellStart"/>
+      <w:r>
+        <w:rPr>
+          <w:bCs/>
+          <w:i/>
+          <w:iCs/>
+          <w:lang w:eastAsia="ko-KR"/>
+        </w:rPr>
+        <w:t>Gagné’s</w:t>
+      </w:r>
+      <w:proofErr w:type="spellEnd"/>
+      <w:r>
+        <w:rPr>
+          <w:bCs/>
+          <w:i/>
+          <w:iCs/>
+          <w:lang w:eastAsia="ko-KR"/>
+        </w:rPr>
+        <w:t xml:space="preserve"> nine events of instruction</w:t>
       </w:r>
       <w:r>
         <w:rPr>
@@ -42874,10 +44194,23 @@
           <w:bCs/>
           <w:lang w:eastAsia="ko-KR"/>
         </w:rPr>
-        <w:t xml:space="preserve">[1] </w:t>
-      </w:r>
-      <w:r>
-        <w:t xml:space="preserve">‡ </w:t>
+        <w:t>[</w:t>
+      </w:r>
+      <w:proofErr w:type="gramStart"/>
+      <w:r>
+        <w:rPr>
+          <w:rFonts w:hint="eastAsia"/>
+          <w:bCs/>
+          <w:lang w:eastAsia="ko-KR"/>
+        </w:rPr>
+        <w:t xml:space="preserve">1] </w:t>
+      </w:r>
+      <w:r>
+        <w:t>‡</w:t>
+      </w:r>
+      <w:proofErr w:type="gramEnd"/>
+      <w:r>
+        <w:t xml:space="preserve"> </w:t>
       </w:r>
       <w:r>
         <w:rPr>
@@ -43494,7 +44827,15 @@
       </w:r>
       <w:r>
         <w:br/>
-        <w:t>International Learning Research Network (iLRN) Conference 2022</w:t>
+        <w:t>International Learning Research Network (</w:t>
+      </w:r>
+      <w:proofErr w:type="spellStart"/>
+      <w:r>
+        <w:t>iLRN</w:t>
+      </w:r>
+      <w:proofErr w:type="spellEnd"/>
+      <w:r>
+        <w:t>) Conference 2022</w:t>
       </w:r>
       <w:r>
         <w:rPr>
@@ -43666,14 +45007,30 @@
           <w:rFonts w:hint="eastAsia"/>
           <w:lang w:eastAsia="ko-KR"/>
         </w:rPr>
-        <w:t>Affiliated Faculty, Modu</w:t>
-      </w:r>
-      <w:r>
-        <w:rPr>
-          <w:rFonts w:hint="eastAsia"/>
-          <w:lang w:eastAsia="ko-KR"/>
-        </w:rPr>
-        <w:t xml:space="preserve">Labs </w:t>
+        <w:t xml:space="preserve">Affiliated Faculty, </w:t>
+      </w:r>
+      <w:proofErr w:type="spellStart"/>
+      <w:r>
+        <w:rPr>
+          <w:rFonts w:hint="eastAsia"/>
+          <w:lang w:eastAsia="ko-KR"/>
+        </w:rPr>
+        <w:t>Modu</w:t>
+      </w:r>
+      <w:r>
+        <w:rPr>
+          <w:rFonts w:hint="eastAsia"/>
+          <w:lang w:eastAsia="ko-KR"/>
+        </w:rPr>
+        <w:t>Labs</w:t>
+      </w:r>
+      <w:proofErr w:type="spellEnd"/>
+      <w:r>
+        <w:rPr>
+          <w:rFonts w:hint="eastAsia"/>
+          <w:lang w:eastAsia="ko-KR"/>
+        </w:rPr>
+        <w:t xml:space="preserve"> </w:t>
       </w:r>
       <w:r>
         <w:rPr>
@@ -43779,7 +45136,15 @@
         <w:ind w:left="1440" w:hanging="720"/>
       </w:pPr>
       <w:r>
-        <w:t>Co-Chair, Immersive Learning Research Network (iLRN) (Appointed</w:t>
+        <w:t>Co-Chair, Immersive Learning Research Network (</w:t>
+      </w:r>
+      <w:proofErr w:type="spellStart"/>
+      <w:r>
+        <w:t>iLRN</w:t>
+      </w:r>
+      <w:proofErr w:type="spellEnd"/>
+      <w:r>
+        <w:t>) (Appointed</w:t>
       </w:r>
       <w:r>
         <w:t>, 2021-present</w:t>
@@ -43871,13 +45236,23 @@
         </w:rPr>
         <w:t xml:space="preserve">Associate Editor – </w:t>
       </w:r>
-      <w:r>
-        <w:rPr>
-          <w:i/>
-          <w:iCs/>
-          <w:color w:val="000000"/>
-        </w:rPr>
-        <w:t>Behaviour &amp; Information Technology</w:t>
+      <w:proofErr w:type="spellStart"/>
+      <w:r>
+        <w:rPr>
+          <w:i/>
+          <w:iCs/>
+          <w:color w:val="000000"/>
+        </w:rPr>
+        <w:t>Behaviour</w:t>
+      </w:r>
+      <w:proofErr w:type="spellEnd"/>
+      <w:r>
+        <w:rPr>
+          <w:i/>
+          <w:iCs/>
+          <w:color w:val="000000"/>
+        </w:rPr>
+        <w:t xml:space="preserve"> &amp; Information Technology</w:t>
       </w:r>
       <w:r>
         <w:rPr>
@@ -43937,7 +45312,29 @@
           <w:color w:val="000000"/>
           <w:lang w:eastAsia="ko-KR"/>
         </w:rPr>
-        <w:t>International Journal of Computer-Supported Collaborative Learning  (SSCI, Q1) (2026-present)</w:t>
+        <w:t xml:space="preserve">International Journal of Computer-Supported Collaborative </w:t>
+      </w:r>
+      <w:proofErr w:type="gramStart"/>
+      <w:r>
+        <w:rPr>
+          <w:rFonts w:hint="eastAsia"/>
+          <w:i/>
+          <w:iCs/>
+          <w:color w:val="000000"/>
+          <w:lang w:eastAsia="ko-KR"/>
+        </w:rPr>
+        <w:t>Learning  (</w:t>
+      </w:r>
+      <w:proofErr w:type="gramEnd"/>
+      <w:r>
+        <w:rPr>
+          <w:rFonts w:hint="eastAsia"/>
+          <w:i/>
+          <w:iCs/>
+          <w:color w:val="000000"/>
+          <w:lang w:eastAsia="ko-KR"/>
+        </w:rPr>
+        <w:t>SSCI, Q1) (2026-present)</w:t>
       </w:r>
     </w:p>
     <w:p>
@@ -44223,7 +45620,14 @@
         <w:rPr>
           <w:color w:val="000000"/>
         </w:rPr>
-        <w:t>Korean Journal</w:t>
+        <w:t xml:space="preserve">Korean </w:t>
+      </w:r>
+      <w:proofErr w:type="gramStart"/>
+      <w:r>
+        <w:rPr>
+          <w:color w:val="000000"/>
+        </w:rPr>
+        <w:t>Journal</w:t>
       </w:r>
       <w:r>
         <w:rPr>
@@ -44241,7 +45645,18 @@
           <w:color w:val="000000"/>
           <w:lang w:eastAsia="ko-KR"/>
         </w:rPr>
-        <w:t>(2024)</w:t>
+        <w:t>(</w:t>
+      </w:r>
+      <w:proofErr w:type="gramEnd"/>
+      <w:r>
+        <w:rPr>
+          <w:rFonts w:hint="eastAsia"/>
+          <w:i/>
+          <w:iCs/>
+          <w:color w:val="000000"/>
+          <w:lang w:eastAsia="ko-KR"/>
+        </w:rPr>
+        <w:t>2024)</w:t>
       </w:r>
     </w:p>
     <w:p>
@@ -44328,7 +45743,25 @@
           <w:iCs/>
           <w:color w:val="000000"/>
         </w:rPr>
-        <w:t>, Korean Open Access Guide in Edutech/Learning Sciences Research</w:t>
+        <w:t xml:space="preserve">, Korean Open Access Guide in </w:t>
+      </w:r>
+      <w:proofErr w:type="spellStart"/>
+      <w:r>
+        <w:rPr>
+          <w:i/>
+          <w:iCs/>
+          <w:color w:val="000000"/>
+        </w:rPr>
+        <w:t>Edutech</w:t>
+      </w:r>
+      <w:proofErr w:type="spellEnd"/>
+      <w:r>
+        <w:rPr>
+          <w:i/>
+          <w:iCs/>
+          <w:color w:val="000000"/>
+        </w:rPr>
+        <w:t>/Learning Sciences Research</w:t>
       </w:r>
     </w:p>
     <w:p>
@@ -44602,7 +46035,29 @@
           <w:color w:val="000000"/>
           <w:lang w:eastAsia="ko-KR"/>
         </w:rPr>
-        <w:t>Engineering Applications of Artificial Intelligence</w:t>
+        <w:t xml:space="preserve">Engineering Applications </w:t>
+      </w:r>
+      <w:proofErr w:type="gramStart"/>
+      <w:r>
+        <w:rPr>
+          <w:rFonts w:hint="eastAsia"/>
+          <w:i/>
+          <w:iCs/>
+          <w:color w:val="000000"/>
+          <w:lang w:eastAsia="ko-KR"/>
+        </w:rPr>
+        <w:t>of</w:t>
+      </w:r>
+      <w:proofErr w:type="gramEnd"/>
+      <w:r>
+        <w:rPr>
+          <w:rFonts w:hint="eastAsia"/>
+          <w:i/>
+          <w:iCs/>
+          <w:color w:val="000000"/>
+          <w:lang w:eastAsia="ko-KR"/>
+        </w:rPr>
+        <w:t xml:space="preserve"> Artificial Intelligence</w:t>
       </w:r>
     </w:p>
     <w:p>
@@ -44638,15 +46093,27 @@
         </w:rPr>
         <w:br/>
       </w:r>
-      <w:r>
-        <w:rPr>
-          <w:rFonts w:hint="eastAsia"/>
-          <w:i/>
-          <w:iCs/>
-          <w:color w:val="000000"/>
-          <w:lang w:eastAsia="ko-KR"/>
-        </w:rPr>
-        <w:t>Behaviour and Information Technology</w:t>
+      <w:proofErr w:type="spellStart"/>
+      <w:r>
+        <w:rPr>
+          <w:rFonts w:hint="eastAsia"/>
+          <w:i/>
+          <w:iCs/>
+          <w:color w:val="000000"/>
+          <w:lang w:eastAsia="ko-KR"/>
+        </w:rPr>
+        <w:t>Behaviour</w:t>
+      </w:r>
+      <w:proofErr w:type="spellEnd"/>
+      <w:r>
+        <w:rPr>
+          <w:rFonts w:hint="eastAsia"/>
+          <w:i/>
+          <w:iCs/>
+          <w:color w:val="000000"/>
+          <w:lang w:eastAsia="ko-KR"/>
+        </w:rPr>
+        <w:t xml:space="preserve"> and Information Technology</w:t>
       </w:r>
     </w:p>
     <w:p>
@@ -44982,6 +46449,7 @@
           <w:color w:val="000000"/>
         </w:rPr>
       </w:pPr>
+      <w:proofErr w:type="spellStart"/>
       <w:r>
         <w:rPr>
           <w:i/>
@@ -44989,6 +46457,7 @@
         </w:rPr>
         <w:t>TechTrends</w:t>
       </w:r>
+      <w:proofErr w:type="spellEnd"/>
     </w:p>
     <w:p>
       <w:pPr>
@@ -45164,12 +46633,21 @@
         </w:rPr>
         <w:br/>
       </w:r>
-      <w:r>
-        <w:rPr>
-          <w:i/>
-          <w:color w:val="000000"/>
-        </w:rPr>
-        <w:t>International Journal of Human-Computer Interaction</w:t>
+      <w:proofErr w:type="spellStart"/>
+      <w:r>
+        <w:rPr>
+          <w:i/>
+          <w:color w:val="000000"/>
+        </w:rPr>
+        <w:t>International</w:t>
+      </w:r>
+      <w:proofErr w:type="spellEnd"/>
+      <w:r>
+        <w:rPr>
+          <w:i/>
+          <w:color w:val="000000"/>
+        </w:rPr>
+        <w:t xml:space="preserve"> Journal of Human-Computer Interaction</w:t>
       </w:r>
       <w:r>
         <w:rPr>
@@ -45577,6 +47055,7 @@
         <w:lastRenderedPageBreak/>
         <w:t xml:space="preserve">Outstanding </w:t>
       </w:r>
+      <w:proofErr w:type="spellStart"/>
       <w:r>
         <w:rPr>
           <w:rFonts w:hint="eastAsia"/>
@@ -45584,6 +47063,7 @@
         </w:rPr>
         <w:t>iLEAD</w:t>
       </w:r>
+      <w:proofErr w:type="spellEnd"/>
       <w:r>
         <w:t xml:space="preserve"> Paper Award (202</w:t>
       </w:r>
@@ -45595,7 +47075,15 @@
         <w:t>4</w:t>
       </w:r>
       <w:r>
-        <w:t>). Immersive Learning Research Network Conference (iLRN) 202</w:t>
+        <w:t>). Immersive Learning Research Network Conference (</w:t>
+      </w:r>
+      <w:proofErr w:type="spellStart"/>
+      <w:r>
+        <w:t>iLRN</w:t>
+      </w:r>
+      <w:proofErr w:type="spellEnd"/>
+      <w:r>
+        <w:t>) 202</w:t>
       </w:r>
       <w:r>
         <w:rPr>
@@ -45620,7 +47108,15 @@
         <w:ind w:left="720" w:hanging="720"/>
       </w:pPr>
       <w:r>
-        <w:t>Outstanding Practitioner Paper Award (2023). Immersive Learning Research Network Conference (iLRN) 2023</w:t>
+        <w:t>Outstanding Practitioner Paper Award (2023). Immersive Learning Research Network Conference (</w:t>
+      </w:r>
+      <w:proofErr w:type="spellStart"/>
+      <w:r>
+        <w:t>iLRN</w:t>
+      </w:r>
+      <w:proofErr w:type="spellEnd"/>
+      <w:r>
+        <w:t>) 2023</w:t>
       </w:r>
     </w:p>
     <w:p>
@@ -47385,6 +48881,7 @@
   <w:style w:type="character" w:default="1" w:styleId="DefaultParagraphFont">
     <w:name w:val="Default Paragraph Font"/>
     <w:uiPriority w:val="1"/>
+    <w:semiHidden/>
     <w:unhideWhenUsed/>
   </w:style>
   <w:style w:type="table" w:default="1" w:styleId="TableNormal">
@@ -47889,6 +49386,14 @@
 </file>
 
 <file path=customXml/item1.xml><?xml version="1.0" encoding="utf-8"?>
+<p:properties xmlns:p="http://schemas.microsoft.com/office/2006/metadata/properties" xmlns:xsi="http://www.w3.org/2001/XMLSchema-instance" xmlns:pc="http://schemas.microsoft.com/office/infopath/2007/PartnerControls">
+  <documentManagement>
+    <_activity xmlns="6a4161d7-0e07-4bb5-8cdd-a87a7602a445" xsi:nil="true"/>
+  </documentManagement>
+</p:properties>
+</file>
+
+<file path=customXml/item2.xml><?xml version="1.0" encoding="utf-8"?>
 <?mso-contentType ?>
 <FormTemplates xmlns="http://schemas.microsoft.com/sharepoint/v3/contenttype/forms">
   <Display>DocumentLibraryForm</Display>
@@ -47897,19 +49402,7 @@
 </FormTemplates>
 </file>
 
-<file path=customXml/item2.xml><?xml version="1.0" encoding="utf-8"?>
-<b:Sources xmlns:b="http://schemas.openxmlformats.org/officeDocument/2006/bibliography" xmlns="http://schemas.openxmlformats.org/officeDocument/2006/bibliography" SelectedStyle="\APASixthEditionOfficeOnline.xsl" StyleName="APA" Version="6"/>
-</file>
-
 <file path=customXml/item3.xml><?xml version="1.0" encoding="utf-8"?>
-<p:properties xmlns:p="http://schemas.microsoft.com/office/2006/metadata/properties" xmlns:xsi="http://www.w3.org/2001/XMLSchema-instance" xmlns:pc="http://schemas.microsoft.com/office/infopath/2007/PartnerControls">
-  <documentManagement>
-    <_activity xmlns="6a4161d7-0e07-4bb5-8cdd-a87a7602a445" xsi:nil="true"/>
-  </documentManagement>
-</p:properties>
-</file>
-
-<file path=customXml/item4.xml><?xml version="1.0" encoding="utf-8"?>
 <ct:contentTypeSchema xmlns:ct="http://schemas.microsoft.com/office/2006/metadata/contentType" xmlns:ma="http://schemas.microsoft.com/office/2006/metadata/properties/metaAttributes" ct:_="" ma:_="" ma:contentTypeName="Document" ma:contentTypeID="0x010100FA54A6C77D34E44FB33E0184D6F9C744" ma:contentTypeVersion="18" ma:contentTypeDescription="Create a new document." ma:contentTypeScope="" ma:versionID="9c28832654d292338743ef1185d20088">
   <xsd:schema xmlns:xsd="http://www.w3.org/2001/XMLSchema" xmlns:xs="http://www.w3.org/2001/XMLSchema" xmlns:p="http://schemas.microsoft.com/office/2006/metadata/properties" xmlns:ns3="6a4161d7-0e07-4bb5-8cdd-a87a7602a445" xmlns:ns4="30453fea-43c5-4a0b-a417-834186a09351" targetNamespace="http://schemas.microsoft.com/office/2006/metadata/properties" ma:root="true" ma:fieldsID="aadbfd92c1be4506f2c2f9fc093c4d0b" ns3:_="" ns4:_="">
     <xsd:import namespace="6a4161d7-0e07-4bb5-8cdd-a87a7602a445"/>
@@ -48162,23 +49655,11 @@
 </ct:contentTypeSchema>
 </file>
 
-<file path=customXml/itemProps1.xml><?xml version="1.0" encoding="utf-8"?>
-<ds:datastoreItem xmlns:ds="http://schemas.openxmlformats.org/officeDocument/2006/customXml" ds:itemID="{F79F8074-1665-45F2-8B05-A95EA1C1A155}">
-  <ds:schemaRefs>
-    <ds:schemaRef ds:uri="http://schemas.microsoft.com/sharepoint/v3/contenttype/forms"/>
-  </ds:schemaRefs>
-</ds:datastoreItem>
+<file path=customXml/item4.xml><?xml version="1.0" encoding="utf-8"?>
+<b:Sources xmlns:b="http://schemas.openxmlformats.org/officeDocument/2006/bibliography" xmlns="http://schemas.openxmlformats.org/officeDocument/2006/bibliography" SelectedStyle="\APASixthEditionOfficeOnline.xsl" StyleName="APA" Version="6"/>
 </file>
 
-<file path=customXml/itemProps2.xml><?xml version="1.0" encoding="utf-8"?>
-<ds:datastoreItem xmlns:ds="http://schemas.openxmlformats.org/officeDocument/2006/customXml" ds:itemID="{E286DD98-9466-43F6-BF97-336366EE54DF}">
-  <ds:schemaRefs>
-    <ds:schemaRef ds:uri="http://schemas.openxmlformats.org/officeDocument/2006/bibliography"/>
-  </ds:schemaRefs>
-</ds:datastoreItem>
-</file>
-
-<file path=customXml/itemProps3.xml><?xml version="1.0" encoding="utf-8"?>
+<file path=customXml/itemProps1.xml><?xml version="1.0" encoding="utf-8"?>
 <ds:datastoreItem xmlns:ds="http://schemas.openxmlformats.org/officeDocument/2006/customXml" ds:itemID="{7C24488D-A36D-4C56-91ED-753F5C27550A}">
   <ds:schemaRefs>
     <ds:schemaRef ds:uri="http://schemas.microsoft.com/office/2006/metadata/properties"/>
@@ -48188,7 +49669,15 @@
 </ds:datastoreItem>
 </file>
 
-<file path=customXml/itemProps4.xml><?xml version="1.0" encoding="utf-8"?>
+<file path=customXml/itemProps2.xml><?xml version="1.0" encoding="utf-8"?>
+<ds:datastoreItem xmlns:ds="http://schemas.openxmlformats.org/officeDocument/2006/customXml" ds:itemID="{F79F8074-1665-45F2-8B05-A95EA1C1A155}">
+  <ds:schemaRefs>
+    <ds:schemaRef ds:uri="http://schemas.microsoft.com/sharepoint/v3/contenttype/forms"/>
+  </ds:schemaRefs>
+</ds:datastoreItem>
+</file>
+
+<file path=customXml/itemProps3.xml><?xml version="1.0" encoding="utf-8"?>
 <ds:datastoreItem xmlns:ds="http://schemas.openxmlformats.org/officeDocument/2006/customXml" ds:itemID="{44F19B31-977D-45A4-A748-143054BB9DA7}">
   <ds:schemaRefs>
     <ds:schemaRef ds:uri="http://schemas.microsoft.com/office/2006/metadata/contentType"/>
@@ -48205,4 +49694,12 @@
     <ds:schemaRef ds:uri="http://schemas.microsoft.com/internal/obd"/>
   </ds:schemaRefs>
 </ds:datastoreItem>
+</file>
+
+<file path=customXml/itemProps4.xml><?xml version="1.0" encoding="utf-8"?>
+<ds:datastoreItem xmlns:ds="http://schemas.openxmlformats.org/officeDocument/2006/customXml" ds:itemID="{E286DD98-9466-43F6-BF97-336366EE54DF}">
+  <ds:schemaRefs>
+    <ds:schemaRef ds:uri="http://schemas.openxmlformats.org/officeDocument/2006/bibliography"/>
+  </ds:schemaRefs>
+</ds:datastoreItem>
 </file>
</xml_diff>

<commit_message>
Auto-select newest CV_<date>_MOON.docx; drop CV_202604 and current-cv copies
Parsers now scan the repo root and pick the newest CV_<date>_MOON.docx instead of hardcoding a filename, and the download link tracks whichever file is selected. Removes the legacy CV_202604_MOON.docx and the current-cv.docx compatibility copy, updates the regenerate workflow trigger to CV_*_MOON.docx, and refreshes site data from the current CV_202605_MOON.docx.

Co-Authored-By: Claude Opus 4.8 (1M context) <noreply@anthropic.com>
</commit_message>
<xml_diff>
--- a/CV_202605_MOON.docx
+++ b/CV_202605_MOON.docx
@@ -247,9 +247,11 @@
           <w:between w:val="nil"/>
         </w:pBdr>
         <w:rPr>
+          <w:rFonts w:hint="eastAsia"/>
           <w:color w:val="4F81BD" w:themeColor="accent1"/>
           <w:sz w:val="22"/>
           <w:szCs w:val="22"/>
+          <w:lang w:eastAsia="ko-KR"/>
         </w:rPr>
       </w:pPr>
       <w:r>
@@ -277,16 +279,29 @@
         <w:r>
           <w:rPr>
             <w:rStyle w:val="Hyperlink"/>
-            <w:sz w:val="22"/>
-            <w:szCs w:val="22"/>
+            <w:lang w:eastAsia="ko-KR"/>
           </w:rPr>
-          <w:t>https://jmoon.people.ua.edu</w:t>
+          <w:t>https://educatian.gith</w:t>
+        </w:r>
+        <w:r>
+          <w:rPr>
+            <w:rStyle w:val="Hyperlink"/>
+            <w:lang w:eastAsia="ko-KR"/>
+          </w:rPr>
+          <w:t>u</w:t>
+        </w:r>
+        <w:r>
+          <w:rPr>
+            <w:rStyle w:val="Hyperlink"/>
+            <w:lang w:eastAsia="ko-KR"/>
+          </w:rPr>
+          <w:t>b.io/cv</w:t>
         </w:r>
       </w:hyperlink>
       <w:r>
         <w:rPr>
-          <w:sz w:val="22"/>
-          <w:szCs w:val="22"/>
+          <w:rFonts w:hint="eastAsia"/>
+          <w:lang w:eastAsia="ko-KR"/>
         </w:rPr>
         <w:t xml:space="preserve"> </w:t>
       </w:r>
@@ -367,10 +382,38 @@
             <w:rStyle w:val="Hyperlink"/>
             <w:sz w:val="22"/>
             <w:szCs w:val="22"/>
+            <w:lang w:eastAsia="ko-KR"/>
           </w:rPr>
-          <w:t>https://adielab.ua.edu</w:t>
+          <w:t>https</w:t>
+        </w:r>
+        <w:r>
+          <w:rPr>
+            <w:rStyle w:val="Hyperlink"/>
+            <w:sz w:val="22"/>
+            <w:szCs w:val="22"/>
+            <w:lang w:eastAsia="ko-KR"/>
+          </w:rPr>
+          <w:t>:</w:t>
+        </w:r>
+        <w:r>
+          <w:rPr>
+            <w:rStyle w:val="Hyperlink"/>
+            <w:sz w:val="22"/>
+            <w:szCs w:val="22"/>
+            <w:lang w:eastAsia="ko-KR"/>
+          </w:rPr>
+          <w:t>//educatian.github.io/adie</w:t>
         </w:r>
       </w:hyperlink>
+      <w:r>
+        <w:rPr>
+          <w:rFonts w:hint="eastAsia"/>
+          <w:sz w:val="22"/>
+          <w:szCs w:val="22"/>
+          <w:lang w:eastAsia="ko-KR"/>
+        </w:rPr>
+        <w:t xml:space="preserve"> </w:t>
+      </w:r>
       <w:r>
         <w:rPr>
           <w:sz w:val="22"/>
@@ -8176,21 +8219,25 @@
           <w:rFonts w:hint="eastAsia"/>
           <w:lang w:eastAsia="ko-KR"/>
         </w:rPr>
-        <w:t>[</w:t>
-      </w:r>
-      <w:r>
-        <w:rPr>
-          <w:rFonts w:hint="eastAsia"/>
-          <w:lang w:eastAsia="ko-KR"/>
-        </w:rPr>
-        <w:t>59</w:t>
-      </w:r>
-      <w:r>
-        <w:rPr>
-          <w:rFonts w:hint="eastAsia"/>
-          <w:lang w:eastAsia="ko-KR"/>
-        </w:rPr>
-        <w:t xml:space="preserve">] Abu, S., Uddin, M., </w:t>
+        <w:t xml:space="preserve">[59] </w:t>
+      </w:r>
+      <w:r>
+        <w:rPr>
+          <w:bCs/>
+          <w:sz w:val="22"/>
+          <w:szCs w:val="22"/>
+        </w:rPr>
+        <w:t>*</w:t>
+      </w:r>
+      <w:r>
+        <w:t xml:space="preserve"> </w:t>
+      </w:r>
+      <w:r>
+        <w:rPr>
+          <w:rFonts w:hint="eastAsia"/>
+          <w:lang w:eastAsia="ko-KR"/>
+        </w:rPr>
+        <w:t xml:space="preserve">Abu, S., Uddin, M., </w:t>
       </w:r>
       <w:r>
         <w:rPr>
@@ -8216,21 +8263,7 @@
           <w:rFonts w:hint="eastAsia"/>
           <w:lang w:eastAsia="ko-KR"/>
         </w:rPr>
-        <w:t>Awoyemi, I., Mintah, R., &amp; Ghooreian, A. (</w:t>
-      </w:r>
-      <w:r>
-        <w:rPr>
-          <w:rFonts w:hint="eastAsia"/>
-          <w:lang w:eastAsia="ko-KR"/>
-        </w:rPr>
-        <w:t>Accepted, 2026</w:t>
-      </w:r>
-      <w:r>
-        <w:rPr>
-          <w:rFonts w:hint="eastAsia"/>
-          <w:lang w:eastAsia="ko-KR"/>
-        </w:rPr>
-        <w:t xml:space="preserve">). </w:t>
+        <w:t xml:space="preserve">Awoyemi, I., Mintah, R., &amp; Ghooreian, A. (Accepted, 2026). </w:t>
       </w:r>
       <w:r>
         <w:rPr>
@@ -8350,16 +8383,84 @@
           <w:rFonts w:hint="eastAsia"/>
           <w:lang w:eastAsia="ko-KR"/>
         </w:rPr>
-        <w:t xml:space="preserve"> (SSCI-indexed)</w:t>
-      </w:r>
-      <w:r>
-        <w:rPr>
-          <w:rFonts w:hint="eastAsia"/>
-          <w:i/>
-          <w:iCs/>
-          <w:lang w:eastAsia="ko-KR"/>
-        </w:rPr>
-        <w:t>.</w:t>
+        <w:t xml:space="preserve"> </w:t>
+      </w:r>
+      <w:r>
+        <w:rPr>
+          <w:b/>
+          <w:i/>
+        </w:rPr>
+        <w:t>[SSCI-indexed</w:t>
+      </w:r>
+      <w:r>
+        <w:rPr>
+          <w:b/>
+          <w:bCs/>
+          <w:i/>
+          <w:iCs/>
+        </w:rPr>
+        <w:t xml:space="preserve">, IF = </w:t>
+      </w:r>
+      <w:r>
+        <w:rPr>
+          <w:rFonts w:hint="eastAsia"/>
+          <w:b/>
+          <w:bCs/>
+          <w:i/>
+          <w:iCs/>
+          <w:lang w:eastAsia="ko-KR"/>
+        </w:rPr>
+        <w:t xml:space="preserve">1.9, </w:t>
+      </w:r>
+      <w:r>
+        <w:rPr>
+          <w:b/>
+          <w:bCs/>
+          <w:i/>
+          <w:iCs/>
+        </w:rPr>
+        <w:t>IF</w:t>
+      </w:r>
+      <w:r>
+        <w:rPr>
+          <w:rFonts w:hint="eastAsia"/>
+          <w:b/>
+          <w:bCs/>
+          <w:i/>
+          <w:iCs/>
+          <w:lang w:eastAsia="ko-KR"/>
+        </w:rPr>
+        <w:t>5</w:t>
+      </w:r>
+      <w:r>
+        <w:rPr>
+          <w:b/>
+          <w:bCs/>
+          <w:i/>
+          <w:iCs/>
+        </w:rPr>
+        <w:t xml:space="preserve"> = </w:t>
+      </w:r>
+      <w:r>
+        <w:rPr>
+          <w:rFonts w:hint="eastAsia"/>
+          <w:b/>
+          <w:bCs/>
+          <w:i/>
+          <w:iCs/>
+          <w:lang w:eastAsia="ko-KR"/>
+        </w:rPr>
+        <w:t>2.1</w:t>
+      </w:r>
+      <w:r>
+        <w:rPr>
+          <w:b/>
+          <w:i/>
+          <w:color w:val="212121"/>
+          <w:sz w:val="28"/>
+          <w:szCs w:val="28"/>
+        </w:rPr>
+        <w:t>]</w:t>
       </w:r>
     </w:p>
     <w:p>
@@ -8584,13 +8685,87 @@
       </w:r>
       <w:r>
         <w:rPr>
-          <w:rFonts w:hint="eastAsia"/>
-          <w:bCs/>
-          <w:i/>
-          <w:iCs/>
-          <w:lang w:eastAsia="ko-KR"/>
-        </w:rPr>
-        <w:t>(SSCI-indexed journal).</w:t>
+          <w:b/>
+          <w:i/>
+        </w:rPr>
+        <w:t>[SSCI-indexed</w:t>
+      </w:r>
+      <w:r>
+        <w:rPr>
+          <w:b/>
+          <w:bCs/>
+          <w:i/>
+          <w:iCs/>
+        </w:rPr>
+        <w:t xml:space="preserve">, IF = </w:t>
+      </w:r>
+      <w:r>
+        <w:rPr>
+          <w:rFonts w:hint="eastAsia"/>
+          <w:b/>
+          <w:bCs/>
+          <w:i/>
+          <w:iCs/>
+          <w:lang w:eastAsia="ko-KR"/>
+        </w:rPr>
+        <w:t xml:space="preserve">8.8, </w:t>
+      </w:r>
+      <w:r>
+        <w:rPr>
+          <w:b/>
+          <w:bCs/>
+          <w:i/>
+          <w:iCs/>
+        </w:rPr>
+        <w:t>IF</w:t>
+      </w:r>
+      <w:r>
+        <w:rPr>
+          <w:rFonts w:hint="eastAsia"/>
+          <w:b/>
+          <w:bCs/>
+          <w:i/>
+          <w:iCs/>
+          <w:lang w:eastAsia="ko-KR"/>
+        </w:rPr>
+        <w:t>5</w:t>
+      </w:r>
+      <w:r>
+        <w:rPr>
+          <w:b/>
+          <w:bCs/>
+          <w:i/>
+          <w:iCs/>
+        </w:rPr>
+        <w:t xml:space="preserve"> = </w:t>
+      </w:r>
+      <w:r>
+        <w:rPr>
+          <w:rFonts w:hint="eastAsia"/>
+          <w:b/>
+          <w:bCs/>
+          <w:i/>
+          <w:iCs/>
+          <w:lang w:eastAsia="ko-KR"/>
+        </w:rPr>
+        <w:t>14.2</w:t>
+      </w:r>
+      <w:r>
+        <w:rPr>
+          <w:b/>
+          <w:i/>
+          <w:color w:val="212121"/>
+          <w:sz w:val="28"/>
+          <w:szCs w:val="28"/>
+        </w:rPr>
+        <w:t>]</w:t>
+      </w:r>
+      <w:r>
+        <w:rPr>
+          <w:rFonts w:hint="eastAsia"/>
+          <w:lang w:eastAsia="ko-KR"/>
+        </w:rPr>
+        <w:t xml:space="preserve"> </w:t>
       </w:r>
     </w:p>
     <w:p>
@@ -9260,7 +9435,40 @@
           <w:iCs/>
           <w:lang w:eastAsia="ko-KR"/>
         </w:rPr>
-        <w:t xml:space="preserve">5.3, </w:t>
+        <w:t>2</w:t>
+      </w:r>
+      <w:r>
+        <w:rPr>
+          <w:rFonts w:hint="eastAsia"/>
+          <w:b/>
+          <w:bCs/>
+          <w:i/>
+          <w:iCs/>
+          <w:lang w:eastAsia="ko-KR"/>
+        </w:rPr>
+        <w:t>.</w:t>
+      </w:r>
+      <w:r>
+        <w:rPr>
+          <w:rFonts w:hint="eastAsia"/>
+          <w:b/>
+          <w:bCs/>
+          <w:i/>
+          <w:iCs/>
+          <w:lang w:eastAsia="ko-KR"/>
+        </w:rPr>
+        <w:t>4</w:t>
+      </w:r>
+      <w:r>
+        <w:rPr>
+          <w:rFonts w:hint="eastAsia"/>
+          <w:b/>
+          <w:bCs/>
+          <w:i/>
+          <w:iCs/>
+          <w:lang w:eastAsia="ko-KR"/>
+        </w:rPr>
+        <w:t xml:space="preserve">, </w:t>
       </w:r>
       <w:r>
         <w:rPr>
@@ -9300,7 +9508,29 @@
           <w:iCs/>
           <w:lang w:eastAsia="ko-KR"/>
         </w:rPr>
-        <w:t>6.2</w:t>
+        <w:t>3</w:t>
+      </w:r>
+      <w:r>
+        <w:rPr>
+          <w:rFonts w:hint="eastAsia"/>
+          <w:b/>
+          <w:bCs/>
+          <w:i/>
+          <w:iCs/>
+          <w:lang w:eastAsia="ko-KR"/>
+        </w:rPr>
+        <w:t>.</w:t>
+      </w:r>
+      <w:r>
+        <w:rPr>
+          <w:rFonts w:hint="eastAsia"/>
+          <w:b/>
+          <w:bCs/>
+          <w:i/>
+          <w:iCs/>
+          <w:lang w:eastAsia="ko-KR"/>
+        </w:rPr>
+        <w:t>1</w:t>
       </w:r>
       <w:r>
         <w:rPr>
@@ -9599,6 +9829,7 @@
       <w:r>
         <w:t>[</w:t>
       </w:r>
+      <w:proofErr w:type="gramStart"/>
       <w:r>
         <w:rPr>
           <w:rFonts w:hint="eastAsia"/>
@@ -9612,8 +9843,18 @@
       <w:r>
         <w:rPr>
           <w:bCs/>
-        </w:rPr>
-        <w:t xml:space="preserve">* </w:t>
+          <w:sz w:val="22"/>
+          <w:szCs w:val="22"/>
+          <w:u w:val="single"/>
+        </w:rPr>
+        <w:t>‡</w:t>
+      </w:r>
+      <w:proofErr w:type="gramEnd"/>
+      <w:r>
+        <w:rPr>
+          <w:bCs/>
+        </w:rPr>
+        <w:t xml:space="preserve"> </w:t>
       </w:r>
       <w:r>
         <w:t xml:space="preserve">Jeong, Y., Lee, Y., Byun, G., &amp; </w:t>
@@ -9871,6 +10112,16 @@
           <w:lang w:eastAsia="ko-KR"/>
         </w:rPr>
         <w:t xml:space="preserve">] </w:t>
+      </w:r>
+      <w:r>
+        <w:t>*</w:t>
+      </w:r>
+      <w:r>
+        <w:rPr>
+          <w:rFonts w:hint="eastAsia"/>
+          <w:lang w:eastAsia="ko-KR"/>
+        </w:rPr>
+        <w:t xml:space="preserve"> </w:t>
       </w:r>
       <w:r>
         <w:rPr>
@@ -35735,31 +35986,6 @@
           <w:szCs w:val="28"/>
         </w:rPr>
         <w:t>WORKING PAPERS [n = 40]</w:t>
-      </w:r>
-      <w:r>
-        <w:rPr>
-          <w:rFonts w:hint="eastAsia"/>
-          <w:b/>
-          <w:sz w:val="28"/>
-          <w:szCs w:val="28"/>
-          <w:lang w:eastAsia="ko-KR"/>
-        </w:rPr>
-      </w:r>
-      <w:r>
-        <w:rPr>
-          <w:rFonts w:hint="eastAsia"/>
-          <w:b/>
-          <w:sz w:val="28"/>
-          <w:szCs w:val="28"/>
-          <w:lang w:eastAsia="ko-KR"/>
-        </w:rPr>
-      </w:r>
-      <w:r>
-        <w:rPr>
-          <w:b/>
-          <w:sz w:val="28"/>
-          <w:szCs w:val="28"/>
-        </w:rPr>
       </w:r>
     </w:p>
     <w:p>
@@ -49378,10 +49604,23 @@
 </file>
 
 <file path=customXml/item1.xml><?xml version="1.0" encoding="utf-8"?>
-<b:Sources xmlns:b="http://schemas.openxmlformats.org/officeDocument/2006/bibliography" xmlns="http://schemas.openxmlformats.org/officeDocument/2006/bibliography" SelectedStyle="\APASixthEditionOfficeOnline.xsl" StyleName="APA" Version="6"/>
+<p:properties xmlns:p="http://schemas.microsoft.com/office/2006/metadata/properties" xmlns:xsi="http://www.w3.org/2001/XMLSchema-instance" xmlns:pc="http://schemas.microsoft.com/office/infopath/2007/PartnerControls">
+  <documentManagement>
+    <_activity xmlns="6a4161d7-0e07-4bb5-8cdd-a87a7602a445" xsi:nil="true"/>
+  </documentManagement>
+</p:properties>
 </file>
 
 <file path=customXml/item2.xml><?xml version="1.0" encoding="utf-8"?>
+<?mso-contentType ?>
+<FormTemplates xmlns="http://schemas.microsoft.com/sharepoint/v3/contenttype/forms">
+  <Display>DocumentLibraryForm</Display>
+  <Edit>DocumentLibraryForm</Edit>
+  <New>DocumentLibraryForm</New>
+</FormTemplates>
+</file>
+
+<file path=customXml/item3.xml><?xml version="1.0" encoding="utf-8"?>
 <ct:contentTypeSchema xmlns:ct="http://schemas.microsoft.com/office/2006/metadata/contentType" xmlns:ma="http://schemas.microsoft.com/office/2006/metadata/properties/metaAttributes" ct:_="" ma:_="" ma:contentTypeName="Document" ma:contentTypeID="0x010100FA54A6C77D34E44FB33E0184D6F9C744" ma:contentTypeVersion="18" ma:contentTypeDescription="Create a new document." ma:contentTypeScope="" ma:versionID="9c28832654d292338743ef1185d20088">
   <xsd:schema xmlns:xsd="http://www.w3.org/2001/XMLSchema" xmlns:xs="http://www.w3.org/2001/XMLSchema" xmlns:p="http://schemas.microsoft.com/office/2006/metadata/properties" xmlns:ns3="6a4161d7-0e07-4bb5-8cdd-a87a7602a445" xmlns:ns4="30453fea-43c5-4a0b-a417-834186a09351" targetNamespace="http://schemas.microsoft.com/office/2006/metadata/properties" ma:root="true" ma:fieldsID="aadbfd92c1be4506f2c2f9fc093c4d0b" ns3:_="" ns4:_="">
     <xsd:import namespace="6a4161d7-0e07-4bb5-8cdd-a87a7602a445"/>
@@ -49634,32 +49873,29 @@
 </ct:contentTypeSchema>
 </file>
 
-<file path=customXml/item3.xml><?xml version="1.0" encoding="utf-8"?>
-<?mso-contentType ?>
-<FormTemplates xmlns="http://schemas.microsoft.com/sharepoint/v3/contenttype/forms">
-  <Display>DocumentLibraryForm</Display>
-  <Edit>DocumentLibraryForm</Edit>
-  <New>DocumentLibraryForm</New>
-</FormTemplates>
-</file>
-
 <file path=customXml/item4.xml><?xml version="1.0" encoding="utf-8"?>
-<p:properties xmlns:p="http://schemas.microsoft.com/office/2006/metadata/properties" xmlns:xsi="http://www.w3.org/2001/XMLSchema-instance" xmlns:pc="http://schemas.microsoft.com/office/infopath/2007/PartnerControls">
-  <documentManagement>
-    <_activity xmlns="6a4161d7-0e07-4bb5-8cdd-a87a7602a445" xsi:nil="true"/>
-  </documentManagement>
-</p:properties>
+<b:Sources xmlns:b="http://schemas.openxmlformats.org/officeDocument/2006/bibliography" xmlns="http://schemas.openxmlformats.org/officeDocument/2006/bibliography" SelectedStyle="\APASixthEditionOfficeOnline.xsl" StyleName="APA" Version="6"/>
 </file>
 
 <file path=customXml/itemProps1.xml><?xml version="1.0" encoding="utf-8"?>
-<ds:datastoreItem xmlns:ds="http://schemas.openxmlformats.org/officeDocument/2006/customXml" ds:itemID="{E286DD98-9466-43F6-BF97-336366EE54DF}">
+<ds:datastoreItem xmlns:ds="http://schemas.openxmlformats.org/officeDocument/2006/customXml" ds:itemID="{7C24488D-A36D-4C56-91ED-753F5C27550A}">
   <ds:schemaRefs>
-    <ds:schemaRef ds:uri="http://schemas.openxmlformats.org/officeDocument/2006/bibliography"/>
+    <ds:schemaRef ds:uri="http://schemas.microsoft.com/office/2006/metadata/properties"/>
+    <ds:schemaRef ds:uri="http://schemas.microsoft.com/office/infopath/2007/PartnerControls"/>
+    <ds:schemaRef ds:uri="6a4161d7-0e07-4bb5-8cdd-a87a7602a445"/>
   </ds:schemaRefs>
 </ds:datastoreItem>
 </file>
 
 <file path=customXml/itemProps2.xml><?xml version="1.0" encoding="utf-8"?>
+<ds:datastoreItem xmlns:ds="http://schemas.openxmlformats.org/officeDocument/2006/customXml" ds:itemID="{F79F8074-1665-45F2-8B05-A95EA1C1A155}">
+  <ds:schemaRefs>
+    <ds:schemaRef ds:uri="http://schemas.microsoft.com/sharepoint/v3/contenttype/forms"/>
+  </ds:schemaRefs>
+</ds:datastoreItem>
+</file>
+
+<file path=customXml/itemProps3.xml><?xml version="1.0" encoding="utf-8"?>
 <ds:datastoreItem xmlns:ds="http://schemas.openxmlformats.org/officeDocument/2006/customXml" ds:itemID="{44F19B31-977D-45A4-A748-143054BB9DA7}">
   <ds:schemaRefs>
     <ds:schemaRef ds:uri="http://schemas.microsoft.com/office/2006/metadata/contentType"/>
@@ -49678,20 +49914,10 @@
 </ds:datastoreItem>
 </file>
 
-<file path=customXml/itemProps3.xml><?xml version="1.0" encoding="utf-8"?>
-<ds:datastoreItem xmlns:ds="http://schemas.openxmlformats.org/officeDocument/2006/customXml" ds:itemID="{F79F8074-1665-45F2-8B05-A95EA1C1A155}">
+<file path=customXml/itemProps4.xml><?xml version="1.0" encoding="utf-8"?>
+<ds:datastoreItem xmlns:ds="http://schemas.openxmlformats.org/officeDocument/2006/customXml" ds:itemID="{E286DD98-9466-43F6-BF97-336366EE54DF}">
   <ds:schemaRefs>
-    <ds:schemaRef ds:uri="http://schemas.microsoft.com/sharepoint/v3/contenttype/forms"/>
-  </ds:schemaRefs>
-</ds:datastoreItem>
-</file>
-
-<file path=customXml/itemProps4.xml><?xml version="1.0" encoding="utf-8"?>
-<ds:datastoreItem xmlns:ds="http://schemas.openxmlformats.org/officeDocument/2006/customXml" ds:itemID="{7C24488D-A36D-4C56-91ED-753F5C27550A}">
-  <ds:schemaRefs>
-    <ds:schemaRef ds:uri="http://schemas.microsoft.com/office/2006/metadata/properties"/>
-    <ds:schemaRef ds:uri="http://schemas.microsoft.com/office/infopath/2007/PartnerControls"/>
-    <ds:schemaRef ds:uri="6a4161d7-0e07-4bb5-8cdd-a87a7602a445"/>
+    <ds:schemaRef ds:uri="http://schemas.openxmlformats.org/officeDocument/2006/bibliography"/>
   </ds:schemaRefs>
 </ds:datastoreItem>
 </file>
</xml_diff>

<commit_message>
Update CV docx, site-data, and research analytics (autopush 2026-06-17 05:22)
</commit_message>
<xml_diff>
--- a/CV_202605_MOON.docx
+++ b/CV_202605_MOON.docx
@@ -7808,7 +7808,7 @@
           <w:u w:val="single"/>
           <w:lang w:eastAsia="ko-KR"/>
         </w:rPr>
-        <w:t>4</w:t>
+        <w:t>5</w:t>
       </w:r>
       <w:r>
         <w:rPr>
@@ -8564,7 +8564,40 @@
           <w:iCs/>
           <w:lang w:eastAsia="ko-KR"/>
         </w:rPr>
-        <w:t xml:space="preserve">2.4, </w:t>
+        <w:t>3</w:t>
+      </w:r>
+      <w:r>
+        <w:rPr>
+          <w:rFonts w:hint="eastAsia"/>
+          <w:b/>
+          <w:bCs/>
+          <w:i/>
+          <w:iCs/>
+          <w:lang w:eastAsia="ko-KR"/>
+        </w:rPr>
+        <w:t>.</w:t>
+      </w:r>
+      <w:r>
+        <w:rPr>
+          <w:rFonts w:hint="eastAsia"/>
+          <w:b/>
+          <w:bCs/>
+          <w:i/>
+          <w:iCs/>
+          <w:lang w:eastAsia="ko-KR"/>
+        </w:rPr>
+        <w:t>8</w:t>
+      </w:r>
+      <w:r>
+        <w:rPr>
+          <w:rFonts w:hint="eastAsia"/>
+          <w:b/>
+          <w:bCs/>
+          <w:i/>
+          <w:iCs/>
+          <w:lang w:eastAsia="ko-KR"/>
+        </w:rPr>
+        <w:t xml:space="preserve">, </w:t>
       </w:r>
       <w:r>
         <w:rPr>
@@ -8604,7 +8637,29 @@
           <w:iCs/>
           <w:lang w:eastAsia="ko-KR"/>
         </w:rPr>
-        <w:t>3.1</w:t>
+        <w:t>4</w:t>
+      </w:r>
+      <w:r>
+        <w:rPr>
+          <w:rFonts w:hint="eastAsia"/>
+          <w:b/>
+          <w:bCs/>
+          <w:i/>
+          <w:iCs/>
+          <w:lang w:eastAsia="ko-KR"/>
+        </w:rPr>
+        <w:t>.</w:t>
+      </w:r>
+      <w:r>
+        <w:rPr>
+          <w:rFonts w:hint="eastAsia"/>
+          <w:b/>
+          <w:bCs/>
+          <w:i/>
+          <w:iCs/>
+          <w:lang w:eastAsia="ko-KR"/>
+        </w:rPr>
+        <w:t>0</w:t>
       </w:r>
       <w:r>
         <w:rPr>
@@ -8832,7 +8887,40 @@
           <w:iCs/>
           <w:lang w:eastAsia="ko-KR"/>
         </w:rPr>
-        <w:t xml:space="preserve">1.8, </w:t>
+        <w:t>2</w:t>
+      </w:r>
+      <w:r>
+        <w:rPr>
+          <w:rFonts w:hint="eastAsia"/>
+          <w:b/>
+          <w:bCs/>
+          <w:i/>
+          <w:iCs/>
+          <w:lang w:eastAsia="ko-KR"/>
+        </w:rPr>
+        <w:t>.</w:t>
+      </w:r>
+      <w:r>
+        <w:rPr>
+          <w:rFonts w:hint="eastAsia"/>
+          <w:b/>
+          <w:bCs/>
+          <w:i/>
+          <w:iCs/>
+          <w:lang w:eastAsia="ko-KR"/>
+        </w:rPr>
+        <w:t>2</w:t>
+      </w:r>
+      <w:r>
+        <w:rPr>
+          <w:rFonts w:hint="eastAsia"/>
+          <w:b/>
+          <w:bCs/>
+          <w:i/>
+          <w:iCs/>
+          <w:lang w:eastAsia="ko-KR"/>
+        </w:rPr>
+        <w:t xml:space="preserve">, </w:t>
       </w:r>
       <w:r>
         <w:rPr>
@@ -8872,7 +8960,29 @@
           <w:iCs/>
           <w:lang w:eastAsia="ko-KR"/>
         </w:rPr>
-        <w:t>2.7</w:t>
+        <w:t>3</w:t>
+      </w:r>
+      <w:r>
+        <w:rPr>
+          <w:rFonts w:hint="eastAsia"/>
+          <w:b/>
+          <w:bCs/>
+          <w:i/>
+          <w:iCs/>
+          <w:lang w:eastAsia="ko-KR"/>
+        </w:rPr>
+        <w:t>.</w:t>
+      </w:r>
+      <w:r>
+        <w:rPr>
+          <w:rFonts w:hint="eastAsia"/>
+          <w:b/>
+          <w:bCs/>
+          <w:i/>
+          <w:iCs/>
+          <w:lang w:eastAsia="ko-KR"/>
+        </w:rPr>
+        <w:t>2</w:t>
       </w:r>
       <w:r>
         <w:rPr>
@@ -9143,7 +9253,40 @@
           <w:iCs/>
           <w:lang w:eastAsia="ko-KR"/>
         </w:rPr>
-        <w:t xml:space="preserve">8.8, </w:t>
+        <w:t>11</w:t>
+      </w:r>
+      <w:r>
+        <w:rPr>
+          <w:rFonts w:hint="eastAsia"/>
+          <w:b/>
+          <w:bCs/>
+          <w:i/>
+          <w:iCs/>
+          <w:lang w:eastAsia="ko-KR"/>
+        </w:rPr>
+        <w:t>.</w:t>
+      </w:r>
+      <w:r>
+        <w:rPr>
+          <w:rFonts w:hint="eastAsia"/>
+          <w:b/>
+          <w:bCs/>
+          <w:i/>
+          <w:iCs/>
+          <w:lang w:eastAsia="ko-KR"/>
+        </w:rPr>
+        <w:t>9</w:t>
+      </w:r>
+      <w:r>
+        <w:rPr>
+          <w:rFonts w:hint="eastAsia"/>
+          <w:b/>
+          <w:bCs/>
+          <w:i/>
+          <w:iCs/>
+          <w:lang w:eastAsia="ko-KR"/>
+        </w:rPr>
+        <w:t xml:space="preserve">, </w:t>
       </w:r>
       <w:r>
         <w:rPr>
@@ -9183,7 +9326,40 @@
           <w:iCs/>
           <w:lang w:eastAsia="ko-KR"/>
         </w:rPr>
-        <w:t>14.2</w:t>
+        <w:t>1</w:t>
+      </w:r>
+      <w:r>
+        <w:rPr>
+          <w:rFonts w:hint="eastAsia"/>
+          <w:b/>
+          <w:bCs/>
+          <w:i/>
+          <w:iCs/>
+          <w:lang w:eastAsia="ko-KR"/>
+        </w:rPr>
+        <w:t>6</w:t>
+      </w:r>
+      <w:r>
+        <w:rPr>
+          <w:rFonts w:hint="eastAsia"/>
+          <w:b/>
+          <w:bCs/>
+          <w:i/>
+          <w:iCs/>
+          <w:lang w:eastAsia="ko-KR"/>
+        </w:rPr>
+        <w:t>.</w:t>
+      </w:r>
+      <w:r>
+        <w:rPr>
+          <w:rFonts w:hint="eastAsia"/>
+          <w:b/>
+          <w:bCs/>
+          <w:i/>
+          <w:iCs/>
+          <w:lang w:eastAsia="ko-KR"/>
+        </w:rPr>
+        <w:t>4</w:t>
       </w:r>
       <w:r>
         <w:rPr>
@@ -9464,18 +9640,29 @@
           <w:i/>
           <w:iCs/>
         </w:rPr>
-        <w:t xml:space="preserve">, IF = </w:t>
-      </w:r>
-      <w:r>
-        <w:rPr>
-          <w:rFonts w:hint="eastAsia"/>
-          <w:b/>
-          <w:bCs/>
-          <w:i/>
-          <w:iCs/>
-          <w:lang w:eastAsia="ko-KR"/>
-        </w:rPr>
-        <w:t xml:space="preserve">5.3, </w:t>
+        <w:t>, IF =</w:t>
+      </w:r>
+      <w:r>
+        <w:rPr>
+          <w:rFonts w:hint="eastAsia"/>
+          <w:b/>
+          <w:bCs/>
+          <w:i/>
+          <w:iCs/>
+          <w:lang w:eastAsia="ko-KR"/>
+        </w:rPr>
+        <w:t>6.7</w:t>
+      </w:r>
+      <w:r>
+        <w:rPr>
+          <w:rFonts w:hint="eastAsia"/>
+          <w:b/>
+          <w:bCs/>
+          <w:i/>
+          <w:iCs/>
+          <w:lang w:eastAsia="ko-KR"/>
+        </w:rPr>
+        <w:t xml:space="preserve">, </w:t>
       </w:r>
       <w:r>
         <w:rPr>
@@ -9515,7 +9702,29 @@
           <w:iCs/>
           <w:lang w:eastAsia="ko-KR"/>
         </w:rPr>
-        <w:t>6.2</w:t>
+        <w:t>7</w:t>
+      </w:r>
+      <w:r>
+        <w:rPr>
+          <w:rFonts w:hint="eastAsia"/>
+          <w:b/>
+          <w:bCs/>
+          <w:i/>
+          <w:iCs/>
+          <w:lang w:eastAsia="ko-KR"/>
+        </w:rPr>
+        <w:t>.</w:t>
+      </w:r>
+      <w:r>
+        <w:rPr>
+          <w:rFonts w:hint="eastAsia"/>
+          <w:b/>
+          <w:bCs/>
+          <w:i/>
+          <w:iCs/>
+          <w:lang w:eastAsia="ko-KR"/>
+        </w:rPr>
+        <w:t>1</w:t>
       </w:r>
       <w:r>
         <w:rPr>
@@ -9757,7 +9966,40 @@
           <w:iCs/>
           <w:lang w:eastAsia="ko-KR"/>
         </w:rPr>
-        <w:t xml:space="preserve">1.9, </w:t>
+        <w:t>2</w:t>
+      </w:r>
+      <w:r>
+        <w:rPr>
+          <w:rFonts w:hint="eastAsia"/>
+          <w:b/>
+          <w:bCs/>
+          <w:i/>
+          <w:iCs/>
+          <w:lang w:eastAsia="ko-KR"/>
+        </w:rPr>
+        <w:t>.</w:t>
+      </w:r>
+      <w:r>
+        <w:rPr>
+          <w:rFonts w:hint="eastAsia"/>
+          <w:b/>
+          <w:bCs/>
+          <w:i/>
+          <w:iCs/>
+          <w:lang w:eastAsia="ko-KR"/>
+        </w:rPr>
+        <w:t>3</w:t>
+      </w:r>
+      <w:r>
+        <w:rPr>
+          <w:rFonts w:hint="eastAsia"/>
+          <w:b/>
+          <w:bCs/>
+          <w:i/>
+          <w:iCs/>
+          <w:lang w:eastAsia="ko-KR"/>
+        </w:rPr>
+        <w:t xml:space="preserve">, </w:t>
       </w:r>
       <w:r>
         <w:rPr>
@@ -9797,7 +10039,18 @@
           <w:iCs/>
           <w:lang w:eastAsia="ko-KR"/>
         </w:rPr>
-        <w:t>2.1</w:t>
+        <w:t>2.</w:t>
+      </w:r>
+      <w:r>
+        <w:rPr>
+          <w:rFonts w:hint="eastAsia"/>
+          <w:b/>
+          <w:bCs/>
+          <w:i/>
+          <w:iCs/>
+          <w:lang w:eastAsia="ko-KR"/>
+        </w:rPr>
+        <w:t>5</w:t>
       </w:r>
       <w:r>
         <w:rPr>
@@ -10034,18 +10287,18 @@
           <w:i/>
           <w:iCs/>
         </w:rPr>
-        <w:t xml:space="preserve">, IF = </w:t>
-      </w:r>
-      <w:r>
-        <w:rPr>
-          <w:rFonts w:hint="eastAsia"/>
-          <w:b/>
-          <w:bCs/>
-          <w:i/>
-          <w:iCs/>
-          <w:lang w:eastAsia="ko-KR"/>
-        </w:rPr>
-        <w:t xml:space="preserve">5.3, </w:t>
+        <w:t>, IF =</w:t>
+      </w:r>
+      <w:r>
+        <w:rPr>
+          <w:rFonts w:hint="eastAsia"/>
+          <w:b/>
+          <w:bCs/>
+          <w:i/>
+          <w:iCs/>
+          <w:lang w:eastAsia="ko-KR"/>
+        </w:rPr>
+        <w:t xml:space="preserve">6.7, </w:t>
       </w:r>
       <w:r>
         <w:rPr>
@@ -10085,7 +10338,7 @@
           <w:iCs/>
           <w:lang w:eastAsia="ko-KR"/>
         </w:rPr>
-        <w:t>6.2</w:t>
+        <w:t>7.1</w:t>
       </w:r>
       <w:r>
         <w:rPr>
@@ -10604,7 +10857,67 @@
           <w:iCs/>
           <w:lang w:eastAsia="ko-KR"/>
         </w:rPr>
-        <w:t>, Q1</w:t>
+        <w:t xml:space="preserve">, </w:t>
+      </w:r>
+      <w:r>
+        <w:rPr>
+          <w:b/>
+          <w:bCs/>
+          <w:i/>
+          <w:iCs/>
+        </w:rPr>
+        <w:t>IF =</w:t>
+      </w:r>
+      <w:r>
+        <w:rPr>
+          <w:rFonts w:hint="eastAsia"/>
+          <w:b/>
+          <w:bCs/>
+          <w:i/>
+          <w:iCs/>
+          <w:lang w:eastAsia="ko-KR"/>
+        </w:rPr>
+        <w:t xml:space="preserve">5.9, </w:t>
+      </w:r>
+      <w:r>
+        <w:rPr>
+          <w:b/>
+          <w:bCs/>
+          <w:i/>
+          <w:iCs/>
+        </w:rPr>
+        <w:t>IF</w:t>
+      </w:r>
+      <w:r>
+        <w:rPr>
+          <w:rFonts w:hint="eastAsia"/>
+          <w:b/>
+          <w:bCs/>
+          <w:i/>
+          <w:iCs/>
+          <w:lang w:eastAsia="ko-KR"/>
+        </w:rPr>
+        <w:t>5</w:t>
+      </w:r>
+      <w:r>
+        <w:rPr>
+          <w:b/>
+          <w:bCs/>
+          <w:i/>
+          <w:iCs/>
+        </w:rPr>
+        <w:t xml:space="preserve"> = </w:t>
+      </w:r>
+      <w:r>
+        <w:rPr>
+          <w:rFonts w:hint="eastAsia"/>
+          <w:b/>
+          <w:bCs/>
+          <w:i/>
+          <w:iCs/>
+          <w:lang w:eastAsia="ko-KR"/>
+        </w:rPr>
+        <w:t>5.8</w:t>
       </w:r>
       <w:r>
         <w:rPr>
@@ -10934,18 +11247,62 @@
           <w:iCs/>
           <w:lang w:eastAsia="ko-KR"/>
         </w:rPr>
-        <w:t>IF = 10.6</w:t>
-      </w:r>
-      <w:r>
-        <w:rPr>
-          <w:rFonts w:hint="eastAsia"/>
-          <w:b/>
-          <w:bCs/>
-          <w:i/>
-          <w:iCs/>
-          <w:lang w:eastAsia="ko-KR"/>
-        </w:rPr>
-        <w:t>, IF5 = 14.9</w:t>
+        <w:t>IF = 10.</w:t>
+      </w:r>
+      <w:r>
+        <w:rPr>
+          <w:rFonts w:hint="eastAsia"/>
+          <w:b/>
+          <w:bCs/>
+          <w:i/>
+          <w:iCs/>
+          <w:lang w:eastAsia="ko-KR"/>
+        </w:rPr>
+        <w:t>3</w:t>
+      </w:r>
+      <w:r>
+        <w:rPr>
+          <w:rFonts w:hint="eastAsia"/>
+          <w:b/>
+          <w:bCs/>
+          <w:i/>
+          <w:iCs/>
+          <w:lang w:eastAsia="ko-KR"/>
+        </w:rPr>
+        <w:t>, IF5 = 1</w:t>
+      </w:r>
+      <w:r>
+        <w:rPr>
+          <w:rFonts w:hint="eastAsia"/>
+          <w:b/>
+          <w:bCs/>
+          <w:i/>
+          <w:iCs/>
+          <w:lang w:eastAsia="ko-KR"/>
+        </w:rPr>
+        <w:t>6</w:t>
+      </w:r>
+      <w:r>
+        <w:rPr>
+          <w:rFonts w:hint="eastAsia"/>
+          <w:b/>
+          <w:bCs/>
+          <w:i/>
+          <w:iCs/>
+          <w:lang w:eastAsia="ko-KR"/>
+        </w:rPr>
+        <w:t>.</w:t>
+      </w:r>
+      <w:r>
+        <w:rPr>
+          <w:rFonts w:hint="eastAsia"/>
+          <w:b/>
+          <w:bCs/>
+          <w:i/>
+          <w:iCs/>
+          <w:lang w:eastAsia="ko-KR"/>
+        </w:rPr>
+        <w:t>7</w:t>
       </w:r>
       <w:r>
         <w:rPr>
@@ -11222,15 +11579,6 @@
       <w:r>
         <w:rPr>
           <w:rFonts w:hint="eastAsia"/>
-          <w:i/>
-          <w:iCs/>
-          <w:lang w:eastAsia="ko-KR"/>
-        </w:rPr>
-        <w:t xml:space="preserve"> </w:t>
-      </w:r>
-      <w:r>
-        <w:rPr>
-          <w:rFonts w:hint="eastAsia"/>
           <w:b/>
           <w:i/>
           <w:iCs/>
@@ -11277,7 +11625,84 @@
           <w:iCs/>
           <w:lang w:eastAsia="ko-KR"/>
         </w:rPr>
-        <w:t>IF = 3.9, IF5 = 4.9</w:t>
+        <w:t xml:space="preserve">IF = </w:t>
+      </w:r>
+      <w:r>
+        <w:rPr>
+          <w:rFonts w:hint="eastAsia"/>
+          <w:b/>
+          <w:bCs/>
+          <w:i/>
+          <w:iCs/>
+          <w:lang w:eastAsia="ko-KR"/>
+        </w:rPr>
+        <w:t>4</w:t>
+      </w:r>
+      <w:r>
+        <w:rPr>
+          <w:rFonts w:hint="eastAsia"/>
+          <w:b/>
+          <w:bCs/>
+          <w:i/>
+          <w:iCs/>
+          <w:lang w:eastAsia="ko-KR"/>
+        </w:rPr>
+        <w:t>.</w:t>
+      </w:r>
+      <w:r>
+        <w:rPr>
+          <w:rFonts w:hint="eastAsia"/>
+          <w:b/>
+          <w:bCs/>
+          <w:i/>
+          <w:iCs/>
+          <w:lang w:eastAsia="ko-KR"/>
+        </w:rPr>
+        <w:t>3</w:t>
+      </w:r>
+      <w:r>
+        <w:rPr>
+          <w:rFonts w:hint="eastAsia"/>
+          <w:b/>
+          <w:bCs/>
+          <w:i/>
+          <w:iCs/>
+          <w:lang w:eastAsia="ko-KR"/>
+        </w:rPr>
+        <w:t xml:space="preserve">, IF5 = </w:t>
+      </w:r>
+      <w:r>
+        <w:rPr>
+          <w:rFonts w:hint="eastAsia"/>
+          <w:b/>
+          <w:bCs/>
+          <w:i/>
+          <w:iCs/>
+          <w:lang w:eastAsia="ko-KR"/>
+        </w:rPr>
+        <w:t>5</w:t>
+      </w:r>
+      <w:r>
+        <w:rPr>
+          <w:rFonts w:hint="eastAsia"/>
+          <w:b/>
+          <w:bCs/>
+          <w:i/>
+          <w:iCs/>
+          <w:lang w:eastAsia="ko-KR"/>
+        </w:rPr>
+        <w:t>.</w:t>
+      </w:r>
+      <w:r>
+        <w:rPr>
+          <w:rFonts w:hint="eastAsia"/>
+          <w:b/>
+          <w:bCs/>
+          <w:i/>
+          <w:iCs/>
+          <w:lang w:eastAsia="ko-KR"/>
+        </w:rPr>
+        <w:t>5</w:t>
       </w:r>
       <w:r>
         <w:rPr>
@@ -11646,7 +12071,62 @@
           <w:iCs/>
           <w:lang w:eastAsia="ko-KR"/>
         </w:rPr>
-        <w:t>IF = 2.2, IF5 = 2.6</w:t>
+        <w:t>IF = 2.</w:t>
+      </w:r>
+      <w:r>
+        <w:rPr>
+          <w:rFonts w:hint="eastAsia"/>
+          <w:b/>
+          <w:bCs/>
+          <w:i/>
+          <w:iCs/>
+          <w:lang w:eastAsia="ko-KR"/>
+        </w:rPr>
+        <w:t>7</w:t>
+      </w:r>
+      <w:r>
+        <w:rPr>
+          <w:rFonts w:hint="eastAsia"/>
+          <w:b/>
+          <w:bCs/>
+          <w:i/>
+          <w:iCs/>
+          <w:lang w:eastAsia="ko-KR"/>
+        </w:rPr>
+        <w:t xml:space="preserve">, IF5 = </w:t>
+      </w:r>
+      <w:r>
+        <w:rPr>
+          <w:rFonts w:hint="eastAsia"/>
+          <w:b/>
+          <w:bCs/>
+          <w:i/>
+          <w:iCs/>
+          <w:lang w:eastAsia="ko-KR"/>
+        </w:rPr>
+        <w:t>3</w:t>
+      </w:r>
+      <w:r>
+        <w:rPr>
+          <w:rFonts w:hint="eastAsia"/>
+          <w:b/>
+          <w:bCs/>
+          <w:i/>
+          <w:iCs/>
+          <w:lang w:eastAsia="ko-KR"/>
+        </w:rPr>
+        <w:t>.</w:t>
+      </w:r>
+      <w:r>
+        <w:rPr>
+          <w:rFonts w:hint="eastAsia"/>
+          <w:b/>
+          <w:bCs/>
+          <w:i/>
+          <w:iCs/>
+          <w:lang w:eastAsia="ko-KR"/>
+        </w:rPr>
+        <w:t>0</w:t>
       </w:r>
       <w:r>
         <w:rPr>
@@ -12046,18 +12526,18 @@
           <w:iCs/>
           <w:lang w:eastAsia="ko-KR"/>
         </w:rPr>
-        <w:t xml:space="preserve">IF = 2.6, IF5 = </w:t>
-      </w:r>
-      <w:r>
-        <w:rPr>
-          <w:rFonts w:hint="eastAsia"/>
-          <w:b/>
-          <w:bCs/>
-          <w:i/>
-          <w:iCs/>
-          <w:lang w:eastAsia="ko-KR"/>
-        </w:rPr>
-        <w:t>2</w:t>
+        <w:t xml:space="preserve">IF = </w:t>
+      </w:r>
+      <w:r>
+        <w:rPr>
+          <w:rFonts w:hint="eastAsia"/>
+          <w:b/>
+          <w:bCs/>
+          <w:i/>
+          <w:iCs/>
+          <w:lang w:eastAsia="ko-KR"/>
+        </w:rPr>
+        <w:t>3</w:t>
       </w:r>
       <w:r>
         <w:rPr>
@@ -12079,7 +12559,51 @@
           <w:iCs/>
           <w:lang w:eastAsia="ko-KR"/>
         </w:rPr>
-        <w:t>7</w:t>
+        <w:t>5</w:t>
+      </w:r>
+      <w:r>
+        <w:rPr>
+          <w:rFonts w:hint="eastAsia"/>
+          <w:b/>
+          <w:bCs/>
+          <w:i/>
+          <w:iCs/>
+          <w:lang w:eastAsia="ko-KR"/>
+        </w:rPr>
+        <w:t xml:space="preserve">, IF5 = </w:t>
+      </w:r>
+      <w:r>
+        <w:rPr>
+          <w:rFonts w:hint="eastAsia"/>
+          <w:b/>
+          <w:bCs/>
+          <w:i/>
+          <w:iCs/>
+          <w:lang w:eastAsia="ko-KR"/>
+        </w:rPr>
+        <w:t>3</w:t>
+      </w:r>
+      <w:r>
+        <w:rPr>
+          <w:rFonts w:hint="eastAsia"/>
+          <w:b/>
+          <w:bCs/>
+          <w:i/>
+          <w:iCs/>
+          <w:lang w:eastAsia="ko-KR"/>
+        </w:rPr>
+        <w:t>.</w:t>
+      </w:r>
+      <w:r>
+        <w:rPr>
+          <w:rFonts w:hint="eastAsia"/>
+          <w:b/>
+          <w:bCs/>
+          <w:i/>
+          <w:iCs/>
+          <w:lang w:eastAsia="ko-KR"/>
+        </w:rPr>
+        <w:t>3</w:t>
       </w:r>
       <w:r>
         <w:rPr>
@@ -12371,7 +12895,27 @@
           <w:iCs/>
           <w:lang w:eastAsia="ko-KR"/>
         </w:rPr>
-        <w:t>Innovation in Education and Teaching International</w:t>
+        <w:t>Innovation</w:t>
+      </w:r>
+      <w:r>
+        <w:rPr>
+          <w:rFonts w:hint="eastAsia"/>
+          <w:bCs/>
+          <w:i/>
+          <w:iCs/>
+          <w:lang w:eastAsia="ko-KR"/>
+        </w:rPr>
+        <w:t>s</w:t>
+      </w:r>
+      <w:r>
+        <w:rPr>
+          <w:rFonts w:hint="eastAsia"/>
+          <w:bCs/>
+          <w:i/>
+          <w:iCs/>
+          <w:lang w:eastAsia="ko-KR"/>
+        </w:rPr>
+        <w:t xml:space="preserve"> in Education and Teaching International</w:t>
       </w:r>
       <w:r>
         <w:rPr>
@@ -12472,7 +13016,84 @@
           <w:iCs/>
           <w:lang w:eastAsia="ko-KR"/>
         </w:rPr>
-        <w:t>; IF = 4.9, IF5 = 3.5</w:t>
+        <w:t xml:space="preserve">; IF = </w:t>
+      </w:r>
+      <w:r>
+        <w:rPr>
+          <w:rFonts w:hint="eastAsia"/>
+          <w:b/>
+          <w:bCs/>
+          <w:i/>
+          <w:iCs/>
+          <w:lang w:eastAsia="ko-KR"/>
+        </w:rPr>
+        <w:t>6</w:t>
+      </w:r>
+      <w:r>
+        <w:rPr>
+          <w:rFonts w:hint="eastAsia"/>
+          <w:b/>
+          <w:bCs/>
+          <w:i/>
+          <w:iCs/>
+          <w:lang w:eastAsia="ko-KR"/>
+        </w:rPr>
+        <w:t>.</w:t>
+      </w:r>
+      <w:r>
+        <w:rPr>
+          <w:rFonts w:hint="eastAsia"/>
+          <w:b/>
+          <w:bCs/>
+          <w:i/>
+          <w:iCs/>
+          <w:lang w:eastAsia="ko-KR"/>
+        </w:rPr>
+        <w:t>2</w:t>
+      </w:r>
+      <w:r>
+        <w:rPr>
+          <w:rFonts w:hint="eastAsia"/>
+          <w:b/>
+          <w:bCs/>
+          <w:i/>
+          <w:iCs/>
+          <w:lang w:eastAsia="ko-KR"/>
+        </w:rPr>
+        <w:t xml:space="preserve">, IF5 = </w:t>
+      </w:r>
+      <w:r>
+        <w:rPr>
+          <w:rFonts w:hint="eastAsia"/>
+          <w:b/>
+          <w:bCs/>
+          <w:i/>
+          <w:iCs/>
+          <w:lang w:eastAsia="ko-KR"/>
+        </w:rPr>
+        <w:t>4</w:t>
+      </w:r>
+      <w:r>
+        <w:rPr>
+          <w:rFonts w:hint="eastAsia"/>
+          <w:b/>
+          <w:bCs/>
+          <w:i/>
+          <w:iCs/>
+          <w:lang w:eastAsia="ko-KR"/>
+        </w:rPr>
+        <w:t>.</w:t>
+      </w:r>
+      <w:r>
+        <w:rPr>
+          <w:rFonts w:hint="eastAsia"/>
+          <w:b/>
+          <w:bCs/>
+          <w:i/>
+          <w:iCs/>
+          <w:lang w:eastAsia="ko-KR"/>
+        </w:rPr>
+        <w:t>2</w:t>
       </w:r>
       <w:r>
         <w:rPr>
@@ -12699,11 +13320,10 @@
       </w:r>
       <w:r>
         <w:rPr>
-          <w:rFonts w:hint="eastAsia"/>
-          <w:b/>
-          <w:i/>
-          <w:iCs/>
-          <w:lang w:eastAsia="ko-KR"/>
+          <w:b/>
+          <w:bCs/>
+          <w:i/>
+          <w:iCs/>
         </w:rPr>
         <w:t>[</w:t>
       </w:r>
@@ -12735,17 +13355,76 @@
           <w:iCs/>
           <w:lang w:eastAsia="ko-KR"/>
         </w:rPr>
+        <w:t xml:space="preserve">, </w:t>
+      </w:r>
+      <w:r>
+        <w:rPr>
+          <w:b/>
+          <w:bCs/>
+          <w:i/>
+          <w:iCs/>
+        </w:rPr>
+        <w:t>IF =</w:t>
+      </w:r>
+      <w:r>
+        <w:rPr>
+          <w:rFonts w:hint="eastAsia"/>
+          <w:b/>
+          <w:bCs/>
+          <w:i/>
+          <w:iCs/>
+          <w:lang w:eastAsia="ko-KR"/>
+        </w:rPr>
+        <w:t xml:space="preserve">5.9, </w:t>
+      </w:r>
+      <w:r>
+        <w:rPr>
+          <w:b/>
+          <w:bCs/>
+          <w:i/>
+          <w:iCs/>
+        </w:rPr>
+        <w:t>IF</w:t>
+      </w:r>
+      <w:r>
+        <w:rPr>
+          <w:rFonts w:hint="eastAsia"/>
+          <w:b/>
+          <w:bCs/>
+          <w:i/>
+          <w:iCs/>
+          <w:lang w:eastAsia="ko-KR"/>
+        </w:rPr>
+        <w:t>5</w:t>
+      </w:r>
+      <w:r>
+        <w:rPr>
+          <w:b/>
+          <w:bCs/>
+          <w:i/>
+          <w:iCs/>
+        </w:rPr>
+        <w:t xml:space="preserve"> = </w:t>
+      </w:r>
+      <w:r>
+        <w:rPr>
+          <w:rFonts w:hint="eastAsia"/>
+          <w:b/>
+          <w:bCs/>
+          <w:i/>
+          <w:iCs/>
+          <w:lang w:eastAsia="ko-KR"/>
+        </w:rPr>
+        <w:t>5.8</w:t>
+      </w:r>
+      <w:r>
+        <w:rPr>
+          <w:b/>
+          <w:bCs/>
+          <w:i/>
+          <w:iCs/>
+        </w:rPr>
         <w:t>]</w:t>
-      </w:r>
-      <w:r>
-        <w:rPr>
-          <w:rFonts w:hint="eastAsia"/>
-          <w:b/>
-          <w:i/>
-          <w:iCs/>
-          <w:lang w:eastAsia="ko-KR"/>
-        </w:rPr>
-        <w:t xml:space="preserve"> </w:t>
       </w:r>
     </w:p>
     <w:p>
@@ -13144,7 +13823,18 @@
           <w:iCs/>
           <w:lang w:eastAsia="ko-KR"/>
         </w:rPr>
-        <w:t>10</w:t>
+        <w:t>1</w:t>
+      </w:r>
+      <w:r>
+        <w:rPr>
+          <w:rFonts w:hint="eastAsia"/>
+          <w:b/>
+          <w:bCs/>
+          <w:i/>
+          <w:iCs/>
+          <w:lang w:eastAsia="ko-KR"/>
+        </w:rPr>
+        <w:t>3</w:t>
       </w:r>
       <w:r>
         <w:rPr>
@@ -13166,7 +13856,7 @@
           <w:iCs/>
           <w:lang w:eastAsia="ko-KR"/>
         </w:rPr>
-        <w:t>5</w:t>
+        <w:t>2</w:t>
       </w:r>
       <w:r>
         <w:rPr>
@@ -13188,7 +13878,7 @@
           <w:iCs/>
           <w:lang w:eastAsia="ko-KR"/>
         </w:rPr>
-        <w:t>3</w:t>
+        <w:t>4</w:t>
       </w:r>
       <w:r>
         <w:rPr>
@@ -13210,7 +13900,7 @@
           <w:iCs/>
           <w:lang w:eastAsia="ko-KR"/>
         </w:rPr>
-        <w:t>0</w:t>
+        <w:t>6</w:t>
       </w:r>
       <w:r>
         <w:rPr>
@@ -13352,7 +14042,7 @@
           <w:iCs/>
           <w:lang w:eastAsia="ko-KR"/>
         </w:rPr>
-        <w:t>[ESCI-indexed; IF = 2.</w:t>
+        <w:t xml:space="preserve">[ESCI-indexed; IF = </w:t>
       </w:r>
       <w:r>
         <w:rPr>
@@ -13373,6 +14063,27 @@
           <w:iCs/>
           <w:lang w:eastAsia="ko-KR"/>
         </w:rPr>
+        <w:t>.</w:t>
+      </w:r>
+      <w:r>
+        <w:rPr>
+          <w:rFonts w:hint="eastAsia"/>
+          <w:b/>
+          <w:bCs/>
+          <w:i/>
+          <w:iCs/>
+          <w:lang w:eastAsia="ko-KR"/>
+        </w:rPr>
+        <w:t>1</w:t>
+      </w:r>
+      <w:r>
+        <w:rPr>
+          <w:b/>
+          <w:bCs/>
+          <w:i/>
+          <w:iCs/>
+          <w:lang w:eastAsia="ko-KR"/>
+        </w:rPr>
         <w:t xml:space="preserve">, IF5 = </w:t>
       </w:r>
       <w:r>
@@ -13405,7 +14116,7 @@
           <w:iCs/>
           <w:lang w:eastAsia="ko-KR"/>
         </w:rPr>
-        <w:t>7</w:t>
+        <w:t>2</w:t>
       </w:r>
       <w:r>
         <w:rPr>
@@ -13789,7 +14500,7 @@
           <w:iCs/>
           <w:lang w:eastAsia="ko-KR"/>
         </w:rPr>
-        <w:t>4</w:t>
+        <w:t>3</w:t>
       </w:r>
       <w:r>
         <w:rPr>
@@ -13853,7 +14564,7 @@
           <w:iCs/>
           <w:lang w:eastAsia="ko-KR"/>
         </w:rPr>
-        <w:t>7</w:t>
+        <w:t>8</w:t>
       </w:r>
       <w:r>
         <w:rPr>
@@ -14041,18 +14752,29 @@
           <w:iCs/>
           <w:lang w:eastAsia="ko-KR"/>
         </w:rPr>
-        <w:t>3.</w:t>
-      </w:r>
-      <w:r>
-        <w:rPr>
-          <w:rFonts w:hint="eastAsia"/>
-          <w:b/>
-          <w:bCs/>
-          <w:i/>
-          <w:iCs/>
-          <w:lang w:eastAsia="ko-KR"/>
-        </w:rPr>
-        <w:t>5</w:t>
+        <w:t>4</w:t>
+      </w:r>
+      <w:r>
+        <w:rPr>
+          <w:rFonts w:hint="eastAsia"/>
+          <w:b/>
+          <w:bCs/>
+          <w:i/>
+          <w:iCs/>
+          <w:lang w:eastAsia="ko-KR"/>
+        </w:rPr>
+        <w:t>.</w:t>
+      </w:r>
+      <w:r>
+        <w:rPr>
+          <w:rFonts w:hint="eastAsia"/>
+          <w:b/>
+          <w:bCs/>
+          <w:i/>
+          <w:iCs/>
+          <w:lang w:eastAsia="ko-KR"/>
+        </w:rPr>
+        <w:t>2</w:t>
       </w:r>
       <w:r>
         <w:rPr>
@@ -14095,7 +14817,7 @@
           <w:iCs/>
           <w:lang w:eastAsia="ko-KR"/>
         </w:rPr>
-        <w:t>2</w:t>
+        <w:t>7</w:t>
       </w:r>
       <w:r>
         <w:rPr>
@@ -14579,7 +15301,7 @@
           <w:iCs/>
           <w:lang w:eastAsia="ko-KR"/>
         </w:rPr>
-        <w:t>3.5</w:t>
+        <w:t>4.2</w:t>
       </w:r>
       <w:r>
         <w:rPr>
@@ -14600,7 +15322,7 @@
           <w:iCs/>
           <w:lang w:eastAsia="ko-KR"/>
         </w:rPr>
-        <w:t>4.2</w:t>
+        <w:t>4.7</w:t>
       </w:r>
       <w:r>
         <w:rPr>
@@ -14748,29 +15470,7 @@
           <w:iCs/>
           <w:lang w:eastAsia="ko-KR"/>
         </w:rPr>
-        <w:t>16</w:t>
-      </w:r>
-      <w:r>
-        <w:rPr>
-          <w:rFonts w:hint="eastAsia"/>
-          <w:b/>
-          <w:bCs/>
-          <w:i/>
-          <w:iCs/>
-          <w:lang w:eastAsia="ko-KR"/>
-        </w:rPr>
-        <w:t>.</w:t>
-      </w:r>
-      <w:r>
-        <w:rPr>
-          <w:rFonts w:hint="eastAsia"/>
-          <w:b/>
-          <w:bCs/>
-          <w:i/>
-          <w:iCs/>
-          <w:lang w:eastAsia="ko-KR"/>
-        </w:rPr>
-        <w:t>7</w:t>
+        <w:t>38.7</w:t>
       </w:r>
       <w:r>
         <w:rPr>
@@ -14791,29 +15491,7 @@
           <w:iCs/>
           <w:lang w:eastAsia="ko-KR"/>
         </w:rPr>
-        <w:t>15</w:t>
-      </w:r>
-      <w:r>
-        <w:rPr>
-          <w:rFonts w:hint="eastAsia"/>
-          <w:b/>
-          <w:bCs/>
-          <w:i/>
-          <w:iCs/>
-          <w:lang w:eastAsia="ko-KR"/>
-        </w:rPr>
-        <w:t>.</w:t>
-      </w:r>
-      <w:r>
-        <w:rPr>
-          <w:rFonts w:hint="eastAsia"/>
-          <w:b/>
-          <w:bCs/>
-          <w:i/>
-          <w:iCs/>
-          <w:lang w:eastAsia="ko-KR"/>
-        </w:rPr>
-        <w:t>5</w:t>
+        <w:t>24.5</w:t>
       </w:r>
       <w:r>
         <w:rPr>
@@ -14994,7 +15672,7 @@
           <w:iCs/>
           <w:lang w:eastAsia="ko-KR"/>
         </w:rPr>
-        <w:t>4</w:t>
+        <w:t>5</w:t>
       </w:r>
       <w:r>
         <w:rPr>
@@ -15015,28 +15693,39 @@
           <w:iCs/>
           <w:lang w:eastAsia="ko-KR"/>
         </w:rPr>
+        <w:t>7</w:t>
+      </w:r>
+      <w:r>
+        <w:rPr>
+          <w:b/>
+          <w:bCs/>
+          <w:i/>
+          <w:iCs/>
+          <w:lang w:eastAsia="ko-KR"/>
+        </w:rPr>
+        <w:t xml:space="preserve">, IF5 = </w:t>
+      </w:r>
+      <w:r>
+        <w:rPr>
+          <w:rFonts w:hint="eastAsia"/>
+          <w:b/>
+          <w:bCs/>
+          <w:i/>
+          <w:iCs/>
+          <w:lang w:eastAsia="ko-KR"/>
+        </w:rPr>
         <w:t>6</w:t>
       </w:r>
       <w:r>
         <w:rPr>
-          <w:b/>
-          <w:bCs/>
-          <w:i/>
-          <w:iCs/>
-          <w:lang w:eastAsia="ko-KR"/>
-        </w:rPr>
-        <w:t xml:space="preserve">, IF5 = </w:t>
-      </w:r>
-      <w:r>
-        <w:rPr>
-          <w:rFonts w:hint="eastAsia"/>
-          <w:b/>
-          <w:bCs/>
-          <w:i/>
-          <w:iCs/>
-          <w:lang w:eastAsia="ko-KR"/>
-        </w:rPr>
-        <w:t>5.</w:t>
+          <w:rFonts w:hint="eastAsia"/>
+          <w:b/>
+          <w:bCs/>
+          <w:i/>
+          <w:iCs/>
+          <w:lang w:eastAsia="ko-KR"/>
+        </w:rPr>
+        <w:t>.</w:t>
       </w:r>
       <w:r>
         <w:rPr>
@@ -15632,7 +16321,7 @@
           <w:iCs/>
           <w:lang w:eastAsia="ko-KR"/>
         </w:rPr>
-        <w:t>8</w:t>
+        <w:t>5</w:t>
       </w:r>
       <w:r>
         <w:rPr>
@@ -15675,7 +16364,7 @@
           <w:iCs/>
           <w:lang w:eastAsia="ko-KR"/>
         </w:rPr>
-        <w:t>7</w:t>
+        <w:t>6</w:t>
       </w:r>
       <w:r>
         <w:rPr>
@@ -15795,7 +16484,7 @@
         <w:rPr>
           <w:bCs/>
         </w:rPr>
-        <w:t xml:space="preserve">nvironment:  A </w:t>
+        <w:t xml:space="preserve">nvironment: A </w:t>
       </w:r>
       <w:r>
         <w:rPr>
@@ -16023,7 +16712,7 @@
           <w:iCs/>
           <w:lang w:eastAsia="ko-KR"/>
         </w:rPr>
-        <w:t>3</w:t>
+        <w:t>5</w:t>
       </w:r>
       <w:r>
         <w:rPr>
@@ -16043,7 +16732,7 @@
           <w:iCs/>
           <w:lang w:eastAsia="ko-KR"/>
         </w:rPr>
-        <w:t>8</w:t>
+        <w:t>2</w:t>
       </w:r>
       <w:r>
         <w:rPr>
@@ -16065,7 +16754,7 @@
           <w:iCs/>
           <w:lang w:eastAsia="ko-KR"/>
         </w:rPr>
-        <w:t>3</w:t>
+        <w:t>4</w:t>
       </w:r>
       <w:r>
         <w:rPr>
@@ -16087,7 +16776,7 @@
           <w:iCs/>
           <w:lang w:eastAsia="ko-KR"/>
         </w:rPr>
-        <w:t>7</w:t>
+        <w:t>6</w:t>
       </w:r>
       <w:r>
         <w:rPr>
@@ -16493,7 +17182,7 @@
           <w:iCs/>
           <w:lang w:eastAsia="ko-KR"/>
         </w:rPr>
-        <w:t>16</w:t>
+        <w:t>38</w:t>
       </w:r>
       <w:r>
         <w:rPr>
@@ -16536,7 +17225,7 @@
           <w:iCs/>
           <w:lang w:eastAsia="ko-KR"/>
         </w:rPr>
-        <w:t>15</w:t>
+        <w:t>24</w:t>
       </w:r>
       <w:r>
         <w:rPr>
@@ -16735,65 +17424,34 @@
         </w:r>
       </w:hyperlink>
       <w:r>
-        <w:t xml:space="preserve">  </w:t>
-      </w:r>
-      <w:r>
-        <w:rPr>
-          <w:rFonts w:hint="eastAsia"/>
-          <w:lang w:eastAsia="ko-KR"/>
-        </w:rPr>
         <w:t xml:space="preserve"> </w:t>
       </w:r>
       <w:r>
         <w:rPr>
           <w:b/>
-          <w:bCs/>
-          <w:i/>
-          <w:iCs/>
-        </w:rPr>
-        <w:t xml:space="preserve">[SSCI-indexed, IF = </w:t>
-      </w:r>
-      <w:r>
-        <w:rPr>
-          <w:rFonts w:hint="eastAsia"/>
-          <w:b/>
-          <w:bCs/>
-          <w:i/>
-          <w:iCs/>
-          <w:lang w:eastAsia="ko-KR"/>
-        </w:rPr>
-        <w:t>8</w:t>
-      </w:r>
-      <w:r>
-        <w:rPr>
-          <w:b/>
-          <w:bCs/>
-          <w:i/>
-          <w:iCs/>
-        </w:rPr>
-        <w:t>.</w:t>
-      </w:r>
-      <w:r>
-        <w:rPr>
-          <w:rFonts w:hint="eastAsia"/>
-          <w:b/>
-          <w:bCs/>
-          <w:i/>
-          <w:iCs/>
-          <w:lang w:eastAsia="ko-KR"/>
-        </w:rPr>
-        <w:t>8</w:t>
-      </w:r>
-      <w:r>
-        <w:rPr>
-          <w:rFonts w:hint="eastAsia"/>
-          <w:b/>
-          <w:bCs/>
-          <w:i/>
-          <w:iCs/>
-          <w:lang w:eastAsia="ko-KR"/>
-        </w:rPr>
-        <w:t xml:space="preserve">, </w:t>
+          <w:i/>
+        </w:rPr>
+        <w:t>[SSCI-indexed</w:t>
+      </w:r>
+      <w:r>
+        <w:rPr>
+          <w:b/>
+          <w:bCs/>
+          <w:i/>
+          <w:iCs/>
+        </w:rPr>
+        <w:t xml:space="preserve">, IF = </w:t>
+      </w:r>
+      <w:r>
+        <w:rPr>
+          <w:rFonts w:hint="eastAsia"/>
+          <w:b/>
+          <w:bCs/>
+          <w:i/>
+          <w:iCs/>
+          <w:lang w:eastAsia="ko-KR"/>
+        </w:rPr>
+        <w:t xml:space="preserve">11.9, </w:t>
       </w:r>
       <w:r>
         <w:rPr>
@@ -16833,47 +17491,15 @@
           <w:iCs/>
           <w:lang w:eastAsia="ko-KR"/>
         </w:rPr>
-        <w:t>1</w:t>
-      </w:r>
-      <w:r>
-        <w:rPr>
-          <w:rFonts w:hint="eastAsia"/>
-          <w:b/>
-          <w:bCs/>
-          <w:i/>
-          <w:iCs/>
-          <w:lang w:eastAsia="ko-KR"/>
-        </w:rPr>
-        <w:t>4</w:t>
-      </w:r>
-      <w:r>
-        <w:rPr>
-          <w:rFonts w:hint="eastAsia"/>
-          <w:b/>
-          <w:bCs/>
-          <w:i/>
-          <w:iCs/>
-          <w:lang w:eastAsia="ko-KR"/>
-        </w:rPr>
-        <w:t>.</w:t>
-      </w:r>
-      <w:r>
-        <w:rPr>
-          <w:rFonts w:hint="eastAsia"/>
-          <w:b/>
-          <w:bCs/>
-          <w:i/>
-          <w:iCs/>
-          <w:lang w:eastAsia="ko-KR"/>
-        </w:rPr>
-        <w:t>2</w:t>
-      </w:r>
-      <w:r>
-        <w:rPr>
-          <w:b/>
-          <w:bCs/>
-          <w:i/>
-          <w:iCs/>
+        <w:t>16.4</w:t>
+      </w:r>
+      <w:r>
+        <w:rPr>
+          <w:b/>
+          <w:i/>
+          <w:color w:val="212121"/>
+          <w:sz w:val="28"/>
+          <w:szCs w:val="28"/>
         </w:rPr>
         <w:t>]</w:t>
       </w:r>
@@ -16987,30 +17613,30 @@
           <w:iCs/>
           <w:lang w:eastAsia="ko-KR"/>
         </w:rPr>
+        <w:t>2</w:t>
+      </w:r>
+      <w:r>
+        <w:rPr>
+          <w:b/>
+          <w:bCs/>
+          <w:i/>
+          <w:iCs/>
+        </w:rPr>
+        <w:t>.</w:t>
+      </w:r>
+      <w:r>
+        <w:rPr>
+          <w:rFonts w:hint="eastAsia"/>
+          <w:b/>
+          <w:bCs/>
+          <w:i/>
+          <w:iCs/>
+          <w:lang w:eastAsia="ko-KR"/>
+        </w:rPr>
         <w:t>1</w:t>
       </w:r>
       <w:r>
         <w:rPr>
-          <w:b/>
-          <w:bCs/>
-          <w:i/>
-          <w:iCs/>
-        </w:rPr>
-        <w:t>.</w:t>
-      </w:r>
-      <w:r>
-        <w:rPr>
-          <w:rFonts w:hint="eastAsia"/>
-          <w:b/>
-          <w:bCs/>
-          <w:i/>
-          <w:iCs/>
-          <w:lang w:eastAsia="ko-KR"/>
-        </w:rPr>
-        <w:t>2</w:t>
-      </w:r>
-      <w:r>
-        <w:rPr>
           <w:rFonts w:hint="eastAsia"/>
           <w:b/>
           <w:bCs/>
@@ -17069,7 +17695,7 @@
           <w:iCs/>
           <w:lang w:eastAsia="ko-KR"/>
         </w:rPr>
-        <w:t>1</w:t>
+        <w:t>4</w:t>
       </w:r>
       <w:r>
         <w:rPr>
@@ -17176,7 +17802,7 @@
           <w:iCs/>
           <w:lang w:eastAsia="ko-KR"/>
         </w:rPr>
-        <w:t>8</w:t>
+        <w:t>6</w:t>
       </w:r>
       <w:r>
         <w:rPr>
@@ -17238,7 +17864,7 @@
           <w:iCs/>
           <w:lang w:eastAsia="ko-KR"/>
         </w:rPr>
-        <w:t>3</w:t>
+        <w:t>2</w:t>
       </w:r>
       <w:r>
         <w:rPr>
@@ -17332,18 +17958,82 @@
           <w:i/>
           <w:iCs/>
         </w:rPr>
-        <w:t>[SSCI-indexed, IF = 5.</w:t>
-      </w:r>
-      <w:r>
-        <w:rPr>
-          <w:rFonts w:hint="eastAsia"/>
-          <w:b/>
-          <w:bCs/>
-          <w:i/>
-          <w:iCs/>
-          <w:lang w:eastAsia="ko-KR"/>
-        </w:rPr>
-        <w:t>4, IF5 = 5.7</w:t>
+        <w:t xml:space="preserve">[SSCI-indexed, IF = </w:t>
+      </w:r>
+      <w:r>
+        <w:rPr>
+          <w:rFonts w:hint="eastAsia"/>
+          <w:b/>
+          <w:bCs/>
+          <w:i/>
+          <w:iCs/>
+          <w:lang w:eastAsia="ko-KR"/>
+        </w:rPr>
+        <w:t>7</w:t>
+      </w:r>
+      <w:r>
+        <w:rPr>
+          <w:b/>
+          <w:bCs/>
+          <w:i/>
+          <w:iCs/>
+        </w:rPr>
+        <w:t>.</w:t>
+      </w:r>
+      <w:r>
+        <w:rPr>
+          <w:rFonts w:hint="eastAsia"/>
+          <w:b/>
+          <w:bCs/>
+          <w:i/>
+          <w:iCs/>
+          <w:lang w:eastAsia="ko-KR"/>
+        </w:rPr>
+        <w:t>2</w:t>
+      </w:r>
+      <w:r>
+        <w:rPr>
+          <w:rFonts w:hint="eastAsia"/>
+          <w:b/>
+          <w:bCs/>
+          <w:i/>
+          <w:iCs/>
+          <w:lang w:eastAsia="ko-KR"/>
+        </w:rPr>
+        <w:t xml:space="preserve">, IF5 = </w:t>
+      </w:r>
+      <w:r>
+        <w:rPr>
+          <w:rFonts w:hint="eastAsia"/>
+          <w:b/>
+          <w:bCs/>
+          <w:i/>
+          <w:iCs/>
+          <w:lang w:eastAsia="ko-KR"/>
+        </w:rPr>
+        <w:t>7</w:t>
+      </w:r>
+      <w:r>
+        <w:rPr>
+          <w:rFonts w:hint="eastAsia"/>
+          <w:b/>
+          <w:bCs/>
+          <w:i/>
+          <w:iCs/>
+          <w:lang w:eastAsia="ko-KR"/>
+        </w:rPr>
+        <w:t>.</w:t>
+      </w:r>
+      <w:r>
+        <w:rPr>
+          <w:rFonts w:hint="eastAsia"/>
+          <w:b/>
+          <w:bCs/>
+          <w:i/>
+          <w:iCs/>
+          <w:lang w:eastAsia="ko-KR"/>
+        </w:rPr>
+        <w:t>3</w:t>
       </w:r>
       <w:r>
         <w:rPr>
@@ -17360,6 +18050,7 @@
         <w:ind w:left="720" w:hanging="720"/>
       </w:pPr>
       <w:r>
+        <w:lastRenderedPageBreak/>
         <w:t>​[2</w:t>
       </w:r>
       <w:r>
@@ -17400,11 +18091,7 @@
         <w:t>2023</w:t>
       </w:r>
       <w:r>
-        <w:t xml:space="preserve">). Revisiting multimedia learning design principles </w:t>
-      </w:r>
-      <w:r>
-        <w:lastRenderedPageBreak/>
-        <w:t xml:space="preserve">in virtual reality-based learning environments for autistic individuals. </w:t>
+        <w:t xml:space="preserve">). Revisiting multimedia learning design principles in virtual reality-based learning environments for autistic individuals. </w:t>
       </w:r>
       <w:r>
         <w:rPr>
@@ -17489,7 +18176,7 @@
           <w:iCs/>
           <w:lang w:eastAsia="ko-KR"/>
         </w:rPr>
-        <w:t>0</w:t>
+        <w:t>4</w:t>
       </w:r>
       <w:r>
         <w:rPr>
@@ -17573,7 +18260,7 @@
           <w:iCs/>
           <w:lang w:eastAsia="ko-KR"/>
         </w:rPr>
-        <w:t>6</w:t>
+        <w:t>7</w:t>
       </w:r>
       <w:r>
         <w:rPr>
@@ -17704,7 +18391,18 @@
           <w:iCs/>
           <w:lang w:eastAsia="ko-KR"/>
         </w:rPr>
-        <w:t xml:space="preserve">8, </w:t>
+        <w:t>6</w:t>
+      </w:r>
+      <w:r>
+        <w:rPr>
+          <w:rFonts w:hint="eastAsia"/>
+          <w:b/>
+          <w:bCs/>
+          <w:i/>
+          <w:iCs/>
+          <w:lang w:eastAsia="ko-KR"/>
+        </w:rPr>
+        <w:t xml:space="preserve">, </w:t>
       </w:r>
       <w:r>
         <w:rPr>
@@ -17744,7 +18442,29 @@
           <w:iCs/>
           <w:lang w:eastAsia="ko-KR"/>
         </w:rPr>
-        <w:t>4.3]</w:t>
+        <w:t>4.</w:t>
+      </w:r>
+      <w:r>
+        <w:rPr>
+          <w:rFonts w:hint="eastAsia"/>
+          <w:b/>
+          <w:bCs/>
+          <w:i/>
+          <w:iCs/>
+          <w:lang w:eastAsia="ko-KR"/>
+        </w:rPr>
+        <w:t>2</w:t>
+      </w:r>
+      <w:r>
+        <w:rPr>
+          <w:rFonts w:hint="eastAsia"/>
+          <w:b/>
+          <w:bCs/>
+          <w:i/>
+          <w:iCs/>
+          <w:lang w:eastAsia="ko-KR"/>
+        </w:rPr>
+        <w:t>]</w:t>
       </w:r>
       <w:r>
         <w:t xml:space="preserve"> ​</w:t>
@@ -17851,7 +18571,7 @@
           <w:iCs/>
           <w:lang w:eastAsia="ko-KR"/>
         </w:rPr>
-        <w:t>6</w:t>
+        <w:t>7</w:t>
       </w:r>
       <w:r>
         <w:rPr>
@@ -17871,7 +18591,7 @@
           <w:iCs/>
           <w:lang w:eastAsia="ko-KR"/>
         </w:rPr>
-        <w:t>0</w:t>
+        <w:t>1</w:t>
       </w:r>
       <w:r>
         <w:rPr>
@@ -17922,7 +18642,7 @@
           <w:iCs/>
           <w:lang w:eastAsia="ko-KR"/>
         </w:rPr>
-        <w:t>6</w:t>
+        <w:t>7</w:t>
       </w:r>
       <w:r>
         <w:rPr>
@@ -17944,7 +18664,7 @@
           <w:iCs/>
           <w:lang w:eastAsia="ko-KR"/>
         </w:rPr>
-        <w:t>3</w:t>
+        <w:t>5</w:t>
       </w:r>
       <w:r>
         <w:rPr>
@@ -17960,13 +18680,6 @@
     <w:p>
       <w:pPr>
         <w:ind w:left="720" w:hanging="720"/>
-        <w:rPr>
-          <w:b/>
-          <w:i/>
-          <w:color w:val="212121"/>
-          <w:sz w:val="28"/>
-          <w:szCs w:val="28"/>
-        </w:rPr>
       </w:pPr>
       <w:r>
         <w:t>[1</w:t>
@@ -18059,7 +18772,27 @@
           <w:i/>
           <w:iCs/>
         </w:rPr>
-        <w:t xml:space="preserve">, IF = </w:t>
+        <w:t>, IF =</w:t>
+      </w:r>
+      <w:r>
+        <w:rPr>
+          <w:rFonts w:hint="eastAsia"/>
+          <w:b/>
+          <w:bCs/>
+          <w:i/>
+          <w:iCs/>
+          <w:lang w:eastAsia="ko-KR"/>
+        </w:rPr>
+        <w:t xml:space="preserve">6.7, </w:t>
+      </w:r>
+      <w:r>
+        <w:rPr>
+          <w:b/>
+          <w:bCs/>
+          <w:i/>
+          <w:iCs/>
+        </w:rPr>
+        <w:t>IF</w:t>
       </w:r>
       <w:r>
         <w:rPr>
@@ -18074,59 +18807,6 @@
       </w:r>
       <w:r>
         <w:rPr>
-          <w:rFonts w:hint="eastAsia"/>
-          <w:b/>
-          <w:bCs/>
-          <w:i/>
-          <w:iCs/>
-          <w:lang w:eastAsia="ko-KR"/>
-        </w:rPr>
-        <w:t>.</w:t>
-      </w:r>
-      <w:r>
-        <w:rPr>
-          <w:rFonts w:hint="eastAsia"/>
-          <w:b/>
-          <w:bCs/>
-          <w:i/>
-          <w:iCs/>
-          <w:lang w:eastAsia="ko-KR"/>
-        </w:rPr>
-        <w:t>3</w:t>
-      </w:r>
-      <w:r>
-        <w:rPr>
-          <w:rFonts w:hint="eastAsia"/>
-          <w:b/>
-          <w:bCs/>
-          <w:i/>
-          <w:iCs/>
-          <w:lang w:eastAsia="ko-KR"/>
-        </w:rPr>
-        <w:t xml:space="preserve">, </w:t>
-      </w:r>
-      <w:r>
-        <w:rPr>
-          <w:b/>
-          <w:bCs/>
-          <w:i/>
-          <w:iCs/>
-        </w:rPr>
-        <w:t>IF</w:t>
-      </w:r>
-      <w:r>
-        <w:rPr>
-          <w:rFonts w:hint="eastAsia"/>
-          <w:b/>
-          <w:bCs/>
-          <w:i/>
-          <w:iCs/>
-          <w:lang w:eastAsia="ko-KR"/>
-        </w:rPr>
-        <w:t>5</w:t>
-      </w:r>
-      <w:r>
-        <w:rPr>
           <w:b/>
           <w:bCs/>
           <w:i/>
@@ -18143,29 +18823,7 @@
           <w:iCs/>
           <w:lang w:eastAsia="ko-KR"/>
         </w:rPr>
-        <w:t>6</w:t>
-      </w:r>
-      <w:r>
-        <w:rPr>
-          <w:rFonts w:hint="eastAsia"/>
-          <w:b/>
-          <w:bCs/>
-          <w:i/>
-          <w:iCs/>
-          <w:lang w:eastAsia="ko-KR"/>
-        </w:rPr>
-        <w:t>.</w:t>
-      </w:r>
-      <w:r>
-        <w:rPr>
-          <w:rFonts w:hint="eastAsia"/>
-          <w:b/>
-          <w:bCs/>
-          <w:i/>
-          <w:iCs/>
-          <w:lang w:eastAsia="ko-KR"/>
-        </w:rPr>
-        <w:t>2</w:t>
+        <w:t>7.1</w:t>
       </w:r>
       <w:r>
         <w:rPr>
@@ -18176,6 +18834,9 @@
           <w:szCs w:val="28"/>
         </w:rPr>
         <w:t>]</w:t>
+      </w:r>
+      <w:r>
+        <w:t xml:space="preserve"> </w:t>
       </w:r>
     </w:p>
     <w:p>
@@ -18322,7 +18983,7 @@
           <w:iCs/>
           <w:lang w:eastAsia="ko-KR"/>
         </w:rPr>
-        <w:t>2</w:t>
+        <w:t>1</w:t>
       </w:r>
       <w:r>
         <w:rPr>
@@ -18373,18 +19034,29 @@
           <w:iCs/>
           <w:lang w:eastAsia="ko-KR"/>
         </w:rPr>
-        <w:t>2.</w:t>
-      </w:r>
-      <w:r>
-        <w:rPr>
-          <w:rFonts w:hint="eastAsia"/>
-          <w:b/>
-          <w:bCs/>
-          <w:i/>
-          <w:iCs/>
-          <w:lang w:eastAsia="ko-KR"/>
-        </w:rPr>
-        <w:t>7</w:t>
+        <w:t>3</w:t>
+      </w:r>
+      <w:r>
+        <w:rPr>
+          <w:rFonts w:hint="eastAsia"/>
+          <w:b/>
+          <w:bCs/>
+          <w:i/>
+          <w:iCs/>
+          <w:lang w:eastAsia="ko-KR"/>
+        </w:rPr>
+        <w:t>.</w:t>
+      </w:r>
+      <w:r>
+        <w:rPr>
+          <w:rFonts w:hint="eastAsia"/>
+          <w:b/>
+          <w:bCs/>
+          <w:i/>
+          <w:iCs/>
+          <w:lang w:eastAsia="ko-KR"/>
+        </w:rPr>
+        <w:t>3</w:t>
       </w:r>
       <w:r>
         <w:rPr>
@@ -18541,7 +19213,7 @@
           <w:iCs/>
           <w:lang w:eastAsia="ko-KR"/>
         </w:rPr>
-        <w:t>6</w:t>
+        <w:t>4</w:t>
       </w:r>
       <w:r>
         <w:rPr>
@@ -18592,7 +19264,7 @@
           <w:iCs/>
           <w:lang w:eastAsia="ko-KR"/>
         </w:rPr>
-        <w:t>4</w:t>
+        <w:t>3</w:t>
       </w:r>
       <w:r>
         <w:rPr>
@@ -18614,7 +19286,7 @@
           <w:iCs/>
           <w:lang w:eastAsia="ko-KR"/>
         </w:rPr>
-        <w:t>8</w:t>
+        <w:t>9</w:t>
       </w:r>
       <w:r>
         <w:rPr>
@@ -18778,7 +19450,7 @@
           <w:iCs/>
           <w:lang w:eastAsia="ko-KR"/>
         </w:rPr>
-        <w:t xml:space="preserve">6, </w:t>
+        <w:t xml:space="preserve">4, </w:t>
       </w:r>
       <w:r>
         <w:rPr>
@@ -18818,7 +19490,7 @@
           <w:iCs/>
           <w:lang w:eastAsia="ko-KR"/>
         </w:rPr>
-        <w:t>4.8</w:t>
+        <w:t>3.9</w:t>
       </w:r>
       <w:r>
         <w:rPr>
@@ -18957,7 +19629,7 @@
           <w:iCs/>
           <w:lang w:eastAsia="ko-KR"/>
         </w:rPr>
-        <w:t>3</w:t>
+        <w:t>5</w:t>
       </w:r>
       <w:r>
         <w:rPr>
@@ -18977,7 +19649,51 @@
           <w:iCs/>
           <w:lang w:eastAsia="ko-KR"/>
         </w:rPr>
-        <w:t>8, IF5 = 3.7</w:t>
+        <w:t>2</w:t>
+      </w:r>
+      <w:r>
+        <w:rPr>
+          <w:rFonts w:hint="eastAsia"/>
+          <w:b/>
+          <w:bCs/>
+          <w:i/>
+          <w:iCs/>
+          <w:lang w:eastAsia="ko-KR"/>
+        </w:rPr>
+        <w:t xml:space="preserve">, IF5 = </w:t>
+      </w:r>
+      <w:r>
+        <w:rPr>
+          <w:rFonts w:hint="eastAsia"/>
+          <w:b/>
+          <w:bCs/>
+          <w:i/>
+          <w:iCs/>
+          <w:lang w:eastAsia="ko-KR"/>
+        </w:rPr>
+        <w:t>4</w:t>
+      </w:r>
+      <w:r>
+        <w:rPr>
+          <w:rFonts w:hint="eastAsia"/>
+          <w:b/>
+          <w:bCs/>
+          <w:i/>
+          <w:iCs/>
+          <w:lang w:eastAsia="ko-KR"/>
+        </w:rPr>
+        <w:t>.</w:t>
+      </w:r>
+      <w:r>
+        <w:rPr>
+          <w:rFonts w:hint="eastAsia"/>
+          <w:b/>
+          <w:bCs/>
+          <w:i/>
+          <w:iCs/>
+          <w:lang w:eastAsia="ko-KR"/>
+        </w:rPr>
+        <w:t>6</w:t>
       </w:r>
       <w:r>
         <w:rPr>
@@ -19108,7 +19824,49 @@
           <w:iCs/>
           <w:lang w:eastAsia="ko-KR"/>
         </w:rPr>
-        <w:t>1.</w:t>
+        <w:t>2</w:t>
+      </w:r>
+      <w:r>
+        <w:rPr>
+          <w:rFonts w:hint="eastAsia"/>
+          <w:b/>
+          <w:bCs/>
+          <w:i/>
+          <w:iCs/>
+          <w:lang w:eastAsia="ko-KR"/>
+        </w:rPr>
+        <w:t>.</w:t>
+      </w:r>
+      <w:r>
+        <w:rPr>
+          <w:rFonts w:hint="eastAsia"/>
+          <w:b/>
+          <w:bCs/>
+          <w:i/>
+          <w:iCs/>
+          <w:lang w:eastAsia="ko-KR"/>
+        </w:rPr>
+        <w:t>7,</w:t>
+      </w:r>
+      <w:r>
+        <w:rPr>
+          <w:rFonts w:hint="eastAsia"/>
+          <w:b/>
+          <w:bCs/>
+          <w:i/>
+          <w:iCs/>
+          <w:lang w:eastAsia="ko-KR"/>
+        </w:rPr>
+        <w:t xml:space="preserve"> </w:t>
+      </w:r>
+      <w:r>
+        <w:rPr>
+          <w:b/>
+          <w:bCs/>
+          <w:i/>
+          <w:iCs/>
+        </w:rPr>
+        <w:t>IF</w:t>
       </w:r>
       <w:r>
         <w:rPr>
@@ -19123,37 +19881,6 @@
       </w:r>
       <w:r>
         <w:rPr>
-          <w:rFonts w:hint="eastAsia"/>
-          <w:b/>
-          <w:bCs/>
-          <w:i/>
-          <w:iCs/>
-          <w:lang w:eastAsia="ko-KR"/>
-        </w:rPr>
-        <w:t xml:space="preserve">, </w:t>
-      </w:r>
-      <w:r>
-        <w:rPr>
-          <w:b/>
-          <w:bCs/>
-          <w:i/>
-          <w:iCs/>
-        </w:rPr>
-        <w:t>IF</w:t>
-      </w:r>
-      <w:r>
-        <w:rPr>
-          <w:rFonts w:hint="eastAsia"/>
-          <w:b/>
-          <w:bCs/>
-          <w:i/>
-          <w:iCs/>
-          <w:lang w:eastAsia="ko-KR"/>
-        </w:rPr>
-        <w:t>5</w:t>
-      </w:r>
-      <w:r>
-        <w:rPr>
           <w:b/>
           <w:bCs/>
           <w:i/>
@@ -19181,7 +19908,7 @@
           <w:iCs/>
           <w:lang w:eastAsia="ko-KR"/>
         </w:rPr>
-        <w:t>3</w:t>
+        <w:t>8</w:t>
       </w:r>
       <w:r>
         <w:rPr>
@@ -19322,7 +20049,7 @@
           <w:iCs/>
           <w:lang w:eastAsia="ko-KR"/>
         </w:rPr>
-        <w:t>7</w:t>
+        <w:t>9</w:t>
       </w:r>
       <w:r>
         <w:rPr>
@@ -19373,18 +20100,40 @@
           <w:iCs/>
           <w:lang w:eastAsia="ko-KR"/>
         </w:rPr>
-        <w:t xml:space="preserve"> 2.</w:t>
-      </w:r>
-      <w:r>
-        <w:rPr>
-          <w:rFonts w:hint="eastAsia"/>
-          <w:b/>
-          <w:bCs/>
-          <w:i/>
-          <w:iCs/>
-          <w:lang w:eastAsia="ko-KR"/>
-        </w:rPr>
-        <w:t>8</w:t>
+        <w:t xml:space="preserve"> </w:t>
+      </w:r>
+      <w:r>
+        <w:rPr>
+          <w:rFonts w:hint="eastAsia"/>
+          <w:b/>
+          <w:bCs/>
+          <w:i/>
+          <w:iCs/>
+          <w:lang w:eastAsia="ko-KR"/>
+        </w:rPr>
+        <w:t>3</w:t>
+      </w:r>
+      <w:r>
+        <w:rPr>
+          <w:rFonts w:hint="eastAsia"/>
+          <w:b/>
+          <w:bCs/>
+          <w:i/>
+          <w:iCs/>
+          <w:lang w:eastAsia="ko-KR"/>
+        </w:rPr>
+        <w:t>.</w:t>
+      </w:r>
+      <w:r>
+        <w:rPr>
+          <w:rFonts w:hint="eastAsia"/>
+          <w:b/>
+          <w:bCs/>
+          <w:i/>
+          <w:iCs/>
+          <w:lang w:eastAsia="ko-KR"/>
+        </w:rPr>
+        <w:t>3</w:t>
       </w:r>
       <w:r>
         <w:rPr>
@@ -19408,6 +20157,7 @@
         </w:pBdr>
         <w:ind w:left="720" w:hanging="720"/>
         <w:rPr>
+          <w:rFonts w:hint="eastAsia"/>
           <w:b/>
           <w:i/>
           <w:color w:val="212121"/>
@@ -19487,7 +20237,7 @@
         <w:t xml:space="preserve"> </w:t>
       </w:r>
       <w:r>
-        <w:t xml:space="preserve">  </w:t>
+        <w:t xml:space="preserve"> </w:t>
       </w:r>
       <w:r>
         <w:rPr>
@@ -19514,7 +20264,7 @@
           <w:iCs/>
           <w:lang w:eastAsia="ko-KR"/>
         </w:rPr>
-        <w:t>1</w:t>
+        <w:t>4</w:t>
       </w:r>
       <w:r>
         <w:rPr>
@@ -19534,7 +20284,7 @@
           <w:iCs/>
           <w:lang w:eastAsia="ko-KR"/>
         </w:rPr>
-        <w:t>9</w:t>
+        <w:t>5</w:t>
       </w:r>
       <w:r>
         <w:rPr>
@@ -19585,7 +20335,7 @@
           <w:iCs/>
           <w:lang w:eastAsia="ko-KR"/>
         </w:rPr>
-        <w:t>2</w:t>
+        <w:t>3</w:t>
       </w:r>
       <w:r>
         <w:rPr>
@@ -19607,7 +20357,7 @@
           <w:iCs/>
           <w:lang w:eastAsia="ko-KR"/>
         </w:rPr>
-        <w:t>8</w:t>
+        <w:t>7]</w:t>
       </w:r>
     </w:p>
     <w:p>
@@ -19781,7 +20531,18 @@
           <w:iCs/>
           <w:lang w:eastAsia="ko-KR"/>
         </w:rPr>
-        <w:t xml:space="preserve">4, </w:t>
+        <w:t>9</w:t>
+      </w:r>
+      <w:r>
+        <w:rPr>
+          <w:rFonts w:hint="eastAsia"/>
+          <w:b/>
+          <w:bCs/>
+          <w:i/>
+          <w:iCs/>
+          <w:lang w:eastAsia="ko-KR"/>
+        </w:rPr>
+        <w:t xml:space="preserve">, </w:t>
       </w:r>
       <w:r>
         <w:rPr>
@@ -19821,7 +20582,7 @@
           <w:iCs/>
           <w:lang w:eastAsia="ko-KR"/>
         </w:rPr>
-        <w:t xml:space="preserve"> 2.</w:t>
+        <w:t>2.</w:t>
       </w:r>
       <w:r>
         <w:rPr>
@@ -19971,7 +20732,7 @@
           <w:iCs/>
           <w:lang w:eastAsia="ko-KR"/>
         </w:rPr>
-        <w:t>8</w:t>
+        <w:t>13</w:t>
       </w:r>
       <w:r>
         <w:rPr>
@@ -19991,7 +20752,7 @@
           <w:iCs/>
           <w:lang w:eastAsia="ko-KR"/>
         </w:rPr>
-        <w:t xml:space="preserve">1, </w:t>
+        <w:t xml:space="preserve">0, </w:t>
       </w:r>
       <w:r>
         <w:rPr>
@@ -20031,7 +20792,7 @@
           <w:iCs/>
           <w:lang w:eastAsia="ko-KR"/>
         </w:rPr>
-        <w:t xml:space="preserve"> 8.1</w:t>
+        <w:t>11.1</w:t>
       </w:r>
       <w:r>
         <w:rPr>
@@ -20435,7 +21196,7 @@
           <w:iCs/>
           <w:lang w:eastAsia="ko-KR"/>
         </w:rPr>
-        <w:t>9</w:t>
+        <w:t>3</w:t>
       </w:r>
       <w:r>
         <w:rPr>
@@ -20486,7 +21247,18 @@
           <w:iCs/>
           <w:lang w:eastAsia="ko-KR"/>
         </w:rPr>
-        <w:t>5.2</w:t>
+        <w:t>5.</w:t>
+      </w:r>
+      <w:r>
+        <w:rPr>
+          <w:rFonts w:hint="eastAsia"/>
+          <w:b/>
+          <w:bCs/>
+          <w:i/>
+          <w:iCs/>
+          <w:lang w:eastAsia="ko-KR"/>
+        </w:rPr>
+        <w:t>8</w:t>
       </w:r>
       <w:r>
         <w:rPr>
@@ -20593,27 +21365,32 @@
       </w:r>
       <w:r>
         <w:rPr>
-          <w:rFonts w:hint="eastAsia"/>
-          <w:b/>
-          <w:color w:val="212121"/>
-          <w:lang w:eastAsia="ko-KR"/>
-        </w:rPr>
-        <w:t xml:space="preserve"> </w:t>
-      </w:r>
-      <w:r>
-        <w:rPr>
-          <w:b/>
-          <w:color w:val="212121"/>
+          <w:b/>
+          <w:bCs/>
+          <w:i/>
+          <w:iCs/>
         </w:rPr>
         <w:t>[</w:t>
       </w:r>
       <w:r>
         <w:rPr>
-          <w:b/>
-          <w:i/>
-          <w:color w:val="212121"/>
-        </w:rPr>
-        <w:t>ESCI-indexed</w:t>
+          <w:rFonts w:hint="eastAsia"/>
+          <w:b/>
+          <w:i/>
+          <w:iCs/>
+          <w:lang w:eastAsia="ko-KR"/>
+        </w:rPr>
+        <w:t>ESCI</w:t>
+      </w:r>
+      <w:r>
+        <w:rPr>
+          <w:rFonts w:hint="eastAsia"/>
+          <w:b/>
+          <w:i/>
+          <w:iCs/>
+          <w:lang w:eastAsia="ko-KR"/>
+        </w:rPr>
+        <w:t>-indexed</w:t>
       </w:r>
       <w:r>
         <w:rPr>
@@ -20633,38 +21410,7 @@
           <w:iCs/>
           <w:lang w:eastAsia="ko-KR"/>
         </w:rPr>
-        <w:t>1</w:t>
-      </w:r>
-      <w:r>
-        <w:rPr>
-          <w:b/>
-          <w:bCs/>
-          <w:i/>
-          <w:iCs/>
-        </w:rPr>
-        <w:t>.</w:t>
-      </w:r>
-      <w:r>
-        <w:rPr>
-          <w:rFonts w:hint="eastAsia"/>
-          <w:b/>
-          <w:bCs/>
-          <w:i/>
-          <w:iCs/>
-          <w:lang w:eastAsia="ko-KR"/>
-        </w:rPr>
-        <w:t>8</w:t>
-      </w:r>
-      <w:r>
-        <w:rPr>
-          <w:rFonts w:hint="eastAsia"/>
-          <w:b/>
-          <w:bCs/>
-          <w:i/>
-          <w:iCs/>
-          <w:lang w:eastAsia="ko-KR"/>
-        </w:rPr>
-        <w:t xml:space="preserve">, </w:t>
+        <w:t xml:space="preserve">2.2, </w:t>
       </w:r>
       <w:r>
         <w:rPr>
@@ -20704,23 +21450,14 @@
           <w:iCs/>
           <w:lang w:eastAsia="ko-KR"/>
         </w:rPr>
-        <w:t>2.</w:t>
-      </w:r>
-      <w:r>
-        <w:rPr>
-          <w:rFonts w:hint="eastAsia"/>
-          <w:b/>
-          <w:bCs/>
-          <w:i/>
-          <w:iCs/>
-          <w:lang w:eastAsia="ko-KR"/>
-        </w:rPr>
-        <w:t>7</w:t>
-      </w:r>
-      <w:r>
-        <w:rPr>
-          <w:b/>
-          <w:color w:val="212121"/>
+        <w:t>3.2</w:t>
+      </w:r>
+      <w:r>
+        <w:rPr>
+          <w:b/>
+          <w:bCs/>
+          <w:i/>
+          <w:iCs/>
         </w:rPr>
         <w:t>]</w:t>
       </w:r>
@@ -20806,18 +21543,116 @@
           <w:iCs/>
           <w:lang w:eastAsia="ko-KR"/>
         </w:rPr>
-        <w:t xml:space="preserve">[ESCI-indexed; IF = </w:t>
-      </w:r>
-      <w:r>
-        <w:rPr>
-          <w:rFonts w:hint="eastAsia"/>
-          <w:b/>
-          <w:bCs/>
-          <w:i/>
-          <w:iCs/>
-          <w:lang w:eastAsia="ko-KR"/>
-        </w:rPr>
-        <w:t>12.1, IF5 = 10.1</w:t>
+        <w:t>[</w:t>
+      </w:r>
+      <w:r>
+        <w:rPr>
+          <w:rFonts w:hint="eastAsia"/>
+          <w:b/>
+          <w:bCs/>
+          <w:i/>
+          <w:iCs/>
+          <w:lang w:eastAsia="ko-KR"/>
+        </w:rPr>
+        <w:t>S</w:t>
+      </w:r>
+      <w:r>
+        <w:rPr>
+          <w:b/>
+          <w:bCs/>
+          <w:i/>
+          <w:iCs/>
+          <w:lang w:eastAsia="ko-KR"/>
+        </w:rPr>
+        <w:t xml:space="preserve">SCI-indexed; IF = </w:t>
+      </w:r>
+      <w:r>
+        <w:rPr>
+          <w:rFonts w:hint="eastAsia"/>
+          <w:b/>
+          <w:bCs/>
+          <w:i/>
+          <w:iCs/>
+          <w:lang w:eastAsia="ko-KR"/>
+        </w:rPr>
+        <w:t>1</w:t>
+      </w:r>
+      <w:r>
+        <w:rPr>
+          <w:rFonts w:hint="eastAsia"/>
+          <w:b/>
+          <w:bCs/>
+          <w:i/>
+          <w:iCs/>
+          <w:lang w:eastAsia="ko-KR"/>
+        </w:rPr>
+        <w:t>7</w:t>
+      </w:r>
+      <w:r>
+        <w:rPr>
+          <w:rFonts w:hint="eastAsia"/>
+          <w:b/>
+          <w:bCs/>
+          <w:i/>
+          <w:iCs/>
+          <w:lang w:eastAsia="ko-KR"/>
+        </w:rPr>
+        <w:t>.</w:t>
+      </w:r>
+      <w:r>
+        <w:rPr>
+          <w:rFonts w:hint="eastAsia"/>
+          <w:b/>
+          <w:bCs/>
+          <w:i/>
+          <w:iCs/>
+          <w:lang w:eastAsia="ko-KR"/>
+        </w:rPr>
+        <w:t>9</w:t>
+      </w:r>
+      <w:r>
+        <w:rPr>
+          <w:rFonts w:hint="eastAsia"/>
+          <w:b/>
+          <w:bCs/>
+          <w:i/>
+          <w:iCs/>
+          <w:lang w:eastAsia="ko-KR"/>
+        </w:rPr>
+        <w:t>, IF5 = 1</w:t>
+      </w:r>
+      <w:r>
+        <w:rPr>
+          <w:rFonts w:hint="eastAsia"/>
+          <w:b/>
+          <w:bCs/>
+          <w:i/>
+          <w:iCs/>
+          <w:lang w:eastAsia="ko-KR"/>
+        </w:rPr>
+        <w:t>4</w:t>
+      </w:r>
+      <w:r>
+        <w:rPr>
+          <w:rFonts w:hint="eastAsia"/>
+          <w:b/>
+          <w:bCs/>
+          <w:i/>
+          <w:iCs/>
+          <w:lang w:eastAsia="ko-KR"/>
+        </w:rPr>
+        <w:t>.</w:t>
+      </w:r>
+      <w:r>
+        <w:rPr>
+          <w:rFonts w:hint="eastAsia"/>
+          <w:b/>
+          <w:bCs/>
+          <w:i/>
+          <w:iCs/>
+          <w:lang w:eastAsia="ko-KR"/>
+        </w:rPr>
+        <w:t>5</w:t>
       </w:r>
       <w:r>
         <w:rPr>
@@ -20948,18 +21783,38 @@
           <w:i/>
           <w:iCs/>
         </w:rPr>
-        <w:t>, IF = 4.</w:t>
-      </w:r>
-      <w:r>
-        <w:rPr>
-          <w:rFonts w:hint="eastAsia"/>
-          <w:b/>
-          <w:bCs/>
-          <w:i/>
-          <w:iCs/>
-          <w:lang w:eastAsia="ko-KR"/>
-        </w:rPr>
-        <w:t>9</w:t>
+        <w:t xml:space="preserve">, IF = </w:t>
+      </w:r>
+      <w:r>
+        <w:rPr>
+          <w:rFonts w:hint="eastAsia"/>
+          <w:b/>
+          <w:bCs/>
+          <w:i/>
+          <w:iCs/>
+          <w:lang w:eastAsia="ko-KR"/>
+        </w:rPr>
+        <w:t>8</w:t>
+      </w:r>
+      <w:r>
+        <w:rPr>
+          <w:b/>
+          <w:bCs/>
+          <w:i/>
+          <w:iCs/>
+        </w:rPr>
+        <w:t>.</w:t>
+      </w:r>
+      <w:r>
+        <w:rPr>
+          <w:rFonts w:hint="eastAsia"/>
+          <w:b/>
+          <w:bCs/>
+          <w:i/>
+          <w:iCs/>
+          <w:lang w:eastAsia="ko-KR"/>
+        </w:rPr>
+        <w:t>5</w:t>
       </w:r>
       <w:r>
         <w:rPr>
@@ -21010,29 +21865,29 @@
           <w:iCs/>
           <w:lang w:eastAsia="ko-KR"/>
         </w:rPr>
-        <w:t xml:space="preserve"> </w:t>
-      </w:r>
-      <w:r>
-        <w:rPr>
-          <w:rFonts w:hint="eastAsia"/>
-          <w:b/>
-          <w:bCs/>
-          <w:i/>
-          <w:iCs/>
-          <w:lang w:eastAsia="ko-KR"/>
-        </w:rPr>
-        <w:t>6</w:t>
-      </w:r>
-      <w:r>
-        <w:rPr>
-          <w:rFonts w:hint="eastAsia"/>
-          <w:b/>
-          <w:bCs/>
-          <w:i/>
-          <w:iCs/>
-          <w:lang w:eastAsia="ko-KR"/>
-        </w:rPr>
-        <w:t>.0</w:t>
+        <w:t>8</w:t>
+      </w:r>
+      <w:r>
+        <w:rPr>
+          <w:rFonts w:hint="eastAsia"/>
+          <w:b/>
+          <w:bCs/>
+          <w:i/>
+          <w:iCs/>
+          <w:lang w:eastAsia="ko-KR"/>
+        </w:rPr>
+        <w:t>.</w:t>
+      </w:r>
+      <w:r>
+        <w:rPr>
+          <w:rFonts w:hint="eastAsia"/>
+          <w:b/>
+          <w:bCs/>
+          <w:i/>
+          <w:iCs/>
+          <w:lang w:eastAsia="ko-KR"/>
+        </w:rPr>
+        <w:t>1</w:t>
       </w:r>
       <w:r>
         <w:rPr>
@@ -21300,7 +22155,7 @@
           <w:iCs/>
           <w:lang w:eastAsia="ko-KR"/>
         </w:rPr>
-        <w:t>8</w:t>
+        <w:t>13</w:t>
       </w:r>
       <w:r>
         <w:rPr>
@@ -21320,7 +22175,7 @@
           <w:iCs/>
           <w:lang w:eastAsia="ko-KR"/>
         </w:rPr>
-        <w:t>1</w:t>
+        <w:t>0</w:t>
       </w:r>
       <w:r>
         <w:rPr>
@@ -21371,18 +22226,7 @@
           <w:iCs/>
           <w:lang w:eastAsia="ko-KR"/>
         </w:rPr>
-        <w:t xml:space="preserve"> </w:t>
-      </w:r>
-      <w:r>
-        <w:rPr>
-          <w:rFonts w:hint="eastAsia"/>
-          <w:b/>
-          <w:bCs/>
-          <w:i/>
-          <w:iCs/>
-          <w:lang w:eastAsia="ko-KR"/>
-        </w:rPr>
-        <w:t>8</w:t>
+        <w:t>11</w:t>
       </w:r>
       <w:r>
         <w:rPr>
@@ -21527,7 +22371,71 @@
           <w:i/>
           <w:iCs/>
         </w:rPr>
-        <w:t>, IF = 2.</w:t>
+        <w:t xml:space="preserve">, IF = </w:t>
+      </w:r>
+      <w:r>
+        <w:rPr>
+          <w:rFonts w:hint="eastAsia"/>
+          <w:b/>
+          <w:bCs/>
+          <w:i/>
+          <w:iCs/>
+          <w:lang w:eastAsia="ko-KR"/>
+        </w:rPr>
+        <w:t>3</w:t>
+      </w:r>
+      <w:r>
+        <w:rPr>
+          <w:b/>
+          <w:bCs/>
+          <w:i/>
+          <w:iCs/>
+        </w:rPr>
+        <w:t>.</w:t>
+      </w:r>
+      <w:r>
+        <w:rPr>
+          <w:rFonts w:hint="eastAsia"/>
+          <w:b/>
+          <w:bCs/>
+          <w:i/>
+          <w:iCs/>
+          <w:lang w:eastAsia="ko-KR"/>
+        </w:rPr>
+        <w:t>3</w:t>
+      </w:r>
+      <w:r>
+        <w:rPr>
+          <w:rFonts w:hint="eastAsia"/>
+          <w:b/>
+          <w:bCs/>
+          <w:i/>
+          <w:iCs/>
+          <w:lang w:eastAsia="ko-KR"/>
+        </w:rPr>
+        <w:t xml:space="preserve">, IF5= </w:t>
+      </w:r>
+      <w:r>
+        <w:rPr>
+          <w:rFonts w:hint="eastAsia"/>
+          <w:b/>
+          <w:bCs/>
+          <w:i/>
+          <w:iCs/>
+          <w:lang w:eastAsia="ko-KR"/>
+        </w:rPr>
+        <w:t>3</w:t>
+      </w:r>
+      <w:r>
+        <w:rPr>
+          <w:rFonts w:hint="eastAsia"/>
+          <w:b/>
+          <w:bCs/>
+          <w:i/>
+          <w:iCs/>
+          <w:lang w:eastAsia="ko-KR"/>
+        </w:rPr>
+        <w:t>.</w:t>
       </w:r>
       <w:r>
         <w:rPr>
@@ -21539,17 +22447,6 @@
           <w:lang w:eastAsia="ko-KR"/>
         </w:rPr>
         <w:t>4</w:t>
-      </w:r>
-      <w:r>
-        <w:rPr>
-          <w:rFonts w:hint="eastAsia"/>
-          <w:b/>
-          <w:bCs/>
-          <w:i/>
-          <w:iCs/>
-          <w:lang w:eastAsia="ko-KR"/>
-        </w:rPr>
-        <w:t>, IF5= 2.7</w:t>
       </w:r>
       <w:r>
         <w:rPr>
@@ -40095,7 +40992,7 @@
           <w:iCs/>
           <w:lang w:eastAsia="ko-KR"/>
         </w:rPr>
-        <w:t>Interactive Learning Environments</w:t>
+        <w:t>Education and Information Technologies</w:t>
       </w:r>
       <w:r>
         <w:rPr>
@@ -48102,27 +48999,10 @@
 </file>
 
 <file path=customXml/item1.xml><?xml version="1.0" encoding="utf-8"?>
-<?mso-contentType ?>
-<FormTemplates xmlns="http://schemas.microsoft.com/sharepoint/v3/contenttype/forms">
-  <Display>DocumentLibraryForm</Display>
-  <Edit>DocumentLibraryForm</Edit>
-  <New>DocumentLibraryForm</New>
-</FormTemplates>
+<b:Sources xmlns:b="http://schemas.openxmlformats.org/officeDocument/2006/bibliography" xmlns="http://schemas.openxmlformats.org/officeDocument/2006/bibliography" SelectedStyle="\APASixthEditionOfficeOnline.xsl" StyleName="APA" Version="6"/>
 </file>
 
 <file path=customXml/item2.xml><?xml version="1.0" encoding="utf-8"?>
-<b:Sources xmlns:b="http://schemas.openxmlformats.org/officeDocument/2006/bibliography" xmlns="http://schemas.openxmlformats.org/officeDocument/2006/bibliography" SelectedStyle="\APASixthEditionOfficeOnline.xsl" StyleName="APA" Version="6"/>
-</file>
-
-<file path=customXml/item3.xml><?xml version="1.0" encoding="utf-8"?>
-<p:properties xmlns:p="http://schemas.microsoft.com/office/2006/metadata/properties" xmlns:xsi="http://www.w3.org/2001/XMLSchema-instance" xmlns:pc="http://schemas.microsoft.com/office/infopath/2007/PartnerControls">
-  <documentManagement>
-    <_activity xmlns="6a4161d7-0e07-4bb5-8cdd-a87a7602a445" xsi:nil="true"/>
-  </documentManagement>
-</p:properties>
-</file>
-
-<file path=customXml/item4.xml><?xml version="1.0" encoding="utf-8"?>
 <ct:contentTypeSchema xmlns:ct="http://schemas.microsoft.com/office/2006/metadata/contentType" xmlns:ma="http://schemas.microsoft.com/office/2006/metadata/properties/metaAttributes" ct:_="" ma:_="" ma:contentTypeName="Document" ma:contentTypeID="0x010100FA54A6C77D34E44FB33E0184D6F9C744" ma:contentTypeVersion="18" ma:contentTypeDescription="Create a new document." ma:contentTypeScope="" ma:versionID="9c28832654d292338743ef1185d20088">
   <xsd:schema xmlns:xsd="http://www.w3.org/2001/XMLSchema" xmlns:xs="http://www.w3.org/2001/XMLSchema" xmlns:p="http://schemas.microsoft.com/office/2006/metadata/properties" xmlns:ns3="6a4161d7-0e07-4bb5-8cdd-a87a7602a445" xmlns:ns4="30453fea-43c5-4a0b-a417-834186a09351" targetNamespace="http://schemas.microsoft.com/office/2006/metadata/properties" ma:root="true" ma:fieldsID="aadbfd92c1be4506f2c2f9fc093c4d0b" ns3:_="" ns4:_="">
     <xsd:import namespace="6a4161d7-0e07-4bb5-8cdd-a87a7602a445"/>
@@ -48375,15 +49255,24 @@
 </ct:contentTypeSchema>
 </file>
 
-<file path=customXml/itemProps1.xml><?xml version="1.0" encoding="utf-8"?>
-<ds:datastoreItem xmlns:ds="http://schemas.openxmlformats.org/officeDocument/2006/customXml" ds:itemID="{F79F8074-1665-45F2-8B05-A95EA1C1A155}">
-  <ds:schemaRefs>
-    <ds:schemaRef ds:uri="http://schemas.microsoft.com/sharepoint/v3/contenttype/forms"/>
-  </ds:schemaRefs>
-</ds:datastoreItem>
+<file path=customXml/item3.xml><?xml version="1.0" encoding="utf-8"?>
+<?mso-contentType ?>
+<FormTemplates xmlns="http://schemas.microsoft.com/sharepoint/v3/contenttype/forms">
+  <Display>DocumentLibraryForm</Display>
+  <Edit>DocumentLibraryForm</Edit>
+  <New>DocumentLibraryForm</New>
+</FormTemplates>
 </file>
 
-<file path=customXml/itemProps2.xml><?xml version="1.0" encoding="utf-8"?>
+<file path=customXml/item4.xml><?xml version="1.0" encoding="utf-8"?>
+<p:properties xmlns:p="http://schemas.microsoft.com/office/2006/metadata/properties" xmlns:xsi="http://www.w3.org/2001/XMLSchema-instance" xmlns:pc="http://schemas.microsoft.com/office/infopath/2007/PartnerControls">
+  <documentManagement>
+    <_activity xmlns="6a4161d7-0e07-4bb5-8cdd-a87a7602a445" xsi:nil="true"/>
+  </documentManagement>
+</p:properties>
+</file>
+
+<file path=customXml/itemProps1.xml><?xml version="1.0" encoding="utf-8"?>
 <ds:datastoreItem xmlns:ds="http://schemas.openxmlformats.org/officeDocument/2006/customXml" ds:itemID="{E286DD98-9466-43F6-BF97-336366EE54DF}">
   <ds:schemaRefs>
     <ds:schemaRef ds:uri="http://schemas.openxmlformats.org/officeDocument/2006/bibliography"/>
@@ -48391,17 +49280,7 @@
 </ds:datastoreItem>
 </file>
 
-<file path=customXml/itemProps3.xml><?xml version="1.0" encoding="utf-8"?>
-<ds:datastoreItem xmlns:ds="http://schemas.openxmlformats.org/officeDocument/2006/customXml" ds:itemID="{7C24488D-A36D-4C56-91ED-753F5C27550A}">
-  <ds:schemaRefs>
-    <ds:schemaRef ds:uri="http://schemas.microsoft.com/office/2006/metadata/properties"/>
-    <ds:schemaRef ds:uri="http://schemas.microsoft.com/office/infopath/2007/PartnerControls"/>
-    <ds:schemaRef ds:uri="6a4161d7-0e07-4bb5-8cdd-a87a7602a445"/>
-  </ds:schemaRefs>
-</ds:datastoreItem>
-</file>
-
-<file path=customXml/itemProps4.xml><?xml version="1.0" encoding="utf-8"?>
+<file path=customXml/itemProps2.xml><?xml version="1.0" encoding="utf-8"?>
 <ds:datastoreItem xmlns:ds="http://schemas.openxmlformats.org/officeDocument/2006/customXml" ds:itemID="{44F19B31-977D-45A4-A748-143054BB9DA7}">
   <ds:schemaRefs>
     <ds:schemaRef ds:uri="http://schemas.microsoft.com/office/2006/metadata/contentType"/>
@@ -48418,4 +49297,22 @@
     <ds:schemaRef ds:uri="http://schemas.microsoft.com/internal/obd"/>
   </ds:schemaRefs>
 </ds:datastoreItem>
+</file>
+
+<file path=customXml/itemProps3.xml><?xml version="1.0" encoding="utf-8"?>
+<ds:datastoreItem xmlns:ds="http://schemas.openxmlformats.org/officeDocument/2006/customXml" ds:itemID="{F79F8074-1665-45F2-8B05-A95EA1C1A155}">
+  <ds:schemaRefs>
+    <ds:schemaRef ds:uri="http://schemas.microsoft.com/sharepoint/v3/contenttype/forms"/>
+  </ds:schemaRefs>
+</ds:datastoreItem>
+</file>
+
+<file path=customXml/itemProps4.xml><?xml version="1.0" encoding="utf-8"?>
+<ds:datastoreItem xmlns:ds="http://schemas.openxmlformats.org/officeDocument/2006/customXml" ds:itemID="{7C24488D-A36D-4C56-91ED-753F5C27550A}">
+  <ds:schemaRefs>
+    <ds:schemaRef ds:uri="http://schemas.microsoft.com/office/2006/metadata/properties"/>
+    <ds:schemaRef ds:uri="http://schemas.microsoft.com/office/infopath/2007/PartnerControls"/>
+    <ds:schemaRef ds:uri="6a4161d7-0e07-4bb5-8cdd-a87a7602a445"/>
+  </ds:schemaRefs>
+</ds:datastoreItem>
 </file>
</xml_diff>

<commit_message>
Update CV docx, site-data, and research analytics (autopush 2026-07-08 08:39)
</commit_message>
<xml_diff>
--- a/CV_202605_MOON.docx
+++ b/CV_202605_MOON.docx
@@ -7753,7 +7753,7 @@
           <w:szCs w:val="28"/>
           <w:lang w:eastAsia="ko-KR"/>
         </w:rPr>
-        <w:t>2</w:t>
+        <w:t>3</w:t>
       </w:r>
       <w:r>
         <w:rPr>
@@ -7925,27 +7925,15 @@
           <w:u w:val="single"/>
           <w:lang w:eastAsia="ko-KR"/>
         </w:rPr>
-        <w:t>5</w:t>
-      </w:r>
-      <w:r>
-        <w:rPr>
-          <w:rFonts w:hint="eastAsia"/>
+        <w:t>60</w:t>
+      </w:r>
+      <w:r>
+        <w:rPr>
           <w:b/>
           <w:bCs/>
           <w:sz w:val="26"/>
           <w:szCs w:val="26"/>
           <w:u w:val="single"/>
-          <w:lang w:eastAsia="ko-KR"/>
-        </w:rPr>
-        <w:t>9</w:t>
-      </w:r>
-      <w:r>
-        <w:rPr>
-          <w:b/>
-          <w:bCs/>
-          <w:sz w:val="26"/>
-          <w:szCs w:val="26"/>
-          <w:u w:val="single"/>
         </w:rPr>
         <w:t>)</w:t>
       </w:r>
@@ -7958,6 +7946,341 @@
         </w:rPr>
       </w:pPr>
       <w:bookmarkStart w:id="0" w:name="_Hlk173694585"/>
+      <w:r>
+        <w:rPr>
+          <w:rFonts w:hint="eastAsia"/>
+          <w:lang w:eastAsia="ko-KR"/>
+        </w:rPr>
+        <w:t>[6</w:t>
+      </w:r>
+      <w:r>
+        <w:rPr>
+          <w:rFonts w:hint="eastAsia"/>
+          <w:lang w:eastAsia="ko-KR"/>
+        </w:rPr>
+        <w:t>0</w:t>
+      </w:r>
+      <w:r>
+        <w:rPr>
+          <w:rFonts w:hint="eastAsia"/>
+          <w:lang w:eastAsia="ko-KR"/>
+        </w:rPr>
+        <w:t xml:space="preserve">] </w:t>
+      </w:r>
+      <w:r>
+        <w:t>*</w:t>
+      </w:r>
+      <w:r>
+        <w:t xml:space="preserve"> </w:t>
+      </w:r>
+      <w:r>
+        <w:rPr>
+          <w:rFonts w:hint="eastAsia"/>
+          <w:lang w:eastAsia="ko-KR"/>
+        </w:rPr>
+        <w:t xml:space="preserve">Awoyemi, I., &amp; </w:t>
+      </w:r>
+      <w:r>
+        <w:rPr>
+          <w:rFonts w:hint="eastAsia"/>
+          <w:b/>
+          <w:bCs/>
+          <w:lang w:eastAsia="ko-KR"/>
+        </w:rPr>
+        <w:t>Moon, J</w:t>
+      </w:r>
+      <w:r>
+        <w:rPr>
+          <w:rFonts w:hint="eastAsia"/>
+          <w:lang w:eastAsia="ko-KR"/>
+        </w:rPr>
+        <w:t>.</w:t>
+      </w:r>
+      <w:r>
+        <w:rPr>
+          <w:rFonts w:hint="eastAsia"/>
+          <w:lang w:eastAsia="ko-KR"/>
+        </w:rPr>
+        <w:t>, Abu, S., &amp; Song, S.</w:t>
+      </w:r>
+      <w:r>
+        <w:rPr>
+          <w:rFonts w:hint="eastAsia"/>
+          <w:lang w:eastAsia="ko-KR"/>
+        </w:rPr>
+        <w:t xml:space="preserve"> (</w:t>
+      </w:r>
+      <w:r>
+        <w:rPr>
+          <w:rFonts w:hint="eastAsia"/>
+          <w:lang w:eastAsia="ko-KR"/>
+        </w:rPr>
+        <w:t>Minor revision, 2026</w:t>
+      </w:r>
+      <w:r>
+        <w:rPr>
+          <w:rFonts w:hint="eastAsia"/>
+          <w:lang w:eastAsia="ko-KR"/>
+        </w:rPr>
+        <w:t xml:space="preserve">). </w:t>
+      </w:r>
+      <w:r>
+        <w:rPr>
+          <w:lang w:eastAsia="ko-KR"/>
+        </w:rPr>
+        <w:t xml:space="preserve">From </w:t>
+      </w:r>
+      <w:r>
+        <w:rPr>
+          <w:rFonts w:hint="eastAsia"/>
+          <w:lang w:eastAsia="ko-KR"/>
+        </w:rPr>
+        <w:t>e</w:t>
+      </w:r>
+      <w:r>
+        <w:rPr>
+          <w:lang w:eastAsia="ko-KR"/>
+        </w:rPr>
+        <w:t xml:space="preserve">xperience to </w:t>
+      </w:r>
+      <w:r>
+        <w:rPr>
+          <w:rFonts w:hint="eastAsia"/>
+          <w:lang w:eastAsia="ko-KR"/>
+        </w:rPr>
+        <w:t>a</w:t>
+      </w:r>
+      <w:r>
+        <w:rPr>
+          <w:lang w:eastAsia="ko-KR"/>
+        </w:rPr>
+        <w:t xml:space="preserve">ction: Sequential </w:t>
+      </w:r>
+      <w:r>
+        <w:rPr>
+          <w:rFonts w:hint="eastAsia"/>
+          <w:lang w:eastAsia="ko-KR"/>
+        </w:rPr>
+        <w:t>d</w:t>
+      </w:r>
+      <w:r>
+        <w:rPr>
+          <w:lang w:eastAsia="ko-KR"/>
+        </w:rPr>
+        <w:t xml:space="preserve">ynamics of </w:t>
+      </w:r>
+      <w:r>
+        <w:rPr>
+          <w:rFonts w:hint="eastAsia"/>
+          <w:lang w:eastAsia="ko-KR"/>
+        </w:rPr>
+        <w:t>e</w:t>
+      </w:r>
+      <w:r>
+        <w:rPr>
+          <w:lang w:eastAsia="ko-KR"/>
+        </w:rPr>
+        <w:t xml:space="preserve">xperiential </w:t>
+      </w:r>
+      <w:r>
+        <w:rPr>
+          <w:rFonts w:hint="eastAsia"/>
+          <w:lang w:eastAsia="ko-KR"/>
+        </w:rPr>
+        <w:t>l</w:t>
+      </w:r>
+      <w:r>
+        <w:rPr>
+          <w:lang w:eastAsia="ko-KR"/>
+        </w:rPr>
+        <w:t xml:space="preserve">earning in </w:t>
+      </w:r>
+      <w:r>
+        <w:rPr>
+          <w:rFonts w:hint="eastAsia"/>
+          <w:lang w:eastAsia="ko-KR"/>
+        </w:rPr>
+        <w:t>i</w:t>
+      </w:r>
+      <w:r>
+        <w:rPr>
+          <w:lang w:eastAsia="ko-KR"/>
+        </w:rPr>
+        <w:t xml:space="preserve">mmersive </w:t>
+      </w:r>
+      <w:r>
+        <w:rPr>
+          <w:rFonts w:hint="eastAsia"/>
+          <w:lang w:eastAsia="ko-KR"/>
+        </w:rPr>
+        <w:t>v</w:t>
+      </w:r>
+      <w:r>
+        <w:rPr>
+          <w:lang w:eastAsia="ko-KR"/>
+        </w:rPr>
+        <w:t xml:space="preserve">irtual </w:t>
+      </w:r>
+      <w:r>
+        <w:rPr>
+          <w:rFonts w:hint="eastAsia"/>
+          <w:lang w:eastAsia="ko-KR"/>
+        </w:rPr>
+        <w:t>r</w:t>
+      </w:r>
+      <w:r>
+        <w:rPr>
+          <w:lang w:eastAsia="ko-KR"/>
+        </w:rPr>
+        <w:t>eality-</w:t>
+      </w:r>
+      <w:r>
+        <w:rPr>
+          <w:rFonts w:hint="eastAsia"/>
+          <w:lang w:eastAsia="ko-KR"/>
+        </w:rPr>
+        <w:t>s</w:t>
+      </w:r>
+      <w:r>
+        <w:rPr>
+          <w:lang w:eastAsia="ko-KR"/>
+        </w:rPr>
+        <w:t xml:space="preserve">upported </w:t>
+      </w:r>
+      <w:r>
+        <w:rPr>
+          <w:rFonts w:hint="eastAsia"/>
+          <w:lang w:eastAsia="ko-KR"/>
+        </w:rPr>
+        <w:t>s</w:t>
+      </w:r>
+      <w:r>
+        <w:rPr>
+          <w:lang w:eastAsia="ko-KR"/>
+        </w:rPr>
+        <w:t xml:space="preserve">afety </w:t>
+      </w:r>
+      <w:r>
+        <w:rPr>
+          <w:rFonts w:hint="eastAsia"/>
+          <w:lang w:eastAsia="ko-KR"/>
+        </w:rPr>
+        <w:t>t</w:t>
+      </w:r>
+      <w:r>
+        <w:rPr>
+          <w:lang w:eastAsia="ko-KR"/>
+        </w:rPr>
+        <w:t>raining</w:t>
+      </w:r>
+      <w:r>
+        <w:rPr>
+          <w:rFonts w:hint="eastAsia"/>
+          <w:lang w:eastAsia="ko-KR"/>
+        </w:rPr>
+        <w:t xml:space="preserve">. </w:t>
+      </w:r>
+      <w:r>
+        <w:rPr>
+          <w:rFonts w:hint="eastAsia"/>
+          <w:i/>
+          <w:iCs/>
+          <w:lang w:eastAsia="ko-KR"/>
+        </w:rPr>
+        <w:t>Interactive Learning Environments</w:t>
+      </w:r>
+      <w:r>
+        <w:rPr>
+          <w:rFonts w:hint="eastAsia"/>
+          <w:lang w:eastAsia="ko-KR"/>
+        </w:rPr>
+        <w:t xml:space="preserve"> </w:t>
+      </w:r>
+      <w:r>
+        <w:rPr>
+          <w:b/>
+          <w:i/>
+        </w:rPr>
+        <w:t>[SSCI-indexed</w:t>
+      </w:r>
+      <w:r>
+        <w:rPr>
+          <w:b/>
+          <w:bCs/>
+          <w:i/>
+          <w:iCs/>
+        </w:rPr>
+        <w:t>, IF =</w:t>
+      </w:r>
+      <w:r>
+        <w:rPr>
+          <w:rFonts w:hint="eastAsia"/>
+          <w:b/>
+          <w:bCs/>
+          <w:i/>
+          <w:iCs/>
+          <w:lang w:eastAsia="ko-KR"/>
+        </w:rPr>
+        <w:t xml:space="preserve">6.7, </w:t>
+      </w:r>
+      <w:r>
+        <w:rPr>
+          <w:b/>
+          <w:bCs/>
+          <w:i/>
+          <w:iCs/>
+        </w:rPr>
+        <w:t>IF</w:t>
+      </w:r>
+      <w:r>
+        <w:rPr>
+          <w:rFonts w:hint="eastAsia"/>
+          <w:b/>
+          <w:bCs/>
+          <w:i/>
+          <w:iCs/>
+          <w:lang w:eastAsia="ko-KR"/>
+        </w:rPr>
+        <w:t>5</w:t>
+      </w:r>
+      <w:r>
+        <w:rPr>
+          <w:b/>
+          <w:bCs/>
+          <w:i/>
+          <w:iCs/>
+        </w:rPr>
+        <w:t xml:space="preserve"> = </w:t>
+      </w:r>
+      <w:r>
+        <w:rPr>
+          <w:rFonts w:hint="eastAsia"/>
+          <w:b/>
+          <w:bCs/>
+          <w:i/>
+          <w:iCs/>
+          <w:lang w:eastAsia="ko-KR"/>
+        </w:rPr>
+        <w:t>7.1</w:t>
+      </w:r>
+      <w:r>
+        <w:rPr>
+          <w:b/>
+          <w:i/>
+          <w:color w:val="212121"/>
+          <w:sz w:val="28"/>
+          <w:szCs w:val="28"/>
+        </w:rPr>
+        <w:t>]</w:t>
+      </w:r>
+    </w:p>
+    <w:p>
+      <w:pPr>
+        <w:ind w:left="720" w:hanging="720"/>
+        <w:rPr>
+          <w:lang w:eastAsia="ko-KR"/>
+        </w:rPr>
+      </w:pPr>
       <w:r>
         <w:rPr>
           <w:rFonts w:hint="eastAsia"/>
@@ -8765,6 +9088,7 @@
           <w:rFonts w:hint="eastAsia"/>
           <w:lang w:eastAsia="ko-KR"/>
         </w:rPr>
+        <w:lastRenderedPageBreak/>
         <w:t>a</w:t>
       </w:r>
       <w:r>
@@ -9164,7 +9488,6 @@
           <w:rFonts w:hint="eastAsia"/>
           <w:lang w:eastAsia="ko-KR"/>
         </w:rPr>
-        <w:lastRenderedPageBreak/>
         <w:t>c</w:t>
       </w:r>
       <w:r>
@@ -12421,6 +12744,7 @@
           <w:bCs/>
           <w:lang w:eastAsia="ko-KR"/>
         </w:rPr>
+        <w:lastRenderedPageBreak/>
         <w:t>c</w:t>
       </w:r>
       <w:r>
@@ -13246,14 +13570,7 @@
         <w:rPr>
           <w:lang w:eastAsia="ko-KR"/>
         </w:rPr>
-        <w:t xml:space="preserve">How </w:t>
-      </w:r>
-      <w:r>
-        <w:rPr>
-          <w:lang w:eastAsia="ko-KR"/>
-        </w:rPr>
-        <w:lastRenderedPageBreak/>
-        <w:t xml:space="preserve">Non-CS preservice teachers conceptualize and engage with computational thinking through 3D game design: Insights from an </w:t>
+        <w:t xml:space="preserve">How Non-CS preservice teachers conceptualize and engage with computational thinking through 3D game design: Insights from an </w:t>
       </w:r>
       <w:r>
         <w:rPr>
@@ -15598,7 +15915,14 @@
         <w:rPr>
           <w:bCs/>
         </w:rPr>
-        <w:t xml:space="preserve">). Using multimodal learning analytics as a formative assessment tool: Exploring collaborative dynamics in mathematics teacher education. </w:t>
+        <w:t xml:space="preserve">). Using multimodal learning analytics as a formative assessment tool: Exploring collaborative dynamics in </w:t>
+      </w:r>
+      <w:r>
+        <w:rPr>
+          <w:bCs/>
+        </w:rPr>
+        <w:lastRenderedPageBreak/>
+        <w:t xml:space="preserve">mathematics teacher education. </w:t>
       </w:r>
       <w:r>
         <w:rPr>
@@ -16117,16 +16441,7 @@
           <w:i/>
           <w:iCs/>
         </w:rPr>
-        <w:t xml:space="preserve">The </w:t>
-      </w:r>
-      <w:r>
-        <w:rPr>
-          <w:bCs/>
-          <w:i/>
-          <w:iCs/>
-        </w:rPr>
-        <w:lastRenderedPageBreak/>
-        <w:t>Mathematical Education</w:t>
+        <w:t>The Mathematical Education</w:t>
       </w:r>
       <w:r>
         <w:rPr>
@@ -17757,7 +18072,11 @@
         <w:t>2023</w:t>
       </w:r>
       <w:r>
-        <w:t xml:space="preserve">). Learner experience design and unpacking sociocultural, technological, and pedagogical design considerations of spherical video-based virtual reality systems for autistic learners: A systematic literature review. </w:t>
+        <w:t xml:space="preserve">). Learner experience design and unpacking sociocultural, technological, and pedagogical design </w:t>
+      </w:r>
+      <w:r>
+        <w:lastRenderedPageBreak/>
+        <w:t xml:space="preserve">considerations of spherical video-based virtual reality systems for autistic learners: A systematic literature review. </w:t>
       </w:r>
       <w:r>
         <w:rPr>
@@ -18073,7 +18392,6 @@
         <w:ind w:left="720" w:hanging="720"/>
       </w:pPr>
       <w:r>
-        <w:lastRenderedPageBreak/>
         <w:t>​[2</w:t>
       </w:r>
       <w:r>
@@ -20423,14 +20741,7 @@
         <w:rPr>
           <w:color w:val="212121"/>
         </w:rPr>
-        <w:t xml:space="preserve">., Liu, Z., Burgos, D., Chen, N. S., &amp; Kinshuk (2021). A systematic literature review of empirical studies on learning analytics in educational </w:t>
-      </w:r>
-      <w:r>
-        <w:rPr>
-          <w:color w:val="212121"/>
-        </w:rPr>
-        <w:lastRenderedPageBreak/>
-        <w:t xml:space="preserve">games. </w:t>
+        <w:t xml:space="preserve">., Liu, Z., Burgos, D., Chen, N. S., &amp; Kinshuk (2021). A systematic literature review of empirical studies on learning analytics in educational games. </w:t>
       </w:r>
       <w:r>
         <w:rPr>
@@ -22518,6 +22829,7 @@
           <w:szCs w:val="26"/>
           <w:u w:val="single"/>
         </w:rPr>
+        <w:lastRenderedPageBreak/>
         <w:t>Korean</w:t>
       </w:r>
       <w:r>
@@ -22694,11 +23006,7 @@
         <w:t xml:space="preserve">Moon, J. </w:t>
       </w:r>
       <w:r>
-        <w:t xml:space="preserve">(2013). Needs analysis of distance education students for using </w:t>
-      </w:r>
-      <w:r>
-        <w:lastRenderedPageBreak/>
-        <w:t>e-textbooks on smart</w:t>
+        <w:t>(2013). Needs analysis of distance education students for using e-textbooks on smart</w:t>
       </w:r>
       <w:r>
         <w:t xml:space="preserve"> </w:t>
@@ -23506,7 +23814,11 @@
         <w:t>Moon, J</w:t>
       </w:r>
       <w:r>
-        <w:t xml:space="preserve">., and West, L. (2021). Designing Dynamic Learning Supports for Game and Simulation-Based Learning in STEM Education, Aprea C. and Ifenthaler, D.(eds.) in </w:t>
+        <w:t xml:space="preserve">., and West, L. (2021). Designing Dynamic Learning Supports for Game and Simulation-Based Learning in STEM Education, Aprea C. and Ifenthaler, </w:t>
+      </w:r>
+      <w:r>
+        <w:lastRenderedPageBreak/>
+        <w:t xml:space="preserve">D.(eds.) in </w:t>
       </w:r>
       <w:r>
         <w:rPr>
@@ -23634,14 +23946,7 @@
         <w:rPr>
           <w:i/>
         </w:rPr>
-        <w:t xml:space="preserve">Data Analytics Approaches in Educational Games and </w:t>
-      </w:r>
-      <w:r>
-        <w:rPr>
-          <w:i/>
-        </w:rPr>
-        <w:lastRenderedPageBreak/>
-        <w:t>Gamification Systems, Smart Computing</w:t>
+        <w:t>Data Analytics Approaches in Educational Games and Gamification Systems, Smart Computing</w:t>
       </w:r>
       <w:r>
         <w:rPr>
@@ -24439,7 +24744,14 @@
         <w:rPr>
           <w:bCs/>
         </w:rPr>
-        <w:t xml:space="preserve">(1), 21–25. Retrieved from </w:t>
+        <w:t xml:space="preserve">(1), </w:t>
+      </w:r>
+      <w:r>
+        <w:rPr>
+          <w:bCs/>
+        </w:rPr>
+        <w:lastRenderedPageBreak/>
+        <w:t xml:space="preserve">21–25. Retrieved from </w:t>
       </w:r>
       <w:hyperlink r:id="rId87" w:history="1">
         <w:r>
@@ -24551,7 +24863,6 @@
           <w:i/>
           <w:iCs/>
         </w:rPr>
-        <w:lastRenderedPageBreak/>
         <w:t>the 16th International Conference of the Learning Sciences - ICLS 2022</w:t>
       </w:r>
       <w:r>
@@ -25005,7 +25316,15 @@
           <w:i/>
           <w:color w:val="000000"/>
         </w:rPr>
-        <w:t>the 11th International Conference on Educational Data Mining</w:t>
+        <w:t xml:space="preserve">the 11th International </w:t>
+      </w:r>
+      <w:r>
+        <w:rPr>
+          <w:i/>
+          <w:color w:val="000000"/>
+        </w:rPr>
+        <w:lastRenderedPageBreak/>
+        <w:t>Conference on Educational Data Mining</w:t>
       </w:r>
       <w:r>
         <w:rPr>
@@ -25088,15 +25407,7 @@
           <w:i/>
           <w:color w:val="000000"/>
         </w:rPr>
-        <w:t xml:space="preserve">International Conference </w:t>
-      </w:r>
-      <w:r>
-        <w:rPr>
-          <w:i/>
-          <w:color w:val="000000"/>
-        </w:rPr>
-        <w:lastRenderedPageBreak/>
-        <w:t>on Computer Supported Collaborative Learning </w:t>
+        <w:t>International Conference on Computer Supported Collaborative Learning </w:t>
       </w:r>
       <w:r>
         <w:rPr>
@@ -26558,7 +26869,16 @@
           <w:color w:val="222222"/>
           <w:lang w:eastAsia="ko-KR"/>
         </w:rPr>
-        <w:t>. Poster Session, AERA 2026, Los Angeles, United States.</w:t>
+        <w:t xml:space="preserve">. Poster Session, AERA 2026, Los Angeles, </w:t>
+      </w:r>
+      <w:r>
+        <w:rPr>
+          <w:rFonts w:hint="eastAsia"/>
+          <w:color w:val="222222"/>
+          <w:lang w:eastAsia="ko-KR"/>
+        </w:rPr>
+        <w:lastRenderedPageBreak/>
+        <w:t>United States.</w:t>
       </w:r>
     </w:p>
     <w:p>
@@ -27122,7 +27442,6 @@
           <w:color w:val="222222"/>
           <w:lang w:eastAsia="ko-KR"/>
         </w:rPr>
-        <w:lastRenderedPageBreak/>
         <w:t>d</w:t>
       </w:r>
       <w:r>
@@ -29887,7 +30206,15 @@
           <w:color w:val="222222"/>
           <w:lang w:eastAsia="ko-KR"/>
         </w:rPr>
-        <w:t>Echo-Teddy: Preliminary Design and Development of Large Language Model-based Social Robot for Autistic Students</w:t>
+        <w:t xml:space="preserve">Echo-Teddy: Preliminary Design and Development of Large </w:t>
+      </w:r>
+      <w:r>
+        <w:rPr>
+          <w:color w:val="222222"/>
+          <w:lang w:eastAsia="ko-KR"/>
+        </w:rPr>
+        <w:lastRenderedPageBreak/>
+        <w:t>Language Model-based Social Robot for Autistic Students</w:t>
       </w:r>
       <w:r>
         <w:rPr>
@@ -30390,7 +30717,6 @@
           <w:color w:val="222222"/>
           <w:lang w:eastAsia="ko-KR"/>
         </w:rPr>
-        <w:lastRenderedPageBreak/>
         <w:t>[</w:t>
       </w:r>
       <w:r>
@@ -31903,6 +32229,7 @@
         <w:ind w:left="720" w:hanging="720"/>
       </w:pPr>
       <w:r>
+        <w:lastRenderedPageBreak/>
         <w:t>[</w:t>
       </w:r>
       <w:r>
@@ -32083,7 +32410,6 @@
         <w:ind w:left="720" w:hanging="720"/>
       </w:pPr>
       <w:r>
-        <w:lastRenderedPageBreak/>
         <w:t>[3</w:t>
       </w:r>
       <w:r>
@@ -33263,6 +33589,7 @@
         </w:rPr>
       </w:pPr>
       <w:r>
+        <w:lastRenderedPageBreak/>
         <w:t xml:space="preserve">[20] </w:t>
       </w:r>
       <w:r>
@@ -33851,7 +34178,6 @@
         </w:rPr>
       </w:pPr>
       <w:r>
-        <w:lastRenderedPageBreak/>
         <w:t xml:space="preserve">[17] </w:t>
       </w:r>
       <w:r>
@@ -35377,6 +35703,7 @@
         </w:rPr>
       </w:pPr>
       <w:r>
+        <w:lastRenderedPageBreak/>
         <w:t xml:space="preserve">[7] </w:t>
       </w:r>
       <w:r>
@@ -35454,11 +35781,7 @@
         <w:t>Math learning through game-based architectural design and building</w:t>
       </w:r>
       <w:r>
-        <w:t xml:space="preserve">. </w:t>
-      </w:r>
-      <w:r>
-        <w:lastRenderedPageBreak/>
-        <w:t>Paper presented at 2017 American Educational Research Association Annual Meeting, American Educational Research Association, San Antonio</w:t>
+        <w:t>. Paper presented at 2017 American Educational Research Association Annual Meeting, American Educational Research Association, San Antonio</w:t>
       </w:r>
       <w:r>
         <w:t>, TX</w:t>
@@ -35850,7 +36173,7 @@
           <w:szCs w:val="28"/>
           <w:lang w:eastAsia="ko-KR"/>
         </w:rPr>
-        <w:t>40</w:t>
+        <w:t>39</w:t>
       </w:r>
       <w:r>
         <w:rPr>
@@ -35978,7 +36301,7 @@
           <w:bCs/>
           <w:lang w:eastAsia="ko-KR"/>
         </w:rPr>
-        <w:t>2</w:t>
+        <w:t>1</w:t>
       </w:r>
       <w:r>
         <w:rPr>
@@ -36021,7 +36344,7 @@
           <w:u w:val="single"/>
           <w:lang w:eastAsia="ko-KR"/>
         </w:rPr>
-        <w:t>30</w:t>
+        <w:t>29</w:t>
       </w:r>
       <w:r>
         <w:rPr>
@@ -36038,16 +36361,29 @@
       <w:pPr>
         <w:ind w:left="720" w:hanging="720"/>
         <w:rPr>
-          <w:rFonts w:hint="eastAsia"/>
-          <w:lang w:eastAsia="ko-KR"/>
-        </w:rPr>
-      </w:pPr>
-      <w:r>
-        <w:rPr>
-          <w:rFonts w:hint="eastAsia"/>
-          <w:lang w:eastAsia="ko-KR"/>
-        </w:rPr>
-        <w:t xml:space="preserve">[30] Lim, J., </w:t>
+          <w:lang w:eastAsia="ko-KR"/>
+        </w:rPr>
+      </w:pPr>
+      <w:r>
+        <w:rPr>
+          <w:rFonts w:hint="eastAsia"/>
+          <w:lang w:eastAsia="ko-KR"/>
+        </w:rPr>
+        <w:t>[</w:t>
+      </w:r>
+      <w:r>
+        <w:rPr>
+          <w:rFonts w:hint="eastAsia"/>
+          <w:lang w:eastAsia="ko-KR"/>
+        </w:rPr>
+        <w:t>29</w:t>
+      </w:r>
+      <w:r>
+        <w:rPr>
+          <w:rFonts w:hint="eastAsia"/>
+          <w:lang w:eastAsia="ko-KR"/>
+        </w:rPr>
+        <w:t xml:space="preserve">] Lim, J., </w:t>
       </w:r>
       <w:r>
         <w:rPr>
@@ -36227,7 +36563,21 @@
           <w:rFonts w:hint="eastAsia"/>
           <w:lang w:eastAsia="ko-KR"/>
         </w:rPr>
-        <w:t xml:space="preserve">[29] </w:t>
+        <w:t>[2</w:t>
+      </w:r>
+      <w:r>
+        <w:rPr>
+          <w:rFonts w:hint="eastAsia"/>
+          <w:lang w:eastAsia="ko-KR"/>
+        </w:rPr>
+        <w:t>8</w:t>
+      </w:r>
+      <w:r>
+        <w:rPr>
+          <w:rFonts w:hint="eastAsia"/>
+          <w:lang w:eastAsia="ko-KR"/>
+        </w:rPr>
+        <w:t xml:space="preserve">] </w:t>
       </w:r>
       <w:r>
         <w:t xml:space="preserve">‡ </w:t>
@@ -36430,7 +36780,7 @@
           <w:rFonts w:hint="eastAsia"/>
           <w:lang w:eastAsia="ko-KR"/>
         </w:rPr>
-        <w:t>8</w:t>
+        <w:t>7</w:t>
       </w:r>
       <w:r>
         <w:rPr>
@@ -36619,7 +36969,7 @@
           <w:rFonts w:hint="eastAsia"/>
           <w:lang w:eastAsia="ko-KR"/>
         </w:rPr>
-        <w:t>7</w:t>
+        <w:t>6</w:t>
       </w:r>
       <w:r>
         <w:rPr>
@@ -36856,7 +37206,7 @@
           <w:rFonts w:hint="eastAsia"/>
           <w:lang w:eastAsia="ko-KR"/>
         </w:rPr>
-        <w:t>6</w:t>
+        <w:t>5</w:t>
       </w:r>
       <w:r>
         <w:rPr>
@@ -37107,6 +37457,7 @@
           <w:rFonts w:hint="eastAsia"/>
           <w:lang w:eastAsia="ko-KR"/>
         </w:rPr>
+        <w:lastRenderedPageBreak/>
         <w:t>[2</w:t>
       </w:r>
       <w:r>
@@ -37114,7 +37465,7 @@
           <w:rFonts w:hint="eastAsia"/>
           <w:lang w:eastAsia="ko-KR"/>
         </w:rPr>
-        <w:t>5</w:t>
+        <w:t>4</w:t>
       </w:r>
       <w:r>
         <w:rPr>
@@ -37311,7 +37662,7 @@
           <w:rFonts w:hint="eastAsia"/>
           <w:lang w:eastAsia="ko-KR"/>
         </w:rPr>
-        <w:t>4</w:t>
+        <w:t>3</w:t>
       </w:r>
       <w:r>
         <w:rPr>
@@ -37425,7 +37776,6 @@
           <w:rFonts w:hint="eastAsia"/>
           <w:lang w:eastAsia="ko-KR"/>
         </w:rPr>
-        <w:lastRenderedPageBreak/>
         <w:t>b</w:t>
       </w:r>
       <w:r>
@@ -37531,7 +37881,7 @@
           <w:rFonts w:hint="eastAsia"/>
           <w:lang w:eastAsia="ko-KR"/>
         </w:rPr>
-        <w:t>3</w:t>
+        <w:t>2</w:t>
       </w:r>
       <w:r>
         <w:rPr>
@@ -37762,7 +38112,7 @@
           <w:rFonts w:hint="eastAsia"/>
           <w:lang w:eastAsia="ko-KR"/>
         </w:rPr>
-        <w:t>2</w:t>
+        <w:t>1</w:t>
       </w:r>
       <w:r>
         <w:rPr>
@@ -37930,7 +38280,7 @@
           <w:rFonts w:hint="eastAsia"/>
           <w:lang w:eastAsia="ko-KR"/>
         </w:rPr>
-        <w:t>1</w:t>
+        <w:t>0</w:t>
       </w:r>
       <w:r>
         <w:rPr>
@@ -38005,14 +38355,7 @@
           <w:rFonts w:hint="eastAsia"/>
           <w:lang w:eastAsia="ko-KR"/>
         </w:rPr>
-        <w:t>2</w:t>
-      </w:r>
-      <w:r>
-        <w:rPr>
-          <w:rFonts w:hint="eastAsia"/>
-          <w:lang w:eastAsia="ko-KR"/>
-        </w:rPr>
-        <w:t>0</w:t>
+        <w:t>19</w:t>
       </w:r>
       <w:r>
         <w:rPr>
@@ -38258,7 +38601,14 @@
           <w:rFonts w:hint="eastAsia"/>
           <w:lang w:eastAsia="ko-KR"/>
         </w:rPr>
-        <w:t>19</w:t>
+        <w:t>1</w:t>
+      </w:r>
+      <w:r>
+        <w:rPr>
+          <w:rFonts w:hint="eastAsia"/>
+          <w:lang w:eastAsia="ko-KR"/>
+        </w:rPr>
+        <w:t>8</w:t>
       </w:r>
       <w:r>
         <w:rPr>
@@ -38333,7 +38683,7 @@
           <w:rFonts w:hint="eastAsia"/>
           <w:lang w:eastAsia="ko-KR"/>
         </w:rPr>
-        <w:t>8</w:t>
+        <w:t>7</w:t>
       </w:r>
       <w:r>
         <w:rPr>
@@ -38528,7 +38878,7 @@
           <w:rFonts w:hint="eastAsia"/>
           <w:lang w:eastAsia="ko-KR"/>
         </w:rPr>
-        <w:t>7</w:t>
+        <w:t>6</w:t>
       </w:r>
       <w:r>
         <w:rPr>
@@ -38761,7 +39111,7 @@
           <w:rFonts w:hint="eastAsia"/>
           <w:lang w:eastAsia="ko-KR"/>
         </w:rPr>
-        <w:t>6</w:t>
+        <w:t>5</w:t>
       </w:r>
       <w:r>
         <w:rPr>
@@ -38781,7 +39131,7 @@
           <w:rFonts w:hint="eastAsia"/>
           <w:lang w:eastAsia="ko-KR"/>
         </w:rPr>
-        <w:t xml:space="preserve">Awoyemi, I., &amp; </w:t>
+        <w:t xml:space="preserve">Awoyemi, I., </w:t>
       </w:r>
       <w:r>
         <w:rPr>
@@ -38797,14 +39147,23 @@
           <w:rFonts w:hint="eastAsia"/>
           <w:lang w:eastAsia="ko-KR"/>
         </w:rPr>
-        <w:t>.</w:t>
-      </w:r>
-      <w:r>
-        <w:rPr>
-          <w:rFonts w:hint="eastAsia"/>
-          <w:lang w:eastAsia="ko-KR"/>
-        </w:rPr>
-        <w:t>, Abu, S., &amp; Song, S.</w:t>
+        <w:t>., &amp;</w:t>
+      </w:r>
+      <w:r>
+        <w:rPr>
+          <w:rFonts w:hint="eastAsia"/>
+          <w:b/>
+          <w:bCs/>
+          <w:lang w:eastAsia="ko-KR"/>
+        </w:rPr>
+        <w:t xml:space="preserve"> </w:t>
+      </w:r>
+      <w:r>
+        <w:rPr>
+          <w:rFonts w:hint="eastAsia"/>
+          <w:lang w:eastAsia="ko-KR"/>
+        </w:rPr>
+        <w:t>Song, S.</w:t>
       </w:r>
       <w:r>
         <w:rPr>
@@ -38831,7 +39190,111 @@
         <w:rPr>
           <w:lang w:eastAsia="ko-KR"/>
         </w:rPr>
-        <w:t xml:space="preserve">From </w:t>
+        <w:t xml:space="preserve">Design and </w:t>
+      </w:r>
+      <w:r>
+        <w:rPr>
+          <w:rFonts w:hint="eastAsia"/>
+          <w:lang w:eastAsia="ko-KR"/>
+        </w:rPr>
+        <w:t>d</w:t>
+      </w:r>
+      <w:r>
+        <w:rPr>
+          <w:lang w:eastAsia="ko-KR"/>
+        </w:rPr>
+        <w:t xml:space="preserve">evelopment </w:t>
+      </w:r>
+      <w:r>
+        <w:rPr>
+          <w:rFonts w:hint="eastAsia"/>
+          <w:lang w:eastAsia="ko-KR"/>
+        </w:rPr>
+        <w:t>r</w:t>
+      </w:r>
+      <w:r>
+        <w:rPr>
+          <w:lang w:eastAsia="ko-KR"/>
+        </w:rPr>
+        <w:t xml:space="preserve">esearch of </w:t>
+      </w:r>
+      <w:r>
+        <w:rPr>
+          <w:rFonts w:hint="eastAsia"/>
+          <w:lang w:eastAsia="ko-KR"/>
+        </w:rPr>
+        <w:t>i</w:t>
+      </w:r>
+      <w:r>
+        <w:rPr>
+          <w:lang w:eastAsia="ko-KR"/>
+        </w:rPr>
+        <w:t xml:space="preserve">mmersive </w:t>
+      </w:r>
+      <w:r>
+        <w:rPr>
+          <w:rFonts w:hint="eastAsia"/>
+          <w:lang w:eastAsia="ko-KR"/>
+        </w:rPr>
+        <w:t>v</w:t>
+      </w:r>
+      <w:r>
+        <w:rPr>
+          <w:lang w:eastAsia="ko-KR"/>
+        </w:rPr>
+        <w:t xml:space="preserve">irtual </w:t>
+      </w:r>
+      <w:r>
+        <w:rPr>
+          <w:rFonts w:hint="eastAsia"/>
+          <w:lang w:eastAsia="ko-KR"/>
+        </w:rPr>
+        <w:t>r</w:t>
+      </w:r>
+      <w:r>
+        <w:rPr>
+          <w:lang w:eastAsia="ko-KR"/>
+        </w:rPr>
+        <w:t xml:space="preserve">eality-supported </w:t>
+      </w:r>
+      <w:r>
+        <w:rPr>
+          <w:rFonts w:hint="eastAsia"/>
+          <w:lang w:eastAsia="ko-KR"/>
+        </w:rPr>
+        <w:t>s</w:t>
+      </w:r>
+      <w:r>
+        <w:rPr>
+          <w:lang w:eastAsia="ko-KR"/>
+        </w:rPr>
+        <w:t xml:space="preserve">afety </w:t>
+      </w:r>
+      <w:r>
+        <w:rPr>
+          <w:rFonts w:hint="eastAsia"/>
+          <w:lang w:eastAsia="ko-KR"/>
+        </w:rPr>
+        <w:t>t</w:t>
+      </w:r>
+      <w:r>
+        <w:rPr>
+          <w:lang w:eastAsia="ko-KR"/>
+        </w:rPr>
+        <w:t xml:space="preserve">raining for </w:t>
+      </w:r>
+      <w:r>
+        <w:rPr>
+          <w:rFonts w:hint="eastAsia"/>
+          <w:lang w:eastAsia="ko-KR"/>
+        </w:rPr>
+        <w:t>c</w:t>
+      </w:r>
+      <w:r>
+        <w:rPr>
+          <w:lang w:eastAsia="ko-KR"/>
+        </w:rPr>
+        <w:t xml:space="preserve">onstruction </w:t>
       </w:r>
       <w:r>
         <w:rPr>
@@ -38844,33 +39307,7 @@
         <w:rPr>
           <w:lang w:eastAsia="ko-KR"/>
         </w:rPr>
-        <w:t xml:space="preserve">xperience to </w:t>
-      </w:r>
-      <w:r>
-        <w:rPr>
-          <w:rFonts w:hint="eastAsia"/>
-          <w:lang w:eastAsia="ko-KR"/>
-        </w:rPr>
-        <w:t>a</w:t>
-      </w:r>
-      <w:r>
-        <w:rPr>
-          <w:lang w:eastAsia="ko-KR"/>
-        </w:rPr>
-        <w:t xml:space="preserve">ction: Sequential </w:t>
-      </w:r>
-      <w:r>
-        <w:rPr>
-          <w:rFonts w:hint="eastAsia"/>
-          <w:lang w:eastAsia="ko-KR"/>
-        </w:rPr>
-        <w:t>d</w:t>
-      </w:r>
-      <w:r>
-        <w:rPr>
-          <w:lang w:eastAsia="ko-KR"/>
-        </w:rPr>
-        <w:t xml:space="preserve">ynamics of </w:t>
+        <w:t xml:space="preserve">ngineering </w:t>
       </w:r>
       <w:r>
         <w:rPr>
@@ -38883,98 +39320,7 @@
         <w:rPr>
           <w:lang w:eastAsia="ko-KR"/>
         </w:rPr>
-        <w:t xml:space="preserve">xperiential </w:t>
-      </w:r>
-      <w:r>
-        <w:rPr>
-          <w:rFonts w:hint="eastAsia"/>
-          <w:lang w:eastAsia="ko-KR"/>
-        </w:rPr>
-        <w:t>l</w:t>
-      </w:r>
-      <w:r>
-        <w:rPr>
-          <w:lang w:eastAsia="ko-KR"/>
-        </w:rPr>
-        <w:t xml:space="preserve">earning in </w:t>
-      </w:r>
-      <w:r>
-        <w:rPr>
-          <w:rFonts w:hint="eastAsia"/>
-          <w:lang w:eastAsia="ko-KR"/>
-        </w:rPr>
-        <w:t>i</w:t>
-      </w:r>
-      <w:r>
-        <w:rPr>
-          <w:lang w:eastAsia="ko-KR"/>
-        </w:rPr>
-        <w:t xml:space="preserve">mmersive </w:t>
-      </w:r>
-      <w:r>
-        <w:rPr>
-          <w:rFonts w:hint="eastAsia"/>
-          <w:lang w:eastAsia="ko-KR"/>
-        </w:rPr>
-        <w:t>v</w:t>
-      </w:r>
-      <w:r>
-        <w:rPr>
-          <w:lang w:eastAsia="ko-KR"/>
-        </w:rPr>
-        <w:t xml:space="preserve">irtual </w:t>
-      </w:r>
-      <w:r>
-        <w:rPr>
-          <w:rFonts w:hint="eastAsia"/>
-          <w:lang w:eastAsia="ko-KR"/>
-        </w:rPr>
-        <w:t>r</w:t>
-      </w:r>
-      <w:r>
-        <w:rPr>
-          <w:lang w:eastAsia="ko-KR"/>
-        </w:rPr>
-        <w:t>eality-</w:t>
-      </w:r>
-      <w:r>
-        <w:rPr>
-          <w:rFonts w:hint="eastAsia"/>
-          <w:lang w:eastAsia="ko-KR"/>
-        </w:rPr>
-        <w:t>s</w:t>
-      </w:r>
-      <w:r>
-        <w:rPr>
-          <w:lang w:eastAsia="ko-KR"/>
-        </w:rPr>
-        <w:t xml:space="preserve">upported </w:t>
-      </w:r>
-      <w:r>
-        <w:rPr>
-          <w:rFonts w:hint="eastAsia"/>
-          <w:lang w:eastAsia="ko-KR"/>
-        </w:rPr>
-        <w:t>s</w:t>
-      </w:r>
-      <w:r>
-        <w:rPr>
-          <w:lang w:eastAsia="ko-KR"/>
-        </w:rPr>
-        <w:t xml:space="preserve">afety </w:t>
-      </w:r>
-      <w:r>
-        <w:rPr>
-          <w:rFonts w:hint="eastAsia"/>
-          <w:lang w:eastAsia="ko-KR"/>
-        </w:rPr>
-        <w:t>t</w:t>
-      </w:r>
-      <w:r>
-        <w:rPr>
-          <w:lang w:eastAsia="ko-KR"/>
-        </w:rPr>
-        <w:t>raining</w:t>
+        <w:t>ducation</w:t>
       </w:r>
       <w:r>
         <w:rPr>
@@ -38990,11 +39336,13 @@
           <w:iCs/>
           <w:lang w:eastAsia="ko-KR"/>
         </w:rPr>
-        <w:t>Interactive Learning Environments</w:t>
-      </w:r>
-      <w:r>
-        <w:rPr>
-          <w:rFonts w:hint="eastAsia"/>
+        <w:t>Educational Technology Research and Development</w:t>
+      </w:r>
+      <w:r>
+        <w:rPr>
+          <w:rFonts w:hint="eastAsia"/>
+          <w:i/>
+          <w:iCs/>
           <w:lang w:eastAsia="ko-KR"/>
         </w:rPr>
         <w:t xml:space="preserve"> </w:t>
@@ -39020,7 +39368,9 @@
       <w:pPr>
         <w:ind w:left="720" w:hanging="720"/>
         <w:rPr>
-          <w:lang w:eastAsia="ko-KR"/>
+          <w:bCs/>
+          <w:i/>
+          <w:iCs/>
         </w:rPr>
       </w:pPr>
       <w:r>
@@ -39042,7 +39392,7 @@
           <w:rFonts w:hint="eastAsia"/>
           <w:lang w:eastAsia="ko-KR"/>
         </w:rPr>
-        <w:t>5</w:t>
+        <w:t>4</w:t>
       </w:r>
       <w:r>
         <w:rPr>
@@ -39052,9 +39402,29 @@
         <w:t xml:space="preserve">] </w:t>
       </w:r>
       <w:r>
-        <w:t>*</w:t>
-      </w:r>
-      <w:r>
+        <w:t xml:space="preserve">‡ </w:t>
+      </w:r>
+      <w:r>
+        <w:rPr>
+          <w:rFonts w:hint="eastAsia"/>
+          <w:b/>
+          <w:bCs/>
+          <w:lang w:eastAsia="ko-KR"/>
+        </w:rPr>
+        <w:t>Moon, J</w:t>
+      </w:r>
+      <w:r>
+        <w:rPr>
+          <w:rFonts w:hint="eastAsia"/>
+          <w:lang w:eastAsia="ko-KR"/>
+        </w:rPr>
+        <w:t>.,</w:t>
+      </w:r>
+      <w:r>
+        <w:rPr>
+          <w:rFonts w:hint="eastAsia"/>
+          <w:lang w:eastAsia="ko-KR"/>
+        </w:rPr>
         <w:t xml:space="preserve"> </w:t>
       </w:r>
       <w:r>
@@ -39062,79 +39432,26 @@
           <w:rFonts w:hint="eastAsia"/>
           <w:lang w:eastAsia="ko-KR"/>
         </w:rPr>
-        <w:t xml:space="preserve">Awoyemi, I., </w:t>
-      </w:r>
-      <w:r>
-        <w:rPr>
-          <w:rFonts w:hint="eastAsia"/>
-          <w:b/>
-          <w:bCs/>
-          <w:lang w:eastAsia="ko-KR"/>
-        </w:rPr>
-        <w:t>Moon, J</w:t>
-      </w:r>
-      <w:r>
-        <w:rPr>
-          <w:rFonts w:hint="eastAsia"/>
-          <w:lang w:eastAsia="ko-KR"/>
-        </w:rPr>
-        <w:t>., &amp;</w:t>
-      </w:r>
-      <w:r>
-        <w:rPr>
-          <w:rFonts w:hint="eastAsia"/>
-          <w:b/>
-          <w:bCs/>
-          <w:lang w:eastAsia="ko-KR"/>
-        </w:rPr>
-        <w:t xml:space="preserve"> </w:t>
-      </w:r>
-      <w:r>
-        <w:rPr>
-          <w:rFonts w:hint="eastAsia"/>
-          <w:lang w:eastAsia="ko-KR"/>
-        </w:rPr>
-        <w:t>Song, S.</w:t>
-      </w:r>
-      <w:r>
-        <w:rPr>
-          <w:rFonts w:hint="eastAsia"/>
-          <w:lang w:eastAsia="ko-KR"/>
-        </w:rPr>
-        <w:t xml:space="preserve"> (</w:t>
-      </w:r>
-      <w:r>
-        <w:rPr>
-          <w:rFonts w:hint="eastAsia"/>
-          <w:lang w:eastAsia="ko-KR"/>
-        </w:rPr>
-        <w:t>Under review</w:t>
-      </w:r>
-      <w:r>
-        <w:rPr>
-          <w:rFonts w:hint="eastAsia"/>
-          <w:lang w:eastAsia="ko-KR"/>
-        </w:rPr>
-        <w:t xml:space="preserve">). </w:t>
-      </w:r>
-      <w:r>
-        <w:rPr>
-          <w:lang w:eastAsia="ko-KR"/>
-        </w:rPr>
-        <w:t xml:space="preserve">Design and </w:t>
-      </w:r>
-      <w:r>
-        <w:rPr>
-          <w:rFonts w:hint="eastAsia"/>
-          <w:lang w:eastAsia="ko-KR"/>
-        </w:rPr>
-        <w:t>d</w:t>
-      </w:r>
-      <w:r>
-        <w:rPr>
-          <w:lang w:eastAsia="ko-KR"/>
-        </w:rPr>
-        <w:t xml:space="preserve">evelopment </w:t>
+        <w:t xml:space="preserve">Lee, Y., &amp; Na, H. (Submitted). </w:t>
+      </w:r>
+      <w:r>
+        <w:rPr>
+          <w:lang w:eastAsia="ko-KR"/>
+        </w:rPr>
+        <w:t xml:space="preserve">Strategic </w:t>
+      </w:r>
+      <w:r>
+        <w:rPr>
+          <w:rFonts w:hint="eastAsia"/>
+          <w:lang w:eastAsia="ko-KR"/>
+        </w:rPr>
+        <w:t>s</w:t>
+      </w:r>
+      <w:r>
+        <w:rPr>
+          <w:lang w:eastAsia="ko-KR"/>
+        </w:rPr>
+        <w:t>elf-</w:t>
       </w:r>
       <w:r>
         <w:rPr>
@@ -39147,46 +39464,85 @@
         <w:rPr>
           <w:lang w:eastAsia="ko-KR"/>
         </w:rPr>
-        <w:t xml:space="preserve">esearch of </w:t>
-      </w:r>
-      <w:r>
-        <w:rPr>
-          <w:rFonts w:hint="eastAsia"/>
-          <w:lang w:eastAsia="ko-KR"/>
-        </w:rPr>
-        <w:t>i</w:t>
-      </w:r>
-      <w:r>
-        <w:rPr>
-          <w:lang w:eastAsia="ko-KR"/>
-        </w:rPr>
-        <w:t xml:space="preserve">mmersive </w:t>
-      </w:r>
-      <w:r>
-        <w:rPr>
-          <w:rFonts w:hint="eastAsia"/>
-          <w:lang w:eastAsia="ko-KR"/>
-        </w:rPr>
-        <w:t>v</w:t>
-      </w:r>
-      <w:r>
-        <w:rPr>
-          <w:lang w:eastAsia="ko-KR"/>
-        </w:rPr>
-        <w:t xml:space="preserve">irtual </w:t>
-      </w:r>
-      <w:r>
-        <w:rPr>
-          <w:rFonts w:hint="eastAsia"/>
-          <w:lang w:eastAsia="ko-KR"/>
-        </w:rPr>
-        <w:t>r</w:t>
-      </w:r>
-      <w:r>
-        <w:rPr>
-          <w:lang w:eastAsia="ko-KR"/>
-        </w:rPr>
-        <w:t xml:space="preserve">eality-supported </w:t>
+        <w:t xml:space="preserve">egulation and </w:t>
+      </w:r>
+      <w:r>
+        <w:rPr>
+          <w:rFonts w:hint="eastAsia"/>
+          <w:lang w:eastAsia="ko-KR"/>
+        </w:rPr>
+        <w:t>l</w:t>
+      </w:r>
+      <w:r>
+        <w:rPr>
+          <w:lang w:eastAsia="ko-KR"/>
+        </w:rPr>
+        <w:t xml:space="preserve">earner </w:t>
+      </w:r>
+      <w:r>
+        <w:rPr>
+          <w:rFonts w:hint="eastAsia"/>
+          <w:lang w:eastAsia="ko-KR"/>
+        </w:rPr>
+        <w:t>a</w:t>
+      </w:r>
+      <w:r>
+        <w:rPr>
+          <w:lang w:eastAsia="ko-KR"/>
+        </w:rPr>
+        <w:t xml:space="preserve">rchetypes in </w:t>
+      </w:r>
+      <w:r>
+        <w:rPr>
+          <w:rFonts w:hint="eastAsia"/>
+          <w:lang w:eastAsia="ko-KR"/>
+        </w:rPr>
+        <w:t>c</w:t>
+      </w:r>
+      <w:r>
+        <w:rPr>
+          <w:lang w:eastAsia="ko-KR"/>
+        </w:rPr>
+        <w:t xml:space="preserve">omputational </w:t>
+      </w:r>
+      <w:r>
+        <w:rPr>
+          <w:rFonts w:hint="eastAsia"/>
+          <w:lang w:eastAsia="ko-KR"/>
+        </w:rPr>
+        <w:t>t</w:t>
+      </w:r>
+      <w:r>
+        <w:rPr>
+          <w:lang w:eastAsia="ko-KR"/>
+        </w:rPr>
+        <w:t xml:space="preserve">hinking: A </w:t>
+      </w:r>
+      <w:r>
+        <w:rPr>
+          <w:rFonts w:hint="eastAsia"/>
+          <w:lang w:eastAsia="ko-KR"/>
+        </w:rPr>
+        <w:t>p</w:t>
+      </w:r>
+      <w:r>
+        <w:rPr>
+          <w:lang w:eastAsia="ko-KR"/>
+        </w:rPr>
+        <w:t xml:space="preserve">rocess </w:t>
+      </w:r>
+      <w:r>
+        <w:rPr>
+          <w:rFonts w:hint="eastAsia"/>
+          <w:lang w:eastAsia="ko-KR"/>
+        </w:rPr>
+        <w:t>m</w:t>
+      </w:r>
+      <w:r>
+        <w:rPr>
+          <w:lang w:eastAsia="ko-KR"/>
+        </w:rPr>
+        <w:t xml:space="preserve">ining </w:t>
       </w:r>
       <w:r>
         <w:rPr>
@@ -39199,59 +39555,59 @@
         <w:rPr>
           <w:lang w:eastAsia="ko-KR"/>
         </w:rPr>
-        <w:t xml:space="preserve">afety </w:t>
-      </w:r>
-      <w:r>
-        <w:rPr>
-          <w:rFonts w:hint="eastAsia"/>
-          <w:lang w:eastAsia="ko-KR"/>
-        </w:rPr>
-        <w:t>t</w:t>
-      </w:r>
-      <w:r>
-        <w:rPr>
-          <w:lang w:eastAsia="ko-KR"/>
-        </w:rPr>
-        <w:t xml:space="preserve">raining for </w:t>
-      </w:r>
-      <w:r>
-        <w:rPr>
-          <w:rFonts w:hint="eastAsia"/>
-          <w:lang w:eastAsia="ko-KR"/>
-        </w:rPr>
-        <w:t>c</w:t>
-      </w:r>
-      <w:r>
-        <w:rPr>
-          <w:lang w:eastAsia="ko-KR"/>
-        </w:rPr>
-        <w:t xml:space="preserve">onstruction </w:t>
-      </w:r>
-      <w:r>
-        <w:rPr>
-          <w:rFonts w:hint="eastAsia"/>
-          <w:lang w:eastAsia="ko-KR"/>
-        </w:rPr>
-        <w:t>e</w:t>
-      </w:r>
-      <w:r>
-        <w:rPr>
-          <w:lang w:eastAsia="ko-KR"/>
-        </w:rPr>
-        <w:t xml:space="preserve">ngineering </w:t>
-      </w:r>
-      <w:r>
-        <w:rPr>
-          <w:rFonts w:hint="eastAsia"/>
-          <w:lang w:eastAsia="ko-KR"/>
-        </w:rPr>
-        <w:t>e</w:t>
-      </w:r>
-      <w:r>
-        <w:rPr>
-          <w:lang w:eastAsia="ko-KR"/>
-        </w:rPr>
-        <w:t>ducation</w:t>
+        <w:t xml:space="preserve">tudy of </w:t>
+      </w:r>
+      <w:r>
+        <w:rPr>
+          <w:rFonts w:hint="eastAsia"/>
+          <w:lang w:eastAsia="ko-KR"/>
+        </w:rPr>
+        <w:t>g</w:t>
+      </w:r>
+      <w:r>
+        <w:rPr>
+          <w:lang w:eastAsia="ko-KR"/>
+        </w:rPr>
+        <w:t>ame-</w:t>
+      </w:r>
+      <w:r>
+        <w:rPr>
+          <w:rFonts w:hint="eastAsia"/>
+          <w:lang w:eastAsia="ko-KR"/>
+        </w:rPr>
+        <w:t>b</w:t>
+      </w:r>
+      <w:r>
+        <w:rPr>
+          <w:lang w:eastAsia="ko-KR"/>
+        </w:rPr>
+        <w:t xml:space="preserve">ased </w:t>
+      </w:r>
+      <w:r>
+        <w:rPr>
+          <w:rFonts w:hint="eastAsia"/>
+          <w:lang w:eastAsia="ko-KR"/>
+        </w:rPr>
+        <w:t>p</w:t>
+      </w:r>
+      <w:r>
+        <w:rPr>
+          <w:lang w:eastAsia="ko-KR"/>
+        </w:rPr>
+        <w:t xml:space="preserve">roblem </w:t>
+      </w:r>
+      <w:r>
+        <w:rPr>
+          <w:rFonts w:hint="eastAsia"/>
+          <w:lang w:eastAsia="ko-KR"/>
+        </w:rPr>
+        <w:t>s</w:t>
+      </w:r>
+      <w:r>
+        <w:rPr>
+          <w:lang w:eastAsia="ko-KR"/>
+        </w:rPr>
+        <w:t>olving</w:t>
       </w:r>
       <w:r>
         <w:rPr>
@@ -39267,32 +39623,46 @@
           <w:iCs/>
           <w:lang w:eastAsia="ko-KR"/>
         </w:rPr>
-        <w:t>Educational Technology Research and Development</w:t>
-      </w:r>
-      <w:r>
-        <w:rPr>
-          <w:rFonts w:hint="eastAsia"/>
-          <w:i/>
-          <w:iCs/>
-          <w:lang w:eastAsia="ko-KR"/>
-        </w:rPr>
-        <w:t xml:space="preserve"> </w:t>
-      </w:r>
-      <w:r>
-        <w:rPr>
-          <w:rFonts w:hint="eastAsia"/>
-          <w:lang w:eastAsia="ko-KR"/>
-        </w:rPr>
-        <w:t>(SSCI-indexed)</w:t>
-      </w:r>
-      <w:r>
-        <w:rPr>
-          <w:rFonts w:hint="eastAsia"/>
-          <w:i/>
-          <w:iCs/>
-          <w:lang w:eastAsia="ko-KR"/>
-        </w:rPr>
-        <w:t>.</w:t>
+        <w:t>Journal of Educational Computing Research</w:t>
+      </w:r>
+      <w:r>
+        <w:rPr>
+          <w:rFonts w:hint="eastAsia"/>
+          <w:lang w:eastAsia="ko-KR"/>
+        </w:rPr>
+        <w:t xml:space="preserve">. </w:t>
+      </w:r>
+      <w:r>
+        <w:rPr>
+          <w:bCs/>
+          <w:i/>
+          <w:iCs/>
+        </w:rPr>
+        <w:t>(</w:t>
+      </w:r>
+      <w:r>
+        <w:rPr>
+          <w:rFonts w:hint="eastAsia"/>
+          <w:bCs/>
+          <w:i/>
+          <w:iCs/>
+          <w:lang w:eastAsia="ko-KR"/>
+        </w:rPr>
+        <w:t>S</w:t>
+      </w:r>
+      <w:r>
+        <w:rPr>
+          <w:bCs/>
+        </w:rPr>
+        <w:t>SCI-indexed journal</w:t>
+      </w:r>
+      <w:r>
+        <w:rPr>
+          <w:bCs/>
+          <w:i/>
+          <w:iCs/>
+        </w:rPr>
+        <w:t>).</w:t>
       </w:r>
     </w:p>
     <w:p>
@@ -39309,21 +39679,14 @@
           <w:rFonts w:hint="eastAsia"/>
           <w:lang w:eastAsia="ko-KR"/>
         </w:rPr>
-        <w:t>[</w:t>
-      </w:r>
-      <w:r>
-        <w:rPr>
-          <w:rFonts w:hint="eastAsia"/>
-          <w:lang w:eastAsia="ko-KR"/>
-        </w:rPr>
-        <w:t>1</w:t>
-      </w:r>
-      <w:r>
-        <w:rPr>
-          <w:rFonts w:hint="eastAsia"/>
-          <w:lang w:eastAsia="ko-KR"/>
-        </w:rPr>
-        <w:t>4</w:t>
+        <w:t>[1</w:t>
+      </w:r>
+      <w:r>
+        <w:rPr>
+          <w:rFonts w:hint="eastAsia"/>
+          <w:lang w:eastAsia="ko-KR"/>
+        </w:rPr>
+        <w:t>3</w:t>
       </w:r>
       <w:r>
         <w:rPr>
@@ -39349,27 +39712,172 @@
           <w:rFonts w:hint="eastAsia"/>
           <w:lang w:eastAsia="ko-KR"/>
         </w:rPr>
-        <w:t>.,</w:t>
-      </w:r>
-      <w:r>
-        <w:rPr>
-          <w:rFonts w:hint="eastAsia"/>
-          <w:lang w:eastAsia="ko-KR"/>
-        </w:rPr>
-        <w:t xml:space="preserve"> </w:t>
-      </w:r>
-      <w:r>
-        <w:rPr>
-          <w:rFonts w:hint="eastAsia"/>
-          <w:lang w:eastAsia="ko-KR"/>
-        </w:rPr>
-        <w:t xml:space="preserve">Lee, Y., &amp; Na, H. (Submitted). </w:t>
-      </w:r>
-      <w:r>
-        <w:rPr>
-          <w:lang w:eastAsia="ko-KR"/>
-        </w:rPr>
-        <w:t xml:space="preserve">Strategic </w:t>
+        <w:t xml:space="preserve">., </w:t>
+      </w:r>
+      <w:r>
+        <w:rPr>
+          <w:rFonts w:hint="eastAsia"/>
+          <w:lang w:eastAsia="ko-KR"/>
+        </w:rPr>
+        <w:t>Aldemir, T.</w:t>
+      </w:r>
+      <w:r>
+        <w:rPr>
+          <w:rFonts w:hint="eastAsia"/>
+          <w:lang w:eastAsia="ko-KR"/>
+        </w:rPr>
+        <w:t>, &amp; Byun, G.</w:t>
+      </w:r>
+      <w:r>
+        <w:rPr>
+          <w:rFonts w:hint="eastAsia"/>
+          <w:lang w:eastAsia="ko-KR"/>
+        </w:rPr>
+        <w:t xml:space="preserve"> (</w:t>
+      </w:r>
+      <w:r>
+        <w:rPr>
+          <w:rFonts w:hint="eastAsia"/>
+          <w:lang w:eastAsia="ko-KR"/>
+        </w:rPr>
+        <w:t xml:space="preserve">Under </w:t>
+      </w:r>
+      <w:r>
+        <w:rPr>
+          <w:rFonts w:hint="eastAsia"/>
+          <w:lang w:eastAsia="ko-KR"/>
+        </w:rPr>
+        <w:t>review</w:t>
+      </w:r>
+      <w:r>
+        <w:rPr>
+          <w:rFonts w:hint="eastAsia"/>
+          <w:lang w:eastAsia="ko-KR"/>
+        </w:rPr>
+        <w:t xml:space="preserve">). </w:t>
+      </w:r>
+      <w:r>
+        <w:rPr>
+          <w:lang w:eastAsia="ko-KR"/>
+        </w:rPr>
+        <w:t xml:space="preserve">Design </w:t>
+      </w:r>
+      <w:r>
+        <w:rPr>
+          <w:rFonts w:hint="eastAsia"/>
+          <w:lang w:eastAsia="ko-KR"/>
+        </w:rPr>
+        <w:t>a</w:t>
+      </w:r>
+      <w:r>
+        <w:rPr>
+          <w:lang w:eastAsia="ko-KR"/>
+        </w:rPr>
+        <w:t xml:space="preserve">ffordance </w:t>
+      </w:r>
+      <w:r>
+        <w:rPr>
+          <w:rFonts w:hint="eastAsia"/>
+          <w:lang w:eastAsia="ko-KR"/>
+        </w:rPr>
+        <w:t>d</w:t>
+      </w:r>
+      <w:r>
+        <w:rPr>
+          <w:lang w:eastAsia="ko-KR"/>
+        </w:rPr>
+        <w:t xml:space="preserve">iagnostic </w:t>
+      </w:r>
+      <w:r>
+        <w:rPr>
+          <w:rFonts w:hint="eastAsia"/>
+          <w:lang w:eastAsia="ko-KR"/>
+        </w:rPr>
+        <w:t>f</w:t>
+      </w:r>
+      <w:r>
+        <w:rPr>
+          <w:lang w:eastAsia="ko-KR"/>
+        </w:rPr>
+        <w:t xml:space="preserve">ramework for </w:t>
+      </w:r>
+      <w:r>
+        <w:rPr>
+          <w:rFonts w:hint="eastAsia"/>
+          <w:lang w:eastAsia="ko-KR"/>
+        </w:rPr>
+        <w:t>c</w:t>
+      </w:r>
+      <w:r>
+        <w:rPr>
+          <w:lang w:eastAsia="ko-KR"/>
+        </w:rPr>
+        <w:t xml:space="preserve">omputational </w:t>
+      </w:r>
+      <w:r>
+        <w:rPr>
+          <w:rFonts w:hint="eastAsia"/>
+          <w:lang w:eastAsia="ko-KR"/>
+        </w:rPr>
+        <w:t>t</w:t>
+      </w:r>
+      <w:r>
+        <w:rPr>
+          <w:lang w:eastAsia="ko-KR"/>
+        </w:rPr>
+        <w:t xml:space="preserve">hinking </w:t>
+      </w:r>
+      <w:r>
+        <w:rPr>
+          <w:rFonts w:hint="eastAsia"/>
+          <w:lang w:eastAsia="ko-KR"/>
+        </w:rPr>
+        <w:t>a</w:t>
+      </w:r>
+      <w:r>
+        <w:rPr>
+          <w:lang w:eastAsia="ko-KR"/>
+        </w:rPr>
+        <w:t xml:space="preserve">ssessment interactive </w:t>
+      </w:r>
+      <w:r>
+        <w:rPr>
+          <w:rFonts w:hint="eastAsia"/>
+          <w:lang w:eastAsia="ko-KR"/>
+        </w:rPr>
+        <w:t>vi</w:t>
+      </w:r>
+      <w:r>
+        <w:rPr>
+          <w:lang w:eastAsia="ko-KR"/>
+        </w:rPr>
+        <w:t xml:space="preserve">rtual </w:t>
+      </w:r>
+      <w:r>
+        <w:rPr>
+          <w:rFonts w:hint="eastAsia"/>
+          <w:lang w:eastAsia="ko-KR"/>
+        </w:rPr>
+        <w:t>m</w:t>
+      </w:r>
+      <w:r>
+        <w:rPr>
+          <w:lang w:eastAsia="ko-KR"/>
+        </w:rPr>
+        <w:t xml:space="preserve">akerspaces: An </w:t>
+      </w:r>
+      <w:r>
+        <w:rPr>
+          <w:rFonts w:hint="eastAsia"/>
+          <w:lang w:eastAsia="ko-KR"/>
+        </w:rPr>
+        <w:t>e</w:t>
+      </w:r>
+      <w:r>
+        <w:rPr>
+          <w:lang w:eastAsia="ko-KR"/>
+        </w:rPr>
+        <w:t xml:space="preserve">xploratory </w:t>
       </w:r>
       <w:r>
         <w:rPr>
@@ -39382,163 +39890,7 @@
         <w:rPr>
           <w:lang w:eastAsia="ko-KR"/>
         </w:rPr>
-        <w:t>elf-</w:t>
-      </w:r>
-      <w:r>
-        <w:rPr>
-          <w:rFonts w:hint="eastAsia"/>
-          <w:lang w:eastAsia="ko-KR"/>
-        </w:rPr>
-        <w:t>r</w:t>
-      </w:r>
-      <w:r>
-        <w:rPr>
-          <w:lang w:eastAsia="ko-KR"/>
-        </w:rPr>
-        <w:t xml:space="preserve">egulation and </w:t>
-      </w:r>
-      <w:r>
-        <w:rPr>
-          <w:rFonts w:hint="eastAsia"/>
-          <w:lang w:eastAsia="ko-KR"/>
-        </w:rPr>
-        <w:t>l</w:t>
-      </w:r>
-      <w:r>
-        <w:rPr>
-          <w:lang w:eastAsia="ko-KR"/>
-        </w:rPr>
-        <w:t xml:space="preserve">earner </w:t>
-      </w:r>
-      <w:r>
-        <w:rPr>
-          <w:rFonts w:hint="eastAsia"/>
-          <w:lang w:eastAsia="ko-KR"/>
-        </w:rPr>
-        <w:t>a</w:t>
-      </w:r>
-      <w:r>
-        <w:rPr>
-          <w:lang w:eastAsia="ko-KR"/>
-        </w:rPr>
-        <w:t xml:space="preserve">rchetypes in </w:t>
-      </w:r>
-      <w:r>
-        <w:rPr>
-          <w:rFonts w:hint="eastAsia"/>
-          <w:lang w:eastAsia="ko-KR"/>
-        </w:rPr>
-        <w:t>c</w:t>
-      </w:r>
-      <w:r>
-        <w:rPr>
-          <w:lang w:eastAsia="ko-KR"/>
-        </w:rPr>
-        <w:t xml:space="preserve">omputational </w:t>
-      </w:r>
-      <w:r>
-        <w:rPr>
-          <w:rFonts w:hint="eastAsia"/>
-          <w:lang w:eastAsia="ko-KR"/>
-        </w:rPr>
-        <w:t>t</w:t>
-      </w:r>
-      <w:r>
-        <w:rPr>
-          <w:lang w:eastAsia="ko-KR"/>
-        </w:rPr>
-        <w:t xml:space="preserve">hinking: A </w:t>
-      </w:r>
-      <w:r>
-        <w:rPr>
-          <w:rFonts w:hint="eastAsia"/>
-          <w:lang w:eastAsia="ko-KR"/>
-        </w:rPr>
-        <w:t>p</w:t>
-      </w:r>
-      <w:r>
-        <w:rPr>
-          <w:lang w:eastAsia="ko-KR"/>
-        </w:rPr>
-        <w:t xml:space="preserve">rocess </w:t>
-      </w:r>
-      <w:r>
-        <w:rPr>
-          <w:rFonts w:hint="eastAsia"/>
-          <w:lang w:eastAsia="ko-KR"/>
-        </w:rPr>
-        <w:t>m</w:t>
-      </w:r>
-      <w:r>
-        <w:rPr>
-          <w:lang w:eastAsia="ko-KR"/>
-        </w:rPr>
-        <w:t xml:space="preserve">ining </w:t>
-      </w:r>
-      <w:r>
-        <w:rPr>
-          <w:rFonts w:hint="eastAsia"/>
-          <w:lang w:eastAsia="ko-KR"/>
-        </w:rPr>
-        <w:t>s</w:t>
-      </w:r>
-      <w:r>
-        <w:rPr>
-          <w:lang w:eastAsia="ko-KR"/>
-        </w:rPr>
-        <w:t xml:space="preserve">tudy of </w:t>
-      </w:r>
-      <w:r>
-        <w:rPr>
-          <w:rFonts w:hint="eastAsia"/>
-          <w:lang w:eastAsia="ko-KR"/>
-        </w:rPr>
-        <w:t>g</w:t>
-      </w:r>
-      <w:r>
-        <w:rPr>
-          <w:lang w:eastAsia="ko-KR"/>
-        </w:rPr>
-        <w:t>ame-</w:t>
-      </w:r>
-      <w:r>
-        <w:rPr>
-          <w:rFonts w:hint="eastAsia"/>
-          <w:lang w:eastAsia="ko-KR"/>
-        </w:rPr>
-        <w:t>b</w:t>
-      </w:r>
-      <w:r>
-        <w:rPr>
-          <w:lang w:eastAsia="ko-KR"/>
-        </w:rPr>
-        <w:t xml:space="preserve">ased </w:t>
-      </w:r>
-      <w:r>
-        <w:rPr>
-          <w:rFonts w:hint="eastAsia"/>
-          <w:lang w:eastAsia="ko-KR"/>
-        </w:rPr>
-        <w:t>p</w:t>
-      </w:r>
-      <w:r>
-        <w:rPr>
-          <w:lang w:eastAsia="ko-KR"/>
-        </w:rPr>
-        <w:t xml:space="preserve">roblem </w:t>
-      </w:r>
-      <w:r>
-        <w:rPr>
-          <w:rFonts w:hint="eastAsia"/>
-          <w:lang w:eastAsia="ko-KR"/>
-        </w:rPr>
-        <w:t>s</w:t>
-      </w:r>
-      <w:r>
-        <w:rPr>
-          <w:lang w:eastAsia="ko-KR"/>
-        </w:rPr>
-        <w:t>olving</w:t>
+        <w:t>tudy</w:t>
       </w:r>
       <w:r>
         <w:rPr>
@@ -39554,7 +39906,7 @@
           <w:iCs/>
           <w:lang w:eastAsia="ko-KR"/>
         </w:rPr>
-        <w:t>Journal of Educational Computing Research</w:t>
+        <w:t>Interactive Learning Environments</w:t>
       </w:r>
       <w:r>
         <w:rPr>
@@ -39573,19 +39925,15 @@
       </w:r>
       <w:r>
         <w:rPr>
-          <w:rFonts w:hint="eastAsia"/>
-          <w:bCs/>
-          <w:i/>
-          <w:iCs/>
-          <w:lang w:eastAsia="ko-KR"/>
-        </w:rPr>
-        <w:t>S</w:t>
-      </w:r>
-      <w:r>
-        <w:rPr>
-          <w:bCs/>
-        </w:rPr>
-        <w:t>SCI-indexed journal</w:t>
+          <w:bCs/>
+        </w:rPr>
+        <w:t>SSCI</w:t>
+      </w:r>
+      <w:r>
+        <w:rPr>
+          <w:bCs/>
+        </w:rPr>
+        <w:t>-indexed journal</w:t>
       </w:r>
       <w:r>
         <w:rPr>
@@ -39600,9 +39948,9 @@
       <w:pPr>
         <w:ind w:left="720" w:hanging="720"/>
         <w:rPr>
-          <w:bCs/>
-          <w:i/>
-          <w:iCs/>
+          <w:i/>
+          <w:iCs/>
+          <w:lang w:eastAsia="ko-KR"/>
         </w:rPr>
       </w:pPr>
       <w:r>
@@ -39617,7 +39965,7 @@
           <w:rFonts w:hint="eastAsia"/>
           <w:lang w:eastAsia="ko-KR"/>
         </w:rPr>
-        <w:t>3</w:t>
+        <w:t>2</w:t>
       </w:r>
       <w:r>
         <w:rPr>
@@ -39627,37 +39975,47 @@
         <w:t xml:space="preserve">] </w:t>
       </w:r>
       <w:r>
-        <w:t xml:space="preserve">‡ </w:t>
-      </w:r>
-      <w:r>
-        <w:rPr>
-          <w:rFonts w:hint="eastAsia"/>
-          <w:b/>
-          <w:bCs/>
-          <w:lang w:eastAsia="ko-KR"/>
-        </w:rPr>
-        <w:t>Moon, J</w:t>
-      </w:r>
-      <w:r>
-        <w:rPr>
-          <w:rFonts w:hint="eastAsia"/>
-          <w:lang w:eastAsia="ko-KR"/>
-        </w:rPr>
-        <w:t xml:space="preserve">., </w:t>
-      </w:r>
-      <w:r>
-        <w:rPr>
-          <w:rFonts w:hint="eastAsia"/>
-          <w:lang w:eastAsia="ko-KR"/>
-        </w:rPr>
-        <w:t>Aldemir, T.</w:t>
-      </w:r>
-      <w:r>
-        <w:rPr>
-          <w:rFonts w:hint="eastAsia"/>
-          <w:lang w:eastAsia="ko-KR"/>
-        </w:rPr>
-        <w:t>, &amp; Byun, G.</w:t>
+        <w:rPr>
+          <w:lang w:eastAsia="ko-KR"/>
+        </w:rPr>
+        <w:t>Lee,</w:t>
+      </w:r>
+      <w:r>
+        <w:rPr>
+          <w:rFonts w:hint="eastAsia"/>
+          <w:lang w:eastAsia="ko-KR"/>
+        </w:rPr>
+        <w:t xml:space="preserve"> H., </w:t>
+      </w:r>
+      <w:r>
+        <w:rPr>
+          <w:lang w:eastAsia="ko-KR"/>
+        </w:rPr>
+        <w:t>Lim,</w:t>
+      </w:r>
+      <w:r>
+        <w:rPr>
+          <w:rFonts w:hint="eastAsia"/>
+          <w:lang w:eastAsia="ko-KR"/>
+        </w:rPr>
+        <w:t xml:space="preserve"> J., &amp; </w:t>
+      </w:r>
+      <w:r>
+        <w:rPr>
+          <w:b/>
+          <w:bCs/>
+          <w:lang w:eastAsia="ko-KR"/>
+        </w:rPr>
+        <w:t>Moon</w:t>
+      </w:r>
+      <w:r>
+        <w:rPr>
+          <w:rFonts w:hint="eastAsia"/>
+          <w:b/>
+          <w:bCs/>
+          <w:lang w:eastAsia="ko-KR"/>
+        </w:rPr>
+        <w:t>, J.</w:t>
       </w:r>
       <w:r>
         <w:rPr>
@@ -39671,27 +40029,20 @@
           <w:rFonts w:hint="eastAsia"/>
           <w:lang w:eastAsia="ko-KR"/>
         </w:rPr>
-        <w:t xml:space="preserve">Under </w:t>
-      </w:r>
-      <w:r>
-        <w:rPr>
-          <w:rFonts w:hint="eastAsia"/>
-          <w:lang w:eastAsia="ko-KR"/>
-        </w:rPr>
-        <w:t>review</w:t>
-      </w:r>
-      <w:r>
-        <w:rPr>
-          <w:rFonts w:hint="eastAsia"/>
-          <w:lang w:eastAsia="ko-KR"/>
-        </w:rPr>
-        <w:t xml:space="preserve">). </w:t>
-      </w:r>
-      <w:r>
-        <w:rPr>
-          <w:lang w:eastAsia="ko-KR"/>
-        </w:rPr>
-        <w:t xml:space="preserve">Design </w:t>
+        <w:t>Submitted</w:t>
+      </w:r>
+      <w:r>
+        <w:rPr>
+          <w:rFonts w:hint="eastAsia"/>
+          <w:lang w:eastAsia="ko-KR"/>
+        </w:rPr>
+        <w:t>). S</w:t>
+      </w:r>
+      <w:r>
+        <w:rPr>
+          <w:lang w:eastAsia="ko-KR"/>
+        </w:rPr>
+        <w:t xml:space="preserve">emantic trajectory </w:t>
       </w:r>
       <w:r>
         <w:rPr>
@@ -39704,183 +40055,107 @@
         <w:rPr>
           <w:lang w:eastAsia="ko-KR"/>
         </w:rPr>
-        <w:t xml:space="preserve">ffordance </w:t>
-      </w:r>
-      <w:r>
-        <w:rPr>
-          <w:rFonts w:hint="eastAsia"/>
-          <w:lang w:eastAsia="ko-KR"/>
-        </w:rPr>
-        <w:t>d</w:t>
-      </w:r>
-      <w:r>
-        <w:rPr>
-          <w:lang w:eastAsia="ko-KR"/>
-        </w:rPr>
-        <w:t xml:space="preserve">iagnostic </w:t>
-      </w:r>
-      <w:r>
-        <w:rPr>
-          <w:rFonts w:hint="eastAsia"/>
-          <w:lang w:eastAsia="ko-KR"/>
-        </w:rPr>
-        <w:t>f</w:t>
-      </w:r>
-      <w:r>
-        <w:rPr>
-          <w:lang w:eastAsia="ko-KR"/>
-        </w:rPr>
-        <w:t xml:space="preserve">ramework for </w:t>
-      </w:r>
-      <w:r>
-        <w:rPr>
-          <w:rFonts w:hint="eastAsia"/>
-          <w:lang w:eastAsia="ko-KR"/>
-        </w:rPr>
-        <w:t>c</w:t>
-      </w:r>
-      <w:r>
-        <w:rPr>
-          <w:lang w:eastAsia="ko-KR"/>
-        </w:rPr>
-        <w:t xml:space="preserve">omputational </w:t>
-      </w:r>
-      <w:r>
-        <w:rPr>
-          <w:rFonts w:hint="eastAsia"/>
-          <w:lang w:eastAsia="ko-KR"/>
-        </w:rPr>
-        <w:t>t</w:t>
-      </w:r>
-      <w:r>
-        <w:rPr>
-          <w:lang w:eastAsia="ko-KR"/>
-        </w:rPr>
-        <w:t xml:space="preserve">hinking </w:t>
-      </w:r>
-      <w:r>
-        <w:rPr>
-          <w:rFonts w:hint="eastAsia"/>
-          <w:lang w:eastAsia="ko-KR"/>
-        </w:rPr>
-        <w:t>a</w:t>
-      </w:r>
-      <w:r>
-        <w:rPr>
-          <w:lang w:eastAsia="ko-KR"/>
-        </w:rPr>
-        <w:t xml:space="preserve">ssessment interactive </w:t>
-      </w:r>
-      <w:r>
-        <w:rPr>
-          <w:rFonts w:hint="eastAsia"/>
-          <w:lang w:eastAsia="ko-KR"/>
-        </w:rPr>
-        <w:t>vi</w:t>
-      </w:r>
-      <w:r>
-        <w:rPr>
-          <w:lang w:eastAsia="ko-KR"/>
-        </w:rPr>
-        <w:t xml:space="preserve">rtual </w:t>
-      </w:r>
-      <w:r>
-        <w:rPr>
-          <w:rFonts w:hint="eastAsia"/>
-          <w:lang w:eastAsia="ko-KR"/>
-        </w:rPr>
-        <w:t>m</w:t>
-      </w:r>
-      <w:r>
-        <w:rPr>
-          <w:lang w:eastAsia="ko-KR"/>
-        </w:rPr>
-        <w:t xml:space="preserve">akerspaces: An </w:t>
-      </w:r>
-      <w:r>
-        <w:rPr>
-          <w:rFonts w:hint="eastAsia"/>
-          <w:lang w:eastAsia="ko-KR"/>
-        </w:rPr>
-        <w:t>e</w:t>
-      </w:r>
-      <w:r>
-        <w:rPr>
-          <w:lang w:eastAsia="ko-KR"/>
-        </w:rPr>
-        <w:t xml:space="preserve">xploratory </w:t>
-      </w:r>
-      <w:r>
-        <w:rPr>
-          <w:rFonts w:hint="eastAsia"/>
-          <w:lang w:eastAsia="ko-KR"/>
-        </w:rPr>
-        <w:t>s</w:t>
-      </w:r>
-      <w:r>
-        <w:rPr>
-          <w:lang w:eastAsia="ko-KR"/>
-        </w:rPr>
-        <w:t>tudy</w:t>
-      </w:r>
-      <w:r>
-        <w:rPr>
-          <w:rFonts w:hint="eastAsia"/>
-          <w:lang w:eastAsia="ko-KR"/>
-        </w:rPr>
-        <w:t xml:space="preserve">. </w:t>
-      </w:r>
-      <w:r>
-        <w:rPr>
-          <w:rFonts w:hint="eastAsia"/>
-          <w:i/>
-          <w:iCs/>
-          <w:lang w:eastAsia="ko-KR"/>
-        </w:rPr>
-        <w:t>Interactive Learning Environments</w:t>
-      </w:r>
-      <w:r>
-        <w:rPr>
-          <w:rFonts w:hint="eastAsia"/>
-          <w:lang w:eastAsia="ko-KR"/>
-        </w:rPr>
-        <w:t xml:space="preserve">. </w:t>
-      </w:r>
-      <w:r>
-        <w:rPr>
-          <w:bCs/>
-          <w:i/>
-          <w:iCs/>
-        </w:rPr>
-        <w:t>(</w:t>
-      </w:r>
-      <w:r>
-        <w:rPr>
-          <w:bCs/>
-        </w:rPr>
-        <w:t>SSCI</w:t>
-      </w:r>
-      <w:r>
-        <w:rPr>
-          <w:bCs/>
-        </w:rPr>
-        <w:t>-indexed journal</w:t>
-      </w:r>
-      <w:r>
-        <w:rPr>
-          <w:bCs/>
-          <w:i/>
-          <w:iCs/>
-        </w:rPr>
-        <w:t>).</w:t>
+        <w:t xml:space="preserve">nalysis of </w:t>
+      </w:r>
+      <w:r>
+        <w:rPr>
+          <w:rFonts w:hint="eastAsia"/>
+          <w:lang w:eastAsia="ko-KR"/>
+        </w:rPr>
+        <w:t>l</w:t>
+      </w:r>
+      <w:r>
+        <w:rPr>
+          <w:lang w:eastAsia="ko-KR"/>
+        </w:rPr>
+        <w:t xml:space="preserve">earner </w:t>
+      </w:r>
+      <w:r>
+        <w:rPr>
+          <w:rFonts w:hint="eastAsia"/>
+          <w:lang w:eastAsia="ko-KR"/>
+        </w:rPr>
+        <w:t>q</w:t>
+      </w:r>
+      <w:r>
+        <w:rPr>
+          <w:lang w:eastAsia="ko-KR"/>
+        </w:rPr>
+        <w:t>uestion in AI</w:t>
+      </w:r>
+      <w:r>
+        <w:rPr>
+          <w:rFonts w:hint="eastAsia"/>
+          <w:lang w:eastAsia="ko-KR"/>
+        </w:rPr>
+        <w:t>-</w:t>
+      </w:r>
+      <w:r>
+        <w:rPr>
+          <w:lang w:eastAsia="ko-KR"/>
+        </w:rPr>
+        <w:t xml:space="preserve">based </w:t>
+      </w:r>
+      <w:r>
+        <w:rPr>
+          <w:rFonts w:hint="eastAsia"/>
+          <w:lang w:eastAsia="ko-KR"/>
+        </w:rPr>
+        <w:t>l</w:t>
+      </w:r>
+      <w:r>
+        <w:rPr>
+          <w:lang w:eastAsia="ko-KR"/>
+        </w:rPr>
+        <w:t>earning: Comparing RAG-</w:t>
+      </w:r>
+      <w:r>
+        <w:rPr>
+          <w:rFonts w:hint="eastAsia"/>
+          <w:lang w:eastAsia="ko-KR"/>
+        </w:rPr>
+        <w:t>b</w:t>
+      </w:r>
+      <w:r>
+        <w:rPr>
+          <w:lang w:eastAsia="ko-KR"/>
+        </w:rPr>
+        <w:t xml:space="preserve">ased and </w:t>
+      </w:r>
+      <w:r>
+        <w:rPr>
+          <w:rFonts w:hint="eastAsia"/>
+          <w:lang w:eastAsia="ko-KR"/>
+        </w:rPr>
+        <w:t>g</w:t>
+      </w:r>
+      <w:r>
+        <w:rPr>
+          <w:lang w:eastAsia="ko-KR"/>
+        </w:rPr>
+        <w:t>enerative AI.</w:t>
+      </w:r>
+      <w:r>
+        <w:rPr>
+          <w:rFonts w:hint="eastAsia"/>
+          <w:lang w:eastAsia="ko-KR"/>
+        </w:rPr>
+        <w:t xml:space="preserve"> </w:t>
+      </w:r>
+      <w:r>
+        <w:rPr>
+          <w:rFonts w:hint="eastAsia"/>
+          <w:i/>
+          <w:iCs/>
+          <w:lang w:eastAsia="ko-KR"/>
+        </w:rPr>
+        <w:t xml:space="preserve">Journal of Educational Data Mining. </w:t>
       </w:r>
     </w:p>
     <w:p>
       <w:pPr>
         <w:ind w:left="720" w:hanging="720"/>
         <w:rPr>
-          <w:i/>
-          <w:iCs/>
           <w:lang w:eastAsia="ko-KR"/>
         </w:rPr>
       </w:pPr>
@@ -39896,7 +40171,7 @@
           <w:rFonts w:hint="eastAsia"/>
           <w:lang w:eastAsia="ko-KR"/>
         </w:rPr>
-        <w:t>2</w:t>
+        <w:t>1</w:t>
       </w:r>
       <w:r>
         <w:rPr>
@@ -39960,20 +40235,137 @@
           <w:rFonts w:hint="eastAsia"/>
           <w:lang w:eastAsia="ko-KR"/>
         </w:rPr>
-        <w:t>Submitted</w:t>
-      </w:r>
-      <w:r>
-        <w:rPr>
-          <w:rFonts w:hint="eastAsia"/>
-          <w:lang w:eastAsia="ko-KR"/>
-        </w:rPr>
-        <w:t>). S</w:t>
-      </w:r>
-      <w:r>
-        <w:rPr>
-          <w:lang w:eastAsia="ko-KR"/>
-        </w:rPr>
-        <w:t xml:space="preserve">emantic trajectory </w:t>
+        <w:t>Under review</w:t>
+      </w:r>
+      <w:r>
+        <w:rPr>
+          <w:rFonts w:hint="eastAsia"/>
+          <w:lang w:eastAsia="ko-KR"/>
+        </w:rPr>
+        <w:t xml:space="preserve">). </w:t>
+      </w:r>
+      <w:r>
+        <w:rPr>
+          <w:lang w:eastAsia="ko-KR"/>
+        </w:rPr>
+        <w:t xml:space="preserve">Designing for </w:t>
+      </w:r>
+      <w:r>
+        <w:rPr>
+          <w:rFonts w:hint="eastAsia"/>
+          <w:lang w:eastAsia="ko-KR"/>
+        </w:rPr>
+        <w:t>t</w:t>
+      </w:r>
+      <w:r>
+        <w:rPr>
+          <w:lang w:eastAsia="ko-KR"/>
+        </w:rPr>
+        <w:t xml:space="preserve">rust in </w:t>
+      </w:r>
+      <w:r>
+        <w:rPr>
+          <w:rFonts w:hint="eastAsia"/>
+          <w:lang w:eastAsia="ko-KR"/>
+        </w:rPr>
+        <w:t>b</w:t>
+      </w:r>
+      <w:r>
+        <w:rPr>
+          <w:lang w:eastAsia="ko-KR"/>
+        </w:rPr>
+        <w:t>lack-</w:t>
+      </w:r>
+      <w:r>
+        <w:rPr>
+          <w:rFonts w:hint="eastAsia"/>
+          <w:lang w:eastAsia="ko-KR"/>
+        </w:rPr>
+        <w:t>b</w:t>
+      </w:r>
+      <w:r>
+        <w:rPr>
+          <w:lang w:eastAsia="ko-KR"/>
+        </w:rPr>
+        <w:t xml:space="preserve">ox AI: The </w:t>
+      </w:r>
+      <w:r>
+        <w:rPr>
+          <w:rFonts w:hint="eastAsia"/>
+          <w:lang w:eastAsia="ko-KR"/>
+        </w:rPr>
+        <w:t>e</w:t>
+      </w:r>
+      <w:r>
+        <w:rPr>
+          <w:lang w:eastAsia="ko-KR"/>
+        </w:rPr>
+        <w:t xml:space="preserve">ffects of RAG based AI </w:t>
+      </w:r>
+      <w:r>
+        <w:rPr>
+          <w:rFonts w:hint="eastAsia"/>
+          <w:lang w:eastAsia="ko-KR"/>
+        </w:rPr>
+        <w:t>t</w:t>
+      </w:r>
+      <w:r>
+        <w:rPr>
+          <w:lang w:eastAsia="ko-KR"/>
+        </w:rPr>
+        <w:t xml:space="preserve">utor </w:t>
+      </w:r>
+      <w:r>
+        <w:rPr>
+          <w:rFonts w:hint="eastAsia"/>
+          <w:lang w:eastAsia="ko-KR"/>
+        </w:rPr>
+        <w:t>c</w:t>
+      </w:r>
+      <w:r>
+        <w:rPr>
+          <w:lang w:eastAsia="ko-KR"/>
+        </w:rPr>
+        <w:t xml:space="preserve">hatbot on AI </w:t>
+      </w:r>
+      <w:r>
+        <w:rPr>
+          <w:rFonts w:hint="eastAsia"/>
+          <w:lang w:eastAsia="ko-KR"/>
+        </w:rPr>
+        <w:t>t</w:t>
+      </w:r>
+      <w:r>
+        <w:rPr>
+          <w:lang w:eastAsia="ko-KR"/>
+        </w:rPr>
+        <w:t xml:space="preserve">rust, </w:t>
+      </w:r>
+      <w:r>
+        <w:rPr>
+          <w:rFonts w:hint="eastAsia"/>
+          <w:lang w:eastAsia="ko-KR"/>
+        </w:rPr>
+        <w:t>l</w:t>
+      </w:r>
+      <w:r>
+        <w:rPr>
+          <w:lang w:eastAsia="ko-KR"/>
+        </w:rPr>
+        <w:t xml:space="preserve">earning </w:t>
+      </w:r>
+      <w:r>
+        <w:rPr>
+          <w:rFonts w:hint="eastAsia"/>
+          <w:lang w:eastAsia="ko-KR"/>
+        </w:rPr>
+        <w:t>e</w:t>
+      </w:r>
+      <w:r>
+        <w:rPr>
+          <w:lang w:eastAsia="ko-KR"/>
+        </w:rPr>
+        <w:t xml:space="preserve">ngagement and </w:t>
       </w:r>
       <w:r>
         <w:rPr>
@@ -39986,108 +40378,91 @@
         <w:rPr>
           <w:lang w:eastAsia="ko-KR"/>
         </w:rPr>
-        <w:t xml:space="preserve">nalysis of </w:t>
-      </w:r>
-      <w:r>
-        <w:rPr>
-          <w:rFonts w:hint="eastAsia"/>
-          <w:lang w:eastAsia="ko-KR"/>
-        </w:rPr>
-        <w:t>l</w:t>
-      </w:r>
-      <w:r>
-        <w:rPr>
-          <w:lang w:eastAsia="ko-KR"/>
-        </w:rPr>
-        <w:t xml:space="preserve">earner </w:t>
-      </w:r>
-      <w:r>
-        <w:rPr>
-          <w:rFonts w:hint="eastAsia"/>
-          <w:lang w:eastAsia="ko-KR"/>
-        </w:rPr>
-        <w:t>q</w:t>
-      </w:r>
-      <w:r>
-        <w:rPr>
-          <w:lang w:eastAsia="ko-KR"/>
-        </w:rPr>
-        <w:t>uestion in AI</w:t>
-      </w:r>
-      <w:r>
-        <w:rPr>
-          <w:rFonts w:hint="eastAsia"/>
-          <w:lang w:eastAsia="ko-KR"/>
-        </w:rPr>
-        <w:t>-</w:t>
-      </w:r>
-      <w:r>
-        <w:rPr>
-          <w:lang w:eastAsia="ko-KR"/>
-        </w:rPr>
-        <w:t xml:space="preserve">based </w:t>
-      </w:r>
-      <w:r>
-        <w:rPr>
-          <w:rFonts w:hint="eastAsia"/>
-          <w:lang w:eastAsia="ko-KR"/>
-        </w:rPr>
-        <w:t>l</w:t>
-      </w:r>
-      <w:r>
-        <w:rPr>
-          <w:lang w:eastAsia="ko-KR"/>
-        </w:rPr>
-        <w:t>earning: Comparing RAG-</w:t>
-      </w:r>
-      <w:r>
-        <w:rPr>
-          <w:rFonts w:hint="eastAsia"/>
-          <w:lang w:eastAsia="ko-KR"/>
-        </w:rPr>
-        <w:t>b</w:t>
-      </w:r>
-      <w:r>
-        <w:rPr>
-          <w:lang w:eastAsia="ko-KR"/>
-        </w:rPr>
-        <w:t xml:space="preserve">ased and </w:t>
-      </w:r>
-      <w:r>
-        <w:rPr>
-          <w:rFonts w:hint="eastAsia"/>
-          <w:lang w:eastAsia="ko-KR"/>
-        </w:rPr>
-        <w:t>g</w:t>
-      </w:r>
-      <w:r>
-        <w:rPr>
-          <w:lang w:eastAsia="ko-KR"/>
-        </w:rPr>
-        <w:t>enerative AI.</w:t>
-      </w:r>
-      <w:r>
-        <w:rPr>
-          <w:rFonts w:hint="eastAsia"/>
-          <w:lang w:eastAsia="ko-KR"/>
-        </w:rPr>
-        <w:t xml:space="preserve"> </w:t>
-      </w:r>
-      <w:r>
-        <w:rPr>
-          <w:rFonts w:hint="eastAsia"/>
-          <w:i/>
-          <w:iCs/>
-          <w:lang w:eastAsia="ko-KR"/>
-        </w:rPr>
-        <w:t xml:space="preserve">Journal of Educational Data Mining. </w:t>
+        <w:t xml:space="preserve">cademic </w:t>
+      </w:r>
+      <w:r>
+        <w:rPr>
+          <w:rFonts w:hint="eastAsia"/>
+          <w:lang w:eastAsia="ko-KR"/>
+        </w:rPr>
+        <w:t>a</w:t>
+      </w:r>
+      <w:r>
+        <w:rPr>
+          <w:lang w:eastAsia="ko-KR"/>
+        </w:rPr>
+        <w:t xml:space="preserve">chievement in </w:t>
+      </w:r>
+      <w:r>
+        <w:rPr>
+          <w:rFonts w:hint="eastAsia"/>
+          <w:lang w:eastAsia="ko-KR"/>
+        </w:rPr>
+        <w:t>h</w:t>
+      </w:r>
+      <w:r>
+        <w:rPr>
+          <w:lang w:eastAsia="ko-KR"/>
+        </w:rPr>
+        <w:t xml:space="preserve">ealth </w:t>
+      </w:r>
+      <w:r>
+        <w:rPr>
+          <w:rFonts w:hint="eastAsia"/>
+          <w:lang w:eastAsia="ko-KR"/>
+        </w:rPr>
+        <w:t>p</w:t>
+      </w:r>
+      <w:r>
+        <w:rPr>
+          <w:lang w:eastAsia="ko-KR"/>
+        </w:rPr>
+        <w:t xml:space="preserve">rofessions </w:t>
+      </w:r>
+      <w:r>
+        <w:rPr>
+          <w:rFonts w:hint="eastAsia"/>
+          <w:lang w:eastAsia="ko-KR"/>
+        </w:rPr>
+        <w:t>e</w:t>
+      </w:r>
+      <w:r>
+        <w:rPr>
+          <w:lang w:eastAsia="ko-KR"/>
+        </w:rPr>
+        <w:t>ducation</w:t>
+      </w:r>
+      <w:r>
+        <w:rPr>
+          <w:rFonts w:hint="eastAsia"/>
+          <w:lang w:eastAsia="ko-KR"/>
+        </w:rPr>
+        <w:t xml:space="preserve">. </w:t>
+      </w:r>
+      <w:r>
+        <w:rPr>
+          <w:rFonts w:hint="eastAsia"/>
+          <w:i/>
+          <w:iCs/>
+          <w:lang w:eastAsia="ko-KR"/>
+        </w:rPr>
+        <w:t>Computers &amp; Education</w:t>
+      </w:r>
+      <w:r>
+        <w:rPr>
+          <w:rFonts w:hint="eastAsia"/>
+          <w:lang w:eastAsia="ko-KR"/>
+        </w:rPr>
+        <w:t>.</w:t>
       </w:r>
     </w:p>
     <w:p>
       <w:pPr>
         <w:ind w:left="720" w:hanging="720"/>
         <w:rPr>
-          <w:lang w:eastAsia="ko-KR"/>
+          <w:bCs/>
+          <w:i/>
+          <w:iCs/>
         </w:rPr>
       </w:pPr>
       <w:r>
@@ -40102,64 +40477,30 @@
           <w:rFonts w:hint="eastAsia"/>
           <w:lang w:eastAsia="ko-KR"/>
         </w:rPr>
-        <w:t>1</w:t>
-      </w:r>
-      <w:r>
-        <w:rPr>
-          <w:rFonts w:hint="eastAsia"/>
-          <w:lang w:eastAsia="ko-KR"/>
-        </w:rPr>
-        <w:t xml:space="preserve">] </w:t>
-      </w:r>
-      <w:r>
-        <w:rPr>
-          <w:lang w:eastAsia="ko-KR"/>
-        </w:rPr>
-        <w:t>Lee,</w:t>
-      </w:r>
-      <w:r>
-        <w:rPr>
-          <w:rFonts w:hint="eastAsia"/>
-          <w:lang w:eastAsia="ko-KR"/>
-        </w:rPr>
-        <w:t xml:space="preserve"> H., </w:t>
-      </w:r>
-      <w:r>
-        <w:rPr>
-          <w:lang w:eastAsia="ko-KR"/>
-        </w:rPr>
-        <w:t>Lim,</w:t>
-      </w:r>
-      <w:r>
-        <w:rPr>
-          <w:rFonts w:hint="eastAsia"/>
-          <w:lang w:eastAsia="ko-KR"/>
-        </w:rPr>
-        <w:t xml:space="preserve"> J., &amp; </w:t>
-      </w:r>
-      <w:r>
-        <w:rPr>
-          <w:b/>
-          <w:bCs/>
-          <w:lang w:eastAsia="ko-KR"/>
-        </w:rPr>
-        <w:t>Moon</w:t>
-      </w:r>
-      <w:r>
-        <w:rPr>
-          <w:rFonts w:hint="eastAsia"/>
-          <w:b/>
-          <w:bCs/>
-          <w:lang w:eastAsia="ko-KR"/>
-        </w:rPr>
-        <w:t>, J.</w:t>
-      </w:r>
-      <w:r>
-        <w:rPr>
-          <w:rFonts w:hint="eastAsia"/>
-          <w:lang w:eastAsia="ko-KR"/>
-        </w:rPr>
-        <w:t xml:space="preserve"> (</w:t>
+        <w:t>0</w:t>
+      </w:r>
+      <w:r>
+        <w:rPr>
+          <w:rFonts w:hint="eastAsia"/>
+          <w:lang w:eastAsia="ko-KR"/>
+        </w:rPr>
+        <w:t xml:space="preserve">] Lim, J., Kim, C., &amp; </w:t>
+      </w:r>
+      <w:r>
+        <w:rPr>
+          <w:rFonts w:hint="eastAsia"/>
+          <w:b/>
+          <w:bCs/>
+          <w:lang w:eastAsia="ko-KR"/>
+        </w:rPr>
+        <w:t>Moon, J</w:t>
+      </w:r>
+      <w:r>
+        <w:rPr>
+          <w:rFonts w:hint="eastAsia"/>
+          <w:lang w:eastAsia="ko-KR"/>
+        </w:rPr>
+        <w:t>. (</w:t>
       </w:r>
       <w:r>
         <w:rPr>
@@ -40179,98 +40520,33 @@
         <w:rPr>
           <w:lang w:eastAsia="ko-KR"/>
         </w:rPr>
-        <w:t xml:space="preserve">Designing for </w:t>
-      </w:r>
-      <w:r>
-        <w:rPr>
-          <w:rFonts w:hint="eastAsia"/>
-          <w:lang w:eastAsia="ko-KR"/>
-        </w:rPr>
-        <w:t>t</w:t>
-      </w:r>
-      <w:r>
-        <w:rPr>
-          <w:lang w:eastAsia="ko-KR"/>
-        </w:rPr>
-        <w:t xml:space="preserve">rust in </w:t>
-      </w:r>
-      <w:r>
-        <w:rPr>
-          <w:rFonts w:hint="eastAsia"/>
-          <w:lang w:eastAsia="ko-KR"/>
-        </w:rPr>
-        <w:t>b</w:t>
-      </w:r>
-      <w:r>
-        <w:rPr>
-          <w:lang w:eastAsia="ko-KR"/>
-        </w:rPr>
-        <w:t>lack-</w:t>
-      </w:r>
-      <w:r>
-        <w:rPr>
-          <w:rFonts w:hint="eastAsia"/>
-          <w:lang w:eastAsia="ko-KR"/>
-        </w:rPr>
-        <w:t>b</w:t>
-      </w:r>
-      <w:r>
-        <w:rPr>
-          <w:lang w:eastAsia="ko-KR"/>
-        </w:rPr>
-        <w:t xml:space="preserve">ox AI: The </w:t>
-      </w:r>
-      <w:r>
-        <w:rPr>
-          <w:rFonts w:hint="eastAsia"/>
-          <w:lang w:eastAsia="ko-KR"/>
-        </w:rPr>
-        <w:t>e</w:t>
-      </w:r>
-      <w:r>
-        <w:rPr>
-          <w:lang w:eastAsia="ko-KR"/>
-        </w:rPr>
-        <w:t xml:space="preserve">ffects of RAG based AI </w:t>
-      </w:r>
-      <w:r>
-        <w:rPr>
-          <w:rFonts w:hint="eastAsia"/>
-          <w:lang w:eastAsia="ko-KR"/>
-        </w:rPr>
-        <w:t>t</w:t>
-      </w:r>
-      <w:r>
-        <w:rPr>
-          <w:lang w:eastAsia="ko-KR"/>
-        </w:rPr>
-        <w:t xml:space="preserve">utor </w:t>
-      </w:r>
-      <w:r>
-        <w:rPr>
-          <w:rFonts w:hint="eastAsia"/>
-          <w:lang w:eastAsia="ko-KR"/>
-        </w:rPr>
-        <w:t>c</w:t>
-      </w:r>
-      <w:r>
-        <w:rPr>
-          <w:lang w:eastAsia="ko-KR"/>
-        </w:rPr>
-        <w:t xml:space="preserve">hatbot on AI </w:t>
-      </w:r>
-      <w:r>
-        <w:rPr>
-          <w:rFonts w:hint="eastAsia"/>
-          <w:lang w:eastAsia="ko-KR"/>
-        </w:rPr>
-        <w:t>t</w:t>
-      </w:r>
-      <w:r>
-        <w:rPr>
-          <w:lang w:eastAsia="ko-KR"/>
-        </w:rPr>
-        <w:t xml:space="preserve">rust, </w:t>
+        <w:t xml:space="preserve">A </w:t>
+      </w:r>
+      <w:r>
+        <w:rPr>
+          <w:rFonts w:hint="eastAsia"/>
+          <w:lang w:eastAsia="ko-KR"/>
+        </w:rPr>
+        <w:t>s</w:t>
+      </w:r>
+      <w:r>
+        <w:rPr>
+          <w:lang w:eastAsia="ko-KR"/>
+        </w:rPr>
+        <w:t xml:space="preserve">ystematic </w:t>
+      </w:r>
+      <w:r>
+        <w:rPr>
+          <w:rFonts w:hint="eastAsia"/>
+          <w:lang w:eastAsia="ko-KR"/>
+        </w:rPr>
+        <w:t>re</w:t>
+      </w:r>
+      <w:r>
+        <w:rPr>
+          <w:lang w:eastAsia="ko-KR"/>
+        </w:rPr>
+        <w:t xml:space="preserve">view of </w:t>
       </w:r>
       <w:r>
         <w:rPr>
@@ -40290,78 +40566,52 @@
           <w:rFonts w:hint="eastAsia"/>
           <w:lang w:eastAsia="ko-KR"/>
         </w:rPr>
-        <w:t>e</w:t>
-      </w:r>
-      <w:r>
-        <w:rPr>
-          <w:lang w:eastAsia="ko-KR"/>
-        </w:rPr>
-        <w:t xml:space="preserve">ngagement and </w:t>
-      </w:r>
-      <w:r>
-        <w:rPr>
-          <w:rFonts w:hint="eastAsia"/>
-          <w:lang w:eastAsia="ko-KR"/>
-        </w:rPr>
         <w:t>a</w:t>
       </w:r>
       <w:r>
         <w:rPr>
           <w:lang w:eastAsia="ko-KR"/>
         </w:rPr>
-        <w:t xml:space="preserve">cademic </w:t>
-      </w:r>
-      <w:r>
-        <w:rPr>
-          <w:rFonts w:hint="eastAsia"/>
-          <w:lang w:eastAsia="ko-KR"/>
-        </w:rPr>
-        <w:t>a</w:t>
-      </w:r>
-      <w:r>
-        <w:rPr>
-          <w:lang w:eastAsia="ko-KR"/>
-        </w:rPr>
-        <w:t xml:space="preserve">chievement in </w:t>
-      </w:r>
-      <w:r>
-        <w:rPr>
-          <w:rFonts w:hint="eastAsia"/>
-          <w:lang w:eastAsia="ko-KR"/>
-        </w:rPr>
-        <w:t>h</w:t>
-      </w:r>
-      <w:r>
-        <w:rPr>
-          <w:lang w:eastAsia="ko-KR"/>
-        </w:rPr>
-        <w:t xml:space="preserve">ealth </w:t>
-      </w:r>
-      <w:r>
-        <w:rPr>
-          <w:rFonts w:hint="eastAsia"/>
-          <w:lang w:eastAsia="ko-KR"/>
-        </w:rPr>
-        <w:t>p</w:t>
-      </w:r>
-      <w:r>
-        <w:rPr>
-          <w:lang w:eastAsia="ko-KR"/>
-        </w:rPr>
-        <w:t xml:space="preserve">rofessions </w:t>
-      </w:r>
-      <w:r>
-        <w:rPr>
-          <w:rFonts w:hint="eastAsia"/>
-          <w:lang w:eastAsia="ko-KR"/>
-        </w:rPr>
-        <w:t>e</w:t>
-      </w:r>
-      <w:r>
-        <w:rPr>
-          <w:lang w:eastAsia="ko-KR"/>
-        </w:rPr>
-        <w:t>ducation</w:t>
+        <w:t xml:space="preserve">nalytics for </w:t>
+      </w:r>
+      <w:r>
+        <w:rPr>
+          <w:rFonts w:hint="eastAsia"/>
+          <w:lang w:eastAsia="ko-KR"/>
+        </w:rPr>
+        <w:t>f</w:t>
+      </w:r>
+      <w:r>
+        <w:rPr>
+          <w:lang w:eastAsia="ko-KR"/>
+        </w:rPr>
+        <w:t xml:space="preserve">eedback </w:t>
+      </w:r>
+      <w:r>
+        <w:rPr>
+          <w:rFonts w:hint="eastAsia"/>
+          <w:lang w:eastAsia="ko-KR"/>
+        </w:rPr>
+        <w:t>s</w:t>
+      </w:r>
+      <w:r>
+        <w:rPr>
+          <w:lang w:eastAsia="ko-KR"/>
+        </w:rPr>
+        <w:t xml:space="preserve">upport in K–12 </w:t>
+      </w:r>
+      <w:r>
+        <w:rPr>
+          <w:rFonts w:hint="eastAsia"/>
+          <w:lang w:eastAsia="ko-KR"/>
+        </w:rPr>
+        <w:t>s</w:t>
+      </w:r>
+      <w:r>
+        <w:rPr>
+          <w:lang w:eastAsia="ko-KR"/>
+        </w:rPr>
+        <w:t>ettings</w:t>
       </w:r>
       <w:r>
         <w:rPr>
@@ -40377,7 +40627,7 @@
           <w:iCs/>
           <w:lang w:eastAsia="ko-KR"/>
         </w:rPr>
-        <w:t>Computers &amp; Education</w:t>
+        <w:t>Educational Research Review</w:t>
       </w:r>
       <w:r>
         <w:rPr>
@@ -40385,6 +40635,42 @@
           <w:lang w:eastAsia="ko-KR"/>
         </w:rPr>
         <w:t>.</w:t>
+      </w:r>
+      <w:r>
+        <w:rPr>
+          <w:rFonts w:hint="eastAsia"/>
+          <w:lang w:eastAsia="ko-KR"/>
+        </w:rPr>
+        <w:t xml:space="preserve"> </w:t>
+      </w:r>
+      <w:r>
+        <w:rPr>
+          <w:bCs/>
+          <w:i/>
+          <w:iCs/>
+        </w:rPr>
+        <w:t>(</w:t>
+      </w:r>
+      <w:r>
+        <w:rPr>
+          <w:bCs/>
+        </w:rPr>
+        <w:t xml:space="preserve">SSCI-indexed </w:t>
+      </w:r>
+      <w:r>
+        <w:rPr>
+          <w:bCs/>
+        </w:rPr>
+        <w:lastRenderedPageBreak/>
+        <w:t>journal</w:t>
+      </w:r>
+      <w:r>
+        <w:rPr>
+          <w:bCs/>
+          <w:i/>
+          <w:iCs/>
+        </w:rPr>
+        <w:t>).</w:t>
       </w:r>
     </w:p>
     <w:p>
@@ -40401,41 +40687,63 @@
           <w:rFonts w:hint="eastAsia"/>
           <w:lang w:eastAsia="ko-KR"/>
         </w:rPr>
-        <w:t>[1</w:t>
-      </w:r>
-      <w:r>
-        <w:rPr>
-          <w:rFonts w:hint="eastAsia"/>
-          <w:lang w:eastAsia="ko-KR"/>
-        </w:rPr>
-        <w:t>0</w:t>
-      </w:r>
-      <w:r>
-        <w:rPr>
-          <w:rFonts w:hint="eastAsia"/>
-          <w:lang w:eastAsia="ko-KR"/>
-        </w:rPr>
-        <w:t xml:space="preserve">] Lim, J., Kim, C., &amp; </w:t>
-      </w:r>
-      <w:r>
-        <w:rPr>
-          <w:rFonts w:hint="eastAsia"/>
-          <w:b/>
-          <w:bCs/>
-          <w:lang w:eastAsia="ko-KR"/>
-        </w:rPr>
-        <w:t>Moon, J</w:t>
-      </w:r>
-      <w:r>
-        <w:rPr>
-          <w:rFonts w:hint="eastAsia"/>
-          <w:lang w:eastAsia="ko-KR"/>
-        </w:rPr>
-        <w:t>. (</w:t>
-      </w:r>
-      <w:r>
-        <w:rPr>
-          <w:rFonts w:hint="eastAsia"/>
+        <w:t>[</w:t>
+      </w:r>
+      <w:r>
+        <w:rPr>
+          <w:rFonts w:hint="eastAsia"/>
+          <w:lang w:eastAsia="ko-KR"/>
+        </w:rPr>
+        <w:t>9</w:t>
+      </w:r>
+      <w:r>
+        <w:rPr>
+          <w:rFonts w:hint="eastAsia"/>
+          <w:lang w:eastAsia="ko-KR"/>
+        </w:rPr>
+        <w:t xml:space="preserve">] * Hong, S., </w:t>
+      </w:r>
+      <w:r>
+        <w:rPr>
+          <w:rFonts w:hint="eastAsia"/>
+          <w:b/>
+          <w:bCs/>
+          <w:lang w:eastAsia="ko-KR"/>
+        </w:rPr>
+        <w:t>Moon, J.</w:t>
+      </w:r>
+      <w:r>
+        <w:rPr>
+          <w:rFonts w:hint="eastAsia"/>
+          <w:lang w:eastAsia="ko-KR"/>
+        </w:rPr>
+        <w:t>,</w:t>
+      </w:r>
+      <w:r>
+        <w:rPr>
+          <w:rFonts w:hint="eastAsia"/>
+          <w:lang w:eastAsia="ko-KR"/>
+        </w:rPr>
+        <w:t xml:space="preserve"> Cho, H., </w:t>
+      </w:r>
+      <w:r>
+        <w:rPr>
+          <w:rFonts w:hint="eastAsia"/>
+          <w:lang w:eastAsia="ko-KR"/>
+        </w:rPr>
+        <w:t>&amp;</w:t>
+      </w:r>
+      <w:r>
+        <w:rPr>
+          <w:rFonts w:hint="eastAsia"/>
+          <w:lang w:eastAsia="ko-KR"/>
+        </w:rPr>
+        <w:t xml:space="preserve"> Lim, C. (</w:t>
+      </w:r>
+      <w:r>
+        <w:rPr>
+          <w:rFonts w:hint="eastAsia"/>
+          <w:bCs/>
           <w:lang w:eastAsia="ko-KR"/>
         </w:rPr>
         <w:t>Under review</w:t>
@@ -40451,238 +40759,6 @@
         <w:rPr>
           <w:lang w:eastAsia="ko-KR"/>
         </w:rPr>
-        <w:t xml:space="preserve">A </w:t>
-      </w:r>
-      <w:r>
-        <w:rPr>
-          <w:rFonts w:hint="eastAsia"/>
-          <w:lang w:eastAsia="ko-KR"/>
-        </w:rPr>
-        <w:t>s</w:t>
-      </w:r>
-      <w:r>
-        <w:rPr>
-          <w:lang w:eastAsia="ko-KR"/>
-        </w:rPr>
-        <w:t xml:space="preserve">ystematic </w:t>
-      </w:r>
-      <w:r>
-        <w:rPr>
-          <w:rFonts w:hint="eastAsia"/>
-          <w:lang w:eastAsia="ko-KR"/>
-        </w:rPr>
-        <w:t>re</w:t>
-      </w:r>
-      <w:r>
-        <w:rPr>
-          <w:lang w:eastAsia="ko-KR"/>
-        </w:rPr>
-        <w:t xml:space="preserve">view of </w:t>
-      </w:r>
-      <w:r>
-        <w:rPr>
-          <w:rFonts w:hint="eastAsia"/>
-          <w:lang w:eastAsia="ko-KR"/>
-        </w:rPr>
-        <w:t>l</w:t>
-      </w:r>
-      <w:r>
-        <w:rPr>
-          <w:lang w:eastAsia="ko-KR"/>
-        </w:rPr>
-        <w:t xml:space="preserve">earning </w:t>
-      </w:r>
-      <w:r>
-        <w:rPr>
-          <w:rFonts w:hint="eastAsia"/>
-          <w:lang w:eastAsia="ko-KR"/>
-        </w:rPr>
-        <w:t>a</w:t>
-      </w:r>
-      <w:r>
-        <w:rPr>
-          <w:lang w:eastAsia="ko-KR"/>
-        </w:rPr>
-        <w:t xml:space="preserve">nalytics for </w:t>
-      </w:r>
-      <w:r>
-        <w:rPr>
-          <w:rFonts w:hint="eastAsia"/>
-          <w:lang w:eastAsia="ko-KR"/>
-        </w:rPr>
-        <w:t>f</w:t>
-      </w:r>
-      <w:r>
-        <w:rPr>
-          <w:lang w:eastAsia="ko-KR"/>
-        </w:rPr>
-        <w:t xml:space="preserve">eedback </w:t>
-      </w:r>
-      <w:r>
-        <w:rPr>
-          <w:rFonts w:hint="eastAsia"/>
-          <w:lang w:eastAsia="ko-KR"/>
-        </w:rPr>
-        <w:t>s</w:t>
-      </w:r>
-      <w:r>
-        <w:rPr>
-          <w:lang w:eastAsia="ko-KR"/>
-        </w:rPr>
-        <w:t xml:space="preserve">upport in K–12 </w:t>
-      </w:r>
-      <w:r>
-        <w:rPr>
-          <w:rFonts w:hint="eastAsia"/>
-          <w:lang w:eastAsia="ko-KR"/>
-        </w:rPr>
-        <w:t>s</w:t>
-      </w:r>
-      <w:r>
-        <w:rPr>
-          <w:lang w:eastAsia="ko-KR"/>
-        </w:rPr>
-        <w:t>ettings</w:t>
-      </w:r>
-      <w:r>
-        <w:rPr>
-          <w:rFonts w:hint="eastAsia"/>
-          <w:lang w:eastAsia="ko-KR"/>
-        </w:rPr>
-        <w:t xml:space="preserve">. </w:t>
-      </w:r>
-      <w:r>
-        <w:rPr>
-          <w:rFonts w:hint="eastAsia"/>
-          <w:i/>
-          <w:iCs/>
-          <w:lang w:eastAsia="ko-KR"/>
-        </w:rPr>
-        <w:t>Educational Research Review</w:t>
-      </w:r>
-      <w:r>
-        <w:rPr>
-          <w:rFonts w:hint="eastAsia"/>
-          <w:lang w:eastAsia="ko-KR"/>
-        </w:rPr>
-        <w:t>.</w:t>
-      </w:r>
-      <w:r>
-        <w:rPr>
-          <w:rFonts w:hint="eastAsia"/>
-          <w:lang w:eastAsia="ko-KR"/>
-        </w:rPr>
-        <w:t xml:space="preserve"> </w:t>
-      </w:r>
-      <w:r>
-        <w:rPr>
-          <w:bCs/>
-          <w:i/>
-          <w:iCs/>
-        </w:rPr>
-        <w:t>(</w:t>
-      </w:r>
-      <w:r>
-        <w:rPr>
-          <w:bCs/>
-        </w:rPr>
-        <w:t>SSCI-indexed journal</w:t>
-      </w:r>
-      <w:r>
-        <w:rPr>
-          <w:bCs/>
-          <w:i/>
-          <w:iCs/>
-        </w:rPr>
-        <w:t>).</w:t>
-      </w:r>
-    </w:p>
-    <w:p>
-      <w:pPr>
-        <w:ind w:left="720" w:hanging="720"/>
-        <w:rPr>
-          <w:bCs/>
-          <w:i/>
-          <w:iCs/>
-        </w:rPr>
-      </w:pPr>
-      <w:r>
-        <w:rPr>
-          <w:rFonts w:hint="eastAsia"/>
-          <w:lang w:eastAsia="ko-KR"/>
-        </w:rPr>
-        <w:t>[</w:t>
-      </w:r>
-      <w:r>
-        <w:rPr>
-          <w:rFonts w:hint="eastAsia"/>
-          <w:lang w:eastAsia="ko-KR"/>
-        </w:rPr>
-        <w:t>9</w:t>
-      </w:r>
-      <w:r>
-        <w:rPr>
-          <w:rFonts w:hint="eastAsia"/>
-          <w:lang w:eastAsia="ko-KR"/>
-        </w:rPr>
-        <w:t xml:space="preserve">] * Hong, S., </w:t>
-      </w:r>
-      <w:r>
-        <w:rPr>
-          <w:rFonts w:hint="eastAsia"/>
-          <w:b/>
-          <w:bCs/>
-          <w:lang w:eastAsia="ko-KR"/>
-        </w:rPr>
-        <w:t>Moon, J.</w:t>
-      </w:r>
-      <w:r>
-        <w:rPr>
-          <w:rFonts w:hint="eastAsia"/>
-          <w:lang w:eastAsia="ko-KR"/>
-        </w:rPr>
-        <w:t>,</w:t>
-      </w:r>
-      <w:r>
-        <w:rPr>
-          <w:rFonts w:hint="eastAsia"/>
-          <w:lang w:eastAsia="ko-KR"/>
-        </w:rPr>
-        <w:t xml:space="preserve"> Cho, H., </w:t>
-      </w:r>
-      <w:r>
-        <w:rPr>
-          <w:rFonts w:hint="eastAsia"/>
-          <w:lang w:eastAsia="ko-KR"/>
-        </w:rPr>
-        <w:t>&amp;</w:t>
-      </w:r>
-      <w:r>
-        <w:rPr>
-          <w:rFonts w:hint="eastAsia"/>
-          <w:lang w:eastAsia="ko-KR"/>
-        </w:rPr>
-        <w:t xml:space="preserve"> Lim, C. (</w:t>
-      </w:r>
-      <w:r>
-        <w:rPr>
-          <w:rFonts w:hint="eastAsia"/>
-          <w:bCs/>
-          <w:lang w:eastAsia="ko-KR"/>
-        </w:rPr>
-        <w:t>Under review</w:t>
-      </w:r>
-      <w:r>
-        <w:rPr>
-          <w:rFonts w:hint="eastAsia"/>
-          <w:lang w:eastAsia="ko-KR"/>
-        </w:rPr>
-        <w:t xml:space="preserve">). </w:t>
-      </w:r>
-      <w:r>
-        <w:rPr>
-          <w:lang w:eastAsia="ko-KR"/>
-        </w:rPr>
         <w:t xml:space="preserve">Using a </w:t>
       </w:r>
       <w:r>
@@ -40716,7 +40792,6 @@
           <w:rFonts w:hint="eastAsia"/>
           <w:lang w:eastAsia="ko-KR"/>
         </w:rPr>
-        <w:lastRenderedPageBreak/>
         <w:t>c</w:t>
       </w:r>
       <w:r>
@@ -43321,7 +43396,15 @@
           <w:bCs/>
           <w:lang w:eastAsia="ko-KR"/>
         </w:rPr>
-        <w:t xml:space="preserve">). How Technology is Shaping K-12 Science Learning: A Scoping Review. </w:t>
+        <w:t xml:space="preserve">). How Technology is Shaping K-12 Science </w:t>
+      </w:r>
+      <w:r>
+        <w:rPr>
+          <w:bCs/>
+          <w:lang w:eastAsia="ko-KR"/>
+        </w:rPr>
+        <w:lastRenderedPageBreak/>
+        <w:t xml:space="preserve">Learning: A Scoping Review. </w:t>
       </w:r>
       <w:r>
         <w:rPr>
@@ -43401,15 +43484,7 @@
           <w:bCs/>
           <w:lang w:eastAsia="ko-KR"/>
         </w:rPr>
-        <w:t xml:space="preserve">., Kourkoulou, T., Aldemir, T., Abu, S., Lee, </w:t>
-      </w:r>
-      <w:r>
-        <w:rPr>
-          <w:bCs/>
-          <w:lang w:eastAsia="ko-KR"/>
-        </w:rPr>
-        <w:lastRenderedPageBreak/>
-        <w:t>H., &amp; Song, D. (</w:t>
+        <w:t>., Kourkoulou, T., Aldemir, T., Abu, S., Lee, H., &amp; Song, D. (</w:t>
       </w:r>
       <w:r>
         <w:rPr>
@@ -44805,6 +44880,7 @@
         </w:rPr>
       </w:pPr>
       <w:r>
+        <w:lastRenderedPageBreak/>
         <w:t xml:space="preserve">Conference Program Co-Chair (Practitioner Stream), </w:t>
       </w:r>
       <w:r>
@@ -44831,7 +44907,6 @@
         <w:ind w:left="1440" w:hanging="720"/>
       </w:pPr>
       <w:r>
-        <w:lastRenderedPageBreak/>
         <w:t>Conference Program Committee, International Society of the Learning Sciences 2023</w:t>
       </w:r>
     </w:p>
@@ -45890,6 +45965,7 @@
           <w:color w:val="000000"/>
           <w:lang w:eastAsia="ko-KR"/>
         </w:rPr>
+        <w:lastRenderedPageBreak/>
         <w:t>Innovations in Education and Teaching International</w:t>
       </w:r>
     </w:p>
@@ -45944,7 +46020,6 @@
           <w:iCs/>
           <w:color w:val="000000"/>
         </w:rPr>
-        <w:lastRenderedPageBreak/>
         <w:t>The Internet and Higher Education</w:t>
       </w:r>
       <w:r>
@@ -46936,7 +47011,11 @@
         <w:ind w:left="720" w:hanging="720"/>
       </w:pPr>
       <w:r>
-        <w:t>Outstanding Practitioner Paper Award (2023). Immersive Learning Research Network Conference (iLRN) 2023</w:t>
+        <w:t xml:space="preserve">Outstanding Practitioner Paper Award (2023). Immersive Learning Research Network </w:t>
+      </w:r>
+      <w:r>
+        <w:lastRenderedPageBreak/>
+        <w:t>Conference (iLRN) 2023</w:t>
       </w:r>
     </w:p>
     <w:p>
@@ -46954,11 +47033,7 @@
         <w:ind w:left="720" w:hanging="720"/>
       </w:pPr>
       <w:r>
-        <w:t xml:space="preserve">Featured Emerging Scholar (2021). CIRCLS (The Center for Integrative Research in Computing </w:t>
-      </w:r>
-      <w:r>
-        <w:lastRenderedPageBreak/>
-        <w:t>and Learning Sciences)</w:t>
+        <w:t>Featured Emerging Scholar (2021). CIRCLS (The Center for Integrative Research in Computing and Learning Sciences)</w:t>
       </w:r>
     </w:p>
     <w:p>
@@ -48705,6 +48780,7 @@
   <w:style w:type="character" w:default="1" w:styleId="DefaultParagraphFont">
     <w:name w:val="Default Paragraph Font"/>
     <w:uiPriority w:val="1"/>
+    <w:semiHidden/>
     <w:unhideWhenUsed/>
   </w:style>
   <w:style w:type="table" w:default="1" w:styleId="TableNormal">
@@ -49218,18 +49294,6 @@
 </file>
 
 <file path=customXml/item2.xml><?xml version="1.0" encoding="utf-8"?>
-<b:Sources xmlns:b="http://schemas.openxmlformats.org/officeDocument/2006/bibliography" xmlns="http://schemas.openxmlformats.org/officeDocument/2006/bibliography" SelectedStyle="\APASixthEditionOfficeOnline.xsl" StyleName="APA" Version="6"/>
-</file>
-
-<file path=customXml/item3.xml><?xml version="1.0" encoding="utf-8"?>
-<p:properties xmlns:p="http://schemas.microsoft.com/office/2006/metadata/properties" xmlns:xsi="http://www.w3.org/2001/XMLSchema-instance" xmlns:pc="http://schemas.microsoft.com/office/infopath/2007/PartnerControls">
-  <documentManagement>
-    <_activity xmlns="6a4161d7-0e07-4bb5-8cdd-a87a7602a445" xsi:nil="true"/>
-  </documentManagement>
-</p:properties>
-</file>
-
-<file path=customXml/item4.xml><?xml version="1.0" encoding="utf-8"?>
 <ct:contentTypeSchema xmlns:ct="http://schemas.microsoft.com/office/2006/metadata/contentType" xmlns:ma="http://schemas.microsoft.com/office/2006/metadata/properties/metaAttributes" ct:_="" ma:_="" ma:contentTypeName="Document" ma:contentTypeID="0x010100FA54A6C77D34E44FB33E0184D6F9C744" ma:contentTypeVersion="18" ma:contentTypeDescription="Create a new document." ma:contentTypeScope="" ma:versionID="9c28832654d292338743ef1185d20088">
   <xsd:schema xmlns:xsd="http://www.w3.org/2001/XMLSchema" xmlns:xs="http://www.w3.org/2001/XMLSchema" xmlns:p="http://schemas.microsoft.com/office/2006/metadata/properties" xmlns:ns3="6a4161d7-0e07-4bb5-8cdd-a87a7602a445" xmlns:ns4="30453fea-43c5-4a0b-a417-834186a09351" targetNamespace="http://schemas.microsoft.com/office/2006/metadata/properties" ma:root="true" ma:fieldsID="aadbfd92c1be4506f2c2f9fc093c4d0b" ns3:_="" ns4:_="">
     <xsd:import namespace="6a4161d7-0e07-4bb5-8cdd-a87a7602a445"/>
@@ -49482,6 +49546,18 @@
 </ct:contentTypeSchema>
 </file>
 
+<file path=customXml/item3.xml><?xml version="1.0" encoding="utf-8"?>
+<b:Sources xmlns:b="http://schemas.openxmlformats.org/officeDocument/2006/bibliography" xmlns="http://schemas.openxmlformats.org/officeDocument/2006/bibliography" SelectedStyle="\APASixthEditionOfficeOnline.xsl" StyleName="APA" Version="6"/>
+</file>
+
+<file path=customXml/item4.xml><?xml version="1.0" encoding="utf-8"?>
+<p:properties xmlns:p="http://schemas.microsoft.com/office/2006/metadata/properties" xmlns:xsi="http://www.w3.org/2001/XMLSchema-instance" xmlns:pc="http://schemas.microsoft.com/office/infopath/2007/PartnerControls">
+  <documentManagement>
+    <_activity xmlns="6a4161d7-0e07-4bb5-8cdd-a87a7602a445" xsi:nil="true"/>
+  </documentManagement>
+</p:properties>
+</file>
+
 <file path=customXml/itemProps1.xml><?xml version="1.0" encoding="utf-8"?>
 <ds:datastoreItem xmlns:ds="http://schemas.openxmlformats.org/officeDocument/2006/customXml" ds:itemID="{F79F8074-1665-45F2-8B05-A95EA1C1A155}">
   <ds:schemaRefs>
@@ -49491,24 +49567,6 @@
 </file>
 
 <file path=customXml/itemProps2.xml><?xml version="1.0" encoding="utf-8"?>
-<ds:datastoreItem xmlns:ds="http://schemas.openxmlformats.org/officeDocument/2006/customXml" ds:itemID="{E286DD98-9466-43F6-BF97-336366EE54DF}">
-  <ds:schemaRefs>
-    <ds:schemaRef ds:uri="http://schemas.openxmlformats.org/officeDocument/2006/bibliography"/>
-  </ds:schemaRefs>
-</ds:datastoreItem>
-</file>
-
-<file path=customXml/itemProps3.xml><?xml version="1.0" encoding="utf-8"?>
-<ds:datastoreItem xmlns:ds="http://schemas.openxmlformats.org/officeDocument/2006/customXml" ds:itemID="{7C24488D-A36D-4C56-91ED-753F5C27550A}">
-  <ds:schemaRefs>
-    <ds:schemaRef ds:uri="http://schemas.microsoft.com/office/2006/metadata/properties"/>
-    <ds:schemaRef ds:uri="http://schemas.microsoft.com/office/infopath/2007/PartnerControls"/>
-    <ds:schemaRef ds:uri="6a4161d7-0e07-4bb5-8cdd-a87a7602a445"/>
-  </ds:schemaRefs>
-</ds:datastoreItem>
-</file>
-
-<file path=customXml/itemProps4.xml><?xml version="1.0" encoding="utf-8"?>
 <ds:datastoreItem xmlns:ds="http://schemas.openxmlformats.org/officeDocument/2006/customXml" ds:itemID="{44F19B31-977D-45A4-A748-143054BB9DA7}">
   <ds:schemaRefs>
     <ds:schemaRef ds:uri="http://schemas.microsoft.com/office/2006/metadata/contentType"/>
@@ -49525,4 +49583,22 @@
     <ds:schemaRef ds:uri="http://schemas.microsoft.com/internal/obd"/>
   </ds:schemaRefs>
 </ds:datastoreItem>
+</file>
+
+<file path=customXml/itemProps3.xml><?xml version="1.0" encoding="utf-8"?>
+<ds:datastoreItem xmlns:ds="http://schemas.openxmlformats.org/officeDocument/2006/customXml" ds:itemID="{E286DD98-9466-43F6-BF97-336366EE54DF}">
+  <ds:schemaRefs>
+    <ds:schemaRef ds:uri="http://schemas.openxmlformats.org/officeDocument/2006/bibliography"/>
+  </ds:schemaRefs>
+</ds:datastoreItem>
+</file>
+
+<file path=customXml/itemProps4.xml><?xml version="1.0" encoding="utf-8"?>
+<ds:datastoreItem xmlns:ds="http://schemas.openxmlformats.org/officeDocument/2006/customXml" ds:itemID="{7C24488D-A36D-4C56-91ED-753F5C27550A}">
+  <ds:schemaRefs>
+    <ds:schemaRef ds:uri="http://schemas.microsoft.com/office/2006/metadata/properties"/>
+    <ds:schemaRef ds:uri="http://schemas.microsoft.com/office/infopath/2007/PartnerControls"/>
+    <ds:schemaRef ds:uri="6a4161d7-0e07-4bb5-8cdd-a87a7602a445"/>
+  </ds:schemaRefs>
+</ds:datastoreItem>
 </file>
</xml_diff>

<commit_message>
Update CV docx, site-data, and research analytics (autopush 2026-07-22 17:30)
</commit_message>
<xml_diff>
--- a/CV_202605_MOON.docx
+++ b/CV_202605_MOON.docx
@@ -7942,7 +7942,10 @@
       <w:pPr>
         <w:ind w:left="720" w:hanging="720"/>
         <w:rPr>
-          <w:lang w:eastAsia="ko-KR"/>
+          <w:b/>
+          <w:bCs/>
+          <w:i/>
+          <w:iCs/>
         </w:rPr>
       </w:pPr>
       <w:bookmarkStart w:id="0" w:name="_Hlk173694585"/>
@@ -7951,7 +7954,310 @@
           <w:rFonts w:hint="eastAsia"/>
           <w:lang w:eastAsia="ko-KR"/>
         </w:rPr>
-        <w:t xml:space="preserve">[60] </w:t>
+        <w:t>[</w:t>
+      </w:r>
+      <w:r>
+        <w:rPr>
+          <w:rFonts w:hint="eastAsia"/>
+          <w:lang w:eastAsia="ko-KR"/>
+        </w:rPr>
+        <w:t>60</w:t>
+      </w:r>
+      <w:r>
+        <w:rPr>
+          <w:rFonts w:hint="eastAsia"/>
+          <w:lang w:eastAsia="ko-KR"/>
+        </w:rPr>
+        <w:t xml:space="preserve">] Aldemir, T., Bicer, Al., Kilinc, S., </w:t>
+      </w:r>
+      <w:r>
+        <w:rPr>
+          <w:rFonts w:hint="eastAsia"/>
+          <w:b/>
+          <w:bCs/>
+          <w:lang w:eastAsia="ko-KR"/>
+        </w:rPr>
+        <w:t>Moon,</w:t>
+      </w:r>
+      <w:r>
+        <w:rPr>
+          <w:rFonts w:hint="eastAsia"/>
+          <w:lang w:eastAsia="ko-KR"/>
+        </w:rPr>
+        <w:t xml:space="preserve"> J., &amp; Kwok, M. (Minor revision, 2026). </w:t>
+      </w:r>
+      <w:r>
+        <w:rPr>
+          <w:lang w:eastAsia="ko-KR"/>
+        </w:rPr>
+        <w:t xml:space="preserve">Challenges, </w:t>
+      </w:r>
+      <w:r>
+        <w:rPr>
+          <w:rFonts w:hint="eastAsia"/>
+          <w:lang w:eastAsia="ko-KR"/>
+        </w:rPr>
+        <w:t>s</w:t>
+      </w:r>
+      <w:r>
+        <w:rPr>
+          <w:lang w:eastAsia="ko-KR"/>
+        </w:rPr>
+        <w:t xml:space="preserve">olutions, and PD </w:t>
+      </w:r>
+      <w:r>
+        <w:rPr>
+          <w:rFonts w:hint="eastAsia"/>
+          <w:lang w:eastAsia="ko-KR"/>
+        </w:rPr>
+        <w:t>n</w:t>
+      </w:r>
+      <w:r>
+        <w:rPr>
+          <w:lang w:eastAsia="ko-KR"/>
+        </w:rPr>
+        <w:t xml:space="preserve">eeds for </w:t>
+      </w:r>
+      <w:r>
+        <w:rPr>
+          <w:rFonts w:hint="eastAsia"/>
+          <w:lang w:eastAsia="ko-KR"/>
+        </w:rPr>
+        <w:t>i</w:t>
+      </w:r>
+      <w:r>
+        <w:rPr>
+          <w:lang w:eastAsia="ko-KR"/>
+        </w:rPr>
+        <w:t xml:space="preserve">ntegrating AI: Insights from a </w:t>
+      </w:r>
+      <w:r>
+        <w:rPr>
+          <w:rFonts w:hint="eastAsia"/>
+          <w:lang w:eastAsia="ko-KR"/>
+        </w:rPr>
+        <w:t>t</w:t>
+      </w:r>
+      <w:r>
+        <w:rPr>
+          <w:lang w:eastAsia="ko-KR"/>
+        </w:rPr>
+        <w:t>wo-</w:t>
+      </w:r>
+      <w:r>
+        <w:rPr>
+          <w:rFonts w:hint="eastAsia"/>
+          <w:lang w:eastAsia="ko-KR"/>
+        </w:rPr>
+        <w:t>w</w:t>
+      </w:r>
+      <w:r>
+        <w:rPr>
+          <w:lang w:eastAsia="ko-KR"/>
+        </w:rPr>
+        <w:t xml:space="preserve">eek AI </w:t>
+      </w:r>
+      <w:r>
+        <w:rPr>
+          <w:rFonts w:hint="eastAsia"/>
+          <w:lang w:eastAsia="ko-KR"/>
+        </w:rPr>
+        <w:t>l</w:t>
+      </w:r>
+      <w:r>
+        <w:rPr>
+          <w:lang w:eastAsia="ko-KR"/>
+        </w:rPr>
+        <w:t xml:space="preserve">iteracy </w:t>
+      </w:r>
+      <w:r>
+        <w:rPr>
+          <w:rFonts w:hint="eastAsia"/>
+          <w:lang w:eastAsia="ko-KR"/>
+        </w:rPr>
+        <w:t>m</w:t>
+      </w:r>
+      <w:r>
+        <w:rPr>
+          <w:lang w:eastAsia="ko-KR"/>
+        </w:rPr>
+        <w:t xml:space="preserve">odule with </w:t>
+      </w:r>
+      <w:r>
+        <w:rPr>
+          <w:rFonts w:hint="eastAsia"/>
+          <w:lang w:eastAsia="ko-KR"/>
+        </w:rPr>
+        <w:t>p</w:t>
+      </w:r>
+      <w:r>
+        <w:rPr>
+          <w:lang w:eastAsia="ko-KR"/>
+        </w:rPr>
+        <w:t xml:space="preserve">reservice </w:t>
+      </w:r>
+      <w:r>
+        <w:rPr>
+          <w:rFonts w:hint="eastAsia"/>
+          <w:lang w:eastAsia="ko-KR"/>
+        </w:rPr>
+        <w:t>t</w:t>
+      </w:r>
+      <w:r>
+        <w:rPr>
+          <w:lang w:eastAsia="ko-KR"/>
+        </w:rPr>
+        <w:t>eachers</w:t>
+      </w:r>
+      <w:r>
+        <w:rPr>
+          <w:rFonts w:hint="eastAsia"/>
+          <w:lang w:eastAsia="ko-KR"/>
+        </w:rPr>
+        <w:t xml:space="preserve">. </w:t>
+      </w:r>
+      <w:r>
+        <w:rPr>
+          <w:rFonts w:hint="eastAsia"/>
+          <w:i/>
+          <w:iCs/>
+          <w:lang w:eastAsia="ko-KR"/>
+        </w:rPr>
+        <w:t>Cogent Education</w:t>
+      </w:r>
+      <w:r>
+        <w:rPr>
+          <w:rFonts w:hint="eastAsia"/>
+          <w:lang w:eastAsia="ko-KR"/>
+        </w:rPr>
+        <w:t xml:space="preserve"> </w:t>
+      </w:r>
+      <w:r>
+        <w:rPr>
+          <w:b/>
+          <w:bCs/>
+          <w:i/>
+          <w:iCs/>
+        </w:rPr>
+        <w:t>[</w:t>
+      </w:r>
+      <w:r>
+        <w:rPr>
+          <w:rFonts w:hint="eastAsia"/>
+          <w:b/>
+          <w:i/>
+          <w:iCs/>
+          <w:lang w:eastAsia="ko-KR"/>
+        </w:rPr>
+        <w:t>ESCI</w:t>
+      </w:r>
+      <w:r>
+        <w:rPr>
+          <w:rFonts w:hint="eastAsia"/>
+          <w:b/>
+          <w:i/>
+          <w:iCs/>
+          <w:lang w:eastAsia="ko-KR"/>
+        </w:rPr>
+        <w:t>-indexed</w:t>
+      </w:r>
+      <w:r>
+        <w:rPr>
+          <w:b/>
+          <w:bCs/>
+          <w:i/>
+          <w:iCs/>
+        </w:rPr>
+        <w:t xml:space="preserve">, IF = </w:t>
+      </w:r>
+      <w:r>
+        <w:rPr>
+          <w:rFonts w:hint="eastAsia"/>
+          <w:b/>
+          <w:bCs/>
+          <w:i/>
+          <w:iCs/>
+          <w:lang w:eastAsia="ko-KR"/>
+        </w:rPr>
+        <w:t xml:space="preserve">2.0, </w:t>
+      </w:r>
+      <w:r>
+        <w:rPr>
+          <w:b/>
+          <w:bCs/>
+          <w:i/>
+          <w:iCs/>
+        </w:rPr>
+        <w:t>IF</w:t>
+      </w:r>
+      <w:r>
+        <w:rPr>
+          <w:rFonts w:hint="eastAsia"/>
+          <w:b/>
+          <w:bCs/>
+          <w:i/>
+          <w:iCs/>
+          <w:lang w:eastAsia="ko-KR"/>
+        </w:rPr>
+        <w:t>5</w:t>
+      </w:r>
+      <w:r>
+        <w:rPr>
+          <w:b/>
+          <w:bCs/>
+          <w:i/>
+          <w:iCs/>
+        </w:rPr>
+        <w:t xml:space="preserve"> = </w:t>
+      </w:r>
+      <w:r>
+        <w:rPr>
+          <w:rFonts w:hint="eastAsia"/>
+          <w:b/>
+          <w:bCs/>
+          <w:i/>
+          <w:iCs/>
+          <w:lang w:eastAsia="ko-KR"/>
+        </w:rPr>
+        <w:t>2.1</w:t>
+      </w:r>
+      <w:r>
+        <w:rPr>
+          <w:b/>
+          <w:bCs/>
+          <w:i/>
+          <w:iCs/>
+        </w:rPr>
+        <w:t>]</w:t>
+      </w:r>
+    </w:p>
+    <w:p>
+      <w:pPr>
+        <w:ind w:left="720" w:hanging="720"/>
+        <w:rPr>
+          <w:lang w:eastAsia="ko-KR"/>
+        </w:rPr>
+      </w:pPr>
+      <w:r>
+        <w:rPr>
+          <w:rFonts w:hint="eastAsia"/>
+          <w:lang w:eastAsia="ko-KR"/>
+        </w:rPr>
+        <w:t>[</w:t>
+      </w:r>
+      <w:r>
+        <w:rPr>
+          <w:rFonts w:hint="eastAsia"/>
+          <w:lang w:eastAsia="ko-KR"/>
+        </w:rPr>
+        <w:t>59</w:t>
+      </w:r>
+      <w:r>
+        <w:rPr>
+          <w:rFonts w:hint="eastAsia"/>
+          <w:lang w:eastAsia="ko-KR"/>
+        </w:rPr>
+        <w:t xml:space="preserve">] </w:t>
       </w:r>
       <w:r>
         <w:t>*</w:t>
@@ -8001,7 +8307,14 @@
           <w:rFonts w:hint="eastAsia"/>
           <w:lang w:eastAsia="ko-KR"/>
         </w:rPr>
-        <w:t>Minor revision, 2026</w:t>
+        <w:t>In Press</w:t>
+      </w:r>
+      <w:r>
+        <w:rPr>
+          <w:rFonts w:hint="eastAsia"/>
+          <w:lang w:eastAsia="ko-KR"/>
+        </w:rPr>
+        <w:t>, 2026</w:t>
       </w:r>
       <w:r>
         <w:rPr>
@@ -8256,281 +8569,6 @@
           <w:color w:val="212121"/>
           <w:sz w:val="28"/>
           <w:szCs w:val="28"/>
-        </w:rPr>
-        <w:t>]</w:t>
-      </w:r>
-    </w:p>
-    <w:p>
-      <w:pPr>
-        <w:ind w:left="720" w:hanging="720"/>
-        <w:rPr>
-          <w:lang w:eastAsia="ko-KR"/>
-        </w:rPr>
-      </w:pPr>
-      <w:r>
-        <w:rPr>
-          <w:rFonts w:hint="eastAsia"/>
-          <w:lang w:eastAsia="ko-KR"/>
-        </w:rPr>
-        <w:t xml:space="preserve">[59] Aldemir, T., Bicer, Al., Kilinc, S., </w:t>
-      </w:r>
-      <w:r>
-        <w:rPr>
-          <w:rFonts w:hint="eastAsia"/>
-          <w:b/>
-          <w:bCs/>
-          <w:lang w:eastAsia="ko-KR"/>
-        </w:rPr>
-        <w:t>Moon,</w:t>
-      </w:r>
-      <w:r>
-        <w:rPr>
-          <w:rFonts w:hint="eastAsia"/>
-          <w:lang w:eastAsia="ko-KR"/>
-        </w:rPr>
-        <w:t xml:space="preserve"> J., &amp; Kwok, M. (Minor revision, 2026). </w:t>
-      </w:r>
-      <w:r>
-        <w:rPr>
-          <w:lang w:eastAsia="ko-KR"/>
-        </w:rPr>
-        <w:t xml:space="preserve">Challenges, </w:t>
-      </w:r>
-      <w:r>
-        <w:rPr>
-          <w:rFonts w:hint="eastAsia"/>
-          <w:lang w:eastAsia="ko-KR"/>
-        </w:rPr>
-        <w:t>s</w:t>
-      </w:r>
-      <w:r>
-        <w:rPr>
-          <w:lang w:eastAsia="ko-KR"/>
-        </w:rPr>
-        <w:t xml:space="preserve">olutions, and PD </w:t>
-      </w:r>
-      <w:r>
-        <w:rPr>
-          <w:rFonts w:hint="eastAsia"/>
-          <w:lang w:eastAsia="ko-KR"/>
-        </w:rPr>
-        <w:t>n</w:t>
-      </w:r>
-      <w:r>
-        <w:rPr>
-          <w:lang w:eastAsia="ko-KR"/>
-        </w:rPr>
-        <w:t xml:space="preserve">eeds for </w:t>
-      </w:r>
-      <w:r>
-        <w:rPr>
-          <w:rFonts w:hint="eastAsia"/>
-          <w:lang w:eastAsia="ko-KR"/>
-        </w:rPr>
-        <w:t>i</w:t>
-      </w:r>
-      <w:r>
-        <w:rPr>
-          <w:lang w:eastAsia="ko-KR"/>
-        </w:rPr>
-        <w:t xml:space="preserve">ntegrating AI: Insights from a </w:t>
-      </w:r>
-      <w:r>
-        <w:rPr>
-          <w:rFonts w:hint="eastAsia"/>
-          <w:lang w:eastAsia="ko-KR"/>
-        </w:rPr>
-        <w:t>t</w:t>
-      </w:r>
-      <w:r>
-        <w:rPr>
-          <w:lang w:eastAsia="ko-KR"/>
-        </w:rPr>
-        <w:t>wo-</w:t>
-      </w:r>
-      <w:r>
-        <w:rPr>
-          <w:rFonts w:hint="eastAsia"/>
-          <w:lang w:eastAsia="ko-KR"/>
-        </w:rPr>
-        <w:t>w</w:t>
-      </w:r>
-      <w:r>
-        <w:rPr>
-          <w:lang w:eastAsia="ko-KR"/>
-        </w:rPr>
-        <w:t xml:space="preserve">eek AI </w:t>
-      </w:r>
-      <w:r>
-        <w:rPr>
-          <w:rFonts w:hint="eastAsia"/>
-          <w:lang w:eastAsia="ko-KR"/>
-        </w:rPr>
-        <w:t>l</w:t>
-      </w:r>
-      <w:r>
-        <w:rPr>
-          <w:lang w:eastAsia="ko-KR"/>
-        </w:rPr>
-        <w:t xml:space="preserve">iteracy </w:t>
-      </w:r>
-      <w:r>
-        <w:rPr>
-          <w:rFonts w:hint="eastAsia"/>
-          <w:lang w:eastAsia="ko-KR"/>
-        </w:rPr>
-        <w:t>m</w:t>
-      </w:r>
-      <w:r>
-        <w:rPr>
-          <w:lang w:eastAsia="ko-KR"/>
-        </w:rPr>
-        <w:t xml:space="preserve">odule with </w:t>
-      </w:r>
-      <w:r>
-        <w:rPr>
-          <w:rFonts w:hint="eastAsia"/>
-          <w:lang w:eastAsia="ko-KR"/>
-        </w:rPr>
-        <w:t>p</w:t>
-      </w:r>
-      <w:r>
-        <w:rPr>
-          <w:lang w:eastAsia="ko-KR"/>
-        </w:rPr>
-        <w:t xml:space="preserve">reservice </w:t>
-      </w:r>
-      <w:r>
-        <w:rPr>
-          <w:rFonts w:hint="eastAsia"/>
-          <w:lang w:eastAsia="ko-KR"/>
-        </w:rPr>
-        <w:t>t</w:t>
-      </w:r>
-      <w:r>
-        <w:rPr>
-          <w:lang w:eastAsia="ko-KR"/>
-        </w:rPr>
-        <w:t>eachers</w:t>
-      </w:r>
-      <w:r>
-        <w:rPr>
-          <w:rFonts w:hint="eastAsia"/>
-          <w:lang w:eastAsia="ko-KR"/>
-        </w:rPr>
-        <w:t xml:space="preserve">. </w:t>
-      </w:r>
-      <w:r>
-        <w:rPr>
-          <w:rFonts w:hint="eastAsia"/>
-          <w:i/>
-          <w:iCs/>
-          <w:lang w:eastAsia="ko-KR"/>
-        </w:rPr>
-        <w:t>Cogent Education</w:t>
-      </w:r>
-      <w:r>
-        <w:rPr>
-          <w:rFonts w:hint="eastAsia"/>
-          <w:lang w:eastAsia="ko-KR"/>
-        </w:rPr>
-        <w:t xml:space="preserve"> </w:t>
-      </w:r>
-      <w:r>
-        <w:rPr>
-          <w:b/>
-          <w:bCs/>
-          <w:i/>
-          <w:iCs/>
-        </w:rPr>
-        <w:t>[</w:t>
-      </w:r>
-      <w:r>
-        <w:rPr>
-          <w:rFonts w:hint="eastAsia"/>
-          <w:b/>
-          <w:i/>
-          <w:iCs/>
-          <w:lang w:eastAsia="ko-KR"/>
-        </w:rPr>
-        <w:t>ESCI</w:t>
-      </w:r>
-      <w:r>
-        <w:rPr>
-          <w:rFonts w:hint="eastAsia"/>
-          <w:b/>
-          <w:i/>
-          <w:iCs/>
-          <w:lang w:eastAsia="ko-KR"/>
-        </w:rPr>
-        <w:t>-indexed</w:t>
-      </w:r>
-      <w:r>
-        <w:rPr>
-          <w:b/>
-          <w:bCs/>
-          <w:i/>
-          <w:iCs/>
-        </w:rPr>
-        <w:t xml:space="preserve">, IF = </w:t>
-      </w:r>
-      <w:r>
-        <w:rPr>
-          <w:rFonts w:hint="eastAsia"/>
-          <w:b/>
-          <w:bCs/>
-          <w:i/>
-          <w:iCs/>
-          <w:lang w:eastAsia="ko-KR"/>
-        </w:rPr>
-        <w:t xml:space="preserve">2.0, </w:t>
-      </w:r>
-      <w:r>
-        <w:rPr>
-          <w:b/>
-          <w:bCs/>
-          <w:i/>
-          <w:iCs/>
-        </w:rPr>
-        <w:t>IF</w:t>
-      </w:r>
-      <w:r>
-        <w:rPr>
-          <w:rFonts w:hint="eastAsia"/>
-          <w:b/>
-          <w:bCs/>
-          <w:i/>
-          <w:iCs/>
-          <w:lang w:eastAsia="ko-KR"/>
-        </w:rPr>
-        <w:t>5</w:t>
-      </w:r>
-      <w:r>
-        <w:rPr>
-          <w:b/>
-          <w:bCs/>
-          <w:i/>
-          <w:iCs/>
-        </w:rPr>
-        <w:t xml:space="preserve"> = </w:t>
-      </w:r>
-      <w:r>
-        <w:rPr>
-          <w:rFonts w:hint="eastAsia"/>
-          <w:b/>
-          <w:bCs/>
-          <w:i/>
-          <w:iCs/>
-          <w:lang w:eastAsia="ko-KR"/>
-        </w:rPr>
-        <w:t>2.1</w:t>
-      </w:r>
-      <w:r>
-        <w:rPr>
-          <w:b/>
-          <w:bCs/>
-          <w:i/>
-          <w:iCs/>
         </w:rPr>
         <w:t>]</w:t>
       </w:r>
@@ -36163,31 +36201,6 @@
         </w:rPr>
         <w:t>WORKING PAPERS [n = 40]</w:t>
       </w:r>
-      <w:r>
-        <w:rPr>
-          <w:rFonts w:hint="eastAsia"/>
-          <w:b/>
-          <w:sz w:val="28"/>
-          <w:szCs w:val="28"/>
-          <w:lang w:eastAsia="ko-KR"/>
-        </w:rPr>
-      </w:r>
-      <w:r>
-        <w:rPr>
-          <w:rFonts w:hint="eastAsia"/>
-          <w:b/>
-          <w:sz w:val="28"/>
-          <w:szCs w:val="28"/>
-          <w:lang w:eastAsia="ko-KR"/>
-        </w:rPr>
-      </w:r>
-      <w:r>
-        <w:rPr>
-          <w:b/>
-          <w:sz w:val="28"/>
-          <w:szCs w:val="28"/>
-        </w:rPr>
-      </w:r>
     </w:p>
     <w:p>
       <w:pPr>
@@ -43540,6 +43553,7 @@
           <w:b/>
           <w:bCs/>
         </w:rPr>
+        <w:lastRenderedPageBreak/>
         <w:t>In Preparation (n = 7)</w:t>
       </w:r>
     </w:p>
@@ -43563,26 +43577,6 @@
         </w:rPr>
         <w:t>Journal Manuscript (n = 4)</w:t>
       </w:r>
-      <w:r>
-        <w:rPr>
-          <w:rFonts w:hint="eastAsia"/>
-          <w:b/>
-          <w:bCs/>
-          <w:i/>
-          <w:iCs/>
-          <w:u w:val="single"/>
-          <w:lang w:eastAsia="ko-KR"/>
-        </w:rPr>
-      </w:r>
-      <w:r>
-        <w:rPr>
-          <w:b/>
-          <w:bCs/>
-          <w:i/>
-          <w:iCs/>
-          <w:u w:val="single"/>
-        </w:rPr>
-      </w:r>
     </w:p>
     <w:p>
       <w:pPr>
@@ -43598,22 +43592,7 @@
           <w:bCs/>
           <w:lang w:eastAsia="ko-KR"/>
         </w:rPr>
-        <w:t>[4]</w:t>
-      </w:r>
-      <w:r>
-        <w:rPr>
-          <w:rFonts w:hint="eastAsia"/>
-          <w:bCs/>
-          <w:lang w:eastAsia="ko-KR"/>
-        </w:rPr>
-      </w:r>
-      <w:r>
-        <w:rPr>
-          <w:rFonts w:hint="eastAsia"/>
-          <w:bCs/>
-          <w:lang w:eastAsia="ko-KR"/>
-        </w:rPr>
-        <w:t xml:space="preserve"> </w:t>
+        <w:t xml:space="preserve">[4] </w:t>
       </w:r>
       <w:r>
         <w:rPr>
@@ -43691,22 +43670,7 @@
           <w:bCs/>
           <w:lang w:eastAsia="ko-KR"/>
         </w:rPr>
-        <w:t>[3]</w:t>
-      </w:r>
-      <w:r>
-        <w:rPr>
-          <w:rFonts w:hint="eastAsia"/>
-          <w:bCs/>
-          <w:lang w:eastAsia="ko-KR"/>
-        </w:rPr>
-      </w:r>
-      <w:r>
-        <w:rPr>
-          <w:rFonts w:hint="eastAsia"/>
-          <w:bCs/>
-          <w:lang w:eastAsia="ko-KR"/>
-        </w:rPr>
-        <w:t xml:space="preserve"> </w:t>
+        <w:t xml:space="preserve">[3] </w:t>
       </w:r>
       <w:r>
         <w:rPr>
@@ -49420,18 +49384,6 @@
 </file>
 
 <file path=customXml/item2.xml><?xml version="1.0" encoding="utf-8"?>
-<b:Sources xmlns:b="http://schemas.openxmlformats.org/officeDocument/2006/bibliography" xmlns="http://schemas.openxmlformats.org/officeDocument/2006/bibliography" SelectedStyle="\APASixthEditionOfficeOnline.xsl" StyleName="APA" Version="6"/>
-</file>
-
-<file path=customXml/item3.xml><?xml version="1.0" encoding="utf-8"?>
-<p:properties xmlns:p="http://schemas.microsoft.com/office/2006/metadata/properties" xmlns:xsi="http://www.w3.org/2001/XMLSchema-instance" xmlns:pc="http://schemas.microsoft.com/office/infopath/2007/PartnerControls">
-  <documentManagement>
-    <_activity xmlns="6a4161d7-0e07-4bb5-8cdd-a87a7602a445" xsi:nil="true"/>
-  </documentManagement>
-</p:properties>
-</file>
-
-<file path=customXml/item4.xml><?xml version="1.0" encoding="utf-8"?>
 <ct:contentTypeSchema xmlns:ct="http://schemas.microsoft.com/office/2006/metadata/contentType" xmlns:ma="http://schemas.microsoft.com/office/2006/metadata/properties/metaAttributes" ct:_="" ma:_="" ma:contentTypeName="Document" ma:contentTypeID="0x010100FA54A6C77D34E44FB33E0184D6F9C744" ma:contentTypeVersion="18" ma:contentTypeDescription="Create a new document." ma:contentTypeScope="" ma:versionID="9c28832654d292338743ef1185d20088">
   <xsd:schema xmlns:xsd="http://www.w3.org/2001/XMLSchema" xmlns:xs="http://www.w3.org/2001/XMLSchema" xmlns:p="http://schemas.microsoft.com/office/2006/metadata/properties" xmlns:ns3="6a4161d7-0e07-4bb5-8cdd-a87a7602a445" xmlns:ns4="30453fea-43c5-4a0b-a417-834186a09351" targetNamespace="http://schemas.microsoft.com/office/2006/metadata/properties" ma:root="true" ma:fieldsID="aadbfd92c1be4506f2c2f9fc093c4d0b" ns3:_="" ns4:_="">
     <xsd:import namespace="6a4161d7-0e07-4bb5-8cdd-a87a7602a445"/>
@@ -49684,6 +49636,18 @@
 </ct:contentTypeSchema>
 </file>
 
+<file path=customXml/item3.xml><?xml version="1.0" encoding="utf-8"?>
+<b:Sources xmlns:b="http://schemas.openxmlformats.org/officeDocument/2006/bibliography" xmlns="http://schemas.openxmlformats.org/officeDocument/2006/bibliography" SelectedStyle="\APASixthEditionOfficeOnline.xsl" StyleName="APA" Version="6"/>
+</file>
+
+<file path=customXml/item4.xml><?xml version="1.0" encoding="utf-8"?>
+<p:properties xmlns:p="http://schemas.microsoft.com/office/2006/metadata/properties" xmlns:xsi="http://www.w3.org/2001/XMLSchema-instance" xmlns:pc="http://schemas.microsoft.com/office/infopath/2007/PartnerControls">
+  <documentManagement>
+    <_activity xmlns="6a4161d7-0e07-4bb5-8cdd-a87a7602a445" xsi:nil="true"/>
+  </documentManagement>
+</p:properties>
+</file>
+
 <file path=customXml/itemProps1.xml><?xml version="1.0" encoding="utf-8"?>
 <ds:datastoreItem xmlns:ds="http://schemas.openxmlformats.org/officeDocument/2006/customXml" ds:itemID="{F79F8074-1665-45F2-8B05-A95EA1C1A155}">
   <ds:schemaRefs>
@@ -49693,24 +49657,6 @@
 </file>
 
 <file path=customXml/itemProps2.xml><?xml version="1.0" encoding="utf-8"?>
-<ds:datastoreItem xmlns:ds="http://schemas.openxmlformats.org/officeDocument/2006/customXml" ds:itemID="{E286DD98-9466-43F6-BF97-336366EE54DF}">
-  <ds:schemaRefs>
-    <ds:schemaRef ds:uri="http://schemas.openxmlformats.org/officeDocument/2006/bibliography"/>
-  </ds:schemaRefs>
-</ds:datastoreItem>
-</file>
-
-<file path=customXml/itemProps3.xml><?xml version="1.0" encoding="utf-8"?>
-<ds:datastoreItem xmlns:ds="http://schemas.openxmlformats.org/officeDocument/2006/customXml" ds:itemID="{7C24488D-A36D-4C56-91ED-753F5C27550A}">
-  <ds:schemaRefs>
-    <ds:schemaRef ds:uri="http://schemas.microsoft.com/office/2006/metadata/properties"/>
-    <ds:schemaRef ds:uri="http://schemas.microsoft.com/office/infopath/2007/PartnerControls"/>
-    <ds:schemaRef ds:uri="6a4161d7-0e07-4bb5-8cdd-a87a7602a445"/>
-  </ds:schemaRefs>
-</ds:datastoreItem>
-</file>
-
-<file path=customXml/itemProps4.xml><?xml version="1.0" encoding="utf-8"?>
 <ds:datastoreItem xmlns:ds="http://schemas.openxmlformats.org/officeDocument/2006/customXml" ds:itemID="{44F19B31-977D-45A4-A748-143054BB9DA7}">
   <ds:schemaRefs>
     <ds:schemaRef ds:uri="http://schemas.microsoft.com/office/2006/metadata/contentType"/>
@@ -49727,4 +49673,22 @@
     <ds:schemaRef ds:uri="http://schemas.microsoft.com/internal/obd"/>
   </ds:schemaRefs>
 </ds:datastoreItem>
+</file>
+
+<file path=customXml/itemProps3.xml><?xml version="1.0" encoding="utf-8"?>
+<ds:datastoreItem xmlns:ds="http://schemas.openxmlformats.org/officeDocument/2006/customXml" ds:itemID="{E286DD98-9466-43F6-BF97-336366EE54DF}">
+  <ds:schemaRefs>
+    <ds:schemaRef ds:uri="http://schemas.openxmlformats.org/officeDocument/2006/bibliography"/>
+  </ds:schemaRefs>
+</ds:datastoreItem>
+</file>
+
+<file path=customXml/itemProps4.xml><?xml version="1.0" encoding="utf-8"?>
+<ds:datastoreItem xmlns:ds="http://schemas.openxmlformats.org/officeDocument/2006/customXml" ds:itemID="{7C24488D-A36D-4C56-91ED-753F5C27550A}">
+  <ds:schemaRefs>
+    <ds:schemaRef ds:uri="http://schemas.microsoft.com/office/2006/metadata/properties"/>
+    <ds:schemaRef ds:uri="http://schemas.microsoft.com/office/infopath/2007/PartnerControls"/>
+    <ds:schemaRef ds:uri="6a4161d7-0e07-4bb5-8cdd-a87a7602a445"/>
+  </ds:schemaRefs>
+</ds:datastoreItem>
 </file>
</xml_diff>

<commit_message>
Update CV docx, site-data, and research analytics (autopush 2026-07-23 04:56)
</commit_message>
<xml_diff>
--- a/CV_202605_MOON.docx
+++ b/CV_202605_MOON.docx
@@ -2298,7 +2298,15 @@
         <w:ind w:firstLine="720"/>
       </w:pPr>
       <w:r>
-        <w:t>Doctoral Dissertation Committee, Kimberly Galho (ELPTS, College of Education)</w:t>
+        <w:t xml:space="preserve">Doctoral Dissertation Committee, Kimberly </w:t>
+      </w:r>
+      <w:proofErr w:type="spellStart"/>
+      <w:r>
+        <w:t>Galho</w:t>
+      </w:r>
+      <w:proofErr w:type="spellEnd"/>
+      <w:r>
+        <w:t xml:space="preserve"> (ELPTS, College of Education)</w:t>
       </w:r>
     </w:p>
     <w:p>
@@ -3497,7 +3505,23 @@
           <w:rFonts w:hint="eastAsia"/>
           <w:lang w:eastAsia="ko-KR"/>
         </w:rPr>
-        <w:t xml:space="preserve">COE RisingTide Grant, The University of Alabama, </w:t>
+        <w:t xml:space="preserve">COE </w:t>
+      </w:r>
+      <w:proofErr w:type="spellStart"/>
+      <w:r>
+        <w:rPr>
+          <w:rFonts w:hint="eastAsia"/>
+          <w:lang w:eastAsia="ko-KR"/>
+        </w:rPr>
+        <w:t>RisingTide</w:t>
+      </w:r>
+      <w:proofErr w:type="spellEnd"/>
+      <w:r>
+        <w:rPr>
+          <w:rFonts w:hint="eastAsia"/>
+          <w:lang w:eastAsia="ko-KR"/>
+        </w:rPr>
+        <w:t xml:space="preserve"> Grant, The University of Alabama, </w:t>
       </w:r>
       <w:r>
         <w:rPr>
@@ -3598,11 +3622,33 @@
       <w:r>
         <w:t xml:space="preserve">). </w:t>
       </w:r>
-      <w:r>
-        <w:rPr>
-          <w:lang w:eastAsia="ko-KR"/>
-        </w:rPr>
-        <w:t>TeachPlay: AI-Enhanced Educational Gamelet Design</w:t>
+      <w:proofErr w:type="spellStart"/>
+      <w:r>
+        <w:rPr>
+          <w:lang w:eastAsia="ko-KR"/>
+        </w:rPr>
+        <w:t>TeachPlay</w:t>
+      </w:r>
+      <w:proofErr w:type="spellEnd"/>
+      <w:r>
+        <w:rPr>
+          <w:lang w:eastAsia="ko-KR"/>
+        </w:rPr>
+        <w:t xml:space="preserve">: AI-Enhanced Educational </w:t>
+      </w:r>
+      <w:proofErr w:type="spellStart"/>
+      <w:r>
+        <w:rPr>
+          <w:lang w:eastAsia="ko-KR"/>
+        </w:rPr>
+        <w:t>Gamelet</w:t>
+      </w:r>
+      <w:proofErr w:type="spellEnd"/>
+      <w:r>
+        <w:rPr>
+          <w:lang w:eastAsia="ko-KR"/>
+        </w:rPr>
+        <w:t xml:space="preserve"> Design</w:t>
       </w:r>
       <w:r>
         <w:rPr>
@@ -3718,11 +3764,19 @@
       <w:r>
         <w:t xml:space="preserve">). </w:t>
       </w:r>
-      <w:r>
-        <w:rPr>
-          <w:lang w:eastAsia="ko-KR"/>
-        </w:rPr>
-        <w:t>RemixEd: Designing AI- and XR-Enhanced Instructional Modules for Inclusive, Doctoral-Level Online Learning</w:t>
+      <w:proofErr w:type="spellStart"/>
+      <w:r>
+        <w:rPr>
+          <w:lang w:eastAsia="ko-KR"/>
+        </w:rPr>
+        <w:t>RemixEd</w:t>
+      </w:r>
+      <w:proofErr w:type="spellEnd"/>
+      <w:r>
+        <w:rPr>
+          <w:lang w:eastAsia="ko-KR"/>
+        </w:rPr>
+        <w:t>: Designing AI- and XR-Enhanced Instructional Modules for Inclusive, Doctoral-Level Online Learning</w:t>
       </w:r>
       <w:r>
         <w:rPr>
@@ -5619,11 +5673,47 @@
         </w:rPr>
         <w:t xml:space="preserve">). </w:t>
       </w:r>
-      <w:r>
-        <w:rPr>
-          <w:lang w:eastAsia="ko-KR"/>
-        </w:rPr>
-        <w:t>SaTS 2.0: EDU: Metaverse or Metaworst: Metaverse Security Education by Using Heutagogical and Challenge-based Pedagogy</w:t>
+      <w:proofErr w:type="spellStart"/>
+      <w:r>
+        <w:rPr>
+          <w:lang w:eastAsia="ko-KR"/>
+        </w:rPr>
+        <w:t>SaTS</w:t>
+      </w:r>
+      <w:proofErr w:type="spellEnd"/>
+      <w:r>
+        <w:rPr>
+          <w:lang w:eastAsia="ko-KR"/>
+        </w:rPr>
+        <w:t xml:space="preserve"> 2.0: EDU: Metaverse or </w:t>
+      </w:r>
+      <w:proofErr w:type="spellStart"/>
+      <w:r>
+        <w:rPr>
+          <w:lang w:eastAsia="ko-KR"/>
+        </w:rPr>
+        <w:t>Metaworst</w:t>
+      </w:r>
+      <w:proofErr w:type="spellEnd"/>
+      <w:r>
+        <w:rPr>
+          <w:lang w:eastAsia="ko-KR"/>
+        </w:rPr>
+        <w:t xml:space="preserve">: Metaverse Security Education by Using </w:t>
+      </w:r>
+      <w:proofErr w:type="spellStart"/>
+      <w:r>
+        <w:rPr>
+          <w:lang w:eastAsia="ko-KR"/>
+        </w:rPr>
+        <w:t>Heutagogical</w:t>
+      </w:r>
+      <w:proofErr w:type="spellEnd"/>
+      <w:r>
+        <w:rPr>
+          <w:lang w:eastAsia="ko-KR"/>
+        </w:rPr>
+        <w:t xml:space="preserve"> and Challenge-based Pedagogy</w:t>
       </w:r>
       <w:r>
         <w:rPr>
@@ -5925,11 +6015,19 @@
         </w:rPr>
         <w:t xml:space="preserve">9). </w:t>
       </w:r>
-      <w:r>
-        <w:rPr>
-          <w:lang w:eastAsia="ko-KR"/>
-        </w:rPr>
-        <w:t>CyberSecure Minds: Generative AI-enhanced Microlearning Games to Teach Math and Science through Real-World Cybersecurity Scenarios for Marginalized Youth</w:t>
+      <w:proofErr w:type="spellStart"/>
+      <w:r>
+        <w:rPr>
+          <w:lang w:eastAsia="ko-KR"/>
+        </w:rPr>
+        <w:t>CyberSecure</w:t>
+      </w:r>
+      <w:proofErr w:type="spellEnd"/>
+      <w:r>
+        <w:rPr>
+          <w:lang w:eastAsia="ko-KR"/>
+        </w:rPr>
+        <w:t xml:space="preserve"> Minds: Generative AI-enhanced Microlearning Games to Teach Math and Science through Real-World Cybersecurity Scenarios for Marginalized Youth</w:t>
       </w:r>
       <w:r>
         <w:rPr>
@@ -7574,12 +7672,21 @@
         </w:rPr>
         <w:t xml:space="preserve"> 2027). </w:t>
       </w:r>
-      <w:r>
-        <w:rPr>
-          <w:rFonts w:hint="eastAsia"/>
-          <w:lang w:eastAsia="ko-KR"/>
-        </w:rPr>
-        <w:t xml:space="preserve">QuestFlex: </w:t>
+      <w:proofErr w:type="spellStart"/>
+      <w:r>
+        <w:rPr>
+          <w:rFonts w:hint="eastAsia"/>
+          <w:lang w:eastAsia="ko-KR"/>
+        </w:rPr>
+        <w:t>QuestFlex</w:t>
+      </w:r>
+      <w:proofErr w:type="spellEnd"/>
+      <w:r>
+        <w:rPr>
+          <w:rFonts w:hint="eastAsia"/>
+          <w:lang w:eastAsia="ko-KR"/>
+        </w:rPr>
+        <w:t xml:space="preserve">: </w:t>
       </w:r>
       <w:r>
         <w:rPr>
@@ -8307,14 +8414,7 @@
           <w:rFonts w:hint="eastAsia"/>
           <w:lang w:eastAsia="ko-KR"/>
         </w:rPr>
-        <w:t>In Press</w:t>
-      </w:r>
-      <w:r>
-        <w:rPr>
-          <w:rFonts w:hint="eastAsia"/>
-          <w:lang w:eastAsia="ko-KR"/>
-        </w:rPr>
-        <w:t>, 2026</w:t>
+        <w:t>In Press, 2026</w:t>
       </w:r>
       <w:r>
         <w:rPr>
@@ -8491,6 +8591,32 @@
       <w:r>
         <w:rPr>
           <w:rFonts w:hint="eastAsia"/>
+          <w:lang w:eastAsia="ko-KR"/>
+        </w:rPr>
+        <w:t xml:space="preserve"> </w:t>
+      </w:r>
+      <w:hyperlink r:id="rId15" w:tooltip="Original URL: https://doi.org/10.1080/10494820.2026.2709674. Click or tap if you trust this link." w:history="1">
+        <w:r>
+          <w:rPr>
+            <w:rStyle w:val="Hyperlink"/>
+            <w:lang w:eastAsia="ko-KR"/>
+          </w:rPr>
+          <w:t>https://doi.org/10.1080/10494820.2026.2709674</w:t>
+        </w:r>
+      </w:hyperlink>
+      <w:r>
+        <w:rPr>
+          <w:b/>
+          <w:i/>
+          <w:lang w:eastAsia="ko-KR"/>
+        </w:rPr>
+        <w:t xml:space="preserve"> </w:t>
+      </w:r>
+      <w:r>
+        <w:rPr>
+          <w:rFonts w:hint="eastAsia"/>
+          <w:b/>
+          <w:i/>
           <w:lang w:eastAsia="ko-KR"/>
         </w:rPr>
         <w:t xml:space="preserve"> </w:t>
@@ -9156,7 +9282,7 @@
         </w:rPr>
         <w:t xml:space="preserve"> </w:t>
       </w:r>
-      <w:hyperlink r:id="rId15" w:history="1">
+      <w:hyperlink r:id="rId16" w:history="1">
         <w:r>
           <w:rPr>
             <w:rStyle w:val="Hyperlink"/>
@@ -9583,7 +9709,7 @@
         </w:rPr>
         <w:t xml:space="preserve">. </w:t>
       </w:r>
-      <w:hyperlink r:id="rId16" w:history="1">
+      <w:hyperlink r:id="rId17" w:history="1">
         <w:r>
           <w:rPr>
             <w:rStyle w:val="Hyperlink"/>
@@ -9983,7 +10109,7 @@
         </w:rPr>
         <w:t xml:space="preserve"> </w:t>
       </w:r>
-      <w:hyperlink r:id="rId17" w:history="1">
+      <w:hyperlink r:id="rId18" w:history="1">
         <w:r>
           <w:rPr>
             <w:rStyle w:val="Hyperlink"/>
@@ -10306,7 +10432,7 @@
         </w:rPr>
         <w:t xml:space="preserve"> </w:t>
       </w:r>
-      <w:hyperlink r:id="rId18" w:tooltip="Original URL: http://dx.doi.org/10.1080/10508422.2026.2685014. Click or tap if you trust this link." w:history="1">
+      <w:hyperlink r:id="rId19" w:tooltip="Original URL: http://dx.doi.org/10.1080/10508422.2026.2685014. Click or tap if you trust this link." w:history="1">
         <w:r>
           <w:rPr>
             <w:rStyle w:val="Hyperlink"/>
@@ -10639,7 +10765,7 @@
         </w:rPr>
         <w:t xml:space="preserve"> </w:t>
       </w:r>
-      <w:hyperlink r:id="rId19" w:history="1">
+      <w:hyperlink r:id="rId20" w:history="1">
         <w:r>
           <w:rPr>
             <w:rStyle w:val="Hyperlink"/>
@@ -10935,7 +11061,7 @@
         </w:rPr>
         <w:t xml:space="preserve"> </w:t>
       </w:r>
-      <w:hyperlink r:id="rId20" w:history="1">
+      <w:hyperlink r:id="rId21" w:history="1">
         <w:r>
           <w:rPr>
             <w:rStyle w:val="Hyperlink"/>
@@ -10991,7 +11117,15 @@
         <w:t>6</w:t>
       </w:r>
       <w:r>
-        <w:t>). Decoding immersive learning states: A reproducible microgenetic pipeline for behavioral data in virtual reality safety training. </w:t>
+        <w:t xml:space="preserve">). Decoding immersive learning states: A reproducible </w:t>
+      </w:r>
+      <w:proofErr w:type="spellStart"/>
+      <w:r>
+        <w:t>microgenetic</w:t>
+      </w:r>
+      <w:proofErr w:type="spellEnd"/>
+      <w:r>
+        <w:t xml:space="preserve"> pipeline for behavioral data in virtual reality safety training. </w:t>
       </w:r>
       <w:r>
         <w:rPr>
@@ -11003,7 +11137,7 @@
       <w:r>
         <w:t>. </w:t>
       </w:r>
-      <w:hyperlink r:id="rId21" w:history="1">
+      <w:hyperlink r:id="rId22" w:history="1">
         <w:r>
           <w:rPr>
             <w:rStyle w:val="Hyperlink"/>
@@ -11187,7 +11321,7 @@
         </w:rPr>
         <w:t xml:space="preserve">. </w:t>
       </w:r>
-      <w:hyperlink r:id="rId22" w:tgtFrame="_blank" w:history="1">
+      <w:hyperlink r:id="rId23" w:tgtFrame="_blank" w:history="1">
         <w:r>
           <w:rPr>
             <w:rStyle w:val="Hyperlink"/>
@@ -11562,7 +11696,7 @@
         </w:rPr>
         <w:t xml:space="preserve"> </w:t>
       </w:r>
-      <w:hyperlink r:id="rId23" w:history="1">
+      <w:hyperlink r:id="rId24" w:history="1">
         <w:r>
           <w:rPr>
             <w:rStyle w:val="Hyperlink"/>
@@ -11942,7 +12076,7 @@
         </w:rPr>
         <w:t xml:space="preserve"> </w:t>
       </w:r>
-      <w:hyperlink r:id="rId24" w:history="1">
+      <w:hyperlink r:id="rId25" w:history="1">
         <w:r>
           <w:rPr>
             <w:rStyle w:val="Hyperlink"/>
@@ -12172,6 +12306,7 @@
         </w:rPr>
         <w:t xml:space="preserve">., Awoyemi, I., Ghooreian, A., &amp; </w:t>
       </w:r>
+      <w:proofErr w:type="spellStart"/>
       <w:r>
         <w:rPr>
           <w:bCs/>
@@ -12179,6 +12314,7 @@
         </w:rPr>
         <w:t>Ramenzapour</w:t>
       </w:r>
+      <w:proofErr w:type="spellEnd"/>
       <w:r>
         <w:rPr>
           <w:rFonts w:hint="eastAsia"/>
@@ -12376,7 +12512,7 @@
         </w:rPr>
         <w:t xml:space="preserve"> </w:t>
       </w:r>
-      <w:hyperlink r:id="rId25" w:history="1">
+      <w:hyperlink r:id="rId26" w:history="1">
         <w:r>
           <w:rPr>
             <w:rStyle w:val="Hyperlink"/>
@@ -12843,7 +12979,7 @@
         </w:rPr>
         <w:t xml:space="preserve"> </w:t>
       </w:r>
-      <w:hyperlink r:id="rId26" w:history="1">
+      <w:hyperlink r:id="rId27" w:history="1">
         <w:r>
           <w:rPr>
             <w:rStyle w:val="Hyperlink"/>
@@ -13310,7 +13446,7 @@
         </w:rPr>
         <w:t xml:space="preserve"> </w:t>
       </w:r>
-      <w:hyperlink r:id="rId27" w:history="1">
+      <w:hyperlink r:id="rId28" w:history="1">
         <w:r>
           <w:rPr>
             <w:rStyle w:val="Hyperlink"/>
@@ -13676,7 +13812,7 @@
         </w:rPr>
         <w:t xml:space="preserve"> </w:t>
       </w:r>
-      <w:hyperlink r:id="rId28" w:history="1">
+      <w:hyperlink r:id="rId29" w:history="1">
         <w:r>
           <w:rPr>
             <w:rStyle w:val="Hyperlink"/>
@@ -14096,7 +14232,7 @@
         </w:rPr>
         <w:t xml:space="preserve">Computers &amp; Education </w:t>
       </w:r>
-      <w:hyperlink r:id="rId29" w:history="1">
+      <w:hyperlink r:id="rId30" w:history="1">
         <w:r>
           <w:rPr>
             <w:rStyle w:val="Hyperlink"/>
@@ -14388,7 +14524,7 @@
         </w:rPr>
         <w:t xml:space="preserve">(1), 192-215. </w:t>
       </w:r>
-      <w:hyperlink r:id="rId30" w:history="1">
+      <w:hyperlink r:id="rId31" w:history="1">
         <w:r>
           <w:rPr>
             <w:rStyle w:val="Hyperlink"/>
@@ -14790,7 +14926,7 @@
         </w:rPr>
         <w:t xml:space="preserve"> </w:t>
       </w:r>
-      <w:hyperlink r:id="rId31" w:tgtFrame="_blank" w:tooltip="Persistent link using digital object identifier" w:history="1">
+      <w:hyperlink r:id="rId32" w:tgtFrame="_blank" w:tooltip="Persistent link using digital object identifier" w:history="1">
         <w:r>
           <w:rPr>
             <w:rStyle w:val="Hyperlink"/>
@@ -15054,7 +15190,7 @@
         </w:rPr>
         <w:t xml:space="preserve"> </w:t>
       </w:r>
-      <w:hyperlink r:id="rId32" w:history="1">
+      <w:hyperlink r:id="rId33" w:history="1">
         <w:r>
           <w:rPr>
             <w:rStyle w:val="Hyperlink"/>
@@ -15279,7 +15415,7 @@
         </w:rPr>
         <w:t xml:space="preserve">Smart Learning Environments </w:t>
       </w:r>
-      <w:hyperlink r:id="rId33" w:history="1">
+      <w:hyperlink r:id="rId34" w:history="1">
         <w:r>
           <w:rPr>
             <w:rStyle w:val="Hyperlink"/>
@@ -15400,7 +15536,7 @@
         </w:rPr>
         <w:t xml:space="preserve"> </w:t>
       </w:r>
-      <w:hyperlink r:id="rId34" w:history="1">
+      <w:hyperlink r:id="rId35" w:history="1">
         <w:r>
           <w:rPr>
             <w:rStyle w:val="Hyperlink"/>
@@ -15612,7 +15748,7 @@
         </w:rPr>
         <w:t xml:space="preserve"> </w:t>
       </w:r>
-      <w:hyperlink r:id="rId35" w:history="1">
+      <w:hyperlink r:id="rId36" w:history="1">
         <w:r>
           <w:rPr>
             <w:rStyle w:val="Hyperlink"/>
@@ -15800,7 +15936,7 @@
         </w:rPr>
         <w:t xml:space="preserve"> </w:t>
       </w:r>
-      <w:hyperlink r:id="rId36" w:history="1">
+      <w:hyperlink r:id="rId37" w:history="1">
         <w:r>
           <w:rPr>
             <w:rStyle w:val="Hyperlink"/>
@@ -15982,7 +16118,7 @@
         </w:rPr>
         <w:t xml:space="preserve"> </w:t>
       </w:r>
-      <w:hyperlink r:id="rId37" w:history="1">
+      <w:hyperlink r:id="rId38" w:history="1">
         <w:r>
           <w:rPr>
             <w:rStyle w:val="Hyperlink"/>
@@ -16287,7 +16423,7 @@
         </w:rPr>
         <w:t xml:space="preserve"> </w:t>
       </w:r>
-      <w:hyperlink r:id="rId38" w:history="1">
+      <w:hyperlink r:id="rId39" w:history="1">
         <w:r>
           <w:rPr>
             <w:rStyle w:val="Hyperlink"/>
@@ -16497,7 +16633,7 @@
         </w:rPr>
         <w:t xml:space="preserve"> </w:t>
       </w:r>
-      <w:hyperlink r:id="rId39" w:history="1">
+      <w:hyperlink r:id="rId40" w:history="1">
         <w:r>
           <w:rPr>
             <w:rStyle w:val="Hyperlink"/>
@@ -16659,7 +16795,7 @@
       <w:r>
         <w:t xml:space="preserve"> </w:t>
       </w:r>
-      <w:hyperlink r:id="rId40" w:history="1">
+      <w:hyperlink r:id="rId41" w:history="1">
         <w:r>
           <w:rPr>
             <w:rStyle w:val="Hyperlink"/>
@@ -16928,7 +17064,7 @@
         </w:rPr>
         <w:t xml:space="preserve"> </w:t>
       </w:r>
-      <w:hyperlink r:id="rId41" w:history="1">
+      <w:hyperlink r:id="rId42" w:history="1">
         <w:r>
           <w:rPr>
             <w:rStyle w:val="Hyperlink"/>
@@ -16999,6 +17135,7 @@
         </w:rPr>
         <w:t xml:space="preserve">). Utilizing generative artificial intelligence for instructional design: Exploring strengths, weakness, opportunities, and threats. </w:t>
       </w:r>
+      <w:proofErr w:type="spellStart"/>
       <w:r>
         <w:rPr>
           <w:bCs/>
@@ -17007,6 +17144,7 @@
         </w:rPr>
         <w:t>TechTrends</w:t>
       </w:r>
+      <w:proofErr w:type="spellEnd"/>
       <w:r>
         <w:rPr>
           <w:rFonts w:hint="eastAsia"/>
@@ -17023,7 +17161,7 @@
         </w:rPr>
         <w:t xml:space="preserve"> </w:t>
       </w:r>
-      <w:hyperlink r:id="rId42" w:history="1">
+      <w:hyperlink r:id="rId43" w:history="1">
         <w:r>
           <w:rPr>
             <w:rStyle w:val="Hyperlink"/>
@@ -17204,7 +17342,15 @@
         <w:t>Moon, J.</w:t>
       </w:r>
       <w:r>
-        <w:t xml:space="preserve">, Yeo, S., Si, Q., &amp; Ljeluola, </w:t>
+        <w:t xml:space="preserve">, Yeo, S., Si, Q., &amp; </w:t>
+      </w:r>
+      <w:proofErr w:type="spellStart"/>
+      <w:r>
+        <w:t>Ljeluola</w:t>
+      </w:r>
+      <w:proofErr w:type="spellEnd"/>
+      <w:r>
+        <w:t xml:space="preserve">, </w:t>
       </w:r>
       <w:r>
         <w:t xml:space="preserve">A. </w:t>
@@ -17256,7 +17402,7 @@
       <w:r>
         <w:t xml:space="preserve"> </w:t>
       </w:r>
-      <w:hyperlink r:id="rId43" w:history="1">
+      <w:hyperlink r:id="rId44" w:history="1">
         <w:r>
           <w:rPr>
             <w:rStyle w:val="Hyperlink"/>
@@ -17431,7 +17577,7 @@
         </w:rPr>
         <w:t xml:space="preserve"> </w:t>
       </w:r>
-      <w:hyperlink r:id="rId44" w:history="1">
+      <w:hyperlink r:id="rId45" w:history="1">
         <w:r>
           <w:rPr>
             <w:rStyle w:val="Hyperlink"/>
@@ -17474,7 +17620,15 @@
         <w:t>Moon, J</w:t>
       </w:r>
       <w:r>
-        <w:t>., &amp; Drachsler, H. (</w:t>
+        <w:t xml:space="preserve">., &amp; </w:t>
+      </w:r>
+      <w:proofErr w:type="spellStart"/>
+      <w:r>
+        <w:t>Drachsler</w:t>
+      </w:r>
+      <w:proofErr w:type="spellEnd"/>
+      <w:r>
+        <w:t>, H. (</w:t>
       </w:r>
       <w:r>
         <w:t>2024</w:t>
@@ -17509,7 +17663,7 @@
       <w:r>
         <w:t xml:space="preserve"> </w:t>
       </w:r>
-      <w:hyperlink r:id="rId45" w:history="1">
+      <w:hyperlink r:id="rId46" w:history="1">
         <w:r>
           <w:rPr>
             <w:rStyle w:val="Hyperlink"/>
@@ -17689,7 +17843,7 @@
         </w:rPr>
         <w:t xml:space="preserve"> </w:t>
       </w:r>
-      <w:hyperlink r:id="rId46" w:history="1">
+      <w:hyperlink r:id="rId47" w:history="1">
         <w:r>
           <w:rPr>
             <w:rStyle w:val="Hyperlink"/>
@@ -17789,7 +17943,7 @@
       <w:r>
         <w:t xml:space="preserve"> </w:t>
       </w:r>
-      <w:hyperlink r:id="rId47" w:history="1">
+      <w:hyperlink r:id="rId48" w:history="1">
         <w:r>
           <w:rPr>
             <w:rStyle w:val="Hyperlink"/>
@@ -17951,7 +18105,7 @@
       <w:r>
         <w:t xml:space="preserve"> </w:t>
       </w:r>
-      <w:hyperlink r:id="rId48" w:history="1">
+      <w:hyperlink r:id="rId49" w:history="1">
         <w:r>
           <w:rPr>
             <w:rStyle w:val="Hyperlink"/>
@@ -18124,7 +18278,7 @@
       <w:r>
         <w:t xml:space="preserve"> </w:t>
       </w:r>
-      <w:hyperlink r:id="rId49" w:history="1">
+      <w:hyperlink r:id="rId50" w:history="1">
         <w:r>
           <w:rPr>
             <w:rStyle w:val="Hyperlink"/>
@@ -18310,7 +18464,7 @@
       <w:r>
         <w:t xml:space="preserve"> </w:t>
       </w:r>
-      <w:hyperlink r:id="rId50" w:history="1">
+      <w:hyperlink r:id="rId51" w:history="1">
         <w:r>
           <w:rPr>
             <w:rStyle w:val="Hyperlink"/>
@@ -18497,7 +18651,7 @@
       <w:r>
         <w:t xml:space="preserve">, 3101-3113. </w:t>
       </w:r>
-      <w:hyperlink r:id="rId51" w:history="1">
+      <w:hyperlink r:id="rId52" w:history="1">
         <w:r>
           <w:rPr>
             <w:rStyle w:val="Hyperlink"/>
@@ -18712,7 +18866,7 @@
       <w:r>
         <w:t xml:space="preserve"> </w:t>
       </w:r>
-      <w:hyperlink r:id="rId52" w:history="1">
+      <w:hyperlink r:id="rId53" w:history="1">
         <w:r>
           <w:rPr>
             <w:rStyle w:val="Hyperlink"/>
@@ -18884,7 +19038,7 @@
       <w:r>
         <w:t xml:space="preserve"> </w:t>
       </w:r>
-      <w:hyperlink r:id="rId53" w:history="1">
+      <w:hyperlink r:id="rId54" w:history="1">
         <w:r>
           <w:rPr>
             <w:rStyle w:val="Hyperlink"/>
@@ -19110,7 +19264,7 @@
         </w:rPr>
         <w:t xml:space="preserve"> </w:t>
       </w:r>
-      <w:hyperlink r:id="rId54" w:history="1">
+      <w:hyperlink r:id="rId55" w:history="1">
         <w:r>
           <w:rPr>
             <w:rStyle w:val="Hyperlink"/>
@@ -19281,7 +19435,7 @@
         </w:rPr>
         <w:t xml:space="preserve">. </w:t>
       </w:r>
-      <w:hyperlink r:id="rId55" w:history="1">
+      <w:hyperlink r:id="rId56" w:history="1">
         <w:r>
           <w:rPr>
             <w:rStyle w:val="Hyperlink"/>
@@ -19527,7 +19681,7 @@
       <w:r>
         <w:t xml:space="preserve">(3), 11-31. </w:t>
       </w:r>
-      <w:hyperlink r:id="rId56" w:history="1">
+      <w:hyperlink r:id="rId57" w:history="1">
         <w:r>
           <w:rPr>
             <w:rStyle w:val="Hyperlink"/>
@@ -19764,7 +19918,7 @@
       <w:r>
         <w:t xml:space="preserve">. </w:t>
       </w:r>
-      <w:hyperlink r:id="rId57" w:history="1">
+      <w:hyperlink r:id="rId58" w:history="1">
         <w:r>
           <w:rPr>
             <w:rStyle w:val="Hyperlink"/>
@@ -19915,6 +20069,7 @@
       <w:r>
         <w:t xml:space="preserve"> </w:t>
       </w:r>
+      <w:proofErr w:type="spellStart"/>
       <w:r>
         <w:rPr>
           <w:i/>
@@ -19922,6 +20077,7 @@
         </w:rPr>
         <w:t>TechTrends</w:t>
       </w:r>
+      <w:proofErr w:type="spellEnd"/>
       <w:r>
         <w:rPr>
           <w:i/>
@@ -19946,7 +20102,7 @@
         </w:rPr>
         <w:t xml:space="preserve"> </w:t>
       </w:r>
-      <w:hyperlink r:id="rId58" w:history="1">
+      <w:hyperlink r:id="rId59" w:history="1">
         <w:r>
           <w:rPr>
             <w:rStyle w:val="Hyperlink"/>
@@ -20155,7 +20311,7 @@
       <w:r>
         <w:t xml:space="preserve">(1), 49-62. </w:t>
       </w:r>
-      <w:hyperlink r:id="rId59" w:history="1">
+      <w:hyperlink r:id="rId60" w:history="1">
         <w:r>
           <w:rPr>
             <w:rStyle w:val="Hyperlink"/>
@@ -20383,7 +20539,7 @@
         </w:rPr>
         <w:t xml:space="preserve">, 1777–1798. </w:t>
       </w:r>
-      <w:hyperlink r:id="rId60" w:history="1">
+      <w:hyperlink r:id="rId61" w:history="1">
         <w:r>
           <w:rPr>
             <w:rStyle w:val="Hyperlink"/>
@@ -20601,7 +20757,7 @@
       <w:r>
         <w:t xml:space="preserve"> </w:t>
       </w:r>
-      <w:hyperlink r:id="rId61" w:history="1">
+      <w:hyperlink r:id="rId62" w:history="1">
         <w:r>
           <w:rPr>
             <w:rStyle w:val="Hyperlink"/>
@@ -20835,7 +20991,7 @@
         </w:rPr>
         <w:t xml:space="preserve">. </w:t>
       </w:r>
-      <w:hyperlink r:id="rId62" w:history="1">
+      <w:hyperlink r:id="rId63" w:history="1">
         <w:r>
           <w:rPr>
             <w:rStyle w:val="Hyperlink"/>
@@ -21052,7 +21208,7 @@
       <w:r>
         <w:t xml:space="preserve">(5), 1766-1784. </w:t>
       </w:r>
-      <w:hyperlink r:id="rId63" w:history="1">
+      <w:hyperlink r:id="rId64" w:history="1">
         <w:r>
           <w:rPr>
             <w:rStyle w:val="Hyperlink"/>
@@ -21263,7 +21419,7 @@
         </w:rPr>
         <w:t xml:space="preserve">, 1931-1959. </w:t>
       </w:r>
-      <w:hyperlink r:id="rId64" w:history="1">
+      <w:hyperlink r:id="rId65" w:history="1">
         <w:r>
           <w:rPr>
             <w:rStyle w:val="Hyperlink"/>
@@ -21484,7 +21640,7 @@
         </w:rPr>
         <w:t>,</w:t>
       </w:r>
-      <w:hyperlink r:id="rId65">
+      <w:hyperlink r:id="rId66">
         <w:r>
           <w:rPr>
             <w:color w:val="212121"/>
@@ -21506,7 +21662,7 @@
         </w:rPr>
         <w:t xml:space="preserve">, 39–63. </w:t>
       </w:r>
-      <w:hyperlink r:id="rId66" w:history="1">
+      <w:hyperlink r:id="rId67" w:history="1">
         <w:r>
           <w:rPr>
             <w:rStyle w:val="Hyperlink"/>
@@ -21717,7 +21873,7 @@
       <w:r>
         <w:t xml:space="preserve">(3), 310-335. </w:t>
       </w:r>
-      <w:hyperlink r:id="rId67" w:history="1">
+      <w:hyperlink r:id="rId68" w:history="1">
         <w:r>
           <w:rPr>
             <w:rStyle w:val="Hyperlink"/>
@@ -21886,7 +22042,7 @@
       <w:r>
         <w:t xml:space="preserve"> </w:t>
       </w:r>
-      <w:hyperlink r:id="rId68" w:history="1">
+      <w:hyperlink r:id="rId69" w:history="1">
         <w:r>
           <w:rPr>
             <w:rStyle w:val="Hyperlink"/>
@@ -22116,7 +22272,7 @@
       <w:r>
         <w:t xml:space="preserve">(4), 863-885. </w:t>
       </w:r>
-      <w:hyperlink r:id="rId69" w:history="1">
+      <w:hyperlink r:id="rId70" w:history="1">
         <w:r>
           <w:rPr>
             <w:rStyle w:val="Hyperlink"/>
@@ -22348,7 +22504,7 @@
       <w:r>
         <w:t xml:space="preserve"> </w:t>
       </w:r>
-      <w:hyperlink r:id="rId70" w:history="1">
+      <w:hyperlink r:id="rId71" w:history="1">
         <w:r>
           <w:rPr>
             <w:rStyle w:val="Hyperlink"/>
@@ -22476,7 +22632,7 @@
       <w:r>
         <w:t>(4), 728-741. </w:t>
       </w:r>
-      <w:hyperlink r:id="rId71" w:history="1">
+      <w:hyperlink r:id="rId72" w:history="1">
         <w:r>
           <w:rPr>
             <w:rStyle w:val="Hyperlink"/>
@@ -22694,7 +22850,7 @@
       <w:r>
         <w:t>(3), 53-62. </w:t>
       </w:r>
-      <w:hyperlink r:id="rId72" w:history="1">
+      <w:hyperlink r:id="rId73" w:history="1">
         <w:r>
           <w:rPr>
             <w:rStyle w:val="Hyperlink"/>
@@ -22964,7 +23120,7 @@
         </w:rPr>
         <w:t xml:space="preserve">(3), 637-681. </w:t>
       </w:r>
-      <w:hyperlink r:id="rId73" w:history="1">
+      <w:hyperlink r:id="rId74" w:history="1">
         <w:r>
           <w:rPr>
             <w:rStyle w:val="Hyperlink"/>
@@ -23010,7 +23166,7 @@
       <w:r>
         <w:t xml:space="preserve">(3), 293-313. </w:t>
       </w:r>
-      <w:hyperlink r:id="rId74" w:history="1">
+      <w:hyperlink r:id="rId75" w:history="1">
         <w:r>
           <w:rPr>
             <w:rStyle w:val="Hyperlink"/>
@@ -23059,7 +23215,7 @@
       <w:r>
         <w:t xml:space="preserve">(10), 594-603. </w:t>
       </w:r>
-      <w:hyperlink r:id="rId75" w:history="1">
+      <w:hyperlink r:id="rId76" w:history="1">
         <w:r>
           <w:rPr>
             <w:rStyle w:val="Hyperlink"/>
@@ -23159,12 +23315,36 @@
         <w:t xml:space="preserve">Instructional Technology and Learning Sciences: Korean Open Access Guide. </w:t>
       </w:r>
       <w:r>
-        <w:t>Korean Edutech/LearningSciences Researcher Network (KELS).</w:t>
-      </w:r>
-      <w:r>
-        <w:t xml:space="preserve"> EdtechBooks. </w:t>
-      </w:r>
-      <w:hyperlink r:id="rId76" w:history="1">
+        <w:t xml:space="preserve">Korean </w:t>
+      </w:r>
+      <w:proofErr w:type="spellStart"/>
+      <w:r>
+        <w:t>Edutech</w:t>
+      </w:r>
+      <w:proofErr w:type="spellEnd"/>
+      <w:r>
+        <w:t>/</w:t>
+      </w:r>
+      <w:proofErr w:type="spellStart"/>
+      <w:r>
+        <w:t>LearningSciences</w:t>
+      </w:r>
+      <w:proofErr w:type="spellEnd"/>
+      <w:r>
+        <w:t xml:space="preserve"> Researcher Network (KELS).</w:t>
+      </w:r>
+      <w:r>
+        <w:t xml:space="preserve"> </w:t>
+      </w:r>
+      <w:proofErr w:type="spellStart"/>
+      <w:r>
+        <w:t>EdtechBooks</w:t>
+      </w:r>
+      <w:proofErr w:type="spellEnd"/>
+      <w:r>
+        <w:t xml:space="preserve">. </w:t>
+      </w:r>
+      <w:hyperlink r:id="rId77" w:history="1">
         <w:r>
           <w:rPr>
             <w:rStyle w:val="Hyperlink"/>
@@ -23471,7 +23651,23 @@
           <w:bCs/>
           <w:lang w:eastAsia="ko-KR"/>
         </w:rPr>
-        <w:t xml:space="preserve">reasoning: AI-mediated dilemma spaces and exploratory learning. In A. Darejeh &amp; S. Sepasgozar (Eds.), </w:t>
+        <w:t xml:space="preserve">reasoning: AI-mediated dilemma spaces and exploratory learning. In A. Darejeh &amp; S. </w:t>
+      </w:r>
+      <w:proofErr w:type="spellStart"/>
+      <w:r>
+        <w:rPr>
+          <w:bCs/>
+          <w:lang w:eastAsia="ko-KR"/>
+        </w:rPr>
+        <w:t>Sepasgozar</w:t>
+      </w:r>
+      <w:proofErr w:type="spellEnd"/>
+      <w:r>
+        <w:rPr>
+          <w:bCs/>
+          <w:lang w:eastAsia="ko-KR"/>
+        </w:rPr>
+        <w:t xml:space="preserve"> (Eds.), </w:t>
       </w:r>
       <w:r>
         <w:rPr>
@@ -23850,7 +24046,15 @@
         <w:t>Moon, J</w:t>
       </w:r>
       <w:r>
-        <w:t xml:space="preserve">., and West, L. (2021). Designing Dynamic Learning Supports for Game and Simulation-Based Learning in STEM Education, Aprea C. and Ifenthaler, </w:t>
+        <w:t xml:space="preserve">., and West, L. (2021). Designing Dynamic Learning Supports for Game and Simulation-Based Learning in STEM Education, Aprea C. and </w:t>
+      </w:r>
+      <w:proofErr w:type="spellStart"/>
+      <w:r>
+        <w:t>Ifenthaler</w:t>
+      </w:r>
+      <w:proofErr w:type="spellEnd"/>
+      <w:r>
+        <w:t xml:space="preserve">, </w:t>
       </w:r>
       <w:r>
         <w:lastRenderedPageBreak/>
@@ -23866,7 +24070,7 @@
       <w:r>
         <w:t xml:space="preserve">. Advances in Game-Based Learning, Springer, Cham. </w:t>
       </w:r>
-      <w:hyperlink r:id="rId77" w:history="1">
+      <w:hyperlink r:id="rId78" w:history="1">
         <w:r>
           <w:rPr>
             <w:rStyle w:val="Hyperlink"/>
@@ -23931,7 +24135,7 @@
       <w:r>
         <w:t xml:space="preserve">, Lecture Note Series in Educational Technology. Springer, Singapore. </w:t>
       </w:r>
-      <w:hyperlink r:id="rId78">
+      <w:hyperlink r:id="rId79">
         <w:r>
           <w:rPr>
             <w:color w:val="1155CC"/>
@@ -23999,7 +24203,7 @@
       <w:r>
         <w:t xml:space="preserve">, Springer, Singapore. </w:t>
       </w:r>
-      <w:hyperlink r:id="rId79">
+      <w:hyperlink r:id="rId80">
         <w:r>
           <w:rPr>
             <w:color w:val="0563C1"/>
@@ -24061,7 +24265,7 @@
       <w:r>
         <w:t xml:space="preserve"> and Intelligence, Springer, Singapore. </w:t>
       </w:r>
-      <w:hyperlink r:id="rId80">
+      <w:hyperlink r:id="rId81">
         <w:r>
           <w:rPr>
             <w:color w:val="0563C1"/>
@@ -24238,7 +24442,7 @@
         </w:rPr>
         <w:t xml:space="preserve">. Advance online publication. </w:t>
       </w:r>
-      <w:hyperlink r:id="rId81" w:history="1">
+      <w:hyperlink r:id="rId82" w:history="1">
         <w:r>
           <w:rPr>
             <w:rStyle w:val="Hyperlink"/>
@@ -24316,7 +24520,7 @@
         </w:rPr>
         <w:t xml:space="preserve">Generative AI-Enhanced Chatbot Design for Constructionist Gaming. In: Plass, J.L., Ochoa, X. (eds) Serious Games. JCSG 2024. Lecture Notes in Computer Science, vol 15259. Springer, Cham. </w:t>
       </w:r>
-      <w:hyperlink r:id="rId82" w:history="1">
+      <w:hyperlink r:id="rId83" w:history="1">
         <w:r>
           <w:rPr>
             <w:rStyle w:val="Hyperlink"/>
@@ -24432,7 +24636,7 @@
         </w:rPr>
         <w:t xml:space="preserve">(1), 16–19. </w:t>
       </w:r>
-      <w:hyperlink r:id="rId83" w:history="1">
+      <w:hyperlink r:id="rId84" w:history="1">
         <w:r>
           <w:rPr>
             <w:rStyle w:val="Hyperlink"/>
@@ -24519,7 +24723,7 @@
         </w:rPr>
         <w:t xml:space="preserve">(1), 32–35. </w:t>
       </w:r>
-      <w:hyperlink r:id="rId84" w:history="1">
+      <w:hyperlink r:id="rId85" w:history="1">
         <w:r>
           <w:rPr>
             <w:rStyle w:val="Hyperlink"/>
@@ -24604,7 +24808,7 @@
         </w:rPr>
         <w:t xml:space="preserve">(1), 109–111. Retrieved from </w:t>
       </w:r>
-      <w:hyperlink r:id="rId85" w:history="1">
+      <w:hyperlink r:id="rId86" w:history="1">
         <w:r>
           <w:rPr>
             <w:rStyle w:val="Hyperlink"/>
@@ -24696,7 +24900,7 @@
         </w:rPr>
         <w:t xml:space="preserve">(1), 112–113. Retrieved from </w:t>
       </w:r>
-      <w:hyperlink r:id="rId86" w:history="1">
+      <w:hyperlink r:id="rId87" w:history="1">
         <w:r>
           <w:rPr>
             <w:rStyle w:val="Hyperlink"/>
@@ -24789,7 +24993,7 @@
         <w:lastRenderedPageBreak/>
         <w:t xml:space="preserve">21–25. Retrieved from </w:t>
       </w:r>
-      <w:hyperlink r:id="rId87" w:history="1">
+      <w:hyperlink r:id="rId88" w:history="1">
         <w:r>
           <w:rPr>
             <w:rStyle w:val="Hyperlink"/>
@@ -24861,7 +25065,7 @@
         </w:rPr>
         <w:t xml:space="preserve">, Fujisawa, Japan. </w:t>
       </w:r>
-      <w:hyperlink r:id="rId88" w:history="1">
+      <w:hyperlink r:id="rId89" w:history="1">
         <w:r>
           <w:rPr>
             <w:rStyle w:val="Hyperlink"/>
@@ -24907,7 +25111,7 @@
         </w:rPr>
         <w:t xml:space="preserve"> (pp. 889-892). International Society of the Learning Sciences. </w:t>
       </w:r>
-      <w:hyperlink r:id="rId89" w:history="1">
+      <w:hyperlink r:id="rId90" w:history="1">
         <w:r>
           <w:rPr>
             <w:rStyle w:val="Hyperlink"/>
@@ -24966,7 +25170,7 @@
         </w:rPr>
         <w:t xml:space="preserve"> </w:t>
       </w:r>
-      <w:hyperlink r:id="rId90" w:history="1">
+      <w:hyperlink r:id="rId91" w:history="1">
         <w:r>
           <w:rPr>
             <w:rStyle w:val="Hyperlink"/>
@@ -25031,7 +25235,7 @@
         </w:rPr>
         <w:t xml:space="preserve"> </w:t>
       </w:r>
-      <w:hyperlink r:id="rId91" w:history="1">
+      <w:hyperlink r:id="rId92" w:history="1">
         <w:r>
           <w:rPr>
             <w:rStyle w:val="Hyperlink"/>
@@ -25102,7 +25306,7 @@
         </w:rPr>
         <w:t xml:space="preserve">In: Fang X. (eds) HCI in Games: Serious and Immersive Games. HCI 2021. Lecture Notes in Computer Science, vol 12790. Springer, Cham. </w:t>
       </w:r>
-      <w:hyperlink r:id="rId92" w:history="1">
+      <w:hyperlink r:id="rId93" w:history="1">
         <w:r>
           <w:rPr>
             <w:rStyle w:val="Hyperlink"/>
@@ -25153,7 +25357,7 @@
         </w:rPr>
         <w:t xml:space="preserve"> </w:t>
       </w:r>
-      <w:hyperlink r:id="rId93" w:history="1">
+      <w:hyperlink r:id="rId94" w:history="1">
         <w:r>
           <w:rPr>
             <w:rStyle w:val="Hyperlink"/>
@@ -25196,7 +25400,7 @@
       <w:r>
         <w:t xml:space="preserve"> </w:t>
       </w:r>
-      <w:hyperlink r:id="rId94" w:history="1">
+      <w:hyperlink r:id="rId95" w:history="1">
         <w:r>
           <w:rPr>
             <w:rStyle w:val="Hyperlink"/>
@@ -25236,7 +25440,7 @@
       <w:r>
         <w:t xml:space="preserve"> </w:t>
       </w:r>
-      <w:hyperlink r:id="rId95" w:history="1">
+      <w:hyperlink r:id="rId96" w:history="1">
         <w:r>
           <w:rPr>
             <w:rStyle w:val="Hyperlink"/>
@@ -25306,7 +25510,7 @@
       <w:r>
         <w:t xml:space="preserve"> </w:t>
       </w:r>
-      <w:hyperlink r:id="rId96" w:history="1">
+      <w:hyperlink r:id="rId97" w:history="1">
         <w:r>
           <w:rPr>
             <w:rStyle w:val="Hyperlink"/>
@@ -25748,7 +25952,7 @@
         </w:rPr>
         <w:t> (pp. 1305-1309). Chesapeake, VA: Association for the Advancement of Computing in Education (AACE). Retrieved from </w:t>
       </w:r>
-      <w:hyperlink r:id="rId97">
+      <w:hyperlink r:id="rId98">
         <w:r>
           <w:rPr>
             <w:color w:val="0563C1"/>
@@ -25931,7 +26135,27 @@
           <w:iCs/>
           <w:lang w:eastAsia="ko-KR"/>
         </w:rPr>
-        <w:t>Enhancing the resolution of instructional design evaluation: Reliability and validity analysis of a multi-agent system applying Gagné’s nine events of instruction</w:t>
+        <w:t xml:space="preserve">Enhancing the resolution of instructional design evaluation: Reliability and validity analysis of a multi-agent system applying </w:t>
+      </w:r>
+      <w:proofErr w:type="spellStart"/>
+      <w:r>
+        <w:rPr>
+          <w:bCs/>
+          <w:i/>
+          <w:iCs/>
+          <w:lang w:eastAsia="ko-KR"/>
+        </w:rPr>
+        <w:t>Gagné’s</w:t>
+      </w:r>
+      <w:proofErr w:type="spellEnd"/>
+      <w:r>
+        <w:rPr>
+          <w:bCs/>
+          <w:i/>
+          <w:iCs/>
+          <w:lang w:eastAsia="ko-KR"/>
+        </w:rPr>
+        <w:t xml:space="preserve"> nine events of instruction</w:t>
       </w:r>
       <w:r>
         <w:rPr>
@@ -26087,14 +26311,25 @@
         </w:rPr>
         <w:t xml:space="preserve">). </w:t>
       </w:r>
-      <w:r>
-        <w:rPr>
-          <w:bCs/>
-          <w:i/>
-          <w:iCs/>
-          <w:lang w:eastAsia="ko-KR"/>
-        </w:rPr>
-        <w:t>FieldExplorer: A network-based visualization platform for supporting novice researchers’ academic decision-making</w:t>
+      <w:proofErr w:type="spellStart"/>
+      <w:r>
+        <w:rPr>
+          <w:bCs/>
+          <w:i/>
+          <w:iCs/>
+          <w:lang w:eastAsia="ko-KR"/>
+        </w:rPr>
+        <w:t>FieldExplorer</w:t>
+      </w:r>
+      <w:proofErr w:type="spellEnd"/>
+      <w:r>
+        <w:rPr>
+          <w:bCs/>
+          <w:i/>
+          <w:iCs/>
+          <w:lang w:eastAsia="ko-KR"/>
+        </w:rPr>
+        <w:t>: A network-based visualization platform for supporting novice researchers’ academic decision-making</w:t>
       </w:r>
       <w:r>
         <w:rPr>
@@ -26182,14 +26417,25 @@
         </w:rPr>
         <w:t xml:space="preserve">). </w:t>
       </w:r>
-      <w:r>
-        <w:rPr>
-          <w:bCs/>
-          <w:i/>
-          <w:iCs/>
-          <w:lang w:eastAsia="ko-KR"/>
-        </w:rPr>
-        <w:t>SpeakWise: Capturing real-time reasoning evidence traces through AI-mediated oral assessment</w:t>
+      <w:proofErr w:type="spellStart"/>
+      <w:r>
+        <w:rPr>
+          <w:bCs/>
+          <w:i/>
+          <w:iCs/>
+          <w:lang w:eastAsia="ko-KR"/>
+        </w:rPr>
+        <w:t>SpeakWise</w:t>
+      </w:r>
+      <w:proofErr w:type="spellEnd"/>
+      <w:r>
+        <w:rPr>
+          <w:bCs/>
+          <w:i/>
+          <w:iCs/>
+          <w:lang w:eastAsia="ko-KR"/>
+        </w:rPr>
+        <w:t>: Capturing real-time reasoning evidence traces through AI-mediated oral assessment</w:t>
       </w:r>
       <w:r>
         <w:rPr>
@@ -26279,14 +26525,25 @@
         </w:rPr>
         <w:t xml:space="preserve">). </w:t>
       </w:r>
-      <w:r>
-        <w:rPr>
-          <w:i/>
-          <w:iCs/>
-          <w:color w:val="222222"/>
-          <w:lang w:eastAsia="ko-KR"/>
-        </w:rPr>
-        <w:t>ReviewLens: An AI-</w:t>
+      <w:proofErr w:type="spellStart"/>
+      <w:r>
+        <w:rPr>
+          <w:i/>
+          <w:iCs/>
+          <w:color w:val="222222"/>
+          <w:lang w:eastAsia="ko-KR"/>
+        </w:rPr>
+        <w:t>ReviewLens</w:t>
+      </w:r>
+      <w:proofErr w:type="spellEnd"/>
+      <w:r>
+        <w:rPr>
+          <w:i/>
+          <w:iCs/>
+          <w:color w:val="222222"/>
+          <w:lang w:eastAsia="ko-KR"/>
+        </w:rPr>
+        <w:t>: An AI-</w:t>
       </w:r>
       <w:r>
         <w:rPr>
@@ -26446,7 +26703,43 @@
           <w:color w:val="222222"/>
           <w:lang w:eastAsia="ko-KR"/>
         </w:rPr>
-        <w:t xml:space="preserve">. iLEAD Stream, iLRN 2026, </w:t>
+        <w:t xml:space="preserve">. </w:t>
+      </w:r>
+      <w:proofErr w:type="spellStart"/>
+      <w:r>
+        <w:rPr>
+          <w:rFonts w:hint="eastAsia"/>
+          <w:color w:val="222222"/>
+          <w:lang w:eastAsia="ko-KR"/>
+        </w:rPr>
+        <w:t>iLEAD</w:t>
+      </w:r>
+      <w:proofErr w:type="spellEnd"/>
+      <w:r>
+        <w:rPr>
+          <w:rFonts w:hint="eastAsia"/>
+          <w:color w:val="222222"/>
+          <w:lang w:eastAsia="ko-KR"/>
+        </w:rPr>
+        <w:t xml:space="preserve"> Stream, </w:t>
+      </w:r>
+      <w:proofErr w:type="spellStart"/>
+      <w:r>
+        <w:rPr>
+          <w:rFonts w:hint="eastAsia"/>
+          <w:color w:val="222222"/>
+          <w:lang w:eastAsia="ko-KR"/>
+        </w:rPr>
+        <w:t>iLRN</w:t>
+      </w:r>
+      <w:proofErr w:type="spellEnd"/>
+      <w:r>
+        <w:rPr>
+          <w:rFonts w:hint="eastAsia"/>
+          <w:color w:val="222222"/>
+          <w:lang w:eastAsia="ko-KR"/>
+        </w:rPr>
+        <w:t xml:space="preserve"> 2026, </w:t>
       </w:r>
       <w:r>
         <w:rPr>
@@ -26499,14 +26792,25 @@
         </w:rPr>
         <w:t xml:space="preserve">., Kim, T., Amayou, J. (2026, June). </w:t>
       </w:r>
-      <w:r>
-        <w:rPr>
-          <w:i/>
-          <w:iCs/>
-          <w:color w:val="222222"/>
-          <w:lang w:eastAsia="ko-KR"/>
-        </w:rPr>
-        <w:t xml:space="preserve">DataSandbox: Designing </w:t>
+      <w:proofErr w:type="spellStart"/>
+      <w:r>
+        <w:rPr>
+          <w:i/>
+          <w:iCs/>
+          <w:color w:val="222222"/>
+          <w:lang w:eastAsia="ko-KR"/>
+        </w:rPr>
+        <w:t>DataSandbox</w:t>
+      </w:r>
+      <w:proofErr w:type="spellEnd"/>
+      <w:r>
+        <w:rPr>
+          <w:i/>
+          <w:iCs/>
+          <w:color w:val="222222"/>
+          <w:lang w:eastAsia="ko-KR"/>
+        </w:rPr>
+        <w:t xml:space="preserve">: Designing </w:t>
       </w:r>
       <w:r>
         <w:rPr>
@@ -26628,7 +26932,43 @@
           <w:color w:val="222222"/>
           <w:lang w:eastAsia="ko-KR"/>
         </w:rPr>
-        <w:t xml:space="preserve">. iLEAD Stream, iLRN 2026, </w:t>
+        <w:t xml:space="preserve">. </w:t>
+      </w:r>
+      <w:proofErr w:type="spellStart"/>
+      <w:r>
+        <w:rPr>
+          <w:rFonts w:hint="eastAsia"/>
+          <w:color w:val="222222"/>
+          <w:lang w:eastAsia="ko-KR"/>
+        </w:rPr>
+        <w:t>iLEAD</w:t>
+      </w:r>
+      <w:proofErr w:type="spellEnd"/>
+      <w:r>
+        <w:rPr>
+          <w:rFonts w:hint="eastAsia"/>
+          <w:color w:val="222222"/>
+          <w:lang w:eastAsia="ko-KR"/>
+        </w:rPr>
+        <w:t xml:space="preserve"> Stream, </w:t>
+      </w:r>
+      <w:proofErr w:type="spellStart"/>
+      <w:r>
+        <w:rPr>
+          <w:rFonts w:hint="eastAsia"/>
+          <w:color w:val="222222"/>
+          <w:lang w:eastAsia="ko-KR"/>
+        </w:rPr>
+        <w:t>iLRN</w:t>
+      </w:r>
+      <w:proofErr w:type="spellEnd"/>
+      <w:r>
+        <w:rPr>
+          <w:rFonts w:hint="eastAsia"/>
+          <w:color w:val="222222"/>
+          <w:lang w:eastAsia="ko-KR"/>
+        </w:rPr>
+        <w:t xml:space="preserve"> 2026, </w:t>
       </w:r>
       <w:r>
         <w:rPr>
@@ -27880,6 +28220,7 @@
         </w:rPr>
         <w:t xml:space="preserve">raining: A </w:t>
       </w:r>
+      <w:proofErr w:type="spellStart"/>
       <w:r>
         <w:rPr>
           <w:rFonts w:hint="eastAsia"/>
@@ -27897,7 +28238,17 @@
           <w:color w:val="222222"/>
           <w:lang w:eastAsia="ko-KR"/>
         </w:rPr>
-        <w:t xml:space="preserve">icrogenetic and </w:t>
+        <w:t>icrogenetic</w:t>
+      </w:r>
+      <w:proofErr w:type="spellEnd"/>
+      <w:r>
+        <w:rPr>
+          <w:i/>
+          <w:iCs/>
+          <w:color w:val="222222"/>
+          <w:lang w:eastAsia="ko-KR"/>
+        </w:rPr>
+        <w:t xml:space="preserve"> and </w:t>
       </w:r>
       <w:r>
         <w:rPr>
@@ -31005,7 +31356,23 @@
           <w:rFonts w:hint="eastAsia"/>
           <w:lang w:eastAsia="ko-KR"/>
         </w:rPr>
-        <w:t xml:space="preserve">Awoyemi, I., Unggi, L., &amp; </w:t>
+        <w:t xml:space="preserve">Awoyemi, I., </w:t>
+      </w:r>
+      <w:proofErr w:type="spellStart"/>
+      <w:r>
+        <w:rPr>
+          <w:rFonts w:hint="eastAsia"/>
+          <w:lang w:eastAsia="ko-KR"/>
+        </w:rPr>
+        <w:t>Unggi</w:t>
+      </w:r>
+      <w:proofErr w:type="spellEnd"/>
+      <w:r>
+        <w:rPr>
+          <w:rFonts w:hint="eastAsia"/>
+          <w:lang w:eastAsia="ko-KR"/>
+        </w:rPr>
+        <w:t xml:space="preserve">, L., &amp; </w:t>
       </w:r>
       <w:r>
         <w:rPr>
@@ -31839,7 +32206,21 @@
         <w:rPr>
           <w:color w:val="222222"/>
         </w:rPr>
-        <w:t>. iLRN 2024 Practitioner Stream</w:t>
+        <w:t xml:space="preserve">. </w:t>
+      </w:r>
+      <w:proofErr w:type="spellStart"/>
+      <w:r>
+        <w:rPr>
+          <w:color w:val="222222"/>
+        </w:rPr>
+        <w:t>iLRN</w:t>
+      </w:r>
+      <w:proofErr w:type="spellEnd"/>
+      <w:r>
+        <w:rPr>
+          <w:color w:val="222222"/>
+        </w:rPr>
+        <w:t xml:space="preserve"> 2024 Practitioner Stream</w:t>
       </w:r>
     </w:p>
     <w:p>
@@ -31923,7 +32304,21 @@
         <w:rPr>
           <w:color w:val="222222"/>
         </w:rPr>
-        <w:t>. iLRN 2024 Practitioner Stream</w:t>
+        <w:t xml:space="preserve">. </w:t>
+      </w:r>
+      <w:proofErr w:type="spellStart"/>
+      <w:r>
+        <w:rPr>
+          <w:color w:val="222222"/>
+        </w:rPr>
+        <w:t>iLRN</w:t>
+      </w:r>
+      <w:proofErr w:type="spellEnd"/>
+      <w:r>
+        <w:rPr>
+          <w:color w:val="222222"/>
+        </w:rPr>
+        <w:t xml:space="preserve"> 2024 Practitioner Stream</w:t>
       </w:r>
     </w:p>
     <w:p>
@@ -32350,8 +32745,13 @@
       <w:r>
         <w:t xml:space="preserve">Poster Presentation. </w:t>
       </w:r>
-      <w:r>
-        <w:t>iLRN 2023 Practitioner Stream. Virtual</w:t>
+      <w:proofErr w:type="spellStart"/>
+      <w:r>
+        <w:t>iLRN</w:t>
+      </w:r>
+      <w:proofErr w:type="spellEnd"/>
+      <w:r>
+        <w:t xml:space="preserve"> 2023 Practitioner Stream. Virtual</w:t>
       </w:r>
       <w:r>
         <w:t>.</w:t>
@@ -32426,8 +32826,13 @@
       <w:r>
         <w:t xml:space="preserve">Poster Presentation. </w:t>
       </w:r>
-      <w:r>
-        <w:t>iLRN 2023 Practitioner Stream. Virtual</w:t>
+      <w:proofErr w:type="spellStart"/>
+      <w:r>
+        <w:t>iLRN</w:t>
+      </w:r>
+      <w:proofErr w:type="spellEnd"/>
+      <w:r>
+        <w:t xml:space="preserve"> 2023 Practitioner Stream. Virtual</w:t>
       </w:r>
       <w:r>
         <w:t>.</w:t>
@@ -32487,8 +32892,13 @@
       <w:r>
         <w:t xml:space="preserve">Poster Presentation. </w:t>
       </w:r>
-      <w:r>
-        <w:t>iLRN 2023 Practitioner Stream. Virtual</w:t>
+      <w:proofErr w:type="spellStart"/>
+      <w:r>
+        <w:t>iLRN</w:t>
+      </w:r>
+      <w:proofErr w:type="spellEnd"/>
+      <w:r>
+        <w:t xml:space="preserve"> 2023 Practitioner Stream. Virtual</w:t>
       </w:r>
       <w:r>
         <w:t>.</w:t>
@@ -32722,12 +33132,21 @@
         </w:rPr>
         <w:t xml:space="preserve">* </w:t>
       </w:r>
-      <w:r>
-        <w:rPr>
-          <w:bCs/>
-          <w:color w:val="000000"/>
-        </w:rPr>
-        <w:t xml:space="preserve">Ljeluola, S. &amp; </w:t>
+      <w:proofErr w:type="spellStart"/>
+      <w:r>
+        <w:rPr>
+          <w:bCs/>
+          <w:color w:val="000000"/>
+        </w:rPr>
+        <w:t>Ljeluola</w:t>
+      </w:r>
+      <w:proofErr w:type="spellEnd"/>
+      <w:r>
+        <w:rPr>
+          <w:bCs/>
+          <w:color w:val="000000"/>
+        </w:rPr>
+        <w:t xml:space="preserve">, S. &amp; </w:t>
       </w:r>
       <w:r>
         <w:rPr>
@@ -33606,7 +34025,21 @@
         <w:rPr>
           <w:bCs/>
         </w:rPr>
-        <w:t>., &amp; Sokolikj, Z. (2022, May) Developing an evidence-centered model for computational thinking in virtual worlds with children with autism. Poster Presentation, iLRN 2022, Vienne, Austria.</w:t>
+        <w:t xml:space="preserve">., &amp; Sokolikj, Z. (2022, May) Developing an evidence-centered model for computational thinking in virtual worlds with children with autism. Poster Presentation, </w:t>
+      </w:r>
+      <w:proofErr w:type="spellStart"/>
+      <w:r>
+        <w:rPr>
+          <w:bCs/>
+        </w:rPr>
+        <w:t>iLRN</w:t>
+      </w:r>
+      <w:proofErr w:type="spellEnd"/>
+      <w:r>
+        <w:rPr>
+          <w:bCs/>
+        </w:rPr>
+        <w:t xml:space="preserve"> 2022, Vienne, Austria.</w:t>
       </w:r>
     </w:p>
     <w:p>
@@ -35808,7 +36241,15 @@
         <w:t>Moon, J.</w:t>
       </w:r>
       <w:r>
-        <w:t xml:space="preserve">, Dai, Z., Pan, Y., Shute, V., Clark, K., &amp; Erlebacher, G. (2017, April). </w:t>
+        <w:t xml:space="preserve">, Dai, Z., Pan, Y., Shute, V., Clark, K., &amp; </w:t>
+      </w:r>
+      <w:proofErr w:type="spellStart"/>
+      <w:r>
+        <w:t>Erlebacher</w:t>
+      </w:r>
+      <w:proofErr w:type="spellEnd"/>
+      <w:r>
+        <w:t xml:space="preserve">, G. (2017, April). </w:t>
       </w:r>
       <w:r>
         <w:rPr>
@@ -37209,6 +37650,7 @@
         </w:rPr>
         <w:t xml:space="preserve">. </w:t>
       </w:r>
+      <w:proofErr w:type="spellStart"/>
       <w:r>
         <w:rPr>
           <w:rFonts w:hint="eastAsia"/>
@@ -37218,6 +37660,7 @@
         </w:rPr>
         <w:t>TechTrends</w:t>
       </w:r>
+      <w:proofErr w:type="spellEnd"/>
       <w:r>
         <w:rPr>
           <w:rFonts w:hint="eastAsia"/>
@@ -38201,11 +38644,19 @@
         </w:rPr>
         <w:t xml:space="preserve"> (In preparation). </w:t>
       </w:r>
-      <w:r>
-        <w:rPr>
-          <w:lang w:eastAsia="ko-KR"/>
-        </w:rPr>
-        <w:t xml:space="preserve">Operationalising CEFR in L2 English </w:t>
+      <w:proofErr w:type="spellStart"/>
+      <w:r>
+        <w:rPr>
+          <w:lang w:eastAsia="ko-KR"/>
+        </w:rPr>
+        <w:t>Operationalising</w:t>
+      </w:r>
+      <w:proofErr w:type="spellEnd"/>
+      <w:r>
+        <w:rPr>
+          <w:lang w:eastAsia="ko-KR"/>
+        </w:rPr>
+        <w:t xml:space="preserve"> CEFR in L2 English </w:t>
       </w:r>
       <w:r>
         <w:rPr>
@@ -41835,6 +42286,7 @@
         </w:rPr>
         <w:t xml:space="preserve">. </w:t>
       </w:r>
+      <w:proofErr w:type="spellStart"/>
       <w:r>
         <w:rPr>
           <w:rFonts w:hint="eastAsia"/>
@@ -41862,6 +42314,7 @@
         </w:rPr>
         <w:t>rends</w:t>
       </w:r>
+      <w:proofErr w:type="spellEnd"/>
       <w:r>
         <w:rPr>
           <w:rFonts w:hint="eastAsia"/>
@@ -43613,7 +44066,23 @@
           <w:bCs/>
           <w:lang w:eastAsia="ko-KR"/>
         </w:rPr>
-        <w:t>., Aldemir, T., Kourkoulou, T., Lee, H., Song, D., Abu, S., Emerson, W., &amp; Wang, S. (</w:t>
+        <w:t xml:space="preserve">., Aldemir, T., </w:t>
+      </w:r>
+      <w:proofErr w:type="spellStart"/>
+      <w:r>
+        <w:rPr>
+          <w:bCs/>
+          <w:lang w:eastAsia="ko-KR"/>
+        </w:rPr>
+        <w:t>Kourkoulou</w:t>
+      </w:r>
+      <w:proofErr w:type="spellEnd"/>
+      <w:r>
+        <w:rPr>
+          <w:bCs/>
+          <w:lang w:eastAsia="ko-KR"/>
+        </w:rPr>
+        <w:t>, T., Lee, H., Song, D., Abu, S., Emerson, W., &amp; Wang, S. (</w:t>
       </w:r>
       <w:r>
         <w:rPr>
@@ -43691,7 +44160,23 @@
           <w:bCs/>
           <w:lang w:eastAsia="ko-KR"/>
         </w:rPr>
-        <w:t>., Kourkoulou, T., Aldemir, T., Abu, S., Lee, H., &amp; Song, D. (</w:t>
+        <w:t xml:space="preserve">., </w:t>
+      </w:r>
+      <w:proofErr w:type="spellStart"/>
+      <w:r>
+        <w:rPr>
+          <w:bCs/>
+          <w:lang w:eastAsia="ko-KR"/>
+        </w:rPr>
+        <w:t>Kourkoulou</w:t>
+      </w:r>
+      <w:proofErr w:type="spellEnd"/>
+      <w:r>
+        <w:rPr>
+          <w:bCs/>
+          <w:lang w:eastAsia="ko-KR"/>
+        </w:rPr>
+        <w:t>, T., Aldemir, T., Abu, S., Lee, H., &amp; Song, D. (</w:t>
       </w:r>
       <w:r>
         <w:rPr>
@@ -44978,7 +45463,15 @@
       </w:r>
       <w:r>
         <w:br/>
-        <w:t>International Learning Research Network (iLRN) Conference 2022</w:t>
+        <w:t>International Learning Research Network (</w:t>
+      </w:r>
+      <w:proofErr w:type="spellStart"/>
+      <w:r>
+        <w:t>iLRN</w:t>
+      </w:r>
+      <w:proofErr w:type="spellEnd"/>
+      <w:r>
+        <w:t>) Conference 2022</w:t>
       </w:r>
       <w:r>
         <w:rPr>
@@ -45150,14 +45643,30 @@
           <w:rFonts w:hint="eastAsia"/>
           <w:lang w:eastAsia="ko-KR"/>
         </w:rPr>
-        <w:t>Affiliated Faculty, Modu</w:t>
-      </w:r>
-      <w:r>
-        <w:rPr>
-          <w:rFonts w:hint="eastAsia"/>
-          <w:lang w:eastAsia="ko-KR"/>
-        </w:rPr>
-        <w:t xml:space="preserve">Labs </w:t>
+        <w:t xml:space="preserve">Affiliated Faculty, </w:t>
+      </w:r>
+      <w:proofErr w:type="spellStart"/>
+      <w:r>
+        <w:rPr>
+          <w:rFonts w:hint="eastAsia"/>
+          <w:lang w:eastAsia="ko-KR"/>
+        </w:rPr>
+        <w:t>Modu</w:t>
+      </w:r>
+      <w:r>
+        <w:rPr>
+          <w:rFonts w:hint="eastAsia"/>
+          <w:lang w:eastAsia="ko-KR"/>
+        </w:rPr>
+        <w:t>Labs</w:t>
+      </w:r>
+      <w:proofErr w:type="spellEnd"/>
+      <w:r>
+        <w:rPr>
+          <w:rFonts w:hint="eastAsia"/>
+          <w:lang w:eastAsia="ko-KR"/>
+        </w:rPr>
+        <w:t xml:space="preserve"> </w:t>
       </w:r>
       <w:r>
         <w:rPr>
@@ -45263,7 +45772,15 @@
         <w:ind w:left="1440" w:hanging="720"/>
       </w:pPr>
       <w:r>
-        <w:t>Co-Chair, Immersive Learning Research Network (iLRN) (Appointed</w:t>
+        <w:t>Co-Chair, Immersive Learning Research Network (</w:t>
+      </w:r>
+      <w:proofErr w:type="spellStart"/>
+      <w:r>
+        <w:t>iLRN</w:t>
+      </w:r>
+      <w:proofErr w:type="spellEnd"/>
+      <w:r>
+        <w:t>) (Appointed</w:t>
       </w:r>
       <w:r>
         <w:t>, 2021-present</w:t>
@@ -45355,13 +45872,23 @@
         </w:rPr>
         <w:t xml:space="preserve">Associate Editor – </w:t>
       </w:r>
-      <w:r>
-        <w:rPr>
-          <w:i/>
-          <w:iCs/>
-          <w:color w:val="000000"/>
-        </w:rPr>
-        <w:t>Behaviour &amp; Information Technology</w:t>
+      <w:proofErr w:type="spellStart"/>
+      <w:r>
+        <w:rPr>
+          <w:i/>
+          <w:iCs/>
+          <w:color w:val="000000"/>
+        </w:rPr>
+        <w:t>Behaviour</w:t>
+      </w:r>
+      <w:proofErr w:type="spellEnd"/>
+      <w:r>
+        <w:rPr>
+          <w:i/>
+          <w:iCs/>
+          <w:color w:val="000000"/>
+        </w:rPr>
+        <w:t xml:space="preserve"> &amp; Information Technology</w:t>
       </w:r>
       <w:r>
         <w:rPr>
@@ -45812,7 +46339,25 @@
           <w:iCs/>
           <w:color w:val="000000"/>
         </w:rPr>
-        <w:t>, Korean Open Access Guide in Edutech/Learning Sciences Research</w:t>
+        <w:t xml:space="preserve">, Korean Open Access Guide in </w:t>
+      </w:r>
+      <w:proofErr w:type="spellStart"/>
+      <w:r>
+        <w:rPr>
+          <w:i/>
+          <w:iCs/>
+          <w:color w:val="000000"/>
+        </w:rPr>
+        <w:t>Edutech</w:t>
+      </w:r>
+      <w:proofErr w:type="spellEnd"/>
+      <w:r>
+        <w:rPr>
+          <w:i/>
+          <w:iCs/>
+          <w:color w:val="000000"/>
+        </w:rPr>
+        <w:t>/Learning Sciences Research</w:t>
       </w:r>
     </w:p>
     <w:p>
@@ -46123,15 +46668,27 @@
         </w:rPr>
         <w:br/>
       </w:r>
-      <w:r>
-        <w:rPr>
-          <w:rFonts w:hint="eastAsia"/>
-          <w:i/>
-          <w:iCs/>
-          <w:color w:val="000000"/>
-          <w:lang w:eastAsia="ko-KR"/>
-        </w:rPr>
-        <w:t>Behaviour and Information Technology</w:t>
+      <w:proofErr w:type="spellStart"/>
+      <w:r>
+        <w:rPr>
+          <w:rFonts w:hint="eastAsia"/>
+          <w:i/>
+          <w:iCs/>
+          <w:color w:val="000000"/>
+          <w:lang w:eastAsia="ko-KR"/>
+        </w:rPr>
+        <w:t>Behaviour</w:t>
+      </w:r>
+      <w:proofErr w:type="spellEnd"/>
+      <w:r>
+        <w:rPr>
+          <w:rFonts w:hint="eastAsia"/>
+          <w:i/>
+          <w:iCs/>
+          <w:color w:val="000000"/>
+          <w:lang w:eastAsia="ko-KR"/>
+        </w:rPr>
+        <w:t xml:space="preserve"> and Information Technology</w:t>
       </w:r>
     </w:p>
     <w:p>
@@ -46467,6 +47024,7 @@
           <w:color w:val="000000"/>
         </w:rPr>
       </w:pPr>
+      <w:proofErr w:type="spellStart"/>
       <w:r>
         <w:rPr>
           <w:i/>
@@ -46474,6 +47032,7 @@
         </w:rPr>
         <w:t>TechTrends</w:t>
       </w:r>
+      <w:proofErr w:type="spellEnd"/>
     </w:p>
     <w:p>
       <w:pPr>
@@ -46649,12 +47208,21 @@
         </w:rPr>
         <w:br/>
       </w:r>
-      <w:r>
-        <w:rPr>
-          <w:i/>
-          <w:color w:val="000000"/>
-        </w:rPr>
-        <w:t>International Journal of Human-Computer Interaction</w:t>
+      <w:proofErr w:type="spellStart"/>
+      <w:r>
+        <w:rPr>
+          <w:i/>
+          <w:color w:val="000000"/>
+        </w:rPr>
+        <w:t>International</w:t>
+      </w:r>
+      <w:proofErr w:type="spellEnd"/>
+      <w:r>
+        <w:rPr>
+          <w:i/>
+          <w:color w:val="000000"/>
+        </w:rPr>
+        <w:t xml:space="preserve"> Journal of Human-Computer Interaction</w:t>
       </w:r>
       <w:r>
         <w:rPr>
@@ -47061,6 +47629,7 @@
       <w:r>
         <w:t xml:space="preserve">Outstanding </w:t>
       </w:r>
+      <w:proofErr w:type="spellStart"/>
       <w:r>
         <w:rPr>
           <w:rFonts w:hint="eastAsia"/>
@@ -47068,6 +47637,7 @@
         </w:rPr>
         <w:t>iLEAD</w:t>
       </w:r>
+      <w:proofErr w:type="spellEnd"/>
       <w:r>
         <w:t xml:space="preserve"> Paper Award (202</w:t>
       </w:r>
@@ -47079,7 +47649,15 @@
         <w:t>4</w:t>
       </w:r>
       <w:r>
-        <w:t>). Immersive Learning Research Network Conference (iLRN) 202</w:t>
+        <w:t>). Immersive Learning Research Network Conference (</w:t>
+      </w:r>
+      <w:proofErr w:type="spellStart"/>
+      <w:r>
+        <w:t>iLRN</w:t>
+      </w:r>
+      <w:proofErr w:type="spellEnd"/>
+      <w:r>
+        <w:t>) 202</w:t>
       </w:r>
       <w:r>
         <w:rPr>
@@ -47105,7 +47683,15 @@
       </w:pPr>
       <w:r>
         <w:lastRenderedPageBreak/>
-        <w:t>Outstanding Practitioner Paper Award (2023). Immersive Learning Research Network Conference (iLRN) 2023</w:t>
+        <w:t>Outstanding Practitioner Paper Award (2023). Immersive Learning Research Network Conference (</w:t>
+      </w:r>
+      <w:proofErr w:type="spellStart"/>
+      <w:r>
+        <w:t>iLRN</w:t>
+      </w:r>
+      <w:proofErr w:type="spellEnd"/>
+      <w:r>
+        <w:t>) 2023</w:t>
       </w:r>
     </w:p>
     <w:p>
@@ -47348,8 +47934,8 @@
       </w:pPr>
     </w:p>
     <w:sectPr>
-      <w:headerReference w:type="default" r:id="rId98"/>
-      <w:footerReference w:type="default" r:id="rId99"/>
+      <w:headerReference w:type="default" r:id="rId99"/>
+      <w:footerReference w:type="default" r:id="rId100"/>
       <w:pgSz w:w="12240" w:h="15840"/>
       <w:pgMar w:top="1701" w:right="1440" w:bottom="1440" w:left="1440" w:header="0" w:footer="720" w:gutter="0"/>
       <w:pgNumType w:start="1"/>
@@ -48870,7 +49456,6 @@
   <w:style w:type="character" w:default="1" w:styleId="DefaultParagraphFont">
     <w:name w:val="Default Paragraph Font"/>
     <w:uiPriority w:val="1"/>
-    <w:semiHidden/>
     <w:unhideWhenUsed/>
   </w:style>
   <w:style w:type="table" w:default="1" w:styleId="TableNormal">
@@ -49384,6 +49969,14 @@
 </file>
 
 <file path=customXml/item2.xml><?xml version="1.0" encoding="utf-8"?>
+<p:properties xmlns:p="http://schemas.microsoft.com/office/2006/metadata/properties" xmlns:xsi="http://www.w3.org/2001/XMLSchema-instance" xmlns:pc="http://schemas.microsoft.com/office/infopath/2007/PartnerControls">
+  <documentManagement>
+    <_activity xmlns="6a4161d7-0e07-4bb5-8cdd-a87a7602a445" xsi:nil="true"/>
+  </documentManagement>
+</p:properties>
+</file>
+
+<file path=customXml/item3.xml><?xml version="1.0" encoding="utf-8"?>
 <ct:contentTypeSchema xmlns:ct="http://schemas.microsoft.com/office/2006/metadata/contentType" xmlns:ma="http://schemas.microsoft.com/office/2006/metadata/properties/metaAttributes" ct:_="" ma:_="" ma:contentTypeName="Document" ma:contentTypeID="0x010100FA54A6C77D34E44FB33E0184D6F9C744" ma:contentTypeVersion="18" ma:contentTypeDescription="Create a new document." ma:contentTypeScope="" ma:versionID="9c28832654d292338743ef1185d20088">
   <xsd:schema xmlns:xsd="http://www.w3.org/2001/XMLSchema" xmlns:xs="http://www.w3.org/2001/XMLSchema" xmlns:p="http://schemas.microsoft.com/office/2006/metadata/properties" xmlns:ns3="6a4161d7-0e07-4bb5-8cdd-a87a7602a445" xmlns:ns4="30453fea-43c5-4a0b-a417-834186a09351" targetNamespace="http://schemas.microsoft.com/office/2006/metadata/properties" ma:root="true" ma:fieldsID="aadbfd92c1be4506f2c2f9fc093c4d0b" ns3:_="" ns4:_="">
     <xsd:import namespace="6a4161d7-0e07-4bb5-8cdd-a87a7602a445"/>
@@ -49636,16 +50229,8 @@
 </ct:contentTypeSchema>
 </file>
 
-<file path=customXml/item3.xml><?xml version="1.0" encoding="utf-8"?>
+<file path=customXml/item4.xml><?xml version="1.0" encoding="utf-8"?>
 <b:Sources xmlns:b="http://schemas.openxmlformats.org/officeDocument/2006/bibliography" xmlns="http://schemas.openxmlformats.org/officeDocument/2006/bibliography" SelectedStyle="\APASixthEditionOfficeOnline.xsl" StyleName="APA" Version="6"/>
-</file>
-
-<file path=customXml/item4.xml><?xml version="1.0" encoding="utf-8"?>
-<p:properties xmlns:p="http://schemas.microsoft.com/office/2006/metadata/properties" xmlns:xsi="http://www.w3.org/2001/XMLSchema-instance" xmlns:pc="http://schemas.microsoft.com/office/infopath/2007/PartnerControls">
-  <documentManagement>
-    <_activity xmlns="6a4161d7-0e07-4bb5-8cdd-a87a7602a445" xsi:nil="true"/>
-  </documentManagement>
-</p:properties>
 </file>
 
 <file path=customXml/itemProps1.xml><?xml version="1.0" encoding="utf-8"?>
@@ -49657,6 +50242,16 @@
 </file>
 
 <file path=customXml/itemProps2.xml><?xml version="1.0" encoding="utf-8"?>
+<ds:datastoreItem xmlns:ds="http://schemas.openxmlformats.org/officeDocument/2006/customXml" ds:itemID="{7C24488D-A36D-4C56-91ED-753F5C27550A}">
+  <ds:schemaRefs>
+    <ds:schemaRef ds:uri="http://schemas.microsoft.com/office/2006/metadata/properties"/>
+    <ds:schemaRef ds:uri="http://schemas.microsoft.com/office/infopath/2007/PartnerControls"/>
+    <ds:schemaRef ds:uri="6a4161d7-0e07-4bb5-8cdd-a87a7602a445"/>
+  </ds:schemaRefs>
+</ds:datastoreItem>
+</file>
+
+<file path=customXml/itemProps3.xml><?xml version="1.0" encoding="utf-8"?>
 <ds:datastoreItem xmlns:ds="http://schemas.openxmlformats.org/officeDocument/2006/customXml" ds:itemID="{44F19B31-977D-45A4-A748-143054BB9DA7}">
   <ds:schemaRefs>
     <ds:schemaRef ds:uri="http://schemas.microsoft.com/office/2006/metadata/contentType"/>
@@ -49675,20 +50270,10 @@
 </ds:datastoreItem>
 </file>
 
-<file path=customXml/itemProps3.xml><?xml version="1.0" encoding="utf-8"?>
+<file path=customXml/itemProps4.xml><?xml version="1.0" encoding="utf-8"?>
 <ds:datastoreItem xmlns:ds="http://schemas.openxmlformats.org/officeDocument/2006/customXml" ds:itemID="{E286DD98-9466-43F6-BF97-336366EE54DF}">
   <ds:schemaRefs>
     <ds:schemaRef ds:uri="http://schemas.openxmlformats.org/officeDocument/2006/bibliography"/>
   </ds:schemaRefs>
 </ds:datastoreItem>
-</file>
-
-<file path=customXml/itemProps4.xml><?xml version="1.0" encoding="utf-8"?>
-<ds:datastoreItem xmlns:ds="http://schemas.openxmlformats.org/officeDocument/2006/customXml" ds:itemID="{7C24488D-A36D-4C56-91ED-753F5C27550A}">
-  <ds:schemaRefs>
-    <ds:schemaRef ds:uri="http://schemas.microsoft.com/office/2006/metadata/properties"/>
-    <ds:schemaRef ds:uri="http://schemas.microsoft.com/office/infopath/2007/PartnerControls"/>
-    <ds:schemaRef ds:uri="6a4161d7-0e07-4bb5-8cdd-a87a7602a445"/>
-  </ds:schemaRefs>
-</ds:datastoreItem>
 </file>
</xml_diff>

<commit_message>
Update CV docx, site-data, research analytics, and abstracts (autopush 2026-08-09 17:38)
</commit_message>
<xml_diff>
--- a/CV_202605_MOON.docx
+++ b/CV_202605_MOON.docx
@@ -3041,37 +3041,7 @@
           <w:u w:val="single"/>
           <w:lang w:eastAsia="ko-KR"/>
         </w:rPr>
-        <w:t>$</w:t>
-      </w:r>
-      <w:r>
-        <w:rPr>
-          <w:rFonts w:hint="eastAsia"/>
-          <w:b/>
-          <w:bCs/>
-          <w:u w:val="single"/>
-          <w:lang w:eastAsia="ko-KR"/>
-        </w:rPr>
-        <w:t>586</w:t>
-      </w:r>
-      <w:r>
-        <w:rPr>
-          <w:rFonts w:hint="eastAsia"/>
-          <w:b/>
-          <w:bCs/>
-          <w:u w:val="single"/>
-          <w:lang w:eastAsia="ko-KR"/>
-        </w:rPr>
-        <w:t>,</w:t>
-      </w:r>
-      <w:r>
-        <w:rPr>
-          <w:rFonts w:hint="eastAsia"/>
-          <w:b/>
-          <w:bCs/>
-          <w:u w:val="single"/>
-          <w:lang w:eastAsia="ko-KR"/>
-        </w:rPr>
-        <w:t>149</w:t>
+        <w:t>$584,380</w:t>
       </w:r>
       <w:r>
         <w:rPr>
@@ -3245,20 +3215,7 @@
           <w:rFonts w:hint="eastAsia"/>
           <w:lang w:eastAsia="ko-KR"/>
         </w:rPr>
-        <w:t xml:space="preserve"> award $</w:t>
-      </w:r>
-      <w:r>
-        <w:rPr>
-          <w:lang w:eastAsia="ko-KR"/>
-        </w:rPr>
-        <w:t>478,690</w:t>
-      </w:r>
-      <w:r>
-        <w:rPr>
-          <w:rFonts w:hint="eastAsia"/>
-          <w:lang w:eastAsia="ko-KR"/>
-        </w:rPr>
-        <w:t xml:space="preserve">, </w:t>
+        <w:t xml:space="preserve"> award $476,421, </w:t>
       </w:r>
       <w:r>
         <w:rPr>
@@ -4606,103 +4563,7 @@
         </w:rPr>
       </w:pPr>
       <w:r>
-        <w:rPr>
-          <w:rFonts w:hint="eastAsia"/>
-          <w:b/>
-          <w:bCs/>
-          <w:u w:val="single"/>
-          <w:lang w:eastAsia="ko-KR"/>
-        </w:rPr>
-        <w:t>Submitted/</w:t>
-      </w:r>
-      <w:r>
-        <w:rPr>
-          <w:rFonts w:hint="eastAsia"/>
-          <w:b/>
-          <w:bCs/>
-          <w:u w:val="single"/>
-          <w:lang w:eastAsia="ko-KR"/>
-        </w:rPr>
-        <w:t>Pending</w:t>
-      </w:r>
-      <w:r>
-        <w:rPr>
-          <w:rFonts w:hint="eastAsia"/>
-          <w:b/>
-          <w:bCs/>
-          <w:u w:val="single"/>
-          <w:lang w:eastAsia="ko-KR"/>
-        </w:rPr>
-        <w:t xml:space="preserve"> </w:t>
-      </w:r>
-      <w:r>
-        <w:rPr>
-          <w:rFonts w:hint="eastAsia"/>
-          <w:b/>
-          <w:bCs/>
-          <w:u w:val="single"/>
-          <w:lang w:eastAsia="ko-KR"/>
-        </w:rPr>
-        <w:t>(</w:t>
-      </w:r>
-      <w:r>
-        <w:rPr>
-          <w:b/>
-          <w:bCs/>
-          <w:u w:val="single"/>
-          <w:lang w:eastAsia="ko-KR"/>
-        </w:rPr>
-        <w:t>$</w:t>
-      </w:r>
-      <w:r>
-        <w:rPr>
-          <w:rFonts w:hint="eastAsia"/>
-          <w:b/>
-          <w:bCs/>
-          <w:u w:val="single"/>
-          <w:lang w:eastAsia="ko-KR"/>
-        </w:rPr>
-        <w:t>35</w:t>
-      </w:r>
-      <w:r>
-        <w:rPr>
-          <w:rFonts w:hint="eastAsia"/>
-          <w:b/>
-          <w:bCs/>
-          <w:u w:val="single"/>
-          <w:lang w:eastAsia="ko-KR"/>
-        </w:rPr>
-        <w:t>,</w:t>
-      </w:r>
-      <w:r>
-        <w:rPr>
-          <w:rFonts w:hint="eastAsia"/>
-          <w:b/>
-          <w:bCs/>
-          <w:u w:val="single"/>
-          <w:lang w:eastAsia="ko-KR"/>
-        </w:rPr>
-        <w:t>00</w:t>
-      </w:r>
-      <w:r>
-        <w:rPr>
-          <w:rFonts w:hint="eastAsia"/>
-          <w:b/>
-          <w:bCs/>
-          <w:u w:val="single"/>
-          <w:lang w:eastAsia="ko-KR"/>
-        </w:rPr>
-        <w:t>0</w:t>
-      </w:r>
-      <w:r>
-        <w:rPr>
-          <w:rFonts w:hint="eastAsia"/>
-          <w:b/>
-          <w:bCs/>
-          <w:u w:val="single"/>
-          <w:lang w:eastAsia="ko-KR"/>
-        </w:rPr>
-        <w:t>)</w:t>
+        <w:t>Submitted/Pending ($434,946)</w:t>
       </w:r>
     </w:p>
     <w:p>
@@ -4962,6 +4823,15 @@
         </w:rPr>
         <w:t xml:space="preserve">. </w:t>
       </w:r>
+      <w:r>
+        <w:rPr>
+          <w:rFonts w:hint="eastAsia"/>
+          <w:b/>
+          <w:bCs/>
+          <w:lang w:eastAsia="ko-KR"/>
+        </w:rPr>
+        <w:t>PENDING</w:t>
+      </w:r>
     </w:p>
     <w:p>
       <w:pPr>
@@ -4974,22 +4844,35 @@
         </w:pBdr>
         <w:ind w:left="720" w:hanging="720"/>
         <w:rPr>
-          <w:b/>
-          <w:bCs/>
-          <w:u w:val="single"/>
-          <w:lang w:eastAsia="ko-KR"/>
-        </w:rPr>
-      </w:pPr>
-      <w:r>
-        <w:rPr>
-          <w:rFonts w:hint="eastAsia"/>
-          <w:b/>
-          <w:bCs/>
-          <w:u w:val="single"/>
-          <w:lang w:eastAsia="ko-KR"/>
-        </w:rPr>
-        <w:lastRenderedPageBreak/>
-        <w:t>Unfunded</w:t>
+          <w:lang w:eastAsia="ko-KR"/>
+        </w:rPr>
+      </w:pPr>
+      <w:r>
+        <w:t xml:space="preserve">Sumengen, A. (Lead PI), Chen, K. (PI), </w:t>
+      </w:r>
+      <w:r>
+        <w:rPr>
+          <w:b/>
+        </w:rPr>
+        <w:t>Moon, J. (PI)</w:t>
+      </w:r>
+      <w:r>
+        <w:t xml:space="preserve">, &amp; McCoy, T. (PI) </w:t>
+      </w:r>
+      <w:r>
+        <w:t xml:space="preserve">(April 2027 - March 2029). </w:t>
+      </w:r>
+      <w:r>
+        <w:t>A Biofeedback-Based Virtual Reality Implementation to Teach Metered Dose Inhaler Technique Education for Pediatric Asthma Patients: A Development and Feasibility Study</w:t>
+      </w:r>
+      <w:r>
+        <w:t xml:space="preserve">. National Institutes of Health (NIH), total requested $399,946, submitted July 10, 2026, </w:t>
+      </w:r>
+      <w:r>
+        <w:rPr>
+          <w:b/>
+        </w:rPr>
+        <w:t>PENDING</w:t>
       </w:r>
     </w:p>
     <w:p>
@@ -5003,163 +4886,9 @@
         </w:pBdr>
         <w:ind w:left="720" w:hanging="720"/>
         <w:rPr>
-          <w:b/>
-          <w:bCs/>
-        </w:rPr>
-      </w:pPr>
-      <w:r>
-        <w:rPr>
-          <w:rFonts w:hint="eastAsia"/>
-          <w:b/>
-          <w:bCs/>
-          <w:lang w:eastAsia="ko-KR"/>
-        </w:rPr>
-        <w:t xml:space="preserve">Moon, J. (Lead PI) </w:t>
-      </w:r>
-      <w:r>
-        <w:rPr>
-          <w:rFonts w:hint="eastAsia"/>
-          <w:lang w:eastAsia="ko-KR"/>
-        </w:rPr>
-        <w:t>(</w:t>
-      </w:r>
-      <w:r>
-        <w:rPr>
-          <w:rFonts w:hint="eastAsia"/>
-          <w:lang w:eastAsia="ko-KR"/>
-        </w:rPr>
-        <w:t>August</w:t>
-      </w:r>
-      <w:r>
-        <w:rPr>
-          <w:rFonts w:hint="eastAsia"/>
-          <w:lang w:eastAsia="ko-KR"/>
-        </w:rPr>
-        <w:t xml:space="preserve"> 202</w:t>
-      </w:r>
-      <w:r>
-        <w:rPr>
-          <w:rFonts w:hint="eastAsia"/>
-          <w:lang w:eastAsia="ko-KR"/>
-        </w:rPr>
-        <w:t>6</w:t>
-      </w:r>
-      <w:r>
-        <w:rPr>
-          <w:rFonts w:hint="eastAsia"/>
-          <w:lang w:eastAsia="ko-KR"/>
-        </w:rPr>
-        <w:t xml:space="preserve"> </w:t>
-      </w:r>
-      <w:r>
-        <w:rPr>
-          <w:lang w:eastAsia="ko-KR"/>
-        </w:rPr>
-        <w:t>–</w:t>
-      </w:r>
-      <w:r>
-        <w:rPr>
-          <w:rFonts w:hint="eastAsia"/>
-          <w:lang w:eastAsia="ko-KR"/>
-        </w:rPr>
-        <w:t xml:space="preserve"> </w:t>
-      </w:r>
-      <w:r>
-        <w:rPr>
-          <w:rFonts w:hint="eastAsia"/>
-          <w:lang w:eastAsia="ko-KR"/>
-        </w:rPr>
-        <w:t>August</w:t>
-      </w:r>
-      <w:r>
-        <w:rPr>
-          <w:rFonts w:hint="eastAsia"/>
-          <w:lang w:eastAsia="ko-KR"/>
-        </w:rPr>
-        <w:t xml:space="preserve"> 202</w:t>
-      </w:r>
-      <w:r>
-        <w:rPr>
-          <w:rFonts w:hint="eastAsia"/>
-          <w:lang w:eastAsia="ko-KR"/>
-        </w:rPr>
-        <w:t>7</w:t>
-      </w:r>
-      <w:r>
-        <w:rPr>
-          <w:rFonts w:hint="eastAsia"/>
-          <w:lang w:eastAsia="ko-KR"/>
-        </w:rPr>
-        <w:t xml:space="preserve">). </w:t>
-      </w:r>
-      <w:r>
-        <w:rPr>
-          <w:lang w:eastAsia="ko-KR"/>
-        </w:rPr>
-        <w:t>Shift the Lens: Uncovering Students' Assets in Written Math Work via Multimodal AI</w:t>
-      </w:r>
-      <w:r>
-        <w:rPr>
-          <w:rFonts w:hint="eastAsia"/>
-          <w:lang w:eastAsia="ko-KR"/>
-        </w:rPr>
-        <w:t xml:space="preserve">, </w:t>
-      </w:r>
-      <w:r>
-        <w:rPr>
-          <w:lang w:eastAsia="ko-KR"/>
-        </w:rPr>
-        <w:t>Total</w:t>
-      </w:r>
-      <w:r>
-        <w:rPr>
-          <w:rFonts w:hint="eastAsia"/>
-          <w:lang w:eastAsia="ko-KR"/>
-        </w:rPr>
-        <w:t xml:space="preserve"> award $</w:t>
-      </w:r>
-      <w:r>
-        <w:rPr>
-          <w:rFonts w:hint="eastAsia"/>
-          <w:lang w:eastAsia="ko-KR"/>
-        </w:rPr>
-        <w:t>5</w:t>
-      </w:r>
-      <w:r>
-        <w:rPr>
-          <w:lang w:eastAsia="ko-KR"/>
-        </w:rPr>
-        <w:t>0,</w:t>
-      </w:r>
-      <w:r>
-        <w:rPr>
-          <w:rFonts w:hint="eastAsia"/>
-          <w:lang w:eastAsia="ko-KR"/>
-        </w:rPr>
-        <w:t>000</w:t>
-      </w:r>
-      <w:r>
-        <w:rPr>
-          <w:rFonts w:hint="eastAsia"/>
-          <w:lang w:eastAsia="ko-KR"/>
-        </w:rPr>
-        <w:t xml:space="preserve">, </w:t>
-      </w:r>
-      <w:r>
-        <w:rPr>
-          <w:rFonts w:hint="eastAsia"/>
-          <w:lang w:eastAsia="ko-KR"/>
-        </w:rPr>
-        <w:t xml:space="preserve">Advanced Innovative Math Solutions Collaboratory, </w:t>
-      </w:r>
-      <w:r>
-        <w:rPr>
-          <w:b/>
-          <w:bCs/>
-          <w:u w:val="single"/>
-        </w:rPr>
-        <w:t>NOT FUNDED</w:t>
-      </w:r>
+          <w:lang w:eastAsia="ko-KR"/>
+        </w:rPr>
+      </w:pPr>
     </w:p>
     <w:p>
       <w:pPr>
@@ -5174,160 +4903,19 @@
         <w:rPr>
           <w:b/>
           <w:bCs/>
-        </w:rPr>
-      </w:pPr>
-      <w:r>
-        <w:rPr>
-          <w:rFonts w:hint="eastAsia"/>
-          <w:b/>
-          <w:bCs/>
-          <w:lang w:eastAsia="ko-KR"/>
-        </w:rPr>
-        <w:t xml:space="preserve">Moon, J. (Lead PI) </w:t>
-      </w:r>
-      <w:r>
-        <w:rPr>
-          <w:rFonts w:hint="eastAsia"/>
-          <w:lang w:eastAsia="ko-KR"/>
-        </w:rPr>
-        <w:t>(</w:t>
-      </w:r>
-      <w:r>
-        <w:rPr>
-          <w:rFonts w:hint="eastAsia"/>
-          <w:lang w:eastAsia="ko-KR"/>
-        </w:rPr>
-        <w:t>June</w:t>
-      </w:r>
-      <w:r>
-        <w:rPr>
-          <w:rFonts w:hint="eastAsia"/>
-          <w:lang w:eastAsia="ko-KR"/>
-        </w:rPr>
-        <w:t xml:space="preserve"> 202</w:t>
-      </w:r>
-      <w:r>
-        <w:rPr>
-          <w:rFonts w:hint="eastAsia"/>
-          <w:lang w:eastAsia="ko-KR"/>
-        </w:rPr>
-        <w:t>6</w:t>
-      </w:r>
-      <w:r>
-        <w:rPr>
-          <w:rFonts w:hint="eastAsia"/>
-          <w:lang w:eastAsia="ko-KR"/>
-        </w:rPr>
-        <w:t xml:space="preserve"> </w:t>
-      </w:r>
-      <w:r>
-        <w:rPr>
-          <w:lang w:eastAsia="ko-KR"/>
-        </w:rPr>
-        <w:t>–</w:t>
-      </w:r>
-      <w:r>
-        <w:rPr>
-          <w:rFonts w:hint="eastAsia"/>
-          <w:lang w:eastAsia="ko-KR"/>
-        </w:rPr>
-        <w:t xml:space="preserve"> </w:t>
-      </w:r>
-      <w:r>
-        <w:rPr>
-          <w:rFonts w:hint="eastAsia"/>
-          <w:lang w:eastAsia="ko-KR"/>
-        </w:rPr>
-        <w:t>May</w:t>
-      </w:r>
-      <w:r>
-        <w:rPr>
-          <w:rFonts w:hint="eastAsia"/>
-          <w:lang w:eastAsia="ko-KR"/>
-        </w:rPr>
-        <w:t xml:space="preserve"> 202</w:t>
-      </w:r>
-      <w:r>
-        <w:rPr>
-          <w:rFonts w:hint="eastAsia"/>
-          <w:lang w:eastAsia="ko-KR"/>
-        </w:rPr>
-        <w:t>7</w:t>
-      </w:r>
-      <w:r>
-        <w:rPr>
-          <w:rFonts w:hint="eastAsia"/>
-          <w:lang w:eastAsia="ko-KR"/>
-        </w:rPr>
-        <w:t xml:space="preserve">). </w:t>
-      </w:r>
-      <w:r>
-        <w:rPr>
-          <w:lang w:eastAsia="ko-KR"/>
-        </w:rPr>
-        <w:t>Shift the Lens: Uncovering Students' Assets in Written Math Work via Multimodal AI</w:t>
-      </w:r>
-      <w:r>
-        <w:rPr>
-          <w:rFonts w:hint="eastAsia"/>
-          <w:lang w:eastAsia="ko-KR"/>
-        </w:rPr>
-        <w:t xml:space="preserve">, </w:t>
-      </w:r>
-      <w:r>
-        <w:rPr>
-          <w:lang w:eastAsia="ko-KR"/>
-        </w:rPr>
-        <w:t>Total</w:t>
-      </w:r>
-      <w:r>
-        <w:rPr>
-          <w:rFonts w:hint="eastAsia"/>
-          <w:lang w:eastAsia="ko-KR"/>
-        </w:rPr>
-        <w:t xml:space="preserve"> award $</w:t>
-      </w:r>
-      <w:r>
-        <w:rPr>
-          <w:rFonts w:hint="eastAsia"/>
-          <w:lang w:eastAsia="ko-KR"/>
-        </w:rPr>
-        <w:t>5</w:t>
-      </w:r>
-      <w:r>
-        <w:rPr>
-          <w:lang w:eastAsia="ko-KR"/>
-        </w:rPr>
-        <w:t>0,</w:t>
-      </w:r>
-      <w:r>
-        <w:rPr>
-          <w:rFonts w:hint="eastAsia"/>
-          <w:lang w:eastAsia="ko-KR"/>
-        </w:rPr>
-        <w:t>000</w:t>
-      </w:r>
-      <w:r>
-        <w:rPr>
-          <w:rFonts w:hint="eastAsia"/>
-          <w:lang w:eastAsia="ko-KR"/>
-        </w:rPr>
-        <w:t xml:space="preserve">, </w:t>
-      </w:r>
-      <w:r>
-        <w:rPr>
-          <w:rFonts w:hint="eastAsia"/>
-          <w:lang w:eastAsia="ko-KR"/>
-        </w:rPr>
-        <w:t xml:space="preserve">Advanced Innovative Math Solutions Collaboratory, </w:t>
-      </w:r>
-      <w:r>
-        <w:rPr>
-          <w:b/>
-          <w:bCs/>
           <w:u w:val="single"/>
-        </w:rPr>
-        <w:t>NOT FUNDED</w:t>
+          <w:lang w:eastAsia="ko-KR"/>
+        </w:rPr>
+      </w:pPr>
+      <w:r>
+        <w:rPr>
+          <w:rFonts w:hint="eastAsia"/>
+          <w:b/>
+          <w:bCs/>
+          <w:u w:val="single"/>
+          <w:lang w:eastAsia="ko-KR"/>
+        </w:rPr>
+        <w:t>Unfunded</w:t>
       </w:r>
     </w:p>
     <w:p>
@@ -5340,89 +4928,155 @@
           <w:between w:val="nil"/>
         </w:pBdr>
         <w:ind w:left="720" w:hanging="720"/>
-      </w:pPr>
-      <w:r>
-        <w:t>Suh, J.</w:t>
-      </w:r>
-      <w:r>
-        <w:rPr>
-          <w:b/>
-          <w:bCs/>
+        <w:rPr>
+          <w:b/>
+          <w:bCs/>
+        </w:rPr>
+      </w:pPr>
+      <w:r>
+        <w:rPr>
+          <w:rFonts w:hint="eastAsia"/>
+          <w:b/>
+          <w:bCs/>
+          <w:lang w:eastAsia="ko-KR"/>
+        </w:rPr>
+        <w:t xml:space="preserve">Moon, J. (Lead PI) </w:t>
+      </w:r>
+      <w:r>
+        <w:rPr>
+          <w:rFonts w:hint="eastAsia"/>
+          <w:lang w:eastAsia="ko-KR"/>
+        </w:rPr>
+        <w:t>(</w:t>
+      </w:r>
+      <w:r>
+        <w:rPr>
+          <w:rFonts w:hint="eastAsia"/>
+          <w:lang w:eastAsia="ko-KR"/>
+        </w:rPr>
+        <w:t>August</w:t>
+      </w:r>
+      <w:r>
+        <w:rPr>
+          <w:rFonts w:hint="eastAsia"/>
+          <w:lang w:eastAsia="ko-KR"/>
+        </w:rPr>
+        <w:t xml:space="preserve"> 202</w:t>
+      </w:r>
+      <w:r>
+        <w:rPr>
+          <w:rFonts w:hint="eastAsia"/>
+          <w:lang w:eastAsia="ko-KR"/>
+        </w:rPr>
+        <w:t>6</w:t>
+      </w:r>
+      <w:r>
+        <w:rPr>
+          <w:rFonts w:hint="eastAsia"/>
+          <w:lang w:eastAsia="ko-KR"/>
         </w:rPr>
         <w:t xml:space="preserve"> </w:t>
       </w:r>
       <w:r>
-        <w:t>(Lead PI),</w:t>
-      </w:r>
-      <w:r>
-        <w:rPr>
-          <w:b/>
-          <w:bCs/>
-        </w:rPr>
-        <w:t xml:space="preserve"> Moon, J. (PI),</w:t>
-      </w:r>
-      <w:r>
-        <w:t xml:space="preserve"> &amp; Worsley, M. (PI) (July 202</w:t>
-      </w:r>
-      <w:r>
-        <w:rPr>
-          <w:rFonts w:hint="eastAsia"/>
-          <w:lang w:eastAsia="ko-KR"/>
-        </w:rPr>
-        <w:t>6</w:t>
-      </w:r>
-      <w:r>
-        <w:t xml:space="preserve"> – June 202</w:t>
-      </w:r>
-      <w:r>
-        <w:rPr>
-          <w:rFonts w:hint="eastAsia"/>
-          <w:lang w:eastAsia="ko-KR"/>
-        </w:rPr>
-        <w:t>9</w:t>
-      </w:r>
-      <w:r>
+        <w:rPr>
+          <w:lang w:eastAsia="ko-KR"/>
+        </w:rPr>
+        <w:t>–</w:t>
+      </w:r>
+      <w:r>
+        <w:rPr>
+          <w:rFonts w:hint="eastAsia"/>
+          <w:lang w:eastAsia="ko-KR"/>
+        </w:rPr>
+        <w:t xml:space="preserve"> </w:t>
+      </w:r>
+      <w:r>
+        <w:rPr>
+          <w:rFonts w:hint="eastAsia"/>
+          <w:lang w:eastAsia="ko-KR"/>
+        </w:rPr>
+        <w:t>August</w:t>
+      </w:r>
+      <w:r>
+        <w:rPr>
+          <w:rFonts w:hint="eastAsia"/>
+          <w:lang w:eastAsia="ko-KR"/>
+        </w:rPr>
+        <w:t xml:space="preserve"> 202</w:t>
+      </w:r>
+      <w:r>
+        <w:rPr>
+          <w:rFonts w:hint="eastAsia"/>
+          <w:lang w:eastAsia="ko-KR"/>
+        </w:rPr>
+        <w:t>7</w:t>
+      </w:r>
+      <w:r>
+        <w:rPr>
+          <w:rFonts w:hint="eastAsia"/>
+          <w:lang w:eastAsia="ko-KR"/>
+        </w:rPr>
         <w:t xml:space="preserve">). </w:t>
       </w:r>
       <w:r>
         <w:rPr>
-          <w:i/>
-          <w:iCs/>
-        </w:rPr>
-        <w:t>Data-informed Adaptive Teaching Analytics (DATA): Leveraging Artificial Intelligence for Adaptive Teaching and Generative Learning</w:t>
-      </w:r>
-      <w:r>
-        <w:t>. National Science Foundation</w:t>
-      </w:r>
-      <w:r>
-        <w:rPr>
-          <w:rFonts w:hint="eastAsia"/>
-          <w:lang w:eastAsia="ko-KR"/>
-        </w:rPr>
-        <w:t>, RITEL</w:t>
-      </w:r>
-      <w:r>
-        <w:t>, Total award $</w:t>
-      </w:r>
-      <w:r>
-        <w:rPr>
-          <w:rFonts w:hint="eastAsia"/>
-          <w:lang w:eastAsia="ko-KR"/>
-        </w:rPr>
-        <w:t>109</w:t>
-      </w:r>
-      <w:r>
-        <w:t>,</w:t>
-      </w:r>
-      <w:r>
-        <w:rPr>
-          <w:rFonts w:hint="eastAsia"/>
-          <w:lang w:eastAsia="ko-KR"/>
-        </w:rPr>
-        <w:t>846</w:t>
-      </w:r>
-      <w:r>
+          <w:lang w:eastAsia="ko-KR"/>
+        </w:rPr>
+        <w:t>Shift the Lens: Uncovering Students' Assets in Written Math Work via Multimodal AI</w:t>
+      </w:r>
+      <w:r>
+        <w:rPr>
+          <w:rFonts w:hint="eastAsia"/>
+          <w:lang w:eastAsia="ko-KR"/>
+        </w:rPr>
         <w:t xml:space="preserve">, </w:t>
+      </w:r>
+      <w:r>
+        <w:rPr>
+          <w:lang w:eastAsia="ko-KR"/>
+        </w:rPr>
+        <w:t>Total</w:t>
+      </w:r>
+      <w:r>
+        <w:rPr>
+          <w:rFonts w:hint="eastAsia"/>
+          <w:lang w:eastAsia="ko-KR"/>
+        </w:rPr>
+        <w:t xml:space="preserve"> award $</w:t>
+      </w:r>
+      <w:r>
+        <w:rPr>
+          <w:rFonts w:hint="eastAsia"/>
+          <w:lang w:eastAsia="ko-KR"/>
+        </w:rPr>
+        <w:t>5</w:t>
+      </w:r>
+      <w:r>
+        <w:rPr>
+          <w:lang w:eastAsia="ko-KR"/>
+        </w:rPr>
+        <w:t>0,</w:t>
+      </w:r>
+      <w:r>
+        <w:rPr>
+          <w:rFonts w:hint="eastAsia"/>
+          <w:lang w:eastAsia="ko-KR"/>
+        </w:rPr>
+        <w:t>000</w:t>
+      </w:r>
+      <w:r>
+        <w:rPr>
+          <w:rFonts w:hint="eastAsia"/>
+          <w:lang w:eastAsia="ko-KR"/>
+        </w:rPr>
+        <w:t xml:space="preserve">, </w:t>
+      </w:r>
+      <w:r>
+        <w:rPr>
+          <w:rFonts w:hint="eastAsia"/>
+          <w:lang w:eastAsia="ko-KR"/>
+        </w:rPr>
+        <w:t xml:space="preserve">Advanced Innovative Math Solutions Collaboratory, </w:t>
       </w:r>
       <w:r>
         <w:rPr>
@@ -5446,62 +5100,61 @@
         <w:rPr>
           <w:b/>
           <w:bCs/>
-          <w:lang w:eastAsia="ko-KR"/>
-        </w:rPr>
-      </w:pPr>
-      <w:r>
-        <w:rPr>
-          <w:rFonts w:hint="eastAsia"/>
-          <w:lang w:eastAsia="ko-KR"/>
-        </w:rPr>
-        <w:t>Hu, F., (Lead PI)</w:t>
-      </w:r>
-      <w:r>
-        <w:rPr>
-          <w:rFonts w:hint="eastAsia"/>
-          <w:b/>
-          <w:bCs/>
+        </w:rPr>
+      </w:pPr>
+      <w:r>
+        <w:rPr>
+          <w:rFonts w:hint="eastAsia"/>
+          <w:b/>
+          <w:bCs/>
+          <w:lang w:eastAsia="ko-KR"/>
+        </w:rPr>
+        <w:t xml:space="preserve">Moon, J. (Lead PI) </w:t>
+      </w:r>
+      <w:r>
+        <w:rPr>
+          <w:rFonts w:hint="eastAsia"/>
+          <w:lang w:eastAsia="ko-KR"/>
+        </w:rPr>
+        <w:t>(</w:t>
+      </w:r>
+      <w:r>
+        <w:rPr>
+          <w:rFonts w:hint="eastAsia"/>
+          <w:lang w:eastAsia="ko-KR"/>
+        </w:rPr>
+        <w:t>June</w:t>
+      </w:r>
+      <w:r>
+        <w:rPr>
+          <w:rFonts w:hint="eastAsia"/>
+          <w:lang w:eastAsia="ko-KR"/>
+        </w:rPr>
+        <w:t xml:space="preserve"> 202</w:t>
+      </w:r>
+      <w:r>
+        <w:rPr>
+          <w:rFonts w:hint="eastAsia"/>
+          <w:lang w:eastAsia="ko-KR"/>
+        </w:rPr>
+        <w:t>6</w:t>
+      </w:r>
+      <w:r>
+        <w:rPr>
+          <w:rFonts w:hint="eastAsia"/>
           <w:lang w:eastAsia="ko-KR"/>
         </w:rPr>
         <w:t xml:space="preserve"> </w:t>
       </w:r>
       <w:r>
         <w:rPr>
-          <w:rFonts w:hint="eastAsia"/>
-          <w:b/>
-          <w:bCs/>
-          <w:lang w:eastAsia="ko-KR"/>
-        </w:rPr>
-        <w:t>Moon, J., (PI</w:t>
-      </w:r>
-      <w:r>
-        <w:rPr>
-          <w:rFonts w:hint="eastAsia"/>
-          <w:b/>
-          <w:bCs/>
-          <w:lang w:eastAsia="ko-KR"/>
-        </w:rPr>
-        <w:t xml:space="preserve">) &amp; </w:t>
-      </w:r>
-      <w:r>
-        <w:rPr>
-          <w:rFonts w:hint="eastAsia"/>
-          <w:lang w:eastAsia="ko-KR"/>
-        </w:rPr>
-        <w:t>Shen, X.</w:t>
-      </w:r>
-      <w:r>
-        <w:rPr>
-          <w:rFonts w:hint="eastAsia"/>
-          <w:lang w:eastAsia="ko-KR"/>
-        </w:rPr>
-        <w:t xml:space="preserve"> (PI)</w:t>
-      </w:r>
-      <w:r>
-        <w:rPr>
-          <w:rFonts w:hint="eastAsia"/>
-          <w:b/>
-          <w:bCs/>
+          <w:lang w:eastAsia="ko-KR"/>
+        </w:rPr>
+        <w:t>–</w:t>
+      </w:r>
+      <w:r>
+        <w:rPr>
+          <w:rFonts w:hint="eastAsia"/>
           <w:lang w:eastAsia="ko-KR"/>
         </w:rPr>
         <w:t xml:space="preserve"> </w:t>
@@ -5511,7 +5164,7 @@
           <w:rFonts w:hint="eastAsia"/>
           <w:lang w:eastAsia="ko-KR"/>
         </w:rPr>
-        <w:t>(April</w:t>
+        <w:t>May</w:t>
       </w:r>
       <w:r>
         <w:rPr>
@@ -5525,48 +5178,7 @@
           <w:rFonts w:hint="eastAsia"/>
           <w:lang w:eastAsia="ko-KR"/>
         </w:rPr>
-        <w:t>6</w:t>
-      </w:r>
-      <w:r>
-        <w:rPr>
-          <w:rFonts w:hint="eastAsia"/>
-          <w:lang w:eastAsia="ko-KR"/>
-        </w:rPr>
-        <w:t xml:space="preserve"> </w:t>
-      </w:r>
-      <w:r>
-        <w:rPr>
-          <w:lang w:eastAsia="ko-KR"/>
-        </w:rPr>
-        <w:t>–</w:t>
-      </w:r>
-      <w:r>
-        <w:rPr>
-          <w:rFonts w:hint="eastAsia"/>
-          <w:lang w:eastAsia="ko-KR"/>
-        </w:rPr>
-        <w:t xml:space="preserve"> </w:t>
-      </w:r>
-      <w:r>
-        <w:rPr>
-          <w:rFonts w:hint="eastAsia"/>
-          <w:lang w:eastAsia="ko-KR"/>
-        </w:rPr>
-        <w:t>March</w:t>
-      </w:r>
-      <w:r>
-        <w:rPr>
-          <w:rFonts w:hint="eastAsia"/>
-          <w:lang w:eastAsia="ko-KR"/>
-        </w:rPr>
-        <w:t xml:space="preserve"> 20</w:t>
-      </w:r>
-      <w:r>
-        <w:rPr>
-          <w:rFonts w:hint="eastAsia"/>
-          <w:lang w:eastAsia="ko-KR"/>
-        </w:rPr>
-        <w:t>29</w:t>
+        <w:t>7</w:t>
       </w:r>
       <w:r>
         <w:rPr>
@@ -5579,7 +5191,7 @@
         <w:rPr>
           <w:lang w:eastAsia="ko-KR"/>
         </w:rPr>
-        <w:t>SaTS 2.0: EDU: Metaverse or Metaworst: Metaverse Security Education by Using Heutagogical and Challenge-based Pedagogy</w:t>
+        <w:t>Shift the Lens: Uncovering Students' Assets in Written Math Work via Multimodal AI</w:t>
       </w:r>
       <w:r>
         <w:rPr>
@@ -5603,23 +5215,37 @@
       </w:r>
       <w:r>
         <w:rPr>
-          <w:lang w:eastAsia="ko-KR"/>
-        </w:rPr>
-        <w:t>598,139.00</w:t>
-      </w:r>
-      <w:r>
-        <w:rPr>
-          <w:rFonts w:hint="eastAsia"/>
-          <w:lang w:eastAsia="ko-KR"/>
-        </w:rPr>
-        <w:t>,</w:t>
-      </w:r>
-      <w:r>
-        <w:rPr>
-          <w:rFonts w:hint="eastAsia"/>
-          <w:lang w:eastAsia="ko-KR"/>
-        </w:rPr>
-        <w:t xml:space="preserve"> </w:t>
+          <w:rFonts w:hint="eastAsia"/>
+          <w:lang w:eastAsia="ko-KR"/>
+        </w:rPr>
+        <w:t>5</w:t>
+      </w:r>
+      <w:r>
+        <w:rPr>
+          <w:lang w:eastAsia="ko-KR"/>
+        </w:rPr>
+        <w:t>0,</w:t>
+      </w:r>
+      <w:r>
+        <w:rPr>
+          <w:rFonts w:hint="eastAsia"/>
+          <w:lang w:eastAsia="ko-KR"/>
+        </w:rPr>
+        <w:t>000</w:t>
+      </w:r>
+      <w:r>
+        <w:rPr>
+          <w:rFonts w:hint="eastAsia"/>
+          <w:lang w:eastAsia="ko-KR"/>
+        </w:rPr>
+        <w:t xml:space="preserve">, </w:t>
+      </w:r>
+      <w:r>
+        <w:rPr>
+          <w:rFonts w:hint="eastAsia"/>
+          <w:lang w:eastAsia="ko-KR"/>
+        </w:rPr>
+        <w:t xml:space="preserve">Advanced Innovative Math Solutions Collaboratory, </w:t>
       </w:r>
       <w:r>
         <w:rPr>
@@ -5640,34 +5266,29 @@
           <w:between w:val="nil"/>
         </w:pBdr>
         <w:ind w:left="720" w:hanging="720"/>
-        <w:rPr>
-          <w:b/>
-          <w:bCs/>
-          <w:lang w:eastAsia="ko-KR"/>
-        </w:rPr>
-      </w:pPr>
-      <w:r>
-        <w:rPr>
-          <w:rFonts w:hint="eastAsia"/>
-          <w:b/>
-          <w:bCs/>
-          <w:lang w:eastAsia="ko-KR"/>
-        </w:rPr>
-        <w:t xml:space="preserve">Moon, J. (Lead PI) </w:t>
-      </w:r>
-      <w:r>
-        <w:rPr>
-          <w:rFonts w:hint="eastAsia"/>
-          <w:lang w:eastAsia="ko-KR"/>
-        </w:rPr>
-        <w:t>(April</w:t>
-      </w:r>
-      <w:r>
-        <w:rPr>
-          <w:rFonts w:hint="eastAsia"/>
-          <w:lang w:eastAsia="ko-KR"/>
-        </w:rPr>
-        <w:t xml:space="preserve"> 202</w:t>
+      </w:pPr>
+      <w:r>
+        <w:t>Suh, J.</w:t>
+      </w:r>
+      <w:r>
+        <w:rPr>
+          <w:b/>
+          <w:bCs/>
+        </w:rPr>
+        <w:t xml:space="preserve"> </w:t>
+      </w:r>
+      <w:r>
+        <w:t>(Lead PI),</w:t>
+      </w:r>
+      <w:r>
+        <w:rPr>
+          <w:b/>
+          <w:bCs/>
+        </w:rPr>
+        <w:t xml:space="preserve"> Moon, J. (PI),</w:t>
+      </w:r>
+      <w:r>
+        <w:t xml:space="preserve"> &amp; Worsley, M. (PI) (July 202</w:t>
       </w:r>
       <w:r>
         <w:rPr>
@@ -5677,106 +5298,57 @@
         <w:t>6</w:t>
       </w:r>
       <w:r>
-        <w:rPr>
-          <w:rFonts w:hint="eastAsia"/>
-          <w:lang w:eastAsia="ko-KR"/>
-        </w:rPr>
-        <w:t xml:space="preserve"> </w:t>
-      </w:r>
-      <w:r>
-        <w:rPr>
-          <w:lang w:eastAsia="ko-KR"/>
-        </w:rPr>
-        <w:t>–</w:t>
-      </w:r>
-      <w:r>
-        <w:rPr>
-          <w:rFonts w:hint="eastAsia"/>
-          <w:lang w:eastAsia="ko-KR"/>
-        </w:rPr>
-        <w:t xml:space="preserve"> </w:t>
-      </w:r>
-      <w:r>
-        <w:rPr>
-          <w:rFonts w:hint="eastAsia"/>
-          <w:lang w:eastAsia="ko-KR"/>
-        </w:rPr>
-        <w:t>Mart</w:t>
-      </w:r>
-      <w:r>
-        <w:rPr>
-          <w:rFonts w:hint="eastAsia"/>
-          <w:lang w:eastAsia="ko-KR"/>
-        </w:rPr>
-        <w:t xml:space="preserve"> 20</w:t>
-      </w:r>
-      <w:r>
-        <w:rPr>
-          <w:rFonts w:hint="eastAsia"/>
-          <w:lang w:eastAsia="ko-KR"/>
-        </w:rPr>
-        <w:t>31</w:t>
-      </w:r>
-      <w:r>
-        <w:rPr>
-          <w:rFonts w:hint="eastAsia"/>
-          <w:lang w:eastAsia="ko-KR"/>
-        </w:rPr>
+        <w:t xml:space="preserve"> – June 202</w:t>
+      </w:r>
+      <w:r>
+        <w:rPr>
+          <w:rFonts w:hint="eastAsia"/>
+          <w:lang w:eastAsia="ko-KR"/>
+        </w:rPr>
+        <w:t>9</w:t>
+      </w:r>
+      <w:r>
         <w:t xml:space="preserve">). </w:t>
       </w:r>
       <w:r>
         <w:rPr>
-          <w:rFonts w:hint="eastAsia"/>
-          <w:lang w:eastAsia="ko-KR"/>
-        </w:rPr>
-        <w:t xml:space="preserve">CAREER: </w:t>
-      </w:r>
-      <w:r>
-        <w:rPr>
-          <w:lang w:eastAsia="ko-KR"/>
-        </w:rPr>
-        <w:t>SCALE-XR - Co-Intelligent XR Learning Environment for Undergraduate STEM Education</w:t>
-      </w:r>
-      <w:r>
-        <w:rPr>
-          <w:rFonts w:hint="eastAsia"/>
-          <w:lang w:eastAsia="ko-KR"/>
-        </w:rPr>
+          <w:i/>
+          <w:iCs/>
+        </w:rPr>
+        <w:t>Data-informed Adaptive Teaching Analytics (DATA): Leveraging Artificial Intelligence for Adaptive Teaching and Generative Learning</w:t>
+      </w:r>
+      <w:r>
+        <w:t>. National Science Foundation</w:t>
+      </w:r>
+      <w:r>
+        <w:rPr>
+          <w:rFonts w:hint="eastAsia"/>
+          <w:lang w:eastAsia="ko-KR"/>
+        </w:rPr>
+        <w:t>, RITEL</w:t>
+      </w:r>
+      <w:r>
+        <w:t>, Total award $</w:t>
+      </w:r>
+      <w:r>
+        <w:rPr>
+          <w:rFonts w:hint="eastAsia"/>
+          <w:lang w:eastAsia="ko-KR"/>
+        </w:rPr>
+        <w:t>109</w:t>
+      </w:r>
+      <w:r>
+        <w:t>,</w:t>
+      </w:r>
+      <w:r>
+        <w:rPr>
+          <w:rFonts w:hint="eastAsia"/>
+          <w:lang w:eastAsia="ko-KR"/>
+        </w:rPr>
+        <w:t>846</w:t>
+      </w:r>
+      <w:r>
         <w:t xml:space="preserve">, </w:t>
-      </w:r>
-      <w:r>
-        <w:rPr>
-          <w:lang w:eastAsia="ko-KR"/>
-        </w:rPr>
-        <w:t>Total</w:t>
-      </w:r>
-      <w:r>
-        <w:rPr>
-          <w:rFonts w:hint="eastAsia"/>
-          <w:lang w:eastAsia="ko-KR"/>
-        </w:rPr>
-        <w:t xml:space="preserve"> award $</w:t>
-      </w:r>
-      <w:r>
-        <w:rPr>
-          <w:rFonts w:hint="eastAsia"/>
-          <w:lang w:eastAsia="ko-KR"/>
-        </w:rPr>
-        <w:t>602,382</w:t>
-      </w:r>
-      <w:r>
-        <w:rPr>
-          <w:rFonts w:hint="eastAsia"/>
-          <w:lang w:eastAsia="ko-KR"/>
-        </w:rPr>
-        <w:t>,</w:t>
-      </w:r>
-      <w:r>
-        <w:rPr>
-          <w:rFonts w:hint="eastAsia"/>
-          <w:lang w:eastAsia="ko-KR"/>
-        </w:rPr>
-        <w:t xml:space="preserve"> National Science Foundation, </w:t>
       </w:r>
       <w:r>
         <w:rPr>
@@ -5806,25 +5378,66 @@
       <w:r>
         <w:rPr>
           <w:rFonts w:hint="eastAsia"/>
-          <w:b/>
-          <w:bCs/>
-          <w:lang w:eastAsia="ko-KR"/>
-        </w:rPr>
-        <w:t xml:space="preserve">Moon, J. (Lead PI) </w:t>
-      </w:r>
-      <w:r>
-        <w:rPr>
-          <w:rFonts w:hint="eastAsia"/>
-          <w:lang w:eastAsia="ko-KR"/>
-        </w:rPr>
-        <w:t>(</w:t>
-      </w:r>
-      <w:r>
-        <w:rPr>
-          <w:rFonts w:hint="eastAsia"/>
-          <w:lang w:eastAsia="ko-KR"/>
-        </w:rPr>
-        <w:t>January</w:t>
+          <w:lang w:eastAsia="ko-KR"/>
+        </w:rPr>
+        <w:t>Hu, F., (Lead PI)</w:t>
+      </w:r>
+      <w:r>
+        <w:rPr>
+          <w:rFonts w:hint="eastAsia"/>
+          <w:b/>
+          <w:bCs/>
+          <w:lang w:eastAsia="ko-KR"/>
+        </w:rPr>
+        <w:t xml:space="preserve"> </w:t>
+      </w:r>
+      <w:r>
+        <w:rPr>
+          <w:rFonts w:hint="eastAsia"/>
+          <w:b/>
+          <w:bCs/>
+          <w:lang w:eastAsia="ko-KR"/>
+        </w:rPr>
+        <w:t>Moon, J., (PI</w:t>
+      </w:r>
+      <w:r>
+        <w:rPr>
+          <w:rFonts w:hint="eastAsia"/>
+          <w:b/>
+          <w:bCs/>
+          <w:lang w:eastAsia="ko-KR"/>
+        </w:rPr>
+        <w:t xml:space="preserve">) &amp; </w:t>
+      </w:r>
+      <w:r>
+        <w:rPr>
+          <w:rFonts w:hint="eastAsia"/>
+          <w:lang w:eastAsia="ko-KR"/>
+        </w:rPr>
+        <w:t>Shen, X.</w:t>
+      </w:r>
+      <w:r>
+        <w:rPr>
+          <w:rFonts w:hint="eastAsia"/>
+          <w:lang w:eastAsia="ko-KR"/>
+        </w:rPr>
+        <w:t xml:space="preserve"> (PI)</w:t>
+      </w:r>
+      <w:r>
+        <w:rPr>
+          <w:rFonts w:hint="eastAsia"/>
+          <w:b/>
+          <w:bCs/>
+          <w:lang w:eastAsia="ko-KR"/>
+        </w:rPr>
+        <w:t xml:space="preserve"> </w:t>
+      </w:r>
+      <w:r>
+        <w:rPr>
+          <w:rFonts w:hint="eastAsia"/>
+          <w:lang w:eastAsia="ko-KR"/>
+        </w:rPr>
+        <w:t>(April</w:t>
       </w:r>
       <w:r>
         <w:rPr>
@@ -5865,27 +5478,34 @@
           <w:rFonts w:hint="eastAsia"/>
           <w:lang w:eastAsia="ko-KR"/>
         </w:rPr>
-        <w:t>December</w:t>
-      </w:r>
-      <w:r>
-        <w:rPr>
-          <w:rFonts w:hint="eastAsia"/>
-          <w:lang w:eastAsia="ko-KR"/>
-        </w:rPr>
-        <w:t xml:space="preserve"> 202</w:t>
-      </w:r>
-      <w:r>
-        <w:rPr>
-          <w:rFonts w:hint="eastAsia"/>
-          <w:lang w:eastAsia="ko-KR"/>
-        </w:rPr>
-        <w:t xml:space="preserve">9). </w:t>
-      </w:r>
-      <w:r>
-        <w:rPr>
-          <w:lang w:eastAsia="ko-KR"/>
-        </w:rPr>
-        <w:t>CyberSecure Minds: Generative AI-enhanced Microlearning Games to Teach Math and Science through Real-World Cybersecurity Scenarios for Marginalized Youth</w:t>
+        <w:t>March</w:t>
+      </w:r>
+      <w:r>
+        <w:rPr>
+          <w:rFonts w:hint="eastAsia"/>
+          <w:lang w:eastAsia="ko-KR"/>
+        </w:rPr>
+        <w:t xml:space="preserve"> 20</w:t>
+      </w:r>
+      <w:r>
+        <w:rPr>
+          <w:rFonts w:hint="eastAsia"/>
+          <w:lang w:eastAsia="ko-KR"/>
+        </w:rPr>
+        <w:t>29</w:t>
+      </w:r>
+      <w:r>
+        <w:rPr>
+          <w:rFonts w:hint="eastAsia"/>
+          <w:lang w:eastAsia="ko-KR"/>
+        </w:rPr>
+        <w:t xml:space="preserve">). </w:t>
+      </w:r>
+      <w:r>
+        <w:rPr>
+          <w:lang w:eastAsia="ko-KR"/>
+        </w:rPr>
+        <w:t>SaTS 2.0: EDU: Metaverse or Metaworst: Metaverse Security Education by Using Heutagogical and Challenge-based Pedagogy</w:t>
       </w:r>
       <w:r>
         <w:rPr>
@@ -5909,23 +5529,20 @@
       </w:r>
       <w:r>
         <w:rPr>
-          <w:rFonts w:hint="eastAsia"/>
-          <w:lang w:eastAsia="ko-KR"/>
-        </w:rPr>
-        <w:t xml:space="preserve">425,000. William T. Grant Scholars </w:t>
-      </w:r>
-      <w:r>
-        <w:rPr>
-          <w:rFonts w:hint="eastAsia"/>
-          <w:lang w:eastAsia="ko-KR"/>
-        </w:rPr>
-        <w:t>Program,</w:t>
-      </w:r>
-      <w:r>
-        <w:rPr>
-          <w:rFonts w:hint="eastAsia"/>
-          <w:b/>
-          <w:bCs/>
+          <w:lang w:eastAsia="ko-KR"/>
+        </w:rPr>
+        <w:t>598,139.00</w:t>
+      </w:r>
+      <w:r>
+        <w:rPr>
+          <w:rFonts w:hint="eastAsia"/>
+          <w:lang w:eastAsia="ko-KR"/>
+        </w:rPr>
+        <w:t>,</w:t>
+      </w:r>
+      <w:r>
+        <w:rPr>
+          <w:rFonts w:hint="eastAsia"/>
           <w:lang w:eastAsia="ko-KR"/>
         </w:rPr>
         <w:t xml:space="preserve"> </w:t>
@@ -5962,26 +5579,20 @@
           <w:bCs/>
           <w:lang w:eastAsia="ko-KR"/>
         </w:rPr>
-        <w:t>Moon, J</w:t>
-      </w:r>
-      <w:r>
-        <w:rPr>
-          <w:rFonts w:hint="eastAsia"/>
-          <w:lang w:eastAsia="ko-KR"/>
-        </w:rPr>
-        <w:t xml:space="preserve">. </w:t>
-      </w:r>
-      <w:r>
-        <w:t>(</w:t>
-      </w:r>
-      <w:r>
-        <w:rPr>
-          <w:rFonts w:hint="eastAsia"/>
-          <w:lang w:eastAsia="ko-KR"/>
-        </w:rPr>
-        <w:t>September</w:t>
-      </w:r>
-      <w:r>
+        <w:t xml:space="preserve">Moon, J. (Lead PI) </w:t>
+      </w:r>
+      <w:r>
+        <w:rPr>
+          <w:rFonts w:hint="eastAsia"/>
+          <w:lang w:eastAsia="ko-KR"/>
+        </w:rPr>
+        <w:t>(April</w:t>
+      </w:r>
+      <w:r>
+        <w:rPr>
+          <w:rFonts w:hint="eastAsia"/>
+          <w:lang w:eastAsia="ko-KR"/>
+        </w:rPr>
         <w:t xml:space="preserve"> 202</w:t>
       </w:r>
       <w:r>
@@ -5989,7 +5600,14 @@
           <w:rFonts w:hint="eastAsia"/>
           <w:lang w:eastAsia="ko-KR"/>
         </w:rPr>
-        <w:t xml:space="preserve">5 </w:t>
+        <w:t>6</w:t>
+      </w:r>
+      <w:r>
+        <w:rPr>
+          <w:rFonts w:hint="eastAsia"/>
+          <w:lang w:eastAsia="ko-KR"/>
+        </w:rPr>
+        <w:t xml:space="preserve"> </w:t>
       </w:r>
       <w:r>
         <w:rPr>
@@ -6002,19 +5620,48 @@
           <w:rFonts w:hint="eastAsia"/>
           <w:lang w:eastAsia="ko-KR"/>
         </w:rPr>
-        <w:t xml:space="preserve"> August 2025</w:t>
-      </w:r>
-      <w:r>
+        <w:t xml:space="preserve"> </w:t>
+      </w:r>
+      <w:r>
+        <w:rPr>
+          <w:rFonts w:hint="eastAsia"/>
+          <w:lang w:eastAsia="ko-KR"/>
+        </w:rPr>
+        <w:t>Mart</w:t>
+      </w:r>
+      <w:r>
+        <w:rPr>
+          <w:rFonts w:hint="eastAsia"/>
+          <w:lang w:eastAsia="ko-KR"/>
+        </w:rPr>
+        <w:t xml:space="preserve"> 20</w:t>
+      </w:r>
+      <w:r>
+        <w:rPr>
+          <w:rFonts w:hint="eastAsia"/>
+          <w:lang w:eastAsia="ko-KR"/>
+        </w:rPr>
+        <w:t>31</w:t>
+      </w:r>
+      <w:r>
+        <w:rPr>
+          <w:rFonts w:hint="eastAsia"/>
+          <w:lang w:eastAsia="ko-KR"/>
+        </w:rPr>
         <w:t xml:space="preserve">). </w:t>
       </w:r>
       <w:r>
         <w:rPr>
           <w:rFonts w:hint="eastAsia"/>
-          <w:i/>
-          <w:iCs/>
-          <w:lang w:eastAsia="ko-KR"/>
-        </w:rPr>
-        <w:t>ALA-AI Fellowship (Junior)</w:t>
+          <w:lang w:eastAsia="ko-KR"/>
+        </w:rPr>
+        <w:t xml:space="preserve">CAREER: </w:t>
+      </w:r>
+      <w:r>
+        <w:rPr>
+          <w:lang w:eastAsia="ko-KR"/>
+        </w:rPr>
+        <w:t>SCALE-XR - Co-Intelligent XR Learning Environment for Undergraduate STEM Education</w:t>
       </w:r>
       <w:r>
         <w:rPr>
@@ -6027,17 +5674,25 @@
         <w:rPr>
           <w:lang w:eastAsia="ko-KR"/>
         </w:rPr>
-        <w:t>$</w:t>
-      </w:r>
-      <w:r>
-        <w:rPr>
-          <w:rFonts w:hint="eastAsia"/>
-          <w:lang w:eastAsia="ko-KR"/>
-        </w:rPr>
-        <w:t>6</w:t>
-      </w:r>
-      <w:r>
-        <w:rPr>
+        <w:t>Total</w:t>
+      </w:r>
+      <w:r>
+        <w:rPr>
+          <w:rFonts w:hint="eastAsia"/>
+          <w:lang w:eastAsia="ko-KR"/>
+        </w:rPr>
+        <w:t xml:space="preserve"> award $</w:t>
+      </w:r>
+      <w:r>
+        <w:rPr>
+          <w:rFonts w:hint="eastAsia"/>
+          <w:lang w:eastAsia="ko-KR"/>
+        </w:rPr>
+        <w:t>602,382</w:t>
+      </w:r>
+      <w:r>
+        <w:rPr>
+          <w:rFonts w:hint="eastAsia"/>
           <w:lang w:eastAsia="ko-KR"/>
         </w:rPr>
         <w:t>,</w:t>
@@ -6047,7 +5702,15 @@
           <w:rFonts w:hint="eastAsia"/>
           <w:lang w:eastAsia="ko-KR"/>
         </w:rPr>
-        <w:t>000</w:t>
+        <w:t xml:space="preserve"> National Science Foundation, </w:t>
+      </w:r>
+      <w:r>
+        <w:rPr>
+          <w:b/>
+          <w:bCs/>
+          <w:u w:val="single"/>
+        </w:rPr>
+        <w:t>NOT FUNDED</w:t>
       </w:r>
     </w:p>
     <w:p>
@@ -6073,30 +5736,62 @@
           <w:bCs/>
           <w:lang w:eastAsia="ko-KR"/>
         </w:rPr>
-        <w:t xml:space="preserve">Moon, J. (Lead PI) &amp; </w:t>
-      </w:r>
-      <w:r>
-        <w:rPr>
-          <w:rFonts w:hint="eastAsia"/>
-          <w:lang w:eastAsia="ko-KR"/>
-        </w:rPr>
-        <w:t>Avraham, R. (PI)</w:t>
-      </w:r>
-      <w:r>
-        <w:rPr>
-          <w:rFonts w:hint="eastAsia"/>
-          <w:b/>
-          <w:bCs/>
+        <w:t xml:space="preserve">Moon, J. (Lead PI) </w:t>
+      </w:r>
+      <w:r>
+        <w:rPr>
+          <w:rFonts w:hint="eastAsia"/>
+          <w:lang w:eastAsia="ko-KR"/>
+        </w:rPr>
+        <w:t>(</w:t>
+      </w:r>
+      <w:r>
+        <w:rPr>
+          <w:rFonts w:hint="eastAsia"/>
+          <w:lang w:eastAsia="ko-KR"/>
+        </w:rPr>
+        <w:t>January</w:t>
+      </w:r>
+      <w:r>
+        <w:rPr>
+          <w:rFonts w:hint="eastAsia"/>
+          <w:lang w:eastAsia="ko-KR"/>
+        </w:rPr>
+        <w:t xml:space="preserve"> 202</w:t>
+      </w:r>
+      <w:r>
+        <w:rPr>
+          <w:rFonts w:hint="eastAsia"/>
+          <w:lang w:eastAsia="ko-KR"/>
+        </w:rPr>
+        <w:t>6</w:t>
+      </w:r>
+      <w:r>
+        <w:rPr>
+          <w:rFonts w:hint="eastAsia"/>
           <w:lang w:eastAsia="ko-KR"/>
         </w:rPr>
         <w:t xml:space="preserve"> </w:t>
       </w:r>
       <w:r>
         <w:rPr>
-          <w:rFonts w:hint="eastAsia"/>
-          <w:lang w:eastAsia="ko-KR"/>
-        </w:rPr>
-        <w:t>(Jan</w:t>
+          <w:lang w:eastAsia="ko-KR"/>
+        </w:rPr>
+        <w:t>–</w:t>
+      </w:r>
+      <w:r>
+        <w:rPr>
+          <w:rFonts w:hint="eastAsia"/>
+          <w:lang w:eastAsia="ko-KR"/>
+        </w:rPr>
+        <w:t xml:space="preserve"> </w:t>
+      </w:r>
+      <w:r>
+        <w:rPr>
+          <w:rFonts w:hint="eastAsia"/>
+          <w:lang w:eastAsia="ko-KR"/>
+        </w:rPr>
+        <w:t>December</w:t>
       </w:r>
       <w:r>
         <w:rPr>
@@ -6110,61 +5805,13 @@
           <w:rFonts w:hint="eastAsia"/>
           <w:lang w:eastAsia="ko-KR"/>
         </w:rPr>
-        <w:t>6</w:t>
-      </w:r>
-      <w:r>
-        <w:rPr>
-          <w:rFonts w:hint="eastAsia"/>
-          <w:lang w:eastAsia="ko-KR"/>
-        </w:rPr>
-        <w:t xml:space="preserve"> </w:t>
-      </w:r>
-      <w:r>
-        <w:rPr>
-          <w:lang w:eastAsia="ko-KR"/>
-        </w:rPr>
-        <w:t>–</w:t>
-      </w:r>
-      <w:r>
-        <w:rPr>
-          <w:rFonts w:hint="eastAsia"/>
-          <w:lang w:eastAsia="ko-KR"/>
-        </w:rPr>
-        <w:t xml:space="preserve"> </w:t>
-      </w:r>
-      <w:r>
-        <w:rPr>
-          <w:rFonts w:hint="eastAsia"/>
-          <w:lang w:eastAsia="ko-KR"/>
-        </w:rPr>
-        <w:t>December</w:t>
-      </w:r>
-      <w:r>
-        <w:rPr>
-          <w:rFonts w:hint="eastAsia"/>
-          <w:lang w:eastAsia="ko-KR"/>
-        </w:rPr>
-        <w:t xml:space="preserve"> 20</w:t>
-      </w:r>
-      <w:r>
-        <w:rPr>
-          <w:rFonts w:hint="eastAsia"/>
-          <w:lang w:eastAsia="ko-KR"/>
-        </w:rPr>
-        <w:t>27</w:t>
-      </w:r>
-      <w:r>
-        <w:rPr>
-          <w:rFonts w:hint="eastAsia"/>
-          <w:lang w:eastAsia="ko-KR"/>
-        </w:rPr>
-        <w:t xml:space="preserve">). </w:t>
-      </w:r>
-      <w:r>
-        <w:rPr>
-          <w:lang w:eastAsia="ko-KR"/>
-        </w:rPr>
-        <w:t>Collaborative Development and Evaluation of a Gamified AI Chatbot to Enhance Rehabilitation Nurses’ Intentions and Behaviors in Addressing Healthy Sexuality</w:t>
+        <w:t xml:space="preserve">9). </w:t>
+      </w:r>
+      <w:r>
+        <w:rPr>
+          <w:lang w:eastAsia="ko-KR"/>
+        </w:rPr>
+        <w:t>CyberSecure Minds: Generative AI-enhanced Microlearning Games to Teach Math and Science through Real-World Cybersecurity Scenarios for Marginalized Youth</w:t>
       </w:r>
       <w:r>
         <w:rPr>
@@ -6191,18 +5838,20 @@
           <w:rFonts w:hint="eastAsia"/>
           <w:lang w:eastAsia="ko-KR"/>
         </w:rPr>
-        <w:t>30,000</w:t>
-      </w:r>
-      <w:r>
-        <w:rPr>
-          <w:rFonts w:hint="eastAsia"/>
-          <w:lang w:eastAsia="ko-KR"/>
-        </w:rPr>
-        <w:t>,</w:t>
-      </w:r>
-      <w:r>
-        <w:rPr>
-          <w:rFonts w:hint="eastAsia"/>
+        <w:t xml:space="preserve">425,000. William T. Grant Scholars </w:t>
+      </w:r>
+      <w:r>
+        <w:rPr>
+          <w:rFonts w:hint="eastAsia"/>
+          <w:lang w:eastAsia="ko-KR"/>
+        </w:rPr>
+        <w:t>Program,</w:t>
+      </w:r>
+      <w:r>
+        <w:rPr>
+          <w:rFonts w:hint="eastAsia"/>
+          <w:b/>
+          <w:bCs/>
           <w:lang w:eastAsia="ko-KR"/>
         </w:rPr>
         <w:t xml:space="preserve"> </w:t>
@@ -6239,14 +5888,34 @@
           <w:bCs/>
           <w:lang w:eastAsia="ko-KR"/>
         </w:rPr>
-        <w:t xml:space="preserve">Moon, J. (Lead PI) </w:t>
-      </w:r>
-      <w:r>
-        <w:rPr>
-          <w:rFonts w:hint="eastAsia"/>
-          <w:lang w:eastAsia="ko-KR"/>
-        </w:rPr>
-        <w:t xml:space="preserve">(September 2025 </w:t>
+        <w:t>Moon, J</w:t>
+      </w:r>
+      <w:r>
+        <w:rPr>
+          <w:rFonts w:hint="eastAsia"/>
+          <w:lang w:eastAsia="ko-KR"/>
+        </w:rPr>
+        <w:t xml:space="preserve">. </w:t>
+      </w:r>
+      <w:r>
+        <w:t>(</w:t>
+      </w:r>
+      <w:r>
+        <w:rPr>
+          <w:rFonts w:hint="eastAsia"/>
+          <w:lang w:eastAsia="ko-KR"/>
+        </w:rPr>
+        <w:t>September</w:t>
+      </w:r>
+      <w:r>
+        <w:t xml:space="preserve"> 202</w:t>
+      </w:r>
+      <w:r>
+        <w:rPr>
+          <w:rFonts w:hint="eastAsia"/>
+          <w:lang w:eastAsia="ko-KR"/>
+        </w:rPr>
+        <w:t xml:space="preserve">5 </w:t>
       </w:r>
       <w:r>
         <w:rPr>
@@ -6259,92 +5928,52 @@
           <w:rFonts w:hint="eastAsia"/>
           <w:lang w:eastAsia="ko-KR"/>
         </w:rPr>
-        <w:t xml:space="preserve"> August 2028)</w:t>
-      </w:r>
-      <w:r>
-        <w:rPr>
-          <w:rFonts w:hint="eastAsia"/>
-          <w:b/>
-          <w:bCs/>
-          <w:lang w:eastAsia="ko-KR"/>
-        </w:rPr>
-        <w:t xml:space="preserve">. </w:t>
-      </w:r>
-      <w:r>
-        <w:rPr>
-          <w:rFonts w:hint="eastAsia"/>
-          <w:lang w:eastAsia="ko-KR"/>
-        </w:rPr>
-        <w:t>Immersive AI Analytics in Teacher Education: Enhancing Reflection and Pedagogical Adaptability</w:t>
-      </w:r>
-      <w:r>
-        <w:rPr>
-          <w:rFonts w:hint="eastAsia"/>
-          <w:b/>
-          <w:bCs/>
-          <w:lang w:eastAsia="ko-KR"/>
-        </w:rPr>
-        <w:t xml:space="preserve">. </w:t>
-      </w:r>
-      <w:r>
-        <w:rPr>
-          <w:lang w:eastAsia="ko-KR"/>
-        </w:rPr>
-        <w:t>Total</w:t>
-      </w:r>
-      <w:r>
-        <w:rPr>
-          <w:rFonts w:hint="eastAsia"/>
-          <w:lang w:eastAsia="ko-KR"/>
-        </w:rPr>
-        <w:t xml:space="preserve"> award $5</w:t>
-      </w:r>
-      <w:r>
-        <w:rPr>
-          <w:rFonts w:hint="eastAsia"/>
-          <w:lang w:eastAsia="ko-KR"/>
-        </w:rPr>
-        <w:t>0,</w:t>
-      </w:r>
-      <w:r>
-        <w:rPr>
-          <w:rFonts w:hint="eastAsia"/>
-          <w:lang w:eastAsia="ko-KR"/>
-        </w:rPr>
-        <w:t xml:space="preserve">000, </w:t>
-      </w:r>
-      <w:r>
-        <w:rPr>
-          <w:rFonts w:hint="eastAsia"/>
-          <w:lang w:eastAsia="ko-KR"/>
-        </w:rPr>
-        <w:t>Spencer Foundation Small Research Grant Program,</w:t>
-      </w:r>
-      <w:r>
-        <w:rPr>
-          <w:rFonts w:hint="eastAsia"/>
-          <w:b/>
-          <w:bCs/>
-          <w:lang w:eastAsia="ko-KR"/>
-        </w:rPr>
-        <w:t xml:space="preserve"> </w:t>
-      </w:r>
-      <w:r>
-        <w:rPr>
-          <w:b/>
-          <w:bCs/>
-          <w:u w:val="single"/>
-        </w:rPr>
-        <w:t>NOT FUNDED</w:t>
-      </w:r>
-      <w:r>
-        <w:rPr>
-          <w:rFonts w:hint="eastAsia"/>
-          <w:b/>
-          <w:bCs/>
-          <w:lang w:eastAsia="ko-KR"/>
-        </w:rPr>
-        <w:t xml:space="preserve"> </w:t>
+        <w:t xml:space="preserve"> August 2025</w:t>
+      </w:r>
+      <w:r>
+        <w:t xml:space="preserve">). </w:t>
+      </w:r>
+      <w:r>
+        <w:rPr>
+          <w:rFonts w:hint="eastAsia"/>
+          <w:i/>
+          <w:iCs/>
+          <w:lang w:eastAsia="ko-KR"/>
+        </w:rPr>
+        <w:t>ALA-AI Fellowship (Junior)</w:t>
+      </w:r>
+      <w:r>
+        <w:rPr>
+          <w:rFonts w:hint="eastAsia"/>
+          <w:lang w:eastAsia="ko-KR"/>
+        </w:rPr>
+        <w:t xml:space="preserve">, </w:t>
+      </w:r>
+      <w:r>
+        <w:rPr>
+          <w:lang w:eastAsia="ko-KR"/>
+        </w:rPr>
+        <w:t>$</w:t>
+      </w:r>
+      <w:r>
+        <w:rPr>
+          <w:rFonts w:hint="eastAsia"/>
+          <w:lang w:eastAsia="ko-KR"/>
+        </w:rPr>
+        <w:t>6</w:t>
+      </w:r>
+      <w:r>
+        <w:rPr>
+          <w:lang w:eastAsia="ko-KR"/>
+        </w:rPr>
+        <w:t>,</w:t>
+      </w:r>
+      <w:r>
+        <w:rPr>
+          <w:rFonts w:hint="eastAsia"/>
+          <w:lang w:eastAsia="ko-KR"/>
+        </w:rPr>
+        <w:t>000</w:t>
       </w:r>
     </w:p>
     <w:p>
@@ -6360,37 +5989,61 @@
         <w:rPr>
           <w:b/>
           <w:bCs/>
-        </w:rPr>
-      </w:pPr>
-      <w:r>
-        <w:rPr>
-          <w:rFonts w:hint="eastAsia"/>
-          <w:b/>
-          <w:bCs/>
-          <w:lang w:eastAsia="ko-KR"/>
-        </w:rPr>
-        <w:t xml:space="preserve">Moon, J. (Lead PI) </w:t>
-      </w:r>
-      <w:r>
-        <w:rPr>
-          <w:rFonts w:hint="eastAsia"/>
-          <w:lang w:eastAsia="ko-KR"/>
-        </w:rPr>
-        <w:t>(</w:t>
-      </w:r>
-      <w:r>
-        <w:rPr>
-          <w:rFonts w:hint="eastAsia"/>
-          <w:lang w:eastAsia="ko-KR"/>
-        </w:rPr>
-        <w:t>June</w:t>
-      </w:r>
-      <w:r>
-        <w:rPr>
-          <w:rFonts w:hint="eastAsia"/>
-          <w:lang w:eastAsia="ko-KR"/>
-        </w:rPr>
-        <w:t xml:space="preserve"> 2025 </w:t>
+          <w:lang w:eastAsia="ko-KR"/>
+        </w:rPr>
+      </w:pPr>
+      <w:r>
+        <w:rPr>
+          <w:rFonts w:hint="eastAsia"/>
+          <w:b/>
+          <w:bCs/>
+          <w:lang w:eastAsia="ko-KR"/>
+        </w:rPr>
+        <w:t xml:space="preserve">Moon, J. (Lead PI) &amp; </w:t>
+      </w:r>
+      <w:r>
+        <w:rPr>
+          <w:rFonts w:hint="eastAsia"/>
+          <w:lang w:eastAsia="ko-KR"/>
+        </w:rPr>
+        <w:t>Avraham, R. (PI)</w:t>
+      </w:r>
+      <w:r>
+        <w:rPr>
+          <w:rFonts w:hint="eastAsia"/>
+          <w:b/>
+          <w:bCs/>
+          <w:lang w:eastAsia="ko-KR"/>
+        </w:rPr>
+        <w:t xml:space="preserve"> </w:t>
+      </w:r>
+      <w:r>
+        <w:rPr>
+          <w:rFonts w:hint="eastAsia"/>
+          <w:lang w:eastAsia="ko-KR"/>
+        </w:rPr>
+        <w:t>(Jan</w:t>
+      </w:r>
+      <w:r>
+        <w:rPr>
+          <w:rFonts w:hint="eastAsia"/>
+          <w:lang w:eastAsia="ko-KR"/>
+        </w:rPr>
+        <w:t xml:space="preserve"> 202</w:t>
+      </w:r>
+      <w:r>
+        <w:rPr>
+          <w:rFonts w:hint="eastAsia"/>
+          <w:lang w:eastAsia="ko-KR"/>
+        </w:rPr>
+        <w:t>6</w:t>
+      </w:r>
+      <w:r>
+        <w:rPr>
+          <w:rFonts w:hint="eastAsia"/>
+          <w:lang w:eastAsia="ko-KR"/>
+        </w:rPr>
+        <w:t xml:space="preserve"> </w:t>
       </w:r>
       <w:r>
         <w:rPr>
@@ -6410,21 +6063,21 @@
           <w:rFonts w:hint="eastAsia"/>
           <w:lang w:eastAsia="ko-KR"/>
         </w:rPr>
-        <w:t>May</w:t>
-      </w:r>
-      <w:r>
-        <w:rPr>
-          <w:rFonts w:hint="eastAsia"/>
-          <w:lang w:eastAsia="ko-KR"/>
-        </w:rPr>
-        <w:t xml:space="preserve"> 202</w:t>
-      </w:r>
-      <w:r>
-        <w:rPr>
-          <w:rFonts w:hint="eastAsia"/>
-          <w:lang w:eastAsia="ko-KR"/>
-        </w:rPr>
-        <w:t>6</w:t>
+        <w:t>December</w:t>
+      </w:r>
+      <w:r>
+        <w:rPr>
+          <w:rFonts w:hint="eastAsia"/>
+          <w:lang w:eastAsia="ko-KR"/>
+        </w:rPr>
+        <w:t xml:space="preserve"> 20</w:t>
+      </w:r>
+      <w:r>
+        <w:rPr>
+          <w:rFonts w:hint="eastAsia"/>
+          <w:lang w:eastAsia="ko-KR"/>
+        </w:rPr>
+        <w:t>27</w:t>
       </w:r>
       <w:r>
         <w:rPr>
@@ -6437,13 +6090,7 @@
         <w:rPr>
           <w:lang w:eastAsia="ko-KR"/>
         </w:rPr>
-        <w:t>Optimizing</w:t>
-      </w:r>
-      <w:r>
-        <w:rPr>
-          <w:lang w:eastAsia="ko-KR"/>
-        </w:rPr>
-        <w:t xml:space="preserve"> Digital Math Learning Through Temporal Analytics: Exploring Spacing Effects and Time-on-Task Behaviors in Khan Academy</w:t>
+        <w:t>Collaborative Development and Evaluation of a Gamified AI Chatbot to Enhance Rehabilitation Nurses’ Intentions and Behaviors in Addressing Healthy Sexuality</w:t>
       </w:r>
       <w:r>
         <w:rPr>
@@ -6467,23 +6114,24 @@
       </w:r>
       <w:r>
         <w:rPr>
-          <w:lang w:eastAsia="ko-KR"/>
-        </w:rPr>
-        <w:t>40,255</w:t>
-      </w:r>
-      <w:r>
-        <w:rPr>
-          <w:rFonts w:hint="eastAsia"/>
-          <w:lang w:eastAsia="ko-KR"/>
-        </w:rPr>
-        <w:t xml:space="preserve">, </w:t>
-      </w:r>
-      <w:r>
-        <w:rPr>
-          <w:rFonts w:hint="eastAsia"/>
-          <w:lang w:eastAsia="ko-KR"/>
-        </w:rPr>
-        <w:t xml:space="preserve">Advanced Innovative Math Solutions Collaboratory, </w:t>
+          <w:rFonts w:hint="eastAsia"/>
+          <w:lang w:eastAsia="ko-KR"/>
+        </w:rPr>
+        <w:t>30,000</w:t>
+      </w:r>
+      <w:r>
+        <w:rPr>
+          <w:rFonts w:hint="eastAsia"/>
+          <w:lang w:eastAsia="ko-KR"/>
+        </w:rPr>
+        <w:t>,</w:t>
+      </w:r>
+      <w:r>
+        <w:rPr>
+          <w:rFonts w:hint="eastAsia"/>
+          <w:lang w:eastAsia="ko-KR"/>
+        </w:rPr>
+        <w:t xml:space="preserve"> </w:t>
       </w:r>
       <w:r>
         <w:rPr>
@@ -6507,125 +6155,122 @@
         <w:rPr>
           <w:b/>
           <w:bCs/>
-        </w:rPr>
-      </w:pPr>
-      <w:r>
-        <w:t>Shi, Y. (Lead PI),</w:t>
-      </w:r>
-      <w:r>
-        <w:rPr>
-          <w:b/>
-          <w:bCs/>
+          <w:lang w:eastAsia="ko-KR"/>
+        </w:rPr>
+      </w:pPr>
+      <w:r>
+        <w:rPr>
+          <w:rFonts w:hint="eastAsia"/>
+          <w:b/>
+          <w:bCs/>
+          <w:lang w:eastAsia="ko-KR"/>
+        </w:rPr>
+        <w:t xml:space="preserve">Moon, J. (Lead PI) </w:t>
+      </w:r>
+      <w:r>
+        <w:rPr>
+          <w:rFonts w:hint="eastAsia"/>
+          <w:lang w:eastAsia="ko-KR"/>
+        </w:rPr>
+        <w:t xml:space="preserve">(September 2025 </w:t>
+      </w:r>
+      <w:r>
+        <w:rPr>
+          <w:lang w:eastAsia="ko-KR"/>
+        </w:rPr>
+        <w:t>–</w:t>
+      </w:r>
+      <w:r>
+        <w:rPr>
+          <w:rFonts w:hint="eastAsia"/>
+          <w:lang w:eastAsia="ko-KR"/>
+        </w:rPr>
+        <w:t xml:space="preserve"> August 2028)</w:t>
+      </w:r>
+      <w:r>
+        <w:rPr>
+          <w:rFonts w:hint="eastAsia"/>
+          <w:b/>
+          <w:bCs/>
+          <w:lang w:eastAsia="ko-KR"/>
+        </w:rPr>
+        <w:t xml:space="preserve">. </w:t>
+      </w:r>
+      <w:r>
+        <w:rPr>
+          <w:rFonts w:hint="eastAsia"/>
+          <w:lang w:eastAsia="ko-KR"/>
+        </w:rPr>
+        <w:t>Immersive AI Analytics in Teacher Education: Enhancing Reflection and Pedagogical Adaptability</w:t>
+      </w:r>
+      <w:r>
+        <w:rPr>
+          <w:rFonts w:hint="eastAsia"/>
+          <w:b/>
+          <w:bCs/>
+          <w:lang w:eastAsia="ko-KR"/>
+        </w:rPr>
+        <w:t xml:space="preserve">. </w:t>
+      </w:r>
+      <w:r>
+        <w:rPr>
+          <w:lang w:eastAsia="ko-KR"/>
+        </w:rPr>
+        <w:t>Total</w:t>
+      </w:r>
+      <w:r>
+        <w:rPr>
+          <w:rFonts w:hint="eastAsia"/>
+          <w:lang w:eastAsia="ko-KR"/>
+        </w:rPr>
+        <w:t xml:space="preserve"> award $5</w:t>
+      </w:r>
+      <w:r>
+        <w:rPr>
+          <w:rFonts w:hint="eastAsia"/>
+          <w:lang w:eastAsia="ko-KR"/>
+        </w:rPr>
+        <w:t>0,</w:t>
+      </w:r>
+      <w:r>
+        <w:rPr>
+          <w:rFonts w:hint="eastAsia"/>
+          <w:lang w:eastAsia="ko-KR"/>
+        </w:rPr>
+        <w:t xml:space="preserve">000, </w:t>
+      </w:r>
+      <w:r>
+        <w:rPr>
+          <w:rFonts w:hint="eastAsia"/>
+          <w:lang w:eastAsia="ko-KR"/>
+        </w:rPr>
+        <w:t>Spencer Foundation Small Research Grant Program,</w:t>
+      </w:r>
+      <w:r>
+        <w:rPr>
+          <w:rFonts w:hint="eastAsia"/>
+          <w:b/>
+          <w:bCs/>
+          <w:lang w:eastAsia="ko-KR"/>
         </w:rPr>
         <w:t xml:space="preserve"> </w:t>
       </w:r>
       <w:r>
-        <w:t>Du, J. (Lead PI)</w:t>
-      </w:r>
-      <w:r>
-        <w:rPr>
-          <w:b/>
-          <w:bCs/>
-        </w:rPr>
-        <w:t xml:space="preserve">, </w:t>
-      </w:r>
-      <w:r>
-        <w:rPr>
-          <w:b/>
-          <w:bCs/>
-        </w:rPr>
-        <w:t>Moon, J</w:t>
-      </w:r>
-      <w:r>
-        <w:rPr>
-          <w:b/>
-          <w:bCs/>
-        </w:rPr>
-        <w:t>. (Lead PI),</w:t>
-      </w:r>
-      <w:r>
-        <w:t xml:space="preserve"> Myers, L. </w:t>
-      </w:r>
-      <w:r>
-        <w:t>(PI)</w:t>
-      </w:r>
-      <w:r>
-        <w:rPr>
-          <w:b/>
-          <w:bCs/>
+        <w:rPr>
+          <w:b/>
+          <w:bCs/>
+          <w:u w:val="single"/>
+        </w:rPr>
+        <w:t>NOT FUNDED</w:t>
+      </w:r>
+      <w:r>
+        <w:rPr>
+          <w:rFonts w:hint="eastAsia"/>
+          <w:b/>
+          <w:bCs/>
+          <w:lang w:eastAsia="ko-KR"/>
         </w:rPr>
         <w:t xml:space="preserve"> </w:t>
-      </w:r>
-      <w:r>
-        <w:t>(</w:t>
-      </w:r>
-      <w:r>
-        <w:t>August</w:t>
-      </w:r>
-      <w:r>
-        <w:t xml:space="preserve"> 202</w:t>
-      </w:r>
-      <w:r>
-        <w:rPr>
-          <w:rFonts w:hint="eastAsia"/>
-          <w:lang w:eastAsia="ko-KR"/>
-        </w:rPr>
-        <w:t>5</w:t>
-      </w:r>
-      <w:r>
-        <w:t xml:space="preserve"> – </w:t>
-      </w:r>
-      <w:r>
-        <w:t>July</w:t>
-      </w:r>
-      <w:r>
-        <w:t xml:space="preserve"> 202</w:t>
-      </w:r>
-      <w:r>
-        <w:rPr>
-          <w:rFonts w:hint="eastAsia"/>
-          <w:lang w:eastAsia="ko-KR"/>
-        </w:rPr>
-        <w:t>8</w:t>
-      </w:r>
-      <w:r>
-        <w:t xml:space="preserve">). </w:t>
-      </w:r>
-      <w:r>
-        <w:t>Collaborative Research: RITEL: Preparing First Responders for Future Robotic Technologies through Distributed and Embodied Virtual Learning Environment</w:t>
-      </w:r>
-      <w:r>
-        <w:t xml:space="preserve">. </w:t>
-      </w:r>
-      <w:r>
-        <w:t>National Science Foundation</w:t>
-      </w:r>
-      <w:r>
-        <w:t>, Total award $</w:t>
-      </w:r>
-      <w:r>
-        <w:t>2</w:t>
-      </w:r>
-      <w:r>
-        <w:rPr>
-          <w:rFonts w:hint="eastAsia"/>
-          <w:lang w:eastAsia="ko-KR"/>
-        </w:rPr>
-        <w:t>2</w:t>
-      </w:r>
-      <w:r>
-        <w:t>0,000</w:t>
-      </w:r>
-      <w:r>
-        <w:t xml:space="preserve">, </w:t>
-      </w:r>
-      <w:r>
-        <w:rPr>
-          <w:b/>
-          <w:bCs/>
-          <w:u w:val="single"/>
-        </w:rPr>
-        <w:t>NOT FUNDED</w:t>
       </w:r>
     </w:p>
     <w:p>
@@ -6641,7 +6286,6 @@
         <w:rPr>
           <w:b/>
           <w:bCs/>
-          <w:lang w:eastAsia="ko-KR"/>
         </w:rPr>
       </w:pPr>
       <w:r>
@@ -6658,7 +6302,21 @@
           <w:rFonts w:hint="eastAsia"/>
           <w:lang w:eastAsia="ko-KR"/>
         </w:rPr>
-        <w:t xml:space="preserve">(May 2025 </w:t>
+        <w:t>(</w:t>
+      </w:r>
+      <w:r>
+        <w:rPr>
+          <w:rFonts w:hint="eastAsia"/>
+          <w:lang w:eastAsia="ko-KR"/>
+        </w:rPr>
+        <w:t>June</w:t>
+      </w:r>
+      <w:r>
+        <w:rPr>
+          <w:rFonts w:hint="eastAsia"/>
+          <w:lang w:eastAsia="ko-KR"/>
+        </w:rPr>
+        <w:t xml:space="preserve"> 2025 </w:t>
       </w:r>
       <w:r>
         <w:rPr>
@@ -6671,20 +6329,54 @@
           <w:rFonts w:hint="eastAsia"/>
           <w:lang w:eastAsia="ko-KR"/>
         </w:rPr>
-        <w:t xml:space="preserve"> May 2027). </w:t>
-      </w:r>
-      <w:r>
-        <w:rPr>
-          <w:lang w:eastAsia="ko-KR"/>
-        </w:rPr>
-        <w:t>Transforming Rural Teacher Preparation: An AI-Powered 3D Simulation for Real-World Classroom Problem-Solving</w:t>
-      </w:r>
-      <w:r>
-        <w:rPr>
-          <w:rFonts w:hint="eastAsia"/>
-          <w:lang w:eastAsia="ko-KR"/>
-        </w:rPr>
-        <w:t xml:space="preserve">. </w:t>
+        <w:t xml:space="preserve"> </w:t>
+      </w:r>
+      <w:r>
+        <w:rPr>
+          <w:rFonts w:hint="eastAsia"/>
+          <w:lang w:eastAsia="ko-KR"/>
+        </w:rPr>
+        <w:t>May</w:t>
+      </w:r>
+      <w:r>
+        <w:rPr>
+          <w:rFonts w:hint="eastAsia"/>
+          <w:lang w:eastAsia="ko-KR"/>
+        </w:rPr>
+        <w:t xml:space="preserve"> 202</w:t>
+      </w:r>
+      <w:r>
+        <w:rPr>
+          <w:rFonts w:hint="eastAsia"/>
+          <w:lang w:eastAsia="ko-KR"/>
+        </w:rPr>
+        <w:t>6</w:t>
+      </w:r>
+      <w:r>
+        <w:rPr>
+          <w:rFonts w:hint="eastAsia"/>
+          <w:lang w:eastAsia="ko-KR"/>
+        </w:rPr>
+        <w:t xml:space="preserve">). </w:t>
+      </w:r>
+      <w:r>
+        <w:rPr>
+          <w:lang w:eastAsia="ko-KR"/>
+        </w:rPr>
+        <w:t>Optimizing</w:t>
+      </w:r>
+      <w:r>
+        <w:rPr>
+          <w:lang w:eastAsia="ko-KR"/>
+        </w:rPr>
+        <w:t xml:space="preserve"> Digital Math Learning Through Temporal Analytics: Exploring Spacing Effects and Time-on-Task Behaviors in Khan Academy</w:t>
+      </w:r>
+      <w:r>
+        <w:rPr>
+          <w:rFonts w:hint="eastAsia"/>
+          <w:lang w:eastAsia="ko-KR"/>
+        </w:rPr>
+        <w:t xml:space="preserve">, </w:t>
       </w:r>
       <w:r>
         <w:rPr>
@@ -6697,28 +6389,27 @@
           <w:rFonts w:hint="eastAsia"/>
           <w:lang w:eastAsia="ko-KR"/>
         </w:rPr>
-        <w:t xml:space="preserve"> award $95</w:t>
-      </w:r>
-      <w:r>
-        <w:rPr>
-          <w:rFonts w:hint="eastAsia"/>
-          <w:lang w:eastAsia="ko-KR"/>
-        </w:rPr>
-        <w:t>,</w:t>
-      </w:r>
-      <w:r>
-        <w:rPr>
-          <w:rFonts w:hint="eastAsia"/>
-          <w:lang w:eastAsia="ko-KR"/>
-        </w:rPr>
-        <w:t xml:space="preserve">000, </w:t>
-      </w:r>
-      <w:r>
-        <w:rPr>
-          <w:rFonts w:hint="eastAsia"/>
-          <w:lang w:eastAsia="ko-KR"/>
-        </w:rPr>
-        <w:t xml:space="preserve">Unity Humanity Grant, </w:t>
+        <w:t xml:space="preserve"> award $</w:t>
+      </w:r>
+      <w:r>
+        <w:rPr>
+          <w:lang w:eastAsia="ko-KR"/>
+        </w:rPr>
+        <w:t>40,255</w:t>
+      </w:r>
+      <w:r>
+        <w:rPr>
+          <w:rFonts w:hint="eastAsia"/>
+          <w:lang w:eastAsia="ko-KR"/>
+        </w:rPr>
+        <w:t xml:space="preserve">, </w:t>
+      </w:r>
+      <w:r>
+        <w:rPr>
+          <w:rFonts w:hint="eastAsia"/>
+          <w:lang w:eastAsia="ko-KR"/>
+        </w:rPr>
+        <w:t xml:space="preserve">Advanced Innovative Math Solutions Collaboratory, </w:t>
       </w:r>
       <w:r>
         <w:rPr>
@@ -6739,23 +6430,23 @@
           <w:between w:val="nil"/>
         </w:pBdr>
         <w:ind w:left="720" w:hanging="720"/>
-      </w:pPr>
-      <w:r>
-        <w:t xml:space="preserve">Liu, J. (Lead PI), Dalal, R. (PI), Myers, L. (PI), </w:t>
-      </w:r>
-      <w:r>
-        <w:rPr>
-          <w:b/>
-          <w:bCs/>
-        </w:rPr>
-        <w:t>Moon, J.</w:t>
-      </w:r>
-      <w:r>
-        <w:rPr>
-          <w:b/>
-          <w:bCs/>
-        </w:rPr>
-        <w:t xml:space="preserve"> (PI)</w:t>
+        <w:rPr>
+          <w:b/>
+          <w:bCs/>
+        </w:rPr>
+      </w:pPr>
+      <w:r>
+        <w:t>Shi, Y. (Lead PI),</w:t>
+      </w:r>
+      <w:r>
+        <w:rPr>
+          <w:b/>
+          <w:bCs/>
+        </w:rPr>
+        <w:t xml:space="preserve"> </w:t>
+      </w:r>
+      <w:r>
+        <w:t>Du, J. (Lead PI)</w:t>
       </w:r>
       <w:r>
         <w:rPr>
@@ -6765,79 +6456,93 @@
         <w:t xml:space="preserve">, </w:t>
       </w:r>
       <w:r>
-        <w:t>Shi, Y. (PI), Wang, H. (PI), Ni, S. (PI), Trouvé, A. (PI), Stoliarov, S. (PI)</w:t>
-      </w:r>
-      <w:r>
-        <w:rPr>
-          <w:rFonts w:ascii="Calibri" w:hAnsi="Calibri" w:cs="Calibri"/>
+        <w:rPr>
+          <w:b/>
+          <w:bCs/>
+        </w:rPr>
+        <w:t>Moon, J</w:t>
+      </w:r>
+      <w:r>
+        <w:rPr>
+          <w:b/>
+          <w:bCs/>
+        </w:rPr>
+        <w:t>. (Lead PI),</w:t>
+      </w:r>
+      <w:r>
+        <w:t xml:space="preserve"> Myers, L. </w:t>
+      </w:r>
+      <w:r>
+        <w:t>(PI)</w:t>
+      </w:r>
+      <w:r>
+        <w:rPr>
           <w:b/>
           <w:bCs/>
         </w:rPr>
         <w:t xml:space="preserve"> </w:t>
       </w:r>
       <w:r>
-        <w:t xml:space="preserve">Co-DEMP: </w:t>
-      </w:r>
-      <w:r>
-        <w:rPr>
-          <w:u w:val="single"/>
-        </w:rPr>
-        <w:t>Co</w:t>
-      </w:r>
-      <w:r>
-        <w:t>-</w:t>
-      </w:r>
-      <w:r>
-        <w:rPr>
-          <w:u w:val="single"/>
-        </w:rPr>
-        <w:t>De</w:t>
-      </w:r>
-      <w:r>
-        <w:t xml:space="preserve">signed </w:t>
-      </w:r>
-      <w:r>
-        <w:rPr>
-          <w:u w:val="single"/>
-        </w:rPr>
-        <w:t>M</w:t>
-      </w:r>
-      <w:r>
-        <w:t>ulti-</w:t>
-      </w:r>
-      <w:r>
-        <w:rPr>
-          <w:u w:val="single"/>
-        </w:rPr>
-        <w:t>P</w:t>
-      </w:r>
-      <w:r>
-        <w:t>hase Training for Electric Vehicle Emergency Responses. Department of Energy</w:t>
-      </w:r>
-      <w:r>
-        <w:t>, U.S Government.</w:t>
-      </w:r>
-      <w:r>
-        <w:t xml:space="preserve"> </w:t>
-      </w:r>
-      <w:r>
-        <w:rPr>
-          <w:rFonts w:hint="eastAsia"/>
-          <w:lang w:eastAsia="ko-KR"/>
-        </w:rPr>
-        <w:t xml:space="preserve"> </w:t>
-      </w:r>
-      <w:r>
-        <w:t xml:space="preserve">Total award </w:t>
-      </w:r>
-      <w:r>
-        <w:t>$2,500,000</w:t>
-      </w:r>
-      <w:r>
-        <w:rPr>
-          <w:rFonts w:hint="eastAsia"/>
-          <w:lang w:eastAsia="ko-KR"/>
-        </w:rPr>
+        <w:t>(</w:t>
+      </w:r>
+      <w:r>
+        <w:t>August</w:t>
+      </w:r>
+      <w:r>
+        <w:t xml:space="preserve"> 202</w:t>
+      </w:r>
+      <w:r>
+        <w:rPr>
+          <w:rFonts w:hint="eastAsia"/>
+          <w:lang w:eastAsia="ko-KR"/>
+        </w:rPr>
+        <w:t>5</w:t>
+      </w:r>
+      <w:r>
+        <w:t xml:space="preserve"> – </w:t>
+      </w:r>
+      <w:r>
+        <w:t>July</w:t>
+      </w:r>
+      <w:r>
+        <w:t xml:space="preserve"> 202</w:t>
+      </w:r>
+      <w:r>
+        <w:rPr>
+          <w:rFonts w:hint="eastAsia"/>
+          <w:lang w:eastAsia="ko-KR"/>
+        </w:rPr>
+        <w:t>8</w:t>
+      </w:r>
+      <w:r>
+        <w:t xml:space="preserve">). </w:t>
+      </w:r>
+      <w:r>
+        <w:t>Collaborative Research: RITEL: Preparing First Responders for Future Robotic Technologies through Distributed and Embodied Virtual Learning Environment</w:t>
+      </w:r>
+      <w:r>
+        <w:t xml:space="preserve">. </w:t>
+      </w:r>
+      <w:r>
+        <w:t>National Science Foundation</w:t>
+      </w:r>
+      <w:r>
+        <w:t>, Total award $</w:t>
+      </w:r>
+      <w:r>
+        <w:t>2</w:t>
+      </w:r>
+      <w:r>
+        <w:rPr>
+          <w:rFonts w:hint="eastAsia"/>
+          <w:lang w:eastAsia="ko-KR"/>
+        </w:rPr>
+        <w:t>2</w:t>
+      </w:r>
+      <w:r>
+        <w:t>0,000</w:t>
+      </w:r>
+      <w:r>
         <w:t xml:space="preserve">, </w:t>
       </w:r>
       <w:r>
@@ -6862,48 +6567,84 @@
         <w:rPr>
           <w:b/>
           <w:bCs/>
-        </w:rPr>
-      </w:pPr>
-      <w:r>
-        <w:t>McNeill, L. (Lead PI),</w:t>
-      </w:r>
-      <w:r>
-        <w:rPr>
-          <w:b/>
-          <w:bCs/>
-        </w:rPr>
-        <w:t xml:space="preserve"> Moon, J</w:t>
-      </w:r>
-      <w:r>
+          <w:lang w:eastAsia="ko-KR"/>
+        </w:rPr>
+      </w:pPr>
+      <w:r>
+        <w:rPr>
+          <w:rFonts w:hint="eastAsia"/>
+          <w:b/>
+          <w:bCs/>
+          <w:lang w:eastAsia="ko-KR"/>
+        </w:rPr>
+        <w:t xml:space="preserve">Moon, J. (Lead PI) </w:t>
+      </w:r>
+      <w:r>
+        <w:rPr>
+          <w:rFonts w:hint="eastAsia"/>
+          <w:lang w:eastAsia="ko-KR"/>
+        </w:rPr>
+        <w:t xml:space="preserve">(May 2025 </w:t>
+      </w:r>
+      <w:r>
+        <w:rPr>
+          <w:lang w:eastAsia="ko-KR"/>
+        </w:rPr>
+        <w:t>–</w:t>
+      </w:r>
+      <w:r>
+        <w:rPr>
+          <w:rFonts w:hint="eastAsia"/>
+          <w:lang w:eastAsia="ko-KR"/>
+        </w:rPr>
+        <w:t xml:space="preserve"> May 2027). </w:t>
+      </w:r>
+      <w:r>
+        <w:rPr>
+          <w:lang w:eastAsia="ko-KR"/>
+        </w:rPr>
+        <w:t>Transforming Rural Teacher Preparation: An AI-Powered 3D Simulation for Real-World Classroom Problem-Solving</w:t>
+      </w:r>
+      <w:r>
+        <w:rPr>
+          <w:rFonts w:hint="eastAsia"/>
+          <w:lang w:eastAsia="ko-KR"/>
+        </w:rPr>
         <w:t xml:space="preserve">. </w:t>
       </w:r>
       <w:r>
         <w:rPr>
-          <w:b/>
-          <w:bCs/>
-        </w:rPr>
-        <w:t>(PI)</w:t>
-      </w:r>
-      <w:r>
-        <w:t xml:space="preserve">, Edmonds, C. (PI) (July 2024 – June 2027). </w:t>
-      </w:r>
-      <w:r>
-        <w:rPr>
-          <w:i/>
-          <w:iCs/>
-        </w:rPr>
-        <w:t xml:space="preserve">HOPE: Harnessing Opportunities for Promoting Heterophily and Engagement in Business </w:t>
-      </w:r>
-      <w:r>
-        <w:rPr>
-          <w:i/>
-          <w:iCs/>
-        </w:rPr>
-        <w:lastRenderedPageBreak/>
-        <w:t>Education through Gamification</w:t>
-      </w:r>
-      <w:r>
-        <w:t xml:space="preserve">. Spencer Foundation, Total award $500,000, </w:t>
+          <w:lang w:eastAsia="ko-KR"/>
+        </w:rPr>
+        <w:t>Total</w:t>
+      </w:r>
+      <w:r>
+        <w:rPr>
+          <w:rFonts w:hint="eastAsia"/>
+          <w:lang w:eastAsia="ko-KR"/>
+        </w:rPr>
+        <w:t xml:space="preserve"> award $95</w:t>
+      </w:r>
+      <w:r>
+        <w:rPr>
+          <w:rFonts w:hint="eastAsia"/>
+          <w:lang w:eastAsia="ko-KR"/>
+        </w:rPr>
+        <w:t>,</w:t>
+      </w:r>
+      <w:r>
+        <w:rPr>
+          <w:rFonts w:hint="eastAsia"/>
+          <w:lang w:eastAsia="ko-KR"/>
+        </w:rPr>
+        <w:t xml:space="preserve">000, </w:t>
+      </w:r>
+      <w:r>
+        <w:rPr>
+          <w:rFonts w:hint="eastAsia"/>
+          <w:lang w:eastAsia="ko-KR"/>
+        </w:rPr>
+        <w:t xml:space="preserve">Unity Humanity Grant, </w:t>
       </w:r>
       <w:r>
         <w:rPr>
@@ -6912,154 +6653,6 @@
           <w:u w:val="single"/>
         </w:rPr>
         <w:t>NOT FUNDED</w:t>
-      </w:r>
-    </w:p>
-    <w:p>
-      <w:pPr>
-        <w:keepNext/>
-        <w:widowControl/>
-        <w:ind w:left="720" w:hanging="720"/>
-        <w:rPr>
-          <w:b/>
-          <w:bCs/>
-          <w:u w:val="single"/>
-        </w:rPr>
-      </w:pPr>
-      <w:r>
-        <w:rPr>
-          <w:b/>
-          <w:bCs/>
-        </w:rPr>
-        <w:t>Moon, J</w:t>
-      </w:r>
-      <w:r>
-        <w:t xml:space="preserve">. </w:t>
-      </w:r>
-      <w:r>
-        <w:rPr>
-          <w:b/>
-          <w:bCs/>
-        </w:rPr>
-        <w:t xml:space="preserve">(Lead PI) </w:t>
-      </w:r>
-      <w:r>
-        <w:t xml:space="preserve">&amp; Suh, J. (PI) (Sep 2022 – Aug 2024). </w:t>
-      </w:r>
-      <w:r>
-        <w:rPr>
-          <w:i/>
-          <w:iCs/>
-        </w:rPr>
-        <w:t>Developing a Teaching Analytic System for Middle School Science Teachers</w:t>
-      </w:r>
-      <w:r>
-        <w:t xml:space="preserve">. ORED Internal Funding, Total award $12,000, </w:t>
-      </w:r>
-      <w:r>
-        <w:rPr>
-          <w:b/>
-          <w:bCs/>
-          <w:u w:val="single"/>
-        </w:rPr>
-        <w:t>NOT FUNDED</w:t>
-      </w:r>
-    </w:p>
-    <w:p>
-      <w:pPr>
-        <w:keepNext/>
-        <w:widowControl/>
-        <w:ind w:left="720" w:hanging="720"/>
-        <w:rPr>
-          <w:b/>
-          <w:bCs/>
-          <w:u w:val="single"/>
-        </w:rPr>
-      </w:pPr>
-      <w:r>
-        <w:rPr>
-          <w:b/>
-          <w:bCs/>
-        </w:rPr>
-        <w:t>Moon, J</w:t>
-      </w:r>
-      <w:r>
-        <w:t xml:space="preserve">. </w:t>
-      </w:r>
-      <w:r>
-        <w:rPr>
-          <w:b/>
-          <w:bCs/>
-        </w:rPr>
-        <w:t>(Lead PI</w:t>
-      </w:r>
-      <w:r>
-        <w:rPr>
-          <w:b/>
-          <w:bCs/>
-        </w:rPr>
-        <w:t xml:space="preserve">) </w:t>
-      </w:r>
-      <w:r>
-        <w:t>&amp;</w:t>
-      </w:r>
-      <w:r>
-        <w:t xml:space="preserve"> </w:t>
-      </w:r>
-      <w:r>
-        <w:t xml:space="preserve">Shi, Y. </w:t>
-      </w:r>
-      <w:r>
-        <w:t>(PI</w:t>
-      </w:r>
-      <w:r>
-        <w:t>)</w:t>
-      </w:r>
-      <w:r>
-        <w:t xml:space="preserve"> (Jan 2022 – Dec 202</w:t>
-      </w:r>
-      <w:r>
-        <w:t>5</w:t>
-      </w:r>
-      <w:r>
-        <w:t xml:space="preserve">). </w:t>
-      </w:r>
-      <w:r>
-        <w:rPr>
-          <w:i/>
-          <w:iCs/>
-        </w:rPr>
-        <w:t>Design and Development of Adaptive Game-based Training to Enhance Computational Thinking of Rural Adolescents with Autism via Minecraft Gameplay</w:t>
-      </w:r>
-      <w:r>
-        <w:t xml:space="preserve">. </w:t>
-      </w:r>
-      <w:r>
-        <w:t>National Science Foundation</w:t>
-      </w:r>
-      <w:r>
-        <w:t>, Total award $</w:t>
-      </w:r>
-      <w:r>
-        <w:t>298,279</w:t>
-      </w:r>
-      <w:r>
-        <w:t xml:space="preserve">, </w:t>
-      </w:r>
-      <w:r>
-        <w:rPr>
-          <w:b/>
-          <w:bCs/>
-          <w:u w:val="single"/>
-        </w:rPr>
-        <w:t xml:space="preserve">NOT </w:t>
-      </w:r>
-      <w:r>
-        <w:rPr>
-          <w:b/>
-          <w:bCs/>
-          <w:u w:val="single"/>
-        </w:rPr>
-        <w:t>FUNDED</w:t>
       </w:r>
     </w:p>
     <w:p>
@@ -7072,100 +6665,86 @@
           <w:between w:val="nil"/>
         </w:pBdr>
         <w:ind w:left="720" w:hanging="720"/>
-        <w:rPr>
-          <w:lang w:eastAsia="ko-KR"/>
-        </w:rPr>
-      </w:pPr>
-      <w:r>
-        <w:rPr>
-          <w:rFonts w:hint="eastAsia"/>
-          <w:lang w:eastAsia="ko-KR"/>
-        </w:rPr>
-        <w:t>Sumengen, A.</w:t>
-      </w:r>
-      <w:r>
-        <w:rPr>
-          <w:rFonts w:hint="eastAsia"/>
-          <w:lang w:eastAsia="ko-KR"/>
+      </w:pPr>
+      <w:r>
+        <w:lastRenderedPageBreak/>
+        <w:t xml:space="preserve">Liu, J. (Lead PI), Dalal, R. (PI), Myers, L. (PI), </w:t>
+      </w:r>
+      <w:r>
+        <w:rPr>
+          <w:b/>
+          <w:bCs/>
+        </w:rPr>
+        <w:t>Moon, J.</w:t>
+      </w:r>
+      <w:r>
+        <w:rPr>
+          <w:b/>
+          <w:bCs/>
+        </w:rPr>
+        <w:t xml:space="preserve"> (PI)</w:t>
+      </w:r>
+      <w:r>
+        <w:rPr>
+          <w:b/>
+          <w:bCs/>
+        </w:rPr>
+        <w:t xml:space="preserve">, </w:t>
+      </w:r>
+      <w:r>
+        <w:t>Shi, Y. (PI), Wang, H. (PI), Ni, S. (PI), Trouvé, A. (PI), Stoliarov, S. (PI)</w:t>
+      </w:r>
+      <w:r>
+        <w:rPr>
+          <w:rFonts w:ascii="Calibri" w:hAnsi="Calibri" w:cs="Calibri"/>
+          <w:b/>
+          <w:bCs/>
         </w:rPr>
         <w:t xml:space="preserve"> </w:t>
       </w:r>
       <w:r>
-        <w:rPr>
-          <w:rFonts w:hint="eastAsia"/>
-          <w:lang w:eastAsia="ko-KR"/>
-        </w:rPr>
-        <w:t>(Lead PI), Chen, K. (</w:t>
-      </w:r>
-      <w:r>
-        <w:rPr>
-          <w:rFonts w:hint="eastAsia"/>
-          <w:lang w:eastAsia="ko-KR"/>
-        </w:rPr>
-        <w:t>PI</w:t>
-      </w:r>
-      <w:r>
-        <w:rPr>
-          <w:rFonts w:hint="eastAsia"/>
-          <w:lang w:eastAsia="ko-KR"/>
-        </w:rPr>
-        <w:t>), &amp;</w:t>
-      </w:r>
-      <w:r>
-        <w:rPr>
-          <w:rFonts w:hint="eastAsia"/>
-          <w:b/>
-          <w:bCs/>
-          <w:lang w:eastAsia="ko-KR"/>
-        </w:rPr>
-        <w:t xml:space="preserve"> Moon, J. (PI), </w:t>
-      </w:r>
-      <w:r>
-        <w:rPr>
-          <w:rFonts w:hint="eastAsia"/>
-          <w:lang w:eastAsia="ko-KR"/>
-        </w:rPr>
-        <w:t>&amp; McCoy, T.</w:t>
-      </w:r>
-      <w:r>
-        <w:rPr>
-          <w:rFonts w:hint="eastAsia"/>
-          <w:lang w:eastAsia="ko-KR"/>
-        </w:rPr>
-        <w:t xml:space="preserve"> (PI)</w:t>
-      </w:r>
-      <w:r>
-        <w:rPr>
-          <w:rFonts w:hint="eastAsia"/>
-          <w:lang w:eastAsia="ko-KR"/>
-        </w:rPr>
-        <w:t xml:space="preserve"> (</w:t>
-      </w:r>
-      <w:r>
-        <w:rPr>
-          <w:rFonts w:hint="eastAsia"/>
-          <w:lang w:eastAsia="ko-KR"/>
-        </w:rPr>
-        <w:t>December</w:t>
-      </w:r>
-      <w:r>
-        <w:rPr>
-          <w:rFonts w:hint="eastAsia"/>
-          <w:lang w:eastAsia="ko-KR"/>
-        </w:rPr>
-        <w:t xml:space="preserve"> 2025 </w:t>
-      </w:r>
-      <w:r>
-        <w:rPr>
-          <w:lang w:eastAsia="ko-KR"/>
-        </w:rPr>
-        <w:t>–</w:t>
-      </w:r>
-      <w:r>
-        <w:rPr>
-          <w:rFonts w:hint="eastAsia"/>
-          <w:lang w:eastAsia="ko-KR"/>
-        </w:rPr>
+        <w:t xml:space="preserve">Co-DEMP: </w:t>
+      </w:r>
+      <w:r>
+        <w:rPr>
+          <w:u w:val="single"/>
+        </w:rPr>
+        <w:t>Co</w:t>
+      </w:r>
+      <w:r>
+        <w:t>-</w:t>
+      </w:r>
+      <w:r>
+        <w:rPr>
+          <w:u w:val="single"/>
+        </w:rPr>
+        <w:t>De</w:t>
+      </w:r>
+      <w:r>
+        <w:t xml:space="preserve">signed </w:t>
+      </w:r>
+      <w:r>
+        <w:rPr>
+          <w:u w:val="single"/>
+        </w:rPr>
+        <w:t>M</w:t>
+      </w:r>
+      <w:r>
+        <w:t>ulti-</w:t>
+      </w:r>
+      <w:r>
+        <w:rPr>
+          <w:u w:val="single"/>
+        </w:rPr>
+        <w:t>P</w:t>
+      </w:r>
+      <w:r>
+        <w:t>hase Training for Electric Vehicle Emergency Responses. Department of Energy</w:t>
+      </w:r>
+      <w:r>
+        <w:t>, U.S Government.</w:t>
+      </w:r>
+      <w:r>
         <w:t xml:space="preserve"> </w:t>
       </w:r>
       <w:r>
@@ -7173,87 +6752,273 @@
           <w:rFonts w:hint="eastAsia"/>
           <w:lang w:eastAsia="ko-KR"/>
         </w:rPr>
-        <w:t>November</w:t>
-      </w:r>
-      <w:r>
-        <w:rPr>
-          <w:rFonts w:hint="eastAsia"/>
-          <w:lang w:eastAsia="ko-KR"/>
-        </w:rPr>
-        <w:t xml:space="preserve"> 202</w:t>
-      </w:r>
-      <w:r>
-        <w:rPr>
-          <w:rFonts w:hint="eastAsia"/>
-          <w:lang w:eastAsia="ko-KR"/>
-        </w:rPr>
-        <w:t>6</w:t>
-      </w:r>
-      <w:r>
-        <w:rPr>
-          <w:rFonts w:hint="eastAsia"/>
-          <w:lang w:eastAsia="ko-KR"/>
-        </w:rPr>
+        <w:t xml:space="preserve"> </w:t>
+      </w:r>
+      <w:r>
+        <w:t xml:space="preserve">Total award </w:t>
+      </w:r>
+      <w:r>
+        <w:t>$2,500,000</w:t>
+      </w:r>
+      <w:r>
+        <w:rPr>
+          <w:rFonts w:hint="eastAsia"/>
+          <w:lang w:eastAsia="ko-KR"/>
+        </w:rPr>
+        <w:t xml:space="preserve">, </w:t>
+      </w:r>
+      <w:r>
+        <w:rPr>
+          <w:b/>
+          <w:bCs/>
+          <w:u w:val="single"/>
+        </w:rPr>
+        <w:t>NOT FUNDED</w:t>
+      </w:r>
+    </w:p>
+    <w:p>
+      <w:pPr>
+        <w:pBdr>
+          <w:top w:val="nil"/>
+          <w:left w:val="nil"/>
+          <w:bottom w:val="nil"/>
+          <w:right w:val="nil"/>
+          <w:between w:val="nil"/>
+        </w:pBdr>
+        <w:ind w:left="720" w:hanging="720"/>
+        <w:rPr>
+          <w:b/>
+          <w:bCs/>
+        </w:rPr>
+      </w:pPr>
+      <w:r>
+        <w:t>McNeill, L. (Lead PI),</w:t>
+      </w:r>
+      <w:r>
+        <w:rPr>
+          <w:b/>
+          <w:bCs/>
+        </w:rPr>
+        <w:t xml:space="preserve"> Moon, J</w:t>
+      </w:r>
+      <w:r>
+        <w:t xml:space="preserve">. </w:t>
+      </w:r>
+      <w:r>
+        <w:rPr>
+          <w:b/>
+          <w:bCs/>
+        </w:rPr>
+        <w:t>(PI)</w:t>
+      </w:r>
+      <w:r>
+        <w:t xml:space="preserve">, Edmonds, C. (PI) (July 2024 – June 2027). </w:t>
+      </w:r>
+      <w:r>
+        <w:rPr>
+          <w:i/>
+          <w:iCs/>
+        </w:rPr>
+        <w:t>HOPE: Harnessing Opportunities for Promoting Heterophily and Engagement in Business Education through Gamification</w:t>
+      </w:r>
+      <w:r>
+        <w:t xml:space="preserve">. Spencer Foundation, Total award $500,000, </w:t>
+      </w:r>
+      <w:r>
+        <w:rPr>
+          <w:b/>
+          <w:bCs/>
+          <w:u w:val="single"/>
+        </w:rPr>
+        <w:t>NOT FUNDED</w:t>
+      </w:r>
+    </w:p>
+    <w:p>
+      <w:pPr>
+        <w:keepNext/>
+        <w:widowControl/>
+        <w:ind w:left="720" w:hanging="720"/>
+        <w:rPr>
+          <w:b/>
+          <w:bCs/>
+          <w:u w:val="single"/>
+        </w:rPr>
+      </w:pPr>
+      <w:r>
+        <w:rPr>
+          <w:b/>
+          <w:bCs/>
+        </w:rPr>
+        <w:t>Moon, J</w:t>
+      </w:r>
+      <w:r>
+        <w:t xml:space="preserve">. </w:t>
+      </w:r>
+      <w:r>
+        <w:rPr>
+          <w:b/>
+          <w:bCs/>
+        </w:rPr>
+        <w:t xml:space="preserve">(Lead PI) </w:t>
+      </w:r>
+      <w:r>
+        <w:t xml:space="preserve">&amp; Suh, J. (PI) (Sep 2022 – Aug 2024). </w:t>
+      </w:r>
+      <w:r>
+        <w:rPr>
+          <w:i/>
+          <w:iCs/>
+        </w:rPr>
+        <w:t>Developing a Teaching Analytic System for Middle School Science Teachers</w:t>
+      </w:r>
+      <w:r>
+        <w:t xml:space="preserve">. ORED Internal Funding, Total award $12,000, </w:t>
+      </w:r>
+      <w:r>
+        <w:rPr>
+          <w:b/>
+          <w:bCs/>
+          <w:u w:val="single"/>
+        </w:rPr>
+        <w:t>NOT FUNDED</w:t>
+      </w:r>
+    </w:p>
+    <w:p>
+      <w:pPr>
+        <w:keepNext/>
+        <w:widowControl/>
+        <w:ind w:left="720" w:hanging="720"/>
+        <w:rPr>
+          <w:b/>
+          <w:bCs/>
+          <w:u w:val="single"/>
+        </w:rPr>
+      </w:pPr>
+      <w:r>
+        <w:rPr>
+          <w:b/>
+          <w:bCs/>
+        </w:rPr>
+        <w:t>Moon, J</w:t>
+      </w:r>
+      <w:r>
+        <w:t xml:space="preserve">. </w:t>
+      </w:r>
+      <w:r>
+        <w:rPr>
+          <w:b/>
+          <w:bCs/>
+        </w:rPr>
+        <w:t>(Lead PI</w:t>
+      </w:r>
+      <w:r>
+        <w:rPr>
+          <w:b/>
+          <w:bCs/>
+        </w:rPr>
+        <w:t xml:space="preserve">) </w:t>
+      </w:r>
+      <w:r>
+        <w:t>&amp;</w:t>
+      </w:r>
+      <w:r>
+        <w:t xml:space="preserve"> </w:t>
+      </w:r>
+      <w:r>
+        <w:t xml:space="preserve">Shi, Y. </w:t>
+      </w:r>
+      <w:r>
+        <w:t>(PI</w:t>
+      </w:r>
+      <w:r>
+        <w:t>)</w:t>
+      </w:r>
+      <w:r>
+        <w:t xml:space="preserve"> (Jan 2022 – Dec 202</w:t>
+      </w:r>
+      <w:r>
+        <w:t>5</w:t>
+      </w:r>
+      <w:r>
         <w:t xml:space="preserve">). </w:t>
       </w:r>
       <w:r>
         <w:rPr>
-          <w:lang w:eastAsia="ko-KR"/>
-        </w:rPr>
+          <w:i/>
+          <w:iCs/>
+        </w:rPr>
+        <w:t>Design and Development of Adaptive Game-based Training to Enhance Computational Thinking of Rural Adolescents with Autism via Minecraft Gameplay</w:t>
+      </w:r>
+      <w:r>
+        <w:t xml:space="preserve">. </w:t>
+      </w:r>
+      <w:r>
+        <w:t>National Science Foundation</w:t>
+      </w:r>
+      <w:r>
+        <w:t>, Total award $</w:t>
+      </w:r>
+      <w:r>
+        <w:t>298,279</w:t>
+      </w:r>
+      <w:r>
+        <w:t xml:space="preserve">, </w:t>
+      </w:r>
+      <w:r>
+        <w:rPr>
+          <w:b/>
+          <w:bCs/>
+          <w:u w:val="single"/>
+        </w:rPr>
+        <w:t xml:space="preserve">NOT </w:t>
+      </w:r>
+      <w:r>
+        <w:rPr>
+          <w:b/>
+          <w:bCs/>
+          <w:u w:val="single"/>
+        </w:rPr>
+        <w:t>FUNDED</w:t>
+      </w:r>
+    </w:p>
+    <w:p>
+      <w:pPr>
+        <w:pBdr>
+          <w:top w:val="nil"/>
+          <w:left w:val="nil"/>
+          <w:bottom w:val="nil"/>
+          <w:right w:val="nil"/>
+          <w:between w:val="nil"/>
+        </w:pBdr>
+        <w:ind w:left="720" w:hanging="720"/>
+        <w:rPr>
+          <w:lang w:eastAsia="ko-KR"/>
+        </w:rPr>
+      </w:pPr>
+      <w:r>
+        <w:t xml:space="preserve">Sumengen, A. (Lead PI), Chen, K. (PI), </w:t>
+      </w:r>
+      <w:r>
+        <w:rPr>
+          <w:b/>
+        </w:rPr>
+        <w:t>Moon, J. (PI)</w:t>
+      </w:r>
+      <w:r>
+        <w:t xml:space="preserve">, &amp; McCoy, T. (PI) </w:t>
+      </w:r>
+      <w:r>
+        <w:t xml:space="preserve">(December 2025 - November 2026). </w:t>
+      </w:r>
+      <w:r>
         <w:t>A Biofeedback-Based Virtual Reality Implementation to Teach Metered Dose Inhaler Technique Education for Pediatric Asthma Patients: A Development and Feasibility Study</w:t>
       </w:r>
       <w:r>
-        <w:rPr>
-          <w:rFonts w:hint="eastAsia"/>
-          <w:lang w:eastAsia="ko-KR"/>
-        </w:rPr>
-        <w:t xml:space="preserve">. </w:t>
-      </w:r>
-      <w:r>
-        <w:rPr>
-          <w:lang w:eastAsia="ko-KR"/>
-        </w:rPr>
-        <w:t>National Institutes of Health (NIH)</w:t>
-      </w:r>
-      <w:r>
-        <w:rPr>
-          <w:rFonts w:hint="eastAsia"/>
-          <w:lang w:eastAsia="ko-KR"/>
-        </w:rPr>
-        <w:t xml:space="preserve">, </w:t>
-      </w:r>
-      <w:r>
-        <w:rPr>
-          <w:lang w:eastAsia="ko-KR"/>
-        </w:rPr>
-        <w:t>Total</w:t>
-      </w:r>
-      <w:r>
-        <w:rPr>
-          <w:rFonts w:hint="eastAsia"/>
-          <w:lang w:eastAsia="ko-KR"/>
-        </w:rPr>
-        <w:t xml:space="preserve"> award $</w:t>
-      </w:r>
-      <w:r>
-        <w:rPr>
-          <w:rFonts w:hint="eastAsia"/>
-          <w:lang w:eastAsia="ko-KR"/>
-        </w:rPr>
-        <w:t>415,250,</w:t>
-      </w:r>
-      <w:r>
-        <w:rPr>
-          <w:rFonts w:hint="eastAsia"/>
-          <w:lang w:eastAsia="ko-KR"/>
-        </w:rPr>
-        <w:t xml:space="preserve"> </w:t>
-      </w:r>
-      <w:r>
-        <w:rPr>
-          <w:b/>
-          <w:bCs/>
-          <w:u w:val="single"/>
+        <w:t xml:space="preserve">. National Institutes of Health (NIH), total requested $415,250, </w:t>
+      </w:r>
+      <w:r>
+        <w:rPr>
+          <w:b/>
         </w:rPr>
         <w:t>NOT FUNDED</w:t>
       </w:r>
@@ -8261,40 +8026,7 @@
           <w:iCs/>
           <w:lang w:eastAsia="ko-KR"/>
         </w:rPr>
-        <w:t>6</w:t>
-      </w:r>
-      <w:r>
-        <w:rPr>
-          <w:rFonts w:hint="eastAsia"/>
-          <w:b/>
-          <w:bCs/>
-          <w:i/>
-          <w:iCs/>
-          <w:lang w:eastAsia="ko-KR"/>
-        </w:rPr>
-        <w:t>.</w:t>
-      </w:r>
-      <w:r>
-        <w:rPr>
-          <w:rFonts w:hint="eastAsia"/>
-          <w:b/>
-          <w:bCs/>
-          <w:i/>
-          <w:iCs/>
-          <w:lang w:eastAsia="ko-KR"/>
-        </w:rPr>
-        <w:t>1</w:t>
-      </w:r>
-      <w:r>
-        <w:rPr>
-          <w:rFonts w:hint="eastAsia"/>
-          <w:b/>
-          <w:bCs/>
-          <w:i/>
-          <w:iCs/>
-          <w:lang w:eastAsia="ko-KR"/>
-        </w:rPr>
-        <w:t xml:space="preserve">, </w:t>
+        <w:t xml:space="preserve">6.1, </w:t>
       </w:r>
       <w:r>
         <w:rPr>
@@ -9101,16 +8833,10 @@
       </w:r>
       <w:r>
         <w:rPr>
-          <w:lang w:eastAsia="ko-KR"/>
-        </w:rPr>
-        <w:t>In Press</w:t>
-      </w:r>
-      <w:r>
-        <w:rPr>
-          <w:rFonts w:hint="eastAsia"/>
-          <w:lang w:eastAsia="ko-KR"/>
-        </w:rPr>
-        <w:t>, 2026</w:t>
+          <w:rFonts w:hint="eastAsia"/>
+          <w:lang w:eastAsia="ko-KR"/>
+        </w:rPr>
+        <w:t>2026</w:t>
       </w:r>
       <w:r>
         <w:rPr>
@@ -9299,47 +9025,56 @@
           <w:rFonts w:hint="eastAsia"/>
           <w:lang w:eastAsia="ko-KR"/>
         </w:rPr>
+        <w:t>k</w:t>
+      </w:r>
+      <w:r>
+        <w:rPr>
+          <w:lang w:eastAsia="ko-KR"/>
+        </w:rPr>
+        <w:t>nowledge</w:t>
+      </w:r>
+      <w:r>
+        <w:rPr>
+          <w:rFonts w:hint="eastAsia"/>
+          <w:lang w:eastAsia="ko-KR"/>
+        </w:rPr>
+        <w:t xml:space="preserve">. </w:t>
+      </w:r>
+      <w:r>
+        <w:rPr>
+          <w:rFonts w:hint="eastAsia"/>
+          <w:i/>
+          <w:iCs/>
+          <w:lang w:eastAsia="ko-KR"/>
+        </w:rPr>
+        <w:t xml:space="preserve">ZDM </w:t>
+      </w:r>
+      <w:r>
+        <w:rPr>
+          <w:i/>
+          <w:iCs/>
+          <w:lang w:eastAsia="ko-KR"/>
+        </w:rPr>
+        <w:t>–</w:t>
+      </w:r>
+      <w:r>
+        <w:rPr>
+          <w:rFonts w:hint="eastAsia"/>
+          <w:i/>
+          <w:iCs/>
+          <w:lang w:eastAsia="ko-KR"/>
+        </w:rPr>
+        <w:t xml:space="preserve"> </w:t>
+      </w:r>
+      <w:r>
+        <w:rPr>
+          <w:rFonts w:hint="eastAsia"/>
+          <w:i/>
+          <w:iCs/>
+          <w:lang w:eastAsia="ko-KR"/>
+        </w:rPr>
         <w:lastRenderedPageBreak/>
-        <w:t>k</w:t>
-      </w:r>
-      <w:r>
-        <w:rPr>
-          <w:lang w:eastAsia="ko-KR"/>
-        </w:rPr>
-        <w:t>nowledge</w:t>
-      </w:r>
-      <w:r>
-        <w:rPr>
-          <w:rFonts w:hint="eastAsia"/>
-          <w:lang w:eastAsia="ko-KR"/>
-        </w:rPr>
-        <w:t xml:space="preserve">. </w:t>
-      </w:r>
-      <w:r>
-        <w:rPr>
-          <w:rFonts w:hint="eastAsia"/>
-          <w:i/>
-          <w:iCs/>
-          <w:lang w:eastAsia="ko-KR"/>
-        </w:rPr>
-        <w:t xml:space="preserve">ZDM </w:t>
-      </w:r>
-      <w:r>
-        <w:rPr>
-          <w:i/>
-          <w:iCs/>
-          <w:lang w:eastAsia="ko-KR"/>
-        </w:rPr>
-        <w:t>–</w:t>
-      </w:r>
-      <w:r>
-        <w:rPr>
-          <w:rFonts w:hint="eastAsia"/>
-          <w:i/>
-          <w:iCs/>
-          <w:lang w:eastAsia="ko-KR"/>
-        </w:rPr>
-        <w:t xml:space="preserve"> International Journal on Mathematics Education</w:t>
+        <w:t>International Journal on Mathematics Education</w:t>
       </w:r>
       <w:r>
         <w:rPr>
@@ -36366,14 +36101,6 @@
           <w:bCs/>
           <w:lang w:eastAsia="ko-KR"/>
         </w:rPr>
-      </w:r>
-      <w:r>
-        <w:rPr>
-          <w:rFonts w:hint="eastAsia"/>
-          <w:b/>
-          <w:bCs/>
-          <w:lang w:eastAsia="ko-KR"/>
-        </w:rPr>
         <w:t>)</w:t>
       </w:r>
     </w:p>
@@ -36412,17 +36139,6 @@
       </w:r>
       <w:r>
         <w:rPr>
-          <w:rFonts w:hint="eastAsia"/>
-          <w:b/>
-          <w:bCs/>
-          <w:i/>
-          <w:iCs/>
-          <w:u w:val="single"/>
-          <w:lang w:eastAsia="ko-KR"/>
-        </w:rPr>
-      </w:r>
-      <w:r>
-        <w:rPr>
           <w:b/>
           <w:bCs/>
           <w:i/>
@@ -36682,20 +36398,7 @@
           <w:rFonts w:hint="eastAsia"/>
           <w:lang w:eastAsia="ko-KR"/>
         </w:rPr>
-        <w:t>[28]</w:t>
-      </w:r>
-      <w:r>
-        <w:rPr>
-          <w:rFonts w:hint="eastAsia"/>
-          <w:lang w:eastAsia="ko-KR"/>
-        </w:rPr>
-      </w:r>
-      <w:r>
-        <w:rPr>
-          <w:rFonts w:hint="eastAsia"/>
-          <w:lang w:eastAsia="ko-KR"/>
-        </w:rPr>
-        <w:t xml:space="preserve"> Lim, J., </w:t>
+        <w:t xml:space="preserve">[28] Lim, J., </w:t>
       </w:r>
       <w:r>
         <w:rPr>
@@ -36892,20 +36595,7 @@
           <w:rFonts w:hint="eastAsia"/>
           <w:lang w:eastAsia="ko-KR"/>
         </w:rPr>
-        <w:t>[27]</w:t>
-      </w:r>
-      <w:r>
-        <w:rPr>
-          <w:rFonts w:hint="eastAsia"/>
-          <w:lang w:eastAsia="ko-KR"/>
-        </w:rPr>
-      </w:r>
-      <w:r>
-        <w:rPr>
-          <w:rFonts w:hint="eastAsia"/>
-          <w:lang w:eastAsia="ko-KR"/>
-        </w:rPr>
-        <w:t xml:space="preserve"> </w:t>
+        <w:t xml:space="preserve">[27] </w:t>
       </w:r>
       <w:r>
         <w:t xml:space="preserve">‡ </w:t>
@@ -37094,26 +36784,7 @@
           <w:rFonts w:hint="eastAsia"/>
           <w:lang w:eastAsia="ko-KR"/>
         </w:rPr>
-        <w:t>[26]</w:t>
-      </w:r>
-      <w:r>
-        <w:rPr>
-          <w:rFonts w:hint="eastAsia"/>
-          <w:lang w:eastAsia="ko-KR"/>
-        </w:rPr>
-      </w:r>
-      <w:r>
-        <w:rPr>
-          <w:rFonts w:hint="eastAsia"/>
-          <w:lang w:eastAsia="ko-KR"/>
-        </w:rPr>
-      </w:r>
-      <w:r>
-        <w:rPr>
-          <w:rFonts w:hint="eastAsia"/>
-          <w:lang w:eastAsia="ko-KR"/>
-        </w:rPr>
-        <w:t xml:space="preserve"> </w:t>
+        <w:t xml:space="preserve">[26] </w:t>
       </w:r>
       <w:r>
         <w:t>*</w:t>
@@ -37281,26 +36952,7 @@
           <w:rFonts w:hint="eastAsia"/>
           <w:lang w:eastAsia="ko-KR"/>
         </w:rPr>
-        <w:t>[25]</w:t>
-      </w:r>
-      <w:r>
-        <w:rPr>
-          <w:rFonts w:hint="eastAsia"/>
-          <w:lang w:eastAsia="ko-KR"/>
-        </w:rPr>
-      </w:r>
-      <w:r>
-        <w:rPr>
-          <w:rFonts w:hint="eastAsia"/>
-          <w:lang w:eastAsia="ko-KR"/>
-        </w:rPr>
-      </w:r>
-      <w:r>
-        <w:rPr>
-          <w:rFonts w:hint="eastAsia"/>
-          <w:lang w:eastAsia="ko-KR"/>
-        </w:rPr>
-        <w:t xml:space="preserve"> Amari, A. Y. </w:t>
+        <w:t xml:space="preserve">[25] Amari, A. Y. </w:t>
       </w:r>
       <w:r>
         <w:rPr>
@@ -37523,20 +37175,7 @@
           <w:rFonts w:hint="eastAsia"/>
           <w:lang w:eastAsia="ko-KR"/>
         </w:rPr>
-        <w:t>[24]</w:t>
-      </w:r>
-      <w:r>
-        <w:rPr>
-          <w:rFonts w:hint="eastAsia"/>
-          <w:lang w:eastAsia="ko-KR"/>
-        </w:rPr>
-      </w:r>
-      <w:r>
-        <w:rPr>
-          <w:rFonts w:hint="eastAsia"/>
-          <w:lang w:eastAsia="ko-KR"/>
-        </w:rPr>
-        <w:t xml:space="preserve"> </w:t>
+        <w:t xml:space="preserve">[24] </w:t>
       </w:r>
       <w:r>
         <w:t xml:space="preserve">‡ </w:t>
@@ -37788,20 +37427,7 @@
           <w:rFonts w:hint="eastAsia"/>
           <w:lang w:eastAsia="ko-KR"/>
         </w:rPr>
-        <w:t>[23]</w:t>
-      </w:r>
-      <w:r>
-        <w:rPr>
-          <w:rFonts w:hint="eastAsia"/>
-          <w:lang w:eastAsia="ko-KR"/>
-        </w:rPr>
-      </w:r>
-      <w:r>
-        <w:rPr>
-          <w:rFonts w:hint="eastAsia"/>
-          <w:lang w:eastAsia="ko-KR"/>
-        </w:rPr>
-        <w:t xml:space="preserve"> * Awoyemi, I., </w:t>
+        <w:t xml:space="preserve">[23] * Awoyemi, I., </w:t>
       </w:r>
       <w:r>
         <w:rPr>
@@ -37984,20 +37610,7 @@
           <w:rFonts w:hint="eastAsia"/>
           <w:lang w:eastAsia="ko-KR"/>
         </w:rPr>
-        <w:t>[22]</w:t>
-      </w:r>
-      <w:r>
-        <w:rPr>
-          <w:rFonts w:hint="eastAsia"/>
-          <w:lang w:eastAsia="ko-KR"/>
-        </w:rPr>
-      </w:r>
-      <w:r>
-        <w:rPr>
-          <w:rFonts w:hint="eastAsia"/>
-          <w:lang w:eastAsia="ko-KR"/>
-        </w:rPr>
-        <w:t xml:space="preserve"> </w:t>
+        <w:t xml:space="preserve">[22] </w:t>
       </w:r>
       <w:r>
         <w:rPr>
@@ -38202,20 +37815,7 @@
           <w:rFonts w:hint="eastAsia"/>
           <w:lang w:eastAsia="ko-KR"/>
         </w:rPr>
-        <w:t>[21]</w:t>
-      </w:r>
-      <w:r>
-        <w:rPr>
-          <w:rFonts w:hint="eastAsia"/>
-          <w:lang w:eastAsia="ko-KR"/>
-        </w:rPr>
-      </w:r>
-      <w:r>
-        <w:rPr>
-          <w:rFonts w:hint="eastAsia"/>
-          <w:lang w:eastAsia="ko-KR"/>
-        </w:rPr>
-        <w:t xml:space="preserve"> </w:t>
+        <w:t xml:space="preserve">[21] </w:t>
       </w:r>
       <w:r>
         <w:t>‡</w:t>
@@ -38432,18 +38032,6 @@
           <w:rFonts w:hint="eastAsia"/>
           <w:lang w:eastAsia="ko-KR"/>
         </w:rPr>
-      </w:r>
-      <w:r>
-        <w:rPr>
-          <w:rFonts w:hint="eastAsia"/>
-          <w:lang w:eastAsia="ko-KR"/>
-        </w:rPr>
-      </w:r>
-      <w:r>
-        <w:rPr>
-          <w:rFonts w:hint="eastAsia"/>
-          <w:lang w:eastAsia="ko-KR"/>
-        </w:rPr>
         <w:t xml:space="preserve"> Awoyemi, D., </w:t>
       </w:r>
       <w:r>
@@ -38598,20 +38186,7 @@
           <w:rFonts w:hint="eastAsia"/>
           <w:lang w:eastAsia="ko-KR"/>
         </w:rPr>
-        <w:t>[19]</w:t>
-      </w:r>
-      <w:r>
-        <w:rPr>
-          <w:rFonts w:hint="eastAsia"/>
-          <w:lang w:eastAsia="ko-KR"/>
-        </w:rPr>
-      </w:r>
-      <w:r>
-        <w:rPr>
-          <w:rFonts w:hint="eastAsia"/>
-          <w:lang w:eastAsia="ko-KR"/>
-        </w:rPr>
-        <w:t xml:space="preserve"> </w:t>
+        <w:t xml:space="preserve">[19] </w:t>
       </w:r>
       <w:r>
         <w:rPr>
@@ -38679,18 +38254,6 @@
           <w:rFonts w:hint="eastAsia"/>
           <w:lang w:eastAsia="ko-KR"/>
         </w:rPr>
-      </w:r>
-      <w:r>
-        <w:rPr>
-          <w:rFonts w:hint="eastAsia"/>
-          <w:lang w:eastAsia="ko-KR"/>
-        </w:rPr>
-      </w:r>
-      <w:r>
-        <w:rPr>
-          <w:rFonts w:hint="eastAsia"/>
-          <w:lang w:eastAsia="ko-KR"/>
-        </w:rPr>
         <w:t xml:space="preserve"> </w:t>
       </w:r>
       <w:r>
@@ -38916,25 +38479,7 @@
         <w:rPr>
           <w:lang w:eastAsia="ko-KR"/>
         </w:rPr>
-        <w:t>[17]</w:t>
-      </w:r>
-      <w:r>
-        <w:rPr>
-          <w:rFonts w:hint="eastAsia"/>
-          <w:lang w:eastAsia="ko-KR"/>
-        </w:rPr>
-      </w:r>
-      <w:r>
-        <w:rPr>
-          <w:rFonts w:hint="eastAsia"/>
-          <w:lang w:eastAsia="ko-KR"/>
-        </w:rPr>
-      </w:r>
-      <w:r>
-        <w:rPr>
-          <w:lang w:eastAsia="ko-KR"/>
-        </w:rPr>
-        <w:t xml:space="preserve"> </w:t>
+        <w:t xml:space="preserve">[17] </w:t>
       </w:r>
       <w:r>
         <w:rPr>
@@ -38989,25 +38534,7 @@
         <w:rPr>
           <w:lang w:eastAsia="ko-KR"/>
         </w:rPr>
-        <w:t>[16]</w:t>
-      </w:r>
-      <w:r>
-        <w:rPr>
-          <w:rFonts w:hint="eastAsia"/>
-          <w:lang w:eastAsia="ko-KR"/>
-        </w:rPr>
-      </w:r>
-      <w:r>
-        <w:rPr>
-          <w:rFonts w:hint="eastAsia"/>
-          <w:lang w:eastAsia="ko-KR"/>
-        </w:rPr>
-      </w:r>
-      <w:r>
-        <w:rPr>
-          <w:lang w:eastAsia="ko-KR"/>
-        </w:rPr>
-        <w:t xml:space="preserve"> </w:t>
+        <w:t xml:space="preserve">[16] </w:t>
       </w:r>
       <w:r>
         <w:rPr>
@@ -39182,26 +38709,7 @@
           <w:rFonts w:hint="eastAsia"/>
           <w:lang w:eastAsia="ko-KR"/>
         </w:rPr>
-        <w:t>[15]</w:t>
-      </w:r>
-      <w:r>
-        <w:rPr>
-          <w:rFonts w:hint="eastAsia"/>
-          <w:lang w:eastAsia="ko-KR"/>
-        </w:rPr>
-      </w:r>
-      <w:r>
-        <w:rPr>
-          <w:rFonts w:hint="eastAsia"/>
-          <w:lang w:eastAsia="ko-KR"/>
-        </w:rPr>
-      </w:r>
-      <w:r>
-        <w:rPr>
-          <w:rFonts w:hint="eastAsia"/>
-          <w:lang w:eastAsia="ko-KR"/>
-        </w:rPr>
-        <w:t xml:space="preserve"> </w:t>
+        <w:t xml:space="preserve">[15] </w:t>
       </w:r>
       <w:r>
         <w:t xml:space="preserve">‡ </w:t>
@@ -39413,26 +38921,7 @@
           <w:rFonts w:hint="eastAsia"/>
           <w:lang w:eastAsia="ko-KR"/>
         </w:rPr>
-        <w:t>[14]</w:t>
-      </w:r>
-      <w:r>
-        <w:rPr>
-          <w:rFonts w:hint="eastAsia"/>
-          <w:lang w:eastAsia="ko-KR"/>
-        </w:rPr>
-      </w:r>
-      <w:r>
-        <w:rPr>
-          <w:rFonts w:hint="eastAsia"/>
-          <w:lang w:eastAsia="ko-KR"/>
-        </w:rPr>
-      </w:r>
-      <w:r>
-        <w:rPr>
-          <w:rFonts w:hint="eastAsia"/>
-          <w:lang w:eastAsia="ko-KR"/>
-        </w:rPr>
-        <w:t xml:space="preserve"> </w:t>
+        <w:t xml:space="preserve">[14] </w:t>
       </w:r>
       <w:r>
         <w:t>*</w:t>
@@ -39699,18 +39188,6 @@
           <w:rFonts w:hint="eastAsia"/>
           <w:lang w:eastAsia="ko-KR"/>
         </w:rPr>
-      </w:r>
-      <w:r>
-        <w:rPr>
-          <w:rFonts w:hint="eastAsia"/>
-          <w:lang w:eastAsia="ko-KR"/>
-        </w:rPr>
-      </w:r>
-      <w:r>
-        <w:rPr>
-          <w:rFonts w:hint="eastAsia"/>
-          <w:lang w:eastAsia="ko-KR"/>
-        </w:rPr>
         <w:t xml:space="preserve"> </w:t>
       </w:r>
       <w:r>
@@ -39991,20 +39468,7 @@
           <w:rFonts w:hint="eastAsia"/>
           <w:lang w:eastAsia="ko-KR"/>
         </w:rPr>
-        <w:t>[12]</w:t>
-      </w:r>
-      <w:r>
-        <w:rPr>
-          <w:rFonts w:hint="eastAsia"/>
-          <w:lang w:eastAsia="ko-KR"/>
-        </w:rPr>
-      </w:r>
-      <w:r>
-        <w:rPr>
-          <w:rFonts w:hint="eastAsia"/>
-          <w:lang w:eastAsia="ko-KR"/>
-        </w:rPr>
-        <w:t xml:space="preserve"> </w:t>
+        <w:t xml:space="preserve">[12] </w:t>
       </w:r>
       <w:r>
         <w:t xml:space="preserve">‡ </w:t>
@@ -40269,20 +39733,7 @@
           <w:rFonts w:hint="eastAsia"/>
           <w:lang w:eastAsia="ko-KR"/>
         </w:rPr>
-        <w:t>[11]</w:t>
-      </w:r>
-      <w:r>
-        <w:rPr>
-          <w:rFonts w:hint="eastAsia"/>
-          <w:lang w:eastAsia="ko-KR"/>
-        </w:rPr>
-      </w:r>
-      <w:r>
-        <w:rPr>
-          <w:rFonts w:hint="eastAsia"/>
-          <w:lang w:eastAsia="ko-KR"/>
-        </w:rPr>
-        <w:t xml:space="preserve"> </w:t>
+        <w:t xml:space="preserve">[11] </w:t>
       </w:r>
       <w:r>
         <w:rPr>
@@ -40474,20 +39925,7 @@
           <w:rFonts w:hint="eastAsia"/>
           <w:lang w:eastAsia="ko-KR"/>
         </w:rPr>
-        <w:t>[10]</w:t>
-      </w:r>
-      <w:r>
-        <w:rPr>
-          <w:rFonts w:hint="eastAsia"/>
-          <w:lang w:eastAsia="ko-KR"/>
-        </w:rPr>
-      </w:r>
-      <w:r>
-        <w:rPr>
-          <w:rFonts w:hint="eastAsia"/>
-          <w:lang w:eastAsia="ko-KR"/>
-        </w:rPr>
-        <w:t xml:space="preserve"> </w:t>
+        <w:t xml:space="preserve">[10] </w:t>
       </w:r>
       <w:r>
         <w:rPr>
@@ -40779,20 +40217,7 @@
           <w:rFonts w:hint="eastAsia"/>
           <w:lang w:eastAsia="ko-KR"/>
         </w:rPr>
-        <w:t>[9]</w:t>
-      </w:r>
-      <w:r>
-        <w:rPr>
-          <w:rFonts w:hint="eastAsia"/>
-          <w:lang w:eastAsia="ko-KR"/>
-        </w:rPr>
-      </w:r>
-      <w:r>
-        <w:rPr>
-          <w:rFonts w:hint="eastAsia"/>
-          <w:lang w:eastAsia="ko-KR"/>
-        </w:rPr>
-        <w:t xml:space="preserve"> Lim, J., Kim, C., &amp; </w:t>
+        <w:t xml:space="preserve">[9] Lim, J., Kim, C., &amp; </w:t>
       </w:r>
       <w:r>
         <w:rPr>
@@ -49047,6 +48472,18 @@
 </file>
 
 <file path=customXml/item2.xml><?xml version="1.0" encoding="utf-8"?>
+<b:Sources xmlns:b="http://schemas.openxmlformats.org/officeDocument/2006/bibliography" xmlns="http://schemas.openxmlformats.org/officeDocument/2006/bibliography" SelectedStyle="\APASixthEditionOfficeOnline.xsl" StyleName="APA" Version="6"/>
+</file>
+
+<file path=customXml/item3.xml><?xml version="1.0" encoding="utf-8"?>
+<p:properties xmlns:p="http://schemas.microsoft.com/office/2006/metadata/properties" xmlns:xsi="http://www.w3.org/2001/XMLSchema-instance" xmlns:pc="http://schemas.microsoft.com/office/infopath/2007/PartnerControls">
+  <documentManagement>
+    <_activity xmlns="6a4161d7-0e07-4bb5-8cdd-a87a7602a445" xsi:nil="true"/>
+  </documentManagement>
+</p:properties>
+</file>
+
+<file path=customXml/item4.xml><?xml version="1.0" encoding="utf-8"?>
 <ct:contentTypeSchema xmlns:ct="http://schemas.microsoft.com/office/2006/metadata/contentType" xmlns:ma="http://schemas.microsoft.com/office/2006/metadata/properties/metaAttributes" ct:_="" ma:_="" ma:contentTypeName="Document" ma:contentTypeID="0x010100FA54A6C77D34E44FB33E0184D6F9C744" ma:contentTypeVersion="18" ma:contentTypeDescription="Create a new document." ma:contentTypeScope="" ma:versionID="9c28832654d292338743ef1185d20088">
   <xsd:schema xmlns:xsd="http://www.w3.org/2001/XMLSchema" xmlns:xs="http://www.w3.org/2001/XMLSchema" xmlns:p="http://schemas.microsoft.com/office/2006/metadata/properties" xmlns:ns3="6a4161d7-0e07-4bb5-8cdd-a87a7602a445" xmlns:ns4="30453fea-43c5-4a0b-a417-834186a09351" targetNamespace="http://schemas.microsoft.com/office/2006/metadata/properties" ma:root="true" ma:fieldsID="aadbfd92c1be4506f2c2f9fc093c4d0b" ns3:_="" ns4:_="">
     <xsd:import namespace="6a4161d7-0e07-4bb5-8cdd-a87a7602a445"/>
@@ -49299,18 +48736,6 @@
 </ct:contentTypeSchema>
 </file>
 
-<file path=customXml/item3.xml><?xml version="1.0" encoding="utf-8"?>
-<b:Sources xmlns:b="http://schemas.openxmlformats.org/officeDocument/2006/bibliography" xmlns="http://schemas.openxmlformats.org/officeDocument/2006/bibliography" SelectedStyle="\APASixthEditionOfficeOnline.xsl" StyleName="APA" Version="6"/>
-</file>
-
-<file path=customXml/item4.xml><?xml version="1.0" encoding="utf-8"?>
-<p:properties xmlns:p="http://schemas.microsoft.com/office/2006/metadata/properties" xmlns:xsi="http://www.w3.org/2001/XMLSchema-instance" xmlns:pc="http://schemas.microsoft.com/office/infopath/2007/PartnerControls">
-  <documentManagement>
-    <_activity xmlns="6a4161d7-0e07-4bb5-8cdd-a87a7602a445" xsi:nil="true"/>
-  </documentManagement>
-</p:properties>
-</file>
-
 <file path=customXml/itemProps1.xml><?xml version="1.0" encoding="utf-8"?>
 <ds:datastoreItem xmlns:ds="http://schemas.openxmlformats.org/officeDocument/2006/customXml" ds:itemID="{F79F8074-1665-45F2-8B05-A95EA1C1A155}">
   <ds:schemaRefs>
@@ -49320,6 +48745,24 @@
 </file>
 
 <file path=customXml/itemProps2.xml><?xml version="1.0" encoding="utf-8"?>
+<ds:datastoreItem xmlns:ds="http://schemas.openxmlformats.org/officeDocument/2006/customXml" ds:itemID="{E286DD98-9466-43F6-BF97-336366EE54DF}">
+  <ds:schemaRefs>
+    <ds:schemaRef ds:uri="http://schemas.openxmlformats.org/officeDocument/2006/bibliography"/>
+  </ds:schemaRefs>
+</ds:datastoreItem>
+</file>
+
+<file path=customXml/itemProps3.xml><?xml version="1.0" encoding="utf-8"?>
+<ds:datastoreItem xmlns:ds="http://schemas.openxmlformats.org/officeDocument/2006/customXml" ds:itemID="{7C24488D-A36D-4C56-91ED-753F5C27550A}">
+  <ds:schemaRefs>
+    <ds:schemaRef ds:uri="http://schemas.microsoft.com/office/2006/metadata/properties"/>
+    <ds:schemaRef ds:uri="http://schemas.microsoft.com/office/infopath/2007/PartnerControls"/>
+    <ds:schemaRef ds:uri="6a4161d7-0e07-4bb5-8cdd-a87a7602a445"/>
+  </ds:schemaRefs>
+</ds:datastoreItem>
+</file>
+
+<file path=customXml/itemProps4.xml><?xml version="1.0" encoding="utf-8"?>
 <ds:datastoreItem xmlns:ds="http://schemas.openxmlformats.org/officeDocument/2006/customXml" ds:itemID="{44F19B31-977D-45A4-A748-143054BB9DA7}">
   <ds:schemaRefs>
     <ds:schemaRef ds:uri="http://schemas.microsoft.com/office/2006/metadata/contentType"/>
@@ -49336,22 +48779,4 @@
     <ds:schemaRef ds:uri="http://schemas.microsoft.com/internal/obd"/>
   </ds:schemaRefs>
 </ds:datastoreItem>
-</file>
-
-<file path=customXml/itemProps3.xml><?xml version="1.0" encoding="utf-8"?>
-<ds:datastoreItem xmlns:ds="http://schemas.openxmlformats.org/officeDocument/2006/customXml" ds:itemID="{E286DD98-9466-43F6-BF97-336366EE54DF}">
-  <ds:schemaRefs>
-    <ds:schemaRef ds:uri="http://schemas.openxmlformats.org/officeDocument/2006/bibliography"/>
-  </ds:schemaRefs>
-</ds:datastoreItem>
-</file>
-
-<file path=customXml/itemProps4.xml><?xml version="1.0" encoding="utf-8"?>
-<ds:datastoreItem xmlns:ds="http://schemas.openxmlformats.org/officeDocument/2006/customXml" ds:itemID="{7C24488D-A36D-4C56-91ED-753F5C27550A}">
-  <ds:schemaRefs>
-    <ds:schemaRef ds:uri="http://schemas.microsoft.com/office/2006/metadata/properties"/>
-    <ds:schemaRef ds:uri="http://schemas.microsoft.com/office/infopath/2007/PartnerControls"/>
-    <ds:schemaRef ds:uri="6a4161d7-0e07-4bb5-8cdd-a87a7602a445"/>
-  </ds:schemaRefs>
-</ds:datastoreItem>
 </file>
</xml_diff>

<commit_message>
Update CyberAI submission title from Cayuse
</commit_message>
<xml_diff>
--- a/CV_202605_MOON.docx
+++ b/CV_202605_MOON.docx
@@ -4635,7 +4635,10 @@
         </w:rPr>
       </w:pPr>
       <w:r>
-        <w:t>Submitted/Pending ($434,946)</w:t>
+        <w:rPr>
+          <w:b/>
+        </w:rPr>
+        <w:t>Submitted/Pending ($932,406)</w:t>
       </w:r>
     </w:p>
     <w:p>
@@ -4841,75 +4844,25 @@
         </w:pBdr>
         <w:ind w:left="720" w:hanging="720"/>
         <w:rPr>
-          <w:lang w:eastAsia="ko-KR"/>
-        </w:rPr>
-      </w:pPr>
-      <w:r>
-        <w:rPr>
-          <w:rFonts w:hint="eastAsia"/>
-          <w:b/>
-          <w:bCs/>
-          <w:lang w:eastAsia="ko-KR"/>
-        </w:rPr>
-        <w:t xml:space="preserve">Moon, J. </w:t>
-      </w:r>
-      <w:r>
-        <w:rPr>
-          <w:rFonts w:hint="eastAsia"/>
-          <w:lang w:eastAsia="ko-KR"/>
-        </w:rPr>
-        <w:t>(Key Personnel</w:t>
-      </w:r>
-      <w:r>
-        <w:rPr>
-          <w:rFonts w:hint="eastAsia"/>
-          <w:b/>
-          <w:bCs/>
-          <w:lang w:eastAsia="ko-KR"/>
-        </w:rPr>
-        <w:t xml:space="preserve"> / </w:t>
-      </w:r>
-      <w:r>
-        <w:rPr>
-          <w:rFonts w:hint="eastAsia"/>
-          <w:lang w:eastAsia="ko-KR"/>
-        </w:rPr>
-        <w:t xml:space="preserve">External Evaluator). (January 2027 </w:t>
-      </w:r>
-      <w:r>
-        <w:rPr>
-          <w:lang w:eastAsia="ko-KR"/>
-        </w:rPr>
-        <w:t>–</w:t>
-      </w:r>
-      <w:r>
-        <w:rPr>
-          <w:rFonts w:hint="eastAsia"/>
-          <w:lang w:eastAsia="ko-KR"/>
-        </w:rPr>
-        <w:t xml:space="preserve"> December 2029). </w:t>
-      </w:r>
-      <w:r>
-        <w:rPr>
-          <w:lang w:eastAsia="ko-KR"/>
-        </w:rPr>
-        <w:t>Collaborative Research: Phase I CAMEL-CN: Connecting Human Sensing with Math Understanding to Build Novel RF Datasets and Instructional Sequences</w:t>
-      </w:r>
-      <w:r>
-        <w:rPr>
-          <w:rFonts w:hint="eastAsia"/>
-          <w:lang w:eastAsia="ko-KR"/>
-        </w:rPr>
-        <w:t xml:space="preserve">. </w:t>
-      </w:r>
-      <w:r>
-        <w:t xml:space="preserve"> </w:t>
-      </w:r>
-      <w:r>
-        <w:rPr>
-          <w:b/>
-        </w:rPr>
-        <w:t>PENDING</w:t>
+          <w:b/>
+          <w:bCs/>
+          <w:lang w:eastAsia="ko-KR"/>
+        </w:rPr>
+      </w:pPr>
+      <w:r>
+        <w:rPr>
+          <w:b/>
+        </w:rPr>
+        <w:t>Hu, F. (Lead PI), Moon, J. (PI), &amp; Shen, X. (PI)</w:t>
+      </w:r>
+      <w:r>
+        <w:t xml:space="preserve"> (October 2026 - September 2029). CyberAI Innovation: Teaching AI as Target and Defender through a Full-Stack Immersive AI Ecosystem, National Science Foundation (NSF), Proposal 26-0572, proposed total amount $497,460.00, submission deadline April 3, 2026, submitted to sponsor March 10, 2026, </w:t>
+      </w:r>
+      <w:r>
+        <w:rPr>
+          <w:b/>
+        </w:rPr>
+        <w:t>SUBMITTED TO SPONSOR</w:t>
       </w:r>
     </w:p>
     <w:p>
@@ -4923,20 +4876,69 @@
         </w:pBdr>
         <w:ind w:left="720" w:hanging="720"/>
         <w:rPr>
-          <w:b/>
-        </w:rPr>
-      </w:pPr>
-      <w:r>
-        <w:t xml:space="preserve">Sumengen, A. (Lead PI), Chen, K. (PI), </w:t>
-      </w:r>
-      <w:r>
-        <w:rPr>
-          <w:b/>
-        </w:rPr>
-        <w:t>Moon, J. (PI)</w:t>
-      </w:r>
-      <w:r>
-        <w:t xml:space="preserve">, &amp; McCoy, T. (PI) (April 2027 - March 2029). A Biofeedback-Based Virtual Reality Implementation to Teach Metered Dose Inhaler Technique Education for Pediatric Asthma Patients: A Development and Feasibility Study. National Institutes of Health (NIH), total requested $399,946, submitted July 10, 2026, </w:t>
+          <w:lang w:eastAsia="ko-KR"/>
+        </w:rPr>
+      </w:pPr>
+      <w:r>
+        <w:rPr>
+          <w:rFonts w:hint="eastAsia"/>
+          <w:b/>
+          <w:bCs/>
+          <w:lang w:eastAsia="ko-KR"/>
+        </w:rPr>
+        <w:t xml:space="preserve">Moon, J. </w:t>
+      </w:r>
+      <w:r>
+        <w:rPr>
+          <w:rFonts w:hint="eastAsia"/>
+          <w:lang w:eastAsia="ko-KR"/>
+        </w:rPr>
+        <w:t>(Key Personnel</w:t>
+      </w:r>
+      <w:r>
+        <w:rPr>
+          <w:rFonts w:hint="eastAsia"/>
+          <w:b/>
+          <w:bCs/>
+          <w:lang w:eastAsia="ko-KR"/>
+        </w:rPr>
+        <w:t xml:space="preserve"> / </w:t>
+      </w:r>
+      <w:r>
+        <w:rPr>
+          <w:rFonts w:hint="eastAsia"/>
+          <w:lang w:eastAsia="ko-KR"/>
+        </w:rPr>
+        <w:t xml:space="preserve">External Evaluator). (January 2027 </w:t>
+      </w:r>
+      <w:r>
+        <w:rPr>
+          <w:lang w:eastAsia="ko-KR"/>
+        </w:rPr>
+        <w:t>–</w:t>
+      </w:r>
+      <w:r>
+        <w:rPr>
+          <w:rFonts w:hint="eastAsia"/>
+          <w:lang w:eastAsia="ko-KR"/>
+        </w:rPr>
+        <w:t xml:space="preserve"> December 2029). </w:t>
+      </w:r>
+      <w:r>
+        <w:rPr>
+          <w:lang w:eastAsia="ko-KR"/>
+        </w:rPr>
+        <w:t>Collaborative Research: Phase I CAMEL-CN: Connecting Human Sensing with Math Understanding to Build Novel RF Datasets and Instructional Sequences</w:t>
+      </w:r>
+      <w:r>
+        <w:rPr>
+          <w:rFonts w:hint="eastAsia"/>
+          <w:lang w:eastAsia="ko-KR"/>
+        </w:rPr>
+        <w:t xml:space="preserve">. </w:t>
+      </w:r>
+      <w:r>
+        <w:t xml:space="preserve"> </w:t>
       </w:r>
       <w:r>
         <w:rPr>
@@ -4956,17 +4958,26 @@
         </w:pBdr>
         <w:ind w:left="720" w:hanging="720"/>
         <w:rPr>
-          <w:lang w:eastAsia="ko-KR"/>
-        </w:rPr>
-      </w:pPr>
-    </w:p>
-    <w:p>
-      <w:pPr/>
-      <w:r>
-        <w:rPr>
-          <w:b/>
-        </w:rPr>
-        <w:t>Withdrawn ($598,139)</w:t>
+          <w:b/>
+        </w:rPr>
+      </w:pPr>
+      <w:r>
+        <w:t xml:space="preserve">Sumengen, A. (Lead PI), Chen, K. (PI), </w:t>
+      </w:r>
+      <w:r>
+        <w:rPr>
+          <w:b/>
+        </w:rPr>
+        <w:t>Moon, J. (PI)</w:t>
+      </w:r>
+      <w:r>
+        <w:t xml:space="preserve">, &amp; McCoy, T. (PI) (April 2027 - March 2029). A Biofeedback-Based Virtual Reality Implementation to Teach Metered Dose Inhaler Technique Education for Pediatric Asthma Patients: A Development and Feasibility Study. National Institutes of Health (NIH), total requested $399,946, submitted July 10, 2026, </w:t>
+      </w:r>
+      <w:r>
+        <w:rPr>
+          <w:b/>
+        </w:rPr>
+        <w:t>PENDING</w:t>
       </w:r>
     </w:p>
     <w:p>
@@ -4980,25 +4991,17 @@
         </w:pBdr>
         <w:ind w:left="720" w:hanging="720"/>
         <w:rPr>
-          <w:b/>
-          <w:bCs/>
-          <w:lang w:eastAsia="ko-KR"/>
-        </w:rPr>
-      </w:pPr>
-      <w:r>
-        <w:rPr>
-          <w:b/>
-        </w:rPr>
-        <w:t>Hu, F. (Lead PI), Moon, J. (PI), &amp; Shen, X. (PI)</w:t>
-      </w:r>
-      <w:r>
-        <w:t xml:space="preserve"> (April 2026 - March 2029). SaTS 2.0: EDU: Metaverse or Metaworst: Metaverse Security Education by Using Heutagogical and Challenge-based Pedagogy, National Science Foundation (NSF), Proposal 25-1293, proposed total amount $598,139.00, submitted September 29, 2025, withdrawn February 9, 2026, </w:t>
-      </w:r>
-      <w:r>
-        <w:rPr>
-          <w:b/>
-        </w:rPr>
-        <w:t>WITHDRAWN</w:t>
+          <w:lang w:eastAsia="ko-KR"/>
+        </w:rPr>
+      </w:pPr>
+    </w:p>
+    <w:p>
+      <w:pPr/>
+      <w:r>
+        <w:rPr>
+          <w:b/>
+        </w:rPr>
+        <w:t>Withdrawn ($598,139)</w:t>
       </w:r>
     </w:p>
     <w:p>
@@ -5014,19 +5017,23 @@
         <w:rPr>
           <w:b/>
           <w:bCs/>
-          <w:u w:val="single"/>
-          <w:lang w:eastAsia="ko-KR"/>
-        </w:rPr>
-      </w:pPr>
-      <w:r>
-        <w:rPr>
-          <w:rFonts w:hint="eastAsia"/>
-          <w:b/>
-          <w:bCs/>
-          <w:u w:val="single"/>
-          <w:lang w:eastAsia="ko-KR"/>
-        </w:rPr>
-        <w:t>Unfunded</w:t>
+          <w:lang w:eastAsia="ko-KR"/>
+        </w:rPr>
+      </w:pPr>
+      <w:r>
+        <w:rPr>
+          <w:b/>
+        </w:rPr>
+        <w:t>Hu, F. (Lead PI), Moon, J. (PI), &amp; Shen, X. (PI)</w:t>
+      </w:r>
+      <w:r>
+        <w:t xml:space="preserve"> (April 2026 - March 2029). SaTS 2.0: EDU: Metaverse or Metaworst: Metaverse Security Education by Using Heutagogical and Challenge-based Pedagogy, National Science Foundation (NSF), Proposal 25-1293, proposed total amount $598,139.00, submitted September 29, 2025, withdrawn February 9, 2026, </w:t>
+      </w:r>
+      <w:r>
+        <w:rPr>
+          <w:b/>
+        </w:rPr>
+        <w:t>WITHDRAWN</w:t>
       </w:r>
     </w:p>
     <w:p>
@@ -5042,160 +5049,19 @@
         <w:rPr>
           <w:b/>
           <w:bCs/>
-        </w:rPr>
-      </w:pPr>
-      <w:r>
-        <w:rPr>
-          <w:rFonts w:hint="eastAsia"/>
-          <w:b/>
-          <w:bCs/>
-          <w:lang w:eastAsia="ko-KR"/>
-        </w:rPr>
-        <w:t xml:space="preserve">Moon, J. (Lead PI) </w:t>
-      </w:r>
-      <w:r>
-        <w:rPr>
-          <w:rFonts w:hint="eastAsia"/>
-          <w:lang w:eastAsia="ko-KR"/>
-        </w:rPr>
-        <w:t>(</w:t>
-      </w:r>
-      <w:r>
-        <w:rPr>
-          <w:rFonts w:hint="eastAsia"/>
-          <w:lang w:eastAsia="ko-KR"/>
-        </w:rPr>
-        <w:t>August</w:t>
-      </w:r>
-      <w:r>
-        <w:rPr>
-          <w:rFonts w:hint="eastAsia"/>
-          <w:lang w:eastAsia="ko-KR"/>
-        </w:rPr>
-        <w:t xml:space="preserve"> 202</w:t>
-      </w:r>
-      <w:r>
-        <w:rPr>
-          <w:rFonts w:hint="eastAsia"/>
-          <w:lang w:eastAsia="ko-KR"/>
-        </w:rPr>
-        <w:t>6</w:t>
-      </w:r>
-      <w:r>
-        <w:rPr>
-          <w:rFonts w:hint="eastAsia"/>
-          <w:lang w:eastAsia="ko-KR"/>
-        </w:rPr>
-        <w:t xml:space="preserve"> </w:t>
-      </w:r>
-      <w:r>
-        <w:rPr>
-          <w:lang w:eastAsia="ko-KR"/>
-        </w:rPr>
-        <w:t>–</w:t>
-      </w:r>
-      <w:r>
-        <w:rPr>
-          <w:rFonts w:hint="eastAsia"/>
-          <w:lang w:eastAsia="ko-KR"/>
-        </w:rPr>
-        <w:t xml:space="preserve"> </w:t>
-      </w:r>
-      <w:r>
-        <w:rPr>
-          <w:rFonts w:hint="eastAsia"/>
-          <w:lang w:eastAsia="ko-KR"/>
-        </w:rPr>
-        <w:t>August</w:t>
-      </w:r>
-      <w:r>
-        <w:rPr>
-          <w:rFonts w:hint="eastAsia"/>
-          <w:lang w:eastAsia="ko-KR"/>
-        </w:rPr>
-        <w:t xml:space="preserve"> 202</w:t>
-      </w:r>
-      <w:r>
-        <w:rPr>
-          <w:rFonts w:hint="eastAsia"/>
-          <w:lang w:eastAsia="ko-KR"/>
-        </w:rPr>
-        <w:t>7</w:t>
-      </w:r>
-      <w:r>
-        <w:rPr>
-          <w:rFonts w:hint="eastAsia"/>
-          <w:lang w:eastAsia="ko-KR"/>
-        </w:rPr>
-        <w:t xml:space="preserve">). </w:t>
-      </w:r>
-      <w:r>
-        <w:rPr>
-          <w:lang w:eastAsia="ko-KR"/>
-        </w:rPr>
-        <w:t>Shift the Lens: Uncovering Students' Assets in Written Math Work via Multimodal AI</w:t>
-      </w:r>
-      <w:r>
-        <w:rPr>
-          <w:rFonts w:hint="eastAsia"/>
-          <w:lang w:eastAsia="ko-KR"/>
-        </w:rPr>
-        <w:t xml:space="preserve">, </w:t>
-      </w:r>
-      <w:r>
-        <w:rPr>
-          <w:lang w:eastAsia="ko-KR"/>
-        </w:rPr>
-        <w:t>Total</w:t>
-      </w:r>
-      <w:r>
-        <w:rPr>
-          <w:rFonts w:hint="eastAsia"/>
-          <w:lang w:eastAsia="ko-KR"/>
-        </w:rPr>
-        <w:t xml:space="preserve"> award $</w:t>
-      </w:r>
-      <w:r>
-        <w:rPr>
-          <w:rFonts w:hint="eastAsia"/>
-          <w:lang w:eastAsia="ko-KR"/>
-        </w:rPr>
-        <w:t>5</w:t>
-      </w:r>
-      <w:r>
-        <w:rPr>
-          <w:lang w:eastAsia="ko-KR"/>
-        </w:rPr>
-        <w:t>0,</w:t>
-      </w:r>
-      <w:r>
-        <w:rPr>
-          <w:rFonts w:hint="eastAsia"/>
-          <w:lang w:eastAsia="ko-KR"/>
-        </w:rPr>
-        <w:t>000</w:t>
-      </w:r>
-      <w:r>
-        <w:rPr>
-          <w:rFonts w:hint="eastAsia"/>
-          <w:lang w:eastAsia="ko-KR"/>
-        </w:rPr>
-        <w:t xml:space="preserve">, </w:t>
-      </w:r>
-      <w:r>
-        <w:rPr>
-          <w:rFonts w:hint="eastAsia"/>
-          <w:lang w:eastAsia="ko-KR"/>
-        </w:rPr>
-        <w:t xml:space="preserve">Advanced Innovative Math Solutions Collaboratory, </w:t>
-      </w:r>
-      <w:r>
-        <w:rPr>
-          <w:b/>
-          <w:bCs/>
           <w:u w:val="single"/>
-        </w:rPr>
-        <w:t>NOT FUNDED</w:t>
+          <w:lang w:eastAsia="ko-KR"/>
+        </w:rPr>
+      </w:pPr>
+      <w:r>
+        <w:rPr>
+          <w:rFonts w:hint="eastAsia"/>
+          <w:b/>
+          <w:bCs/>
+          <w:u w:val="single"/>
+          <w:lang w:eastAsia="ko-KR"/>
+        </w:rPr>
+        <w:t>Unfunded</w:t>
       </w:r>
     </w:p>
     <w:p>
@@ -5234,7 +5100,7 @@
           <w:rFonts w:hint="eastAsia"/>
           <w:lang w:eastAsia="ko-KR"/>
         </w:rPr>
-        <w:t>June</w:t>
+        <w:t>August</w:t>
       </w:r>
       <w:r>
         <w:rPr>
@@ -5275,7 +5141,7 @@
           <w:rFonts w:hint="eastAsia"/>
           <w:lang w:eastAsia="ko-KR"/>
         </w:rPr>
-        <w:t>May</w:t>
+        <w:t>August</w:t>
       </w:r>
       <w:r>
         <w:rPr>
@@ -5377,89 +5243,155 @@
           <w:between w:val="nil"/>
         </w:pBdr>
         <w:ind w:left="720" w:hanging="720"/>
-      </w:pPr>
-      <w:r>
-        <w:t>Suh, J.</w:t>
-      </w:r>
-      <w:r>
-        <w:rPr>
-          <w:b/>
-          <w:bCs/>
+        <w:rPr>
+          <w:b/>
+          <w:bCs/>
+        </w:rPr>
+      </w:pPr>
+      <w:r>
+        <w:rPr>
+          <w:rFonts w:hint="eastAsia"/>
+          <w:b/>
+          <w:bCs/>
+          <w:lang w:eastAsia="ko-KR"/>
+        </w:rPr>
+        <w:t xml:space="preserve">Moon, J. (Lead PI) </w:t>
+      </w:r>
+      <w:r>
+        <w:rPr>
+          <w:rFonts w:hint="eastAsia"/>
+          <w:lang w:eastAsia="ko-KR"/>
+        </w:rPr>
+        <w:t>(</w:t>
+      </w:r>
+      <w:r>
+        <w:rPr>
+          <w:rFonts w:hint="eastAsia"/>
+          <w:lang w:eastAsia="ko-KR"/>
+        </w:rPr>
+        <w:t>June</w:t>
+      </w:r>
+      <w:r>
+        <w:rPr>
+          <w:rFonts w:hint="eastAsia"/>
+          <w:lang w:eastAsia="ko-KR"/>
+        </w:rPr>
+        <w:t xml:space="preserve"> 202</w:t>
+      </w:r>
+      <w:r>
+        <w:rPr>
+          <w:rFonts w:hint="eastAsia"/>
+          <w:lang w:eastAsia="ko-KR"/>
+        </w:rPr>
+        <w:t>6</w:t>
+      </w:r>
+      <w:r>
+        <w:rPr>
+          <w:rFonts w:hint="eastAsia"/>
+          <w:lang w:eastAsia="ko-KR"/>
         </w:rPr>
         <w:t xml:space="preserve"> </w:t>
       </w:r>
       <w:r>
-        <w:t>(Lead PI),</w:t>
-      </w:r>
-      <w:r>
-        <w:rPr>
-          <w:b/>
-          <w:bCs/>
-        </w:rPr>
-        <w:t xml:space="preserve"> Moon, J. (PI),</w:t>
-      </w:r>
-      <w:r>
-        <w:t xml:space="preserve"> &amp; Worsley, M. (PI) (July 202</w:t>
-      </w:r>
-      <w:r>
-        <w:rPr>
-          <w:rFonts w:hint="eastAsia"/>
-          <w:lang w:eastAsia="ko-KR"/>
-        </w:rPr>
-        <w:t>6</w:t>
-      </w:r>
-      <w:r>
-        <w:t xml:space="preserve"> – June 202</w:t>
-      </w:r>
-      <w:r>
-        <w:rPr>
-          <w:rFonts w:hint="eastAsia"/>
-          <w:lang w:eastAsia="ko-KR"/>
-        </w:rPr>
-        <w:t>9</w:t>
-      </w:r>
-      <w:r>
+        <w:rPr>
+          <w:lang w:eastAsia="ko-KR"/>
+        </w:rPr>
+        <w:t>–</w:t>
+      </w:r>
+      <w:r>
+        <w:rPr>
+          <w:rFonts w:hint="eastAsia"/>
+          <w:lang w:eastAsia="ko-KR"/>
+        </w:rPr>
+        <w:t xml:space="preserve"> </w:t>
+      </w:r>
+      <w:r>
+        <w:rPr>
+          <w:rFonts w:hint="eastAsia"/>
+          <w:lang w:eastAsia="ko-KR"/>
+        </w:rPr>
+        <w:t>May</w:t>
+      </w:r>
+      <w:r>
+        <w:rPr>
+          <w:rFonts w:hint="eastAsia"/>
+          <w:lang w:eastAsia="ko-KR"/>
+        </w:rPr>
+        <w:t xml:space="preserve"> 202</w:t>
+      </w:r>
+      <w:r>
+        <w:rPr>
+          <w:rFonts w:hint="eastAsia"/>
+          <w:lang w:eastAsia="ko-KR"/>
+        </w:rPr>
+        <w:t>7</w:t>
+      </w:r>
+      <w:r>
+        <w:rPr>
+          <w:rFonts w:hint="eastAsia"/>
+          <w:lang w:eastAsia="ko-KR"/>
+        </w:rPr>
         <w:t xml:space="preserve">). </w:t>
       </w:r>
       <w:r>
         <w:rPr>
-          <w:i/>
-          <w:iCs/>
-        </w:rPr>
-        <w:t>Data-informed Adaptive Teaching Analytics (DATA): Leveraging Artificial Intelligence for Adaptive Teaching and Generative Learning</w:t>
-      </w:r>
-      <w:r>
-        <w:t>. National Science Foundation</w:t>
-      </w:r>
-      <w:r>
-        <w:rPr>
-          <w:rFonts w:hint="eastAsia"/>
-          <w:lang w:eastAsia="ko-KR"/>
-        </w:rPr>
-        <w:t>, RITEL</w:t>
-      </w:r>
-      <w:r>
-        <w:t>, Total award $</w:t>
-      </w:r>
-      <w:r>
-        <w:rPr>
-          <w:rFonts w:hint="eastAsia"/>
-          <w:lang w:eastAsia="ko-KR"/>
-        </w:rPr>
-        <w:t>109</w:t>
-      </w:r>
-      <w:r>
-        <w:t>,</w:t>
-      </w:r>
-      <w:r>
-        <w:rPr>
-          <w:rFonts w:hint="eastAsia"/>
-          <w:lang w:eastAsia="ko-KR"/>
-        </w:rPr>
-        <w:t>846</w:t>
-      </w:r>
-      <w:r>
+          <w:lang w:eastAsia="ko-KR"/>
+        </w:rPr>
+        <w:t>Shift the Lens: Uncovering Students' Assets in Written Math Work via Multimodal AI</w:t>
+      </w:r>
+      <w:r>
+        <w:rPr>
+          <w:rFonts w:hint="eastAsia"/>
+          <w:lang w:eastAsia="ko-KR"/>
+        </w:rPr>
         <w:t xml:space="preserve">, </w:t>
+      </w:r>
+      <w:r>
+        <w:rPr>
+          <w:lang w:eastAsia="ko-KR"/>
+        </w:rPr>
+        <w:t>Total</w:t>
+      </w:r>
+      <w:r>
+        <w:rPr>
+          <w:rFonts w:hint="eastAsia"/>
+          <w:lang w:eastAsia="ko-KR"/>
+        </w:rPr>
+        <w:t xml:space="preserve"> award $</w:t>
+      </w:r>
+      <w:r>
+        <w:rPr>
+          <w:rFonts w:hint="eastAsia"/>
+          <w:lang w:eastAsia="ko-KR"/>
+        </w:rPr>
+        <w:t>5</w:t>
+      </w:r>
+      <w:r>
+        <w:rPr>
+          <w:lang w:eastAsia="ko-KR"/>
+        </w:rPr>
+        <w:t>0,</w:t>
+      </w:r>
+      <w:r>
+        <w:rPr>
+          <w:rFonts w:hint="eastAsia"/>
+          <w:lang w:eastAsia="ko-KR"/>
+        </w:rPr>
+        <w:t>000</w:t>
+      </w:r>
+      <w:r>
+        <w:rPr>
+          <w:rFonts w:hint="eastAsia"/>
+          <w:lang w:eastAsia="ko-KR"/>
+        </w:rPr>
+        <w:t xml:space="preserve">, </w:t>
+      </w:r>
+      <w:r>
+        <w:rPr>
+          <w:rFonts w:hint="eastAsia"/>
+          <w:lang w:eastAsia="ko-KR"/>
+        </w:rPr>
+        <w:t xml:space="preserve">Advanced Innovative Math Solutions Collaboratory, </w:t>
       </w:r>
       <w:r>
         <w:rPr>
@@ -5480,102 +5412,89 @@
           <w:between w:val="nil"/>
         </w:pBdr>
         <w:ind w:left="720" w:hanging="720"/>
-        <w:rPr>
-          <w:b/>
-          <w:bCs/>
-          <w:lang w:eastAsia="ko-KR"/>
-        </w:rPr>
-      </w:pPr>
-      <w:r>
-        <w:rPr>
-          <w:rFonts w:hint="eastAsia"/>
-          <w:b/>
-          <w:bCs/>
-          <w:lang w:eastAsia="ko-KR"/>
-        </w:rPr>
-        <w:t xml:space="preserve">Moon, J. (Lead PI) </w:t>
-      </w:r>
-      <w:r>
-        <w:rPr>
-          <w:rFonts w:hint="eastAsia"/>
-          <w:lang w:eastAsia="ko-KR"/>
-        </w:rPr>
-        <w:t xml:space="preserve">(April 2026 </w:t>
-      </w:r>
-      <w:r>
-        <w:rPr>
-          <w:rFonts w:hint="eastAsia"/>
-          <w:lang w:eastAsia="ko-KR"/>
-        </w:rPr>
-        <w:t>–</w:t>
-      </w:r>
-      <w:r>
-        <w:rPr>
-          <w:rFonts w:hint="eastAsia"/>
-          <w:lang w:eastAsia="ko-KR"/>
-        </w:rPr>
-        <w:t xml:space="preserve"> March 2031</w:t>
-      </w:r>
-      <w:r>
-        <w:rPr>
-          <w:rFonts w:hint="eastAsia"/>
-          <w:lang w:eastAsia="ko-KR"/>
-        </w:rPr>
+      </w:pPr>
+      <w:r>
+        <w:t>Suh, J.</w:t>
+      </w:r>
+      <w:r>
+        <w:rPr>
+          <w:b/>
+          <w:bCs/>
+        </w:rPr>
+        <w:t xml:space="preserve"> </w:t>
+      </w:r>
+      <w:r>
+        <w:t>(Lead PI),</w:t>
+      </w:r>
+      <w:r>
+        <w:rPr>
+          <w:b/>
+          <w:bCs/>
+        </w:rPr>
+        <w:t xml:space="preserve"> Moon, J. (PI),</w:t>
+      </w:r>
+      <w:r>
+        <w:t xml:space="preserve"> &amp; Worsley, M. (PI) (July 202</w:t>
+      </w:r>
+      <w:r>
+        <w:rPr>
+          <w:rFonts w:hint="eastAsia"/>
+          <w:lang w:eastAsia="ko-KR"/>
+        </w:rPr>
+        <w:t>6</w:t>
+      </w:r>
+      <w:r>
+        <w:t xml:space="preserve"> – June 202</w:t>
+      </w:r>
+      <w:r>
+        <w:rPr>
+          <w:rFonts w:hint="eastAsia"/>
+          <w:lang w:eastAsia="ko-KR"/>
+        </w:rPr>
+        <w:t>9</w:t>
+      </w:r>
+      <w:r>
         <w:t xml:space="preserve">). </w:t>
       </w:r>
       <w:r>
         <w:rPr>
-          <w:rFonts w:hint="eastAsia"/>
-          <w:lang w:eastAsia="ko-KR"/>
-        </w:rPr>
-        <w:t xml:space="preserve">CAREER: </w:t>
-      </w:r>
-      <w:r>
-        <w:rPr>
-          <w:lang w:eastAsia="ko-KR"/>
-        </w:rPr>
-        <w:t>SCALE-XR - Co-Intelligent XR Learning Environment for Undergraduate STEM Education</w:t>
-      </w:r>
-      <w:r>
-        <w:rPr>
-          <w:rFonts w:hint="eastAsia"/>
-          <w:lang w:eastAsia="ko-KR"/>
-        </w:rPr>
+          <w:i/>
+          <w:iCs/>
+        </w:rPr>
+        <w:t>Data-informed Adaptive Teaching Analytics (DATA): Leveraging Artificial Intelligence for Adaptive Teaching and Generative Learning</w:t>
+      </w:r>
+      <w:r>
+        <w:t>. National Science Foundation</w:t>
+      </w:r>
+      <w:r>
+        <w:rPr>
+          <w:rFonts w:hint="eastAsia"/>
+          <w:lang w:eastAsia="ko-KR"/>
+        </w:rPr>
+        <w:t>, RITEL</w:t>
+      </w:r>
+      <w:r>
+        <w:t>, Total award $</w:t>
+      </w:r>
+      <w:r>
+        <w:rPr>
+          <w:rFonts w:hint="eastAsia"/>
+          <w:lang w:eastAsia="ko-KR"/>
+        </w:rPr>
+        <w:t>109</w:t>
+      </w:r>
+      <w:r>
+        <w:t>,</w:t>
+      </w:r>
+      <w:r>
+        <w:rPr>
+          <w:rFonts w:hint="eastAsia"/>
+          <w:lang w:eastAsia="ko-KR"/>
+        </w:rPr>
+        <w:t>846</w:t>
+      </w:r>
+      <w:r>
         <w:t xml:space="preserve">, </w:t>
-      </w:r>
-      <w:r>
-        <w:rPr>
-          <w:lang w:eastAsia="ko-KR"/>
-        </w:rPr>
-        <w:t>Total</w:t>
-      </w:r>
-      <w:r>
-        <w:rPr>
-          <w:rFonts w:hint="eastAsia"/>
-          <w:lang w:eastAsia="ko-KR"/>
-        </w:rPr>
-        <w:t xml:space="preserve"> award $</w:t>
-      </w:r>
-      <w:r>
-        <w:rPr>
-          <w:rFonts w:hint="eastAsia"/>
-          <w:lang w:eastAsia="ko-KR"/>
-        </w:rPr>
-        <w:t>602,382</w:t>
-      </w:r>
-      <w:r>
-        <w:rPr>
-          <w:rFonts w:hint="eastAsia"/>
-          <w:lang w:eastAsia="ko-KR"/>
-        </w:rPr>
-        <w:t>,</w:t>
-      </w:r>
-      <w:r>
-        <w:rPr>
-          <w:rFonts w:hint="eastAsia"/>
-          <w:lang w:eastAsia="ko-KR"/>
-        </w:rPr>
-        <w:t xml:space="preserve"> National Science Foundation, </w:t>
       </w:r>
       <w:r>
         <w:rPr>
@@ -5616,38 +5535,11 @@
           <w:rFonts w:hint="eastAsia"/>
           <w:lang w:eastAsia="ko-KR"/>
         </w:rPr>
-        <w:t>(</w:t>
-      </w:r>
-      <w:r>
-        <w:rPr>
-          <w:rFonts w:hint="eastAsia"/>
-          <w:lang w:eastAsia="ko-KR"/>
-        </w:rPr>
-        <w:t>January</w:t>
-      </w:r>
-      <w:r>
-        <w:rPr>
-          <w:rFonts w:hint="eastAsia"/>
-          <w:lang w:eastAsia="ko-KR"/>
-        </w:rPr>
-        <w:t xml:space="preserve"> 202</w:t>
-      </w:r>
-      <w:r>
-        <w:rPr>
-          <w:rFonts w:hint="eastAsia"/>
-          <w:lang w:eastAsia="ko-KR"/>
-        </w:rPr>
-        <w:t>6</w:t>
-      </w:r>
-      <w:r>
-        <w:rPr>
-          <w:rFonts w:hint="eastAsia"/>
-          <w:lang w:eastAsia="ko-KR"/>
-        </w:rPr>
-        <w:t xml:space="preserve"> </w:t>
-      </w:r>
-      <w:r>
-        <w:rPr>
+        <w:t xml:space="preserve">(April 2026 </w:t>
+      </w:r>
+      <w:r>
+        <w:rPr>
+          <w:rFonts w:hint="eastAsia"/>
           <w:lang w:eastAsia="ko-KR"/>
         </w:rPr>
         <w:t>–</w:t>
@@ -5657,42 +5549,27 @@
           <w:rFonts w:hint="eastAsia"/>
           <w:lang w:eastAsia="ko-KR"/>
         </w:rPr>
-        <w:t xml:space="preserve"> </w:t>
-      </w:r>
-      <w:r>
-        <w:rPr>
-          <w:rFonts w:hint="eastAsia"/>
-          <w:lang w:eastAsia="ko-KR"/>
-        </w:rPr>
-        <w:t>December</w:t>
-      </w:r>
-      <w:r>
-        <w:rPr>
-          <w:rFonts w:hint="eastAsia"/>
-          <w:lang w:eastAsia="ko-KR"/>
-        </w:rPr>
-        <w:t xml:space="preserve"> 202</w:t>
-      </w:r>
-      <w:r>
-        <w:rPr>
-          <w:rFonts w:hint="eastAsia"/>
-          <w:lang w:eastAsia="ko-KR"/>
-        </w:rPr>
-        <w:t xml:space="preserve">9). </w:t>
-      </w:r>
-      <w:proofErr w:type="spellStart"/>
-      <w:r>
-        <w:rPr>
-          <w:lang w:eastAsia="ko-KR"/>
-        </w:rPr>
-        <w:t>CyberSecure</w:t>
-      </w:r>
-      <w:proofErr w:type="spellEnd"/>
-      <w:r>
-        <w:rPr>
-          <w:lang w:eastAsia="ko-KR"/>
-        </w:rPr>
-        <w:t xml:space="preserve"> Minds: Generative AI-enhanced Microlearning Games to Teach Math and Science through Real-World Cybersecurity Scenarios for Marginalized Youth</w:t>
+        <w:t xml:space="preserve"> March 2031</w:t>
+      </w:r>
+      <w:r>
+        <w:rPr>
+          <w:rFonts w:hint="eastAsia"/>
+          <w:lang w:eastAsia="ko-KR"/>
+        </w:rPr>
+        <w:t xml:space="preserve">). </w:t>
+      </w:r>
+      <w:r>
+        <w:rPr>
+          <w:rFonts w:hint="eastAsia"/>
+          <w:lang w:eastAsia="ko-KR"/>
+        </w:rPr>
+        <w:t xml:space="preserve">CAREER: </w:t>
+      </w:r>
+      <w:r>
+        <w:rPr>
+          <w:lang w:eastAsia="ko-KR"/>
+        </w:rPr>
+        <w:t>SCALE-XR - Co-Intelligent XR Learning Environment for Undergraduate STEM Education</w:t>
       </w:r>
       <w:r>
         <w:rPr>
@@ -5719,23 +5596,21 @@
           <w:rFonts w:hint="eastAsia"/>
           <w:lang w:eastAsia="ko-KR"/>
         </w:rPr>
-        <w:t xml:space="preserve">425,000. William T. Grant Scholars </w:t>
-      </w:r>
-      <w:r>
-        <w:rPr>
-          <w:rFonts w:hint="eastAsia"/>
-          <w:lang w:eastAsia="ko-KR"/>
-        </w:rPr>
-        <w:t>Program,</w:t>
-      </w:r>
-      <w:r>
-        <w:rPr>
-          <w:rFonts w:hint="eastAsia"/>
-          <w:b/>
-          <w:bCs/>
-          <w:lang w:eastAsia="ko-KR"/>
-        </w:rPr>
-        <w:t xml:space="preserve"> </w:t>
+        <w:t>602,382</w:t>
+      </w:r>
+      <w:r>
+        <w:rPr>
+          <w:rFonts w:hint="eastAsia"/>
+          <w:lang w:eastAsia="ko-KR"/>
+        </w:rPr>
+        <w:t>,</w:t>
+      </w:r>
+      <w:r>
+        <w:rPr>
+          <w:rFonts w:hint="eastAsia"/>
+          <w:lang w:eastAsia="ko-KR"/>
+        </w:rPr>
+        <w:t xml:space="preserve"> National Science Foundation, </w:t>
       </w:r>
       <w:r>
         <w:rPr>

</xml_diff>

<commit_message>
Update CV docx, site-data, research analytics, and abstracts (autopush 2026-08-12 09:00)
</commit_message>
<xml_diff>
--- a/CV_202605_MOON.docx
+++ b/CV_202605_MOON.docx
@@ -4862,7 +4862,7 @@
         <w:rPr>
           <w:b/>
         </w:rPr>
-        <w:t>SUBMITTED TO SPONSOR</w:t>
+        <w:t>PENDING</w:t>
       </w:r>
     </w:p>
     <w:p>
@@ -4994,47 +4994,6 @@
           <w:lang w:eastAsia="ko-KR"/>
         </w:rPr>
       </w:pPr>
-    </w:p>
-    <w:p>
-      <w:pPr/>
-      <w:r>
-        <w:rPr>
-          <w:b/>
-        </w:rPr>
-        <w:t>Withdrawn ($598,139)</w:t>
-      </w:r>
-    </w:p>
-    <w:p>
-      <w:pPr>
-        <w:pBdr>
-          <w:top w:val="nil"/>
-          <w:left w:val="nil"/>
-          <w:bottom w:val="nil"/>
-          <w:right w:val="nil"/>
-          <w:between w:val="nil"/>
-        </w:pBdr>
-        <w:ind w:left="720" w:hanging="720"/>
-        <w:rPr>
-          <w:b/>
-          <w:bCs/>
-          <w:lang w:eastAsia="ko-KR"/>
-        </w:rPr>
-      </w:pPr>
-      <w:r>
-        <w:rPr>
-          <w:b/>
-        </w:rPr>
-        <w:t>Hu, F. (Lead PI), Moon, J. (PI), &amp; Shen, X. (PI)</w:t>
-      </w:r>
-      <w:r>
-        <w:t xml:space="preserve"> (April 2026 - March 2029). SaTS 2.0: EDU: Metaverse or Metaworst: Metaverse Security Education by Using Heutagogical and Challenge-based Pedagogy, National Science Foundation (NSF), Proposal 25-1293, proposed total amount $598,139.00, submitted September 29, 2025, withdrawn February 9, 2026, </w:t>
-      </w:r>
-      <w:r>
-        <w:rPr>
-          <w:b/>
-        </w:rPr>
-        <w:t>WITHDRAWN</w:t>
-      </w:r>
     </w:p>
     <w:p>
       <w:pPr>

</xml_diff>

<commit_message>
Update CV docx, site-data, research analytics, and abstracts (autopush 2026-08-16 18:52)
</commit_message>
<xml_diff>
--- a/CV_202605_MOON.docx
+++ b/CV_202605_MOON.docx
@@ -6142,90 +6142,93 @@
         </w:rPr>
       </w:pPr>
       <w:r>
+        <w:t>Shi, Y. (Lead PI),</w:t>
+      </w:r>
+      <w:r>
+        <w:rPr>
+          <w:b/>
+          <w:bCs/>
+        </w:rPr>
+        <w:t xml:space="preserve"> </w:t>
+      </w:r>
+      <w:r>
+        <w:t>Du, J. (Lead PI)</w:t>
+      </w:r>
+      <w:r>
+        <w:rPr>
+          <w:b/>
+          <w:bCs/>
+        </w:rPr>
+        <w:t xml:space="preserve">, </w:t>
+      </w:r>
+      <w:r>
+        <w:rPr>
+          <w:b/>
+          <w:bCs/>
+        </w:rPr>
+        <w:t>Moon, J</w:t>
+      </w:r>
+      <w:r>
+        <w:rPr>
+          <w:b/>
+          <w:bCs/>
+        </w:rPr>
+        <w:t>. (Lead PI),</w:t>
+      </w:r>
+      <w:r>
+        <w:t xml:space="preserve"> Myers, L. </w:t>
+      </w:r>
+      <w:r>
+        <w:t>(PI)</w:t>
+      </w:r>
+      <w:r>
+        <w:rPr>
+          <w:b/>
+          <w:bCs/>
+        </w:rPr>
+        <w:t xml:space="preserve"> </w:t>
+      </w:r>
+      <w:r>
+        <w:t>(</w:t>
+      </w:r>
+      <w:r>
+        <w:t>August</w:t>
+      </w:r>
+      <w:r>
+        <w:t xml:space="preserve"> 202</w:t>
+      </w:r>
+      <w:r>
+        <w:rPr>
+          <w:rFonts w:hint="eastAsia"/>
+          <w:lang w:eastAsia="ko-KR"/>
+        </w:rPr>
+        <w:t>5</w:t>
+      </w:r>
+      <w:r>
+        <w:t xml:space="preserve"> – </w:t>
+      </w:r>
+      <w:r>
+        <w:t>July</w:t>
+      </w:r>
+      <w:r>
+        <w:t xml:space="preserve"> 202</w:t>
+      </w:r>
+      <w:r>
+        <w:rPr>
+          <w:rFonts w:hint="eastAsia"/>
+          <w:lang w:eastAsia="ko-KR"/>
+        </w:rPr>
+        <w:t>8</w:t>
+      </w:r>
+      <w:r>
+        <w:t xml:space="preserve">). </w:t>
+      </w:r>
+      <w:r>
+        <w:t xml:space="preserve">Collaborative Research: RITEL: Preparing First Responders for Future Robotic </w:t>
+      </w:r>
+      <w:r>
         <w:lastRenderedPageBreak/>
-        <w:t>Shi, Y. (Lead PI),</w:t>
-      </w:r>
-      <w:r>
-        <w:rPr>
-          <w:b/>
-          <w:bCs/>
-        </w:rPr>
-        <w:t xml:space="preserve"> </w:t>
-      </w:r>
-      <w:r>
-        <w:t>Du, J. (Lead PI)</w:t>
-      </w:r>
-      <w:r>
-        <w:rPr>
-          <w:b/>
-          <w:bCs/>
-        </w:rPr>
-        <w:t xml:space="preserve">, </w:t>
-      </w:r>
-      <w:r>
-        <w:rPr>
-          <w:b/>
-          <w:bCs/>
-        </w:rPr>
-        <w:t>Moon, J</w:t>
-      </w:r>
-      <w:r>
-        <w:rPr>
-          <w:b/>
-          <w:bCs/>
-        </w:rPr>
-        <w:t>. (Lead PI),</w:t>
-      </w:r>
-      <w:r>
-        <w:t xml:space="preserve"> Myers, L. </w:t>
-      </w:r>
-      <w:r>
-        <w:t>(PI)</w:t>
-      </w:r>
-      <w:r>
-        <w:rPr>
-          <w:b/>
-          <w:bCs/>
-        </w:rPr>
-        <w:t xml:space="preserve"> </w:t>
-      </w:r>
-      <w:r>
-        <w:t>(</w:t>
-      </w:r>
-      <w:r>
-        <w:t>August</w:t>
-      </w:r>
-      <w:r>
-        <w:t xml:space="preserve"> 202</w:t>
-      </w:r>
-      <w:r>
-        <w:rPr>
-          <w:rFonts w:hint="eastAsia"/>
-          <w:lang w:eastAsia="ko-KR"/>
-        </w:rPr>
-        <w:t>5</w:t>
-      </w:r>
-      <w:r>
-        <w:t xml:space="preserve"> – </w:t>
-      </w:r>
-      <w:r>
-        <w:t>July</w:t>
-      </w:r>
-      <w:r>
-        <w:t xml:space="preserve"> 202</w:t>
-      </w:r>
-      <w:r>
-        <w:rPr>
-          <w:rFonts w:hint="eastAsia"/>
-          <w:lang w:eastAsia="ko-KR"/>
-        </w:rPr>
-        <w:t>8</w:t>
-      </w:r>
-      <w:r>
-        <w:t xml:space="preserve">). </w:t>
-      </w:r>
-      <w:r>
-        <w:t>Collaborative Research: RITEL: Preparing First Responders for Future Robotic Technologies through Distributed and Embodied Virtual Learning Environment</w:t>
+        <w:t>Technologies through Distributed and Embodied Virtual Learning Environment</w:t>
       </w:r>
       <w:r>
         <w:t xml:space="preserve">. </w:t>
@@ -7865,17 +7868,7 @@
           <w:i/>
           <w:iCs/>
         </w:rPr>
-        <w:t xml:space="preserve">, IF </w:t>
-      </w:r>
-      <w:r>
-        <w:rPr>
-          <w:b/>
-          <w:bCs/>
-          <w:i/>
-          <w:iCs/>
-        </w:rPr>
-        <w:lastRenderedPageBreak/>
-        <w:t xml:space="preserve">= </w:t>
+        <w:t xml:space="preserve">, IF = </w:t>
       </w:r>
       <w:r>
         <w:rPr>
@@ -7995,7 +7988,21 @@
           <w:rFonts w:hint="eastAsia"/>
           <w:lang w:eastAsia="ko-KR"/>
         </w:rPr>
-        <w:t xml:space="preserve"> J., &amp; Kwok, M. (Minor revision, 2026). </w:t>
+        <w:t xml:space="preserve"> J., &amp; Kwok, M. (</w:t>
+      </w:r>
+      <w:r>
+        <w:rPr>
+          <w:rFonts w:hint="eastAsia"/>
+          <w:lang w:eastAsia="ko-KR"/>
+        </w:rPr>
+        <w:t>Accepted</w:t>
+      </w:r>
+      <w:r>
+        <w:rPr>
+          <w:rFonts w:hint="eastAsia"/>
+          <w:lang w:eastAsia="ko-KR"/>
+        </w:rPr>
+        <w:t xml:space="preserve">, 2026). </w:t>
       </w:r>
       <w:r>
         <w:rPr>
@@ -8008,6 +8015,7 @@
           <w:rFonts w:hint="eastAsia"/>
           <w:lang w:eastAsia="ko-KR"/>
         </w:rPr>
+        <w:lastRenderedPageBreak/>
         <w:t>s</w:t>
       </w:r>
       <w:r>
@@ -48415,6 +48423,14 @@
 </file>
 
 <file path=customXml/item2.xml><?xml version="1.0" encoding="utf-8"?>
+<p:properties xmlns:p="http://schemas.microsoft.com/office/2006/metadata/properties" xmlns:xsi="http://www.w3.org/2001/XMLSchema-instance" xmlns:pc="http://schemas.microsoft.com/office/infopath/2007/PartnerControls">
+  <documentManagement>
+    <_activity xmlns="6a4161d7-0e07-4bb5-8cdd-a87a7602a445" xsi:nil="true"/>
+  </documentManagement>
+</p:properties>
+</file>
+
+<file path=customXml/item3.xml><?xml version="1.0" encoding="utf-8"?>
 <ct:contentTypeSchema xmlns:ct="http://schemas.microsoft.com/office/2006/metadata/contentType" xmlns:ma="http://schemas.microsoft.com/office/2006/metadata/properties/metaAttributes" ct:_="" ma:_="" ma:contentTypeName="Document" ma:contentTypeID="0x010100FA54A6C77D34E44FB33E0184D6F9C744" ma:contentTypeVersion="18" ma:contentTypeDescription="Create a new document." ma:contentTypeScope="" ma:versionID="9c28832654d292338743ef1185d20088">
   <xsd:schema xmlns:xsd="http://www.w3.org/2001/XMLSchema" xmlns:xs="http://www.w3.org/2001/XMLSchema" xmlns:p="http://schemas.microsoft.com/office/2006/metadata/properties" xmlns:ns3="6a4161d7-0e07-4bb5-8cdd-a87a7602a445" xmlns:ns4="30453fea-43c5-4a0b-a417-834186a09351" targetNamespace="http://schemas.microsoft.com/office/2006/metadata/properties" ma:root="true" ma:fieldsID="aadbfd92c1be4506f2c2f9fc093c4d0b" ns3:_="" ns4:_="">
     <xsd:import namespace="6a4161d7-0e07-4bb5-8cdd-a87a7602a445"/>
@@ -48667,16 +48683,8 @@
 </ct:contentTypeSchema>
 </file>
 
-<file path=customXml/item3.xml><?xml version="1.0" encoding="utf-8"?>
+<file path=customXml/item4.xml><?xml version="1.0" encoding="utf-8"?>
 <b:Sources xmlns:b="http://schemas.openxmlformats.org/officeDocument/2006/bibliography" xmlns="http://schemas.openxmlformats.org/officeDocument/2006/bibliography" SelectedStyle="\APASixthEditionOfficeOnline.xsl" StyleName="APA" Version="6"/>
-</file>
-
-<file path=customXml/item4.xml><?xml version="1.0" encoding="utf-8"?>
-<p:properties xmlns:p="http://schemas.microsoft.com/office/2006/metadata/properties" xmlns:xsi="http://www.w3.org/2001/XMLSchema-instance" xmlns:pc="http://schemas.microsoft.com/office/infopath/2007/PartnerControls">
-  <documentManagement>
-    <_activity xmlns="6a4161d7-0e07-4bb5-8cdd-a87a7602a445" xsi:nil="true"/>
-  </documentManagement>
-</p:properties>
 </file>
 
 <file path=customXml/itemProps1.xml><?xml version="1.0" encoding="utf-8"?>
@@ -48688,6 +48696,16 @@
 </file>
 
 <file path=customXml/itemProps2.xml><?xml version="1.0" encoding="utf-8"?>
+<ds:datastoreItem xmlns:ds="http://schemas.openxmlformats.org/officeDocument/2006/customXml" ds:itemID="{7C24488D-A36D-4C56-91ED-753F5C27550A}">
+  <ds:schemaRefs>
+    <ds:schemaRef ds:uri="http://schemas.microsoft.com/office/2006/metadata/properties"/>
+    <ds:schemaRef ds:uri="http://schemas.microsoft.com/office/infopath/2007/PartnerControls"/>
+    <ds:schemaRef ds:uri="6a4161d7-0e07-4bb5-8cdd-a87a7602a445"/>
+  </ds:schemaRefs>
+</ds:datastoreItem>
+</file>
+
+<file path=customXml/itemProps3.xml><?xml version="1.0" encoding="utf-8"?>
 <ds:datastoreItem xmlns:ds="http://schemas.openxmlformats.org/officeDocument/2006/customXml" ds:itemID="{44F19B31-977D-45A4-A748-143054BB9DA7}">
   <ds:schemaRefs>
     <ds:schemaRef ds:uri="http://schemas.microsoft.com/office/2006/metadata/contentType"/>
@@ -48706,20 +48724,10 @@
 </ds:datastoreItem>
 </file>
 
-<file path=customXml/itemProps3.xml><?xml version="1.0" encoding="utf-8"?>
+<file path=customXml/itemProps4.xml><?xml version="1.0" encoding="utf-8"?>
 <ds:datastoreItem xmlns:ds="http://schemas.openxmlformats.org/officeDocument/2006/customXml" ds:itemID="{E286DD98-9466-43F6-BF97-336366EE54DF}">
   <ds:schemaRefs>
     <ds:schemaRef ds:uri="http://schemas.openxmlformats.org/officeDocument/2006/bibliography"/>
   </ds:schemaRefs>
 </ds:datastoreItem>
-</file>
-
-<file path=customXml/itemProps4.xml><?xml version="1.0" encoding="utf-8"?>
-<ds:datastoreItem xmlns:ds="http://schemas.openxmlformats.org/officeDocument/2006/customXml" ds:itemID="{7C24488D-A36D-4C56-91ED-753F5C27550A}">
-  <ds:schemaRefs>
-    <ds:schemaRef ds:uri="http://schemas.microsoft.com/office/2006/metadata/properties"/>
-    <ds:schemaRef ds:uri="http://schemas.microsoft.com/office/infopath/2007/PartnerControls"/>
-    <ds:schemaRef ds:uri="6a4161d7-0e07-4bb5-8cdd-a87a7602a445"/>
-  </ds:schemaRefs>
-</ds:datastoreItem>
 </file>
</xml_diff>

<commit_message>
Update CV docx, site-data, research analytics, and abstracts (autopush 2026-08-18 09:00)
</commit_message>
<xml_diff>
--- a/CV_202605_MOON.docx
+++ b/CV_202605_MOON.docx
@@ -7988,21 +7988,7 @@
           <w:rFonts w:hint="eastAsia"/>
           <w:lang w:eastAsia="ko-KR"/>
         </w:rPr>
-        <w:t xml:space="preserve"> J., &amp; Kwok, M. (</w:t>
-      </w:r>
-      <w:r>
-        <w:rPr>
-          <w:rFonts w:hint="eastAsia"/>
-          <w:lang w:eastAsia="ko-KR"/>
-        </w:rPr>
-        <w:t>Accepted</w:t>
-      </w:r>
-      <w:r>
-        <w:rPr>
-          <w:rFonts w:hint="eastAsia"/>
-          <w:lang w:eastAsia="ko-KR"/>
-        </w:rPr>
-        <w:t xml:space="preserve">, 2026). </w:t>
+        <w:t xml:space="preserve"> J., &amp; Kwok, M. (2026). </w:t>
       </w:r>
       <w:r>
         <w:rPr>
@@ -8015,14 +8001,20 @@
           <w:rFonts w:hint="eastAsia"/>
           <w:lang w:eastAsia="ko-KR"/>
         </w:rPr>
+        <w:t>s</w:t>
+      </w:r>
+      <w:r>
+        <w:rPr>
+          <w:lang w:eastAsia="ko-KR"/>
+        </w:rPr>
+        <w:t xml:space="preserve">olutions, and </w:t>
+      </w:r>
+      <w:r>
+        <w:rPr>
+          <w:lang w:eastAsia="ko-KR"/>
+        </w:rPr>
         <w:lastRenderedPageBreak/>
-        <w:t>s</w:t>
-      </w:r>
-      <w:r>
-        <w:rPr>
-          <w:lang w:eastAsia="ko-KR"/>
-        </w:rPr>
-        <w:t xml:space="preserve">olutions, and PD </w:t>
+        <w:t xml:space="preserve">PD </w:t>
       </w:r>
       <w:r>
         <w:rPr>
@@ -8144,6 +8136,22 @@
         </w:rPr>
         <w:t>Cogent Education</w:t>
       </w:r>
+      <w:r>
+        <w:rPr>
+          <w:rFonts w:hint="eastAsia"/>
+          <w:lang w:eastAsia="ko-KR"/>
+        </w:rPr>
+        <w:t xml:space="preserve"> </w:t>
+      </w:r>
+      <w:hyperlink r:id="rId15" w:history="1">
+        <w:r>
+          <w:rPr>
+            <w:rStyle w:val="Hyperlink"/>
+            <w:lang w:eastAsia="ko-KR"/>
+          </w:rPr>
+          <w:t>https://doi.org/10.1080/2331186X.2026.2721038</w:t>
+        </w:r>
+      </w:hyperlink>
       <w:r>
         <w:rPr>
           <w:rFonts w:hint="eastAsia"/>
@@ -8300,7 +8308,23 @@
           <w:rFonts w:hint="eastAsia"/>
           <w:lang w:eastAsia="ko-KR"/>
         </w:rPr>
-        <w:t>Awoyemi, I., Moon, J., Abu, S., &amp; Song, S. (</w:t>
+        <w:t xml:space="preserve">Awoyemi, I., </w:t>
+      </w:r>
+      <w:r>
+        <w:rPr>
+          <w:rFonts w:hint="eastAsia"/>
+          <w:b/>
+          <w:bCs/>
+          <w:lang w:eastAsia="ko-KR"/>
+        </w:rPr>
+        <w:t>Moon, J</w:t>
+      </w:r>
+      <w:r>
+        <w:rPr>
+          <w:rFonts w:hint="eastAsia"/>
+          <w:lang w:eastAsia="ko-KR"/>
+        </w:rPr>
+        <w:t>., Abu, S., &amp; Song, S. (</w:t>
       </w:r>
       <w:r>
         <w:rPr>
@@ -8488,7 +8512,7 @@
         </w:rPr>
         <w:t xml:space="preserve"> </w:t>
       </w:r>
-      <w:hyperlink r:id="rId15" w:tooltip="Original URL: https://doi.org/10.1080/10494820.2026.2709674. Click or tap if you trust this link." w:history="1">
+      <w:hyperlink r:id="rId16" w:tooltip="Original URL: https://doi.org/10.1080/10494820.2026.2709674. Click or tap if you trust this link." w:history="1">
         <w:r>
           <w:rPr>
             <w:rStyle w:val="Hyperlink"/>
@@ -8913,7 +8937,7 @@
         </w:rPr>
         <w:t xml:space="preserve">. </w:t>
       </w:r>
-      <w:hyperlink r:id="rId16" w:history="1">
+      <w:hyperlink r:id="rId17" w:history="1">
         <w:r>
           <w:rPr>
             <w:rStyle w:val="Hyperlink"/>
@@ -9185,7 +9209,7 @@
         </w:rPr>
         <w:t xml:space="preserve"> </w:t>
       </w:r>
-      <w:hyperlink r:id="rId17" w:history="1">
+      <w:hyperlink r:id="rId18" w:history="1">
         <w:r>
           <w:rPr>
             <w:rStyle w:val="Hyperlink"/>
@@ -9484,7 +9508,7 @@
         </w:rPr>
         <w:t xml:space="preserve">. </w:t>
       </w:r>
-      <w:hyperlink r:id="rId18" w:history="1">
+      <w:hyperlink r:id="rId19" w:history="1">
         <w:r>
           <w:rPr>
             <w:rStyle w:val="Hyperlink"/>
@@ -9870,7 +9894,7 @@
         </w:rPr>
         <w:t xml:space="preserve"> </w:t>
       </w:r>
-      <w:hyperlink r:id="rId19" w:history="1">
+      <w:hyperlink r:id="rId20" w:history="1">
         <w:r>
           <w:rPr>
             <w:rStyle w:val="Hyperlink"/>
@@ -10167,7 +10191,7 @@
         </w:rPr>
         <w:t xml:space="preserve"> </w:t>
       </w:r>
-      <w:hyperlink r:id="rId20" w:tooltip="Original URL: http://dx.doi.org/10.1080/10508422.2026.2685014. Click or tap if you trust this link." w:history="1">
+      <w:hyperlink r:id="rId21" w:tooltip="Original URL: http://dx.doi.org/10.1080/10508422.2026.2685014. Click or tap if you trust this link." w:history="1">
         <w:r>
           <w:rPr>
             <w:rStyle w:val="Hyperlink"/>
@@ -10500,7 +10524,7 @@
         </w:rPr>
         <w:t xml:space="preserve"> </w:t>
       </w:r>
-      <w:hyperlink r:id="rId21" w:history="1">
+      <w:hyperlink r:id="rId22" w:history="1">
         <w:r>
           <w:rPr>
             <w:rStyle w:val="Hyperlink"/>
@@ -10769,7 +10793,7 @@
         </w:rPr>
         <w:t xml:space="preserve"> </w:t>
       </w:r>
-      <w:hyperlink r:id="rId22" w:history="1">
+      <w:hyperlink r:id="rId23" w:history="1">
         <w:r>
           <w:rPr>
             <w:rStyle w:val="Hyperlink"/>
@@ -10853,7 +10877,7 @@
       <w:r>
         <w:t>. </w:t>
       </w:r>
-      <w:hyperlink r:id="rId23" w:history="1">
+      <w:hyperlink r:id="rId24" w:history="1">
         <w:r>
           <w:rPr>
             <w:rStyle w:val="Hyperlink"/>
@@ -11048,7 +11072,7 @@
         </w:rPr>
         <w:t xml:space="preserve">. </w:t>
       </w:r>
-      <w:hyperlink r:id="rId24" w:tgtFrame="_blank" w:history="1">
+      <w:hyperlink r:id="rId25" w:tgtFrame="_blank" w:history="1">
         <w:r>
           <w:rPr>
             <w:rStyle w:val="Hyperlink"/>
@@ -11424,7 +11448,7 @@
         </w:rPr>
         <w:t xml:space="preserve"> </w:t>
       </w:r>
-      <w:hyperlink r:id="rId25" w:history="1">
+      <w:hyperlink r:id="rId26" w:history="1">
         <w:r>
           <w:rPr>
             <w:rStyle w:val="Hyperlink"/>
@@ -11753,7 +11777,7 @@
         </w:rPr>
         <w:t xml:space="preserve"> </w:t>
       </w:r>
-      <w:hyperlink r:id="rId26" w:history="1">
+      <w:hyperlink r:id="rId27" w:history="1">
         <w:r>
           <w:rPr>
             <w:rStyle w:val="Hyperlink"/>
@@ -12180,7 +12204,7 @@
         </w:rPr>
         <w:t xml:space="preserve"> </w:t>
       </w:r>
-      <w:hyperlink r:id="rId27" w:history="1">
+      <w:hyperlink r:id="rId28" w:history="1">
         <w:r>
           <w:rPr>
             <w:rStyle w:val="Hyperlink"/>
@@ -12468,7 +12492,7 @@
         </w:rPr>
         <w:t xml:space="preserve"> </w:t>
       </w:r>
-      <w:hyperlink r:id="rId28" w:history="1">
+      <w:hyperlink r:id="rId29" w:history="1">
         <w:r>
           <w:rPr>
             <w:rStyle w:val="Hyperlink"/>
@@ -12945,7 +12969,7 @@
         </w:rPr>
         <w:t xml:space="preserve"> </w:t>
       </w:r>
-      <w:hyperlink r:id="rId29" w:history="1">
+      <w:hyperlink r:id="rId30" w:history="1">
         <w:r>
           <w:rPr>
             <w:rStyle w:val="Hyperlink"/>
@@ -13333,7 +13357,7 @@
         </w:rPr>
         <w:t xml:space="preserve"> </w:t>
       </w:r>
-      <w:hyperlink r:id="rId30" w:history="1">
+      <w:hyperlink r:id="rId31" w:history="1">
         <w:r>
           <w:rPr>
             <w:rStyle w:val="Hyperlink"/>
@@ -13755,7 +13779,7 @@
         </w:rPr>
         <w:t xml:space="preserve">Computers &amp; Education </w:t>
       </w:r>
-      <w:hyperlink r:id="rId31" w:history="1">
+      <w:hyperlink r:id="rId32" w:history="1">
         <w:r>
           <w:rPr>
             <w:rStyle w:val="Hyperlink"/>
@@ -14047,7 +14071,7 @@
         </w:rPr>
         <w:t xml:space="preserve">(1), 192-215. </w:t>
       </w:r>
-      <w:hyperlink r:id="rId32" w:history="1">
+      <w:hyperlink r:id="rId33" w:history="1">
         <w:r>
           <w:rPr>
             <w:rStyle w:val="Hyperlink"/>
@@ -14449,7 +14473,7 @@
         </w:rPr>
         <w:t xml:space="preserve"> </w:t>
       </w:r>
-      <w:hyperlink r:id="rId33" w:tgtFrame="_blank" w:tooltip="Persistent link using digital object identifier" w:history="1">
+      <w:hyperlink r:id="rId34" w:tgtFrame="_blank" w:tooltip="Persistent link using digital object identifier" w:history="1">
         <w:r>
           <w:rPr>
             <w:rStyle w:val="Hyperlink"/>
@@ -14715,7 +14739,7 @@
         </w:rPr>
         <w:t xml:space="preserve"> </w:t>
       </w:r>
-      <w:hyperlink r:id="rId34" w:history="1">
+      <w:hyperlink r:id="rId35" w:history="1">
         <w:r>
           <w:rPr>
             <w:rStyle w:val="Hyperlink"/>
@@ -14947,7 +14971,7 @@
         </w:rPr>
         <w:t xml:space="preserve">Smart Learning Environments </w:t>
       </w:r>
-      <w:hyperlink r:id="rId35" w:history="1">
+      <w:hyperlink r:id="rId36" w:history="1">
         <w:r>
           <w:rPr>
             <w:rStyle w:val="Hyperlink"/>
@@ -15080,7 +15104,7 @@
         </w:rPr>
         <w:t xml:space="preserve"> </w:t>
       </w:r>
-      <w:hyperlink r:id="rId36" w:history="1">
+      <w:hyperlink r:id="rId37" w:history="1">
         <w:r>
           <w:rPr>
             <w:rStyle w:val="Hyperlink"/>
@@ -15301,7 +15325,7 @@
         </w:rPr>
         <w:t xml:space="preserve"> </w:t>
       </w:r>
-      <w:hyperlink r:id="rId37" w:history="1">
+      <w:hyperlink r:id="rId38" w:history="1">
         <w:r>
           <w:rPr>
             <w:rStyle w:val="Hyperlink"/>
@@ -15498,7 +15522,7 @@
         </w:rPr>
         <w:t xml:space="preserve"> </w:t>
       </w:r>
-      <w:hyperlink r:id="rId38" w:history="1">
+      <w:hyperlink r:id="rId39" w:history="1">
         <w:r>
           <w:rPr>
             <w:rStyle w:val="Hyperlink"/>
@@ -15682,7 +15706,7 @@
         </w:rPr>
         <w:t xml:space="preserve"> </w:t>
       </w:r>
-      <w:hyperlink r:id="rId39" w:history="1">
+      <w:hyperlink r:id="rId40" w:history="1">
         <w:r>
           <w:rPr>
             <w:rStyle w:val="Hyperlink"/>
@@ -15987,7 +16011,7 @@
         </w:rPr>
         <w:t xml:space="preserve"> </w:t>
       </w:r>
-      <w:hyperlink r:id="rId40" w:history="1">
+      <w:hyperlink r:id="rId41" w:history="1">
         <w:r>
           <w:rPr>
             <w:rStyle w:val="Hyperlink"/>
@@ -16187,7 +16211,7 @@
         </w:rPr>
         <w:t xml:space="preserve"> </w:t>
       </w:r>
-      <w:hyperlink r:id="rId41" w:history="1">
+      <w:hyperlink r:id="rId42" w:history="1">
         <w:r>
           <w:rPr>
             <w:rStyle w:val="Hyperlink"/>
@@ -16349,7 +16373,7 @@
       <w:r>
         <w:t xml:space="preserve"> </w:t>
       </w:r>
-      <w:hyperlink r:id="rId42" w:history="1">
+      <w:hyperlink r:id="rId43" w:history="1">
         <w:r>
           <w:rPr>
             <w:rStyle w:val="Hyperlink"/>
@@ -16618,7 +16642,7 @@
         </w:rPr>
         <w:t xml:space="preserve"> </w:t>
       </w:r>
-      <w:hyperlink r:id="rId43" w:history="1">
+      <w:hyperlink r:id="rId44" w:history="1">
         <w:r>
           <w:rPr>
             <w:rStyle w:val="Hyperlink"/>
@@ -16715,7 +16739,7 @@
         </w:rPr>
         <w:t xml:space="preserve"> </w:t>
       </w:r>
-      <w:hyperlink r:id="rId44" w:history="1">
+      <w:hyperlink r:id="rId45" w:history="1">
         <w:r>
           <w:rPr>
             <w:rStyle w:val="Hyperlink"/>
@@ -16926,7 +16950,7 @@
       <w:r>
         <w:t xml:space="preserve"> </w:t>
       </w:r>
-      <w:hyperlink r:id="rId45" w:history="1">
+      <w:hyperlink r:id="rId46" w:history="1">
         <w:r>
           <w:rPr>
             <w:rStyle w:val="Hyperlink"/>
@@ -17125,7 +17149,7 @@
         </w:rPr>
         <w:t xml:space="preserve"> </w:t>
       </w:r>
-      <w:hyperlink r:id="rId46" w:history="1">
+      <w:hyperlink r:id="rId47" w:history="1">
         <w:r>
           <w:rPr>
             <w:rStyle w:val="Hyperlink"/>
@@ -17219,7 +17243,7 @@
       <w:r>
         <w:t xml:space="preserve"> </w:t>
       </w:r>
-      <w:hyperlink r:id="rId47" w:history="1">
+      <w:hyperlink r:id="rId48" w:history="1">
         <w:r>
           <w:rPr>
             <w:rStyle w:val="Hyperlink"/>
@@ -17399,7 +17423,7 @@
         </w:rPr>
         <w:t xml:space="preserve"> </w:t>
       </w:r>
-      <w:hyperlink r:id="rId48" w:history="1">
+      <w:hyperlink r:id="rId49" w:history="1">
         <w:r>
           <w:rPr>
             <w:rStyle w:val="Hyperlink"/>
@@ -17499,7 +17523,7 @@
       <w:r>
         <w:t xml:space="preserve"> </w:t>
       </w:r>
-      <w:hyperlink r:id="rId49" w:history="1">
+      <w:hyperlink r:id="rId50" w:history="1">
         <w:r>
           <w:rPr>
             <w:rStyle w:val="Hyperlink"/>
@@ -17666,7 +17690,7 @@
       <w:r>
         <w:t xml:space="preserve"> </w:t>
       </w:r>
-      <w:hyperlink r:id="rId50" w:history="1">
+      <w:hyperlink r:id="rId51" w:history="1">
         <w:r>
           <w:rPr>
             <w:rStyle w:val="Hyperlink"/>
@@ -17835,7 +17859,7 @@
       <w:r>
         <w:t xml:space="preserve"> </w:t>
       </w:r>
-      <w:hyperlink r:id="rId51" w:history="1">
+      <w:hyperlink r:id="rId52" w:history="1">
         <w:r>
           <w:rPr>
             <w:rStyle w:val="Hyperlink"/>
@@ -18021,7 +18045,7 @@
       <w:r>
         <w:t xml:space="preserve"> </w:t>
       </w:r>
-      <w:hyperlink r:id="rId52" w:history="1">
+      <w:hyperlink r:id="rId53" w:history="1">
         <w:r>
           <w:rPr>
             <w:rStyle w:val="Hyperlink"/>
@@ -18208,7 +18232,7 @@
       <w:r>
         <w:t xml:space="preserve">, 3101-3113. </w:t>
       </w:r>
-      <w:hyperlink r:id="rId53" w:history="1">
+      <w:hyperlink r:id="rId54" w:history="1">
         <w:r>
           <w:rPr>
             <w:rStyle w:val="Hyperlink"/>
@@ -18442,7 +18466,7 @@
       <w:r>
         <w:t xml:space="preserve"> </w:t>
       </w:r>
-      <w:hyperlink r:id="rId54" w:history="1">
+      <w:hyperlink r:id="rId55" w:history="1">
         <w:r>
           <w:rPr>
             <w:rStyle w:val="Hyperlink"/>
@@ -18614,7 +18638,7 @@
       <w:r>
         <w:t xml:space="preserve"> </w:t>
       </w:r>
-      <w:hyperlink r:id="rId55" w:history="1">
+      <w:hyperlink r:id="rId56" w:history="1">
         <w:r>
           <w:rPr>
             <w:rStyle w:val="Hyperlink"/>
@@ -18845,7 +18869,7 @@
         </w:rPr>
         <w:t xml:space="preserve"> </w:t>
       </w:r>
-      <w:hyperlink r:id="rId56" w:history="1">
+      <w:hyperlink r:id="rId57" w:history="1">
         <w:r>
           <w:rPr>
             <w:rStyle w:val="Hyperlink"/>
@@ -19016,7 +19040,7 @@
         </w:rPr>
         <w:t xml:space="preserve">. </w:t>
       </w:r>
-      <w:hyperlink r:id="rId57" w:history="1">
+      <w:hyperlink r:id="rId58" w:history="1">
         <w:r>
           <w:rPr>
             <w:rStyle w:val="Hyperlink"/>
@@ -19262,7 +19286,7 @@
       <w:r>
         <w:t xml:space="preserve">(3), 11-31. </w:t>
       </w:r>
-      <w:hyperlink r:id="rId58" w:history="1">
+      <w:hyperlink r:id="rId59" w:history="1">
         <w:r>
           <w:rPr>
             <w:rStyle w:val="Hyperlink"/>
@@ -19505,7 +19529,7 @@
       <w:r>
         <w:t xml:space="preserve">. </w:t>
       </w:r>
-      <w:hyperlink r:id="rId59" w:history="1">
+      <w:hyperlink r:id="rId60" w:history="1">
         <w:r>
           <w:rPr>
             <w:rStyle w:val="Hyperlink"/>
@@ -19689,7 +19713,7 @@
         </w:rPr>
         <w:t xml:space="preserve"> </w:t>
       </w:r>
-      <w:hyperlink r:id="rId60" w:history="1">
+      <w:hyperlink r:id="rId61" w:history="1">
         <w:r>
           <w:rPr>
             <w:rStyle w:val="Hyperlink"/>
@@ -19898,7 +19922,7 @@
       <w:r>
         <w:t xml:space="preserve">(1), 49-62. </w:t>
       </w:r>
-      <w:hyperlink r:id="rId61" w:history="1">
+      <w:hyperlink r:id="rId62" w:history="1">
         <w:r>
           <w:rPr>
             <w:rStyle w:val="Hyperlink"/>
@@ -20142,7 +20166,7 @@
         </w:rPr>
         <w:t xml:space="preserve">, 1777–1798. </w:t>
       </w:r>
-      <w:hyperlink r:id="rId62" w:history="1">
+      <w:hyperlink r:id="rId63" w:history="1">
         <w:r>
           <w:rPr>
             <w:rStyle w:val="Hyperlink"/>
@@ -20386,7 +20410,7 @@
       <w:r>
         <w:t xml:space="preserve"> </w:t>
       </w:r>
-      <w:hyperlink r:id="rId63" w:history="1">
+      <w:hyperlink r:id="rId64" w:history="1">
         <w:r>
           <w:rPr>
             <w:rStyle w:val="Hyperlink"/>
@@ -20620,7 +20644,7 @@
         </w:rPr>
         <w:t xml:space="preserve">. </w:t>
       </w:r>
-      <w:hyperlink r:id="rId64" w:history="1">
+      <w:hyperlink r:id="rId65" w:history="1">
         <w:r>
           <w:rPr>
             <w:rStyle w:val="Hyperlink"/>
@@ -20842,7 +20866,7 @@
       <w:r>
         <w:t xml:space="preserve">(5), 1766-1784. </w:t>
       </w:r>
-      <w:hyperlink r:id="rId65" w:history="1">
+      <w:hyperlink r:id="rId66" w:history="1">
         <w:r>
           <w:rPr>
             <w:rStyle w:val="Hyperlink"/>
@@ -21053,7 +21077,7 @@
         </w:rPr>
         <w:t xml:space="preserve">, 1931-1959. </w:t>
       </w:r>
-      <w:hyperlink r:id="rId66" w:history="1">
+      <w:hyperlink r:id="rId67" w:history="1">
         <w:r>
           <w:rPr>
             <w:rStyle w:val="Hyperlink"/>
@@ -21279,7 +21303,7 @@
         </w:rPr>
         <w:t>,</w:t>
       </w:r>
-      <w:hyperlink r:id="rId67">
+      <w:hyperlink r:id="rId68">
         <w:r>
           <w:rPr>
             <w:color w:val="212121"/>
@@ -21301,7 +21325,7 @@
         </w:rPr>
         <w:t xml:space="preserve">, 39–63. </w:t>
       </w:r>
-      <w:hyperlink r:id="rId68" w:history="1">
+      <w:hyperlink r:id="rId69" w:history="1">
         <w:r>
           <w:rPr>
             <w:rStyle w:val="Hyperlink"/>
@@ -21517,7 +21541,7 @@
       <w:r>
         <w:t xml:space="preserve">(3), 310-335. </w:t>
       </w:r>
-      <w:hyperlink r:id="rId69" w:history="1">
+      <w:hyperlink r:id="rId70" w:history="1">
         <w:r>
           <w:rPr>
             <w:rStyle w:val="Hyperlink"/>
@@ -21686,7 +21710,7 @@
       <w:r>
         <w:t xml:space="preserve"> </w:t>
       </w:r>
-      <w:hyperlink r:id="rId70" w:history="1">
+      <w:hyperlink r:id="rId71" w:history="1">
         <w:r>
           <w:rPr>
             <w:rStyle w:val="Hyperlink"/>
@@ -21921,7 +21945,7 @@
       <w:r>
         <w:t xml:space="preserve">(4), 863-885. </w:t>
       </w:r>
-      <w:hyperlink r:id="rId71" w:history="1">
+      <w:hyperlink r:id="rId72" w:history="1">
         <w:r>
           <w:rPr>
             <w:rStyle w:val="Hyperlink"/>
@@ -22143,7 +22167,7 @@
       <w:r>
         <w:t xml:space="preserve"> </w:t>
       </w:r>
-      <w:hyperlink r:id="rId72" w:history="1">
+      <w:hyperlink r:id="rId73" w:history="1">
         <w:r>
           <w:rPr>
             <w:rStyle w:val="Hyperlink"/>
@@ -22271,7 +22295,7 @@
       <w:r>
         <w:t>(4), 728-741. </w:t>
       </w:r>
-      <w:hyperlink r:id="rId73" w:history="1">
+      <w:hyperlink r:id="rId74" w:history="1">
         <w:r>
           <w:rPr>
             <w:rStyle w:val="Hyperlink"/>
@@ -22494,7 +22518,7 @@
       <w:r>
         <w:t>(3), 53-62. </w:t>
       </w:r>
-      <w:hyperlink r:id="rId74" w:history="1">
+      <w:hyperlink r:id="rId75" w:history="1">
         <w:r>
           <w:rPr>
             <w:rStyle w:val="Hyperlink"/>
@@ -22777,7 +22801,7 @@
         </w:rPr>
         <w:t xml:space="preserve">(3), 637-681. </w:t>
       </w:r>
-      <w:hyperlink r:id="rId75" w:history="1">
+      <w:hyperlink r:id="rId76" w:history="1">
         <w:r>
           <w:rPr>
             <w:rStyle w:val="Hyperlink"/>
@@ -22823,7 +22847,7 @@
       <w:r>
         <w:t xml:space="preserve">(3), 293-313. </w:t>
       </w:r>
-      <w:hyperlink r:id="rId76" w:history="1">
+      <w:hyperlink r:id="rId77" w:history="1">
         <w:r>
           <w:rPr>
             <w:rStyle w:val="Hyperlink"/>
@@ -22872,7 +22896,7 @@
       <w:r>
         <w:t xml:space="preserve">(10), 594-603. </w:t>
       </w:r>
-      <w:hyperlink r:id="rId77" w:history="1">
+      <w:hyperlink r:id="rId78" w:history="1">
         <w:r>
           <w:rPr>
             <w:rStyle w:val="Hyperlink"/>
@@ -23001,7 +23025,7 @@
       <w:r>
         <w:t xml:space="preserve">. </w:t>
       </w:r>
-      <w:hyperlink r:id="rId78" w:history="1">
+      <w:hyperlink r:id="rId79" w:history="1">
         <w:r>
           <w:rPr>
             <w:rStyle w:val="Hyperlink"/>
@@ -23742,7 +23766,7 @@
       <w:r>
         <w:t xml:space="preserve">. Advances in Game-Based Learning, Springer, Cham. </w:t>
       </w:r>
-      <w:hyperlink r:id="rId79" w:history="1">
+      <w:hyperlink r:id="rId80" w:history="1">
         <w:r>
           <w:rPr>
             <w:rStyle w:val="Hyperlink"/>
@@ -23807,7 +23831,7 @@
       <w:r>
         <w:t xml:space="preserve">, Lecture Note Series in Educational Technology. Springer, Singapore. </w:t>
       </w:r>
-      <w:hyperlink r:id="rId80">
+      <w:hyperlink r:id="rId81">
         <w:r>
           <w:rPr>
             <w:color w:val="1155CC"/>
@@ -23875,7 +23899,7 @@
       <w:r>
         <w:t xml:space="preserve">, Springer, Singapore. </w:t>
       </w:r>
-      <w:hyperlink r:id="rId81">
+      <w:hyperlink r:id="rId82">
         <w:r>
           <w:rPr>
             <w:color w:val="0563C1"/>
@@ -23937,7 +23961,7 @@
       <w:r>
         <w:t xml:space="preserve"> and Intelligence, Springer, Singapore. </w:t>
       </w:r>
-      <w:hyperlink r:id="rId82">
+      <w:hyperlink r:id="rId83">
         <w:r>
           <w:rPr>
             <w:color w:val="0563C1"/>
@@ -24143,7 +24167,7 @@
         </w:rPr>
         <w:t xml:space="preserve">. Advance online publication. </w:t>
       </w:r>
-      <w:hyperlink r:id="rId83" w:history="1">
+      <w:hyperlink r:id="rId84" w:history="1">
         <w:r>
           <w:rPr>
             <w:rStyle w:val="Hyperlink"/>
@@ -24221,7 +24245,7 @@
         </w:rPr>
         <w:t xml:space="preserve">Generative AI-Enhanced Chatbot Design for Constructionist Gaming. In: Plass, J.L., Ochoa, X. (eds) Serious Games. JCSG 2024. Lecture Notes in Computer Science, vol 15259. Springer, Cham. </w:t>
       </w:r>
-      <w:hyperlink r:id="rId84" w:history="1">
+      <w:hyperlink r:id="rId85" w:history="1">
         <w:r>
           <w:rPr>
             <w:rStyle w:val="Hyperlink"/>
@@ -24337,7 +24361,7 @@
         </w:rPr>
         <w:t xml:space="preserve">(1), 16–19. </w:t>
       </w:r>
-      <w:hyperlink r:id="rId85" w:history="1">
+      <w:hyperlink r:id="rId86" w:history="1">
         <w:r>
           <w:rPr>
             <w:rStyle w:val="Hyperlink"/>
@@ -24424,7 +24448,7 @@
         </w:rPr>
         <w:t xml:space="preserve">(1), 32–35. </w:t>
       </w:r>
-      <w:hyperlink r:id="rId86" w:history="1">
+      <w:hyperlink r:id="rId87" w:history="1">
         <w:r>
           <w:rPr>
             <w:rStyle w:val="Hyperlink"/>
@@ -24510,7 +24534,7 @@
         </w:rPr>
         <w:t xml:space="preserve">(1), 109–111. Retrieved from </w:t>
       </w:r>
-      <w:hyperlink r:id="rId87" w:history="1">
+      <w:hyperlink r:id="rId88" w:history="1">
         <w:r>
           <w:rPr>
             <w:rStyle w:val="Hyperlink"/>
@@ -24602,7 +24626,7 @@
         </w:rPr>
         <w:t xml:space="preserve">(1), 112–113. Retrieved from </w:t>
       </w:r>
-      <w:hyperlink r:id="rId88" w:history="1">
+      <w:hyperlink r:id="rId89" w:history="1">
         <w:r>
           <w:rPr>
             <w:rStyle w:val="Hyperlink"/>
@@ -24688,7 +24712,7 @@
         </w:rPr>
         <w:t xml:space="preserve">(1), 21–25. Retrieved from </w:t>
       </w:r>
-      <w:hyperlink r:id="rId89" w:history="1">
+      <w:hyperlink r:id="rId90" w:history="1">
         <w:r>
           <w:rPr>
             <w:rStyle w:val="Hyperlink"/>
@@ -24760,7 +24784,7 @@
         </w:rPr>
         <w:t xml:space="preserve">, Fujisawa, Japan. </w:t>
       </w:r>
-      <w:hyperlink r:id="rId90" w:history="1">
+      <w:hyperlink r:id="rId91" w:history="1">
         <w:r>
           <w:rPr>
             <w:rStyle w:val="Hyperlink"/>
@@ -24806,7 +24830,7 @@
         </w:rPr>
         <w:t xml:space="preserve"> (pp. 889-892). International Society of the Learning Sciences. </w:t>
       </w:r>
-      <w:hyperlink r:id="rId91" w:history="1">
+      <w:hyperlink r:id="rId92" w:history="1">
         <w:r>
           <w:rPr>
             <w:rStyle w:val="Hyperlink"/>
@@ -24865,7 +24889,7 @@
         </w:rPr>
         <w:t xml:space="preserve"> </w:t>
       </w:r>
-      <w:hyperlink r:id="rId92" w:history="1">
+      <w:hyperlink r:id="rId93" w:history="1">
         <w:r>
           <w:rPr>
             <w:rStyle w:val="Hyperlink"/>
@@ -24930,7 +24954,7 @@
         </w:rPr>
         <w:t xml:space="preserve"> </w:t>
       </w:r>
-      <w:hyperlink r:id="rId93" w:history="1">
+      <w:hyperlink r:id="rId94" w:history="1">
         <w:r>
           <w:rPr>
             <w:rStyle w:val="Hyperlink"/>
@@ -25015,7 +25039,7 @@
         </w:rPr>
         <w:t xml:space="preserve">In: Fang X. (eds) HCI in Games: Serious and Immersive Games. HCI 2021. Lecture Notes in Computer Science, vol 12790. Springer, Cham. </w:t>
       </w:r>
-      <w:hyperlink r:id="rId94" w:history="1">
+      <w:hyperlink r:id="rId95" w:history="1">
         <w:r>
           <w:rPr>
             <w:rStyle w:val="Hyperlink"/>
@@ -25066,7 +25090,7 @@
         </w:rPr>
         <w:t xml:space="preserve"> </w:t>
       </w:r>
-      <w:hyperlink r:id="rId95" w:history="1">
+      <w:hyperlink r:id="rId96" w:history="1">
         <w:r>
           <w:rPr>
             <w:rStyle w:val="Hyperlink"/>
@@ -25109,7 +25133,7 @@
       <w:r>
         <w:t xml:space="preserve"> </w:t>
       </w:r>
-      <w:hyperlink r:id="rId96" w:history="1">
+      <w:hyperlink r:id="rId97" w:history="1">
         <w:r>
           <w:rPr>
             <w:rStyle w:val="Hyperlink"/>
@@ -25158,7 +25182,7 @@
       <w:r>
         <w:t xml:space="preserve"> </w:t>
       </w:r>
-      <w:hyperlink r:id="rId97" w:history="1">
+      <w:hyperlink r:id="rId98" w:history="1">
         <w:r>
           <w:rPr>
             <w:rStyle w:val="Hyperlink"/>
@@ -25228,7 +25252,7 @@
       <w:r>
         <w:t xml:space="preserve"> </w:t>
       </w:r>
-      <w:hyperlink r:id="rId98" w:history="1">
+      <w:hyperlink r:id="rId99" w:history="1">
         <w:r>
           <w:rPr>
             <w:rStyle w:val="Hyperlink"/>
@@ -25662,7 +25686,7 @@
         </w:rPr>
         <w:t> (pp. 1305-1309). Chesapeake, VA: Association for the Advancement of Computing in Education (AACE). Retrieved from </w:t>
       </w:r>
-      <w:hyperlink r:id="rId99">
+      <w:hyperlink r:id="rId100">
         <w:r>
           <w:rPr>
             <w:color w:val="0563C1"/>
@@ -46387,8 +46411,8 @@
       </w:pPr>
     </w:p>
     <w:sectPr>
-      <w:headerReference w:type="default" r:id="rId100"/>
-      <w:footerReference w:type="default" r:id="rId101"/>
+      <w:headerReference w:type="default" r:id="rId101"/>
+      <w:footerReference w:type="default" r:id="rId102"/>
       <w:pgSz w:w="12240" w:h="15840"/>
       <w:pgMar w:top="1701" w:right="1440" w:bottom="1440" w:left="1440" w:header="0" w:footer="720" w:gutter="0"/>
       <w:pgNumType w:start="1"/>
@@ -48423,6 +48447,10 @@
 </file>
 
 <file path=customXml/item2.xml><?xml version="1.0" encoding="utf-8"?>
+<b:Sources xmlns:b="http://schemas.openxmlformats.org/officeDocument/2006/bibliography" xmlns="http://schemas.openxmlformats.org/officeDocument/2006/bibliography" SelectedStyle="\APASixthEditionOfficeOnline.xsl" StyleName="APA" Version="6"/>
+</file>
+
+<file path=customXml/item3.xml><?xml version="1.0" encoding="utf-8"?>
 <p:properties xmlns:p="http://schemas.microsoft.com/office/2006/metadata/properties" xmlns:xsi="http://www.w3.org/2001/XMLSchema-instance" xmlns:pc="http://schemas.microsoft.com/office/infopath/2007/PartnerControls">
   <documentManagement>
     <_activity xmlns="6a4161d7-0e07-4bb5-8cdd-a87a7602a445" xsi:nil="true"/>
@@ -48430,7 +48458,7 @@
 </p:properties>
 </file>
 
-<file path=customXml/item3.xml><?xml version="1.0" encoding="utf-8"?>
+<file path=customXml/item4.xml><?xml version="1.0" encoding="utf-8"?>
 <ct:contentTypeSchema xmlns:ct="http://schemas.microsoft.com/office/2006/metadata/contentType" xmlns:ma="http://schemas.microsoft.com/office/2006/metadata/properties/metaAttributes" ct:_="" ma:_="" ma:contentTypeName="Document" ma:contentTypeID="0x010100FA54A6C77D34E44FB33E0184D6F9C744" ma:contentTypeVersion="18" ma:contentTypeDescription="Create a new document." ma:contentTypeScope="" ma:versionID="9c28832654d292338743ef1185d20088">
   <xsd:schema xmlns:xsd="http://www.w3.org/2001/XMLSchema" xmlns:xs="http://www.w3.org/2001/XMLSchema" xmlns:p="http://schemas.microsoft.com/office/2006/metadata/properties" xmlns:ns3="6a4161d7-0e07-4bb5-8cdd-a87a7602a445" xmlns:ns4="30453fea-43c5-4a0b-a417-834186a09351" targetNamespace="http://schemas.microsoft.com/office/2006/metadata/properties" ma:root="true" ma:fieldsID="aadbfd92c1be4506f2c2f9fc093c4d0b" ns3:_="" ns4:_="">
     <xsd:import namespace="6a4161d7-0e07-4bb5-8cdd-a87a7602a445"/>
@@ -48683,10 +48711,6 @@
 </ct:contentTypeSchema>
 </file>
 
-<file path=customXml/item4.xml><?xml version="1.0" encoding="utf-8"?>
-<b:Sources xmlns:b="http://schemas.openxmlformats.org/officeDocument/2006/bibliography" xmlns="http://schemas.openxmlformats.org/officeDocument/2006/bibliography" SelectedStyle="\APASixthEditionOfficeOnline.xsl" StyleName="APA" Version="6"/>
-</file>
-
 <file path=customXml/itemProps1.xml><?xml version="1.0" encoding="utf-8"?>
 <ds:datastoreItem xmlns:ds="http://schemas.openxmlformats.org/officeDocument/2006/customXml" ds:itemID="{F79F8074-1665-45F2-8B05-A95EA1C1A155}">
   <ds:schemaRefs>
@@ -48696,6 +48720,14 @@
 </file>
 
 <file path=customXml/itemProps2.xml><?xml version="1.0" encoding="utf-8"?>
+<ds:datastoreItem xmlns:ds="http://schemas.openxmlformats.org/officeDocument/2006/customXml" ds:itemID="{E286DD98-9466-43F6-BF97-336366EE54DF}">
+  <ds:schemaRefs>
+    <ds:schemaRef ds:uri="http://schemas.openxmlformats.org/officeDocument/2006/bibliography"/>
+  </ds:schemaRefs>
+</ds:datastoreItem>
+</file>
+
+<file path=customXml/itemProps3.xml><?xml version="1.0" encoding="utf-8"?>
 <ds:datastoreItem xmlns:ds="http://schemas.openxmlformats.org/officeDocument/2006/customXml" ds:itemID="{7C24488D-A36D-4C56-91ED-753F5C27550A}">
   <ds:schemaRefs>
     <ds:schemaRef ds:uri="http://schemas.microsoft.com/office/2006/metadata/properties"/>
@@ -48705,7 +48737,7 @@
 </ds:datastoreItem>
 </file>
 
-<file path=customXml/itemProps3.xml><?xml version="1.0" encoding="utf-8"?>
+<file path=customXml/itemProps4.xml><?xml version="1.0" encoding="utf-8"?>
 <ds:datastoreItem xmlns:ds="http://schemas.openxmlformats.org/officeDocument/2006/customXml" ds:itemID="{44F19B31-977D-45A4-A748-143054BB9DA7}">
   <ds:schemaRefs>
     <ds:schemaRef ds:uri="http://schemas.microsoft.com/office/2006/metadata/contentType"/>
@@ -48722,12 +48754,4 @@
     <ds:schemaRef ds:uri="http://schemas.microsoft.com/internal/obd"/>
   </ds:schemaRefs>
 </ds:datastoreItem>
-</file>
-
-<file path=customXml/itemProps4.xml><?xml version="1.0" encoding="utf-8"?>
-<ds:datastoreItem xmlns:ds="http://schemas.openxmlformats.org/officeDocument/2006/customXml" ds:itemID="{E286DD98-9466-43F6-BF97-336366EE54DF}">
-  <ds:schemaRefs>
-    <ds:schemaRef ds:uri="http://schemas.openxmlformats.org/officeDocument/2006/bibliography"/>
-  </ds:schemaRefs>
-</ds:datastoreItem>
 </file>
</xml_diff>

<commit_message>
Update CV docx, site-data, research analytics, and abstracts (autopush 2026-08-26 09:00)
</commit_message>
<xml_diff>
--- a/CV_202605_MOON.docx
+++ b/CV_202605_MOON.docx
@@ -1,6 +1,6 @@
 
 <file path=word/document.xml><?xml version="1.0" encoding="utf-8"?>
-<w:document xmlns:wpc="http://schemas.microsoft.com/office/word/2010/wordprocessingCanvas" xmlns:cx="http://schemas.microsoft.com/office/drawing/2014/chartex" xmlns:cx1="http://schemas.microsoft.com/office/drawing/2015/9/8/chartex" xmlns:cx2="http://schemas.microsoft.com/office/drawing/2015/10/21/chartex" xmlns:cx3="http://schemas.microsoft.com/office/drawing/2016/5/9/chartex" xmlns:cx4="http://schemas.microsoft.com/office/drawing/2016/5/10/chartex" xmlns:cx5="http://schemas.microsoft.com/office/drawing/2016/5/11/chartex" xmlns:cx6="http://schemas.microsoft.com/office/drawing/2016/5/12/chartex" xmlns:cx7="http://schemas.microsoft.com/office/drawing/2016/5/13/chartex" xmlns:cx8="http://schemas.microsoft.com/office/drawing/2016/5/14/chartex" xmlns:mc="http://schemas.openxmlformats.org/markup-compatibility/2006" xmlns:aink="http://schemas.microsoft.com/office/drawing/2016/ink" xmlns:am3d="http://schemas.microsoft.com/office/drawing/2017/model3d" xmlns:o="urn:schemas-microsoft-com:office:office" xmlns:oel="http://schemas.microsoft.com/office/2019/extlst" xmlns:r="http://schemas.openxmlformats.org/officeDocument/2006/relationships" xmlns:m="http://schemas.openxmlformats.org/officeDocument/2006/math" xmlns:v="urn:schemas-microsoft-com:vml" xmlns:wp14="http://schemas.microsoft.com/office/word/2010/wordprocessingDrawing" xmlns:wp="http://schemas.openxmlformats.org/drawingml/2006/wordprocessingDrawing" xmlns:w10="urn:schemas-microsoft-com:office:word" xmlns:w="http://schemas.openxmlformats.org/wordprocessingml/2006/main" xmlns:w14="http://schemas.microsoft.com/office/word/2010/wordml" xmlns:w15="http://schemas.microsoft.com/office/word/2012/wordml" xmlns:w16cei="http://schemas.microsoft.com/office/word/2026/wordml/cei" xmlns:w16cex="http://schemas.microsoft.com/office/word/2018/wordml/cex" xmlns:w16cid="http://schemas.microsoft.com/office/word/2016/wordml/cid" xmlns:w16="http://schemas.microsoft.com/office/word/2018/wordml" xmlns:w16du="http://schemas.microsoft.com/office/word/2023/wordml/word16du" xmlns:w16sdtdh="http://schemas.microsoft.com/office/word/2020/wordml/sdtdatahash" xmlns:w16sdtfl="http://schemas.microsoft.com/office/word/2024/wordml/sdtformatlock" xmlns:w16se="http://schemas.microsoft.com/office/word/2015/wordml/symex" xmlns:wpg="http://schemas.microsoft.com/office/word/2010/wordprocessingGroup" xmlns:wpi="http://schemas.microsoft.com/office/word/2010/wordprocessingInk" xmlns:wne="http://schemas.microsoft.com/office/word/2006/wordml" xmlns:wps="http://schemas.microsoft.com/office/word/2010/wordprocessingShape" mc:Ignorable="w14 w15 w16se w16cid w16 w16cex w16sdtdh w16sdtfl w16du wp14">
+<w:document xmlns:wpc="http://schemas.microsoft.com/office/word/2010/wordprocessingCanvas" xmlns:cx="http://schemas.microsoft.com/office/drawing/2014/chartex" xmlns:cx1="http://schemas.microsoft.com/office/drawing/2015/9/8/chartex" xmlns:cx2="http://schemas.microsoft.com/office/drawing/2015/10/21/chartex" xmlns:cx3="http://schemas.microsoft.com/office/drawing/2016/5/9/chartex" xmlns:cx4="http://schemas.microsoft.com/office/drawing/2016/5/10/chartex" xmlns:cx5="http://schemas.microsoft.com/office/drawing/2016/5/11/chartex" xmlns:cx6="http://schemas.microsoft.com/office/drawing/2016/5/12/chartex" xmlns:cx7="http://schemas.microsoft.com/office/drawing/2016/5/13/chartex" xmlns:cx8="http://schemas.microsoft.com/office/drawing/2016/5/14/chartex" xmlns:mc="http://schemas.openxmlformats.org/markup-compatibility/2006" xmlns:aink="http://schemas.microsoft.com/office/drawing/2016/ink" xmlns:am3d="http://schemas.microsoft.com/office/drawing/2017/model3d" xmlns:o="urn:schemas-microsoft-com:office:office" xmlns:oel="http://schemas.microsoft.com/office/2019/extlst" xmlns:r="http://schemas.openxmlformats.org/officeDocument/2006/relationships" xmlns:m="http://schemas.openxmlformats.org/officeDocument/2006/math" xmlns:v="urn:schemas-microsoft-com:vml" xmlns:wp14="http://schemas.microsoft.com/office/word/2010/wordprocessingDrawing" xmlns:wp="http://schemas.openxmlformats.org/drawingml/2006/wordprocessingDrawing" xmlns:w10="urn:schemas-microsoft-com:office:word" xmlns:w="http://schemas.openxmlformats.org/wordprocessingml/2006/main" xmlns:w14="http://schemas.microsoft.com/office/word/2010/wordml" xmlns:w15="http://schemas.microsoft.com/office/word/2012/wordml" xmlns:w16cex="http://schemas.microsoft.com/office/word/2018/wordml/cex" xmlns:w16cid="http://schemas.microsoft.com/office/word/2016/wordml/cid" xmlns:w16="http://schemas.microsoft.com/office/word/2018/wordml" xmlns:w16du="http://schemas.microsoft.com/office/word/2023/wordml/word16du" xmlns:w16sdtdh="http://schemas.microsoft.com/office/word/2020/wordml/sdtdatahash" xmlns:w16sdtfl="http://schemas.microsoft.com/office/word/2024/wordml/sdtformatlock" xmlns:w16se="http://schemas.microsoft.com/office/word/2015/wordml/symex" xmlns:wpg="http://schemas.microsoft.com/office/word/2010/wordprocessingGroup" xmlns:wpi="http://schemas.microsoft.com/office/word/2010/wordprocessingInk" xmlns:wne="http://schemas.microsoft.com/office/word/2006/wordml" xmlns:wps="http://schemas.microsoft.com/office/word/2010/wordprocessingShape" mc:Ignorable="w14 w15 w16se w16cid w16 w16cex w16sdtdh w16sdtfl w16du wp14">
   <w:body>
     <w:p>
       <w:pPr>
@@ -2215,7 +2215,6 @@
       <w:pPr>
         <w:ind w:left="720"/>
         <w:rPr>
-          <w:rFonts w:hint="eastAsia"/>
           <w:lang w:eastAsia="ko-KR"/>
         </w:rPr>
       </w:pPr>
@@ -2471,69 +2470,45 @@
       <w:pPr>
         <w:ind w:left="720"/>
         <w:rPr>
-          <w:rFonts w:hint="eastAsia"/>
-          <w:lang w:eastAsia="ko-KR"/>
-        </w:rPr>
-      </w:pPr>
-      <w:r>
-        <w:rPr>
-          <w:rFonts w:hint="eastAsia"/>
-          <w:lang w:eastAsia="ko-KR"/>
-        </w:rPr>
-        <w:t>2026-Present, Osazee Nicholas-Asemota</w:t>
-      </w:r>
-      <w:r>
-        <w:rPr>
-          <w:rFonts w:hint="eastAsia"/>
-          <w:lang w:eastAsia="ko-KR"/>
-        </w:rPr>
-        <w:t xml:space="preserve"> (Doctoral Student, ELPTS, College of Education)</w:t>
+          <w:lang w:eastAsia="ko-KR"/>
+        </w:rPr>
+      </w:pPr>
+      <w:r>
+        <w:rPr>
+          <w:rFonts w:hint="eastAsia"/>
+          <w:lang w:eastAsia="ko-KR"/>
+        </w:rPr>
+        <w:t>2026-Present, Osazee Nicholas-Asemota (Doctoral Student, ELPTS, College of Education)</w:t>
       </w:r>
     </w:p>
     <w:p>
       <w:pPr>
         <w:ind w:firstLine="720"/>
         <w:rPr>
-          <w:rFonts w:hint="eastAsia"/>
-          <w:lang w:eastAsia="ko-KR"/>
-        </w:rPr>
-      </w:pPr>
-      <w:r>
-        <w:rPr>
-          <w:rFonts w:hint="eastAsia"/>
-          <w:lang w:eastAsia="ko-KR"/>
-        </w:rPr>
-        <w:t>2026-Present, Andrew Bergeron</w:t>
-      </w:r>
-      <w:r>
-        <w:rPr>
-          <w:rFonts w:hint="eastAsia"/>
-          <w:lang w:eastAsia="ko-KR"/>
-        </w:rPr>
-        <w:t xml:space="preserve"> (Doctoral Student, ELPTS, College of Education)</w:t>
+          <w:lang w:eastAsia="ko-KR"/>
+        </w:rPr>
+      </w:pPr>
+      <w:r>
+        <w:rPr>
+          <w:rFonts w:hint="eastAsia"/>
+          <w:lang w:eastAsia="ko-KR"/>
+        </w:rPr>
+        <w:t>2026-Present, Andrew Bergeron (Doctoral Student, ELPTS, College of Education)</w:t>
       </w:r>
     </w:p>
     <w:p>
       <w:pPr>
         <w:ind w:firstLine="720"/>
         <w:rPr>
-          <w:rFonts w:hint="eastAsia"/>
-          <w:lang w:eastAsia="ko-KR"/>
-        </w:rPr>
-      </w:pPr>
-      <w:r>
-        <w:rPr>
-          <w:rFonts w:hint="eastAsia"/>
-          <w:lang w:eastAsia="ko-KR"/>
-        </w:rPr>
-        <w:t>2026-Present, Vijesh Sharma</w:t>
-      </w:r>
-      <w:r>
-        <w:rPr>
-          <w:rFonts w:hint="eastAsia"/>
-          <w:lang w:eastAsia="ko-KR"/>
-        </w:rPr>
-        <w:t xml:space="preserve"> (Doctoral Student, ELPTS, College of Education)</w:t>
+          <w:lang w:eastAsia="ko-KR"/>
+        </w:rPr>
+      </w:pPr>
+      <w:r>
+        <w:rPr>
+          <w:rFonts w:hint="eastAsia"/>
+          <w:lang w:eastAsia="ko-KR"/>
+        </w:rPr>
+        <w:t>2026-Present, Vijesh Sharma (Doctoral Student, ELPTS, College of Education)</w:t>
       </w:r>
       <w:r>
         <w:rPr>
@@ -2552,14 +2527,7 @@
           <w:rFonts w:hint="eastAsia"/>
           <w:lang w:eastAsia="ko-KR"/>
         </w:rPr>
-        <w:t>2026-Present, Colton Clark</w:t>
-      </w:r>
-      <w:r>
-        <w:rPr>
-          <w:rFonts w:hint="eastAsia"/>
-          <w:lang w:eastAsia="ko-KR"/>
-        </w:rPr>
-        <w:t xml:space="preserve"> (Doctoral Student, ELPTS, College of Education)</w:t>
+        <w:t>2026-Present, Colton Clark (Doctoral Student, ELPTS, College of Education)</w:t>
       </w:r>
     </w:p>
     <w:p>
@@ -43433,7 +43401,96 @@
           <w:color w:val="000000"/>
           <w:lang w:eastAsia="ko-KR"/>
         </w:rPr>
-        <w:t>International Journal of Computer-Supported Collaborative Learning  (SSCI, Q1) (2026-present)</w:t>
+        <w:t xml:space="preserve">International Journal of Computer-Supported Collaborative </w:t>
+      </w:r>
+      <w:r>
+        <w:rPr>
+          <w:i/>
+          <w:iCs/>
+          <w:color w:val="000000"/>
+          <w:lang w:eastAsia="ko-KR"/>
+        </w:rPr>
+        <w:t>Learning (</w:t>
+      </w:r>
+      <w:r>
+        <w:rPr>
+          <w:rFonts w:hint="eastAsia"/>
+          <w:i/>
+          <w:iCs/>
+          <w:color w:val="000000"/>
+          <w:lang w:eastAsia="ko-KR"/>
+        </w:rPr>
+        <w:t>SSCI, Q1) (2026-present)</w:t>
+      </w:r>
+    </w:p>
+    <w:p>
+      <w:pPr>
+        <w:pBdr>
+          <w:top w:val="nil"/>
+          <w:left w:val="nil"/>
+          <w:bottom w:val="nil"/>
+          <w:right w:val="nil"/>
+          <w:between w:val="nil"/>
+        </w:pBdr>
+        <w:ind w:left="1080" w:hanging="360"/>
+        <w:rPr>
+          <w:color w:val="000000"/>
+          <w:lang w:eastAsia="ko-KR"/>
+        </w:rPr>
+      </w:pPr>
+      <w:r>
+        <w:rPr>
+          <w:rFonts w:hint="eastAsia"/>
+          <w:color w:val="000000"/>
+          <w:lang w:eastAsia="ko-KR"/>
+        </w:rPr>
+        <w:t xml:space="preserve">Editorial Board </w:t>
+      </w:r>
+      <w:r>
+        <w:rPr>
+          <w:color w:val="000000"/>
+        </w:rPr>
+        <w:t xml:space="preserve">– </w:t>
+      </w:r>
+      <w:r>
+        <w:rPr>
+          <w:rFonts w:hint="eastAsia"/>
+          <w:i/>
+          <w:iCs/>
+          <w:color w:val="000000"/>
+          <w:lang w:eastAsia="ko-KR"/>
+        </w:rPr>
+        <w:t>British</w:t>
+      </w:r>
+      <w:r>
+        <w:rPr>
+          <w:rFonts w:hint="eastAsia"/>
+          <w:i/>
+          <w:iCs/>
+          <w:color w:val="000000"/>
+          <w:lang w:eastAsia="ko-KR"/>
+        </w:rPr>
+        <w:t xml:space="preserve"> Journal of </w:t>
+      </w:r>
+      <w:r>
+        <w:rPr>
+          <w:rFonts w:hint="eastAsia"/>
+          <w:i/>
+          <w:iCs/>
+          <w:color w:val="000000"/>
+          <w:lang w:eastAsia="ko-KR"/>
+        </w:rPr>
+        <w:t>Educational Technology</w:t>
+      </w:r>
+      <w:r>
+        <w:rPr>
+          <w:rFonts w:hint="eastAsia"/>
+          <w:i/>
+          <w:iCs/>
+          <w:color w:val="000000"/>
+          <w:lang w:eastAsia="ko-KR"/>
+        </w:rPr>
+        <w:t xml:space="preserve"> (SSCI, Q1) (2026-present)</w:t>
       </w:r>
     </w:p>
     <w:p>
@@ -43857,7 +43914,14 @@
         <w:rPr>
           <w:color w:val="000000"/>
         </w:rPr>
-        <w:t xml:space="preserve">Published by </w:t>
+        <w:t xml:space="preserve">Published </w:t>
+      </w:r>
+      <w:r>
+        <w:rPr>
+          <w:color w:val="000000"/>
+        </w:rPr>
+        <w:lastRenderedPageBreak/>
+        <w:t xml:space="preserve">by </w:t>
       </w:r>
       <w:r>
         <w:rPr>
@@ -43883,14 +43947,7 @@
         <w:rPr>
           <w:color w:val="000000"/>
         </w:rPr>
-        <w:t xml:space="preserve"> National University, South </w:t>
-      </w:r>
-      <w:r>
-        <w:rPr>
-          <w:color w:val="000000"/>
-        </w:rPr>
-        <w:lastRenderedPageBreak/>
-        <w:t>Korea</w:t>
+        <w:t xml:space="preserve"> National University, South Korea</w:t>
       </w:r>
       <w:r>
         <w:rPr>
@@ -44915,6 +44972,7 @@
           <w:rFonts w:hint="eastAsia"/>
           <w:lang w:eastAsia="ko-KR"/>
         </w:rPr>
+        <w:lastRenderedPageBreak/>
         <w:t>President</w:t>
       </w:r>
       <w:r>
@@ -44966,7 +45024,6 @@
         <w:rPr>
           <w:lang w:eastAsia="ko-KR"/>
         </w:rPr>
-        <w:lastRenderedPageBreak/>
         <w:t>Finalist (selected as one of 11 finalists from 159 applicants).</w:t>
       </w:r>
       <w:r>
@@ -45354,7 +45411,7 @@
 </file>
 
 <file path=word/endnotes.xml><?xml version="1.0" encoding="utf-8"?>
-<w:endnotes xmlns:wpc="http://schemas.microsoft.com/office/word/2010/wordprocessingCanvas" xmlns:cx="http://schemas.microsoft.com/office/drawing/2014/chartex" xmlns:cx1="http://schemas.microsoft.com/office/drawing/2015/9/8/chartex" xmlns:cx2="http://schemas.microsoft.com/office/drawing/2015/10/21/chartex" xmlns:cx3="http://schemas.microsoft.com/office/drawing/2016/5/9/chartex" xmlns:cx4="http://schemas.microsoft.com/office/drawing/2016/5/10/chartex" xmlns:cx5="http://schemas.microsoft.com/office/drawing/2016/5/11/chartex" xmlns:cx6="http://schemas.microsoft.com/office/drawing/2016/5/12/chartex" xmlns:cx7="http://schemas.microsoft.com/office/drawing/2016/5/13/chartex" xmlns:cx8="http://schemas.microsoft.com/office/drawing/2016/5/14/chartex" xmlns:mc="http://schemas.openxmlformats.org/markup-compatibility/2006" xmlns:aink="http://schemas.microsoft.com/office/drawing/2016/ink" xmlns:am3d="http://schemas.microsoft.com/office/drawing/2017/model3d" xmlns:o="urn:schemas-microsoft-com:office:office" xmlns:oel="http://schemas.microsoft.com/office/2019/extlst" xmlns:r="http://schemas.openxmlformats.org/officeDocument/2006/relationships" xmlns:m="http://schemas.openxmlformats.org/officeDocument/2006/math" xmlns:v="urn:schemas-microsoft-com:vml" xmlns:wp14="http://schemas.microsoft.com/office/word/2010/wordprocessingDrawing" xmlns:wp="http://schemas.openxmlformats.org/drawingml/2006/wordprocessingDrawing" xmlns:w10="urn:schemas-microsoft-com:office:word" xmlns:w="http://schemas.openxmlformats.org/wordprocessingml/2006/main" xmlns:w14="http://schemas.microsoft.com/office/word/2010/wordml" xmlns:w15="http://schemas.microsoft.com/office/word/2012/wordml" xmlns:w16cei="http://schemas.microsoft.com/office/word/2026/wordml/cei" xmlns:w16cex="http://schemas.microsoft.com/office/word/2018/wordml/cex" xmlns:w16cid="http://schemas.microsoft.com/office/word/2016/wordml/cid" xmlns:w16="http://schemas.microsoft.com/office/word/2018/wordml" xmlns:w16du="http://schemas.microsoft.com/office/word/2023/wordml/word16du" xmlns:w16sdtdh="http://schemas.microsoft.com/office/word/2020/wordml/sdtdatahash" xmlns:w16sdtfl="http://schemas.microsoft.com/office/word/2024/wordml/sdtformatlock" xmlns:w16se="http://schemas.microsoft.com/office/word/2015/wordml/symex" xmlns:wpg="http://schemas.microsoft.com/office/word/2010/wordprocessingGroup" xmlns:wpi="http://schemas.microsoft.com/office/word/2010/wordprocessingInk" xmlns:wne="http://schemas.microsoft.com/office/word/2006/wordml" xmlns:wps="http://schemas.microsoft.com/office/word/2010/wordprocessingShape" mc:Ignorable="w14 w15 w16se w16cid w16 w16cex w16sdtdh w16sdtfl w16du wp14">
+<w:endnotes xmlns:wpc="http://schemas.microsoft.com/office/word/2010/wordprocessingCanvas" xmlns:cx="http://schemas.microsoft.com/office/drawing/2014/chartex" xmlns:cx1="http://schemas.microsoft.com/office/drawing/2015/9/8/chartex" xmlns:cx2="http://schemas.microsoft.com/office/drawing/2015/10/21/chartex" xmlns:cx3="http://schemas.microsoft.com/office/drawing/2016/5/9/chartex" xmlns:cx4="http://schemas.microsoft.com/office/drawing/2016/5/10/chartex" xmlns:cx5="http://schemas.microsoft.com/office/drawing/2016/5/11/chartex" xmlns:cx6="http://schemas.microsoft.com/office/drawing/2016/5/12/chartex" xmlns:cx7="http://schemas.microsoft.com/office/drawing/2016/5/13/chartex" xmlns:cx8="http://schemas.microsoft.com/office/drawing/2016/5/14/chartex" xmlns:mc="http://schemas.openxmlformats.org/markup-compatibility/2006" xmlns:aink="http://schemas.microsoft.com/office/drawing/2016/ink" xmlns:am3d="http://schemas.microsoft.com/office/drawing/2017/model3d" xmlns:o="urn:schemas-microsoft-com:office:office" xmlns:oel="http://schemas.microsoft.com/office/2019/extlst" xmlns:r="http://schemas.openxmlformats.org/officeDocument/2006/relationships" xmlns:m="http://schemas.openxmlformats.org/officeDocument/2006/math" xmlns:v="urn:schemas-microsoft-com:vml" xmlns:wp14="http://schemas.microsoft.com/office/word/2010/wordprocessingDrawing" xmlns:wp="http://schemas.openxmlformats.org/drawingml/2006/wordprocessingDrawing" xmlns:w10="urn:schemas-microsoft-com:office:word" xmlns:w="http://schemas.openxmlformats.org/wordprocessingml/2006/main" xmlns:w14="http://schemas.microsoft.com/office/word/2010/wordml" xmlns:w15="http://schemas.microsoft.com/office/word/2012/wordml" xmlns:w16cex="http://schemas.microsoft.com/office/word/2018/wordml/cex" xmlns:w16cid="http://schemas.microsoft.com/office/word/2016/wordml/cid" xmlns:w16="http://schemas.microsoft.com/office/word/2018/wordml" xmlns:w16du="http://schemas.microsoft.com/office/word/2023/wordml/word16du" xmlns:w16sdtdh="http://schemas.microsoft.com/office/word/2020/wordml/sdtdatahash" xmlns:w16sdtfl="http://schemas.microsoft.com/office/word/2024/wordml/sdtformatlock" xmlns:w16se="http://schemas.microsoft.com/office/word/2015/wordml/symex" xmlns:wpg="http://schemas.microsoft.com/office/word/2010/wordprocessingGroup" xmlns:wpi="http://schemas.microsoft.com/office/word/2010/wordprocessingInk" xmlns:wne="http://schemas.microsoft.com/office/word/2006/wordml" xmlns:wps="http://schemas.microsoft.com/office/word/2010/wordprocessingShape" mc:Ignorable="w14 w15 w16se w16cid w16 w16cex w16sdtdh w16sdtfl w16du wp14">
   <w:endnote w:type="separator" w:id="-1">
     <w:p>
       <w:r>
@@ -45373,7 +45430,7 @@
 </file>
 
 <file path=word/footer1.xml><?xml version="1.0" encoding="utf-8"?>
-<w:ftr xmlns:wpc="http://schemas.microsoft.com/office/word/2010/wordprocessingCanvas" xmlns:cx="http://schemas.microsoft.com/office/drawing/2014/chartex" xmlns:cx1="http://schemas.microsoft.com/office/drawing/2015/9/8/chartex" xmlns:cx2="http://schemas.microsoft.com/office/drawing/2015/10/21/chartex" xmlns:cx3="http://schemas.microsoft.com/office/drawing/2016/5/9/chartex" xmlns:cx4="http://schemas.microsoft.com/office/drawing/2016/5/10/chartex" xmlns:cx5="http://schemas.microsoft.com/office/drawing/2016/5/11/chartex" xmlns:cx6="http://schemas.microsoft.com/office/drawing/2016/5/12/chartex" xmlns:cx7="http://schemas.microsoft.com/office/drawing/2016/5/13/chartex" xmlns:cx8="http://schemas.microsoft.com/office/drawing/2016/5/14/chartex" xmlns:mc="http://schemas.openxmlformats.org/markup-compatibility/2006" xmlns:aink="http://schemas.microsoft.com/office/drawing/2016/ink" xmlns:am3d="http://schemas.microsoft.com/office/drawing/2017/model3d" xmlns:o="urn:schemas-microsoft-com:office:office" xmlns:oel="http://schemas.microsoft.com/office/2019/extlst" xmlns:r="http://schemas.openxmlformats.org/officeDocument/2006/relationships" xmlns:m="http://schemas.openxmlformats.org/officeDocument/2006/math" xmlns:v="urn:schemas-microsoft-com:vml" xmlns:wp14="http://schemas.microsoft.com/office/word/2010/wordprocessingDrawing" xmlns:wp="http://schemas.openxmlformats.org/drawingml/2006/wordprocessingDrawing" xmlns:w10="urn:schemas-microsoft-com:office:word" xmlns:w="http://schemas.openxmlformats.org/wordprocessingml/2006/main" xmlns:w14="http://schemas.microsoft.com/office/word/2010/wordml" xmlns:w15="http://schemas.microsoft.com/office/word/2012/wordml" xmlns:w16cei="http://schemas.microsoft.com/office/word/2026/wordml/cei" xmlns:w16cex="http://schemas.microsoft.com/office/word/2018/wordml/cex" xmlns:w16cid="http://schemas.microsoft.com/office/word/2016/wordml/cid" xmlns:w16="http://schemas.microsoft.com/office/word/2018/wordml" xmlns:w16du="http://schemas.microsoft.com/office/word/2023/wordml/word16du" xmlns:w16sdtdh="http://schemas.microsoft.com/office/word/2020/wordml/sdtdatahash" xmlns:w16sdtfl="http://schemas.microsoft.com/office/word/2024/wordml/sdtformatlock" xmlns:w16se="http://schemas.microsoft.com/office/word/2015/wordml/symex" xmlns:wpg="http://schemas.microsoft.com/office/word/2010/wordprocessingGroup" xmlns:wpi="http://schemas.microsoft.com/office/word/2010/wordprocessingInk" xmlns:wne="http://schemas.microsoft.com/office/word/2006/wordml" xmlns:wps="http://schemas.microsoft.com/office/word/2010/wordprocessingShape" mc:Ignorable="w14 w15 w16se w16cid w16 w16cex w16sdtdh w16sdtfl w16du wp14">
+<w:ftr xmlns:wpc="http://schemas.microsoft.com/office/word/2010/wordprocessingCanvas" xmlns:cx="http://schemas.microsoft.com/office/drawing/2014/chartex" xmlns:cx1="http://schemas.microsoft.com/office/drawing/2015/9/8/chartex" xmlns:cx2="http://schemas.microsoft.com/office/drawing/2015/10/21/chartex" xmlns:cx3="http://schemas.microsoft.com/office/drawing/2016/5/9/chartex" xmlns:cx4="http://schemas.microsoft.com/office/drawing/2016/5/10/chartex" xmlns:cx5="http://schemas.microsoft.com/office/drawing/2016/5/11/chartex" xmlns:cx6="http://schemas.microsoft.com/office/drawing/2016/5/12/chartex" xmlns:cx7="http://schemas.microsoft.com/office/drawing/2016/5/13/chartex" xmlns:cx8="http://schemas.microsoft.com/office/drawing/2016/5/14/chartex" xmlns:mc="http://schemas.openxmlformats.org/markup-compatibility/2006" xmlns:aink="http://schemas.microsoft.com/office/drawing/2016/ink" xmlns:am3d="http://schemas.microsoft.com/office/drawing/2017/model3d" xmlns:o="urn:schemas-microsoft-com:office:office" xmlns:oel="http://schemas.microsoft.com/office/2019/extlst" xmlns:r="http://schemas.openxmlformats.org/officeDocument/2006/relationships" xmlns:m="http://schemas.openxmlformats.org/officeDocument/2006/math" xmlns:v="urn:schemas-microsoft-com:vml" xmlns:wp14="http://schemas.microsoft.com/office/word/2010/wordprocessingDrawing" xmlns:wp="http://schemas.openxmlformats.org/drawingml/2006/wordprocessingDrawing" xmlns:w10="urn:schemas-microsoft-com:office:word" xmlns:w="http://schemas.openxmlformats.org/wordprocessingml/2006/main" xmlns:w14="http://schemas.microsoft.com/office/word/2010/wordml" xmlns:w15="http://schemas.microsoft.com/office/word/2012/wordml" xmlns:w16cex="http://schemas.microsoft.com/office/word/2018/wordml/cex" xmlns:w16cid="http://schemas.microsoft.com/office/word/2016/wordml/cid" xmlns:w16="http://schemas.microsoft.com/office/word/2018/wordml" xmlns:w16du="http://schemas.microsoft.com/office/word/2023/wordml/word16du" xmlns:w16sdtdh="http://schemas.microsoft.com/office/word/2020/wordml/sdtdatahash" xmlns:w16sdtfl="http://schemas.microsoft.com/office/word/2024/wordml/sdtformatlock" xmlns:w16se="http://schemas.microsoft.com/office/word/2015/wordml/symex" xmlns:wpg="http://schemas.microsoft.com/office/word/2010/wordprocessingGroup" xmlns:wpi="http://schemas.microsoft.com/office/word/2010/wordprocessingInk" xmlns:wne="http://schemas.microsoft.com/office/word/2006/wordml" xmlns:wps="http://schemas.microsoft.com/office/word/2010/wordprocessingShape" mc:Ignorable="w14 w15 w16se w16cid w16 w16cex w16sdtdh w16sdtfl w16du wp14">
   <w:p>
     <w:pPr>
       <w:pBdr>
@@ -45440,7 +45497,7 @@
 </file>
 
 <file path=word/footnotes.xml><?xml version="1.0" encoding="utf-8"?>
-<w:footnotes xmlns:wpc="http://schemas.microsoft.com/office/word/2010/wordprocessingCanvas" xmlns:cx="http://schemas.microsoft.com/office/drawing/2014/chartex" xmlns:cx1="http://schemas.microsoft.com/office/drawing/2015/9/8/chartex" xmlns:cx2="http://schemas.microsoft.com/office/drawing/2015/10/21/chartex" xmlns:cx3="http://schemas.microsoft.com/office/drawing/2016/5/9/chartex" xmlns:cx4="http://schemas.microsoft.com/office/drawing/2016/5/10/chartex" xmlns:cx5="http://schemas.microsoft.com/office/drawing/2016/5/11/chartex" xmlns:cx6="http://schemas.microsoft.com/office/drawing/2016/5/12/chartex" xmlns:cx7="http://schemas.microsoft.com/office/drawing/2016/5/13/chartex" xmlns:cx8="http://schemas.microsoft.com/office/drawing/2016/5/14/chartex" xmlns:mc="http://schemas.openxmlformats.org/markup-compatibility/2006" xmlns:aink="http://schemas.microsoft.com/office/drawing/2016/ink" xmlns:am3d="http://schemas.microsoft.com/office/drawing/2017/model3d" xmlns:o="urn:schemas-microsoft-com:office:office" xmlns:oel="http://schemas.microsoft.com/office/2019/extlst" xmlns:r="http://schemas.openxmlformats.org/officeDocument/2006/relationships" xmlns:m="http://schemas.openxmlformats.org/officeDocument/2006/math" xmlns:v="urn:schemas-microsoft-com:vml" xmlns:wp14="http://schemas.microsoft.com/office/word/2010/wordprocessingDrawing" xmlns:wp="http://schemas.openxmlformats.org/drawingml/2006/wordprocessingDrawing" xmlns:w10="urn:schemas-microsoft-com:office:word" xmlns:w="http://schemas.openxmlformats.org/wordprocessingml/2006/main" xmlns:w14="http://schemas.microsoft.com/office/word/2010/wordml" xmlns:w15="http://schemas.microsoft.com/office/word/2012/wordml" xmlns:w16cei="http://schemas.microsoft.com/office/word/2026/wordml/cei" xmlns:w16cex="http://schemas.microsoft.com/office/word/2018/wordml/cex" xmlns:w16cid="http://schemas.microsoft.com/office/word/2016/wordml/cid" xmlns:w16="http://schemas.microsoft.com/office/word/2018/wordml" xmlns:w16du="http://schemas.microsoft.com/office/word/2023/wordml/word16du" xmlns:w16sdtdh="http://schemas.microsoft.com/office/word/2020/wordml/sdtdatahash" xmlns:w16sdtfl="http://schemas.microsoft.com/office/word/2024/wordml/sdtformatlock" xmlns:w16se="http://schemas.microsoft.com/office/word/2015/wordml/symex" xmlns:wpg="http://schemas.microsoft.com/office/word/2010/wordprocessingGroup" xmlns:wpi="http://schemas.microsoft.com/office/word/2010/wordprocessingInk" xmlns:wne="http://schemas.microsoft.com/office/word/2006/wordml" xmlns:wps="http://schemas.microsoft.com/office/word/2010/wordprocessingShape" mc:Ignorable="w14 w15 w16se w16cid w16 w16cex w16sdtdh w16sdtfl w16du wp14">
+<w:footnotes xmlns:wpc="http://schemas.microsoft.com/office/word/2010/wordprocessingCanvas" xmlns:cx="http://schemas.microsoft.com/office/drawing/2014/chartex" xmlns:cx1="http://schemas.microsoft.com/office/drawing/2015/9/8/chartex" xmlns:cx2="http://schemas.microsoft.com/office/drawing/2015/10/21/chartex" xmlns:cx3="http://schemas.microsoft.com/office/drawing/2016/5/9/chartex" xmlns:cx4="http://schemas.microsoft.com/office/drawing/2016/5/10/chartex" xmlns:cx5="http://schemas.microsoft.com/office/drawing/2016/5/11/chartex" xmlns:cx6="http://schemas.microsoft.com/office/drawing/2016/5/12/chartex" xmlns:cx7="http://schemas.microsoft.com/office/drawing/2016/5/13/chartex" xmlns:cx8="http://schemas.microsoft.com/office/drawing/2016/5/14/chartex" xmlns:mc="http://schemas.openxmlformats.org/markup-compatibility/2006" xmlns:aink="http://schemas.microsoft.com/office/drawing/2016/ink" xmlns:am3d="http://schemas.microsoft.com/office/drawing/2017/model3d" xmlns:o="urn:schemas-microsoft-com:office:office" xmlns:oel="http://schemas.microsoft.com/office/2019/extlst" xmlns:r="http://schemas.openxmlformats.org/officeDocument/2006/relationships" xmlns:m="http://schemas.openxmlformats.org/officeDocument/2006/math" xmlns:v="urn:schemas-microsoft-com:vml" xmlns:wp14="http://schemas.microsoft.com/office/word/2010/wordprocessingDrawing" xmlns:wp="http://schemas.openxmlformats.org/drawingml/2006/wordprocessingDrawing" xmlns:w10="urn:schemas-microsoft-com:office:word" xmlns:w="http://schemas.openxmlformats.org/wordprocessingml/2006/main" xmlns:w14="http://schemas.microsoft.com/office/word/2010/wordml" xmlns:w15="http://schemas.microsoft.com/office/word/2012/wordml" xmlns:w16cex="http://schemas.microsoft.com/office/word/2018/wordml/cex" xmlns:w16cid="http://schemas.microsoft.com/office/word/2016/wordml/cid" xmlns:w16="http://schemas.microsoft.com/office/word/2018/wordml" xmlns:w16du="http://schemas.microsoft.com/office/word/2023/wordml/word16du" xmlns:w16sdtdh="http://schemas.microsoft.com/office/word/2020/wordml/sdtdatahash" xmlns:w16sdtfl="http://schemas.microsoft.com/office/word/2024/wordml/sdtformatlock" xmlns:w16se="http://schemas.microsoft.com/office/word/2015/wordml/symex" xmlns:wpg="http://schemas.microsoft.com/office/word/2010/wordprocessingGroup" xmlns:wpi="http://schemas.microsoft.com/office/word/2010/wordprocessingInk" xmlns:wne="http://schemas.microsoft.com/office/word/2006/wordml" xmlns:wps="http://schemas.microsoft.com/office/word/2010/wordprocessingShape" mc:Ignorable="w14 w15 w16se w16cid w16 w16cex w16sdtdh w16sdtfl w16du wp14">
   <w:footnote w:type="separator" w:id="-1">
     <w:p>
       <w:r>
@@ -45459,7 +45516,7 @@
 </file>
 
 <file path=word/header1.xml><?xml version="1.0" encoding="utf-8"?>
-<w:hdr xmlns:wpc="http://schemas.microsoft.com/office/word/2010/wordprocessingCanvas" xmlns:cx="http://schemas.microsoft.com/office/drawing/2014/chartex" xmlns:cx1="http://schemas.microsoft.com/office/drawing/2015/9/8/chartex" xmlns:cx2="http://schemas.microsoft.com/office/drawing/2015/10/21/chartex" xmlns:cx3="http://schemas.microsoft.com/office/drawing/2016/5/9/chartex" xmlns:cx4="http://schemas.microsoft.com/office/drawing/2016/5/10/chartex" xmlns:cx5="http://schemas.microsoft.com/office/drawing/2016/5/11/chartex" xmlns:cx6="http://schemas.microsoft.com/office/drawing/2016/5/12/chartex" xmlns:cx7="http://schemas.microsoft.com/office/drawing/2016/5/13/chartex" xmlns:cx8="http://schemas.microsoft.com/office/drawing/2016/5/14/chartex" xmlns:mc="http://schemas.openxmlformats.org/markup-compatibility/2006" xmlns:aink="http://schemas.microsoft.com/office/drawing/2016/ink" xmlns:am3d="http://schemas.microsoft.com/office/drawing/2017/model3d" xmlns:o="urn:schemas-microsoft-com:office:office" xmlns:oel="http://schemas.microsoft.com/office/2019/extlst" xmlns:r="http://schemas.openxmlformats.org/officeDocument/2006/relationships" xmlns:m="http://schemas.openxmlformats.org/officeDocument/2006/math" xmlns:v="urn:schemas-microsoft-com:vml" xmlns:wp14="http://schemas.microsoft.com/office/word/2010/wordprocessingDrawing" xmlns:wp="http://schemas.openxmlformats.org/drawingml/2006/wordprocessingDrawing" xmlns:w10="urn:schemas-microsoft-com:office:word" xmlns:w="http://schemas.openxmlformats.org/wordprocessingml/2006/main" xmlns:w14="http://schemas.microsoft.com/office/word/2010/wordml" xmlns:w15="http://schemas.microsoft.com/office/word/2012/wordml" xmlns:w16cei="http://schemas.microsoft.com/office/word/2026/wordml/cei" xmlns:w16cex="http://schemas.microsoft.com/office/word/2018/wordml/cex" xmlns:w16cid="http://schemas.microsoft.com/office/word/2016/wordml/cid" xmlns:w16="http://schemas.microsoft.com/office/word/2018/wordml" xmlns:w16du="http://schemas.microsoft.com/office/word/2023/wordml/word16du" xmlns:w16sdtdh="http://schemas.microsoft.com/office/word/2020/wordml/sdtdatahash" xmlns:w16sdtfl="http://schemas.microsoft.com/office/word/2024/wordml/sdtformatlock" xmlns:w16se="http://schemas.microsoft.com/office/word/2015/wordml/symex" xmlns:wpg="http://schemas.microsoft.com/office/word/2010/wordprocessingGroup" xmlns:wpi="http://schemas.microsoft.com/office/word/2010/wordprocessingInk" xmlns:wne="http://schemas.microsoft.com/office/word/2006/wordml" xmlns:wps="http://schemas.microsoft.com/office/word/2010/wordprocessingShape" mc:Ignorable="w14 w15 w16se w16cid w16 w16cex w16sdtdh w16sdtfl w16du wp14">
+<w:hdr xmlns:wpc="http://schemas.microsoft.com/office/word/2010/wordprocessingCanvas" xmlns:cx="http://schemas.microsoft.com/office/drawing/2014/chartex" xmlns:cx1="http://schemas.microsoft.com/office/drawing/2015/9/8/chartex" xmlns:cx2="http://schemas.microsoft.com/office/drawing/2015/10/21/chartex" xmlns:cx3="http://schemas.microsoft.com/office/drawing/2016/5/9/chartex" xmlns:cx4="http://schemas.microsoft.com/office/drawing/2016/5/10/chartex" xmlns:cx5="http://schemas.microsoft.com/office/drawing/2016/5/11/chartex" xmlns:cx6="http://schemas.microsoft.com/office/drawing/2016/5/12/chartex" xmlns:cx7="http://schemas.microsoft.com/office/drawing/2016/5/13/chartex" xmlns:cx8="http://schemas.microsoft.com/office/drawing/2016/5/14/chartex" xmlns:mc="http://schemas.openxmlformats.org/markup-compatibility/2006" xmlns:aink="http://schemas.microsoft.com/office/drawing/2016/ink" xmlns:am3d="http://schemas.microsoft.com/office/drawing/2017/model3d" xmlns:o="urn:schemas-microsoft-com:office:office" xmlns:oel="http://schemas.microsoft.com/office/2019/extlst" xmlns:r="http://schemas.openxmlformats.org/officeDocument/2006/relationships" xmlns:m="http://schemas.openxmlformats.org/officeDocument/2006/math" xmlns:v="urn:schemas-microsoft-com:vml" xmlns:wp14="http://schemas.microsoft.com/office/word/2010/wordprocessingDrawing" xmlns:wp="http://schemas.openxmlformats.org/drawingml/2006/wordprocessingDrawing" xmlns:w10="urn:schemas-microsoft-com:office:word" xmlns:w="http://schemas.openxmlformats.org/wordprocessingml/2006/main" xmlns:w14="http://schemas.microsoft.com/office/word/2010/wordml" xmlns:w15="http://schemas.microsoft.com/office/word/2012/wordml" xmlns:w16cex="http://schemas.microsoft.com/office/word/2018/wordml/cex" xmlns:w16cid="http://schemas.microsoft.com/office/word/2016/wordml/cid" xmlns:w16="http://schemas.microsoft.com/office/word/2018/wordml" xmlns:w16du="http://schemas.microsoft.com/office/word/2023/wordml/word16du" xmlns:w16sdtdh="http://schemas.microsoft.com/office/word/2020/wordml/sdtdatahash" xmlns:w16sdtfl="http://schemas.microsoft.com/office/word/2024/wordml/sdtformatlock" xmlns:w16se="http://schemas.microsoft.com/office/word/2015/wordml/symex" xmlns:wpg="http://schemas.microsoft.com/office/word/2010/wordprocessingGroup" xmlns:wpi="http://schemas.microsoft.com/office/word/2010/wordprocessingInk" xmlns:wne="http://schemas.microsoft.com/office/word/2006/wordml" xmlns:wps="http://schemas.microsoft.com/office/word/2010/wordprocessingShape" mc:Ignorable="w14 w15 w16se w16cid w16 w16cex w16sdtdh w16sdtfl w16du wp14">
   <w:p>
     <w:pPr>
       <w:pBdr>
@@ -45479,7 +45536,7 @@
 </file>
 
 <file path=word/numbering.xml><?xml version="1.0" encoding="utf-8"?>
-<w:numbering xmlns:wpc="http://schemas.microsoft.com/office/word/2010/wordprocessingCanvas" xmlns:cx="http://schemas.microsoft.com/office/drawing/2014/chartex" xmlns:cx1="http://schemas.microsoft.com/office/drawing/2015/9/8/chartex" xmlns:cx2="http://schemas.microsoft.com/office/drawing/2015/10/21/chartex" xmlns:cx3="http://schemas.microsoft.com/office/drawing/2016/5/9/chartex" xmlns:cx4="http://schemas.microsoft.com/office/drawing/2016/5/10/chartex" xmlns:cx5="http://schemas.microsoft.com/office/drawing/2016/5/11/chartex" xmlns:cx6="http://schemas.microsoft.com/office/drawing/2016/5/12/chartex" xmlns:cx7="http://schemas.microsoft.com/office/drawing/2016/5/13/chartex" xmlns:cx8="http://schemas.microsoft.com/office/drawing/2016/5/14/chartex" xmlns:mc="http://schemas.openxmlformats.org/markup-compatibility/2006" xmlns:aink="http://schemas.microsoft.com/office/drawing/2016/ink" xmlns:am3d="http://schemas.microsoft.com/office/drawing/2017/model3d" xmlns:o="urn:schemas-microsoft-com:office:office" xmlns:oel="http://schemas.microsoft.com/office/2019/extlst" xmlns:r="http://schemas.openxmlformats.org/officeDocument/2006/relationships" xmlns:m="http://schemas.openxmlformats.org/officeDocument/2006/math" xmlns:v="urn:schemas-microsoft-com:vml" xmlns:wp14="http://schemas.microsoft.com/office/word/2010/wordprocessingDrawing" xmlns:wp="http://schemas.openxmlformats.org/drawingml/2006/wordprocessingDrawing" xmlns:w10="urn:schemas-microsoft-com:office:word" xmlns:w="http://schemas.openxmlformats.org/wordprocessingml/2006/main" xmlns:w14="http://schemas.microsoft.com/office/word/2010/wordml" xmlns:w15="http://schemas.microsoft.com/office/word/2012/wordml" xmlns:w16cei="http://schemas.microsoft.com/office/word/2026/wordml/cei" xmlns:w16cex="http://schemas.microsoft.com/office/word/2018/wordml/cex" xmlns:w16cid="http://schemas.microsoft.com/office/word/2016/wordml/cid" xmlns:w16="http://schemas.microsoft.com/office/word/2018/wordml" xmlns:w16du="http://schemas.microsoft.com/office/word/2023/wordml/word16du" xmlns:w16sdtdh="http://schemas.microsoft.com/office/word/2020/wordml/sdtdatahash" xmlns:w16sdtfl="http://schemas.microsoft.com/office/word/2024/wordml/sdtformatlock" xmlns:w16se="http://schemas.microsoft.com/office/word/2015/wordml/symex" xmlns:wpg="http://schemas.microsoft.com/office/word/2010/wordprocessingGroup" xmlns:wpi="http://schemas.microsoft.com/office/word/2010/wordprocessingInk" xmlns:wne="http://schemas.microsoft.com/office/word/2006/wordml" xmlns:wps="http://schemas.microsoft.com/office/word/2010/wordprocessingShape" mc:Ignorable="w14 w15 w16se w16cid w16 w16cex w16sdtdh w16sdtfl w16du wp14">
+<w:numbering xmlns:wpc="http://schemas.microsoft.com/office/word/2010/wordprocessingCanvas" xmlns:cx="http://schemas.microsoft.com/office/drawing/2014/chartex" xmlns:cx1="http://schemas.microsoft.com/office/drawing/2015/9/8/chartex" xmlns:cx2="http://schemas.microsoft.com/office/drawing/2015/10/21/chartex" xmlns:cx3="http://schemas.microsoft.com/office/drawing/2016/5/9/chartex" xmlns:cx4="http://schemas.microsoft.com/office/drawing/2016/5/10/chartex" xmlns:cx5="http://schemas.microsoft.com/office/drawing/2016/5/11/chartex" xmlns:cx6="http://schemas.microsoft.com/office/drawing/2016/5/12/chartex" xmlns:cx7="http://schemas.microsoft.com/office/drawing/2016/5/13/chartex" xmlns:cx8="http://schemas.microsoft.com/office/drawing/2016/5/14/chartex" xmlns:mc="http://schemas.openxmlformats.org/markup-compatibility/2006" xmlns:aink="http://schemas.microsoft.com/office/drawing/2016/ink" xmlns:am3d="http://schemas.microsoft.com/office/drawing/2017/model3d" xmlns:o="urn:schemas-microsoft-com:office:office" xmlns:oel="http://schemas.microsoft.com/office/2019/extlst" xmlns:r="http://schemas.openxmlformats.org/officeDocument/2006/relationships" xmlns:m="http://schemas.openxmlformats.org/officeDocument/2006/math" xmlns:v="urn:schemas-microsoft-com:vml" xmlns:wp14="http://schemas.microsoft.com/office/word/2010/wordprocessingDrawing" xmlns:wp="http://schemas.openxmlformats.org/drawingml/2006/wordprocessingDrawing" xmlns:w10="urn:schemas-microsoft-com:office:word" xmlns:w="http://schemas.openxmlformats.org/wordprocessingml/2006/main" xmlns:w14="http://schemas.microsoft.com/office/word/2010/wordml" xmlns:w15="http://schemas.microsoft.com/office/word/2012/wordml" xmlns:w16cex="http://schemas.microsoft.com/office/word/2018/wordml/cex" xmlns:w16cid="http://schemas.microsoft.com/office/word/2016/wordml/cid" xmlns:w16="http://schemas.microsoft.com/office/word/2018/wordml" xmlns:w16du="http://schemas.microsoft.com/office/word/2023/wordml/word16du" xmlns:w16sdtdh="http://schemas.microsoft.com/office/word/2020/wordml/sdtdatahash" xmlns:w16sdtfl="http://schemas.microsoft.com/office/word/2024/wordml/sdtformatlock" xmlns:w16se="http://schemas.microsoft.com/office/word/2015/wordml/symex" xmlns:wpg="http://schemas.microsoft.com/office/word/2010/wordprocessingGroup" xmlns:wpi="http://schemas.microsoft.com/office/word/2010/wordprocessingInk" xmlns:wne="http://schemas.microsoft.com/office/word/2006/wordml" xmlns:wps="http://schemas.microsoft.com/office/word/2010/wordprocessingShape" mc:Ignorable="w14 w15 w16se w16cid w16 w16cex w16sdtdh w16sdtfl w16du wp14">
   <w:abstractNum w:abstractNumId="0" w15:restartNumberingAfterBreak="0">
     <w:nsid w:val="1134312A"/>
     <w:multiLevelType w:val="multilevel"/>
@@ -46864,6 +46921,7 @@
   <w:style w:type="character" w:default="1" w:styleId="DefaultParagraphFont">
     <w:name w:val="Default Paragraph Font"/>
     <w:uiPriority w:val="1"/>
+    <w:semiHidden/>
     <w:unhideWhenUsed/>
   </w:style>
   <w:style w:type="table" w:default="1" w:styleId="TableNormal">
@@ -47377,6 +47435,14 @@
 </file>
 
 <file path=customXml/item2.xml><?xml version="1.0" encoding="utf-8"?>
+<p:properties xmlns:p="http://schemas.microsoft.com/office/2006/metadata/properties" xmlns:xsi="http://www.w3.org/2001/XMLSchema-instance" xmlns:pc="http://schemas.microsoft.com/office/infopath/2007/PartnerControls">
+  <documentManagement>
+    <_activity xmlns="6a4161d7-0e07-4bb5-8cdd-a87a7602a445" xsi:nil="true"/>
+  </documentManagement>
+</p:properties>
+</file>
+
+<file path=customXml/item3.xml><?xml version="1.0" encoding="utf-8"?>
 <ct:contentTypeSchema xmlns:ct="http://schemas.microsoft.com/office/2006/metadata/contentType" xmlns:ma="http://schemas.microsoft.com/office/2006/metadata/properties/metaAttributes" ct:_="" ma:_="" ma:contentTypeName="Document" ma:contentTypeID="0x010100FA54A6C77D34E44FB33E0184D6F9C744" ma:contentTypeVersion="18" ma:contentTypeDescription="Create a new document." ma:contentTypeScope="" ma:versionID="9c28832654d292338743ef1185d20088">
   <xsd:schema xmlns:xsd="http://www.w3.org/2001/XMLSchema" xmlns:xs="http://www.w3.org/2001/XMLSchema" xmlns:p="http://schemas.microsoft.com/office/2006/metadata/properties" xmlns:ns3="6a4161d7-0e07-4bb5-8cdd-a87a7602a445" xmlns:ns4="30453fea-43c5-4a0b-a417-834186a09351" targetNamespace="http://schemas.microsoft.com/office/2006/metadata/properties" ma:root="true" ma:fieldsID="aadbfd92c1be4506f2c2f9fc093c4d0b" ns3:_="" ns4:_="">
     <xsd:import namespace="6a4161d7-0e07-4bb5-8cdd-a87a7602a445"/>
@@ -47629,16 +47695,8 @@
 </ct:contentTypeSchema>
 </file>
 
-<file path=customXml/item3.xml><?xml version="1.0" encoding="utf-8"?>
+<file path=customXml/item4.xml><?xml version="1.0" encoding="utf-8"?>
 <b:Sources xmlns:b="http://schemas.openxmlformats.org/officeDocument/2006/bibliography" xmlns="http://schemas.openxmlformats.org/officeDocument/2006/bibliography" SelectedStyle="\APASixthEditionOfficeOnline.xsl" StyleName="APA" Version="6"/>
-</file>
-
-<file path=customXml/item4.xml><?xml version="1.0" encoding="utf-8"?>
-<p:properties xmlns:p="http://schemas.microsoft.com/office/2006/metadata/properties" xmlns:xsi="http://www.w3.org/2001/XMLSchema-instance" xmlns:pc="http://schemas.microsoft.com/office/infopath/2007/PartnerControls">
-  <documentManagement>
-    <_activity xmlns="6a4161d7-0e07-4bb5-8cdd-a87a7602a445" xsi:nil="true"/>
-  </documentManagement>
-</p:properties>
 </file>
 
 <file path=customXml/itemProps1.xml><?xml version="1.0" encoding="utf-8"?>
@@ -47650,6 +47708,16 @@
 </file>
 
 <file path=customXml/itemProps2.xml><?xml version="1.0" encoding="utf-8"?>
+<ds:datastoreItem xmlns:ds="http://schemas.openxmlformats.org/officeDocument/2006/customXml" ds:itemID="{7C24488D-A36D-4C56-91ED-753F5C27550A}">
+  <ds:schemaRefs>
+    <ds:schemaRef ds:uri="http://schemas.microsoft.com/office/2006/metadata/properties"/>
+    <ds:schemaRef ds:uri="http://schemas.microsoft.com/office/infopath/2007/PartnerControls"/>
+    <ds:schemaRef ds:uri="6a4161d7-0e07-4bb5-8cdd-a87a7602a445"/>
+  </ds:schemaRefs>
+</ds:datastoreItem>
+</file>
+
+<file path=customXml/itemProps3.xml><?xml version="1.0" encoding="utf-8"?>
 <ds:datastoreItem xmlns:ds="http://schemas.openxmlformats.org/officeDocument/2006/customXml" ds:itemID="{44F19B31-977D-45A4-A748-143054BB9DA7}">
   <ds:schemaRefs>
     <ds:schemaRef ds:uri="http://schemas.microsoft.com/office/2006/metadata/contentType"/>
@@ -47668,20 +47736,10 @@
 </ds:datastoreItem>
 </file>
 
-<file path=customXml/itemProps3.xml><?xml version="1.0" encoding="utf-8"?>
+<file path=customXml/itemProps4.xml><?xml version="1.0" encoding="utf-8"?>
 <ds:datastoreItem xmlns:ds="http://schemas.openxmlformats.org/officeDocument/2006/customXml" ds:itemID="{E286DD98-9466-43F6-BF97-336366EE54DF}">
   <ds:schemaRefs>
     <ds:schemaRef ds:uri="http://schemas.openxmlformats.org/officeDocument/2006/bibliography"/>
   </ds:schemaRefs>
 </ds:datastoreItem>
-</file>
-
-<file path=customXml/itemProps4.xml><?xml version="1.0" encoding="utf-8"?>
-<ds:datastoreItem xmlns:ds="http://schemas.openxmlformats.org/officeDocument/2006/customXml" ds:itemID="{7C24488D-A36D-4C56-91ED-753F5C27550A}">
-  <ds:schemaRefs>
-    <ds:schemaRef ds:uri="http://schemas.microsoft.com/office/2006/metadata/properties"/>
-    <ds:schemaRef ds:uri="http://schemas.microsoft.com/office/infopath/2007/PartnerControls"/>
-    <ds:schemaRef ds:uri="6a4161d7-0e07-4bb5-8cdd-a87a7602a445"/>
-  </ds:schemaRefs>
-</ds:datastoreItem>
 </file>
</xml_diff>

<commit_message>
Publish design affordance paper and official journal covers
</commit_message>
<xml_diff>
--- a/CV_202605_MOON.docx
+++ b/CV_202605_MOON.docx
@@ -7778,7 +7778,7 @@
           <w:bCs/>
           <w:lang w:eastAsia="ko-KR"/>
         </w:rPr>
-        <w:t>Accepted, 2026</w:t>
+        <w:t>2026</w:t>
       </w:r>
       <w:r>
         <w:rPr>
@@ -7791,72 +7791,62 @@
         <w:rPr>
           <w:lang w:eastAsia="ko-KR"/>
         </w:rPr>
-        <w:t xml:space="preserve">Design </w:t>
-      </w:r>
-      <w:r>
-        <w:rPr>
-          <w:rFonts w:hint="eastAsia"/>
-          <w:lang w:eastAsia="ko-KR"/>
-        </w:rPr>
-        <w:t>a</w:t>
-      </w:r>
-      <w:r>
-        <w:rPr>
-          <w:lang w:eastAsia="ko-KR"/>
-        </w:rPr>
-        <w:t xml:space="preserve">ffordance </w:t>
-      </w:r>
-      <w:r>
-        <w:rPr>
-          <w:rFonts w:hint="eastAsia"/>
-          <w:lang w:eastAsia="ko-KR"/>
-        </w:rPr>
-        <w:t>d</w:t>
-      </w:r>
-      <w:r>
-        <w:rPr>
-          <w:lang w:eastAsia="ko-KR"/>
-        </w:rPr>
-        <w:t xml:space="preserve">iagnostic </w:t>
-      </w:r>
-      <w:r>
-        <w:rPr>
-          <w:rFonts w:hint="eastAsia"/>
-          <w:lang w:eastAsia="ko-KR"/>
-        </w:rPr>
-        <w:t>framework for computational thinking assessment in interactive virtual makerspaces</w:t>
-      </w:r>
-      <w:r>
-        <w:rPr>
-          <w:lang w:eastAsia="ko-KR"/>
-        </w:rPr>
-        <w:t xml:space="preserve">: An </w:t>
-      </w:r>
-      <w:r>
-        <w:rPr>
-          <w:rFonts w:hint="eastAsia"/>
-          <w:lang w:eastAsia="ko-KR"/>
-        </w:rPr>
-        <w:t>e</w:t>
-      </w:r>
-      <w:r>
-        <w:rPr>
-          <w:lang w:eastAsia="ko-KR"/>
-        </w:rPr>
-        <w:t xml:space="preserve">xploratory </w:t>
-      </w:r>
-      <w:r>
-        <w:rPr>
-          <w:rFonts w:hint="eastAsia"/>
-          <w:lang w:eastAsia="ko-KR"/>
-        </w:rPr>
-        <w:t>s</w:t>
-      </w:r>
-      <w:r>
-        <w:rPr>
-          <w:lang w:eastAsia="ko-KR"/>
-        </w:rPr>
-        <w:t>tudy</w:t>
+        <w:t>Design Affordance Diagnostic Framework: Screening Construct-Irrelevant Variance in Computational Thinking Assessment</w:t>
+      </w:r>
+      <w:r>
+        <w:rPr>
+          <w:rFonts w:hint="eastAsia"/>
+          <w:lang w:eastAsia="ko-KR"/>
+        </w:rPr>
+      </w:r>
+      <w:r>
+        <w:rPr>
+          <w:lang w:eastAsia="ko-KR"/>
+        </w:rPr>
+      </w:r>
+      <w:r>
+        <w:rPr>
+          <w:rFonts w:hint="eastAsia"/>
+          <w:lang w:eastAsia="ko-KR"/>
+        </w:rPr>
+      </w:r>
+      <w:r>
+        <w:rPr>
+          <w:lang w:eastAsia="ko-KR"/>
+        </w:rPr>
+      </w:r>
+      <w:r>
+        <w:rPr>
+          <w:rFonts w:hint="eastAsia"/>
+          <w:lang w:eastAsia="ko-KR"/>
+        </w:rPr>
+      </w:r>
+      <w:r>
+        <w:rPr>
+          <w:lang w:eastAsia="ko-KR"/>
+        </w:rPr>
+      </w:r>
+      <w:r>
+        <w:rPr>
+          <w:rFonts w:hint="eastAsia"/>
+          <w:lang w:eastAsia="ko-KR"/>
+        </w:rPr>
+      </w:r>
+      <w:r>
+        <w:rPr>
+          <w:lang w:eastAsia="ko-KR"/>
+        </w:rPr>
+      </w:r>
+      <w:r>
+        <w:rPr>
+          <w:rFonts w:hint="eastAsia"/>
+          <w:lang w:eastAsia="ko-KR"/>
+        </w:rPr>
+      </w:r>
+      <w:r>
+        <w:rPr>
+          <w:lang w:eastAsia="ko-KR"/>
+        </w:rPr>
       </w:r>
       <w:r>
         <w:rPr>

</xml_diff>

<commit_message>
Publish two Springer handbook chapters
</commit_message>
<xml_diff>
--- a/CV_202605_MOON.docx
+++ b/CV_202605_MOON.docx
@@ -23480,267 +23480,64 @@
       <w:pPr>
         <w:ind w:left="720" w:hanging="720"/>
       </w:pPr>
-      <w:r>
-        <w:rPr>
-          <w:rFonts w:hint="eastAsia"/>
-          <w:color w:val="222222"/>
-          <w:lang w:eastAsia="ko-KR"/>
-        </w:rPr>
-        <w:t>[</w:t>
-      </w:r>
-      <w:r>
-        <w:rPr>
-          <w:rFonts w:hint="eastAsia"/>
-          <w:color w:val="222222"/>
-          <w:lang w:eastAsia="ko-KR"/>
-        </w:rPr>
-        <w:t>7</w:t>
-      </w:r>
-      <w:r>
-        <w:rPr>
-          <w:rFonts w:hint="eastAsia"/>
-          <w:color w:val="222222"/>
-          <w:lang w:eastAsia="ko-KR"/>
-        </w:rPr>
-        <w:t xml:space="preserve">] </w:t>
-      </w:r>
-      <w:r>
-        <w:rPr>
-          <w:rFonts w:hint="eastAsia"/>
-          <w:lang w:eastAsia="ko-KR"/>
-        </w:rPr>
-        <w:t>*</w:t>
-      </w:r>
-      <w:r>
-        <w:rPr>
-          <w:bCs/>
-          <w:sz w:val="22"/>
-          <w:szCs w:val="22"/>
-        </w:rPr>
-        <w:t>‡</w:t>
-      </w:r>
-      <w:r>
-        <w:rPr>
-          <w:rFonts w:hint="eastAsia"/>
-          <w:bCs/>
-          <w:sz w:val="22"/>
-          <w:szCs w:val="22"/>
-          <w:lang w:eastAsia="ko-KR"/>
-        </w:rPr>
-        <w:t xml:space="preserve"> </w:t>
-      </w:r>
       <w:bookmarkStart w:id="5" w:name="_Hlk197519187"/>
-      <w:r>
-        <w:rPr>
-          <w:rFonts w:hint="eastAsia"/>
-          <w:lang w:eastAsia="ko-KR"/>
-        </w:rPr>
-        <w:t xml:space="preserve">Abu, S., Ghooreian, A., Ogunniran, M., Awoyemi, I., </w:t>
-      </w:r>
-      <w:r>
-        <w:rPr>
-          <w:rFonts w:hint="eastAsia"/>
-          <w:b/>
-          <w:bCs/>
-          <w:lang w:eastAsia="ko-KR"/>
-        </w:rPr>
-        <w:t>Moon, J</w:t>
-      </w:r>
-      <w:r>
-        <w:rPr>
-          <w:rFonts w:hint="eastAsia"/>
-          <w:lang w:eastAsia="ko-KR"/>
-        </w:rPr>
-        <w:t xml:space="preserve">. </w:t>
-      </w:r>
-      <w:r>
-        <w:t>(</w:t>
-      </w:r>
-      <w:r>
-        <w:rPr>
-          <w:rFonts w:hint="eastAsia"/>
-          <w:lang w:eastAsia="ko-KR"/>
-        </w:rPr>
-        <w:t>In Press</w:t>
-      </w:r>
-      <w:r>
-        <w:rPr>
-          <w:rFonts w:hint="eastAsia"/>
-          <w:lang w:eastAsia="ko-KR"/>
-        </w:rPr>
-        <w:t>, 202</w:t>
-      </w:r>
-      <w:r>
-        <w:rPr>
-          <w:rFonts w:hint="eastAsia"/>
-          <w:lang w:eastAsia="ko-KR"/>
-        </w:rPr>
-        <w:t>7</w:t>
-      </w:r>
-      <w:r>
-        <w:t xml:space="preserve">). </w:t>
-      </w:r>
-      <w:r>
-        <w:rPr>
-          <w:rFonts w:hint="eastAsia"/>
-          <w:lang w:eastAsia="ko-KR"/>
-        </w:rPr>
-        <w:t>Game-based Learning for Social Changes</w:t>
-      </w:r>
       <w:bookmarkEnd w:id="5"/>
       <w:r>
-        <w:t xml:space="preserve">. In </w:t>
-      </w:r>
-      <w:r>
-        <w:rPr>
-          <w:rFonts w:hint="eastAsia"/>
-          <w:lang w:eastAsia="ko-KR"/>
-        </w:rPr>
-        <w:t>Trifonas, P.</w:t>
-      </w:r>
-      <w:r>
-        <w:t xml:space="preserve"> (Eds.), </w:t>
-      </w:r>
-      <w:r>
-        <w:rPr>
-          <w:i/>
-          <w:iCs/>
-        </w:rPr>
-        <w:t>International Handbook of Theory and Research in Digital Media and Education</w:t>
-      </w:r>
-      <w:r>
-        <w:t xml:space="preserve">. </w:t>
-      </w:r>
-      <w:r>
-        <w:rPr>
-          <w:rFonts w:hint="eastAsia"/>
-          <w:lang w:eastAsia="ko-KR"/>
-        </w:rPr>
-        <w:t>Springer</w:t>
-      </w:r>
-      <w:r>
-        <w:t>.</w:t>
+        <w:rPr/>
+        <w:t xml:space="preserve">[7] *‡ Abu, S., Ghooreian, A., Ogunniran, M., Awoyemi, I., &amp; </w:t>
+      </w:r>
+      <w:r>
+        <w:rPr>
+          <w:b/>
+        </w:rPr>
+        <w:t>Moon, J.</w:t>
+      </w:r>
+      <w:r>
+        <w:rPr/>
+        <w:t xml:space="preserve"> (2026). Game-based learning for social change. In P. P. Trifonas &amp; P. P. Trifonas (Eds.), </w:t>
+      </w:r>
+      <w:r>
+        <w:rPr>
+          <w:i/>
+        </w:rPr>
+        <w:t>Handbook of theory and research in digital media and education</w:t>
+      </w:r>
+      <w:r>
+        <w:rPr/>
+        <w:t>. Springer. https://doi.org/10.1007/978-3-032-04596-6_29-1</w:t>
       </w:r>
     </w:p>
     <w:p>
       <w:pPr>
         <w:ind w:left="720" w:hanging="720"/>
       </w:pPr>
-      <w:r>
-        <w:rPr>
-          <w:rFonts w:hint="eastAsia"/>
-          <w:color w:val="222222"/>
-          <w:lang w:eastAsia="ko-KR"/>
-        </w:rPr>
-        <w:t>[</w:t>
-      </w:r>
-      <w:r>
-        <w:rPr>
-          <w:rFonts w:hint="eastAsia"/>
-          <w:color w:val="222222"/>
-          <w:lang w:eastAsia="ko-KR"/>
-        </w:rPr>
-        <w:t>6</w:t>
-      </w:r>
-      <w:r>
-        <w:rPr>
-          <w:rFonts w:hint="eastAsia"/>
-          <w:color w:val="222222"/>
-          <w:lang w:eastAsia="ko-KR"/>
-        </w:rPr>
-        <w:t xml:space="preserve">] * </w:t>
-      </w:r>
       <w:bookmarkStart w:id="6" w:name="_Hlk197519199"/>
-      <w:r>
-        <w:rPr>
-          <w:rFonts w:hint="eastAsia"/>
-          <w:lang w:eastAsia="ko-KR"/>
-        </w:rPr>
-        <w:t xml:space="preserve">Hong, S., </w:t>
-      </w:r>
-      <w:r>
-        <w:rPr>
-          <w:rFonts w:hint="eastAsia"/>
-          <w:b/>
-          <w:bCs/>
-          <w:lang w:eastAsia="ko-KR"/>
-        </w:rPr>
-        <w:t>Moon, J</w:t>
-      </w:r>
-      <w:r>
-        <w:rPr>
-          <w:rFonts w:hint="eastAsia"/>
-          <w:lang w:eastAsia="ko-KR"/>
-        </w:rPr>
-        <w:t xml:space="preserve">., Eom, T., Hwang, J., Lim, J., &amp; Park, S. </w:t>
-      </w:r>
-      <w:r>
-        <w:rPr>
-          <w:lang w:eastAsia="ko-KR"/>
-        </w:rPr>
-        <w:t>(</w:t>
-      </w:r>
-      <w:r>
-        <w:rPr>
-          <w:rFonts w:hint="eastAsia"/>
-          <w:lang w:eastAsia="ko-KR"/>
-        </w:rPr>
-        <w:t>In Press</w:t>
-      </w:r>
-      <w:r>
-        <w:rPr>
-          <w:rFonts w:hint="eastAsia"/>
-          <w:lang w:eastAsia="ko-KR"/>
-        </w:rPr>
-        <w:t>, 2026</w:t>
-      </w:r>
-      <w:r>
-        <w:rPr>
-          <w:lang w:eastAsia="ko-KR"/>
-        </w:rPr>
-        <w:t xml:space="preserve">). </w:t>
-      </w:r>
       <w:bookmarkStart w:id="7" w:name="_Hlk197519194"/>
-      <w:r>
-        <w:t>Immersive and Engaging Design for Teacher Simulation: Theoretical Foundations and Innovative Approache</w:t>
-      </w:r>
       <w:bookmarkEnd w:id="7"/>
-      <w:r>
-        <w:t>s</w:t>
-      </w:r>
       <w:bookmarkEnd w:id="6"/>
       <w:r>
-        <w:t xml:space="preserve">. In </w:t>
-      </w:r>
-      <w:r>
-        <w:rPr>
-          <w:rFonts w:hint="eastAsia"/>
-          <w:lang w:eastAsia="ko-KR"/>
-        </w:rPr>
-        <w:t>Trifonas, P.</w:t>
-      </w:r>
-      <w:r>
-        <w:t xml:space="preserve"> (Eds.), </w:t>
-      </w:r>
-      <w:r>
-        <w:rPr>
-          <w:i/>
-          <w:iCs/>
-        </w:rPr>
-        <w:t>International Handbook of Theory and Research in Digital Media and Education</w:t>
-      </w:r>
-      <w:r>
-        <w:t xml:space="preserve">. </w:t>
-      </w:r>
-      <w:r>
-        <w:rPr>
-          <w:rFonts w:hint="eastAsia"/>
-          <w:lang w:eastAsia="ko-KR"/>
-        </w:rPr>
-        <w:t>Springer</w:t>
-      </w:r>
-      <w:r>
-        <w:t>.</w:t>
+        <w:rPr/>
+        <w:t xml:space="preserve">[6] * Hong, S., </w:t>
+      </w:r>
+      <w:r>
+        <w:rPr>
+          <w:b/>
+        </w:rPr>
+        <w:t>Moon, J.</w:t>
+      </w:r>
+      <w:r>
+        <w:rPr/>
+        <w:t xml:space="preserve">, Eom, T., Hwang, J., Lim, J., &amp; Park, S. (2026). Immersive and engaging design for teacher simulation: Theoretical foundations and innovative approaches. In P. P. Trifonas &amp; P. P. Trifonas (Eds.), </w:t>
+      </w:r>
+      <w:r>
+        <w:rPr>
+          <w:i/>
+        </w:rPr>
+        <w:t>Handbook of theory and research in digital media and education</w:t>
+      </w:r>
+      <w:r>
+        <w:rPr/>
+        <w:t>. Springer. https://doi.org/10.1007/978-3-032-04596-6_22-1</w:t>
       </w:r>
     </w:p>
     <w:p>

</xml_diff>

<commit_message>
Align 2026 publication titles with publisher records
</commit_message>
<xml_diff>
--- a/CV_202605_MOON.docx
+++ b/CV_202605_MOON.docx
@@ -8425,124 +8425,106 @@
         <w:rPr>
           <w:lang w:eastAsia="ko-KR"/>
         </w:rPr>
-        <w:t xml:space="preserve">Challenges, </w:t>
-      </w:r>
-      <w:r>
-        <w:rPr>
-          <w:rFonts w:hint="eastAsia"/>
-          <w:lang w:eastAsia="ko-KR"/>
-        </w:rPr>
-        <w:t>s</w:t>
-      </w:r>
-      <w:r>
-        <w:rPr>
-          <w:lang w:eastAsia="ko-KR"/>
-        </w:rPr>
-        <w:t xml:space="preserve">olutions, and PD </w:t>
-      </w:r>
-      <w:r>
-        <w:rPr>
-          <w:rFonts w:hint="eastAsia"/>
-          <w:lang w:eastAsia="ko-KR"/>
-        </w:rPr>
-        <w:t>n</w:t>
-      </w:r>
-      <w:r>
-        <w:rPr>
-          <w:lang w:eastAsia="ko-KR"/>
-        </w:rPr>
-        <w:t xml:space="preserve">eeds for </w:t>
-      </w:r>
-      <w:r>
-        <w:rPr>
-          <w:rFonts w:hint="eastAsia"/>
-          <w:lang w:eastAsia="ko-KR"/>
-        </w:rPr>
-        <w:t>i</w:t>
-      </w:r>
-      <w:r>
-        <w:rPr>
-          <w:lang w:eastAsia="ko-KR"/>
-        </w:rPr>
-        <w:t xml:space="preserve">ntegrating AI: Insights from a </w:t>
-      </w:r>
-      <w:r>
-        <w:rPr>
-          <w:rFonts w:hint="eastAsia"/>
-          <w:lang w:eastAsia="ko-KR"/>
-        </w:rPr>
-        <w:t>t</w:t>
-      </w:r>
-      <w:r>
-        <w:rPr>
-          <w:lang w:eastAsia="ko-KR"/>
-        </w:rPr>
-        <w:t>wo-</w:t>
-      </w:r>
-      <w:r>
-        <w:rPr>
-          <w:rFonts w:hint="eastAsia"/>
-          <w:lang w:eastAsia="ko-KR"/>
-        </w:rPr>
-        <w:t>w</w:t>
-      </w:r>
-      <w:r>
-        <w:rPr>
-          <w:lang w:eastAsia="ko-KR"/>
-        </w:rPr>
-        <w:t xml:space="preserve">eek AI </w:t>
-      </w:r>
-      <w:r>
-        <w:rPr>
-          <w:rFonts w:hint="eastAsia"/>
-          <w:lang w:eastAsia="ko-KR"/>
-        </w:rPr>
-        <w:t>l</w:t>
-      </w:r>
-      <w:r>
-        <w:rPr>
-          <w:lang w:eastAsia="ko-KR"/>
-        </w:rPr>
-        <w:t xml:space="preserve">iteracy </w:t>
-      </w:r>
-      <w:r>
-        <w:rPr>
-          <w:rFonts w:hint="eastAsia"/>
-          <w:lang w:eastAsia="ko-KR"/>
-        </w:rPr>
-        <w:t>m</w:t>
-      </w:r>
-      <w:r>
-        <w:rPr>
-          <w:lang w:eastAsia="ko-KR"/>
-        </w:rPr>
-        <w:t xml:space="preserve">odule with </w:t>
-      </w:r>
-      <w:r>
-        <w:rPr>
-          <w:rFonts w:hint="eastAsia"/>
-          <w:lang w:eastAsia="ko-KR"/>
-        </w:rPr>
-        <w:t>p</w:t>
-      </w:r>
-      <w:r>
-        <w:rPr>
-          <w:lang w:eastAsia="ko-KR"/>
-        </w:rPr>
-        <w:t xml:space="preserve">reservice </w:t>
-      </w:r>
-      <w:r>
-        <w:rPr>
-          <w:rFonts w:hint="eastAsia"/>
-          <w:lang w:eastAsia="ko-KR"/>
-        </w:rPr>
-        <w:t>t</w:t>
-      </w:r>
-      <w:r>
-        <w:rPr>
-          <w:lang w:eastAsia="ko-KR"/>
-        </w:rPr>
-        <w:t>eachers</w:t>
+        <w:t>Challenges, safeguards, and professional learning needs for AI integration: insights from a two-week AI literacy module with preservice teachers</w:t>
+      </w:r>
+      <w:r>
+        <w:rPr>
+          <w:rFonts w:hint="eastAsia"/>
+          <w:lang w:eastAsia="ko-KR"/>
+        </w:rPr>
+      </w:r>
+      <w:r>
+        <w:rPr>
+          <w:lang w:eastAsia="ko-KR"/>
+        </w:rPr>
+      </w:r>
+      <w:r>
+        <w:rPr>
+          <w:rFonts w:hint="eastAsia"/>
+          <w:lang w:eastAsia="ko-KR"/>
+        </w:rPr>
+      </w:r>
+      <w:r>
+        <w:rPr>
+          <w:lang w:eastAsia="ko-KR"/>
+        </w:rPr>
+      </w:r>
+      <w:r>
+        <w:rPr>
+          <w:rFonts w:hint="eastAsia"/>
+          <w:lang w:eastAsia="ko-KR"/>
+        </w:rPr>
+      </w:r>
+      <w:r>
+        <w:rPr>
+          <w:lang w:eastAsia="ko-KR"/>
+        </w:rPr>
+      </w:r>
+      <w:r>
+        <w:rPr>
+          <w:rFonts w:hint="eastAsia"/>
+          <w:lang w:eastAsia="ko-KR"/>
+        </w:rPr>
+      </w:r>
+      <w:r>
+        <w:rPr>
+          <w:lang w:eastAsia="ko-KR"/>
+        </w:rPr>
+      </w:r>
+      <w:r>
+        <w:rPr>
+          <w:rFonts w:hint="eastAsia"/>
+          <w:lang w:eastAsia="ko-KR"/>
+        </w:rPr>
+      </w:r>
+      <w:r>
+        <w:rPr>
+          <w:lang w:eastAsia="ko-KR"/>
+        </w:rPr>
+      </w:r>
+      <w:r>
+        <w:rPr>
+          <w:rFonts w:hint="eastAsia"/>
+          <w:lang w:eastAsia="ko-KR"/>
+        </w:rPr>
+      </w:r>
+      <w:r>
+        <w:rPr>
+          <w:lang w:eastAsia="ko-KR"/>
+        </w:rPr>
+      </w:r>
+      <w:r>
+        <w:rPr>
+          <w:rFonts w:hint="eastAsia"/>
+          <w:lang w:eastAsia="ko-KR"/>
+        </w:rPr>
+      </w:r>
+      <w:r>
+        <w:rPr>
+          <w:lang w:eastAsia="ko-KR"/>
+        </w:rPr>
+      </w:r>
+      <w:r>
+        <w:rPr>
+          <w:rFonts w:hint="eastAsia"/>
+          <w:lang w:eastAsia="ko-KR"/>
+        </w:rPr>
+      </w:r>
+      <w:r>
+        <w:rPr>
+          <w:lang w:eastAsia="ko-KR"/>
+        </w:rPr>
+      </w:r>
+      <w:r>
+        <w:rPr>
+          <w:rFonts w:hint="eastAsia"/>
+          <w:lang w:eastAsia="ko-KR"/>
+        </w:rPr>
+      </w:r>
+      <w:r>
+        <w:rPr>
+          <w:lang w:eastAsia="ko-KR"/>
+        </w:rPr>
       </w:r>
       <w:r>
         <w:rPr>

</xml_diff>